<commit_message>
ops: KII Guide r3 -- portal now uses the new KII project (ar47NkjJiuWP4j6sTgmMpH, /x/hwMQ5dG3)
The End time check in the KII Guide compared times with '>' and refused correct times;
r3 uses decimal-time() and prefills Duration. Updated configure-kobo.sh (so a token
rotation does not revert the KII form), the System Manual and docs/11.

Co-Authored-By: Claude Sonnet 5 <noreply@anthropic.com>
</commit_message>
<xml_diff>
--- a/docs/manuals/ABF-FST_Screen_and_Button_Reference.docx
+++ b/docs/manuals/ABF-FST_Screen_and_Button_Reference.docx
@@ -69,7 +69,7 @@
           <w:left w:w="10" w:type="dxa"/>
           <w:right w:w="10" w:type="dxa"/>
         </w:tblCellMar>
-        <w:tblLook w:val="04A0" w:firstRow="1" w:lastRow="0" w:firstColumn="1" w:lastColumn="0" w:noHBand="0" w:noVBand="1"/>
+        <w:tblLook w:val="0000" w:firstRow="0" w:lastRow="0" w:firstColumn="0" w:lastColumn="0" w:noHBand="0" w:noVBand="0"/>
       </w:tblPr>
       <w:tblGrid>
         <w:gridCol w:w="2300"/>
@@ -538,7 +538,7 @@
     <w:sdt>
       <w:sdtPr>
         <w:alias w:val="Contents"/>
-        <w:id w:val="-1506823823"/>
+        <w:id w:val="499855626"/>
       </w:sdtPr>
       <w:sdtEndPr/>
       <w:sdtContent>
@@ -567,7 +567,7 @@
           <w:r>
             <w:fldChar w:fldCharType="separate"/>
           </w:r>
-          <w:hyperlink w:anchor="_Toc240888443" w:history="1">
+          <w:hyperlink w:anchor="_Toc240916537" w:history="1">
             <w:r>
               <w:rPr>
                 <w:rStyle w:val="Hyperlink"/>
@@ -591,7 +591,7 @@
               <w:rPr>
                 <w:noProof/>
               </w:rPr>
-              <w:instrText xml:space="preserve"> PAGEREF _Toc240888443 \h </w:instrText>
+              <w:instrText xml:space="preserve"> PAGEREF _Toc240916537 \h </w:instrText>
             </w:r>
             <w:r>
               <w:rPr>
@@ -634,7 +634,7 @@
               <w14:ligatures w14:val="standardContextual"/>
             </w:rPr>
           </w:pPr>
-          <w:hyperlink w:anchor="_Toc240888444" w:history="1">
+          <w:hyperlink w:anchor="_Toc240916538" w:history="1">
             <w:r>
               <w:rPr>
                 <w:rStyle w:val="Hyperlink"/>
@@ -658,7 +658,7 @@
               <w:rPr>
                 <w:noProof/>
               </w:rPr>
-              <w:instrText xml:space="preserve"> PAGEREF _Toc240888444 \h </w:instrText>
+              <w:instrText xml:space="preserve"> PAGEREF _Toc240916538 \h </w:instrText>
             </w:r>
             <w:r>
               <w:rPr>
@@ -701,7 +701,7 @@
               <w14:ligatures w14:val="standardContextual"/>
             </w:rPr>
           </w:pPr>
-          <w:hyperlink w:anchor="_Toc240888445" w:history="1">
+          <w:hyperlink w:anchor="_Toc240916539" w:history="1">
             <w:r>
               <w:rPr>
                 <w:rStyle w:val="Hyperlink"/>
@@ -725,7 +725,7 @@
               <w:rPr>
                 <w:noProof/>
               </w:rPr>
-              <w:instrText xml:space="preserve"> PAGEREF _Toc240888445 \h </w:instrText>
+              <w:instrText xml:space="preserve"> PAGEREF _Toc240916539 \h </w:instrText>
             </w:r>
             <w:r>
               <w:rPr>
@@ -768,7 +768,7 @@
               <w14:ligatures w14:val="standardContextual"/>
             </w:rPr>
           </w:pPr>
-          <w:hyperlink w:anchor="_Toc240888446" w:history="1">
+          <w:hyperlink w:anchor="_Toc240916540" w:history="1">
             <w:r>
               <w:rPr>
                 <w:rStyle w:val="Hyperlink"/>
@@ -792,7 +792,7 @@
               <w:rPr>
                 <w:noProof/>
               </w:rPr>
-              <w:instrText xml:space="preserve"> PAGEREF _Toc240888446 \h </w:instrText>
+              <w:instrText xml:space="preserve"> PAGEREF _Toc240916540 \h </w:instrText>
             </w:r>
             <w:r>
               <w:rPr>
@@ -835,7 +835,7 @@
               <w14:ligatures w14:val="standardContextual"/>
             </w:rPr>
           </w:pPr>
-          <w:hyperlink w:anchor="_Toc240888447" w:history="1">
+          <w:hyperlink w:anchor="_Toc240916541" w:history="1">
             <w:r>
               <w:rPr>
                 <w:rStyle w:val="Hyperlink"/>
@@ -859,7 +859,7 @@
               <w:rPr>
                 <w:noProof/>
               </w:rPr>
-              <w:instrText xml:space="preserve"> PAGEREF _Toc240888447 \h </w:instrText>
+              <w:instrText xml:space="preserve"> PAGEREF _Toc240916541 \h </w:instrText>
             </w:r>
             <w:r>
               <w:rPr>
@@ -902,7 +902,7 @@
               <w14:ligatures w14:val="standardContextual"/>
             </w:rPr>
           </w:pPr>
-          <w:hyperlink w:anchor="_Toc240888448" w:history="1">
+          <w:hyperlink w:anchor="_Toc240916542" w:history="1">
             <w:r>
               <w:rPr>
                 <w:rStyle w:val="Hyperlink"/>
@@ -926,7 +926,7 @@
               <w:rPr>
                 <w:noProof/>
               </w:rPr>
-              <w:instrText xml:space="preserve"> PAGEREF _Toc240888448 \h </w:instrText>
+              <w:instrText xml:space="preserve"> PAGEREF _Toc240916542 \h </w:instrText>
             </w:r>
             <w:r>
               <w:rPr>
@@ -969,7 +969,7 @@
               <w14:ligatures w14:val="standardContextual"/>
             </w:rPr>
           </w:pPr>
-          <w:hyperlink w:anchor="_Toc240888449" w:history="1">
+          <w:hyperlink w:anchor="_Toc240916543" w:history="1">
             <w:r>
               <w:rPr>
                 <w:rStyle w:val="Hyperlink"/>
@@ -993,7 +993,7 @@
               <w:rPr>
                 <w:noProof/>
               </w:rPr>
-              <w:instrText xml:space="preserve"> PAGEREF _Toc240888449 \h </w:instrText>
+              <w:instrText xml:space="preserve"> PAGEREF _Toc240916543 \h </w:instrText>
             </w:r>
             <w:r>
               <w:rPr>
@@ -1036,7 +1036,7 @@
               <w14:ligatures w14:val="standardContextual"/>
             </w:rPr>
           </w:pPr>
-          <w:hyperlink w:anchor="_Toc240888450" w:history="1">
+          <w:hyperlink w:anchor="_Toc240916544" w:history="1">
             <w:r>
               <w:rPr>
                 <w:rStyle w:val="Hyperlink"/>
@@ -1060,7 +1060,7 @@
               <w:rPr>
                 <w:noProof/>
               </w:rPr>
-              <w:instrText xml:space="preserve"> PAGEREF _Toc240888450 \h </w:instrText>
+              <w:instrText xml:space="preserve"> PAGEREF _Toc240916544 \h </w:instrText>
             </w:r>
             <w:r>
               <w:rPr>
@@ -1103,7 +1103,7 @@
               <w14:ligatures w14:val="standardContextual"/>
             </w:rPr>
           </w:pPr>
-          <w:hyperlink w:anchor="_Toc240888451" w:history="1">
+          <w:hyperlink w:anchor="_Toc240916545" w:history="1">
             <w:r>
               <w:rPr>
                 <w:rStyle w:val="Hyperlink"/>
@@ -1127,7 +1127,7 @@
               <w:rPr>
                 <w:noProof/>
               </w:rPr>
-              <w:instrText xml:space="preserve"> PAGEREF _Toc240888451 \h </w:instrText>
+              <w:instrText xml:space="preserve"> PAGEREF _Toc240916545 \h </w:instrText>
             </w:r>
             <w:r>
               <w:rPr>
@@ -1170,7 +1170,7 @@
               <w14:ligatures w14:val="standardContextual"/>
             </w:rPr>
           </w:pPr>
-          <w:hyperlink w:anchor="_Toc240888452" w:history="1">
+          <w:hyperlink w:anchor="_Toc240916546" w:history="1">
             <w:r>
               <w:rPr>
                 <w:rStyle w:val="Hyperlink"/>
@@ -1194,7 +1194,7 @@
               <w:rPr>
                 <w:noProof/>
               </w:rPr>
-              <w:instrText xml:space="preserve"> PAGEREF _Toc240888452 \h </w:instrText>
+              <w:instrText xml:space="preserve"> PAGEREF _Toc240916546 \h </w:instrText>
             </w:r>
             <w:r>
               <w:rPr>
@@ -1237,7 +1237,7 @@
               <w14:ligatures w14:val="standardContextual"/>
             </w:rPr>
           </w:pPr>
-          <w:hyperlink w:anchor="_Toc240888453" w:history="1">
+          <w:hyperlink w:anchor="_Toc240916547" w:history="1">
             <w:r>
               <w:rPr>
                 <w:rStyle w:val="Hyperlink"/>
@@ -1261,7 +1261,7 @@
               <w:rPr>
                 <w:noProof/>
               </w:rPr>
-              <w:instrText xml:space="preserve"> PAGEREF _Toc240888453 \h </w:instrText>
+              <w:instrText xml:space="preserve"> PAGEREF _Toc240916547 \h </w:instrText>
             </w:r>
             <w:r>
               <w:rPr>
@@ -1304,7 +1304,7 @@
               <w14:ligatures w14:val="standardContextual"/>
             </w:rPr>
           </w:pPr>
-          <w:hyperlink w:anchor="_Toc240888454" w:history="1">
+          <w:hyperlink w:anchor="_Toc240916548" w:history="1">
             <w:r>
               <w:rPr>
                 <w:rStyle w:val="Hyperlink"/>
@@ -1328,7 +1328,7 @@
               <w:rPr>
                 <w:noProof/>
               </w:rPr>
-              <w:instrText xml:space="preserve"> PAGEREF _Toc240888454 \h </w:instrText>
+              <w:instrText xml:space="preserve"> PAGEREF _Toc240916548 \h </w:instrText>
             </w:r>
             <w:r>
               <w:rPr>
@@ -1371,7 +1371,7 @@
               <w14:ligatures w14:val="standardContextual"/>
             </w:rPr>
           </w:pPr>
-          <w:hyperlink w:anchor="_Toc240888455" w:history="1">
+          <w:hyperlink w:anchor="_Toc240916549" w:history="1">
             <w:r>
               <w:rPr>
                 <w:rStyle w:val="Hyperlink"/>
@@ -1395,7 +1395,7 @@
               <w:rPr>
                 <w:noProof/>
               </w:rPr>
-              <w:instrText xml:space="preserve"> PAGEREF _Toc240888455 \h </w:instrText>
+              <w:instrText xml:space="preserve"> PAGEREF _Toc240916549 \h </w:instrText>
             </w:r>
             <w:r>
               <w:rPr>
@@ -1438,7 +1438,7 @@
               <w14:ligatures w14:val="standardContextual"/>
             </w:rPr>
           </w:pPr>
-          <w:hyperlink w:anchor="_Toc240888456" w:history="1">
+          <w:hyperlink w:anchor="_Toc240916550" w:history="1">
             <w:r>
               <w:rPr>
                 <w:rStyle w:val="Hyperlink"/>
@@ -1462,7 +1462,7 @@
               <w:rPr>
                 <w:noProof/>
               </w:rPr>
-              <w:instrText xml:space="preserve"> PAGEREF _Toc240888456 \h </w:instrText>
+              <w:instrText xml:space="preserve"> PAGEREF _Toc240916550 \h </w:instrText>
             </w:r>
             <w:r>
               <w:rPr>
@@ -1505,7 +1505,7 @@
               <w14:ligatures w14:val="standardContextual"/>
             </w:rPr>
           </w:pPr>
-          <w:hyperlink w:anchor="_Toc240888457" w:history="1">
+          <w:hyperlink w:anchor="_Toc240916551" w:history="1">
             <w:r>
               <w:rPr>
                 <w:rStyle w:val="Hyperlink"/>
@@ -1529,7 +1529,7 @@
               <w:rPr>
                 <w:noProof/>
               </w:rPr>
-              <w:instrText xml:space="preserve"> PAGEREF _Toc240888457 \h </w:instrText>
+              <w:instrText xml:space="preserve"> PAGEREF _Toc240916551 \h </w:instrText>
             </w:r>
             <w:r>
               <w:rPr>
@@ -1572,7 +1572,7 @@
               <w14:ligatures w14:val="standardContextual"/>
             </w:rPr>
           </w:pPr>
-          <w:hyperlink w:anchor="_Toc240888458" w:history="1">
+          <w:hyperlink w:anchor="_Toc240916552" w:history="1">
             <w:r>
               <w:rPr>
                 <w:rStyle w:val="Hyperlink"/>
@@ -1596,7 +1596,7 @@
               <w:rPr>
                 <w:noProof/>
               </w:rPr>
-              <w:instrText xml:space="preserve"> PAGEREF _Toc240888458 \h </w:instrText>
+              <w:instrText xml:space="preserve"> PAGEREF _Toc240916552 \h </w:instrText>
             </w:r>
             <w:r>
               <w:rPr>
@@ -1639,7 +1639,7 @@
               <w14:ligatures w14:val="standardContextual"/>
             </w:rPr>
           </w:pPr>
-          <w:hyperlink w:anchor="_Toc240888459" w:history="1">
+          <w:hyperlink w:anchor="_Toc240916553" w:history="1">
             <w:r>
               <w:rPr>
                 <w:rStyle w:val="Hyperlink"/>
@@ -1663,7 +1663,7 @@
               <w:rPr>
                 <w:noProof/>
               </w:rPr>
-              <w:instrText xml:space="preserve"> PAGEREF _Toc240888459 \h </w:instrText>
+              <w:instrText xml:space="preserve"> PAGEREF _Toc240916553 \h </w:instrText>
             </w:r>
             <w:r>
               <w:rPr>
@@ -1706,7 +1706,7 @@
               <w14:ligatures w14:val="standardContextual"/>
             </w:rPr>
           </w:pPr>
-          <w:hyperlink w:anchor="_Toc240888460" w:history="1">
+          <w:hyperlink w:anchor="_Toc240916554" w:history="1">
             <w:r>
               <w:rPr>
                 <w:rStyle w:val="Hyperlink"/>
@@ -1730,7 +1730,7 @@
               <w:rPr>
                 <w:noProof/>
               </w:rPr>
-              <w:instrText xml:space="preserve"> PAGEREF _Toc240888460 \h </w:instrText>
+              <w:instrText xml:space="preserve"> PAGEREF _Toc240916554 \h </w:instrText>
             </w:r>
             <w:r>
               <w:rPr>
@@ -1773,7 +1773,7 @@
               <w14:ligatures w14:val="standardContextual"/>
             </w:rPr>
           </w:pPr>
-          <w:hyperlink w:anchor="_Toc240888461" w:history="1">
+          <w:hyperlink w:anchor="_Toc240916555" w:history="1">
             <w:r>
               <w:rPr>
                 <w:rStyle w:val="Hyperlink"/>
@@ -1797,7 +1797,7 @@
               <w:rPr>
                 <w:noProof/>
               </w:rPr>
-              <w:instrText xml:space="preserve"> PAGEREF _Toc240888461 \h </w:instrText>
+              <w:instrText xml:space="preserve"> PAGEREF _Toc240916555 \h </w:instrText>
             </w:r>
             <w:r>
               <w:rPr>
@@ -1840,7 +1840,7 @@
               <w14:ligatures w14:val="standardContextual"/>
             </w:rPr>
           </w:pPr>
-          <w:hyperlink w:anchor="_Toc240888462" w:history="1">
+          <w:hyperlink w:anchor="_Toc240916556" w:history="1">
             <w:r>
               <w:rPr>
                 <w:rStyle w:val="Hyperlink"/>
@@ -1864,7 +1864,7 @@
               <w:rPr>
                 <w:noProof/>
               </w:rPr>
-              <w:instrText xml:space="preserve"> PAGEREF _Toc240888462 \h </w:instrText>
+              <w:instrText xml:space="preserve"> PAGEREF _Toc240916556 \h </w:instrText>
             </w:r>
             <w:r>
               <w:rPr>
@@ -1907,7 +1907,7 @@
               <w14:ligatures w14:val="standardContextual"/>
             </w:rPr>
           </w:pPr>
-          <w:hyperlink w:anchor="_Toc240888463" w:history="1">
+          <w:hyperlink w:anchor="_Toc240916557" w:history="1">
             <w:r>
               <w:rPr>
                 <w:rStyle w:val="Hyperlink"/>
@@ -1931,7 +1931,7 @@
               <w:rPr>
                 <w:noProof/>
               </w:rPr>
-              <w:instrText xml:space="preserve"> PAGEREF _Toc240888463 \h </w:instrText>
+              <w:instrText xml:space="preserve"> PAGEREF _Toc240916557 \h </w:instrText>
             </w:r>
             <w:r>
               <w:rPr>
@@ -1974,7 +1974,7 @@
               <w14:ligatures w14:val="standardContextual"/>
             </w:rPr>
           </w:pPr>
-          <w:hyperlink w:anchor="_Toc240888464" w:history="1">
+          <w:hyperlink w:anchor="_Toc240916558" w:history="1">
             <w:r>
               <w:rPr>
                 <w:rStyle w:val="Hyperlink"/>
@@ -1998,7 +1998,7 @@
               <w:rPr>
                 <w:noProof/>
               </w:rPr>
-              <w:instrText xml:space="preserve"> PAGEREF _Toc240888464 \h </w:instrText>
+              <w:instrText xml:space="preserve"> PAGEREF _Toc240916558 \h </w:instrText>
             </w:r>
             <w:r>
               <w:rPr>
@@ -2041,7 +2041,7 @@
               <w14:ligatures w14:val="standardContextual"/>
             </w:rPr>
           </w:pPr>
-          <w:hyperlink w:anchor="_Toc240888465" w:history="1">
+          <w:hyperlink w:anchor="_Toc240916559" w:history="1">
             <w:r>
               <w:rPr>
                 <w:rStyle w:val="Hyperlink"/>
@@ -2065,7 +2065,7 @@
               <w:rPr>
                 <w:noProof/>
               </w:rPr>
-              <w:instrText xml:space="preserve"> PAGEREF _Toc240888465 \h </w:instrText>
+              <w:instrText xml:space="preserve"> PAGEREF _Toc240916559 \h </w:instrText>
             </w:r>
             <w:r>
               <w:rPr>
@@ -2108,7 +2108,7 @@
               <w14:ligatures w14:val="standardContextual"/>
             </w:rPr>
           </w:pPr>
-          <w:hyperlink w:anchor="_Toc240888466" w:history="1">
+          <w:hyperlink w:anchor="_Toc240916560" w:history="1">
             <w:r>
               <w:rPr>
                 <w:rStyle w:val="Hyperlink"/>
@@ -2132,7 +2132,7 @@
               <w:rPr>
                 <w:noProof/>
               </w:rPr>
-              <w:instrText xml:space="preserve"> PAGEREF _Toc240888466 \h </w:instrText>
+              <w:instrText xml:space="preserve"> PAGEREF _Toc240916560 \h </w:instrText>
             </w:r>
             <w:r>
               <w:rPr>
@@ -2175,7 +2175,7 @@
               <w14:ligatures w14:val="standardContextual"/>
             </w:rPr>
           </w:pPr>
-          <w:hyperlink w:anchor="_Toc240888467" w:history="1">
+          <w:hyperlink w:anchor="_Toc240916561" w:history="1">
             <w:r>
               <w:rPr>
                 <w:rStyle w:val="Hyperlink"/>
@@ -2199,7 +2199,7 @@
               <w:rPr>
                 <w:noProof/>
               </w:rPr>
-              <w:instrText xml:space="preserve"> PAGEREF _Toc240888467 \h </w:instrText>
+              <w:instrText xml:space="preserve"> PAGEREF _Toc240916561 \h </w:instrText>
             </w:r>
             <w:r>
               <w:rPr>
@@ -2242,7 +2242,7 @@
               <w14:ligatures w14:val="standardContextual"/>
             </w:rPr>
           </w:pPr>
-          <w:hyperlink w:anchor="_Toc240888468" w:history="1">
+          <w:hyperlink w:anchor="_Toc240916562" w:history="1">
             <w:r>
               <w:rPr>
                 <w:rStyle w:val="Hyperlink"/>
@@ -2266,7 +2266,7 @@
               <w:rPr>
                 <w:noProof/>
               </w:rPr>
-              <w:instrText xml:space="preserve"> PAGEREF _Toc240888468 \h </w:instrText>
+              <w:instrText xml:space="preserve"> PAGEREF _Toc240916562 \h </w:instrText>
             </w:r>
             <w:r>
               <w:rPr>
@@ -2309,7 +2309,7 @@
               <w14:ligatures w14:val="standardContextual"/>
             </w:rPr>
           </w:pPr>
-          <w:hyperlink w:anchor="_Toc240888469" w:history="1">
+          <w:hyperlink w:anchor="_Toc240916563" w:history="1">
             <w:r>
               <w:rPr>
                 <w:rStyle w:val="Hyperlink"/>
@@ -2333,7 +2333,7 @@
               <w:rPr>
                 <w:noProof/>
               </w:rPr>
-              <w:instrText xml:space="preserve"> PAGEREF _Toc240888469 \h </w:instrText>
+              <w:instrText xml:space="preserve"> PAGEREF _Toc240916563 \h </w:instrText>
             </w:r>
             <w:r>
               <w:rPr>
@@ -2376,7 +2376,7 @@
               <w14:ligatures w14:val="standardContextual"/>
             </w:rPr>
           </w:pPr>
-          <w:hyperlink w:anchor="_Toc240888470" w:history="1">
+          <w:hyperlink w:anchor="_Toc240916564" w:history="1">
             <w:r>
               <w:rPr>
                 <w:rStyle w:val="Hyperlink"/>
@@ -2400,7 +2400,7 @@
               <w:rPr>
                 <w:noProof/>
               </w:rPr>
-              <w:instrText xml:space="preserve"> PAGEREF _Toc240888470 \h </w:instrText>
+              <w:instrText xml:space="preserve"> PAGEREF _Toc240916564 \h </w:instrText>
             </w:r>
             <w:r>
               <w:rPr>
@@ -2443,7 +2443,7 @@
               <w14:ligatures w14:val="standardContextual"/>
             </w:rPr>
           </w:pPr>
-          <w:hyperlink w:anchor="_Toc240888471" w:history="1">
+          <w:hyperlink w:anchor="_Toc240916565" w:history="1">
             <w:r>
               <w:rPr>
                 <w:rStyle w:val="Hyperlink"/>
@@ -2467,7 +2467,7 @@
               <w:rPr>
                 <w:noProof/>
               </w:rPr>
-              <w:instrText xml:space="preserve"> PAGEREF _Toc240888471 \h </w:instrText>
+              <w:instrText xml:space="preserve"> PAGEREF _Toc240916565 \h </w:instrText>
             </w:r>
             <w:r>
               <w:rPr>
@@ -2510,7 +2510,7 @@
               <w14:ligatures w14:val="standardContextual"/>
             </w:rPr>
           </w:pPr>
-          <w:hyperlink w:anchor="_Toc240888472" w:history="1">
+          <w:hyperlink w:anchor="_Toc240916566" w:history="1">
             <w:r>
               <w:rPr>
                 <w:rStyle w:val="Hyperlink"/>
@@ -2534,7 +2534,7 @@
               <w:rPr>
                 <w:noProof/>
               </w:rPr>
-              <w:instrText xml:space="preserve"> PAGEREF _Toc240888472 \h </w:instrText>
+              <w:instrText xml:space="preserve"> PAGEREF _Toc240916566 \h </w:instrText>
             </w:r>
             <w:r>
               <w:rPr>
@@ -2577,7 +2577,7 @@
               <w14:ligatures w14:val="standardContextual"/>
             </w:rPr>
           </w:pPr>
-          <w:hyperlink w:anchor="_Toc240888473" w:history="1">
+          <w:hyperlink w:anchor="_Toc240916567" w:history="1">
             <w:r>
               <w:rPr>
                 <w:rStyle w:val="Hyperlink"/>
@@ -2601,7 +2601,7 @@
               <w:rPr>
                 <w:noProof/>
               </w:rPr>
-              <w:instrText xml:space="preserve"> PAGEREF _Toc240888473 \h </w:instrText>
+              <w:instrText xml:space="preserve"> PAGEREF _Toc240916567 \h </w:instrText>
             </w:r>
             <w:r>
               <w:rPr>
@@ -2644,7 +2644,7 @@
               <w14:ligatures w14:val="standardContextual"/>
             </w:rPr>
           </w:pPr>
-          <w:hyperlink w:anchor="_Toc240888474" w:history="1">
+          <w:hyperlink w:anchor="_Toc240916568" w:history="1">
             <w:r>
               <w:rPr>
                 <w:rStyle w:val="Hyperlink"/>
@@ -2668,7 +2668,7 @@
               <w:rPr>
                 <w:noProof/>
               </w:rPr>
-              <w:instrText xml:space="preserve"> PAGEREF _Toc240888474 \h </w:instrText>
+              <w:instrText xml:space="preserve"> PAGEREF _Toc240916568 \h </w:instrText>
             </w:r>
             <w:r>
               <w:rPr>
@@ -2711,7 +2711,7 @@
               <w14:ligatures w14:val="standardContextual"/>
             </w:rPr>
           </w:pPr>
-          <w:hyperlink w:anchor="_Toc240888475" w:history="1">
+          <w:hyperlink w:anchor="_Toc240916569" w:history="1">
             <w:r>
               <w:rPr>
                 <w:rStyle w:val="Hyperlink"/>
@@ -2735,7 +2735,7 @@
               <w:rPr>
                 <w:noProof/>
               </w:rPr>
-              <w:instrText xml:space="preserve"> PAGEREF _Toc240888475 \h </w:instrText>
+              <w:instrText xml:space="preserve"> PAGEREF _Toc240916569 \h </w:instrText>
             </w:r>
             <w:r>
               <w:rPr>
@@ -2778,7 +2778,7 @@
               <w14:ligatures w14:val="standardContextual"/>
             </w:rPr>
           </w:pPr>
-          <w:hyperlink w:anchor="_Toc240888476" w:history="1">
+          <w:hyperlink w:anchor="_Toc240916570" w:history="1">
             <w:r>
               <w:rPr>
                 <w:rStyle w:val="Hyperlink"/>
@@ -2802,7 +2802,7 @@
               <w:rPr>
                 <w:noProof/>
               </w:rPr>
-              <w:instrText xml:space="preserve"> PAGEREF _Toc240888476 \h </w:instrText>
+              <w:instrText xml:space="preserve"> PAGEREF _Toc240916570 \h </w:instrText>
             </w:r>
             <w:r>
               <w:rPr>
@@ -2845,7 +2845,7 @@
               <w14:ligatures w14:val="standardContextual"/>
             </w:rPr>
           </w:pPr>
-          <w:hyperlink w:anchor="_Toc240888477" w:history="1">
+          <w:hyperlink w:anchor="_Toc240916571" w:history="1">
             <w:r>
               <w:rPr>
                 <w:rStyle w:val="Hyperlink"/>
@@ -2869,7 +2869,7 @@
               <w:rPr>
                 <w:noProof/>
               </w:rPr>
-              <w:instrText xml:space="preserve"> PAGEREF _Toc240888477 \h </w:instrText>
+              <w:instrText xml:space="preserve"> PAGEREF _Toc240916571 \h </w:instrText>
             </w:r>
             <w:r>
               <w:rPr>
@@ -2912,7 +2912,7 @@
               <w14:ligatures w14:val="standardContextual"/>
             </w:rPr>
           </w:pPr>
-          <w:hyperlink w:anchor="_Toc240888478" w:history="1">
+          <w:hyperlink w:anchor="_Toc240916572" w:history="1">
             <w:r>
               <w:rPr>
                 <w:rStyle w:val="Hyperlink"/>
@@ -2936,7 +2936,7 @@
               <w:rPr>
                 <w:noProof/>
               </w:rPr>
-              <w:instrText xml:space="preserve"> PAGEREF _Toc240888478 \h </w:instrText>
+              <w:instrText xml:space="preserve"> PAGEREF _Toc240916572 \h </w:instrText>
             </w:r>
             <w:r>
               <w:rPr>
@@ -2979,7 +2979,7 @@
               <w14:ligatures w14:val="standardContextual"/>
             </w:rPr>
           </w:pPr>
-          <w:hyperlink w:anchor="_Toc240888479" w:history="1">
+          <w:hyperlink w:anchor="_Toc240916573" w:history="1">
             <w:r>
               <w:rPr>
                 <w:rStyle w:val="Hyperlink"/>
@@ -3003,7 +3003,7 @@
               <w:rPr>
                 <w:noProof/>
               </w:rPr>
-              <w:instrText xml:space="preserve"> PAGEREF _Toc240888479 \h </w:instrText>
+              <w:instrText xml:space="preserve"> PAGEREF _Toc240916573 \h </w:instrText>
             </w:r>
             <w:r>
               <w:rPr>
@@ -3046,7 +3046,7 @@
               <w14:ligatures w14:val="standardContextual"/>
             </w:rPr>
           </w:pPr>
-          <w:hyperlink w:anchor="_Toc240888480" w:history="1">
+          <w:hyperlink w:anchor="_Toc240916574" w:history="1">
             <w:r>
               <w:rPr>
                 <w:rStyle w:val="Hyperlink"/>
@@ -3070,7 +3070,7 @@
               <w:rPr>
                 <w:noProof/>
               </w:rPr>
-              <w:instrText xml:space="preserve"> PAGEREF _Toc240888480 \h </w:instrText>
+              <w:instrText xml:space="preserve"> PAGEREF _Toc240916574 \h </w:instrText>
             </w:r>
             <w:r>
               <w:rPr>
@@ -3113,7 +3113,7 @@
               <w14:ligatures w14:val="standardContextual"/>
             </w:rPr>
           </w:pPr>
-          <w:hyperlink w:anchor="_Toc240888481" w:history="1">
+          <w:hyperlink w:anchor="_Toc240916575" w:history="1">
             <w:r>
               <w:rPr>
                 <w:rStyle w:val="Hyperlink"/>
@@ -3137,7 +3137,7 @@
               <w:rPr>
                 <w:noProof/>
               </w:rPr>
-              <w:instrText xml:space="preserve"> PAGEREF _Toc240888481 \h </w:instrText>
+              <w:instrText xml:space="preserve"> PAGEREF _Toc240916575 \h </w:instrText>
             </w:r>
             <w:r>
               <w:rPr>
@@ -3180,7 +3180,7 @@
               <w14:ligatures w14:val="standardContextual"/>
             </w:rPr>
           </w:pPr>
-          <w:hyperlink w:anchor="_Toc240888482" w:history="1">
+          <w:hyperlink w:anchor="_Toc240916576" w:history="1">
             <w:r>
               <w:rPr>
                 <w:rStyle w:val="Hyperlink"/>
@@ -3204,7 +3204,7 @@
               <w:rPr>
                 <w:noProof/>
               </w:rPr>
-              <w:instrText xml:space="preserve"> PAGEREF _Toc240888482 \h </w:instrText>
+              <w:instrText xml:space="preserve"> PAGEREF _Toc240916576 \h </w:instrText>
             </w:r>
             <w:r>
               <w:rPr>
@@ -3243,7 +3243,7 @@
         <w:pStyle w:val="Heading1"/>
         <w:pageBreakBefore/>
       </w:pPr>
-      <w:bookmarkStart w:id="0" w:name="_Toc240888443"/>
+      <w:bookmarkStart w:id="0" w:name="_Toc240916537"/>
       <w:r>
         <w:lastRenderedPageBreak/>
         <w:t>1. About this reference</w:t>
@@ -3309,7 +3309,7 @@
           <w:left w:w="10" w:type="dxa"/>
           <w:right w:w="10" w:type="dxa"/>
         </w:tblCellMar>
-        <w:tblLook w:val="04A0" w:firstRow="1" w:lastRow="0" w:firstColumn="1" w:lastColumn="0" w:noHBand="0" w:noVBand="1"/>
+        <w:tblLook w:val="0000" w:firstRow="0" w:lastRow="0" w:firstColumn="0" w:lastColumn="0" w:noHBand="0" w:noVBand="0"/>
       </w:tblPr>
       <w:tblGrid>
         <w:gridCol w:w="2635"/>
@@ -3696,7 +3696,7 @@
         <w:pStyle w:val="Heading1"/>
         <w:pageBreakBefore/>
       </w:pPr>
-      <w:bookmarkStart w:id="1" w:name="_Toc240888444"/>
+      <w:bookmarkStart w:id="1" w:name="_Toc240916538"/>
       <w:r>
         <w:lastRenderedPageBreak/>
         <w:t>2. Rules that apply on every screen</w:t>
@@ -3913,7 +3913,7 @@
         <w:pStyle w:val="Heading1"/>
         <w:pageBreakBefore/>
       </w:pPr>
-      <w:bookmarkStart w:id="2" w:name="_Toc240888445"/>
+      <w:bookmarkStart w:id="2" w:name="_Toc240916539"/>
       <w:r>
         <w:lastRenderedPageBreak/>
         <w:t>3. Who can open which screen</w:t>
@@ -3943,7 +3943,7 @@
           <w:left w:w="10" w:type="dxa"/>
           <w:right w:w="10" w:type="dxa"/>
         </w:tblCellMar>
-        <w:tblLook w:val="04A0" w:firstRow="1" w:lastRow="0" w:firstColumn="1" w:lastColumn="0" w:noHBand="0" w:noVBand="1"/>
+        <w:tblLook w:val="0000" w:firstRow="0" w:lastRow="0" w:firstColumn="0" w:lastColumn="0" w:noHBand="0" w:noVBand="0"/>
       </w:tblPr>
       <w:tblGrid>
         <w:gridCol w:w="3388"/>
@@ -9243,7 +9243,7 @@
         <w:pStyle w:val="Heading1"/>
         <w:pageBreakBefore/>
       </w:pPr>
-      <w:bookmarkStart w:id="3" w:name="_Toc240888446"/>
+      <w:bookmarkStart w:id="3" w:name="_Toc240916540"/>
       <w:r>
         <w:lastRenderedPageBreak/>
         <w:t>4. Signing in and your account</w:t>
@@ -9254,7 +9254,7 @@
       <w:pPr>
         <w:pStyle w:val="Heading2"/>
       </w:pPr>
-      <w:bookmarkStart w:id="4" w:name="_Toc240888447"/>
+      <w:bookmarkStart w:id="4" w:name="_Toc240916541"/>
       <w:r>
         <w:t>4.1 Sign in</w:t>
       </w:r>
@@ -9317,7 +9317,7 @@
           <w:left w:w="10" w:type="dxa"/>
           <w:right w:w="10" w:type="dxa"/>
         </w:tblCellMar>
-        <w:tblLook w:val="04A0" w:firstRow="1" w:lastRow="0" w:firstColumn="1" w:lastColumn="0" w:noHBand="0" w:noVBand="1"/>
+        <w:tblLook w:val="0000" w:firstRow="0" w:lastRow="0" w:firstColumn="0" w:lastColumn="0" w:noHBand="0" w:noVBand="0"/>
       </w:tblPr>
       <w:tblGrid>
         <w:gridCol w:w="1882"/>
@@ -9767,7 +9767,7 @@
       <w:pPr>
         <w:pStyle w:val="Heading2"/>
       </w:pPr>
-      <w:bookmarkStart w:id="5" w:name="_Toc240888448"/>
+      <w:bookmarkStart w:id="5" w:name="_Toc240916542"/>
       <w:r>
         <w:t>4.2 The header and menu bar (every screen)</w:t>
       </w:r>
@@ -9830,7 +9830,7 @@
           <w:left w:w="10" w:type="dxa"/>
           <w:right w:w="10" w:type="dxa"/>
         </w:tblCellMar>
-        <w:tblLook w:val="04A0" w:firstRow="1" w:lastRow="0" w:firstColumn="1" w:lastColumn="0" w:noHBand="0" w:noVBand="1"/>
+        <w:tblLook w:val="0000" w:firstRow="0" w:lastRow="0" w:firstColumn="0" w:lastColumn="0" w:noHBand="0" w:noVBand="0"/>
       </w:tblPr>
       <w:tblGrid>
         <w:gridCol w:w="1882"/>
@@ -10490,7 +10490,7 @@
       <w:pPr>
         <w:pStyle w:val="Heading2"/>
       </w:pPr>
-      <w:bookmarkStart w:id="6" w:name="_Toc240888449"/>
+      <w:bookmarkStart w:id="6" w:name="_Toc240916543"/>
       <w:r>
         <w:lastRenderedPageBreak/>
         <w:t>4.3 Change Password</w:t>
@@ -10554,7 +10554,7 @@
           <w:left w:w="10" w:type="dxa"/>
           <w:right w:w="10" w:type="dxa"/>
         </w:tblCellMar>
-        <w:tblLook w:val="04A0" w:firstRow="1" w:lastRow="0" w:firstColumn="1" w:lastColumn="0" w:noHBand="0" w:noVBand="1"/>
+        <w:tblLook w:val="0000" w:firstRow="0" w:lastRow="0" w:firstColumn="0" w:lastColumn="0" w:noHBand="0" w:noVBand="0"/>
       </w:tblPr>
       <w:tblGrid>
         <w:gridCol w:w="1882"/>
@@ -11112,7 +11112,7 @@
         <w:pStyle w:val="Heading1"/>
         <w:pageBreakBefore/>
       </w:pPr>
-      <w:bookmarkStart w:id="7" w:name="_Toc240888450"/>
+      <w:bookmarkStart w:id="7" w:name="_Toc240916544"/>
       <w:r>
         <w:lastRenderedPageBreak/>
         <w:t>5. Dashboards and Reports (read-only)</w:t>
@@ -11123,7 +11123,7 @@
       <w:pPr>
         <w:pStyle w:val="Heading2"/>
       </w:pPr>
-      <w:bookmarkStart w:id="8" w:name="_Toc240888451"/>
+      <w:bookmarkStart w:id="8" w:name="_Toc240916545"/>
       <w:r>
         <w:t>5.1 Executive Dashboard</w:t>
       </w:r>
@@ -11186,7 +11186,7 @@
           <w:left w:w="10" w:type="dxa"/>
           <w:right w:w="10" w:type="dxa"/>
         </w:tblCellMar>
-        <w:tblLook w:val="04A0" w:firstRow="1" w:lastRow="0" w:firstColumn="1" w:lastColumn="0" w:noHBand="0" w:noVBand="1"/>
+        <w:tblLook w:val="0000" w:firstRow="0" w:lastRow="0" w:firstColumn="0" w:lastColumn="0" w:noHBand="0" w:noVBand="0"/>
       </w:tblPr>
       <w:tblGrid>
         <w:gridCol w:w="1882"/>
@@ -11636,7 +11636,7 @@
       <w:pPr>
         <w:pStyle w:val="Heading2"/>
       </w:pPr>
-      <w:bookmarkStart w:id="9" w:name="_Toc240888452"/>
+      <w:bookmarkStart w:id="9" w:name="_Toc240916546"/>
       <w:r>
         <w:t>5.2 Sampling Dashboard</w:t>
       </w:r>
@@ -11699,7 +11699,7 @@
           <w:left w:w="10" w:type="dxa"/>
           <w:right w:w="10" w:type="dxa"/>
         </w:tblCellMar>
-        <w:tblLook w:val="04A0" w:firstRow="1" w:lastRow="0" w:firstColumn="1" w:lastColumn="0" w:noHBand="0" w:noVBand="1"/>
+        <w:tblLook w:val="0000" w:firstRow="0" w:lastRow="0" w:firstColumn="0" w:lastColumn="0" w:noHBand="0" w:noVBand="0"/>
       </w:tblPr>
       <w:tblGrid>
         <w:gridCol w:w="1882"/>
@@ -12149,7 +12149,7 @@
       <w:pPr>
         <w:pStyle w:val="Heading2"/>
       </w:pPr>
-      <w:bookmarkStart w:id="10" w:name="_Toc240888453"/>
+      <w:bookmarkStart w:id="10" w:name="_Toc240916547"/>
       <w:r>
         <w:t>5.3 Contact Dashboard</w:t>
       </w:r>
@@ -12213,7 +12213,7 @@
           <w:left w:w="10" w:type="dxa"/>
           <w:right w:w="10" w:type="dxa"/>
         </w:tblCellMar>
-        <w:tblLook w:val="04A0" w:firstRow="1" w:lastRow="0" w:firstColumn="1" w:lastColumn="0" w:noHBand="0" w:noVBand="1"/>
+        <w:tblLook w:val="0000" w:firstRow="0" w:lastRow="0" w:firstColumn="0" w:lastColumn="0" w:noHBand="0" w:noVBand="0"/>
       </w:tblPr>
       <w:tblGrid>
         <w:gridCol w:w="1882"/>
@@ -12453,7 +12453,7 @@
       <w:pPr>
         <w:pStyle w:val="Heading2"/>
       </w:pPr>
-      <w:bookmarkStart w:id="11" w:name="_Toc240888454"/>
+      <w:bookmarkStart w:id="11" w:name="_Toc240916548"/>
       <w:r>
         <w:t>5.4 QA Dashboard</w:t>
       </w:r>
@@ -12516,7 +12516,7 @@
           <w:left w:w="10" w:type="dxa"/>
           <w:right w:w="10" w:type="dxa"/>
         </w:tblCellMar>
-        <w:tblLook w:val="04A0" w:firstRow="1" w:lastRow="0" w:firstColumn="1" w:lastColumn="0" w:noHBand="0" w:noVBand="1"/>
+        <w:tblLook w:val="0000" w:firstRow="0" w:lastRow="0" w:firstColumn="0" w:lastColumn="0" w:noHBand="0" w:noVBand="0"/>
       </w:tblPr>
       <w:tblGrid>
         <w:gridCol w:w="1882"/>
@@ -13073,7 +13073,7 @@
       <w:pPr>
         <w:pStyle w:val="Heading2"/>
       </w:pPr>
-      <w:bookmarkStart w:id="12" w:name="_Toc240888455"/>
+      <w:bookmarkStart w:id="12" w:name="_Toc240916549"/>
       <w:r>
         <w:t>5.5 KII / Document Dashboard</w:t>
       </w:r>
@@ -13136,7 +13136,7 @@
           <w:left w:w="10" w:type="dxa"/>
           <w:right w:w="10" w:type="dxa"/>
         </w:tblCellMar>
-        <w:tblLook w:val="04A0" w:firstRow="1" w:lastRow="0" w:firstColumn="1" w:lastColumn="0" w:noHBand="0" w:noVBand="1"/>
+        <w:tblLook w:val="0000" w:firstRow="0" w:lastRow="0" w:firstColumn="0" w:lastColumn="0" w:noHBand="0" w:noVBand="0"/>
       </w:tblPr>
       <w:tblGrid>
         <w:gridCol w:w="1882"/>
@@ -13483,7 +13483,7 @@
       <w:pPr>
         <w:pStyle w:val="Heading2"/>
       </w:pPr>
-      <w:bookmarkStart w:id="13" w:name="_Toc240888456"/>
+      <w:bookmarkStart w:id="13" w:name="_Toc240916550"/>
       <w:r>
         <w:lastRenderedPageBreak/>
         <w:t>5.6 Reports</w:t>
@@ -13547,7 +13547,7 @@
           <w:left w:w="10" w:type="dxa"/>
           <w:right w:w="10" w:type="dxa"/>
         </w:tblCellMar>
-        <w:tblLook w:val="04A0" w:firstRow="1" w:lastRow="0" w:firstColumn="1" w:lastColumn="0" w:noHBand="0" w:noVBand="1"/>
+        <w:tblLook w:val="0000" w:firstRow="0" w:lastRow="0" w:firstColumn="0" w:lastColumn="0" w:noHBand="0" w:noVBand="0"/>
       </w:tblPr>
       <w:tblGrid>
         <w:gridCol w:w="1882"/>
@@ -13998,7 +13998,7 @@
         <w:pStyle w:val="Heading1"/>
         <w:pageBreakBefore/>
       </w:pPr>
-      <w:bookmarkStart w:id="14" w:name="_Toc240888457"/>
+      <w:bookmarkStart w:id="14" w:name="_Toc240916551"/>
       <w:r>
         <w:lastRenderedPageBreak/>
         <w:t>6. The sample and contact</w:t>
@@ -14009,7 +14009,7 @@
       <w:pPr>
         <w:pStyle w:val="Heading2"/>
       </w:pPr>
-      <w:bookmarkStart w:id="15" w:name="_Toc240888458"/>
+      <w:bookmarkStart w:id="15" w:name="_Toc240916552"/>
       <w:r>
         <w:t>6.1 Main-400 Register (and Reserve)</w:t>
       </w:r>
@@ -14072,7 +14072,7 @@
           <w:left w:w="10" w:type="dxa"/>
           <w:right w:w="10" w:type="dxa"/>
         </w:tblCellMar>
-        <w:tblLook w:val="04A0" w:firstRow="1" w:lastRow="0" w:firstColumn="1" w:lastColumn="0" w:noHBand="0" w:noVBand="1"/>
+        <w:tblLook w:val="0000" w:firstRow="0" w:lastRow="0" w:firstColumn="0" w:lastColumn="0" w:noHBand="0" w:noVBand="0"/>
       </w:tblPr>
       <w:tblGrid>
         <w:gridCol w:w="1882"/>
@@ -14942,7 +14942,7 @@
       <w:pPr>
         <w:pStyle w:val="Heading2"/>
       </w:pPr>
-      <w:bookmarkStart w:id="16" w:name="_Toc240888459"/>
+      <w:bookmarkStart w:id="16" w:name="_Toc240916553"/>
       <w:r>
         <w:t>6.2 Case page</w:t>
       </w:r>
@@ -15005,7 +15005,7 @@
           <w:left w:w="10" w:type="dxa"/>
           <w:right w:w="10" w:type="dxa"/>
         </w:tblCellMar>
-        <w:tblLook w:val="04A0" w:firstRow="1" w:lastRow="0" w:firstColumn="1" w:lastColumn="0" w:noHBand="0" w:noVBand="1"/>
+        <w:tblLook w:val="0000" w:firstRow="0" w:lastRow="0" w:firstColumn="0" w:lastColumn="0" w:noHBand="0" w:noVBand="0"/>
       </w:tblPr>
       <w:tblGrid>
         <w:gridCol w:w="1882"/>
@@ -16621,7 +16621,7 @@
       <w:pPr>
         <w:pStyle w:val="Heading2"/>
       </w:pPr>
-      <w:bookmarkStart w:id="17" w:name="_Toc240888460"/>
+      <w:bookmarkStart w:id="17" w:name="_Toc240916554"/>
       <w:r>
         <w:t>6.3 Pre-Interview Profile (PROIT) and its review screen</w:t>
       </w:r>
@@ -16684,7 +16684,7 @@
           <w:left w:w="10" w:type="dxa"/>
           <w:right w:w="10" w:type="dxa"/>
         </w:tblCellMar>
-        <w:tblLook w:val="04A0" w:firstRow="1" w:lastRow="0" w:firstColumn="1" w:lastColumn="0" w:noHBand="0" w:noVBand="1"/>
+        <w:tblLook w:val="0000" w:firstRow="0" w:lastRow="0" w:firstColumn="0" w:lastColumn="0" w:noHBand="0" w:noVBand="0"/>
       </w:tblPr>
       <w:tblGrid>
         <w:gridCol w:w="1882"/>
@@ -17555,7 +17555,7 @@
       <w:pPr>
         <w:pStyle w:val="Heading2"/>
       </w:pPr>
-      <w:bookmarkStart w:id="18" w:name="_Toc240888461"/>
+      <w:bookmarkStart w:id="18" w:name="_Toc240916555"/>
       <w:r>
         <w:t>6.4 Register Organisation</w:t>
       </w:r>
@@ -17618,7 +17618,7 @@
           <w:left w:w="10" w:type="dxa"/>
           <w:right w:w="10" w:type="dxa"/>
         </w:tblCellMar>
-        <w:tblLook w:val="04A0" w:firstRow="1" w:lastRow="0" w:firstColumn="1" w:lastColumn="0" w:noHBand="0" w:noVBand="1"/>
+        <w:tblLook w:val="0000" w:firstRow="0" w:lastRow="0" w:firstColumn="0" w:lastColumn="0" w:noHBand="0" w:noVBand="0"/>
       </w:tblPr>
       <w:tblGrid>
         <w:gridCol w:w="1882"/>
@@ -18278,7 +18278,7 @@
       <w:pPr>
         <w:pStyle w:val="Heading2"/>
       </w:pPr>
-      <w:bookmarkStart w:id="19" w:name="_Toc240888462"/>
+      <w:bookmarkStart w:id="19" w:name="_Toc240916556"/>
       <w:r>
         <w:t>6.5 Appointment Queue</w:t>
       </w:r>
@@ -18342,7 +18342,7 @@
           <w:left w:w="10" w:type="dxa"/>
           <w:right w:w="10" w:type="dxa"/>
         </w:tblCellMar>
-        <w:tblLook w:val="04A0" w:firstRow="1" w:lastRow="0" w:firstColumn="1" w:lastColumn="0" w:noHBand="0" w:noVBand="1"/>
+        <w:tblLook w:val="0000" w:firstRow="0" w:lastRow="0" w:firstColumn="0" w:lastColumn="0" w:noHBand="0" w:noVBand="0"/>
       </w:tblPr>
       <w:tblGrid>
         <w:gridCol w:w="1882"/>
@@ -18899,7 +18899,7 @@
       <w:pPr>
         <w:pStyle w:val="Heading2"/>
       </w:pPr>
-      <w:bookmarkStart w:id="20" w:name="_Toc240888463"/>
+      <w:bookmarkStart w:id="20" w:name="_Toc240916557"/>
       <w:r>
         <w:t>6.6 Follow-ups due</w:t>
       </w:r>
@@ -18962,7 +18962,7 @@
           <w:left w:w="10" w:type="dxa"/>
           <w:right w:w="10" w:type="dxa"/>
         </w:tblCellMar>
-        <w:tblLook w:val="04A0" w:firstRow="1" w:lastRow="0" w:firstColumn="1" w:lastColumn="0" w:noHBand="0" w:noVBand="1"/>
+        <w:tblLook w:val="0000" w:firstRow="0" w:lastRow="0" w:firstColumn="0" w:lastColumn="0" w:noHBand="0" w:noVBand="0"/>
       </w:tblPr>
       <w:tblGrid>
         <w:gridCol w:w="1882"/>
@@ -19412,7 +19412,7 @@
       <w:pPr>
         <w:pStyle w:val="Heading2"/>
       </w:pPr>
-      <w:bookmarkStart w:id="21" w:name="_Toc240888464"/>
+      <w:bookmarkStart w:id="21" w:name="_Toc240916558"/>
       <w:r>
         <w:t>6.7 Reserve Activation</w:t>
       </w:r>
@@ -19475,7 +19475,7 @@
           <w:left w:w="10" w:type="dxa"/>
           <w:right w:w="10" w:type="dxa"/>
         </w:tblCellMar>
-        <w:tblLook w:val="04A0" w:firstRow="1" w:lastRow="0" w:firstColumn="1" w:lastColumn="0" w:noHBand="0" w:noVBand="1"/>
+        <w:tblLook w:val="0000" w:firstRow="0" w:lastRow="0" w:firstColumn="0" w:lastColumn="0" w:noHBand="0" w:noVBand="0"/>
       </w:tblPr>
       <w:tblGrid>
         <w:gridCol w:w="1882"/>
@@ -20034,7 +20034,7 @@
         <w:pStyle w:val="Heading1"/>
         <w:pageBreakBefore/>
       </w:pPr>
-      <w:bookmarkStart w:id="22" w:name="_Toc240888465"/>
+      <w:bookmarkStart w:id="22" w:name="_Toc240916559"/>
       <w:r>
         <w:lastRenderedPageBreak/>
         <w:t>7. Quality checking</w:t>
@@ -20045,7 +20045,7 @@
       <w:pPr>
         <w:pStyle w:val="Heading2"/>
       </w:pPr>
-      <w:bookmarkStart w:id="23" w:name="_Toc240888466"/>
+      <w:bookmarkStart w:id="23" w:name="_Toc240916560"/>
       <w:r>
         <w:t>7.1 QA Queue (with the KoboToolbox sync panel)</w:t>
       </w:r>
@@ -20108,7 +20108,7 @@
           <w:left w:w="10" w:type="dxa"/>
           <w:right w:w="10" w:type="dxa"/>
         </w:tblCellMar>
-        <w:tblLook w:val="04A0" w:firstRow="1" w:lastRow="0" w:firstColumn="1" w:lastColumn="0" w:noHBand="0" w:noVBand="1"/>
+        <w:tblLook w:val="0000" w:firstRow="0" w:lastRow="0" w:firstColumn="0" w:lastColumn="0" w:noHBand="0" w:noVBand="0"/>
       </w:tblPr>
       <w:tblGrid>
         <w:gridCol w:w="1882"/>
@@ -20768,7 +20768,7 @@
       <w:pPr>
         <w:pStyle w:val="Heading2"/>
       </w:pPr>
-      <w:bookmarkStart w:id="24" w:name="_Toc240888467"/>
+      <w:bookmarkStart w:id="24" w:name="_Toc240916561"/>
       <w:r>
         <w:t>7.2 QA Exceptions</w:t>
       </w:r>
@@ -20831,7 +20831,7 @@
           <w:left w:w="10" w:type="dxa"/>
           <w:right w:w="10" w:type="dxa"/>
         </w:tblCellMar>
-        <w:tblLook w:val="04A0" w:firstRow="1" w:lastRow="0" w:firstColumn="1" w:lastColumn="0" w:noHBand="0" w:noVBand="1"/>
+        <w:tblLook w:val="0000" w:firstRow="0" w:lastRow="0" w:firstColumn="0" w:lastColumn="0" w:noHBand="0" w:noVBand="0"/>
       </w:tblPr>
       <w:tblGrid>
         <w:gridCol w:w="1882"/>
@@ -21600,7 +21600,7 @@
         <w:pStyle w:val="Heading1"/>
         <w:pageBreakBefore/>
       </w:pPr>
-      <w:bookmarkStart w:id="25" w:name="_Toc240888468"/>
+      <w:bookmarkStart w:id="25" w:name="_Toc240916562"/>
       <w:r>
         <w:lastRenderedPageBreak/>
         <w:t>8. Key Informant Interviews</w:t>
@@ -21611,7 +21611,7 @@
       <w:pPr>
         <w:pStyle w:val="Heading2"/>
       </w:pPr>
-      <w:bookmarkStart w:id="26" w:name="_Toc240888469"/>
+      <w:bookmarkStart w:id="26" w:name="_Toc240916563"/>
       <w:r>
         <w:t>8.1 KII Register</w:t>
       </w:r>
@@ -21674,7 +21674,7 @@
           <w:left w:w="10" w:type="dxa"/>
           <w:right w:w="10" w:type="dxa"/>
         </w:tblCellMar>
-        <w:tblLook w:val="04A0" w:firstRow="1" w:lastRow="0" w:firstColumn="1" w:lastColumn="0" w:noHBand="0" w:noVBand="1"/>
+        <w:tblLook w:val="0000" w:firstRow="0" w:lastRow="0" w:firstColumn="0" w:lastColumn="0" w:noHBand="0" w:noVBand="0"/>
       </w:tblPr>
       <w:tblGrid>
         <w:gridCol w:w="1882"/>
@@ -22231,7 +22231,7 @@
       <w:pPr>
         <w:pStyle w:val="Heading2"/>
       </w:pPr>
-      <w:bookmarkStart w:id="27" w:name="_Toc240888470"/>
+      <w:bookmarkStart w:id="27" w:name="_Toc240916564"/>
       <w:r>
         <w:t>8.2 New KII Record</w:t>
       </w:r>
@@ -22294,7 +22294,7 @@
           <w:left w:w="10" w:type="dxa"/>
           <w:right w:w="10" w:type="dxa"/>
         </w:tblCellMar>
-        <w:tblLook w:val="04A0" w:firstRow="1" w:lastRow="0" w:firstColumn="1" w:lastColumn="0" w:noHBand="0" w:noVBand="1"/>
+        <w:tblLook w:val="0000" w:firstRow="0" w:lastRow="0" w:firstColumn="0" w:lastColumn="0" w:noHBand="0" w:noVBand="0"/>
       </w:tblPr>
       <w:tblGrid>
         <w:gridCol w:w="1882"/>
@@ -22641,7 +22641,7 @@
       <w:pPr>
         <w:pStyle w:val="Heading2"/>
       </w:pPr>
-      <w:bookmarkStart w:id="28" w:name="_Toc240888471"/>
+      <w:bookmarkStart w:id="28" w:name="_Toc240916565"/>
       <w:r>
         <w:t>8.3 KII record</w:t>
       </w:r>
@@ -22704,7 +22704,7 @@
           <w:left w:w="10" w:type="dxa"/>
           <w:right w:w="10" w:type="dxa"/>
         </w:tblCellMar>
-        <w:tblLook w:val="04A0" w:firstRow="1" w:lastRow="0" w:firstColumn="1" w:lastColumn="0" w:noHBand="0" w:noVBand="1"/>
+        <w:tblLook w:val="0000" w:firstRow="0" w:lastRow="0" w:firstColumn="0" w:lastColumn="0" w:noHBand="0" w:noVBand="0"/>
       </w:tblPr>
       <w:tblGrid>
         <w:gridCol w:w="1882"/>
@@ -23683,7 +23683,7 @@
         <w:pStyle w:val="Heading1"/>
         <w:pageBreakBefore/>
       </w:pPr>
-      <w:bookmarkStart w:id="29" w:name="_Toc240888472"/>
+      <w:bookmarkStart w:id="29" w:name="_Toc240916566"/>
       <w:r>
         <w:lastRenderedPageBreak/>
         <w:t>9. Documentary evidence</w:t>
@@ -23694,7 +23694,7 @@
       <w:pPr>
         <w:pStyle w:val="Heading2"/>
       </w:pPr>
-      <w:bookmarkStart w:id="30" w:name="_Toc240888473"/>
+      <w:bookmarkStart w:id="30" w:name="_Toc240916567"/>
       <w:r>
         <w:t>9.1 Documents (the corpus)</w:t>
       </w:r>
@@ -23757,7 +23757,7 @@
           <w:left w:w="10" w:type="dxa"/>
           <w:right w:w="10" w:type="dxa"/>
         </w:tblCellMar>
-        <w:tblLook w:val="04A0" w:firstRow="1" w:lastRow="0" w:firstColumn="1" w:lastColumn="0" w:noHBand="0" w:noVBand="1"/>
+        <w:tblLook w:val="0000" w:firstRow="0" w:lastRow="0" w:firstColumn="0" w:lastColumn="0" w:noHBand="0" w:noVBand="0"/>
       </w:tblPr>
       <w:tblGrid>
         <w:gridCol w:w="1882"/>
@@ -24314,7 +24314,7 @@
       <w:pPr>
         <w:pStyle w:val="Heading2"/>
       </w:pPr>
-      <w:bookmarkStart w:id="31" w:name="_Toc240888474"/>
+      <w:bookmarkStart w:id="31" w:name="_Toc240916568"/>
       <w:r>
         <w:t>9.2 New Documentary Evidence Record</w:t>
       </w:r>
@@ -24377,7 +24377,7 @@
           <w:left w:w="10" w:type="dxa"/>
           <w:right w:w="10" w:type="dxa"/>
         </w:tblCellMar>
-        <w:tblLook w:val="04A0" w:firstRow="1" w:lastRow="0" w:firstColumn="1" w:lastColumn="0" w:noHBand="0" w:noVBand="1"/>
+        <w:tblLook w:val="0000" w:firstRow="0" w:lastRow="0" w:firstColumn="0" w:lastColumn="0" w:noHBand="0" w:noVBand="0"/>
       </w:tblPr>
       <w:tblGrid>
         <w:gridCol w:w="1882"/>
@@ -25145,7 +25145,7 @@
       <w:pPr>
         <w:pStyle w:val="Heading2"/>
       </w:pPr>
-      <w:bookmarkStart w:id="32" w:name="_Toc240888475"/>
+      <w:bookmarkStart w:id="32" w:name="_Toc240916569"/>
       <w:r>
         <w:t>9.3 Document record</w:t>
       </w:r>
@@ -25208,7 +25208,7 @@
           <w:left w:w="10" w:type="dxa"/>
           <w:right w:w="10" w:type="dxa"/>
         </w:tblCellMar>
-        <w:tblLook w:val="04A0" w:firstRow="1" w:lastRow="0" w:firstColumn="1" w:lastColumn="0" w:noHBand="0" w:noVBand="1"/>
+        <w:tblLook w:val="0000" w:firstRow="0" w:lastRow="0" w:firstColumn="0" w:lastColumn="0" w:noHBand="0" w:noVBand="0"/>
       </w:tblPr>
       <w:tblGrid>
         <w:gridCol w:w="1882"/>
@@ -26499,7 +26499,7 @@
       <w:pPr>
         <w:pStyle w:val="Heading2"/>
       </w:pPr>
-      <w:bookmarkStart w:id="33" w:name="_Toc240888476"/>
+      <w:bookmarkStart w:id="33" w:name="_Toc240916570"/>
       <w:r>
         <w:t>9.4 Auto-fill review screen</w:t>
       </w:r>
@@ -26562,7 +26562,7 @@
           <w:left w:w="10" w:type="dxa"/>
           <w:right w:w="10" w:type="dxa"/>
         </w:tblCellMar>
-        <w:tblLook w:val="04A0" w:firstRow="1" w:lastRow="0" w:firstColumn="1" w:lastColumn="0" w:noHBand="0" w:noVBand="1"/>
+        <w:tblLook w:val="0000" w:firstRow="0" w:lastRow="0" w:firstColumn="0" w:lastColumn="0" w:noHBand="0" w:noVBand="0"/>
       </w:tblPr>
       <w:tblGrid>
         <w:gridCol w:w="1882"/>
@@ -27541,7 +27541,7 @@
         <w:pStyle w:val="Heading1"/>
         <w:pageBreakBefore/>
       </w:pPr>
-      <w:bookmarkStart w:id="34" w:name="_Toc240888477"/>
+      <w:bookmarkStart w:id="34" w:name="_Toc240916571"/>
       <w:r>
         <w:lastRenderedPageBreak/>
         <w:t>10. Completed forms and exports</w:t>
@@ -27552,7 +27552,7 @@
       <w:pPr>
         <w:pStyle w:val="Heading2"/>
       </w:pPr>
-      <w:bookmarkStart w:id="35" w:name="_Toc240888478"/>
+      <w:bookmarkStart w:id="35" w:name="_Toc240916572"/>
       <w:r>
         <w:t>10.1 Completed forms (Form PDFs)</w:t>
       </w:r>
@@ -27615,7 +27615,7 @@
           <w:left w:w="10" w:type="dxa"/>
           <w:right w:w="10" w:type="dxa"/>
         </w:tblCellMar>
-        <w:tblLook w:val="04A0" w:firstRow="1" w:lastRow="0" w:firstColumn="1" w:lastColumn="0" w:noHBand="0" w:noVBand="1"/>
+        <w:tblLook w:val="0000" w:firstRow="0" w:lastRow="0" w:firstColumn="0" w:lastColumn="0" w:noHBand="0" w:noVBand="0"/>
       </w:tblPr>
       <w:tblGrid>
         <w:gridCol w:w="1882"/>
@@ -28818,7 +28818,7 @@
         <w:pStyle w:val="Heading1"/>
         <w:pageBreakBefore/>
       </w:pPr>
-      <w:bookmarkStart w:id="36" w:name="_Toc240888479"/>
+      <w:bookmarkStart w:id="36" w:name="_Toc240916573"/>
       <w:r>
         <w:lastRenderedPageBreak/>
         <w:t>11. Study administration</w:t>
@@ -28829,7 +28829,7 @@
       <w:pPr>
         <w:pStyle w:val="Heading2"/>
       </w:pPr>
-      <w:bookmarkStart w:id="37" w:name="_Toc240888480"/>
+      <w:bookmarkStart w:id="37" w:name="_Toc240916574"/>
       <w:r>
         <w:t>11.1 Cost Dashboard</w:t>
       </w:r>
@@ -28892,7 +28892,7 @@
           <w:left w:w="10" w:type="dxa"/>
           <w:right w:w="10" w:type="dxa"/>
         </w:tblCellMar>
-        <w:tblLook w:val="04A0" w:firstRow="1" w:lastRow="0" w:firstColumn="1" w:lastColumn="0" w:noHBand="0" w:noVBand="1"/>
+        <w:tblLook w:val="0000" w:firstRow="0" w:lastRow="0" w:firstColumn="0" w:lastColumn="0" w:noHBand="0" w:noVBand="0"/>
       </w:tblPr>
       <w:tblGrid>
         <w:gridCol w:w="1882"/>
@@ -29239,7 +29239,7 @@
       <w:pPr>
         <w:pStyle w:val="Heading2"/>
       </w:pPr>
-      <w:bookmarkStart w:id="38" w:name="_Toc240888481"/>
+      <w:bookmarkStart w:id="38" w:name="_Toc240916575"/>
       <w:r>
         <w:t>11.2 Audit Log</w:t>
       </w:r>
@@ -29302,7 +29302,7 @@
           <w:left w:w="10" w:type="dxa"/>
           <w:right w:w="10" w:type="dxa"/>
         </w:tblCellMar>
-        <w:tblLook w:val="04A0" w:firstRow="1" w:lastRow="0" w:firstColumn="1" w:lastColumn="0" w:noHBand="0" w:noVBand="1"/>
+        <w:tblLook w:val="0000" w:firstRow="0" w:lastRow="0" w:firstColumn="0" w:lastColumn="0" w:noHBand="0" w:noVBand="0"/>
       </w:tblPr>
       <w:tblGrid>
         <w:gridCol w:w="1882"/>
@@ -29649,7 +29649,7 @@
       <w:pPr>
         <w:pStyle w:val="Heading2"/>
       </w:pPr>
-      <w:bookmarkStart w:id="39" w:name="_Toc240888482"/>
+      <w:bookmarkStart w:id="39" w:name="_Toc240916576"/>
       <w:r>
         <w:t>11.3 Export</w:t>
       </w:r>
@@ -29712,7 +29712,7 @@
           <w:left w:w="10" w:type="dxa"/>
           <w:right w:w="10" w:type="dxa"/>
         </w:tblCellMar>
-        <w:tblLook w:val="04A0" w:firstRow="1" w:lastRow="0" w:firstColumn="1" w:lastColumn="0" w:noHBand="0" w:noVBand="1"/>
+        <w:tblLook w:val="0000" w:firstRow="0" w:lastRow="0" w:firstColumn="0" w:lastColumn="0" w:noHBand="0" w:noVBand="0"/>
       </w:tblPr>
       <w:tblGrid>
         <w:gridCol w:w="1882"/>
@@ -30380,10 +30380,10 @@
 <file path=word/numbering.xml><?xml version="1.0" encoding="utf-8"?>
 <w:numbering xmlns:wpc="http://schemas.microsoft.com/office/word/2010/wordprocessingCanvas" xmlns:cx="http://schemas.microsoft.com/office/drawing/2014/chartex" xmlns:cx1="http://schemas.microsoft.com/office/drawing/2015/9/8/chartex" xmlns:cx2="http://schemas.microsoft.com/office/drawing/2015/10/21/chartex" xmlns:cx3="http://schemas.microsoft.com/office/drawing/2016/5/9/chartex" xmlns:cx4="http://schemas.microsoft.com/office/drawing/2016/5/10/chartex" xmlns:cx5="http://schemas.microsoft.com/office/drawing/2016/5/11/chartex" xmlns:cx6="http://schemas.microsoft.com/office/drawing/2016/5/12/chartex" xmlns:cx7="http://schemas.microsoft.com/office/drawing/2016/5/13/chartex" xmlns:cx8="http://schemas.microsoft.com/office/drawing/2016/5/14/chartex" xmlns:mc="http://schemas.openxmlformats.org/markup-compatibility/2006" xmlns:aink="http://schemas.microsoft.com/office/drawing/2016/ink" xmlns:am3d="http://schemas.microsoft.com/office/drawing/2017/model3d" xmlns:o="urn:schemas-microsoft-com:office:office" xmlns:oel="http://schemas.microsoft.com/office/2019/extlst" xmlns:r="http://schemas.openxmlformats.org/officeDocument/2006/relationships" xmlns:m="http://schemas.openxmlformats.org/officeDocument/2006/math" xmlns:v="urn:schemas-microsoft-com:vml" xmlns:wp14="http://schemas.microsoft.com/office/word/2010/wordprocessingDrawing" xmlns:wp="http://schemas.openxmlformats.org/drawingml/2006/wordprocessingDrawing" xmlns:w10="urn:schemas-microsoft-com:office:word" xmlns:w="http://schemas.openxmlformats.org/wordprocessingml/2006/main" xmlns:w14="http://schemas.microsoft.com/office/word/2010/wordml" xmlns:w15="http://schemas.microsoft.com/office/word/2012/wordml" xmlns:w16cex="http://schemas.microsoft.com/office/word/2018/wordml/cex" xmlns:w16cid="http://schemas.microsoft.com/office/word/2016/wordml/cid" xmlns:w16="http://schemas.microsoft.com/office/word/2018/wordml" xmlns:w16sdtdh="http://schemas.microsoft.com/office/word/2020/wordml/sdtdatahash" xmlns:w16se="http://schemas.microsoft.com/office/word/2015/wordml/symex" xmlns:wpg="http://schemas.microsoft.com/office/word/2010/wordprocessingGroup" xmlns:wpi="http://schemas.microsoft.com/office/word/2010/wordprocessingInk" xmlns:wne="http://schemas.microsoft.com/office/word/2006/wordml" xmlns:wps="http://schemas.microsoft.com/office/word/2010/wordprocessingShape" mc:Ignorable="w14 w15 w16se w16cid w16 w16cex w16sdtdh wp14">
   <w:abstractNum w:abstractNumId="0" w15:restartNumberingAfterBreak="0">
-    <w:nsid w:val="659E28D6"/>
+    <w:nsid w:val="10F9644F"/>
     <w:multiLevelType w:val="hybridMultilevel"/>
-    <w:tmpl w:val="8F2AE4FE"/>
-    <w:lvl w:ilvl="0" w:tplc="870C59B2">
+    <w:tmpl w:val="02523D40"/>
+    <w:lvl w:ilvl="0" w:tplc="4C9E9BD2">
       <w:start w:val="1"/>
       <w:numFmt w:val="bullet"/>
       <w:lvlText w:val="●"/>
@@ -30392,7 +30392,7 @@
         <w:ind w:left="720" w:hanging="360"/>
       </w:pPr>
     </w:lvl>
-    <w:lvl w:ilvl="1" w:tplc="58A63D44">
+    <w:lvl w:ilvl="1" w:tplc="76A061DA">
       <w:start w:val="1"/>
       <w:numFmt w:val="bullet"/>
       <w:lvlText w:val="○"/>
@@ -30401,7 +30401,7 @@
         <w:ind w:left="1440" w:hanging="360"/>
       </w:pPr>
     </w:lvl>
-    <w:lvl w:ilvl="2" w:tplc="B3D0B7E6">
+    <w:lvl w:ilvl="2" w:tplc="486852C0">
       <w:start w:val="1"/>
       <w:numFmt w:val="bullet"/>
       <w:lvlText w:val="■"/>
@@ -30410,7 +30410,7 @@
         <w:ind w:left="2160" w:hanging="360"/>
       </w:pPr>
     </w:lvl>
-    <w:lvl w:ilvl="3" w:tplc="7C80CB4A">
+    <w:lvl w:ilvl="3" w:tplc="1B501980">
       <w:start w:val="1"/>
       <w:numFmt w:val="bullet"/>
       <w:lvlText w:val="●"/>
@@ -30419,7 +30419,7 @@
         <w:ind w:left="2880" w:hanging="360"/>
       </w:pPr>
     </w:lvl>
-    <w:lvl w:ilvl="4" w:tplc="70F03C46">
+    <w:lvl w:ilvl="4" w:tplc="C09004A8">
       <w:start w:val="1"/>
       <w:numFmt w:val="bullet"/>
       <w:lvlText w:val="○"/>
@@ -30428,7 +30428,7 @@
         <w:ind w:left="3600" w:hanging="360"/>
       </w:pPr>
     </w:lvl>
-    <w:lvl w:ilvl="5" w:tplc="CF488CD6">
+    <w:lvl w:ilvl="5" w:tplc="1BFCDEEA">
       <w:start w:val="1"/>
       <w:numFmt w:val="bullet"/>
       <w:lvlText w:val="■"/>
@@ -30437,7 +30437,7 @@
         <w:ind w:left="4320" w:hanging="360"/>
       </w:pPr>
     </w:lvl>
-    <w:lvl w:ilvl="6" w:tplc="84B21D7C">
+    <w:lvl w:ilvl="6" w:tplc="335239A6">
       <w:start w:val="1"/>
       <w:numFmt w:val="bullet"/>
       <w:lvlText w:val="●"/>
@@ -30446,7 +30446,7 @@
         <w:ind w:left="5040" w:hanging="360"/>
       </w:pPr>
     </w:lvl>
-    <w:lvl w:ilvl="7" w:tplc="66067714">
+    <w:lvl w:ilvl="7" w:tplc="E46A7386">
       <w:start w:val="1"/>
       <w:numFmt w:val="bullet"/>
       <w:lvlText w:val="●"/>
@@ -30455,7 +30455,7 @@
         <w:ind w:left="5760" w:hanging="360"/>
       </w:pPr>
     </w:lvl>
-    <w:lvl w:ilvl="8" w:tplc="B7F0DF6E">
+    <w:lvl w:ilvl="8" w:tplc="4E860340">
       <w:start w:val="1"/>
       <w:numFmt w:val="bullet"/>
       <w:lvlText w:val="●"/>
@@ -30466,10 +30466,10 @@
     </w:lvl>
   </w:abstractNum>
   <w:abstractNum w:abstractNumId="1" w15:restartNumberingAfterBreak="0">
-    <w:nsid w:val="6A852BBD"/>
+    <w:nsid w:val="1B67707A"/>
     <w:multiLevelType w:val="hybridMultilevel"/>
-    <w:tmpl w:val="6E120F64"/>
-    <w:lvl w:ilvl="0" w:tplc="B738624E">
+    <w:tmpl w:val="77429388"/>
+    <w:lvl w:ilvl="0" w:tplc="661C96EE">
       <w:start w:val="1"/>
       <w:numFmt w:val="bullet"/>
       <w:lvlText w:val="•"/>
@@ -30478,7 +30478,7 @@
         <w:ind w:left="460" w:hanging="280"/>
       </w:pPr>
     </w:lvl>
-    <w:lvl w:ilvl="1" w:tplc="A07668BC">
+    <w:lvl w:ilvl="1" w:tplc="9E2ECF28">
       <w:start w:val="1"/>
       <w:numFmt w:val="bullet"/>
       <w:lvlText w:val="–"/>
@@ -30487,49 +30487,49 @@
         <w:ind w:left="900" w:hanging="280"/>
       </w:pPr>
     </w:lvl>
-    <w:lvl w:ilvl="2" w:tplc="6E948958">
+    <w:lvl w:ilvl="2" w:tplc="C358B192">
       <w:numFmt w:val="decimal"/>
       <w:lvlText w:val=""/>
       <w:lvlJc w:val="left"/>
     </w:lvl>
-    <w:lvl w:ilvl="3" w:tplc="70C6FF0E">
+    <w:lvl w:ilvl="3" w:tplc="D0281C26">
       <w:numFmt w:val="decimal"/>
       <w:lvlText w:val=""/>
       <w:lvlJc w:val="left"/>
     </w:lvl>
-    <w:lvl w:ilvl="4" w:tplc="74FC897E">
+    <w:lvl w:ilvl="4" w:tplc="46603726">
       <w:numFmt w:val="decimal"/>
       <w:lvlText w:val=""/>
       <w:lvlJc w:val="left"/>
     </w:lvl>
-    <w:lvl w:ilvl="5" w:tplc="38D80B9C">
+    <w:lvl w:ilvl="5" w:tplc="2DA80490">
       <w:numFmt w:val="decimal"/>
       <w:lvlText w:val=""/>
       <w:lvlJc w:val="left"/>
     </w:lvl>
-    <w:lvl w:ilvl="6" w:tplc="C58AE150">
+    <w:lvl w:ilvl="6" w:tplc="7AA8F2E2">
       <w:numFmt w:val="decimal"/>
       <w:lvlText w:val=""/>
       <w:lvlJc w:val="left"/>
     </w:lvl>
-    <w:lvl w:ilvl="7" w:tplc="55842526">
+    <w:lvl w:ilvl="7" w:tplc="93B4E8C6">
       <w:numFmt w:val="decimal"/>
       <w:lvlText w:val=""/>
       <w:lvlJc w:val="left"/>
     </w:lvl>
-    <w:lvl w:ilvl="8" w:tplc="71CACF4C">
+    <w:lvl w:ilvl="8" w:tplc="92CE5E16">
       <w:numFmt w:val="decimal"/>
       <w:lvlText w:val=""/>
       <w:lvlJc w:val="left"/>
     </w:lvl>
   </w:abstractNum>
-  <w:num w:numId="1" w16cid:durableId="1344017980">
+  <w:num w:numId="1" w16cid:durableId="109395768">
     <w:abstractNumId w:val="0"/>
     <w:lvlOverride w:ilvl="0">
       <w:startOverride w:val="1"/>
     </w:lvlOverride>
   </w:num>
-  <w:num w:numId="2" w16cid:durableId="503782379">
+  <w:num w:numId="2" w16cid:durableId="2092501997">
     <w:abstractNumId w:val="1"/>
     <w:lvlOverride w:ilvl="0">
       <w:startOverride w:val="1"/>
@@ -31155,7 +31155,7 @@
     <w:autoRedefine/>
     <w:uiPriority w:val="39"/>
     <w:unhideWhenUsed/>
-    <w:rsid w:val="001C7134"/>
+    <w:rsid w:val="00E3270C"/>
     <w:pPr>
       <w:spacing w:after="100"/>
     </w:pPr>
@@ -31167,7 +31167,7 @@
     <w:autoRedefine/>
     <w:uiPriority w:val="39"/>
     <w:unhideWhenUsed/>
-    <w:rsid w:val="001C7134"/>
+    <w:rsid w:val="00E3270C"/>
     <w:pPr>
       <w:spacing w:after="100"/>
       <w:ind w:left="210"/>

</xml_diff>

<commit_message>
docs: manuals v1.8 -- PROIT AI research and interview sheet in every affected guide, three new screenshots
Co-Authored-By: Claude Sonnet 5 <noreply@anthropic.com>
</commit_message>
<xml_diff>
--- a/docs/manuals/ABF-FST_Screen_and_Button_Reference.docx
+++ b/docs/manuals/ABF-FST_Screen_and_Button_Reference.docx
@@ -69,7 +69,7 @@
           <w:left w:w="10" w:type="dxa"/>
           <w:right w:w="10" w:type="dxa"/>
         </w:tblCellMar>
-        <w:tblLook w:val="0000" w:firstRow="0" w:lastRow="0" w:firstColumn="0" w:lastColumn="0" w:noHBand="0" w:noVBand="0"/>
+        <w:tblLook w:val="04A0" w:firstRow="1" w:lastRow="0" w:firstColumn="1" w:lastColumn="0" w:noHBand="0" w:noVBand="1"/>
       </w:tblPr>
       <w:tblGrid>
         <w:gridCol w:w="2300"/>
@@ -469,7 +469,7 @@
                 <w:sz w:val="19"/>
                 <w:szCs w:val="19"/>
               </w:rPr>
-              <w:t>Version 1.7 · 21 September 2026</w:t>
+              <w:t>Version 1.8 · 21 September 2026</w:t>
             </w:r>
           </w:p>
         </w:tc>
@@ -538,7 +538,7 @@
     <w:sdt>
       <w:sdtPr>
         <w:alias w:val="Contents"/>
-        <w:id w:val="499855626"/>
+        <w:id w:val="-532354263"/>
       </w:sdtPr>
       <w:sdtEndPr/>
       <w:sdtContent>
@@ -567,7 +567,7 @@
           <w:r>
             <w:fldChar w:fldCharType="separate"/>
           </w:r>
-          <w:hyperlink w:anchor="_Toc240916537" w:history="1">
+          <w:hyperlink w:anchor="_Toc240919827" w:history="1">
             <w:r>
               <w:rPr>
                 <w:rStyle w:val="Hyperlink"/>
@@ -591,7 +591,7 @@
               <w:rPr>
                 <w:noProof/>
               </w:rPr>
-              <w:instrText xml:space="preserve"> PAGEREF _Toc240916537 \h </w:instrText>
+              <w:instrText xml:space="preserve"> PAGEREF _Toc240919827 \h </w:instrText>
             </w:r>
             <w:r>
               <w:rPr>
@@ -634,7 +634,7 @@
               <w14:ligatures w14:val="standardContextual"/>
             </w:rPr>
           </w:pPr>
-          <w:hyperlink w:anchor="_Toc240916538" w:history="1">
+          <w:hyperlink w:anchor="_Toc240919828" w:history="1">
             <w:r>
               <w:rPr>
                 <w:rStyle w:val="Hyperlink"/>
@@ -658,7 +658,7 @@
               <w:rPr>
                 <w:noProof/>
               </w:rPr>
-              <w:instrText xml:space="preserve"> PAGEREF _Toc240916538 \h </w:instrText>
+              <w:instrText xml:space="preserve"> PAGEREF _Toc240919828 \h </w:instrText>
             </w:r>
             <w:r>
               <w:rPr>
@@ -701,7 +701,7 @@
               <w14:ligatures w14:val="standardContextual"/>
             </w:rPr>
           </w:pPr>
-          <w:hyperlink w:anchor="_Toc240916539" w:history="1">
+          <w:hyperlink w:anchor="_Toc240919829" w:history="1">
             <w:r>
               <w:rPr>
                 <w:rStyle w:val="Hyperlink"/>
@@ -725,7 +725,7 @@
               <w:rPr>
                 <w:noProof/>
               </w:rPr>
-              <w:instrText xml:space="preserve"> PAGEREF _Toc240916539 \h </w:instrText>
+              <w:instrText xml:space="preserve"> PAGEREF _Toc240919829 \h </w:instrText>
             </w:r>
             <w:r>
               <w:rPr>
@@ -768,7 +768,7 @@
               <w14:ligatures w14:val="standardContextual"/>
             </w:rPr>
           </w:pPr>
-          <w:hyperlink w:anchor="_Toc240916540" w:history="1">
+          <w:hyperlink w:anchor="_Toc240919830" w:history="1">
             <w:r>
               <w:rPr>
                 <w:rStyle w:val="Hyperlink"/>
@@ -792,7 +792,7 @@
               <w:rPr>
                 <w:noProof/>
               </w:rPr>
-              <w:instrText xml:space="preserve"> PAGEREF _Toc240916540 \h </w:instrText>
+              <w:instrText xml:space="preserve"> PAGEREF _Toc240919830 \h </w:instrText>
             </w:r>
             <w:r>
               <w:rPr>
@@ -835,7 +835,7 @@
               <w14:ligatures w14:val="standardContextual"/>
             </w:rPr>
           </w:pPr>
-          <w:hyperlink w:anchor="_Toc240916541" w:history="1">
+          <w:hyperlink w:anchor="_Toc240919831" w:history="1">
             <w:r>
               <w:rPr>
                 <w:rStyle w:val="Hyperlink"/>
@@ -859,7 +859,7 @@
               <w:rPr>
                 <w:noProof/>
               </w:rPr>
-              <w:instrText xml:space="preserve"> PAGEREF _Toc240916541 \h </w:instrText>
+              <w:instrText xml:space="preserve"> PAGEREF _Toc240919831 \h </w:instrText>
             </w:r>
             <w:r>
               <w:rPr>
@@ -902,7 +902,7 @@
               <w14:ligatures w14:val="standardContextual"/>
             </w:rPr>
           </w:pPr>
-          <w:hyperlink w:anchor="_Toc240916542" w:history="1">
+          <w:hyperlink w:anchor="_Toc240919832" w:history="1">
             <w:r>
               <w:rPr>
                 <w:rStyle w:val="Hyperlink"/>
@@ -926,7 +926,7 @@
               <w:rPr>
                 <w:noProof/>
               </w:rPr>
-              <w:instrText xml:space="preserve"> PAGEREF _Toc240916542 \h </w:instrText>
+              <w:instrText xml:space="preserve"> PAGEREF _Toc240919832 \h </w:instrText>
             </w:r>
             <w:r>
               <w:rPr>
@@ -969,7 +969,7 @@
               <w14:ligatures w14:val="standardContextual"/>
             </w:rPr>
           </w:pPr>
-          <w:hyperlink w:anchor="_Toc240916543" w:history="1">
+          <w:hyperlink w:anchor="_Toc240919833" w:history="1">
             <w:r>
               <w:rPr>
                 <w:rStyle w:val="Hyperlink"/>
@@ -993,7 +993,7 @@
               <w:rPr>
                 <w:noProof/>
               </w:rPr>
-              <w:instrText xml:space="preserve"> PAGEREF _Toc240916543 \h </w:instrText>
+              <w:instrText xml:space="preserve"> PAGEREF _Toc240919833 \h </w:instrText>
             </w:r>
             <w:r>
               <w:rPr>
@@ -1036,7 +1036,7 @@
               <w14:ligatures w14:val="standardContextual"/>
             </w:rPr>
           </w:pPr>
-          <w:hyperlink w:anchor="_Toc240916544" w:history="1">
+          <w:hyperlink w:anchor="_Toc240919834" w:history="1">
             <w:r>
               <w:rPr>
                 <w:rStyle w:val="Hyperlink"/>
@@ -1060,7 +1060,7 @@
               <w:rPr>
                 <w:noProof/>
               </w:rPr>
-              <w:instrText xml:space="preserve"> PAGEREF _Toc240916544 \h </w:instrText>
+              <w:instrText xml:space="preserve"> PAGEREF _Toc240919834 \h </w:instrText>
             </w:r>
             <w:r>
               <w:rPr>
@@ -1103,7 +1103,7 @@
               <w14:ligatures w14:val="standardContextual"/>
             </w:rPr>
           </w:pPr>
-          <w:hyperlink w:anchor="_Toc240916545" w:history="1">
+          <w:hyperlink w:anchor="_Toc240919835" w:history="1">
             <w:r>
               <w:rPr>
                 <w:rStyle w:val="Hyperlink"/>
@@ -1127,7 +1127,7 @@
               <w:rPr>
                 <w:noProof/>
               </w:rPr>
-              <w:instrText xml:space="preserve"> PAGEREF _Toc240916545 \h </w:instrText>
+              <w:instrText xml:space="preserve"> PAGEREF _Toc240919835 \h </w:instrText>
             </w:r>
             <w:r>
               <w:rPr>
@@ -1170,7 +1170,7 @@
               <w14:ligatures w14:val="standardContextual"/>
             </w:rPr>
           </w:pPr>
-          <w:hyperlink w:anchor="_Toc240916546" w:history="1">
+          <w:hyperlink w:anchor="_Toc240919836" w:history="1">
             <w:r>
               <w:rPr>
                 <w:rStyle w:val="Hyperlink"/>
@@ -1194,7 +1194,7 @@
               <w:rPr>
                 <w:noProof/>
               </w:rPr>
-              <w:instrText xml:space="preserve"> PAGEREF _Toc240916546 \h </w:instrText>
+              <w:instrText xml:space="preserve"> PAGEREF _Toc240919836 \h </w:instrText>
             </w:r>
             <w:r>
               <w:rPr>
@@ -1237,7 +1237,7 @@
               <w14:ligatures w14:val="standardContextual"/>
             </w:rPr>
           </w:pPr>
-          <w:hyperlink w:anchor="_Toc240916547" w:history="1">
+          <w:hyperlink w:anchor="_Toc240919837" w:history="1">
             <w:r>
               <w:rPr>
                 <w:rStyle w:val="Hyperlink"/>
@@ -1261,7 +1261,7 @@
               <w:rPr>
                 <w:noProof/>
               </w:rPr>
-              <w:instrText xml:space="preserve"> PAGEREF _Toc240916547 \h </w:instrText>
+              <w:instrText xml:space="preserve"> PAGEREF _Toc240919837 \h </w:instrText>
             </w:r>
             <w:r>
               <w:rPr>
@@ -1304,7 +1304,7 @@
               <w14:ligatures w14:val="standardContextual"/>
             </w:rPr>
           </w:pPr>
-          <w:hyperlink w:anchor="_Toc240916548" w:history="1">
+          <w:hyperlink w:anchor="_Toc240919838" w:history="1">
             <w:r>
               <w:rPr>
                 <w:rStyle w:val="Hyperlink"/>
@@ -1328,7 +1328,7 @@
               <w:rPr>
                 <w:noProof/>
               </w:rPr>
-              <w:instrText xml:space="preserve"> PAGEREF _Toc240916548 \h </w:instrText>
+              <w:instrText xml:space="preserve"> PAGEREF _Toc240919838 \h </w:instrText>
             </w:r>
             <w:r>
               <w:rPr>
@@ -1371,7 +1371,7 @@
               <w14:ligatures w14:val="standardContextual"/>
             </w:rPr>
           </w:pPr>
-          <w:hyperlink w:anchor="_Toc240916549" w:history="1">
+          <w:hyperlink w:anchor="_Toc240919839" w:history="1">
             <w:r>
               <w:rPr>
                 <w:rStyle w:val="Hyperlink"/>
@@ -1395,7 +1395,7 @@
               <w:rPr>
                 <w:noProof/>
               </w:rPr>
-              <w:instrText xml:space="preserve"> PAGEREF _Toc240916549 \h </w:instrText>
+              <w:instrText xml:space="preserve"> PAGEREF _Toc240919839 \h </w:instrText>
             </w:r>
             <w:r>
               <w:rPr>
@@ -1438,7 +1438,7 @@
               <w14:ligatures w14:val="standardContextual"/>
             </w:rPr>
           </w:pPr>
-          <w:hyperlink w:anchor="_Toc240916550" w:history="1">
+          <w:hyperlink w:anchor="_Toc240919840" w:history="1">
             <w:r>
               <w:rPr>
                 <w:rStyle w:val="Hyperlink"/>
@@ -1462,7 +1462,7 @@
               <w:rPr>
                 <w:noProof/>
               </w:rPr>
-              <w:instrText xml:space="preserve"> PAGEREF _Toc240916550 \h </w:instrText>
+              <w:instrText xml:space="preserve"> PAGEREF _Toc240919840 \h </w:instrText>
             </w:r>
             <w:r>
               <w:rPr>
@@ -1505,7 +1505,7 @@
               <w14:ligatures w14:val="standardContextual"/>
             </w:rPr>
           </w:pPr>
-          <w:hyperlink w:anchor="_Toc240916551" w:history="1">
+          <w:hyperlink w:anchor="_Toc240919841" w:history="1">
             <w:r>
               <w:rPr>
                 <w:rStyle w:val="Hyperlink"/>
@@ -1529,7 +1529,7 @@
               <w:rPr>
                 <w:noProof/>
               </w:rPr>
-              <w:instrText xml:space="preserve"> PAGEREF _Toc240916551 \h </w:instrText>
+              <w:instrText xml:space="preserve"> PAGEREF _Toc240919841 \h </w:instrText>
             </w:r>
             <w:r>
               <w:rPr>
@@ -1572,7 +1572,7 @@
               <w14:ligatures w14:val="standardContextual"/>
             </w:rPr>
           </w:pPr>
-          <w:hyperlink w:anchor="_Toc240916552" w:history="1">
+          <w:hyperlink w:anchor="_Toc240919842" w:history="1">
             <w:r>
               <w:rPr>
                 <w:rStyle w:val="Hyperlink"/>
@@ -1596,7 +1596,7 @@
               <w:rPr>
                 <w:noProof/>
               </w:rPr>
-              <w:instrText xml:space="preserve"> PAGEREF _Toc240916552 \h </w:instrText>
+              <w:instrText xml:space="preserve"> PAGEREF _Toc240919842 \h </w:instrText>
             </w:r>
             <w:r>
               <w:rPr>
@@ -1639,7 +1639,7 @@
               <w14:ligatures w14:val="standardContextual"/>
             </w:rPr>
           </w:pPr>
-          <w:hyperlink w:anchor="_Toc240916553" w:history="1">
+          <w:hyperlink w:anchor="_Toc240919843" w:history="1">
             <w:r>
               <w:rPr>
                 <w:rStyle w:val="Hyperlink"/>
@@ -1663,7 +1663,7 @@
               <w:rPr>
                 <w:noProof/>
               </w:rPr>
-              <w:instrText xml:space="preserve"> PAGEREF _Toc240916553 \h </w:instrText>
+              <w:instrText xml:space="preserve"> PAGEREF _Toc240919843 \h </w:instrText>
             </w:r>
             <w:r>
               <w:rPr>
@@ -1706,7 +1706,7 @@
               <w14:ligatures w14:val="standardContextual"/>
             </w:rPr>
           </w:pPr>
-          <w:hyperlink w:anchor="_Toc240916554" w:history="1">
+          <w:hyperlink w:anchor="_Toc240919844" w:history="1">
             <w:r>
               <w:rPr>
                 <w:rStyle w:val="Hyperlink"/>
@@ -1730,7 +1730,7 @@
               <w:rPr>
                 <w:noProof/>
               </w:rPr>
-              <w:instrText xml:space="preserve"> PAGEREF _Toc240916554 \h </w:instrText>
+              <w:instrText xml:space="preserve"> PAGEREF _Toc240919844 \h </w:instrText>
             </w:r>
             <w:r>
               <w:rPr>
@@ -1773,13 +1773,13 @@
               <w14:ligatures w14:val="standardContextual"/>
             </w:rPr>
           </w:pPr>
-          <w:hyperlink w:anchor="_Toc240916555" w:history="1">
+          <w:hyperlink w:anchor="_Toc240919845" w:history="1">
             <w:r>
               <w:rPr>
                 <w:rStyle w:val="Hyperlink"/>
                 <w:noProof/>
               </w:rPr>
-              <w:t>6.4 Register Organisation</w:t>
+              <w:t>6.4 Interview sheet (verifying a locked profile)</w:t>
             </w:r>
             <w:r>
               <w:rPr>
@@ -1797,7 +1797,7 @@
               <w:rPr>
                 <w:noProof/>
               </w:rPr>
-              <w:instrText xml:space="preserve"> PAGEREF _Toc240916555 \h </w:instrText>
+              <w:instrText xml:space="preserve"> PAGEREF _Toc240919845 \h </w:instrText>
             </w:r>
             <w:r>
               <w:rPr>
@@ -1814,7 +1814,7 @@
               <w:rPr>
                 <w:noProof/>
               </w:rPr>
-              <w:t>16</w:t>
+              <w:t>17</w:t>
             </w:r>
             <w:r>
               <w:rPr>
@@ -1840,13 +1840,13 @@
               <w14:ligatures w14:val="standardContextual"/>
             </w:rPr>
           </w:pPr>
-          <w:hyperlink w:anchor="_Toc240916556" w:history="1">
+          <w:hyperlink w:anchor="_Toc240919846" w:history="1">
             <w:r>
               <w:rPr>
                 <w:rStyle w:val="Hyperlink"/>
                 <w:noProof/>
               </w:rPr>
-              <w:t>6.5 Appointment Queue</w:t>
+              <w:t>6.5 Register Organisation</w:t>
             </w:r>
             <w:r>
               <w:rPr>
@@ -1864,7 +1864,7 @@
               <w:rPr>
                 <w:noProof/>
               </w:rPr>
-              <w:instrText xml:space="preserve"> PAGEREF _Toc240916556 \h </w:instrText>
+              <w:instrText xml:space="preserve"> PAGEREF _Toc240919846 \h </w:instrText>
             </w:r>
             <w:r>
               <w:rPr>
@@ -1881,7 +1881,7 @@
               <w:rPr>
                 <w:noProof/>
               </w:rPr>
-              <w:t>16</w:t>
+              <w:t>18</w:t>
             </w:r>
             <w:r>
               <w:rPr>
@@ -1907,13 +1907,13 @@
               <w14:ligatures w14:val="standardContextual"/>
             </w:rPr>
           </w:pPr>
-          <w:hyperlink w:anchor="_Toc240916557" w:history="1">
+          <w:hyperlink w:anchor="_Toc240919847" w:history="1">
             <w:r>
               <w:rPr>
                 <w:rStyle w:val="Hyperlink"/>
                 <w:noProof/>
               </w:rPr>
-              <w:t>6.6 Follow-ups due</w:t>
+              <w:t>6.6 Appointment Queue</w:t>
             </w:r>
             <w:r>
               <w:rPr>
@@ -1931,7 +1931,7 @@
               <w:rPr>
                 <w:noProof/>
               </w:rPr>
-              <w:instrText xml:space="preserve"> PAGEREF _Toc240916557 \h </w:instrText>
+              <w:instrText xml:space="preserve"> PAGEREF _Toc240919847 \h </w:instrText>
             </w:r>
             <w:r>
               <w:rPr>
@@ -1948,7 +1948,7 @@
               <w:rPr>
                 <w:noProof/>
               </w:rPr>
-              <w:t>17</w:t>
+              <w:t>18</w:t>
             </w:r>
             <w:r>
               <w:rPr>
@@ -1974,13 +1974,13 @@
               <w14:ligatures w14:val="standardContextual"/>
             </w:rPr>
           </w:pPr>
-          <w:hyperlink w:anchor="_Toc240916558" w:history="1">
+          <w:hyperlink w:anchor="_Toc240919848" w:history="1">
             <w:r>
               <w:rPr>
                 <w:rStyle w:val="Hyperlink"/>
                 <w:noProof/>
               </w:rPr>
-              <w:t>6.7 Reserve Activation</w:t>
+              <w:t>6.7 Follow-ups due</w:t>
             </w:r>
             <w:r>
               <w:rPr>
@@ -1998,7 +1998,7 @@
               <w:rPr>
                 <w:noProof/>
               </w:rPr>
-              <w:instrText xml:space="preserve"> PAGEREF _Toc240916558 \h </w:instrText>
+              <w:instrText xml:space="preserve"> PAGEREF _Toc240919848 \h </w:instrText>
             </w:r>
             <w:r>
               <w:rPr>
@@ -2015,7 +2015,74 @@
               <w:rPr>
                 <w:noProof/>
               </w:rPr>
-              <w:t>17</w:t>
+              <w:t>19</w:t>
+            </w:r>
+            <w:r>
+              <w:rPr>
+                <w:noProof/>
+              </w:rPr>
+              <w:fldChar w:fldCharType="end"/>
+            </w:r>
+          </w:hyperlink>
+        </w:p>
+        <w:p>
+          <w:pPr>
+            <w:pStyle w:val="TOC2"/>
+            <w:tabs>
+              <w:tab w:val="right" w:leader="dot" w:pos="9402"/>
+            </w:tabs>
+            <w:rPr>
+              <w:rFonts w:asciiTheme="minorHAnsi" w:eastAsiaTheme="minorEastAsia" w:hAnsiTheme="minorHAnsi" w:cstheme="minorBidi"/>
+              <w:noProof/>
+              <w:color w:val="auto"/>
+              <w:kern w:val="2"/>
+              <w:sz w:val="24"/>
+              <w:szCs w:val="24"/>
+              <w14:ligatures w14:val="standardContextual"/>
+            </w:rPr>
+          </w:pPr>
+          <w:hyperlink w:anchor="_Toc240919849" w:history="1">
+            <w:r>
+              <w:rPr>
+                <w:rStyle w:val="Hyperlink"/>
+                <w:noProof/>
+              </w:rPr>
+              <w:t>6.8 Reserve Activation</w:t>
+            </w:r>
+            <w:r>
+              <w:rPr>
+                <w:noProof/>
+              </w:rPr>
+              <w:tab/>
+            </w:r>
+            <w:r>
+              <w:rPr>
+                <w:noProof/>
+              </w:rPr>
+              <w:fldChar w:fldCharType="begin"/>
+            </w:r>
+            <w:r>
+              <w:rPr>
+                <w:noProof/>
+              </w:rPr>
+              <w:instrText xml:space="preserve"> PAGEREF _Toc240919849 \h </w:instrText>
+            </w:r>
+            <w:r>
+              <w:rPr>
+                <w:noProof/>
+              </w:rPr>
+            </w:r>
+            <w:r>
+              <w:rPr>
+                <w:noProof/>
+              </w:rPr>
+              <w:fldChar w:fldCharType="separate"/>
+            </w:r>
+            <w:r>
+              <w:rPr>
+                <w:noProof/>
+              </w:rPr>
+              <w:t>19</w:t>
             </w:r>
             <w:r>
               <w:rPr>
@@ -2041,7 +2108,7 @@
               <w14:ligatures w14:val="standardContextual"/>
             </w:rPr>
           </w:pPr>
-          <w:hyperlink w:anchor="_Toc240916559" w:history="1">
+          <w:hyperlink w:anchor="_Toc240919850" w:history="1">
             <w:r>
               <w:rPr>
                 <w:rStyle w:val="Hyperlink"/>
@@ -2065,7 +2132,7 @@
               <w:rPr>
                 <w:noProof/>
               </w:rPr>
-              <w:instrText xml:space="preserve"> PAGEREF _Toc240916559 \h </w:instrText>
+              <w:instrText xml:space="preserve"> PAGEREF _Toc240919850 \h </w:instrText>
             </w:r>
             <w:r>
               <w:rPr>
@@ -2082,7 +2149,7 @@
               <w:rPr>
                 <w:noProof/>
               </w:rPr>
-              <w:t>19</w:t>
+              <w:t>21</w:t>
             </w:r>
             <w:r>
               <w:rPr>
@@ -2108,7 +2175,7 @@
               <w14:ligatures w14:val="standardContextual"/>
             </w:rPr>
           </w:pPr>
-          <w:hyperlink w:anchor="_Toc240916560" w:history="1">
+          <w:hyperlink w:anchor="_Toc240919851" w:history="1">
             <w:r>
               <w:rPr>
                 <w:rStyle w:val="Hyperlink"/>
@@ -2132,7 +2199,7 @@
               <w:rPr>
                 <w:noProof/>
               </w:rPr>
-              <w:instrText xml:space="preserve"> PAGEREF _Toc240916560 \h </w:instrText>
+              <w:instrText xml:space="preserve"> PAGEREF _Toc240919851 \h </w:instrText>
             </w:r>
             <w:r>
               <w:rPr>
@@ -2149,7 +2216,7 @@
               <w:rPr>
                 <w:noProof/>
               </w:rPr>
-              <w:t>19</w:t>
+              <w:t>21</w:t>
             </w:r>
             <w:r>
               <w:rPr>
@@ -2175,7 +2242,7 @@
               <w14:ligatures w14:val="standardContextual"/>
             </w:rPr>
           </w:pPr>
-          <w:hyperlink w:anchor="_Toc240916561" w:history="1">
+          <w:hyperlink w:anchor="_Toc240919852" w:history="1">
             <w:r>
               <w:rPr>
                 <w:rStyle w:val="Hyperlink"/>
@@ -2199,7 +2266,7 @@
               <w:rPr>
                 <w:noProof/>
               </w:rPr>
-              <w:instrText xml:space="preserve"> PAGEREF _Toc240916561 \h </w:instrText>
+              <w:instrText xml:space="preserve"> PAGEREF _Toc240919852 \h </w:instrText>
             </w:r>
             <w:r>
               <w:rPr>
@@ -2216,7 +2283,7 @@
               <w:rPr>
                 <w:noProof/>
               </w:rPr>
-              <w:t>19</w:t>
+              <w:t>21</w:t>
             </w:r>
             <w:r>
               <w:rPr>
@@ -2242,7 +2309,7 @@
               <w14:ligatures w14:val="standardContextual"/>
             </w:rPr>
           </w:pPr>
-          <w:hyperlink w:anchor="_Toc240916562" w:history="1">
+          <w:hyperlink w:anchor="_Toc240919853" w:history="1">
             <w:r>
               <w:rPr>
                 <w:rStyle w:val="Hyperlink"/>
@@ -2266,7 +2333,7 @@
               <w:rPr>
                 <w:noProof/>
               </w:rPr>
-              <w:instrText xml:space="preserve"> PAGEREF _Toc240916562 \h </w:instrText>
+              <w:instrText xml:space="preserve"> PAGEREF _Toc240919853 \h </w:instrText>
             </w:r>
             <w:r>
               <w:rPr>
@@ -2283,7 +2350,7 @@
               <w:rPr>
                 <w:noProof/>
               </w:rPr>
-              <w:t>21</w:t>
+              <w:t>23</w:t>
             </w:r>
             <w:r>
               <w:rPr>
@@ -2309,7 +2376,7 @@
               <w14:ligatures w14:val="standardContextual"/>
             </w:rPr>
           </w:pPr>
-          <w:hyperlink w:anchor="_Toc240916563" w:history="1">
+          <w:hyperlink w:anchor="_Toc240919854" w:history="1">
             <w:r>
               <w:rPr>
                 <w:rStyle w:val="Hyperlink"/>
@@ -2333,7 +2400,7 @@
               <w:rPr>
                 <w:noProof/>
               </w:rPr>
-              <w:instrText xml:space="preserve"> PAGEREF _Toc240916563 \h </w:instrText>
+              <w:instrText xml:space="preserve"> PAGEREF _Toc240919854 \h </w:instrText>
             </w:r>
             <w:r>
               <w:rPr>
@@ -2350,7 +2417,7 @@
               <w:rPr>
                 <w:noProof/>
               </w:rPr>
-              <w:t>21</w:t>
+              <w:t>23</w:t>
             </w:r>
             <w:r>
               <w:rPr>
@@ -2376,7 +2443,7 @@
               <w14:ligatures w14:val="standardContextual"/>
             </w:rPr>
           </w:pPr>
-          <w:hyperlink w:anchor="_Toc240916564" w:history="1">
+          <w:hyperlink w:anchor="_Toc240919855" w:history="1">
             <w:r>
               <w:rPr>
                 <w:rStyle w:val="Hyperlink"/>
@@ -2400,7 +2467,7 @@
               <w:rPr>
                 <w:noProof/>
               </w:rPr>
-              <w:instrText xml:space="preserve"> PAGEREF _Toc240916564 \h </w:instrText>
+              <w:instrText xml:space="preserve"> PAGEREF _Toc240919855 \h </w:instrText>
             </w:r>
             <w:r>
               <w:rPr>
@@ -2417,7 +2484,7 @@
               <w:rPr>
                 <w:noProof/>
               </w:rPr>
-              <w:t>21</w:t>
+              <w:t>23</w:t>
             </w:r>
             <w:r>
               <w:rPr>
@@ -2443,7 +2510,7 @@
               <w14:ligatures w14:val="standardContextual"/>
             </w:rPr>
           </w:pPr>
-          <w:hyperlink w:anchor="_Toc240916565" w:history="1">
+          <w:hyperlink w:anchor="_Toc240919856" w:history="1">
             <w:r>
               <w:rPr>
                 <w:rStyle w:val="Hyperlink"/>
@@ -2467,7 +2534,7 @@
               <w:rPr>
                 <w:noProof/>
               </w:rPr>
-              <w:instrText xml:space="preserve"> PAGEREF _Toc240916565 \h </w:instrText>
+              <w:instrText xml:space="preserve"> PAGEREF _Toc240919856 \h </w:instrText>
             </w:r>
             <w:r>
               <w:rPr>
@@ -2484,7 +2551,7 @@
               <w:rPr>
                 <w:noProof/>
               </w:rPr>
-              <w:t>21</w:t>
+              <w:t>23</w:t>
             </w:r>
             <w:r>
               <w:rPr>
@@ -2510,7 +2577,7 @@
               <w14:ligatures w14:val="standardContextual"/>
             </w:rPr>
           </w:pPr>
-          <w:hyperlink w:anchor="_Toc240916566" w:history="1">
+          <w:hyperlink w:anchor="_Toc240919857" w:history="1">
             <w:r>
               <w:rPr>
                 <w:rStyle w:val="Hyperlink"/>
@@ -2534,7 +2601,7 @@
               <w:rPr>
                 <w:noProof/>
               </w:rPr>
-              <w:instrText xml:space="preserve"> PAGEREF _Toc240916566 \h </w:instrText>
+              <w:instrText xml:space="preserve"> PAGEREF _Toc240919857 \h </w:instrText>
             </w:r>
             <w:r>
               <w:rPr>
@@ -2551,7 +2618,7 @@
               <w:rPr>
                 <w:noProof/>
               </w:rPr>
-              <w:t>23</w:t>
+              <w:t>25</w:t>
             </w:r>
             <w:r>
               <w:rPr>
@@ -2577,7 +2644,7 @@
               <w14:ligatures w14:val="standardContextual"/>
             </w:rPr>
           </w:pPr>
-          <w:hyperlink w:anchor="_Toc240916567" w:history="1">
+          <w:hyperlink w:anchor="_Toc240919858" w:history="1">
             <w:r>
               <w:rPr>
                 <w:rStyle w:val="Hyperlink"/>
@@ -2601,7 +2668,7 @@
               <w:rPr>
                 <w:noProof/>
               </w:rPr>
-              <w:instrText xml:space="preserve"> PAGEREF _Toc240916567 \h </w:instrText>
+              <w:instrText xml:space="preserve"> PAGEREF _Toc240919858 \h </w:instrText>
             </w:r>
             <w:r>
               <w:rPr>
@@ -2618,7 +2685,7 @@
               <w:rPr>
                 <w:noProof/>
               </w:rPr>
-              <w:t>23</w:t>
+              <w:t>25</w:t>
             </w:r>
             <w:r>
               <w:rPr>
@@ -2644,7 +2711,7 @@
               <w14:ligatures w14:val="standardContextual"/>
             </w:rPr>
           </w:pPr>
-          <w:hyperlink w:anchor="_Toc240916568" w:history="1">
+          <w:hyperlink w:anchor="_Toc240919859" w:history="1">
             <w:r>
               <w:rPr>
                 <w:rStyle w:val="Hyperlink"/>
@@ -2668,7 +2735,7 @@
               <w:rPr>
                 <w:noProof/>
               </w:rPr>
-              <w:instrText xml:space="preserve"> PAGEREF _Toc240916568 \h </w:instrText>
+              <w:instrText xml:space="preserve"> PAGEREF _Toc240919859 \h </w:instrText>
             </w:r>
             <w:r>
               <w:rPr>
@@ -2685,7 +2752,7 @@
               <w:rPr>
                 <w:noProof/>
               </w:rPr>
-              <w:t>23</w:t>
+              <w:t>25</w:t>
             </w:r>
             <w:r>
               <w:rPr>
@@ -2711,7 +2778,7 @@
               <w14:ligatures w14:val="standardContextual"/>
             </w:rPr>
           </w:pPr>
-          <w:hyperlink w:anchor="_Toc240916569" w:history="1">
+          <w:hyperlink w:anchor="_Toc240919860" w:history="1">
             <w:r>
               <w:rPr>
                 <w:rStyle w:val="Hyperlink"/>
@@ -2735,7 +2802,7 @@
               <w:rPr>
                 <w:noProof/>
               </w:rPr>
-              <w:instrText xml:space="preserve"> PAGEREF _Toc240916569 \h </w:instrText>
+              <w:instrText xml:space="preserve"> PAGEREF _Toc240919860 \h </w:instrText>
             </w:r>
             <w:r>
               <w:rPr>
@@ -2752,7 +2819,7 @@
               <w:rPr>
                 <w:noProof/>
               </w:rPr>
-              <w:t>24</w:t>
+              <w:t>26</w:t>
             </w:r>
             <w:r>
               <w:rPr>
@@ -2778,7 +2845,7 @@
               <w14:ligatures w14:val="standardContextual"/>
             </w:rPr>
           </w:pPr>
-          <w:hyperlink w:anchor="_Toc240916570" w:history="1">
+          <w:hyperlink w:anchor="_Toc240919861" w:history="1">
             <w:r>
               <w:rPr>
                 <w:rStyle w:val="Hyperlink"/>
@@ -2802,7 +2869,7 @@
               <w:rPr>
                 <w:noProof/>
               </w:rPr>
-              <w:instrText xml:space="preserve"> PAGEREF _Toc240916570 \h </w:instrText>
+              <w:instrText xml:space="preserve"> PAGEREF _Toc240919861 \h </w:instrText>
             </w:r>
             <w:r>
               <w:rPr>
@@ -2819,7 +2886,7 @@
               <w:rPr>
                 <w:noProof/>
               </w:rPr>
-              <w:t>25</w:t>
+              <w:t>27</w:t>
             </w:r>
             <w:r>
               <w:rPr>
@@ -2845,7 +2912,7 @@
               <w14:ligatures w14:val="standardContextual"/>
             </w:rPr>
           </w:pPr>
-          <w:hyperlink w:anchor="_Toc240916571" w:history="1">
+          <w:hyperlink w:anchor="_Toc240919862" w:history="1">
             <w:r>
               <w:rPr>
                 <w:rStyle w:val="Hyperlink"/>
@@ -2869,7 +2936,7 @@
               <w:rPr>
                 <w:noProof/>
               </w:rPr>
-              <w:instrText xml:space="preserve"> PAGEREF _Toc240916571 \h </w:instrText>
+              <w:instrText xml:space="preserve"> PAGEREF _Toc240919862 \h </w:instrText>
             </w:r>
             <w:r>
               <w:rPr>
@@ -2886,7 +2953,7 @@
               <w:rPr>
                 <w:noProof/>
               </w:rPr>
-              <w:t>27</w:t>
+              <w:t>29</w:t>
             </w:r>
             <w:r>
               <w:rPr>
@@ -2912,7 +2979,7 @@
               <w14:ligatures w14:val="standardContextual"/>
             </w:rPr>
           </w:pPr>
-          <w:hyperlink w:anchor="_Toc240916572" w:history="1">
+          <w:hyperlink w:anchor="_Toc240919863" w:history="1">
             <w:r>
               <w:rPr>
                 <w:rStyle w:val="Hyperlink"/>
@@ -2936,7 +3003,7 @@
               <w:rPr>
                 <w:noProof/>
               </w:rPr>
-              <w:instrText xml:space="preserve"> PAGEREF _Toc240916572 \h </w:instrText>
+              <w:instrText xml:space="preserve"> PAGEREF _Toc240919863 \h </w:instrText>
             </w:r>
             <w:r>
               <w:rPr>
@@ -2953,7 +3020,7 @@
               <w:rPr>
                 <w:noProof/>
               </w:rPr>
-              <w:t>27</w:t>
+              <w:t>29</w:t>
             </w:r>
             <w:r>
               <w:rPr>
@@ -2979,7 +3046,7 @@
               <w14:ligatures w14:val="standardContextual"/>
             </w:rPr>
           </w:pPr>
-          <w:hyperlink w:anchor="_Toc240916573" w:history="1">
+          <w:hyperlink w:anchor="_Toc240919864" w:history="1">
             <w:r>
               <w:rPr>
                 <w:rStyle w:val="Hyperlink"/>
@@ -3003,7 +3070,7 @@
               <w:rPr>
                 <w:noProof/>
               </w:rPr>
-              <w:instrText xml:space="preserve"> PAGEREF _Toc240916573 \h </w:instrText>
+              <w:instrText xml:space="preserve"> PAGEREF _Toc240919864 \h </w:instrText>
             </w:r>
             <w:r>
               <w:rPr>
@@ -3020,7 +3087,7 @@
               <w:rPr>
                 <w:noProof/>
               </w:rPr>
-              <w:t>29</w:t>
+              <w:t>31</w:t>
             </w:r>
             <w:r>
               <w:rPr>
@@ -3046,7 +3113,7 @@
               <w14:ligatures w14:val="standardContextual"/>
             </w:rPr>
           </w:pPr>
-          <w:hyperlink w:anchor="_Toc240916574" w:history="1">
+          <w:hyperlink w:anchor="_Toc240919865" w:history="1">
             <w:r>
               <w:rPr>
                 <w:rStyle w:val="Hyperlink"/>
@@ -3070,7 +3137,7 @@
               <w:rPr>
                 <w:noProof/>
               </w:rPr>
-              <w:instrText xml:space="preserve"> PAGEREF _Toc240916574 \h </w:instrText>
+              <w:instrText xml:space="preserve"> PAGEREF _Toc240919865 \h </w:instrText>
             </w:r>
             <w:r>
               <w:rPr>
@@ -3087,7 +3154,7 @@
               <w:rPr>
                 <w:noProof/>
               </w:rPr>
-              <w:t>29</w:t>
+              <w:t>31</w:t>
             </w:r>
             <w:r>
               <w:rPr>
@@ -3113,7 +3180,7 @@
               <w14:ligatures w14:val="standardContextual"/>
             </w:rPr>
           </w:pPr>
-          <w:hyperlink w:anchor="_Toc240916575" w:history="1">
+          <w:hyperlink w:anchor="_Toc240919866" w:history="1">
             <w:r>
               <w:rPr>
                 <w:rStyle w:val="Hyperlink"/>
@@ -3137,7 +3204,7 @@
               <w:rPr>
                 <w:noProof/>
               </w:rPr>
-              <w:instrText xml:space="preserve"> PAGEREF _Toc240916575 \h </w:instrText>
+              <w:instrText xml:space="preserve"> PAGEREF _Toc240919866 \h </w:instrText>
             </w:r>
             <w:r>
               <w:rPr>
@@ -3154,7 +3221,7 @@
               <w:rPr>
                 <w:noProof/>
               </w:rPr>
-              <w:t>29</w:t>
+              <w:t>31</w:t>
             </w:r>
             <w:r>
               <w:rPr>
@@ -3180,7 +3247,7 @@
               <w14:ligatures w14:val="standardContextual"/>
             </w:rPr>
           </w:pPr>
-          <w:hyperlink w:anchor="_Toc240916576" w:history="1">
+          <w:hyperlink w:anchor="_Toc240919867" w:history="1">
             <w:r>
               <w:rPr>
                 <w:rStyle w:val="Hyperlink"/>
@@ -3204,7 +3271,7 @@
               <w:rPr>
                 <w:noProof/>
               </w:rPr>
-              <w:instrText xml:space="preserve"> PAGEREF _Toc240916576 \h </w:instrText>
+              <w:instrText xml:space="preserve"> PAGEREF _Toc240919867 \h </w:instrText>
             </w:r>
             <w:r>
               <w:rPr>
@@ -3221,7 +3288,7 @@
               <w:rPr>
                 <w:noProof/>
               </w:rPr>
-              <w:t>29</w:t>
+              <w:t>31</w:t>
             </w:r>
             <w:r>
               <w:rPr>
@@ -3243,7 +3310,7 @@
         <w:pStyle w:val="Heading1"/>
         <w:pageBreakBefore/>
       </w:pPr>
-      <w:bookmarkStart w:id="0" w:name="_Toc240916537"/>
+      <w:bookmarkStart w:id="0" w:name="_Toc240919827"/>
       <w:r>
         <w:lastRenderedPageBreak/>
         <w:t>1. About this reference</w:t>
@@ -3309,7 +3376,7 @@
           <w:left w:w="10" w:type="dxa"/>
           <w:right w:w="10" w:type="dxa"/>
         </w:tblCellMar>
-        <w:tblLook w:val="0000" w:firstRow="0" w:lastRow="0" w:firstColumn="0" w:lastColumn="0" w:noHBand="0" w:noVBand="0"/>
+        <w:tblLook w:val="04A0" w:firstRow="1" w:lastRow="0" w:firstColumn="1" w:lastColumn="0" w:noHBand="0" w:noVBand="1"/>
       </w:tblPr>
       <w:tblGrid>
         <w:gridCol w:w="2635"/>
@@ -3696,7 +3763,7 @@
         <w:pStyle w:val="Heading1"/>
         <w:pageBreakBefore/>
       </w:pPr>
-      <w:bookmarkStart w:id="1" w:name="_Toc240916538"/>
+      <w:bookmarkStart w:id="1" w:name="_Toc240919828"/>
       <w:r>
         <w:lastRenderedPageBreak/>
         <w:t>2. Rules that apply on every screen</w:t>
@@ -3913,7 +3980,7 @@
         <w:pStyle w:val="Heading1"/>
         <w:pageBreakBefore/>
       </w:pPr>
-      <w:bookmarkStart w:id="2" w:name="_Toc240916539"/>
+      <w:bookmarkStart w:id="2" w:name="_Toc240919829"/>
       <w:r>
         <w:lastRenderedPageBreak/>
         <w:t>3. Who can open which screen</w:t>
@@ -3943,7 +4010,7 @@
           <w:left w:w="10" w:type="dxa"/>
           <w:right w:w="10" w:type="dxa"/>
         </w:tblCellMar>
-        <w:tblLook w:val="0000" w:firstRow="0" w:lastRow="0" w:firstColumn="0" w:lastColumn="0" w:noHBand="0" w:noVBand="0"/>
+        <w:tblLook w:val="04A0" w:firstRow="1" w:lastRow="0" w:firstColumn="1" w:lastColumn="0" w:noHBand="0" w:noVBand="1"/>
       </w:tblPr>
       <w:tblGrid>
         <w:gridCol w:w="3388"/>
@@ -5993,7 +6060,7 @@
                 <w:sz w:val="19"/>
                 <w:szCs w:val="19"/>
               </w:rPr>
-              <w:t>Register Organisation</w:t>
+              <w:t>Interview sheet (verifying a locked profile)</w:t>
             </w:r>
           </w:p>
         </w:tc>
@@ -6060,6 +6127,13 @@
             <w:pPr>
               <w:spacing w:after="40"/>
             </w:pPr>
+            <w:r>
+              <w:rPr>
+                <w:sz w:val="19"/>
+                <w:szCs w:val="19"/>
+              </w:rPr>
+              <w:t>✓</w:t>
+            </w:r>
           </w:p>
         </w:tc>
         <w:tc>
@@ -6094,6 +6168,13 @@
             <w:pPr>
               <w:spacing w:after="40"/>
             </w:pPr>
+            <w:r>
+              <w:rPr>
+                <w:sz w:val="19"/>
+                <w:szCs w:val="19"/>
+              </w:rPr>
+              <w:t>✓</w:t>
+            </w:r>
           </w:p>
         </w:tc>
         <w:tc>
@@ -6184,7 +6265,7 @@
                 <w:sz w:val="19"/>
                 <w:szCs w:val="19"/>
               </w:rPr>
-              <w:t>Appointment Queue</w:t>
+              <w:t>Register Organisation</w:t>
             </w:r>
           </w:p>
         </w:tc>
@@ -6248,13 +6329,6 @@
             <w:pPr>
               <w:spacing w:after="40"/>
             </w:pPr>
-            <w:r>
-              <w:rPr>
-                <w:sz w:val="19"/>
-                <w:szCs w:val="19"/>
-              </w:rPr>
-              <w:t>✓</w:t>
-            </w:r>
           </w:p>
         </w:tc>
         <w:tc>
@@ -6375,7 +6449,7 @@
                 <w:sz w:val="19"/>
                 <w:szCs w:val="19"/>
               </w:rPr>
-              <w:t>Follow-ups due</w:t>
+              <w:t>Appointment Queue</w:t>
             </w:r>
           </w:p>
         </w:tc>
@@ -6573,7 +6647,7 @@
                 <w:sz w:val="19"/>
                 <w:szCs w:val="19"/>
               </w:rPr>
-              <w:t>Reserve Activation</w:t>
+              <w:t>Follow-ups due</w:t>
             </w:r>
           </w:p>
         </w:tc>
@@ -6637,6 +6711,13 @@
             <w:pPr>
               <w:spacing w:after="40"/>
             </w:pPr>
+            <w:r>
+              <w:rPr>
+                <w:sz w:val="19"/>
+                <w:szCs w:val="19"/>
+              </w:rPr>
+              <w:t>✓</w:t>
+            </w:r>
           </w:p>
         </w:tc>
         <w:tc>
@@ -6757,7 +6838,7 @@
                 <w:sz w:val="19"/>
                 <w:szCs w:val="19"/>
               </w:rPr>
-              <w:t>QA Queue (with the KoboToolbox sync panel)</w:t>
+              <w:t>Reserve Activation</w:t>
             </w:r>
           </w:p>
         </w:tc>
@@ -6841,13 +6922,6 @@
             <w:pPr>
               <w:spacing w:after="40"/>
             </w:pPr>
-            <w:r>
-              <w:rPr>
-                <w:sz w:val="19"/>
-                <w:szCs w:val="19"/>
-              </w:rPr>
-              <w:t>✓</w:t>
-            </w:r>
           </w:p>
         </w:tc>
         <w:tc>
@@ -6955,7 +7029,7 @@
                 <w:sz w:val="19"/>
                 <w:szCs w:val="19"/>
               </w:rPr>
-              <w:t>QA Exceptions</w:t>
+              <w:t>QA Queue (with the KoboToolbox sync panel)</w:t>
             </w:r>
           </w:p>
         </w:tc>
@@ -7146,7 +7220,7 @@
                 <w:sz w:val="19"/>
                 <w:szCs w:val="19"/>
               </w:rPr>
-              <w:t>KII Register</w:t>
+              <w:t>QA Exceptions</w:t>
             </w:r>
           </w:p>
         </w:tc>
@@ -7230,6 +7304,13 @@
             <w:pPr>
               <w:spacing w:after="40"/>
             </w:pPr>
+            <w:r>
+              <w:rPr>
+                <w:sz w:val="19"/>
+                <w:szCs w:val="19"/>
+              </w:rPr>
+              <w:t>✓</w:t>
+            </w:r>
           </w:p>
         </w:tc>
         <w:tc>
@@ -7247,13 +7328,6 @@
             <w:pPr>
               <w:spacing w:after="40"/>
             </w:pPr>
-            <w:r>
-              <w:rPr>
-                <w:sz w:val="19"/>
-                <w:szCs w:val="19"/>
-              </w:rPr>
-              <w:t>✓</w:t>
-            </w:r>
           </w:p>
         </w:tc>
         <w:tc>
@@ -7344,7 +7418,7 @@
                 <w:sz w:val="19"/>
                 <w:szCs w:val="19"/>
               </w:rPr>
-              <w:t>New KII Record</w:t>
+              <w:t>KII Register</w:t>
             </w:r>
           </w:p>
         </w:tc>
@@ -7495,6 +7569,13 @@
             <w:pPr>
               <w:spacing w:after="40"/>
             </w:pPr>
+            <w:r>
+              <w:rPr>
+                <w:sz w:val="19"/>
+                <w:szCs w:val="19"/>
+              </w:rPr>
+              <w:t>✓</w:t>
+            </w:r>
           </w:p>
         </w:tc>
       </w:tr>
@@ -7528,7 +7609,7 @@
                 <w:sz w:val="19"/>
                 <w:szCs w:val="19"/>
               </w:rPr>
-              <w:t>KII record</w:t>
+              <w:t>New KII Record</w:t>
             </w:r>
           </w:p>
         </w:tc>
@@ -7687,13 +7768,6 @@
             <w:pPr>
               <w:spacing w:after="40"/>
             </w:pPr>
-            <w:r>
-              <w:rPr>
-                <w:sz w:val="19"/>
-                <w:szCs w:val="19"/>
-              </w:rPr>
-              <w:t>✓</w:t>
-            </w:r>
           </w:p>
         </w:tc>
       </w:tr>
@@ -7726,7 +7800,7 @@
                 <w:sz w:val="19"/>
                 <w:szCs w:val="19"/>
               </w:rPr>
-              <w:t>Documents (the corpus)</w:t>
+              <w:t>KII record</w:t>
             </w:r>
           </w:p>
         </w:tc>
@@ -7822,6 +7896,13 @@
             <w:pPr>
               <w:spacing w:after="40"/>
             </w:pPr>
+            <w:r>
+              <w:rPr>
+                <w:sz w:val="19"/>
+                <w:szCs w:val="19"/>
+              </w:rPr>
+              <w:t>✓</w:t>
+            </w:r>
           </w:p>
         </w:tc>
         <w:tc>
@@ -7838,13 +7919,6 @@
             <w:pPr>
               <w:spacing w:after="40"/>
             </w:pPr>
-            <w:r>
-              <w:rPr>
-                <w:sz w:val="19"/>
-                <w:szCs w:val="19"/>
-              </w:rPr>
-              <w:t>✓</w:t>
-            </w:r>
           </w:p>
         </w:tc>
         <w:tc>
@@ -7917,7 +7991,7 @@
                 <w:sz w:val="19"/>
                 <w:szCs w:val="19"/>
               </w:rPr>
-              <w:t>New Documentary Evidence Record</w:t>
+              <w:t>Documents (the corpus)</w:t>
             </w:r>
           </w:p>
         </w:tc>
@@ -8076,6 +8150,13 @@
             <w:pPr>
               <w:spacing w:after="40"/>
             </w:pPr>
+            <w:r>
+              <w:rPr>
+                <w:sz w:val="19"/>
+                <w:szCs w:val="19"/>
+              </w:rPr>
+              <w:t>✓</w:t>
+            </w:r>
           </w:p>
         </w:tc>
       </w:tr>
@@ -8108,7 +8189,7 @@
                 <w:sz w:val="19"/>
                 <w:szCs w:val="19"/>
               </w:rPr>
-              <w:t>Document record</w:t>
+              <w:t>New Documentary Evidence Record</w:t>
             </w:r>
           </w:p>
         </w:tc>
@@ -8259,13 +8340,6 @@
             <w:pPr>
               <w:spacing w:after="40"/>
             </w:pPr>
-            <w:r>
-              <w:rPr>
-                <w:sz w:val="19"/>
-                <w:szCs w:val="19"/>
-              </w:rPr>
-              <w:t>✓</w:t>
-            </w:r>
           </w:p>
         </w:tc>
       </w:tr>
@@ -8299,7 +8373,7 @@
                 <w:sz w:val="19"/>
                 <w:szCs w:val="19"/>
               </w:rPr>
-              <w:t>Auto-fill review screen</w:t>
+              <w:t>Document record</w:t>
             </w:r>
           </w:p>
         </w:tc>
@@ -8497,7 +8571,7 @@
                 <w:sz w:val="19"/>
                 <w:szCs w:val="19"/>
               </w:rPr>
-              <w:t>Completed forms (Form PDFs)</w:t>
+              <w:t>Auto-fill review screen</w:t>
             </w:r>
           </w:p>
         </w:tc>
@@ -8577,13 +8651,6 @@
             <w:pPr>
               <w:spacing w:after="40"/>
             </w:pPr>
-            <w:r>
-              <w:rPr>
-                <w:sz w:val="19"/>
-                <w:szCs w:val="19"/>
-              </w:rPr>
-              <w:t>✓</w:t>
-            </w:r>
           </w:p>
         </w:tc>
         <w:tc>
@@ -8600,13 +8667,6 @@
             <w:pPr>
               <w:spacing w:after="40"/>
             </w:pPr>
-            <w:r>
-              <w:rPr>
-                <w:sz w:val="19"/>
-                <w:szCs w:val="19"/>
-              </w:rPr>
-              <w:t>✓</w:t>
-            </w:r>
           </w:p>
         </w:tc>
         <w:tc>
@@ -8702,7 +8762,7 @@
                 <w:sz w:val="19"/>
                 <w:szCs w:val="19"/>
               </w:rPr>
-              <w:t>Cost Dashboard</w:t>
+              <w:t>Completed forms (Form PDFs)</w:t>
             </w:r>
           </w:p>
         </w:tc>
@@ -8786,6 +8846,13 @@
             <w:pPr>
               <w:spacing w:after="40"/>
             </w:pPr>
+            <w:r>
+              <w:rPr>
+                <w:sz w:val="19"/>
+                <w:szCs w:val="19"/>
+              </w:rPr>
+              <w:t>✓</w:t>
+            </w:r>
           </w:p>
         </w:tc>
         <w:tc>
@@ -8803,6 +8870,13 @@
             <w:pPr>
               <w:spacing w:after="40"/>
             </w:pPr>
+            <w:r>
+              <w:rPr>
+                <w:sz w:val="19"/>
+                <w:szCs w:val="19"/>
+              </w:rPr>
+              <w:t>✓</w:t>
+            </w:r>
           </w:p>
         </w:tc>
         <w:tc>
@@ -8820,6 +8894,13 @@
             <w:pPr>
               <w:spacing w:after="40"/>
             </w:pPr>
+            <w:r>
+              <w:rPr>
+                <w:sz w:val="19"/>
+                <w:szCs w:val="19"/>
+              </w:rPr>
+              <w:t>✓</w:t>
+            </w:r>
           </w:p>
         </w:tc>
         <w:tc>
@@ -8837,13 +8918,6 @@
             <w:pPr>
               <w:spacing w:after="40"/>
             </w:pPr>
-            <w:r>
-              <w:rPr>
-                <w:sz w:val="19"/>
-                <w:szCs w:val="19"/>
-              </w:rPr>
-              <w:t>✓</w:t>
-            </w:r>
           </w:p>
         </w:tc>
         <w:tc>
@@ -8900,7 +8974,7 @@
                 <w:sz w:val="19"/>
                 <w:szCs w:val="19"/>
               </w:rPr>
-              <w:t>Audit Log</w:t>
+              <w:t>Cost Dashboard</w:t>
             </w:r>
           </w:p>
         </w:tc>
@@ -8941,6 +9015,13 @@
             <w:pPr>
               <w:spacing w:after="40"/>
             </w:pPr>
+            <w:r>
+              <w:rPr>
+                <w:sz w:val="19"/>
+                <w:szCs w:val="19"/>
+              </w:rPr>
+              <w:t>✓</w:t>
+            </w:r>
           </w:p>
         </w:tc>
         <w:tc>
@@ -9021,6 +9102,13 @@
             <w:pPr>
               <w:spacing w:after="40"/>
             </w:pPr>
+            <w:r>
+              <w:rPr>
+                <w:sz w:val="19"/>
+                <w:szCs w:val="19"/>
+              </w:rPr>
+              <w:t>✓</w:t>
+            </w:r>
           </w:p>
         </w:tc>
         <w:tc>
@@ -9037,6 +9125,13 @@
             <w:pPr>
               <w:spacing w:after="40"/>
             </w:pPr>
+            <w:r>
+              <w:rPr>
+                <w:sz w:val="19"/>
+                <w:szCs w:val="19"/>
+              </w:rPr>
+              <w:t>✓</w:t>
+            </w:r>
           </w:p>
         </w:tc>
       </w:tr>
@@ -9070,6 +9165,184 @@
                 <w:sz w:val="19"/>
                 <w:szCs w:val="19"/>
               </w:rPr>
+              <w:lastRenderedPageBreak/>
+              <w:t>Audit Log</w:t>
+            </w:r>
+          </w:p>
+        </w:tc>
+        <w:tc>
+          <w:tcPr>
+            <w:tcW w:w="753" w:type="dxa"/>
+            <w:shd w:val="clear" w:color="auto" w:fill="F8FAFB"/>
+            <w:tcMar>
+              <w:top w:w="70" w:type="dxa"/>
+              <w:left w:w="110" w:type="dxa"/>
+              <w:bottom w:w="70" w:type="dxa"/>
+              <w:right w:w="110" w:type="dxa"/>
+            </w:tcMar>
+          </w:tcPr>
+          <w:p>
+            <w:pPr>
+              <w:spacing w:after="40"/>
+            </w:pPr>
+            <w:r>
+              <w:rPr>
+                <w:sz w:val="19"/>
+                <w:szCs w:val="19"/>
+              </w:rPr>
+              <w:t>✓</w:t>
+            </w:r>
+          </w:p>
+        </w:tc>
+        <w:tc>
+          <w:tcPr>
+            <w:tcW w:w="753" w:type="dxa"/>
+            <w:shd w:val="clear" w:color="auto" w:fill="F8FAFB"/>
+            <w:tcMar>
+              <w:top w:w="70" w:type="dxa"/>
+              <w:left w:w="110" w:type="dxa"/>
+              <w:bottom w:w="70" w:type="dxa"/>
+              <w:right w:w="110" w:type="dxa"/>
+            </w:tcMar>
+          </w:tcPr>
+          <w:p>
+            <w:pPr>
+              <w:spacing w:after="40"/>
+            </w:pPr>
+          </w:p>
+        </w:tc>
+        <w:tc>
+          <w:tcPr>
+            <w:tcW w:w="753" w:type="dxa"/>
+            <w:shd w:val="clear" w:color="auto" w:fill="F8FAFB"/>
+            <w:tcMar>
+              <w:top w:w="70" w:type="dxa"/>
+              <w:left w:w="110" w:type="dxa"/>
+              <w:bottom w:w="70" w:type="dxa"/>
+              <w:right w:w="110" w:type="dxa"/>
+            </w:tcMar>
+          </w:tcPr>
+          <w:p>
+            <w:pPr>
+              <w:spacing w:after="40"/>
+            </w:pPr>
+          </w:p>
+        </w:tc>
+        <w:tc>
+          <w:tcPr>
+            <w:tcW w:w="753" w:type="dxa"/>
+            <w:shd w:val="clear" w:color="auto" w:fill="F8FAFB"/>
+            <w:tcMar>
+              <w:top w:w="70" w:type="dxa"/>
+              <w:left w:w="110" w:type="dxa"/>
+              <w:bottom w:w="70" w:type="dxa"/>
+              <w:right w:w="110" w:type="dxa"/>
+            </w:tcMar>
+          </w:tcPr>
+          <w:p>
+            <w:pPr>
+              <w:spacing w:after="40"/>
+            </w:pPr>
+          </w:p>
+        </w:tc>
+        <w:tc>
+          <w:tcPr>
+            <w:tcW w:w="753" w:type="dxa"/>
+            <w:shd w:val="clear" w:color="auto" w:fill="F8FAFB"/>
+            <w:tcMar>
+              <w:top w:w="70" w:type="dxa"/>
+              <w:left w:w="110" w:type="dxa"/>
+              <w:bottom w:w="70" w:type="dxa"/>
+              <w:right w:w="110" w:type="dxa"/>
+            </w:tcMar>
+          </w:tcPr>
+          <w:p>
+            <w:pPr>
+              <w:spacing w:after="40"/>
+            </w:pPr>
+          </w:p>
+        </w:tc>
+        <w:tc>
+          <w:tcPr>
+            <w:tcW w:w="753" w:type="dxa"/>
+            <w:shd w:val="clear" w:color="auto" w:fill="F8FAFB"/>
+            <w:tcMar>
+              <w:top w:w="70" w:type="dxa"/>
+              <w:left w:w="110" w:type="dxa"/>
+              <w:bottom w:w="70" w:type="dxa"/>
+              <w:right w:w="110" w:type="dxa"/>
+            </w:tcMar>
+          </w:tcPr>
+          <w:p>
+            <w:pPr>
+              <w:spacing w:after="40"/>
+            </w:pPr>
+          </w:p>
+        </w:tc>
+        <w:tc>
+          <w:tcPr>
+            <w:tcW w:w="753" w:type="dxa"/>
+            <w:shd w:val="clear" w:color="auto" w:fill="F8FAFB"/>
+            <w:tcMar>
+              <w:top w:w="70" w:type="dxa"/>
+              <w:left w:w="110" w:type="dxa"/>
+              <w:bottom w:w="70" w:type="dxa"/>
+              <w:right w:w="110" w:type="dxa"/>
+            </w:tcMar>
+          </w:tcPr>
+          <w:p>
+            <w:pPr>
+              <w:spacing w:after="40"/>
+            </w:pPr>
+          </w:p>
+        </w:tc>
+        <w:tc>
+          <w:tcPr>
+            <w:tcW w:w="753" w:type="dxa"/>
+            <w:shd w:val="clear" w:color="auto" w:fill="F8FAFB"/>
+            <w:tcMar>
+              <w:top w:w="70" w:type="dxa"/>
+              <w:left w:w="110" w:type="dxa"/>
+              <w:bottom w:w="70" w:type="dxa"/>
+              <w:right w:w="110" w:type="dxa"/>
+            </w:tcMar>
+          </w:tcPr>
+          <w:p>
+            <w:pPr>
+              <w:spacing w:after="40"/>
+            </w:pPr>
+          </w:p>
+        </w:tc>
+      </w:tr>
+      <w:tr>
+        <w:tblPrEx>
+          <w:tblCellMar>
+            <w:top w:w="0" w:type="dxa"/>
+            <w:bottom w:w="0" w:type="dxa"/>
+          </w:tblCellMar>
+        </w:tblPrEx>
+        <w:trPr>
+          <w:cantSplit/>
+        </w:trPr>
+        <w:tc>
+          <w:tcPr>
+            <w:tcW w:w="3388" w:type="dxa"/>
+            <w:tcMar>
+              <w:top w:w="70" w:type="dxa"/>
+              <w:left w:w="110" w:type="dxa"/>
+              <w:bottom w:w="70" w:type="dxa"/>
+              <w:right w:w="110" w:type="dxa"/>
+            </w:tcMar>
+          </w:tcPr>
+          <w:p>
+            <w:pPr>
+              <w:spacing w:after="40"/>
+            </w:pPr>
+            <w:r>
+              <w:rPr>
+                <w:sz w:val="19"/>
+                <w:szCs w:val="19"/>
+              </w:rPr>
               <w:t>Export</w:t>
             </w:r>
           </w:p>
@@ -9077,7 +9350,6 @@
         <w:tc>
           <w:tcPr>
             <w:tcW w:w="753" w:type="dxa"/>
-            <w:shd w:val="clear" w:color="auto" w:fill="F8FAFB"/>
             <w:tcMar>
               <w:top w:w="70" w:type="dxa"/>
               <w:left w:w="110" w:type="dxa"/>
@@ -9101,7 +9373,6 @@
         <w:tc>
           <w:tcPr>
             <w:tcW w:w="753" w:type="dxa"/>
-            <w:shd w:val="clear" w:color="auto" w:fill="F8FAFB"/>
             <w:tcMar>
               <w:top w:w="70" w:type="dxa"/>
               <w:left w:w="110" w:type="dxa"/>
@@ -9125,7 +9396,6 @@
         <w:tc>
           <w:tcPr>
             <w:tcW w:w="753" w:type="dxa"/>
-            <w:shd w:val="clear" w:color="auto" w:fill="F8FAFB"/>
             <w:tcMar>
               <w:top w:w="70" w:type="dxa"/>
               <w:left w:w="110" w:type="dxa"/>
@@ -9142,7 +9412,6 @@
         <w:tc>
           <w:tcPr>
             <w:tcW w:w="753" w:type="dxa"/>
-            <w:shd w:val="clear" w:color="auto" w:fill="F8FAFB"/>
             <w:tcMar>
               <w:top w:w="70" w:type="dxa"/>
               <w:left w:w="110" w:type="dxa"/>
@@ -9159,7 +9428,6 @@
         <w:tc>
           <w:tcPr>
             <w:tcW w:w="753" w:type="dxa"/>
-            <w:shd w:val="clear" w:color="auto" w:fill="F8FAFB"/>
             <w:tcMar>
               <w:top w:w="70" w:type="dxa"/>
               <w:left w:w="110" w:type="dxa"/>
@@ -9176,7 +9444,6 @@
         <w:tc>
           <w:tcPr>
             <w:tcW w:w="753" w:type="dxa"/>
-            <w:shd w:val="clear" w:color="auto" w:fill="F8FAFB"/>
             <w:tcMar>
               <w:top w:w="70" w:type="dxa"/>
               <w:left w:w="110" w:type="dxa"/>
@@ -9193,7 +9460,6 @@
         <w:tc>
           <w:tcPr>
             <w:tcW w:w="753" w:type="dxa"/>
-            <w:shd w:val="clear" w:color="auto" w:fill="F8FAFB"/>
             <w:tcMar>
               <w:top w:w="70" w:type="dxa"/>
               <w:left w:w="110" w:type="dxa"/>
@@ -9217,7 +9483,6 @@
         <w:tc>
           <w:tcPr>
             <w:tcW w:w="753" w:type="dxa"/>
-            <w:shd w:val="clear" w:color="auto" w:fill="F8FAFB"/>
             <w:tcMar>
               <w:top w:w="70" w:type="dxa"/>
               <w:left w:w="110" w:type="dxa"/>
@@ -9243,7 +9508,7 @@
         <w:pStyle w:val="Heading1"/>
         <w:pageBreakBefore/>
       </w:pPr>
-      <w:bookmarkStart w:id="3" w:name="_Toc240916540"/>
+      <w:bookmarkStart w:id="3" w:name="_Toc240919830"/>
       <w:r>
         <w:lastRenderedPageBreak/>
         <w:t>4. Signing in and your account</w:t>
@@ -9254,7 +9519,7 @@
       <w:pPr>
         <w:pStyle w:val="Heading2"/>
       </w:pPr>
-      <w:bookmarkStart w:id="4" w:name="_Toc240916541"/>
+      <w:bookmarkStart w:id="4" w:name="_Toc240919831"/>
       <w:r>
         <w:t>4.1 Sign in</w:t>
       </w:r>
@@ -9317,7 +9582,7 @@
           <w:left w:w="10" w:type="dxa"/>
           <w:right w:w="10" w:type="dxa"/>
         </w:tblCellMar>
-        <w:tblLook w:val="0000" w:firstRow="0" w:lastRow="0" w:firstColumn="0" w:lastColumn="0" w:noHBand="0" w:noVBand="0"/>
+        <w:tblLook w:val="04A0" w:firstRow="1" w:lastRow="0" w:firstColumn="1" w:lastColumn="0" w:noHBand="0" w:noVBand="1"/>
       </w:tblPr>
       <w:tblGrid>
         <w:gridCol w:w="1882"/>
@@ -9767,7 +10032,7 @@
       <w:pPr>
         <w:pStyle w:val="Heading2"/>
       </w:pPr>
-      <w:bookmarkStart w:id="5" w:name="_Toc240916542"/>
+      <w:bookmarkStart w:id="5" w:name="_Toc240919832"/>
       <w:r>
         <w:t>4.2 The header and menu bar (every screen)</w:t>
       </w:r>
@@ -9830,7 +10095,7 @@
           <w:left w:w="10" w:type="dxa"/>
           <w:right w:w="10" w:type="dxa"/>
         </w:tblCellMar>
-        <w:tblLook w:val="0000" w:firstRow="0" w:lastRow="0" w:firstColumn="0" w:lastColumn="0" w:noHBand="0" w:noVBand="0"/>
+        <w:tblLook w:val="04A0" w:firstRow="1" w:lastRow="0" w:firstColumn="1" w:lastColumn="0" w:noHBand="0" w:noVBand="1"/>
       </w:tblPr>
       <w:tblGrid>
         <w:gridCol w:w="1882"/>
@@ -10490,7 +10755,7 @@
       <w:pPr>
         <w:pStyle w:val="Heading2"/>
       </w:pPr>
-      <w:bookmarkStart w:id="6" w:name="_Toc240916543"/>
+      <w:bookmarkStart w:id="6" w:name="_Toc240919833"/>
       <w:r>
         <w:lastRenderedPageBreak/>
         <w:t>4.3 Change Password</w:t>
@@ -10554,7 +10819,7 @@
           <w:left w:w="10" w:type="dxa"/>
           <w:right w:w="10" w:type="dxa"/>
         </w:tblCellMar>
-        <w:tblLook w:val="0000" w:firstRow="0" w:lastRow="0" w:firstColumn="0" w:lastColumn="0" w:noHBand="0" w:noVBand="0"/>
+        <w:tblLook w:val="04A0" w:firstRow="1" w:lastRow="0" w:firstColumn="1" w:lastColumn="0" w:noHBand="0" w:noVBand="1"/>
       </w:tblPr>
       <w:tblGrid>
         <w:gridCol w:w="1882"/>
@@ -11112,7 +11377,7 @@
         <w:pStyle w:val="Heading1"/>
         <w:pageBreakBefore/>
       </w:pPr>
-      <w:bookmarkStart w:id="7" w:name="_Toc240916544"/>
+      <w:bookmarkStart w:id="7" w:name="_Toc240919834"/>
       <w:r>
         <w:lastRenderedPageBreak/>
         <w:t>5. Dashboards and Reports (read-only)</w:t>
@@ -11123,7 +11388,7 @@
       <w:pPr>
         <w:pStyle w:val="Heading2"/>
       </w:pPr>
-      <w:bookmarkStart w:id="8" w:name="_Toc240916545"/>
+      <w:bookmarkStart w:id="8" w:name="_Toc240919835"/>
       <w:r>
         <w:t>5.1 Executive Dashboard</w:t>
       </w:r>
@@ -11186,7 +11451,7 @@
           <w:left w:w="10" w:type="dxa"/>
           <w:right w:w="10" w:type="dxa"/>
         </w:tblCellMar>
-        <w:tblLook w:val="0000" w:firstRow="0" w:lastRow="0" w:firstColumn="0" w:lastColumn="0" w:noHBand="0" w:noVBand="0"/>
+        <w:tblLook w:val="04A0" w:firstRow="1" w:lastRow="0" w:firstColumn="1" w:lastColumn="0" w:noHBand="0" w:noVBand="1"/>
       </w:tblPr>
       <w:tblGrid>
         <w:gridCol w:w="1882"/>
@@ -11636,7 +11901,7 @@
       <w:pPr>
         <w:pStyle w:val="Heading2"/>
       </w:pPr>
-      <w:bookmarkStart w:id="9" w:name="_Toc240916546"/>
+      <w:bookmarkStart w:id="9" w:name="_Toc240919836"/>
       <w:r>
         <w:t>5.2 Sampling Dashboard</w:t>
       </w:r>
@@ -11699,7 +11964,7 @@
           <w:left w:w="10" w:type="dxa"/>
           <w:right w:w="10" w:type="dxa"/>
         </w:tblCellMar>
-        <w:tblLook w:val="0000" w:firstRow="0" w:lastRow="0" w:firstColumn="0" w:lastColumn="0" w:noHBand="0" w:noVBand="0"/>
+        <w:tblLook w:val="04A0" w:firstRow="1" w:lastRow="0" w:firstColumn="1" w:lastColumn="0" w:noHBand="0" w:noVBand="1"/>
       </w:tblPr>
       <w:tblGrid>
         <w:gridCol w:w="1882"/>
@@ -12149,7 +12414,7 @@
       <w:pPr>
         <w:pStyle w:val="Heading2"/>
       </w:pPr>
-      <w:bookmarkStart w:id="10" w:name="_Toc240916547"/>
+      <w:bookmarkStart w:id="10" w:name="_Toc240919837"/>
       <w:r>
         <w:t>5.3 Contact Dashboard</w:t>
       </w:r>
@@ -12213,7 +12478,7 @@
           <w:left w:w="10" w:type="dxa"/>
           <w:right w:w="10" w:type="dxa"/>
         </w:tblCellMar>
-        <w:tblLook w:val="0000" w:firstRow="0" w:lastRow="0" w:firstColumn="0" w:lastColumn="0" w:noHBand="0" w:noVBand="0"/>
+        <w:tblLook w:val="04A0" w:firstRow="1" w:lastRow="0" w:firstColumn="1" w:lastColumn="0" w:noHBand="0" w:noVBand="1"/>
       </w:tblPr>
       <w:tblGrid>
         <w:gridCol w:w="1882"/>
@@ -12453,7 +12718,7 @@
       <w:pPr>
         <w:pStyle w:val="Heading2"/>
       </w:pPr>
-      <w:bookmarkStart w:id="11" w:name="_Toc240916548"/>
+      <w:bookmarkStart w:id="11" w:name="_Toc240919838"/>
       <w:r>
         <w:t>5.4 QA Dashboard</w:t>
       </w:r>
@@ -12516,7 +12781,7 @@
           <w:left w:w="10" w:type="dxa"/>
           <w:right w:w="10" w:type="dxa"/>
         </w:tblCellMar>
-        <w:tblLook w:val="0000" w:firstRow="0" w:lastRow="0" w:firstColumn="0" w:lastColumn="0" w:noHBand="0" w:noVBand="0"/>
+        <w:tblLook w:val="04A0" w:firstRow="1" w:lastRow="0" w:firstColumn="1" w:lastColumn="0" w:noHBand="0" w:noVBand="1"/>
       </w:tblPr>
       <w:tblGrid>
         <w:gridCol w:w="1882"/>
@@ -13073,7 +13338,7 @@
       <w:pPr>
         <w:pStyle w:val="Heading2"/>
       </w:pPr>
-      <w:bookmarkStart w:id="12" w:name="_Toc240916549"/>
+      <w:bookmarkStart w:id="12" w:name="_Toc240919839"/>
       <w:r>
         <w:t>5.5 KII / Document Dashboard</w:t>
       </w:r>
@@ -13136,7 +13401,7 @@
           <w:left w:w="10" w:type="dxa"/>
           <w:right w:w="10" w:type="dxa"/>
         </w:tblCellMar>
-        <w:tblLook w:val="0000" w:firstRow="0" w:lastRow="0" w:firstColumn="0" w:lastColumn="0" w:noHBand="0" w:noVBand="0"/>
+        <w:tblLook w:val="04A0" w:firstRow="1" w:lastRow="0" w:firstColumn="1" w:lastColumn="0" w:noHBand="0" w:noVBand="1"/>
       </w:tblPr>
       <w:tblGrid>
         <w:gridCol w:w="1882"/>
@@ -13483,7 +13748,7 @@
       <w:pPr>
         <w:pStyle w:val="Heading2"/>
       </w:pPr>
-      <w:bookmarkStart w:id="13" w:name="_Toc240916550"/>
+      <w:bookmarkStart w:id="13" w:name="_Toc240919840"/>
       <w:r>
         <w:lastRenderedPageBreak/>
         <w:t>5.6 Reports</w:t>
@@ -13547,7 +13812,7 @@
           <w:left w:w="10" w:type="dxa"/>
           <w:right w:w="10" w:type="dxa"/>
         </w:tblCellMar>
-        <w:tblLook w:val="0000" w:firstRow="0" w:lastRow="0" w:firstColumn="0" w:lastColumn="0" w:noHBand="0" w:noVBand="0"/>
+        <w:tblLook w:val="04A0" w:firstRow="1" w:lastRow="0" w:firstColumn="1" w:lastColumn="0" w:noHBand="0" w:noVBand="1"/>
       </w:tblPr>
       <w:tblGrid>
         <w:gridCol w:w="1882"/>
@@ -13998,7 +14263,7 @@
         <w:pStyle w:val="Heading1"/>
         <w:pageBreakBefore/>
       </w:pPr>
-      <w:bookmarkStart w:id="14" w:name="_Toc240916551"/>
+      <w:bookmarkStart w:id="14" w:name="_Toc240919841"/>
       <w:r>
         <w:lastRenderedPageBreak/>
         <w:t>6. The sample and contact</w:t>
@@ -14009,7 +14274,7 @@
       <w:pPr>
         <w:pStyle w:val="Heading2"/>
       </w:pPr>
-      <w:bookmarkStart w:id="15" w:name="_Toc240916552"/>
+      <w:bookmarkStart w:id="15" w:name="_Toc240919842"/>
       <w:r>
         <w:t>6.1 Main-400 Register (and Reserve)</w:t>
       </w:r>
@@ -14072,7 +14337,7 @@
           <w:left w:w="10" w:type="dxa"/>
           <w:right w:w="10" w:type="dxa"/>
         </w:tblCellMar>
-        <w:tblLook w:val="0000" w:firstRow="0" w:lastRow="0" w:firstColumn="0" w:lastColumn="0" w:noHBand="0" w:noVBand="0"/>
+        <w:tblLook w:val="04A0" w:firstRow="1" w:lastRow="0" w:firstColumn="1" w:lastColumn="0" w:noHBand="0" w:noVBand="1"/>
       </w:tblPr>
       <w:tblGrid>
         <w:gridCol w:w="1882"/>
@@ -14942,7 +15207,7 @@
       <w:pPr>
         <w:pStyle w:val="Heading2"/>
       </w:pPr>
-      <w:bookmarkStart w:id="16" w:name="_Toc240916553"/>
+      <w:bookmarkStart w:id="16" w:name="_Toc240919843"/>
       <w:r>
         <w:t>6.2 Case page</w:t>
       </w:r>
@@ -15005,7 +15270,7 @@
           <w:left w:w="10" w:type="dxa"/>
           <w:right w:w="10" w:type="dxa"/>
         </w:tblCellMar>
-        <w:tblLook w:val="0000" w:firstRow="0" w:lastRow="0" w:firstColumn="0" w:lastColumn="0" w:noHBand="0" w:noVBand="0"/>
+        <w:tblLook w:val="04A0" w:firstRow="1" w:lastRow="0" w:firstColumn="1" w:lastColumn="0" w:noHBand="0" w:noVBand="1"/>
       </w:tblPr>
       <w:tblGrid>
         <w:gridCol w:w="1882"/>
@@ -16621,7 +16886,7 @@
       <w:pPr>
         <w:pStyle w:val="Heading2"/>
       </w:pPr>
-      <w:bookmarkStart w:id="17" w:name="_Toc240916554"/>
+      <w:bookmarkStart w:id="17" w:name="_Toc240919844"/>
       <w:r>
         <w:t>6.3 Pre-Interview Profile (PROIT) and its review screen</w:t>
       </w:r>
@@ -16684,7 +16949,7 @@
           <w:left w:w="10" w:type="dxa"/>
           <w:right w:w="10" w:type="dxa"/>
         </w:tblCellMar>
-        <w:tblLook w:val="0000" w:firstRow="0" w:lastRow="0" w:firstColumn="0" w:lastColumn="0" w:noHBand="0" w:noVBand="0"/>
+        <w:tblLook w:val="04A0" w:firstRow="1" w:lastRow="0" w:firstColumn="1" w:lastColumn="0" w:noHBand="0" w:noVBand="1"/>
       </w:tblPr>
       <w:tblGrid>
         <w:gridCol w:w="1882"/>
@@ -16944,7 +17209,7 @@
                 <w:sz w:val="19"/>
                 <w:szCs w:val="19"/>
               </w:rPr>
-              <w:t>Add a background field (Select a field, What was found, Add field)</w:t>
+              <w:t>Research with AI / Research again</w:t>
             </w:r>
           </w:p>
         </w:tc>
@@ -16968,7 +17233,7 @@
                 <w:sz w:val="19"/>
                 <w:szCs w:val="19"/>
               </w:rPr>
-              <w:t>Adds one fact, for example a working capital facility, from a fixed catalogue of allowed fields.</w:t>
+              <w:t>The AI searches public sources for the organisation and the respondent's published professional role, and proposes background facts. It works in the background for a few minutes; you can leave the page.</w:t>
             </w:r>
           </w:p>
         </w:tc>
@@ -16992,7 +17257,7 @@
                 <w:sz w:val="19"/>
                 <w:szCs w:val="19"/>
               </w:rPr>
-              <w:t>Only listed, documented kinds of fact can be recorded; health, religion, ethnicity, politics and inferred finances are never collected.</w:t>
+              <w:t>Finding what is already public is slow desk work; the AI does the searching so the interview can confirm facts instead of asking for them. It only proposes, never records.</w:t>
             </w:r>
           </w:p>
         </w:tc>
@@ -17016,7 +17281,7 @@
                 <w:sz w:val="19"/>
                 <w:szCs w:val="19"/>
               </w:rPr>
-              <w:t>The field appears in the list, waiting for a source.</w:t>
+              <w:t>A list of proposals appears under “To review”, and a list of what was not found publicly. The organisation name, and the respondent's name and role, are sent to the AI provider's search; never contact details.</w:t>
             </w:r>
           </w:p>
         </w:tc>
@@ -17050,7 +17315,8 @@
                 <w:sz w:val="19"/>
                 <w:szCs w:val="19"/>
               </w:rPr>
-              <w:t>Add source</w:t>
+              <w:lastRenderedPageBreak/>
+              <w:t>Proposed value (editable)</w:t>
             </w:r>
           </w:p>
         </w:tc>
@@ -17073,7 +17339,7 @@
                 <w:sz w:val="19"/>
                 <w:szCs w:val="19"/>
               </w:rPr>
-              <w:t>Attaches the source that shows the fact (for example a registry entry).</w:t>
+              <w:t>The fact the AI found, in plain words. Edit it if the wording needs correcting.</w:t>
             </w:r>
           </w:p>
         </w:tc>
@@ -17096,7 +17362,7 @@
                 <w:sz w:val="19"/>
                 <w:szCs w:val="19"/>
               </w:rPr>
-              <w:t>Every fact with a documentary value needs at least one source so it can be checked.</w:t>
+              <w:t>The researcher is responsible for what enters the profile, so the wording is theirs to fix.</w:t>
             </w:r>
           </w:p>
         </w:tc>
@@ -17119,7 +17385,7 @@
                 <w:sz w:val="19"/>
                 <w:szCs w:val="19"/>
               </w:rPr>
-              <w:t>The source is listed under the field.</w:t>
+              <w:t>Nothing changes until you select Accept.</w:t>
             </w:r>
           </w:p>
         </w:tc>
@@ -17154,7 +17420,7 @@
                 <w:sz w:val="19"/>
                 <w:szCs w:val="19"/>
               </w:rPr>
-              <w:t>Insert suggestion</w:t>
+              <w:t>Proposal sources (title, publisher, date, tier, quote)</w:t>
             </w:r>
           </w:p>
         </w:tc>
@@ -17178,7 +17444,7 @@
                 <w:sz w:val="19"/>
                 <w:szCs w:val="19"/>
               </w:rPr>
-              <w:t>Inserts a suggested probe question for the chosen role, using your evidence.</w:t>
+              <w:t>Every source the AI used, each with a short exact quote. Select the title to open the page and check it.</w:t>
             </w:r>
           </w:p>
         </w:tc>
@@ -17202,7 +17468,7 @@
                 <w:sz w:val="19"/>
                 <w:szCs w:val="19"/>
               </w:rPr>
-              <w:t>Saves writing role-specific questions from scratch and keeps interviews consistent.</w:t>
+              <w:t>Only pages the search actually returned can be cited, so there are no invented references. Checking the page is how you confirm it is the right organisation.</w:t>
             </w:r>
           </w:p>
         </w:tc>
@@ -17226,7 +17492,7 @@
                 <w:sz w:val="19"/>
                 <w:szCs w:val="19"/>
               </w:rPr>
-              <w:t>The suggestion is added above for you to keep, edit or delete.</w:t>
+              <w:t>The page opens in a new tab.</w:t>
             </w:r>
           </w:p>
         </w:tc>
@@ -17260,8 +17526,7 @@
                 <w:sz w:val="19"/>
                 <w:szCs w:val="19"/>
               </w:rPr>
-              <w:lastRenderedPageBreak/>
-              <w:t>Gap-engine notes: Known, Unknown, Contradictions, Priority probe questions, Role-specific module, short form → Save gap-engine notes</w:t>
+              <w:t>Accept (a proposal)</w:t>
             </w:r>
           </w:p>
         </w:tc>
@@ -17284,7 +17549,7 @@
                 <w:sz w:val="19"/>
                 <w:szCs w:val="19"/>
               </w:rPr>
-              <w:t>Records what is already established, what is missing, where sources disagree, and what to ask first.</w:t>
+              <w:t>Puts the fact into the profile as a background field, with all its sources and your name as the person who accepted it.</w:t>
             </w:r>
           </w:p>
         </w:tc>
@@ -17307,7 +17572,7 @@
                 <w:sz w:val="19"/>
                 <w:szCs w:val="19"/>
               </w:rPr>
-              <w:t>Focuses the interview on real gaps and reduces the burden on the respondent.</w:t>
+              <w:t>Every fact needs a source and a person's decision before it can reach a respondent. If you edited the wording it is recorded as “accepted with edits”.</w:t>
             </w:r>
           </w:p>
         </w:tc>
@@ -17330,7 +17595,7 @@
                 <w:sz w:val="19"/>
                 <w:szCs w:val="19"/>
               </w:rPr>
-              <w:t>The notes are saved; the panel shows how many background questions became verifications.</w:t>
+              <w:t>The field appears in the profile with its sources; the proposal moves to “Already decided”. It still needs the lock.</w:t>
             </w:r>
           </w:p>
         </w:tc>
@@ -17365,7 +17630,7 @@
                 <w:sz w:val="19"/>
                 <w:szCs w:val="19"/>
               </w:rPr>
-              <w:t>Lock pre-profile</w:t>
+              <w:t>Reject (a proposal)</w:t>
             </w:r>
           </w:p>
         </w:tc>
@@ -17389,7 +17654,7 @@
                 <w:sz w:val="19"/>
                 <w:szCs w:val="19"/>
               </w:rPr>
-              <w:t>Finalises the profile.</w:t>
+              <w:t>Discards the proposal, for example when it is a different organisation with a similar name.</w:t>
             </w:r>
           </w:p>
         </w:tc>
@@ -17413,7 +17678,7 @@
                 <w:sz w:val="19"/>
                 <w:szCs w:val="19"/>
               </w:rPr>
-              <w:t>A locked profile is the version the interview is planned from; it cannot be quietly changed afterwards. It cannot be locked while a fact still has no source.</w:t>
+              <w:t>A wrong fact put to a respondent damages trust and the data.</w:t>
             </w:r>
           </w:p>
         </w:tc>
@@ -17437,7 +17702,7 @@
                 <w:sz w:val="19"/>
                 <w:szCs w:val="19"/>
               </w:rPr>
-              <w:t>The profile becomes read-only.</w:t>
+              <w:t>The proposal is marked rejected; nothing enters the profile.</w:t>
             </w:r>
           </w:p>
         </w:tc>
@@ -17471,6 +17736,637 @@
                 <w:sz w:val="19"/>
                 <w:szCs w:val="19"/>
               </w:rPr>
+              <w:t>Not found publicly: ask the respondent</w:t>
+            </w:r>
+          </w:p>
+        </w:tc>
+        <w:tc>
+          <w:tcPr>
+            <w:tcW w:w="3012" w:type="dxa"/>
+            <w:tcMar>
+              <w:top w:w="70" w:type="dxa"/>
+              <w:left w:w="110" w:type="dxa"/>
+              <w:bottom w:w="70" w:type="dxa"/>
+              <w:right w:w="110" w:type="dxa"/>
+            </w:tcMar>
+          </w:tcPr>
+          <w:p>
+            <w:pPr>
+              <w:spacing w:after="40"/>
+            </w:pPr>
+            <w:r>
+              <w:rPr>
+                <w:sz w:val="19"/>
+                <w:szCs w:val="19"/>
+              </w:rPr>
+              <w:t>Lists the fields the AI could not find in any public source.</w:t>
+            </w:r>
+          </w:p>
+        </w:tc>
+        <w:tc>
+          <w:tcPr>
+            <w:tcW w:w="2447" w:type="dxa"/>
+            <w:tcMar>
+              <w:top w:w="70" w:type="dxa"/>
+              <w:left w:w="110" w:type="dxa"/>
+              <w:bottom w:w="70" w:type="dxa"/>
+              <w:right w:w="110" w:type="dxa"/>
+            </w:tcMar>
+          </w:tcPr>
+          <w:p>
+            <w:pPr>
+              <w:spacing w:after="40"/>
+            </w:pPr>
+            <w:r>
+              <w:rPr>
+                <w:sz w:val="19"/>
+                <w:szCs w:val="19"/>
+              </w:rPr>
+              <w:t>These are the questions to ask in full at the interview, so the respondent is not asked what is already public.</w:t>
+            </w:r>
+          </w:p>
+        </w:tc>
+        <w:tc>
+          <w:tcPr>
+            <w:tcW w:w="2071" w:type="dxa"/>
+            <w:tcMar>
+              <w:top w:w="70" w:type="dxa"/>
+              <w:left w:w="110" w:type="dxa"/>
+              <w:bottom w:w="70" w:type="dxa"/>
+              <w:right w:w="110" w:type="dxa"/>
+            </w:tcMar>
+          </w:tcPr>
+          <w:p>
+            <w:pPr>
+              <w:spacing w:after="40"/>
+            </w:pPr>
+            <w:r>
+              <w:rPr>
+                <w:sz w:val="19"/>
+                <w:szCs w:val="19"/>
+              </w:rPr>
+              <w:t>Read only. Add any you find yourself with “Add a background field”.</w:t>
+            </w:r>
+          </w:p>
+        </w:tc>
+      </w:tr>
+      <w:tr>
+        <w:tblPrEx>
+          <w:tblCellMar>
+            <w:top w:w="0" w:type="dxa"/>
+            <w:bottom w:w="0" w:type="dxa"/>
+          </w:tblCellMar>
+        </w:tblPrEx>
+        <w:trPr>
+          <w:cantSplit/>
+        </w:trPr>
+        <w:tc>
+          <w:tcPr>
+            <w:tcW w:w="1882" w:type="dxa"/>
+            <w:shd w:val="clear" w:color="auto" w:fill="F8FAFB"/>
+            <w:tcMar>
+              <w:top w:w="70" w:type="dxa"/>
+              <w:left w:w="110" w:type="dxa"/>
+              <w:bottom w:w="70" w:type="dxa"/>
+              <w:right w:w="110" w:type="dxa"/>
+            </w:tcMar>
+          </w:tcPr>
+          <w:p>
+            <w:pPr>
+              <w:spacing w:after="40"/>
+            </w:pPr>
+            <w:r>
+              <w:rPr>
+                <w:sz w:val="19"/>
+                <w:szCs w:val="19"/>
+              </w:rPr>
+              <w:t>Add a background field (Select a field, What was found, Add field)</w:t>
+            </w:r>
+          </w:p>
+        </w:tc>
+        <w:tc>
+          <w:tcPr>
+            <w:tcW w:w="3012" w:type="dxa"/>
+            <w:shd w:val="clear" w:color="auto" w:fill="F8FAFB"/>
+            <w:tcMar>
+              <w:top w:w="70" w:type="dxa"/>
+              <w:left w:w="110" w:type="dxa"/>
+              <w:bottom w:w="70" w:type="dxa"/>
+              <w:right w:w="110" w:type="dxa"/>
+            </w:tcMar>
+          </w:tcPr>
+          <w:p>
+            <w:pPr>
+              <w:spacing w:after="40"/>
+            </w:pPr>
+            <w:r>
+              <w:rPr>
+                <w:sz w:val="19"/>
+                <w:szCs w:val="19"/>
+              </w:rPr>
+              <w:t>Adds one fact, for example a working capital facility, from a fixed catalogue of allowed fields.</w:t>
+            </w:r>
+          </w:p>
+        </w:tc>
+        <w:tc>
+          <w:tcPr>
+            <w:tcW w:w="2447" w:type="dxa"/>
+            <w:shd w:val="clear" w:color="auto" w:fill="F8FAFB"/>
+            <w:tcMar>
+              <w:top w:w="70" w:type="dxa"/>
+              <w:left w:w="110" w:type="dxa"/>
+              <w:bottom w:w="70" w:type="dxa"/>
+              <w:right w:w="110" w:type="dxa"/>
+            </w:tcMar>
+          </w:tcPr>
+          <w:p>
+            <w:pPr>
+              <w:spacing w:after="40"/>
+            </w:pPr>
+            <w:r>
+              <w:rPr>
+                <w:sz w:val="19"/>
+                <w:szCs w:val="19"/>
+              </w:rPr>
+              <w:t>Only listed, documented kinds of fact can be recorded; health, religion, ethnicity, politics and inferred finances are never collected.</w:t>
+            </w:r>
+          </w:p>
+        </w:tc>
+        <w:tc>
+          <w:tcPr>
+            <w:tcW w:w="2071" w:type="dxa"/>
+            <w:shd w:val="clear" w:color="auto" w:fill="F8FAFB"/>
+            <w:tcMar>
+              <w:top w:w="70" w:type="dxa"/>
+              <w:left w:w="110" w:type="dxa"/>
+              <w:bottom w:w="70" w:type="dxa"/>
+              <w:right w:w="110" w:type="dxa"/>
+            </w:tcMar>
+          </w:tcPr>
+          <w:p>
+            <w:pPr>
+              <w:spacing w:after="40"/>
+            </w:pPr>
+            <w:r>
+              <w:rPr>
+                <w:sz w:val="19"/>
+                <w:szCs w:val="19"/>
+              </w:rPr>
+              <w:t>The field appears in the list, waiting for a source.</w:t>
+            </w:r>
+          </w:p>
+        </w:tc>
+      </w:tr>
+      <w:tr>
+        <w:tblPrEx>
+          <w:tblCellMar>
+            <w:top w:w="0" w:type="dxa"/>
+            <w:bottom w:w="0" w:type="dxa"/>
+          </w:tblCellMar>
+        </w:tblPrEx>
+        <w:trPr>
+          <w:cantSplit/>
+        </w:trPr>
+        <w:tc>
+          <w:tcPr>
+            <w:tcW w:w="1882" w:type="dxa"/>
+            <w:tcMar>
+              <w:top w:w="70" w:type="dxa"/>
+              <w:left w:w="110" w:type="dxa"/>
+              <w:bottom w:w="70" w:type="dxa"/>
+              <w:right w:w="110" w:type="dxa"/>
+            </w:tcMar>
+          </w:tcPr>
+          <w:p>
+            <w:pPr>
+              <w:spacing w:after="40"/>
+            </w:pPr>
+            <w:r>
+              <w:rPr>
+                <w:sz w:val="19"/>
+                <w:szCs w:val="19"/>
+              </w:rPr>
+              <w:t>Add source</w:t>
+            </w:r>
+          </w:p>
+        </w:tc>
+        <w:tc>
+          <w:tcPr>
+            <w:tcW w:w="3012" w:type="dxa"/>
+            <w:tcMar>
+              <w:top w:w="70" w:type="dxa"/>
+              <w:left w:w="110" w:type="dxa"/>
+              <w:bottom w:w="70" w:type="dxa"/>
+              <w:right w:w="110" w:type="dxa"/>
+            </w:tcMar>
+          </w:tcPr>
+          <w:p>
+            <w:pPr>
+              <w:spacing w:after="40"/>
+            </w:pPr>
+            <w:r>
+              <w:rPr>
+                <w:sz w:val="19"/>
+                <w:szCs w:val="19"/>
+              </w:rPr>
+              <w:t>Attaches the source that shows the fact (for example a registry entry).</w:t>
+            </w:r>
+          </w:p>
+        </w:tc>
+        <w:tc>
+          <w:tcPr>
+            <w:tcW w:w="2447" w:type="dxa"/>
+            <w:tcMar>
+              <w:top w:w="70" w:type="dxa"/>
+              <w:left w:w="110" w:type="dxa"/>
+              <w:bottom w:w="70" w:type="dxa"/>
+              <w:right w:w="110" w:type="dxa"/>
+            </w:tcMar>
+          </w:tcPr>
+          <w:p>
+            <w:pPr>
+              <w:spacing w:after="40"/>
+            </w:pPr>
+            <w:r>
+              <w:rPr>
+                <w:sz w:val="19"/>
+                <w:szCs w:val="19"/>
+              </w:rPr>
+              <w:t>Every fact with a documentary value needs at least one source so it can be checked.</w:t>
+            </w:r>
+          </w:p>
+        </w:tc>
+        <w:tc>
+          <w:tcPr>
+            <w:tcW w:w="2071" w:type="dxa"/>
+            <w:tcMar>
+              <w:top w:w="70" w:type="dxa"/>
+              <w:left w:w="110" w:type="dxa"/>
+              <w:bottom w:w="70" w:type="dxa"/>
+              <w:right w:w="110" w:type="dxa"/>
+            </w:tcMar>
+          </w:tcPr>
+          <w:p>
+            <w:pPr>
+              <w:spacing w:after="40"/>
+            </w:pPr>
+            <w:r>
+              <w:rPr>
+                <w:sz w:val="19"/>
+                <w:szCs w:val="19"/>
+              </w:rPr>
+              <w:t>The source is listed under the field.</w:t>
+            </w:r>
+          </w:p>
+        </w:tc>
+      </w:tr>
+      <w:tr>
+        <w:tblPrEx>
+          <w:tblCellMar>
+            <w:top w:w="0" w:type="dxa"/>
+            <w:bottom w:w="0" w:type="dxa"/>
+          </w:tblCellMar>
+        </w:tblPrEx>
+        <w:trPr>
+          <w:cantSplit/>
+        </w:trPr>
+        <w:tc>
+          <w:tcPr>
+            <w:tcW w:w="1882" w:type="dxa"/>
+            <w:shd w:val="clear" w:color="auto" w:fill="F8FAFB"/>
+            <w:tcMar>
+              <w:top w:w="70" w:type="dxa"/>
+              <w:left w:w="110" w:type="dxa"/>
+              <w:bottom w:w="70" w:type="dxa"/>
+              <w:right w:w="110" w:type="dxa"/>
+            </w:tcMar>
+          </w:tcPr>
+          <w:p>
+            <w:pPr>
+              <w:spacing w:after="40"/>
+            </w:pPr>
+            <w:r>
+              <w:rPr>
+                <w:sz w:val="19"/>
+                <w:szCs w:val="19"/>
+              </w:rPr>
+              <w:t>Insert suggestion</w:t>
+            </w:r>
+          </w:p>
+        </w:tc>
+        <w:tc>
+          <w:tcPr>
+            <w:tcW w:w="3012" w:type="dxa"/>
+            <w:shd w:val="clear" w:color="auto" w:fill="F8FAFB"/>
+            <w:tcMar>
+              <w:top w:w="70" w:type="dxa"/>
+              <w:left w:w="110" w:type="dxa"/>
+              <w:bottom w:w="70" w:type="dxa"/>
+              <w:right w:w="110" w:type="dxa"/>
+            </w:tcMar>
+          </w:tcPr>
+          <w:p>
+            <w:pPr>
+              <w:spacing w:after="40"/>
+            </w:pPr>
+            <w:r>
+              <w:rPr>
+                <w:sz w:val="19"/>
+                <w:szCs w:val="19"/>
+              </w:rPr>
+              <w:t>Inserts a suggested probe question for the chosen role, using your evidence.</w:t>
+            </w:r>
+          </w:p>
+        </w:tc>
+        <w:tc>
+          <w:tcPr>
+            <w:tcW w:w="2447" w:type="dxa"/>
+            <w:shd w:val="clear" w:color="auto" w:fill="F8FAFB"/>
+            <w:tcMar>
+              <w:top w:w="70" w:type="dxa"/>
+              <w:left w:w="110" w:type="dxa"/>
+              <w:bottom w:w="70" w:type="dxa"/>
+              <w:right w:w="110" w:type="dxa"/>
+            </w:tcMar>
+          </w:tcPr>
+          <w:p>
+            <w:pPr>
+              <w:spacing w:after="40"/>
+            </w:pPr>
+            <w:r>
+              <w:rPr>
+                <w:sz w:val="19"/>
+                <w:szCs w:val="19"/>
+              </w:rPr>
+              <w:t>Saves writing role-specific questions from scratch and keeps interviews consistent.</w:t>
+            </w:r>
+          </w:p>
+        </w:tc>
+        <w:tc>
+          <w:tcPr>
+            <w:tcW w:w="2071" w:type="dxa"/>
+            <w:shd w:val="clear" w:color="auto" w:fill="F8FAFB"/>
+            <w:tcMar>
+              <w:top w:w="70" w:type="dxa"/>
+              <w:left w:w="110" w:type="dxa"/>
+              <w:bottom w:w="70" w:type="dxa"/>
+              <w:right w:w="110" w:type="dxa"/>
+            </w:tcMar>
+          </w:tcPr>
+          <w:p>
+            <w:pPr>
+              <w:spacing w:after="40"/>
+            </w:pPr>
+            <w:r>
+              <w:rPr>
+                <w:sz w:val="19"/>
+                <w:szCs w:val="19"/>
+              </w:rPr>
+              <w:t>The suggestion is added above for you to keep, edit or delete.</w:t>
+            </w:r>
+          </w:p>
+        </w:tc>
+      </w:tr>
+      <w:tr>
+        <w:tblPrEx>
+          <w:tblCellMar>
+            <w:top w:w="0" w:type="dxa"/>
+            <w:bottom w:w="0" w:type="dxa"/>
+          </w:tblCellMar>
+        </w:tblPrEx>
+        <w:trPr>
+          <w:cantSplit/>
+        </w:trPr>
+        <w:tc>
+          <w:tcPr>
+            <w:tcW w:w="1882" w:type="dxa"/>
+            <w:tcMar>
+              <w:top w:w="70" w:type="dxa"/>
+              <w:left w:w="110" w:type="dxa"/>
+              <w:bottom w:w="70" w:type="dxa"/>
+              <w:right w:w="110" w:type="dxa"/>
+            </w:tcMar>
+          </w:tcPr>
+          <w:p>
+            <w:pPr>
+              <w:spacing w:after="40"/>
+            </w:pPr>
+            <w:r>
+              <w:rPr>
+                <w:sz w:val="19"/>
+                <w:szCs w:val="19"/>
+              </w:rPr>
+              <w:t>Gap-engine notes: Known, Unknown, Contradictions, Priority probe questions, Role-specific module, short form → Save gap-engine notes</w:t>
+            </w:r>
+          </w:p>
+        </w:tc>
+        <w:tc>
+          <w:tcPr>
+            <w:tcW w:w="3012" w:type="dxa"/>
+            <w:tcMar>
+              <w:top w:w="70" w:type="dxa"/>
+              <w:left w:w="110" w:type="dxa"/>
+              <w:bottom w:w="70" w:type="dxa"/>
+              <w:right w:w="110" w:type="dxa"/>
+            </w:tcMar>
+          </w:tcPr>
+          <w:p>
+            <w:pPr>
+              <w:spacing w:after="40"/>
+            </w:pPr>
+            <w:r>
+              <w:rPr>
+                <w:sz w:val="19"/>
+                <w:szCs w:val="19"/>
+              </w:rPr>
+              <w:t>Records what is already established, what is missing, where sources disagree, and what to ask first.</w:t>
+            </w:r>
+          </w:p>
+        </w:tc>
+        <w:tc>
+          <w:tcPr>
+            <w:tcW w:w="2447" w:type="dxa"/>
+            <w:tcMar>
+              <w:top w:w="70" w:type="dxa"/>
+              <w:left w:w="110" w:type="dxa"/>
+              <w:bottom w:w="70" w:type="dxa"/>
+              <w:right w:w="110" w:type="dxa"/>
+            </w:tcMar>
+          </w:tcPr>
+          <w:p>
+            <w:pPr>
+              <w:spacing w:after="40"/>
+            </w:pPr>
+            <w:r>
+              <w:rPr>
+                <w:sz w:val="19"/>
+                <w:szCs w:val="19"/>
+              </w:rPr>
+              <w:t>Focuses the interview on real gaps and reduces the burden on the respondent.</w:t>
+            </w:r>
+          </w:p>
+        </w:tc>
+        <w:tc>
+          <w:tcPr>
+            <w:tcW w:w="2071" w:type="dxa"/>
+            <w:tcMar>
+              <w:top w:w="70" w:type="dxa"/>
+              <w:left w:w="110" w:type="dxa"/>
+              <w:bottom w:w="70" w:type="dxa"/>
+              <w:right w:w="110" w:type="dxa"/>
+            </w:tcMar>
+          </w:tcPr>
+          <w:p>
+            <w:pPr>
+              <w:spacing w:after="40"/>
+            </w:pPr>
+            <w:r>
+              <w:rPr>
+                <w:sz w:val="19"/>
+                <w:szCs w:val="19"/>
+              </w:rPr>
+              <w:t>The notes are saved; the panel shows how many background questions became verifications.</w:t>
+            </w:r>
+          </w:p>
+        </w:tc>
+      </w:tr>
+      <w:tr>
+        <w:tblPrEx>
+          <w:tblCellMar>
+            <w:top w:w="0" w:type="dxa"/>
+            <w:bottom w:w="0" w:type="dxa"/>
+          </w:tblCellMar>
+        </w:tblPrEx>
+        <w:trPr>
+          <w:cantSplit/>
+        </w:trPr>
+        <w:tc>
+          <w:tcPr>
+            <w:tcW w:w="1882" w:type="dxa"/>
+            <w:shd w:val="clear" w:color="auto" w:fill="F8FAFB"/>
+            <w:tcMar>
+              <w:top w:w="70" w:type="dxa"/>
+              <w:left w:w="110" w:type="dxa"/>
+              <w:bottom w:w="70" w:type="dxa"/>
+              <w:right w:w="110" w:type="dxa"/>
+            </w:tcMar>
+          </w:tcPr>
+          <w:p>
+            <w:pPr>
+              <w:spacing w:after="40"/>
+            </w:pPr>
+            <w:r>
+              <w:rPr>
+                <w:sz w:val="19"/>
+                <w:szCs w:val="19"/>
+              </w:rPr>
+              <w:t>Lock pre-profile</w:t>
+            </w:r>
+          </w:p>
+        </w:tc>
+        <w:tc>
+          <w:tcPr>
+            <w:tcW w:w="3012" w:type="dxa"/>
+            <w:shd w:val="clear" w:color="auto" w:fill="F8FAFB"/>
+            <w:tcMar>
+              <w:top w:w="70" w:type="dxa"/>
+              <w:left w:w="110" w:type="dxa"/>
+              <w:bottom w:w="70" w:type="dxa"/>
+              <w:right w:w="110" w:type="dxa"/>
+            </w:tcMar>
+          </w:tcPr>
+          <w:p>
+            <w:pPr>
+              <w:spacing w:after="40"/>
+            </w:pPr>
+            <w:r>
+              <w:rPr>
+                <w:sz w:val="19"/>
+                <w:szCs w:val="19"/>
+              </w:rPr>
+              <w:t>Finalises the profile.</w:t>
+            </w:r>
+          </w:p>
+        </w:tc>
+        <w:tc>
+          <w:tcPr>
+            <w:tcW w:w="2447" w:type="dxa"/>
+            <w:shd w:val="clear" w:color="auto" w:fill="F8FAFB"/>
+            <w:tcMar>
+              <w:top w:w="70" w:type="dxa"/>
+              <w:left w:w="110" w:type="dxa"/>
+              <w:bottom w:w="70" w:type="dxa"/>
+              <w:right w:w="110" w:type="dxa"/>
+            </w:tcMar>
+          </w:tcPr>
+          <w:p>
+            <w:pPr>
+              <w:spacing w:after="40"/>
+            </w:pPr>
+            <w:r>
+              <w:rPr>
+                <w:sz w:val="19"/>
+                <w:szCs w:val="19"/>
+              </w:rPr>
+              <w:t>A locked profile is the version the interview is planned from; it cannot be quietly changed afterwards. It cannot be locked while a fact still has no source.</w:t>
+            </w:r>
+          </w:p>
+        </w:tc>
+        <w:tc>
+          <w:tcPr>
+            <w:tcW w:w="2071" w:type="dxa"/>
+            <w:shd w:val="clear" w:color="auto" w:fill="F8FAFB"/>
+            <w:tcMar>
+              <w:top w:w="70" w:type="dxa"/>
+              <w:left w:w="110" w:type="dxa"/>
+              <w:bottom w:w="70" w:type="dxa"/>
+              <w:right w:w="110" w:type="dxa"/>
+            </w:tcMar>
+          </w:tcPr>
+          <w:p>
+            <w:pPr>
+              <w:spacing w:after="40"/>
+            </w:pPr>
+            <w:r>
+              <w:rPr>
+                <w:sz w:val="19"/>
+                <w:szCs w:val="19"/>
+              </w:rPr>
+              <w:t>The profile becomes read-only.</w:t>
+            </w:r>
+          </w:p>
+        </w:tc>
+      </w:tr>
+      <w:tr>
+        <w:tblPrEx>
+          <w:tblCellMar>
+            <w:top w:w="0" w:type="dxa"/>
+            <w:bottom w:w="0" w:type="dxa"/>
+          </w:tblCellMar>
+        </w:tblPrEx>
+        <w:trPr>
+          <w:cantSplit/>
+        </w:trPr>
+        <w:tc>
+          <w:tcPr>
+            <w:tcW w:w="1882" w:type="dxa"/>
+            <w:tcMar>
+              <w:top w:w="70" w:type="dxa"/>
+              <w:left w:w="110" w:type="dxa"/>
+              <w:bottom w:w="70" w:type="dxa"/>
+              <w:right w:w="110" w:type="dxa"/>
+            </w:tcMar>
+          </w:tcPr>
+          <w:p>
+            <w:pPr>
+              <w:spacing w:after="40"/>
+            </w:pPr>
+            <w:r>
+              <w:rPr>
+                <w:sz w:val="19"/>
+                <w:szCs w:val="19"/>
+              </w:rPr>
+              <w:lastRenderedPageBreak/>
               <w:t>Researcher review screen (link)</w:t>
             </w:r>
           </w:p>
@@ -17555,11 +18451,1269 @@
       <w:pPr>
         <w:pStyle w:val="Heading2"/>
       </w:pPr>
-      <w:bookmarkStart w:id="18" w:name="_Toc240916555"/>
+      <w:bookmarkStart w:id="18" w:name="_Toc240919845"/>
       <w:r>
-        <w:t>6.4 Register Organisation</w:t>
+        <w:t>6.4 Interview sheet (verifying a locked profile)</w:t>
       </w:r>
       <w:bookmarkEnd w:id="18"/>
+    </w:p>
+    <w:p>
+      <w:pPr>
+        <w:spacing w:after="120" w:line="288" w:lineRule="auto"/>
+      </w:pPr>
+      <w:r>
+        <w:rPr>
+          <w:b/>
+          <w:bCs/>
+        </w:rPr>
+        <w:t>Who can open it:</w:t>
+      </w:r>
+      <w:r>
+        <w:t xml:space="preserve"> PI / System Admin, Field / Digital Coordinator, Contact RA, KII RA, Supervisor.  </w:t>
+      </w:r>
+      <w:r>
+        <w:rPr>
+          <w:b/>
+          <w:bCs/>
+        </w:rPr>
+        <w:t>Where:</w:t>
+      </w:r>
+      <w:r>
+        <w:t xml:space="preserve"> </w:t>
+      </w:r>
+      <w:r>
+        <w:rPr>
+          <w:rFonts w:ascii="Consolas" w:eastAsia="Consolas" w:hAnsi="Consolas" w:cs="Consolas"/>
+          <w:color w:val="122238"/>
+          <w:sz w:val="19"/>
+          <w:szCs w:val="19"/>
+        </w:rPr>
+        <w:t>(on the case page, and on the KII record)</w:t>
+      </w:r>
+    </w:p>
+    <w:p>
+      <w:pPr>
+        <w:spacing w:after="120" w:line="288" w:lineRule="auto"/>
+      </w:pPr>
+      <w:r>
+        <w:t>The locked pre-interview profile as the interviewer uses it: confirm what is public, ask what is not, record what the respondent says, and after the interview reconcile it. The coordinator and PI see it inside the PROIT panel; a Contact RA sees it on a case assigned to them; a KII RA on a KII record.</w:t>
+      </w:r>
+    </w:p>
+    <w:tbl>
+      <w:tblPr>
+        <w:tblW w:w="9412" w:type="dxa"/>
+        <w:tblBorders>
+          <w:top w:val="single" w:sz="4" w:space="0" w:color="D5DAE0"/>
+          <w:left w:val="single" w:sz="4" w:space="0" w:color="D5DAE0"/>
+          <w:bottom w:val="single" w:sz="4" w:space="0" w:color="D5DAE0"/>
+          <w:right w:val="single" w:sz="4" w:space="0" w:color="D5DAE0"/>
+          <w:insideH w:val="single" w:sz="4" w:space="0" w:color="D5DAE0"/>
+          <w:insideV w:val="single" w:sz="4" w:space="0" w:color="D5DAE0"/>
+        </w:tblBorders>
+        <w:tblCellMar>
+          <w:left w:w="10" w:type="dxa"/>
+          <w:right w:w="10" w:type="dxa"/>
+        </w:tblCellMar>
+        <w:tblLook w:val="04A0" w:firstRow="1" w:lastRow="0" w:firstColumn="1" w:lastColumn="0" w:noHBand="0" w:noVBand="1"/>
+      </w:tblPr>
+      <w:tblGrid>
+        <w:gridCol w:w="1882"/>
+        <w:gridCol w:w="3012"/>
+        <w:gridCol w:w="2447"/>
+        <w:gridCol w:w="2071"/>
+      </w:tblGrid>
+      <w:tr>
+        <w:tblPrEx>
+          <w:tblCellMar>
+            <w:top w:w="0" w:type="dxa"/>
+            <w:bottom w:w="0" w:type="dxa"/>
+          </w:tblCellMar>
+        </w:tblPrEx>
+        <w:trPr>
+          <w:tblHeader/>
+        </w:trPr>
+        <w:tc>
+          <w:tcPr>
+            <w:tcW w:w="1882" w:type="dxa"/>
+            <w:shd w:val="clear" w:color="auto" w:fill="1B3350"/>
+            <w:tcMar>
+              <w:top w:w="70" w:type="dxa"/>
+              <w:left w:w="110" w:type="dxa"/>
+              <w:bottom w:w="70" w:type="dxa"/>
+              <w:right w:w="110" w:type="dxa"/>
+            </w:tcMar>
+          </w:tcPr>
+          <w:p>
+            <w:pPr>
+              <w:spacing w:after="40"/>
+            </w:pPr>
+            <w:r>
+              <w:rPr>
+                <w:b/>
+                <w:bCs/>
+                <w:color w:val="FFFFFF"/>
+                <w:sz w:val="19"/>
+                <w:szCs w:val="19"/>
+              </w:rPr>
+              <w:t>Control</w:t>
+            </w:r>
+          </w:p>
+        </w:tc>
+        <w:tc>
+          <w:tcPr>
+            <w:tcW w:w="3012" w:type="dxa"/>
+            <w:shd w:val="clear" w:color="auto" w:fill="1B3350"/>
+            <w:tcMar>
+              <w:top w:w="70" w:type="dxa"/>
+              <w:left w:w="110" w:type="dxa"/>
+              <w:bottom w:w="70" w:type="dxa"/>
+              <w:right w:w="110" w:type="dxa"/>
+            </w:tcMar>
+          </w:tcPr>
+          <w:p>
+            <w:pPr>
+              <w:spacing w:after="40"/>
+            </w:pPr>
+            <w:r>
+              <w:rPr>
+                <w:b/>
+                <w:bCs/>
+                <w:color w:val="FFFFFF"/>
+                <w:sz w:val="19"/>
+                <w:szCs w:val="19"/>
+              </w:rPr>
+              <w:t>What it does and when to use it</w:t>
+            </w:r>
+          </w:p>
+        </w:tc>
+        <w:tc>
+          <w:tcPr>
+            <w:tcW w:w="2447" w:type="dxa"/>
+            <w:shd w:val="clear" w:color="auto" w:fill="1B3350"/>
+            <w:tcMar>
+              <w:top w:w="70" w:type="dxa"/>
+              <w:left w:w="110" w:type="dxa"/>
+              <w:bottom w:w="70" w:type="dxa"/>
+              <w:right w:w="110" w:type="dxa"/>
+            </w:tcMar>
+          </w:tcPr>
+          <w:p>
+            <w:pPr>
+              <w:spacing w:after="40"/>
+            </w:pPr>
+            <w:r>
+              <w:rPr>
+                <w:b/>
+                <w:bCs/>
+                <w:color w:val="FFFFFF"/>
+                <w:sz w:val="19"/>
+                <w:szCs w:val="19"/>
+              </w:rPr>
+              <w:t>Why it exists</w:t>
+            </w:r>
+          </w:p>
+        </w:tc>
+        <w:tc>
+          <w:tcPr>
+            <w:tcW w:w="2071" w:type="dxa"/>
+            <w:shd w:val="clear" w:color="auto" w:fill="1B3350"/>
+            <w:tcMar>
+              <w:top w:w="70" w:type="dxa"/>
+              <w:left w:w="110" w:type="dxa"/>
+              <w:bottom w:w="70" w:type="dxa"/>
+              <w:right w:w="110" w:type="dxa"/>
+            </w:tcMar>
+          </w:tcPr>
+          <w:p>
+            <w:pPr>
+              <w:spacing w:after="40"/>
+            </w:pPr>
+            <w:r>
+              <w:rPr>
+                <w:b/>
+                <w:bCs/>
+                <w:color w:val="FFFFFF"/>
+                <w:sz w:val="19"/>
+                <w:szCs w:val="19"/>
+              </w:rPr>
+              <w:t>What happens next</w:t>
+            </w:r>
+          </w:p>
+        </w:tc>
+      </w:tr>
+      <w:tr>
+        <w:tblPrEx>
+          <w:tblCellMar>
+            <w:top w:w="0" w:type="dxa"/>
+            <w:bottom w:w="0" w:type="dxa"/>
+          </w:tblCellMar>
+        </w:tblPrEx>
+        <w:trPr>
+          <w:cantSplit/>
+        </w:trPr>
+        <w:tc>
+          <w:tcPr>
+            <w:tcW w:w="1882" w:type="dxa"/>
+            <w:tcMar>
+              <w:top w:w="70" w:type="dxa"/>
+              <w:left w:w="110" w:type="dxa"/>
+              <w:bottom w:w="70" w:type="dxa"/>
+              <w:right w:w="110" w:type="dxa"/>
+            </w:tcMar>
+          </w:tcPr>
+          <w:p>
+            <w:pPr>
+              <w:spacing w:after="40"/>
+            </w:pPr>
+            <w:r>
+              <w:rPr>
+                <w:sz w:val="19"/>
+                <w:szCs w:val="19"/>
+              </w:rPr>
+              <w:t>Status (Verified x of y · settled x of y / Reconciled)</w:t>
+            </w:r>
+          </w:p>
+        </w:tc>
+        <w:tc>
+          <w:tcPr>
+            <w:tcW w:w="3012" w:type="dxa"/>
+            <w:tcMar>
+              <w:top w:w="70" w:type="dxa"/>
+              <w:left w:w="110" w:type="dxa"/>
+              <w:bottom w:w="70" w:type="dxa"/>
+              <w:right w:w="110" w:type="dxa"/>
+            </w:tcMar>
+          </w:tcPr>
+          <w:p>
+            <w:pPr>
+              <w:spacing w:after="40"/>
+            </w:pPr>
+            <w:r>
+              <w:rPr>
+                <w:sz w:val="19"/>
+                <w:szCs w:val="19"/>
+              </w:rPr>
+              <w:t>Counts how many facts have been verified with the respondent and how many are settled. It reads Reconciled when all are.</w:t>
+            </w:r>
+          </w:p>
+        </w:tc>
+        <w:tc>
+          <w:tcPr>
+            <w:tcW w:w="2447" w:type="dxa"/>
+            <w:tcMar>
+              <w:top w:w="70" w:type="dxa"/>
+              <w:left w:w="110" w:type="dxa"/>
+              <w:bottom w:w="70" w:type="dxa"/>
+              <w:right w:w="110" w:type="dxa"/>
+            </w:tcMar>
+          </w:tcPr>
+          <w:p>
+            <w:pPr>
+              <w:spacing w:after="40"/>
+            </w:pPr>
+            <w:r>
+              <w:rPr>
+                <w:sz w:val="19"/>
+                <w:szCs w:val="19"/>
+              </w:rPr>
+              <w:t>A case is not complete until every fact is verified and, where corrected, reconciled.</w:t>
+            </w:r>
+          </w:p>
+        </w:tc>
+        <w:tc>
+          <w:tcPr>
+            <w:tcW w:w="2071" w:type="dxa"/>
+            <w:tcMar>
+              <w:top w:w="70" w:type="dxa"/>
+              <w:left w:w="110" w:type="dxa"/>
+              <w:bottom w:w="70" w:type="dxa"/>
+              <w:right w:w="110" w:type="dxa"/>
+            </w:tcMar>
+          </w:tcPr>
+          <w:p>
+            <w:pPr>
+              <w:spacing w:after="40"/>
+            </w:pPr>
+            <w:r>
+              <w:rPr>
+                <w:sz w:val="19"/>
+                <w:szCs w:val="19"/>
+              </w:rPr>
+              <w:t>Read only. It updates as answers are saved.</w:t>
+            </w:r>
+          </w:p>
+        </w:tc>
+      </w:tr>
+      <w:tr>
+        <w:tblPrEx>
+          <w:tblCellMar>
+            <w:top w:w="0" w:type="dxa"/>
+            <w:bottom w:w="0" w:type="dxa"/>
+          </w:tblCellMar>
+        </w:tblPrEx>
+        <w:trPr>
+          <w:cantSplit/>
+        </w:trPr>
+        <w:tc>
+          <w:tcPr>
+            <w:tcW w:w="1882" w:type="dxa"/>
+            <w:shd w:val="clear" w:color="auto" w:fill="F8FAFB"/>
+            <w:tcMar>
+              <w:top w:w="70" w:type="dxa"/>
+              <w:left w:w="110" w:type="dxa"/>
+              <w:bottom w:w="70" w:type="dxa"/>
+              <w:right w:w="110" w:type="dxa"/>
+            </w:tcMar>
+          </w:tcPr>
+          <w:p>
+            <w:pPr>
+              <w:spacing w:after="40"/>
+            </w:pPr>
+            <w:r>
+              <w:rPr>
+                <w:sz w:val="19"/>
+                <w:szCs w:val="19"/>
+              </w:rPr>
+              <w:t>Confirm / Confirm, then probe / Ask (label on each row)</w:t>
+            </w:r>
+          </w:p>
+        </w:tc>
+        <w:tc>
+          <w:tcPr>
+            <w:tcW w:w="3012" w:type="dxa"/>
+            <w:shd w:val="clear" w:color="auto" w:fill="F8FAFB"/>
+            <w:tcMar>
+              <w:top w:w="70" w:type="dxa"/>
+              <w:left w:w="110" w:type="dxa"/>
+              <w:bottom w:w="70" w:type="dxa"/>
+              <w:right w:w="110" w:type="dxa"/>
+            </w:tcMar>
+          </w:tcPr>
+          <w:p>
+            <w:pPr>
+              <w:spacing w:after="40"/>
+            </w:pPr>
+            <w:r>
+              <w:rPr>
+                <w:sz w:val="19"/>
+                <w:szCs w:val="19"/>
+              </w:rPr>
+              <w:t>Tells you what to do with that row: confirm a public fact, confirm it and probe (sources disagree), or ask the question in full because nothing reliable is public.</w:t>
+            </w:r>
+          </w:p>
+        </w:tc>
+        <w:tc>
+          <w:tcPr>
+            <w:tcW w:w="2447" w:type="dxa"/>
+            <w:shd w:val="clear" w:color="auto" w:fill="F8FAFB"/>
+            <w:tcMar>
+              <w:top w:w="70" w:type="dxa"/>
+              <w:left w:w="110" w:type="dxa"/>
+              <w:bottom w:w="70" w:type="dxa"/>
+              <w:right w:w="110" w:type="dxa"/>
+            </w:tcMar>
+          </w:tcPr>
+          <w:p>
+            <w:pPr>
+              <w:spacing w:after="40"/>
+            </w:pPr>
+            <w:r>
+              <w:rPr>
+                <w:sz w:val="19"/>
+                <w:szCs w:val="19"/>
+              </w:rPr>
+              <w:t>Asking only what is not public reduces the burden on the respondent.</w:t>
+            </w:r>
+          </w:p>
+        </w:tc>
+        <w:tc>
+          <w:tcPr>
+            <w:tcW w:w="2071" w:type="dxa"/>
+            <w:shd w:val="clear" w:color="auto" w:fill="F8FAFB"/>
+            <w:tcMar>
+              <w:top w:w="70" w:type="dxa"/>
+              <w:left w:w="110" w:type="dxa"/>
+              <w:bottom w:w="70" w:type="dxa"/>
+              <w:right w:w="110" w:type="dxa"/>
+            </w:tcMar>
+          </w:tcPr>
+          <w:p>
+            <w:pPr>
+              <w:spacing w:after="40"/>
+            </w:pPr>
+            <w:r>
+              <w:rPr>
+                <w:sz w:val="19"/>
+                <w:szCs w:val="19"/>
+              </w:rPr>
+              <w:t>Read only.</w:t>
+            </w:r>
+          </w:p>
+        </w:tc>
+      </w:tr>
+      <w:tr>
+        <w:tblPrEx>
+          <w:tblCellMar>
+            <w:top w:w="0" w:type="dxa"/>
+            <w:bottom w:w="0" w:type="dxa"/>
+          </w:tblCellMar>
+        </w:tblPrEx>
+        <w:trPr>
+          <w:cantSplit/>
+        </w:trPr>
+        <w:tc>
+          <w:tcPr>
+            <w:tcW w:w="1882" w:type="dxa"/>
+            <w:tcMar>
+              <w:top w:w="70" w:type="dxa"/>
+              <w:left w:w="110" w:type="dxa"/>
+              <w:bottom w:w="70" w:type="dxa"/>
+              <w:right w:w="110" w:type="dxa"/>
+            </w:tcMar>
+          </w:tcPr>
+          <w:p>
+            <w:pPr>
+              <w:spacing w:after="40"/>
+            </w:pPr>
+            <w:r>
+              <w:rPr>
+                <w:sz w:val="19"/>
+                <w:szCs w:val="19"/>
+              </w:rPr>
+              <w:t>Public source says (with source links)</w:t>
+            </w:r>
+          </w:p>
+        </w:tc>
+        <w:tc>
+          <w:tcPr>
+            <w:tcW w:w="3012" w:type="dxa"/>
+            <w:tcMar>
+              <w:top w:w="70" w:type="dxa"/>
+              <w:left w:w="110" w:type="dxa"/>
+              <w:bottom w:w="70" w:type="dxa"/>
+              <w:right w:w="110" w:type="dxa"/>
+            </w:tcMar>
+          </w:tcPr>
+          <w:p>
+            <w:pPr>
+              <w:spacing w:after="40"/>
+            </w:pPr>
+            <w:r>
+              <w:rPr>
+                <w:sz w:val="19"/>
+                <w:szCs w:val="19"/>
+              </w:rPr>
+              <w:t>Shows the public fact and where it came from. A weak source's value is hidden and the row says to ask in full.</w:t>
+            </w:r>
+          </w:p>
+        </w:tc>
+        <w:tc>
+          <w:tcPr>
+            <w:tcW w:w="2447" w:type="dxa"/>
+            <w:tcMar>
+              <w:top w:w="70" w:type="dxa"/>
+              <w:left w:w="110" w:type="dxa"/>
+              <w:bottom w:w="70" w:type="dxa"/>
+              <w:right w:w="110" w:type="dxa"/>
+            </w:tcMar>
+          </w:tcPr>
+          <w:p>
+            <w:pPr>
+              <w:spacing w:after="40"/>
+            </w:pPr>
+            <w:r>
+              <w:rPr>
+                <w:sz w:val="19"/>
+                <w:szCs w:val="19"/>
+              </w:rPr>
+              <w:t>A weak or uncorroborated fact must never be put to a respondent as if it were established.</w:t>
+            </w:r>
+          </w:p>
+        </w:tc>
+        <w:tc>
+          <w:tcPr>
+            <w:tcW w:w="2071" w:type="dxa"/>
+            <w:tcMar>
+              <w:top w:w="70" w:type="dxa"/>
+              <w:left w:w="110" w:type="dxa"/>
+              <w:bottom w:w="70" w:type="dxa"/>
+              <w:right w:w="110" w:type="dxa"/>
+            </w:tcMar>
+          </w:tcPr>
+          <w:p>
+            <w:pPr>
+              <w:spacing w:after="40"/>
+            </w:pPr>
+            <w:r>
+              <w:rPr>
+                <w:sz w:val="19"/>
+                <w:szCs w:val="19"/>
+              </w:rPr>
+              <w:t>Read only. Select a source to open it.</w:t>
+            </w:r>
+          </w:p>
+        </w:tc>
+      </w:tr>
+      <w:tr>
+        <w:tblPrEx>
+          <w:tblCellMar>
+            <w:top w:w="0" w:type="dxa"/>
+            <w:bottom w:w="0" w:type="dxa"/>
+          </w:tblCellMar>
+        </w:tblPrEx>
+        <w:trPr>
+          <w:cantSplit/>
+        </w:trPr>
+        <w:tc>
+          <w:tcPr>
+            <w:tcW w:w="1882" w:type="dxa"/>
+            <w:shd w:val="clear" w:color="auto" w:fill="F8FAFB"/>
+            <w:tcMar>
+              <w:top w:w="70" w:type="dxa"/>
+              <w:left w:w="110" w:type="dxa"/>
+              <w:bottom w:w="70" w:type="dxa"/>
+              <w:right w:w="110" w:type="dxa"/>
+            </w:tcMar>
+          </w:tcPr>
+          <w:p>
+            <w:pPr>
+              <w:spacing w:after="40"/>
+            </w:pPr>
+            <w:r>
+              <w:rPr>
+                <w:sz w:val="19"/>
+                <w:szCs w:val="19"/>
+              </w:rPr>
+              <w:t>What the respondent said</w:t>
+            </w:r>
+          </w:p>
+        </w:tc>
+        <w:tc>
+          <w:tcPr>
+            <w:tcW w:w="3012" w:type="dxa"/>
+            <w:shd w:val="clear" w:color="auto" w:fill="F8FAFB"/>
+            <w:tcMar>
+              <w:top w:w="70" w:type="dxa"/>
+              <w:left w:w="110" w:type="dxa"/>
+              <w:bottom w:w="70" w:type="dxa"/>
+              <w:right w:w="110" w:type="dxa"/>
+            </w:tcMar>
+          </w:tcPr>
+          <w:p>
+            <w:pPr>
+              <w:spacing w:after="40"/>
+            </w:pPr>
+            <w:r>
+              <w:rPr>
+                <w:sz w:val="19"/>
+                <w:szCs w:val="19"/>
+              </w:rPr>
+              <w:t>Record the answer: confirmed, corrected, partly correct or out of date, does not know, prefers not to say, or does not apply. For a gap, “They told us”.</w:t>
+            </w:r>
+          </w:p>
+        </w:tc>
+        <w:tc>
+          <w:tcPr>
+            <w:tcW w:w="2447" w:type="dxa"/>
+            <w:shd w:val="clear" w:color="auto" w:fill="F8FAFB"/>
+            <w:tcMar>
+              <w:top w:w="70" w:type="dxa"/>
+              <w:left w:w="110" w:type="dxa"/>
+              <w:bottom w:w="70" w:type="dxa"/>
+              <w:right w:w="110" w:type="dxa"/>
+            </w:tcMar>
+          </w:tcPr>
+          <w:p>
+            <w:pPr>
+              <w:spacing w:after="40"/>
+            </w:pPr>
+            <w:r>
+              <w:rPr>
+                <w:sz w:val="19"/>
+                <w:szCs w:val="19"/>
+              </w:rPr>
+              <w:t>The respondent's answer is kept separately from the public value and never replaces it; that separation is what lets the analysis compare the two.</w:t>
+            </w:r>
+          </w:p>
+        </w:tc>
+        <w:tc>
+          <w:tcPr>
+            <w:tcW w:w="2071" w:type="dxa"/>
+            <w:shd w:val="clear" w:color="auto" w:fill="F8FAFB"/>
+            <w:tcMar>
+              <w:top w:w="70" w:type="dxa"/>
+              <w:left w:w="110" w:type="dxa"/>
+              <w:bottom w:w="70" w:type="dxa"/>
+              <w:right w:w="110" w:type="dxa"/>
+            </w:tcMar>
+          </w:tcPr>
+          <w:p>
+            <w:pPr>
+              <w:spacing w:after="40"/>
+            </w:pPr>
+            <w:r>
+              <w:rPr>
+                <w:sz w:val="19"/>
+                <w:szCs w:val="19"/>
+              </w:rPr>
+              <w:t>Nothing is saved until Save answer.</w:t>
+            </w:r>
+          </w:p>
+        </w:tc>
+      </w:tr>
+      <w:tr>
+        <w:tblPrEx>
+          <w:tblCellMar>
+            <w:top w:w="0" w:type="dxa"/>
+            <w:bottom w:w="0" w:type="dxa"/>
+          </w:tblCellMar>
+        </w:tblPrEx>
+        <w:trPr>
+          <w:cantSplit/>
+        </w:trPr>
+        <w:tc>
+          <w:tcPr>
+            <w:tcW w:w="1882" w:type="dxa"/>
+            <w:tcMar>
+              <w:top w:w="70" w:type="dxa"/>
+              <w:left w:w="110" w:type="dxa"/>
+              <w:bottom w:w="70" w:type="dxa"/>
+              <w:right w:w="110" w:type="dxa"/>
+            </w:tcMar>
+          </w:tcPr>
+          <w:p>
+            <w:pPr>
+              <w:spacing w:after="40"/>
+            </w:pPr>
+            <w:r>
+              <w:rPr>
+                <w:sz w:val="19"/>
+                <w:szCs w:val="19"/>
+              </w:rPr>
+              <w:t>Their answer / Comment</w:t>
+            </w:r>
+          </w:p>
+        </w:tc>
+        <w:tc>
+          <w:tcPr>
+            <w:tcW w:w="3012" w:type="dxa"/>
+            <w:tcMar>
+              <w:top w:w="70" w:type="dxa"/>
+              <w:left w:w="110" w:type="dxa"/>
+              <w:bottom w:w="70" w:type="dxa"/>
+              <w:right w:w="110" w:type="dxa"/>
+            </w:tcMar>
+          </w:tcPr>
+          <w:p>
+            <w:pPr>
+              <w:spacing w:after="40"/>
+            </w:pPr>
+            <w:r>
+              <w:rPr>
+                <w:sz w:val="19"/>
+                <w:szCs w:val="19"/>
+              </w:rPr>
+              <w:t>Type what the respondent said when they corrected or supplied a value, and any comment.</w:t>
+            </w:r>
+          </w:p>
+        </w:tc>
+        <w:tc>
+          <w:tcPr>
+            <w:tcW w:w="2447" w:type="dxa"/>
+            <w:tcMar>
+              <w:top w:w="70" w:type="dxa"/>
+              <w:left w:w="110" w:type="dxa"/>
+              <w:bottom w:w="70" w:type="dxa"/>
+              <w:right w:w="110" w:type="dxa"/>
+            </w:tcMar>
+          </w:tcPr>
+          <w:p>
+            <w:pPr>
+              <w:spacing w:after="40"/>
+            </w:pPr>
+            <w:r>
+              <w:rPr>
+                <w:sz w:val="19"/>
+                <w:szCs w:val="19"/>
+              </w:rPr>
+              <w:t>The exact answer is the research data; the comment explains it.</w:t>
+            </w:r>
+          </w:p>
+        </w:tc>
+        <w:tc>
+          <w:tcPr>
+            <w:tcW w:w="2071" w:type="dxa"/>
+            <w:tcMar>
+              <w:top w:w="70" w:type="dxa"/>
+              <w:left w:w="110" w:type="dxa"/>
+              <w:bottom w:w="70" w:type="dxa"/>
+              <w:right w:w="110" w:type="dxa"/>
+            </w:tcMar>
+          </w:tcPr>
+          <w:p>
+            <w:pPr>
+              <w:spacing w:after="40"/>
+            </w:pPr>
+            <w:r>
+              <w:rPr>
+                <w:sz w:val="19"/>
+                <w:szCs w:val="19"/>
+              </w:rPr>
+              <w:t>Kept with the row.</w:t>
+            </w:r>
+          </w:p>
+        </w:tc>
+      </w:tr>
+      <w:tr>
+        <w:tblPrEx>
+          <w:tblCellMar>
+            <w:top w:w="0" w:type="dxa"/>
+            <w:bottom w:w="0" w:type="dxa"/>
+          </w:tblCellMar>
+        </w:tblPrEx>
+        <w:trPr>
+          <w:cantSplit/>
+        </w:trPr>
+        <w:tc>
+          <w:tcPr>
+            <w:tcW w:w="1882" w:type="dxa"/>
+            <w:shd w:val="clear" w:color="auto" w:fill="F8FAFB"/>
+            <w:tcMar>
+              <w:top w:w="70" w:type="dxa"/>
+              <w:left w:w="110" w:type="dxa"/>
+              <w:bottom w:w="70" w:type="dxa"/>
+              <w:right w:w="110" w:type="dxa"/>
+            </w:tcMar>
+          </w:tcPr>
+          <w:p>
+            <w:pPr>
+              <w:spacing w:after="40"/>
+            </w:pPr>
+            <w:r>
+              <w:rPr>
+                <w:sz w:val="19"/>
+                <w:szCs w:val="19"/>
+              </w:rPr>
+              <w:t>Save answer</w:t>
+            </w:r>
+          </w:p>
+        </w:tc>
+        <w:tc>
+          <w:tcPr>
+            <w:tcW w:w="3012" w:type="dxa"/>
+            <w:shd w:val="clear" w:color="auto" w:fill="F8FAFB"/>
+            <w:tcMar>
+              <w:top w:w="70" w:type="dxa"/>
+              <w:left w:w="110" w:type="dxa"/>
+              <w:bottom w:w="70" w:type="dxa"/>
+              <w:right w:w="110" w:type="dxa"/>
+            </w:tcMar>
+          </w:tcPr>
+          <w:p>
+            <w:pPr>
+              <w:spacing w:after="40"/>
+            </w:pPr>
+            <w:r>
+              <w:rPr>
+                <w:sz w:val="19"/>
+                <w:szCs w:val="19"/>
+              </w:rPr>
+              <w:t>Saves the answer for that fact.</w:t>
+            </w:r>
+          </w:p>
+        </w:tc>
+        <w:tc>
+          <w:tcPr>
+            <w:tcW w:w="2447" w:type="dxa"/>
+            <w:shd w:val="clear" w:color="auto" w:fill="F8FAFB"/>
+            <w:tcMar>
+              <w:top w:w="70" w:type="dxa"/>
+              <w:left w:w="110" w:type="dxa"/>
+              <w:bottom w:w="70" w:type="dxa"/>
+              <w:right w:w="110" w:type="dxa"/>
+            </w:tcMar>
+          </w:tcPr>
+          <w:p>
+            <w:pPr>
+              <w:spacing w:after="40"/>
+            </w:pPr>
+            <w:r>
+              <w:rPr>
+                <w:sz w:val="19"/>
+                <w:szCs w:val="19"/>
+              </w:rPr>
+              <w:t>Each answer is recorded as it is given, so nothing depends on memory after the interview.</w:t>
+            </w:r>
+          </w:p>
+        </w:tc>
+        <w:tc>
+          <w:tcPr>
+            <w:tcW w:w="2071" w:type="dxa"/>
+            <w:shd w:val="clear" w:color="auto" w:fill="F8FAFB"/>
+            <w:tcMar>
+              <w:top w:w="70" w:type="dxa"/>
+              <w:left w:w="110" w:type="dxa"/>
+              <w:bottom w:w="70" w:type="dxa"/>
+              <w:right w:w="110" w:type="dxa"/>
+            </w:tcMar>
+          </w:tcPr>
+          <w:p>
+            <w:pPr>
+              <w:spacing w:after="40"/>
+            </w:pPr>
+            <w:r>
+              <w:rPr>
+                <w:sz w:val="19"/>
+                <w:szCs w:val="19"/>
+              </w:rPr>
+              <w:t>The status updates; “Recorded: …” appears under the row. A correction shows “Differs from the public source”.</w:t>
+            </w:r>
+          </w:p>
+        </w:tc>
+      </w:tr>
+      <w:tr>
+        <w:tblPrEx>
+          <w:tblCellMar>
+            <w:top w:w="0" w:type="dxa"/>
+            <w:bottom w:w="0" w:type="dxa"/>
+          </w:tblCellMar>
+        </w:tblPrEx>
+        <w:trPr>
+          <w:cantSplit/>
+        </w:trPr>
+        <w:tc>
+          <w:tcPr>
+            <w:tcW w:w="1882" w:type="dxa"/>
+            <w:tcMar>
+              <w:top w:w="70" w:type="dxa"/>
+              <w:left w:w="110" w:type="dxa"/>
+              <w:bottom w:w="70" w:type="dxa"/>
+              <w:right w:w="110" w:type="dxa"/>
+            </w:tcMar>
+          </w:tcPr>
+          <w:p>
+            <w:pPr>
+              <w:spacing w:after="40"/>
+            </w:pPr>
+            <w:r>
+              <w:rPr>
+                <w:sz w:val="19"/>
+                <w:szCs w:val="19"/>
+              </w:rPr>
+              <w:t>Differs from the public source (label)</w:t>
+            </w:r>
+          </w:p>
+        </w:tc>
+        <w:tc>
+          <w:tcPr>
+            <w:tcW w:w="3012" w:type="dxa"/>
+            <w:tcMar>
+              <w:top w:w="70" w:type="dxa"/>
+              <w:left w:w="110" w:type="dxa"/>
+              <w:bottom w:w="70" w:type="dxa"/>
+              <w:right w:w="110" w:type="dxa"/>
+            </w:tcMar>
+          </w:tcPr>
+          <w:p>
+            <w:pPr>
+              <w:spacing w:after="40"/>
+            </w:pPr>
+            <w:r>
+              <w:rPr>
+                <w:sz w:val="19"/>
+                <w:szCs w:val="19"/>
+              </w:rPr>
+              <w:t>Marks a fact the respondent corrected or qualified.</w:t>
+            </w:r>
+          </w:p>
+        </w:tc>
+        <w:tc>
+          <w:tcPr>
+            <w:tcW w:w="2447" w:type="dxa"/>
+            <w:tcMar>
+              <w:top w:w="70" w:type="dxa"/>
+              <w:left w:w="110" w:type="dxa"/>
+              <w:bottom w:w="70" w:type="dxa"/>
+              <w:right w:w="110" w:type="dxa"/>
+            </w:tcMar>
+          </w:tcPr>
+          <w:p>
+            <w:pPr>
+              <w:spacing w:after="40"/>
+            </w:pPr>
+            <w:r>
+              <w:rPr>
+                <w:sz w:val="19"/>
+                <w:szCs w:val="19"/>
+              </w:rPr>
+              <w:t>Contradictions between public sources and respondents are findings, not errors to hide.</w:t>
+            </w:r>
+          </w:p>
+        </w:tc>
+        <w:tc>
+          <w:tcPr>
+            <w:tcW w:w="2071" w:type="dxa"/>
+            <w:tcMar>
+              <w:top w:w="70" w:type="dxa"/>
+              <w:left w:w="110" w:type="dxa"/>
+              <w:bottom w:w="70" w:type="dxa"/>
+              <w:right w:w="110" w:type="dxa"/>
+            </w:tcMar>
+          </w:tcPr>
+          <w:p>
+            <w:pPr>
+              <w:spacing w:after="40"/>
+            </w:pPr>
+            <w:r>
+              <w:rPr>
+                <w:sz w:val="19"/>
+                <w:szCs w:val="19"/>
+              </w:rPr>
+              <w:t>Read only. The coordinator reconciles it.</w:t>
+            </w:r>
+          </w:p>
+        </w:tc>
+      </w:tr>
+      <w:tr>
+        <w:tblPrEx>
+          <w:tblCellMar>
+            <w:top w:w="0" w:type="dxa"/>
+            <w:bottom w:w="0" w:type="dxa"/>
+          </w:tblCellMar>
+        </w:tblPrEx>
+        <w:trPr>
+          <w:cantSplit/>
+        </w:trPr>
+        <w:tc>
+          <w:tcPr>
+            <w:tcW w:w="1882" w:type="dxa"/>
+            <w:shd w:val="clear" w:color="auto" w:fill="F8FAFB"/>
+            <w:tcMar>
+              <w:top w:w="70" w:type="dxa"/>
+              <w:left w:w="110" w:type="dxa"/>
+              <w:bottom w:w="70" w:type="dxa"/>
+              <w:right w:w="110" w:type="dxa"/>
+            </w:tcMar>
+          </w:tcPr>
+          <w:p>
+            <w:pPr>
+              <w:spacing w:after="40"/>
+            </w:pPr>
+            <w:r>
+              <w:rPr>
+                <w:sz w:val="19"/>
+                <w:szCs w:val="19"/>
+              </w:rPr>
+              <w:lastRenderedPageBreak/>
+              <w:t>Interview finished</w:t>
+            </w:r>
+          </w:p>
+        </w:tc>
+        <w:tc>
+          <w:tcPr>
+            <w:tcW w:w="3012" w:type="dxa"/>
+            <w:shd w:val="clear" w:color="auto" w:fill="F8FAFB"/>
+            <w:tcMar>
+              <w:top w:w="70" w:type="dxa"/>
+              <w:left w:w="110" w:type="dxa"/>
+              <w:bottom w:w="70" w:type="dxa"/>
+              <w:right w:w="110" w:type="dxa"/>
+            </w:tcMar>
+          </w:tcPr>
+          <w:p>
+            <w:pPr>
+              <w:spacing w:after="40"/>
+            </w:pPr>
+            <w:r>
+              <w:rPr>
+                <w:sz w:val="19"/>
+                <w:szCs w:val="19"/>
+              </w:rPr>
+              <w:t>Records that the interview and its verification are over, so reconciliation can begin.</w:t>
+            </w:r>
+          </w:p>
+        </w:tc>
+        <w:tc>
+          <w:tcPr>
+            <w:tcW w:w="2447" w:type="dxa"/>
+            <w:shd w:val="clear" w:color="auto" w:fill="F8FAFB"/>
+            <w:tcMar>
+              <w:top w:w="70" w:type="dxa"/>
+              <w:left w:w="110" w:type="dxa"/>
+              <w:bottom w:w="70" w:type="dxa"/>
+              <w:right w:w="110" w:type="dxa"/>
+            </w:tcMar>
+          </w:tcPr>
+          <w:p>
+            <w:pPr>
+              <w:spacing w:after="40"/>
+            </w:pPr>
+            <w:r>
+              <w:rPr>
+                <w:sz w:val="19"/>
+                <w:szCs w:val="19"/>
+              </w:rPr>
+              <w:t>Separates what was said in the interview from the researcher's later coding.</w:t>
+            </w:r>
+          </w:p>
+        </w:tc>
+        <w:tc>
+          <w:tcPr>
+            <w:tcW w:w="2071" w:type="dxa"/>
+            <w:shd w:val="clear" w:color="auto" w:fill="F8FAFB"/>
+            <w:tcMar>
+              <w:top w:w="70" w:type="dxa"/>
+              <w:left w:w="110" w:type="dxa"/>
+              <w:bottom w:w="70" w:type="dxa"/>
+              <w:right w:w="110" w:type="dxa"/>
+            </w:tcMar>
+          </w:tcPr>
+          <w:p>
+            <w:pPr>
+              <w:spacing w:after="40"/>
+            </w:pPr>
+            <w:r>
+              <w:rPr>
+                <w:sz w:val="19"/>
+                <w:szCs w:val="19"/>
+              </w:rPr>
+              <w:t>It shows the time it was recorded.</w:t>
+            </w:r>
+          </w:p>
+        </w:tc>
+      </w:tr>
+      <w:tr>
+        <w:tblPrEx>
+          <w:tblCellMar>
+            <w:top w:w="0" w:type="dxa"/>
+            <w:bottom w:w="0" w:type="dxa"/>
+          </w:tblCellMar>
+        </w:tblPrEx>
+        <w:trPr>
+          <w:cantSplit/>
+        </w:trPr>
+        <w:tc>
+          <w:tcPr>
+            <w:tcW w:w="1882" w:type="dxa"/>
+            <w:tcMar>
+              <w:top w:w="70" w:type="dxa"/>
+              <w:left w:w="110" w:type="dxa"/>
+              <w:bottom w:w="70" w:type="dxa"/>
+              <w:right w:w="110" w:type="dxa"/>
+            </w:tcMar>
+          </w:tcPr>
+          <w:p>
+            <w:pPr>
+              <w:spacing w:after="40"/>
+            </w:pPr>
+            <w:r>
+              <w:rPr>
+                <w:sz w:val="19"/>
+                <w:szCs w:val="19"/>
+              </w:rPr>
+              <w:t>Reconciled value (required) → Save reconciled value (the PI, the Field Coordinator only)</w:t>
+            </w:r>
+          </w:p>
+        </w:tc>
+        <w:tc>
+          <w:tcPr>
+            <w:tcW w:w="3012" w:type="dxa"/>
+            <w:tcMar>
+              <w:top w:w="70" w:type="dxa"/>
+              <w:left w:w="110" w:type="dxa"/>
+              <w:bottom w:w="70" w:type="dxa"/>
+              <w:right w:w="110" w:type="dxa"/>
+            </w:tcMar>
+          </w:tcPr>
+          <w:p>
+            <w:pPr>
+              <w:spacing w:after="40"/>
+            </w:pPr>
+            <w:r>
+              <w:rPr>
+                <w:sz w:val="19"/>
+                <w:szCs w:val="19"/>
+              </w:rPr>
+              <w:t>The coordinator or PI types the value that is coded for analysis, where the respondent corrected, qualified, did not know or declined. Not needed for a plain confirmation.</w:t>
+            </w:r>
+          </w:p>
+        </w:tc>
+        <w:tc>
+          <w:tcPr>
+            <w:tcW w:w="2447" w:type="dxa"/>
+            <w:tcMar>
+              <w:top w:w="70" w:type="dxa"/>
+              <w:left w:w="110" w:type="dxa"/>
+              <w:bottom w:w="70" w:type="dxa"/>
+              <w:right w:w="110" w:type="dxa"/>
+            </w:tcMar>
+          </w:tcPr>
+          <w:p>
+            <w:pPr>
+              <w:spacing w:after="40"/>
+            </w:pPr>
+            <w:r>
+              <w:rPr>
+                <w:sz w:val="19"/>
+                <w:szCs w:val="19"/>
+              </w:rPr>
+              <w:t>The reconciled value is the researcher's coded position; it never overwrites the public value or the respondent's answer.</w:t>
+            </w:r>
+          </w:p>
+        </w:tc>
+        <w:tc>
+          <w:tcPr>
+            <w:tcW w:w="2071" w:type="dxa"/>
+            <w:tcMar>
+              <w:top w:w="70" w:type="dxa"/>
+              <w:left w:w="110" w:type="dxa"/>
+              <w:bottom w:w="70" w:type="dxa"/>
+              <w:right w:w="110" w:type="dxa"/>
+            </w:tcMar>
+          </w:tcPr>
+          <w:p>
+            <w:pPr>
+              <w:spacing w:after="40"/>
+            </w:pPr>
+            <w:r>
+              <w:rPr>
+                <w:sz w:val="19"/>
+                <w:szCs w:val="19"/>
+              </w:rPr>
+              <w:t>The fact becomes settled. When all are, the status reads Reconciled.</w:t>
+            </w:r>
+          </w:p>
+        </w:tc>
+      </w:tr>
+      <w:tr>
+        <w:tblPrEx>
+          <w:tblCellMar>
+            <w:top w:w="0" w:type="dxa"/>
+            <w:bottom w:w="0" w:type="dxa"/>
+          </w:tblCellMar>
+        </w:tblPrEx>
+        <w:trPr>
+          <w:cantSplit/>
+        </w:trPr>
+        <w:tc>
+          <w:tcPr>
+            <w:tcW w:w="1882" w:type="dxa"/>
+            <w:shd w:val="clear" w:color="auto" w:fill="F8FAFB"/>
+            <w:tcMar>
+              <w:top w:w="70" w:type="dxa"/>
+              <w:left w:w="110" w:type="dxa"/>
+              <w:bottom w:w="70" w:type="dxa"/>
+              <w:right w:w="110" w:type="dxa"/>
+            </w:tcMar>
+          </w:tcPr>
+          <w:p>
+            <w:pPr>
+              <w:spacing w:after="40"/>
+            </w:pPr>
+            <w:r>
+              <w:rPr>
+                <w:sz w:val="19"/>
+                <w:szCs w:val="19"/>
+              </w:rPr>
+              <w:t>Record a protocol deviation</w:t>
+            </w:r>
+            <w:r>
+              <w:rPr>
+                <w:sz w:val="19"/>
+                <w:szCs w:val="19"/>
+              </w:rPr>
+              <w:t xml:space="preserve"> (the PI, the Field Coordinator only)</w:t>
+            </w:r>
+          </w:p>
+        </w:tc>
+        <w:tc>
+          <w:tcPr>
+            <w:tcW w:w="3012" w:type="dxa"/>
+            <w:shd w:val="clear" w:color="auto" w:fill="F8FAFB"/>
+            <w:tcMar>
+              <w:top w:w="70" w:type="dxa"/>
+              <w:left w:w="110" w:type="dxa"/>
+              <w:bottom w:w="70" w:type="dxa"/>
+              <w:right w:w="110" w:type="dxa"/>
+            </w:tcMar>
+          </w:tcPr>
+          <w:p>
+            <w:pPr>
+              <w:spacing w:after="40"/>
+            </w:pPr>
+            <w:r>
+              <w:rPr>
+                <w:sz w:val="19"/>
+                <w:szCs w:val="19"/>
+              </w:rPr>
+              <w:t>Releases the case when reconciliation truly cannot be finished, after you give the reason.</w:t>
+            </w:r>
+          </w:p>
+        </w:tc>
+        <w:tc>
+          <w:tcPr>
+            <w:tcW w:w="2447" w:type="dxa"/>
+            <w:shd w:val="clear" w:color="auto" w:fill="F8FAFB"/>
+            <w:tcMar>
+              <w:top w:w="70" w:type="dxa"/>
+              <w:left w:w="110" w:type="dxa"/>
+              <w:bottom w:w="70" w:type="dxa"/>
+              <w:right w:w="110" w:type="dxa"/>
+            </w:tcMar>
+          </w:tcPr>
+          <w:p>
+            <w:pPr>
+              <w:spacing w:after="40"/>
+            </w:pPr>
+            <w:r>
+              <w:rPr>
+                <w:sz w:val="19"/>
+                <w:szCs w:val="19"/>
+              </w:rPr>
+              <w:t>A lost respondent must not block a completed interview forever, but the exception has to be visible and explained.</w:t>
+            </w:r>
+          </w:p>
+        </w:tc>
+        <w:tc>
+          <w:tcPr>
+            <w:tcW w:w="2071" w:type="dxa"/>
+            <w:shd w:val="clear" w:color="auto" w:fill="F8FAFB"/>
+            <w:tcMar>
+              <w:top w:w="70" w:type="dxa"/>
+              <w:left w:w="110" w:type="dxa"/>
+              <w:bottom w:w="70" w:type="dxa"/>
+              <w:right w:w="110" w:type="dxa"/>
+            </w:tcMar>
+          </w:tcPr>
+          <w:p>
+            <w:pPr>
+              <w:spacing w:after="40"/>
+            </w:pPr>
+            <w:r>
+              <w:rPr>
+                <w:sz w:val="19"/>
+                <w:szCs w:val="19"/>
+              </w:rPr>
+              <w:t>The case is released and stays flagged, with the reason kept.</w:t>
+            </w:r>
+          </w:p>
+        </w:tc>
+      </w:tr>
+    </w:tbl>
+    <w:p>
+      <w:pPr>
+        <w:spacing w:after="120"/>
+      </w:pPr>
+    </w:p>
+    <w:p>
+      <w:pPr>
+        <w:pStyle w:val="Heading2"/>
+      </w:pPr>
+      <w:bookmarkStart w:id="19" w:name="_Toc240919846"/>
+      <w:r>
+        <w:t>6.5 Register Organisation</w:t>
+      </w:r>
+      <w:bookmarkEnd w:id="19"/>
     </w:p>
     <w:p>
       <w:pPr>
@@ -17618,7 +19772,7 @@
           <w:left w:w="10" w:type="dxa"/>
           <w:right w:w="10" w:type="dxa"/>
         </w:tblCellMar>
-        <w:tblLook w:val="0000" w:firstRow="0" w:lastRow="0" w:firstColumn="0" w:lastColumn="0" w:noHBand="0" w:noVBand="0"/>
+        <w:tblLook w:val="04A0" w:firstRow="1" w:lastRow="0" w:firstColumn="1" w:lastColumn="0" w:noHBand="0" w:noVBand="1"/>
       </w:tblPr>
       <w:tblGrid>
         <w:gridCol w:w="1882"/>
@@ -18278,11 +20432,11 @@
       <w:pPr>
         <w:pStyle w:val="Heading2"/>
       </w:pPr>
-      <w:bookmarkStart w:id="19" w:name="_Toc240916556"/>
+      <w:bookmarkStart w:id="20" w:name="_Toc240919847"/>
       <w:r>
-        <w:t>6.5 Appointment Queue</w:t>
+        <w:t>6.6 Appointment Queue</w:t>
       </w:r>
-      <w:bookmarkEnd w:id="19"/>
+      <w:bookmarkEnd w:id="20"/>
     </w:p>
     <w:p>
       <w:pPr>
@@ -18323,7 +20477,6 @@
         <w:spacing w:after="120" w:line="288" w:lineRule="auto"/>
       </w:pPr>
       <w:r>
-        <w:lastRenderedPageBreak/>
         <w:t>Calls that respondents have asked for, and their progress.</w:t>
       </w:r>
     </w:p>
@@ -18342,7 +20495,7 @@
           <w:left w:w="10" w:type="dxa"/>
           <w:right w:w="10" w:type="dxa"/>
         </w:tblCellMar>
-        <w:tblLook w:val="0000" w:firstRow="0" w:lastRow="0" w:firstColumn="0" w:lastColumn="0" w:noHBand="0" w:noVBand="0"/>
+        <w:tblLook w:val="04A0" w:firstRow="1" w:lastRow="0" w:firstColumn="1" w:lastColumn="0" w:noHBand="0" w:noVBand="1"/>
       </w:tblPr>
       <w:tblGrid>
         <w:gridCol w:w="1882"/>
@@ -18383,6 +20536,7 @@
                 <w:sz w:val="19"/>
                 <w:szCs w:val="19"/>
               </w:rPr>
+              <w:lastRenderedPageBreak/>
               <w:t>Control</w:t>
             </w:r>
           </w:p>
@@ -18899,11 +21053,11 @@
       <w:pPr>
         <w:pStyle w:val="Heading2"/>
       </w:pPr>
-      <w:bookmarkStart w:id="20" w:name="_Toc240916557"/>
+      <w:bookmarkStart w:id="21" w:name="_Toc240919848"/>
       <w:r>
-        <w:t>6.6 Follow-ups due</w:t>
+        <w:t>6.7 Follow-ups due</w:t>
       </w:r>
-      <w:bookmarkEnd w:id="20"/>
+      <w:bookmarkEnd w:id="21"/>
     </w:p>
     <w:p>
       <w:pPr>
@@ -18962,7 +21116,7 @@
           <w:left w:w="10" w:type="dxa"/>
           <w:right w:w="10" w:type="dxa"/>
         </w:tblCellMar>
-        <w:tblLook w:val="0000" w:firstRow="0" w:lastRow="0" w:firstColumn="0" w:lastColumn="0" w:noHBand="0" w:noVBand="0"/>
+        <w:tblLook w:val="04A0" w:firstRow="1" w:lastRow="0" w:firstColumn="1" w:lastColumn="0" w:noHBand="0" w:noVBand="1"/>
       </w:tblPr>
       <w:tblGrid>
         <w:gridCol w:w="1882"/>
@@ -19412,11 +21566,11 @@
       <w:pPr>
         <w:pStyle w:val="Heading2"/>
       </w:pPr>
-      <w:bookmarkStart w:id="21" w:name="_Toc240916558"/>
+      <w:bookmarkStart w:id="22" w:name="_Toc240919849"/>
       <w:r>
-        <w:t>6.7 Reserve Activation</w:t>
+        <w:t>6.8 Reserve Activation</w:t>
       </w:r>
-      <w:bookmarkEnd w:id="21"/>
+      <w:bookmarkEnd w:id="22"/>
     </w:p>
     <w:p>
       <w:pPr>
@@ -19475,7 +21629,7 @@
           <w:left w:w="10" w:type="dxa"/>
           <w:right w:w="10" w:type="dxa"/>
         </w:tblCellMar>
-        <w:tblLook w:val="0000" w:firstRow="0" w:lastRow="0" w:firstColumn="0" w:lastColumn="0" w:noHBand="0" w:noVBand="0"/>
+        <w:tblLook w:val="04A0" w:firstRow="1" w:lastRow="0" w:firstColumn="1" w:lastColumn="0" w:noHBand="0" w:noVBand="1"/>
       </w:tblPr>
       <w:tblGrid>
         <w:gridCol w:w="1882"/>
@@ -20034,22 +22188,22 @@
         <w:pStyle w:val="Heading1"/>
         <w:pageBreakBefore/>
       </w:pPr>
-      <w:bookmarkStart w:id="22" w:name="_Toc240916559"/>
+      <w:bookmarkStart w:id="23" w:name="_Toc240919850"/>
       <w:r>
         <w:lastRenderedPageBreak/>
         <w:t>7. Quality checking</w:t>
       </w:r>
-      <w:bookmarkEnd w:id="22"/>
+      <w:bookmarkEnd w:id="23"/>
     </w:p>
     <w:p>
       <w:pPr>
         <w:pStyle w:val="Heading2"/>
       </w:pPr>
-      <w:bookmarkStart w:id="23" w:name="_Toc240916560"/>
+      <w:bookmarkStart w:id="24" w:name="_Toc240919851"/>
       <w:r>
         <w:t>7.1 QA Queue (with the KoboToolbox sync panel)</w:t>
       </w:r>
-      <w:bookmarkEnd w:id="23"/>
+      <w:bookmarkEnd w:id="24"/>
     </w:p>
     <w:p>
       <w:pPr>
@@ -20108,7 +22262,7 @@
           <w:left w:w="10" w:type="dxa"/>
           <w:right w:w="10" w:type="dxa"/>
         </w:tblCellMar>
-        <w:tblLook w:val="0000" w:firstRow="0" w:lastRow="0" w:firstColumn="0" w:lastColumn="0" w:noHBand="0" w:noVBand="0"/>
+        <w:tblLook w:val="04A0" w:firstRow="1" w:lastRow="0" w:firstColumn="1" w:lastColumn="0" w:noHBand="0" w:noVBand="1"/>
       </w:tblPr>
       <w:tblGrid>
         <w:gridCol w:w="1882"/>
@@ -20520,7 +22674,7 @@
                 <w:sz w:val="19"/>
                 <w:szCs w:val="19"/>
               </w:rPr>
-              <w:t>Only a person can pass a questionnaire; even one that triggered no rule is not passed until someone accepts it.</w:t>
+              <w:t>Only a person can pass a questionnaire; even one that triggered no rule is not passed until someone accepts it. If the case has a locked pre-interview profile, every fact on it must first be verified with the respondent and reconciled (or a deviation recorded).</w:t>
             </w:r>
           </w:p>
         </w:tc>
@@ -20543,7 +22697,7 @@
                 <w:sz w:val="19"/>
                 <w:szCs w:val="19"/>
               </w:rPr>
-              <w:t>The submission is marked QA passed, the case moves on, and the decision is audited.</w:t>
+              <w:t>The submission is marked QA passed, the case moves on, and the decision is audited. If the profile is not reconciled you are told how many facts are outstanding, and nothing changes.</w:t>
             </w:r>
           </w:p>
         </w:tc>
@@ -20768,11 +22922,11 @@
       <w:pPr>
         <w:pStyle w:val="Heading2"/>
       </w:pPr>
-      <w:bookmarkStart w:id="24" w:name="_Toc240916561"/>
+      <w:bookmarkStart w:id="25" w:name="_Toc240919852"/>
       <w:r>
         <w:t>7.2 QA Exceptions</w:t>
       </w:r>
-      <w:bookmarkEnd w:id="24"/>
+      <w:bookmarkEnd w:id="25"/>
     </w:p>
     <w:p>
       <w:pPr>
@@ -20831,7 +22985,7 @@
           <w:left w:w="10" w:type="dxa"/>
           <w:right w:w="10" w:type="dxa"/>
         </w:tblCellMar>
-        <w:tblLook w:val="0000" w:firstRow="0" w:lastRow="0" w:firstColumn="0" w:lastColumn="0" w:noHBand="0" w:noVBand="0"/>
+        <w:tblLook w:val="04A0" w:firstRow="1" w:lastRow="0" w:firstColumn="1" w:lastColumn="0" w:noHBand="0" w:noVBand="1"/>
       </w:tblPr>
       <w:tblGrid>
         <w:gridCol w:w="1882"/>
@@ -20872,6 +23026,7 @@
                 <w:sz w:val="19"/>
                 <w:szCs w:val="19"/>
               </w:rPr>
+              <w:lastRenderedPageBreak/>
               <w:t>Control</w:t>
             </w:r>
           </w:p>
@@ -21091,7 +23246,6 @@
                 <w:sz w:val="19"/>
                 <w:szCs w:val="19"/>
               </w:rPr>
-              <w:lastRenderedPageBreak/>
               <w:t>Include resolved</w:t>
             </w:r>
           </w:p>
@@ -21600,22 +23754,22 @@
         <w:pStyle w:val="Heading1"/>
         <w:pageBreakBefore/>
       </w:pPr>
-      <w:bookmarkStart w:id="25" w:name="_Toc240916562"/>
+      <w:bookmarkStart w:id="26" w:name="_Toc240919853"/>
       <w:r>
         <w:lastRenderedPageBreak/>
         <w:t>8. Key Informant Interviews</w:t>
       </w:r>
-      <w:bookmarkEnd w:id="25"/>
+      <w:bookmarkEnd w:id="26"/>
     </w:p>
     <w:p>
       <w:pPr>
         <w:pStyle w:val="Heading2"/>
       </w:pPr>
-      <w:bookmarkStart w:id="26" w:name="_Toc240916563"/>
+      <w:bookmarkStart w:id="27" w:name="_Toc240919854"/>
       <w:r>
         <w:t>8.1 KII Register</w:t>
       </w:r>
-      <w:bookmarkEnd w:id="26"/>
+      <w:bookmarkEnd w:id="27"/>
     </w:p>
     <w:p>
       <w:pPr>
@@ -21674,7 +23828,7 @@
           <w:left w:w="10" w:type="dxa"/>
           <w:right w:w="10" w:type="dxa"/>
         </w:tblCellMar>
-        <w:tblLook w:val="0000" w:firstRow="0" w:lastRow="0" w:firstColumn="0" w:lastColumn="0" w:noHBand="0" w:noVBand="0"/>
+        <w:tblLook w:val="04A0" w:firstRow="1" w:lastRow="0" w:firstColumn="1" w:lastColumn="0" w:noHBand="0" w:noVBand="1"/>
       </w:tblPr>
       <w:tblGrid>
         <w:gridCol w:w="1882"/>
@@ -22231,11 +24385,11 @@
       <w:pPr>
         <w:pStyle w:val="Heading2"/>
       </w:pPr>
-      <w:bookmarkStart w:id="27" w:name="_Toc240916564"/>
+      <w:bookmarkStart w:id="28" w:name="_Toc240919855"/>
       <w:r>
         <w:t>8.2 New KII Record</w:t>
       </w:r>
-      <w:bookmarkEnd w:id="27"/>
+      <w:bookmarkEnd w:id="28"/>
     </w:p>
     <w:p>
       <w:pPr>
@@ -22294,7 +24448,7 @@
           <w:left w:w="10" w:type="dxa"/>
           <w:right w:w="10" w:type="dxa"/>
         </w:tblCellMar>
-        <w:tblLook w:val="0000" w:firstRow="0" w:lastRow="0" w:firstColumn="0" w:lastColumn="0" w:noHBand="0" w:noVBand="0"/>
+        <w:tblLook w:val="04A0" w:firstRow="1" w:lastRow="0" w:firstColumn="1" w:lastColumn="0" w:noHBand="0" w:noVBand="1"/>
       </w:tblPr>
       <w:tblGrid>
         <w:gridCol w:w="1882"/>
@@ -22641,11 +24795,11 @@
       <w:pPr>
         <w:pStyle w:val="Heading2"/>
       </w:pPr>
-      <w:bookmarkStart w:id="28" w:name="_Toc240916565"/>
+      <w:bookmarkStart w:id="29" w:name="_Toc240919856"/>
       <w:r>
         <w:t>8.3 KII record</w:t>
       </w:r>
-      <w:bookmarkEnd w:id="28"/>
+      <w:bookmarkEnd w:id="29"/>
     </w:p>
     <w:p>
       <w:pPr>
@@ -22704,7 +24858,7 @@
           <w:left w:w="10" w:type="dxa"/>
           <w:right w:w="10" w:type="dxa"/>
         </w:tblCellMar>
-        <w:tblLook w:val="0000" w:firstRow="0" w:lastRow="0" w:firstColumn="0" w:lastColumn="0" w:noHBand="0" w:noVBand="0"/>
+        <w:tblLook w:val="04A0" w:firstRow="1" w:lastRow="0" w:firstColumn="1" w:lastColumn="0" w:noHBand="0" w:noVBand="1"/>
       </w:tblPr>
       <w:tblGrid>
         <w:gridCol w:w="1882"/>
@@ -23537,7 +25691,7 @@
                 <w:sz w:val="19"/>
                 <w:szCs w:val="19"/>
               </w:rPr>
-              <w:t>Shows what has and has not been analysed.</w:t>
+              <w:t>Shows what has and has not been analysed. If the interview had a locked pre-interview profile, COMPLETE is refused until it is reconciled; a synced KII Guide then completes it at the next sync.</w:t>
             </w:r>
           </w:p>
         </w:tc>
@@ -23560,7 +25714,7 @@
                 <w:sz w:val="19"/>
                 <w:szCs w:val="19"/>
               </w:rPr>
-              <w:t>The status changes and cannot go backwards.</w:t>
+              <w:t>The status changes and cannot go backwards. If the profile is not reconciled you are told what is outstanding.</w:t>
             </w:r>
           </w:p>
         </w:tc>
@@ -23683,22 +25837,22 @@
         <w:pStyle w:val="Heading1"/>
         <w:pageBreakBefore/>
       </w:pPr>
-      <w:bookmarkStart w:id="29" w:name="_Toc240916566"/>
+      <w:bookmarkStart w:id="30" w:name="_Toc240919857"/>
       <w:r>
         <w:lastRenderedPageBreak/>
         <w:t>9. Documentary evidence</w:t>
       </w:r>
-      <w:bookmarkEnd w:id="29"/>
+      <w:bookmarkEnd w:id="30"/>
     </w:p>
     <w:p>
       <w:pPr>
         <w:pStyle w:val="Heading2"/>
       </w:pPr>
-      <w:bookmarkStart w:id="30" w:name="_Toc240916567"/>
+      <w:bookmarkStart w:id="31" w:name="_Toc240919858"/>
       <w:r>
         <w:t>9.1 Documents (the corpus)</w:t>
       </w:r>
-      <w:bookmarkEnd w:id="30"/>
+      <w:bookmarkEnd w:id="31"/>
     </w:p>
     <w:p>
       <w:pPr>
@@ -23757,7 +25911,7 @@
           <w:left w:w="10" w:type="dxa"/>
           <w:right w:w="10" w:type="dxa"/>
         </w:tblCellMar>
-        <w:tblLook w:val="0000" w:firstRow="0" w:lastRow="0" w:firstColumn="0" w:lastColumn="0" w:noHBand="0" w:noVBand="0"/>
+        <w:tblLook w:val="04A0" w:firstRow="1" w:lastRow="0" w:firstColumn="1" w:lastColumn="0" w:noHBand="0" w:noVBand="1"/>
       </w:tblPr>
       <w:tblGrid>
         <w:gridCol w:w="1882"/>
@@ -24314,11 +26468,11 @@
       <w:pPr>
         <w:pStyle w:val="Heading2"/>
       </w:pPr>
-      <w:bookmarkStart w:id="31" w:name="_Toc240916568"/>
+      <w:bookmarkStart w:id="32" w:name="_Toc240919859"/>
       <w:r>
         <w:t>9.2 New Documentary Evidence Record</w:t>
       </w:r>
-      <w:bookmarkEnd w:id="31"/>
+      <w:bookmarkEnd w:id="32"/>
     </w:p>
     <w:p>
       <w:pPr>
@@ -24377,7 +26531,7 @@
           <w:left w:w="10" w:type="dxa"/>
           <w:right w:w="10" w:type="dxa"/>
         </w:tblCellMar>
-        <w:tblLook w:val="0000" w:firstRow="0" w:lastRow="0" w:firstColumn="0" w:lastColumn="0" w:noHBand="0" w:noVBand="0"/>
+        <w:tblLook w:val="04A0" w:firstRow="1" w:lastRow="0" w:firstColumn="1" w:lastColumn="0" w:noHBand="0" w:noVBand="1"/>
       </w:tblPr>
       <w:tblGrid>
         <w:gridCol w:w="1882"/>
@@ -25145,11 +27299,11 @@
       <w:pPr>
         <w:pStyle w:val="Heading2"/>
       </w:pPr>
-      <w:bookmarkStart w:id="32" w:name="_Toc240916569"/>
+      <w:bookmarkStart w:id="33" w:name="_Toc240919860"/>
       <w:r>
         <w:t>9.3 Document record</w:t>
       </w:r>
-      <w:bookmarkEnd w:id="32"/>
+      <w:bookmarkEnd w:id="33"/>
     </w:p>
     <w:p>
       <w:pPr>
@@ -25208,7 +27362,7 @@
           <w:left w:w="10" w:type="dxa"/>
           <w:right w:w="10" w:type="dxa"/>
         </w:tblCellMar>
-        <w:tblLook w:val="0000" w:firstRow="0" w:lastRow="0" w:firstColumn="0" w:lastColumn="0" w:noHBand="0" w:noVBand="0"/>
+        <w:tblLook w:val="04A0" w:firstRow="1" w:lastRow="0" w:firstColumn="1" w:lastColumn="0" w:noHBand="0" w:noVBand="1"/>
       </w:tblPr>
       <w:tblGrid>
         <w:gridCol w:w="1882"/>
@@ -26499,11 +28653,11 @@
       <w:pPr>
         <w:pStyle w:val="Heading2"/>
       </w:pPr>
-      <w:bookmarkStart w:id="33" w:name="_Toc240916570"/>
+      <w:bookmarkStart w:id="34" w:name="_Toc240919861"/>
       <w:r>
         <w:t>9.4 Auto-fill review screen</w:t>
       </w:r>
-      <w:bookmarkEnd w:id="33"/>
+      <w:bookmarkEnd w:id="34"/>
     </w:p>
     <w:p>
       <w:pPr>
@@ -26562,7 +28716,7 @@
           <w:left w:w="10" w:type="dxa"/>
           <w:right w:w="10" w:type="dxa"/>
         </w:tblCellMar>
-        <w:tblLook w:val="0000" w:firstRow="0" w:lastRow="0" w:firstColumn="0" w:lastColumn="0" w:noHBand="0" w:noVBand="0"/>
+        <w:tblLook w:val="04A0" w:firstRow="1" w:lastRow="0" w:firstColumn="1" w:lastColumn="0" w:noHBand="0" w:noVBand="1"/>
       </w:tblPr>
       <w:tblGrid>
         <w:gridCol w:w="1882"/>
@@ -27541,22 +29695,22 @@
         <w:pStyle w:val="Heading1"/>
         <w:pageBreakBefore/>
       </w:pPr>
-      <w:bookmarkStart w:id="34" w:name="_Toc240916571"/>
+      <w:bookmarkStart w:id="35" w:name="_Toc240919862"/>
       <w:r>
         <w:lastRenderedPageBreak/>
         <w:t>10. Completed forms and exports</w:t>
       </w:r>
-      <w:bookmarkEnd w:id="34"/>
+      <w:bookmarkEnd w:id="35"/>
     </w:p>
     <w:p>
       <w:pPr>
         <w:pStyle w:val="Heading2"/>
       </w:pPr>
-      <w:bookmarkStart w:id="35" w:name="_Toc240916572"/>
+      <w:bookmarkStart w:id="36" w:name="_Toc240919863"/>
       <w:r>
         <w:t>10.1 Completed forms (Form PDFs)</w:t>
       </w:r>
-      <w:bookmarkEnd w:id="35"/>
+      <w:bookmarkEnd w:id="36"/>
     </w:p>
     <w:p>
       <w:pPr>
@@ -27615,7 +29769,7 @@
           <w:left w:w="10" w:type="dxa"/>
           <w:right w:w="10" w:type="dxa"/>
         </w:tblCellMar>
-        <w:tblLook w:val="0000" w:firstRow="0" w:lastRow="0" w:firstColumn="0" w:lastColumn="0" w:noHBand="0" w:noVBand="0"/>
+        <w:tblLook w:val="04A0" w:firstRow="1" w:lastRow="0" w:firstColumn="1" w:lastColumn="0" w:noHBand="0" w:noVBand="1"/>
       </w:tblPr>
       <w:tblGrid>
         <w:gridCol w:w="1882"/>
@@ -28818,22 +30972,22 @@
         <w:pStyle w:val="Heading1"/>
         <w:pageBreakBefore/>
       </w:pPr>
-      <w:bookmarkStart w:id="36" w:name="_Toc240916573"/>
+      <w:bookmarkStart w:id="37" w:name="_Toc240919864"/>
       <w:r>
         <w:lastRenderedPageBreak/>
         <w:t>11. Study administration</w:t>
       </w:r>
-      <w:bookmarkEnd w:id="36"/>
+      <w:bookmarkEnd w:id="37"/>
     </w:p>
     <w:p>
       <w:pPr>
         <w:pStyle w:val="Heading2"/>
       </w:pPr>
-      <w:bookmarkStart w:id="37" w:name="_Toc240916574"/>
+      <w:bookmarkStart w:id="38" w:name="_Toc240919865"/>
       <w:r>
         <w:t>11.1 Cost Dashboard</w:t>
       </w:r>
-      <w:bookmarkEnd w:id="37"/>
+      <w:bookmarkEnd w:id="38"/>
     </w:p>
     <w:p>
       <w:pPr>
@@ -28892,7 +31046,7 @@
           <w:left w:w="10" w:type="dxa"/>
           <w:right w:w="10" w:type="dxa"/>
         </w:tblCellMar>
-        <w:tblLook w:val="0000" w:firstRow="0" w:lastRow="0" w:firstColumn="0" w:lastColumn="0" w:noHBand="0" w:noVBand="0"/>
+        <w:tblLook w:val="04A0" w:firstRow="1" w:lastRow="0" w:firstColumn="1" w:lastColumn="0" w:noHBand="0" w:noVBand="1"/>
       </w:tblPr>
       <w:tblGrid>
         <w:gridCol w:w="1882"/>
@@ -29239,11 +31393,11 @@
       <w:pPr>
         <w:pStyle w:val="Heading2"/>
       </w:pPr>
-      <w:bookmarkStart w:id="38" w:name="_Toc240916575"/>
+      <w:bookmarkStart w:id="39" w:name="_Toc240919866"/>
       <w:r>
         <w:t>11.2 Audit Log</w:t>
       </w:r>
-      <w:bookmarkEnd w:id="38"/>
+      <w:bookmarkEnd w:id="39"/>
     </w:p>
     <w:p>
       <w:pPr>
@@ -29302,7 +31456,7 @@
           <w:left w:w="10" w:type="dxa"/>
           <w:right w:w="10" w:type="dxa"/>
         </w:tblCellMar>
-        <w:tblLook w:val="0000" w:firstRow="0" w:lastRow="0" w:firstColumn="0" w:lastColumn="0" w:noHBand="0" w:noVBand="0"/>
+        <w:tblLook w:val="04A0" w:firstRow="1" w:lastRow="0" w:firstColumn="1" w:lastColumn="0" w:noHBand="0" w:noVBand="1"/>
       </w:tblPr>
       <w:tblGrid>
         <w:gridCol w:w="1882"/>
@@ -29649,11 +31803,11 @@
       <w:pPr>
         <w:pStyle w:val="Heading2"/>
       </w:pPr>
-      <w:bookmarkStart w:id="39" w:name="_Toc240916576"/>
+      <w:bookmarkStart w:id="40" w:name="_Toc240919867"/>
       <w:r>
         <w:t>11.3 Export</w:t>
       </w:r>
-      <w:bookmarkEnd w:id="39"/>
+      <w:bookmarkEnd w:id="40"/>
     </w:p>
     <w:p>
       <w:pPr>
@@ -29712,7 +31866,7 @@
           <w:left w:w="10" w:type="dxa"/>
           <w:right w:w="10" w:type="dxa"/>
         </w:tblCellMar>
-        <w:tblLook w:val="0000" w:firstRow="0" w:lastRow="0" w:firstColumn="0" w:lastColumn="0" w:noHBand="0" w:noVBand="0"/>
+        <w:tblLook w:val="04A0" w:firstRow="1" w:lastRow="0" w:firstColumn="1" w:lastColumn="0" w:noHBand="0" w:noVBand="1"/>
       </w:tblPr>
       <w:tblGrid>
         <w:gridCol w:w="1882"/>
@@ -30207,7 +32361,7 @@
         <w:sz w:val="16"/>
         <w:szCs w:val="16"/>
       </w:rPr>
-      <w:t>Version 1.7 · 21 September 2026</w:t>
+      <w:t>Version 1.8 · 21 September 2026</w:t>
     </w:r>
     <w:r>
       <w:rPr>
@@ -30380,10 +32534,10 @@
 <file path=word/numbering.xml><?xml version="1.0" encoding="utf-8"?>
 <w:numbering xmlns:wpc="http://schemas.microsoft.com/office/word/2010/wordprocessingCanvas" xmlns:cx="http://schemas.microsoft.com/office/drawing/2014/chartex" xmlns:cx1="http://schemas.microsoft.com/office/drawing/2015/9/8/chartex" xmlns:cx2="http://schemas.microsoft.com/office/drawing/2015/10/21/chartex" xmlns:cx3="http://schemas.microsoft.com/office/drawing/2016/5/9/chartex" xmlns:cx4="http://schemas.microsoft.com/office/drawing/2016/5/10/chartex" xmlns:cx5="http://schemas.microsoft.com/office/drawing/2016/5/11/chartex" xmlns:cx6="http://schemas.microsoft.com/office/drawing/2016/5/12/chartex" xmlns:cx7="http://schemas.microsoft.com/office/drawing/2016/5/13/chartex" xmlns:cx8="http://schemas.microsoft.com/office/drawing/2016/5/14/chartex" xmlns:mc="http://schemas.openxmlformats.org/markup-compatibility/2006" xmlns:aink="http://schemas.microsoft.com/office/drawing/2016/ink" xmlns:am3d="http://schemas.microsoft.com/office/drawing/2017/model3d" xmlns:o="urn:schemas-microsoft-com:office:office" xmlns:oel="http://schemas.microsoft.com/office/2019/extlst" xmlns:r="http://schemas.openxmlformats.org/officeDocument/2006/relationships" xmlns:m="http://schemas.openxmlformats.org/officeDocument/2006/math" xmlns:v="urn:schemas-microsoft-com:vml" xmlns:wp14="http://schemas.microsoft.com/office/word/2010/wordprocessingDrawing" xmlns:wp="http://schemas.openxmlformats.org/drawingml/2006/wordprocessingDrawing" xmlns:w10="urn:schemas-microsoft-com:office:word" xmlns:w="http://schemas.openxmlformats.org/wordprocessingml/2006/main" xmlns:w14="http://schemas.microsoft.com/office/word/2010/wordml" xmlns:w15="http://schemas.microsoft.com/office/word/2012/wordml" xmlns:w16cex="http://schemas.microsoft.com/office/word/2018/wordml/cex" xmlns:w16cid="http://schemas.microsoft.com/office/word/2016/wordml/cid" xmlns:w16="http://schemas.microsoft.com/office/word/2018/wordml" xmlns:w16sdtdh="http://schemas.microsoft.com/office/word/2020/wordml/sdtdatahash" xmlns:w16se="http://schemas.microsoft.com/office/word/2015/wordml/symex" xmlns:wpg="http://schemas.microsoft.com/office/word/2010/wordprocessingGroup" xmlns:wpi="http://schemas.microsoft.com/office/word/2010/wordprocessingInk" xmlns:wne="http://schemas.microsoft.com/office/word/2006/wordml" xmlns:wps="http://schemas.microsoft.com/office/word/2010/wordprocessingShape" mc:Ignorable="w14 w15 w16se w16cid w16 w16cex w16sdtdh wp14">
   <w:abstractNum w:abstractNumId="0" w15:restartNumberingAfterBreak="0">
-    <w:nsid w:val="10F9644F"/>
+    <w:nsid w:val="140C3E32"/>
     <w:multiLevelType w:val="hybridMultilevel"/>
-    <w:tmpl w:val="02523D40"/>
-    <w:lvl w:ilvl="0" w:tplc="4C9E9BD2">
+    <w:tmpl w:val="8CFE54EE"/>
+    <w:lvl w:ilvl="0" w:tplc="BA38AAA8">
       <w:start w:val="1"/>
       <w:numFmt w:val="bullet"/>
       <w:lvlText w:val="●"/>
@@ -30392,7 +32546,7 @@
         <w:ind w:left="720" w:hanging="360"/>
       </w:pPr>
     </w:lvl>
-    <w:lvl w:ilvl="1" w:tplc="76A061DA">
+    <w:lvl w:ilvl="1" w:tplc="6EDA2D9C">
       <w:start w:val="1"/>
       <w:numFmt w:val="bullet"/>
       <w:lvlText w:val="○"/>
@@ -30401,7 +32555,7 @@
         <w:ind w:left="1440" w:hanging="360"/>
       </w:pPr>
     </w:lvl>
-    <w:lvl w:ilvl="2" w:tplc="486852C0">
+    <w:lvl w:ilvl="2" w:tplc="371210BA">
       <w:start w:val="1"/>
       <w:numFmt w:val="bullet"/>
       <w:lvlText w:val="■"/>
@@ -30410,7 +32564,7 @@
         <w:ind w:left="2160" w:hanging="360"/>
       </w:pPr>
     </w:lvl>
-    <w:lvl w:ilvl="3" w:tplc="1B501980">
+    <w:lvl w:ilvl="3" w:tplc="18B67702">
       <w:start w:val="1"/>
       <w:numFmt w:val="bullet"/>
       <w:lvlText w:val="●"/>
@@ -30419,7 +32573,7 @@
         <w:ind w:left="2880" w:hanging="360"/>
       </w:pPr>
     </w:lvl>
-    <w:lvl w:ilvl="4" w:tplc="C09004A8">
+    <w:lvl w:ilvl="4" w:tplc="2BC20C7A">
       <w:start w:val="1"/>
       <w:numFmt w:val="bullet"/>
       <w:lvlText w:val="○"/>
@@ -30428,7 +32582,7 @@
         <w:ind w:left="3600" w:hanging="360"/>
       </w:pPr>
     </w:lvl>
-    <w:lvl w:ilvl="5" w:tplc="1BFCDEEA">
+    <w:lvl w:ilvl="5" w:tplc="F1A29716">
       <w:start w:val="1"/>
       <w:numFmt w:val="bullet"/>
       <w:lvlText w:val="■"/>
@@ -30437,7 +32591,7 @@
         <w:ind w:left="4320" w:hanging="360"/>
       </w:pPr>
     </w:lvl>
-    <w:lvl w:ilvl="6" w:tplc="335239A6">
+    <w:lvl w:ilvl="6" w:tplc="BD6EDEA6">
       <w:start w:val="1"/>
       <w:numFmt w:val="bullet"/>
       <w:lvlText w:val="●"/>
@@ -30446,7 +32600,7 @@
         <w:ind w:left="5040" w:hanging="360"/>
       </w:pPr>
     </w:lvl>
-    <w:lvl w:ilvl="7" w:tplc="E46A7386">
+    <w:lvl w:ilvl="7" w:tplc="01CC3772">
       <w:start w:val="1"/>
       <w:numFmt w:val="bullet"/>
       <w:lvlText w:val="●"/>
@@ -30455,7 +32609,7 @@
         <w:ind w:left="5760" w:hanging="360"/>
       </w:pPr>
     </w:lvl>
-    <w:lvl w:ilvl="8" w:tplc="4E860340">
+    <w:lvl w:ilvl="8" w:tplc="9FB2E98C">
       <w:start w:val="1"/>
       <w:numFmt w:val="bullet"/>
       <w:lvlText w:val="●"/>
@@ -30466,10 +32620,10 @@
     </w:lvl>
   </w:abstractNum>
   <w:abstractNum w:abstractNumId="1" w15:restartNumberingAfterBreak="0">
-    <w:nsid w:val="1B67707A"/>
+    <w:nsid w:val="40664855"/>
     <w:multiLevelType w:val="hybridMultilevel"/>
-    <w:tmpl w:val="77429388"/>
-    <w:lvl w:ilvl="0" w:tplc="661C96EE">
+    <w:tmpl w:val="2FAA086E"/>
+    <w:lvl w:ilvl="0" w:tplc="C4D261F0">
       <w:start w:val="1"/>
       <w:numFmt w:val="bullet"/>
       <w:lvlText w:val="•"/>
@@ -30478,7 +32632,7 @@
         <w:ind w:left="460" w:hanging="280"/>
       </w:pPr>
     </w:lvl>
-    <w:lvl w:ilvl="1" w:tplc="9E2ECF28">
+    <w:lvl w:ilvl="1" w:tplc="B6B6EA50">
       <w:start w:val="1"/>
       <w:numFmt w:val="bullet"/>
       <w:lvlText w:val="–"/>
@@ -30487,49 +32641,49 @@
         <w:ind w:left="900" w:hanging="280"/>
       </w:pPr>
     </w:lvl>
-    <w:lvl w:ilvl="2" w:tplc="C358B192">
+    <w:lvl w:ilvl="2" w:tplc="A8381EC6">
       <w:numFmt w:val="decimal"/>
       <w:lvlText w:val=""/>
       <w:lvlJc w:val="left"/>
     </w:lvl>
-    <w:lvl w:ilvl="3" w:tplc="D0281C26">
+    <w:lvl w:ilvl="3" w:tplc="D8061B92">
       <w:numFmt w:val="decimal"/>
       <w:lvlText w:val=""/>
       <w:lvlJc w:val="left"/>
     </w:lvl>
-    <w:lvl w:ilvl="4" w:tplc="46603726">
+    <w:lvl w:ilvl="4" w:tplc="3926BE44">
       <w:numFmt w:val="decimal"/>
       <w:lvlText w:val=""/>
       <w:lvlJc w:val="left"/>
     </w:lvl>
-    <w:lvl w:ilvl="5" w:tplc="2DA80490">
+    <w:lvl w:ilvl="5" w:tplc="D9227412">
       <w:numFmt w:val="decimal"/>
       <w:lvlText w:val=""/>
       <w:lvlJc w:val="left"/>
     </w:lvl>
-    <w:lvl w:ilvl="6" w:tplc="7AA8F2E2">
+    <w:lvl w:ilvl="6" w:tplc="64BAA03A">
       <w:numFmt w:val="decimal"/>
       <w:lvlText w:val=""/>
       <w:lvlJc w:val="left"/>
     </w:lvl>
-    <w:lvl w:ilvl="7" w:tplc="93B4E8C6">
+    <w:lvl w:ilvl="7" w:tplc="6A02490A">
       <w:numFmt w:val="decimal"/>
       <w:lvlText w:val=""/>
       <w:lvlJc w:val="left"/>
     </w:lvl>
-    <w:lvl w:ilvl="8" w:tplc="92CE5E16">
+    <w:lvl w:ilvl="8" w:tplc="752A295A">
       <w:numFmt w:val="decimal"/>
       <w:lvlText w:val=""/>
       <w:lvlJc w:val="left"/>
     </w:lvl>
   </w:abstractNum>
-  <w:num w:numId="1" w16cid:durableId="109395768">
+  <w:num w:numId="1" w16cid:durableId="714735629">
     <w:abstractNumId w:val="0"/>
     <w:lvlOverride w:ilvl="0">
       <w:startOverride w:val="1"/>
     </w:lvlOverride>
   </w:num>
-  <w:num w:numId="2" w16cid:durableId="2092501997">
+  <w:num w:numId="2" w16cid:durableId="2030370856">
     <w:abstractNumId w:val="1"/>
     <w:lvlOverride w:ilvl="0">
       <w:startOverride w:val="1"/>
@@ -31155,7 +33309,7 @@
     <w:autoRedefine/>
     <w:uiPriority w:val="39"/>
     <w:unhideWhenUsed/>
-    <w:rsid w:val="00E3270C"/>
+    <w:rsid w:val="001819E2"/>
     <w:pPr>
       <w:spacing w:after="100"/>
     </w:pPr>
@@ -31167,7 +33321,7 @@
     <w:autoRedefine/>
     <w:uiPriority w:val="39"/>
     <w:unhideWhenUsed/>
-    <w:rsid w:val="00E3270C"/>
+    <w:rsid w:val="001819E2"/>
     <w:pPr>
       <w:spacing w:after="100"/>
       <w:ind w:left="210"/>

</xml_diff>

<commit_message>
feat: PROIT profile saved-to-Kobo marker, plain-words AI credit error, manuals and docs updated
Co-Authored-By: Claude Sonnet 5 <noreply@anthropic.com>
</commit_message>
<xml_diff>
--- a/docs/manuals/ABF-FST_Screen_and_Button_Reference.docx
+++ b/docs/manuals/ABF-FST_Screen_and_Button_Reference.docx
@@ -538,7 +538,7 @@
     <w:sdt>
       <w:sdtPr>
         <w:alias w:val="Contents"/>
-        <w:id w:val="-532354263"/>
+        <w:id w:val="-523236998"/>
       </w:sdtPr>
       <w:sdtEndPr/>
       <w:sdtContent>
@@ -567,7 +567,7 @@
           <w:r>
             <w:fldChar w:fldCharType="separate"/>
           </w:r>
-          <w:hyperlink w:anchor="_Toc240919827" w:history="1">
+          <w:hyperlink w:anchor="_Toc240922974" w:history="1">
             <w:r>
               <w:rPr>
                 <w:rStyle w:val="Hyperlink"/>
@@ -591,7 +591,7 @@
               <w:rPr>
                 <w:noProof/>
               </w:rPr>
-              <w:instrText xml:space="preserve"> PAGEREF _Toc240919827 \h </w:instrText>
+              <w:instrText xml:space="preserve"> PAGEREF _Toc240922974 \h </w:instrText>
             </w:r>
             <w:r>
               <w:rPr>
@@ -634,7 +634,7 @@
               <w14:ligatures w14:val="standardContextual"/>
             </w:rPr>
           </w:pPr>
-          <w:hyperlink w:anchor="_Toc240919828" w:history="1">
+          <w:hyperlink w:anchor="_Toc240922975" w:history="1">
             <w:r>
               <w:rPr>
                 <w:rStyle w:val="Hyperlink"/>
@@ -658,7 +658,7 @@
               <w:rPr>
                 <w:noProof/>
               </w:rPr>
-              <w:instrText xml:space="preserve"> PAGEREF _Toc240919828 \h </w:instrText>
+              <w:instrText xml:space="preserve"> PAGEREF _Toc240922975 \h </w:instrText>
             </w:r>
             <w:r>
               <w:rPr>
@@ -701,7 +701,7 @@
               <w14:ligatures w14:val="standardContextual"/>
             </w:rPr>
           </w:pPr>
-          <w:hyperlink w:anchor="_Toc240919829" w:history="1">
+          <w:hyperlink w:anchor="_Toc240922976" w:history="1">
             <w:r>
               <w:rPr>
                 <w:rStyle w:val="Hyperlink"/>
@@ -725,7 +725,7 @@
               <w:rPr>
                 <w:noProof/>
               </w:rPr>
-              <w:instrText xml:space="preserve"> PAGEREF _Toc240919829 \h </w:instrText>
+              <w:instrText xml:space="preserve"> PAGEREF _Toc240922976 \h </w:instrText>
             </w:r>
             <w:r>
               <w:rPr>
@@ -768,7 +768,7 @@
               <w14:ligatures w14:val="standardContextual"/>
             </w:rPr>
           </w:pPr>
-          <w:hyperlink w:anchor="_Toc240919830" w:history="1">
+          <w:hyperlink w:anchor="_Toc240922977" w:history="1">
             <w:r>
               <w:rPr>
                 <w:rStyle w:val="Hyperlink"/>
@@ -792,7 +792,7 @@
               <w:rPr>
                 <w:noProof/>
               </w:rPr>
-              <w:instrText xml:space="preserve"> PAGEREF _Toc240919830 \h </w:instrText>
+              <w:instrText xml:space="preserve"> PAGEREF _Toc240922977 \h </w:instrText>
             </w:r>
             <w:r>
               <w:rPr>
@@ -835,7 +835,7 @@
               <w14:ligatures w14:val="standardContextual"/>
             </w:rPr>
           </w:pPr>
-          <w:hyperlink w:anchor="_Toc240919831" w:history="1">
+          <w:hyperlink w:anchor="_Toc240922978" w:history="1">
             <w:r>
               <w:rPr>
                 <w:rStyle w:val="Hyperlink"/>
@@ -859,7 +859,7 @@
               <w:rPr>
                 <w:noProof/>
               </w:rPr>
-              <w:instrText xml:space="preserve"> PAGEREF _Toc240919831 \h </w:instrText>
+              <w:instrText xml:space="preserve"> PAGEREF _Toc240922978 \h </w:instrText>
             </w:r>
             <w:r>
               <w:rPr>
@@ -902,7 +902,7 @@
               <w14:ligatures w14:val="standardContextual"/>
             </w:rPr>
           </w:pPr>
-          <w:hyperlink w:anchor="_Toc240919832" w:history="1">
+          <w:hyperlink w:anchor="_Toc240922979" w:history="1">
             <w:r>
               <w:rPr>
                 <w:rStyle w:val="Hyperlink"/>
@@ -926,7 +926,7 @@
               <w:rPr>
                 <w:noProof/>
               </w:rPr>
-              <w:instrText xml:space="preserve"> PAGEREF _Toc240919832 \h </w:instrText>
+              <w:instrText xml:space="preserve"> PAGEREF _Toc240922979 \h </w:instrText>
             </w:r>
             <w:r>
               <w:rPr>
@@ -969,7 +969,7 @@
               <w14:ligatures w14:val="standardContextual"/>
             </w:rPr>
           </w:pPr>
-          <w:hyperlink w:anchor="_Toc240919833" w:history="1">
+          <w:hyperlink w:anchor="_Toc240922980" w:history="1">
             <w:r>
               <w:rPr>
                 <w:rStyle w:val="Hyperlink"/>
@@ -993,7 +993,7 @@
               <w:rPr>
                 <w:noProof/>
               </w:rPr>
-              <w:instrText xml:space="preserve"> PAGEREF _Toc240919833 \h </w:instrText>
+              <w:instrText xml:space="preserve"> PAGEREF _Toc240922980 \h </w:instrText>
             </w:r>
             <w:r>
               <w:rPr>
@@ -1036,7 +1036,7 @@
               <w14:ligatures w14:val="standardContextual"/>
             </w:rPr>
           </w:pPr>
-          <w:hyperlink w:anchor="_Toc240919834" w:history="1">
+          <w:hyperlink w:anchor="_Toc240922981" w:history="1">
             <w:r>
               <w:rPr>
                 <w:rStyle w:val="Hyperlink"/>
@@ -1060,7 +1060,7 @@
               <w:rPr>
                 <w:noProof/>
               </w:rPr>
-              <w:instrText xml:space="preserve"> PAGEREF _Toc240919834 \h </w:instrText>
+              <w:instrText xml:space="preserve"> PAGEREF _Toc240922981 \h </w:instrText>
             </w:r>
             <w:r>
               <w:rPr>
@@ -1103,7 +1103,7 @@
               <w14:ligatures w14:val="standardContextual"/>
             </w:rPr>
           </w:pPr>
-          <w:hyperlink w:anchor="_Toc240919835" w:history="1">
+          <w:hyperlink w:anchor="_Toc240922982" w:history="1">
             <w:r>
               <w:rPr>
                 <w:rStyle w:val="Hyperlink"/>
@@ -1127,7 +1127,7 @@
               <w:rPr>
                 <w:noProof/>
               </w:rPr>
-              <w:instrText xml:space="preserve"> PAGEREF _Toc240919835 \h </w:instrText>
+              <w:instrText xml:space="preserve"> PAGEREF _Toc240922982 \h </w:instrText>
             </w:r>
             <w:r>
               <w:rPr>
@@ -1170,7 +1170,7 @@
               <w14:ligatures w14:val="standardContextual"/>
             </w:rPr>
           </w:pPr>
-          <w:hyperlink w:anchor="_Toc240919836" w:history="1">
+          <w:hyperlink w:anchor="_Toc240922983" w:history="1">
             <w:r>
               <w:rPr>
                 <w:rStyle w:val="Hyperlink"/>
@@ -1194,7 +1194,7 @@
               <w:rPr>
                 <w:noProof/>
               </w:rPr>
-              <w:instrText xml:space="preserve"> PAGEREF _Toc240919836 \h </w:instrText>
+              <w:instrText xml:space="preserve"> PAGEREF _Toc240922983 \h </w:instrText>
             </w:r>
             <w:r>
               <w:rPr>
@@ -1237,7 +1237,7 @@
               <w14:ligatures w14:val="standardContextual"/>
             </w:rPr>
           </w:pPr>
-          <w:hyperlink w:anchor="_Toc240919837" w:history="1">
+          <w:hyperlink w:anchor="_Toc240922984" w:history="1">
             <w:r>
               <w:rPr>
                 <w:rStyle w:val="Hyperlink"/>
@@ -1261,7 +1261,7 @@
               <w:rPr>
                 <w:noProof/>
               </w:rPr>
-              <w:instrText xml:space="preserve"> PAGEREF _Toc240919837 \h </w:instrText>
+              <w:instrText xml:space="preserve"> PAGEREF _Toc240922984 \h </w:instrText>
             </w:r>
             <w:r>
               <w:rPr>
@@ -1304,7 +1304,7 @@
               <w14:ligatures w14:val="standardContextual"/>
             </w:rPr>
           </w:pPr>
-          <w:hyperlink w:anchor="_Toc240919838" w:history="1">
+          <w:hyperlink w:anchor="_Toc240922985" w:history="1">
             <w:r>
               <w:rPr>
                 <w:rStyle w:val="Hyperlink"/>
@@ -1328,7 +1328,7 @@
               <w:rPr>
                 <w:noProof/>
               </w:rPr>
-              <w:instrText xml:space="preserve"> PAGEREF _Toc240919838 \h </w:instrText>
+              <w:instrText xml:space="preserve"> PAGEREF _Toc240922985 \h </w:instrText>
             </w:r>
             <w:r>
               <w:rPr>
@@ -1371,7 +1371,7 @@
               <w14:ligatures w14:val="standardContextual"/>
             </w:rPr>
           </w:pPr>
-          <w:hyperlink w:anchor="_Toc240919839" w:history="1">
+          <w:hyperlink w:anchor="_Toc240922986" w:history="1">
             <w:r>
               <w:rPr>
                 <w:rStyle w:val="Hyperlink"/>
@@ -1395,7 +1395,7 @@
               <w:rPr>
                 <w:noProof/>
               </w:rPr>
-              <w:instrText xml:space="preserve"> PAGEREF _Toc240919839 \h </w:instrText>
+              <w:instrText xml:space="preserve"> PAGEREF _Toc240922986 \h </w:instrText>
             </w:r>
             <w:r>
               <w:rPr>
@@ -1438,7 +1438,7 @@
               <w14:ligatures w14:val="standardContextual"/>
             </w:rPr>
           </w:pPr>
-          <w:hyperlink w:anchor="_Toc240919840" w:history="1">
+          <w:hyperlink w:anchor="_Toc240922987" w:history="1">
             <w:r>
               <w:rPr>
                 <w:rStyle w:val="Hyperlink"/>
@@ -1462,7 +1462,7 @@
               <w:rPr>
                 <w:noProof/>
               </w:rPr>
-              <w:instrText xml:space="preserve"> PAGEREF _Toc240919840 \h </w:instrText>
+              <w:instrText xml:space="preserve"> PAGEREF _Toc240922987 \h </w:instrText>
             </w:r>
             <w:r>
               <w:rPr>
@@ -1505,7 +1505,7 @@
               <w14:ligatures w14:val="standardContextual"/>
             </w:rPr>
           </w:pPr>
-          <w:hyperlink w:anchor="_Toc240919841" w:history="1">
+          <w:hyperlink w:anchor="_Toc240922988" w:history="1">
             <w:r>
               <w:rPr>
                 <w:rStyle w:val="Hyperlink"/>
@@ -1529,7 +1529,7 @@
               <w:rPr>
                 <w:noProof/>
               </w:rPr>
-              <w:instrText xml:space="preserve"> PAGEREF _Toc240919841 \h </w:instrText>
+              <w:instrText xml:space="preserve"> PAGEREF _Toc240922988 \h </w:instrText>
             </w:r>
             <w:r>
               <w:rPr>
@@ -1572,7 +1572,7 @@
               <w14:ligatures w14:val="standardContextual"/>
             </w:rPr>
           </w:pPr>
-          <w:hyperlink w:anchor="_Toc240919842" w:history="1">
+          <w:hyperlink w:anchor="_Toc240922989" w:history="1">
             <w:r>
               <w:rPr>
                 <w:rStyle w:val="Hyperlink"/>
@@ -1596,7 +1596,7 @@
               <w:rPr>
                 <w:noProof/>
               </w:rPr>
-              <w:instrText xml:space="preserve"> PAGEREF _Toc240919842 \h </w:instrText>
+              <w:instrText xml:space="preserve"> PAGEREF _Toc240922989 \h </w:instrText>
             </w:r>
             <w:r>
               <w:rPr>
@@ -1639,7 +1639,7 @@
               <w14:ligatures w14:val="standardContextual"/>
             </w:rPr>
           </w:pPr>
-          <w:hyperlink w:anchor="_Toc240919843" w:history="1">
+          <w:hyperlink w:anchor="_Toc240922990" w:history="1">
             <w:r>
               <w:rPr>
                 <w:rStyle w:val="Hyperlink"/>
@@ -1663,7 +1663,7 @@
               <w:rPr>
                 <w:noProof/>
               </w:rPr>
-              <w:instrText xml:space="preserve"> PAGEREF _Toc240919843 \h </w:instrText>
+              <w:instrText xml:space="preserve"> PAGEREF _Toc240922990 \h </w:instrText>
             </w:r>
             <w:r>
               <w:rPr>
@@ -1706,7 +1706,7 @@
               <w14:ligatures w14:val="standardContextual"/>
             </w:rPr>
           </w:pPr>
-          <w:hyperlink w:anchor="_Toc240919844" w:history="1">
+          <w:hyperlink w:anchor="_Toc240922991" w:history="1">
             <w:r>
               <w:rPr>
                 <w:rStyle w:val="Hyperlink"/>
@@ -1730,7 +1730,7 @@
               <w:rPr>
                 <w:noProof/>
               </w:rPr>
-              <w:instrText xml:space="preserve"> PAGEREF _Toc240919844 \h </w:instrText>
+              <w:instrText xml:space="preserve"> PAGEREF _Toc240922991 \h </w:instrText>
             </w:r>
             <w:r>
               <w:rPr>
@@ -1773,7 +1773,7 @@
               <w14:ligatures w14:val="standardContextual"/>
             </w:rPr>
           </w:pPr>
-          <w:hyperlink w:anchor="_Toc240919845" w:history="1">
+          <w:hyperlink w:anchor="_Toc240922992" w:history="1">
             <w:r>
               <w:rPr>
                 <w:rStyle w:val="Hyperlink"/>
@@ -1797,7 +1797,7 @@
               <w:rPr>
                 <w:noProof/>
               </w:rPr>
-              <w:instrText xml:space="preserve"> PAGEREF _Toc240919845 \h </w:instrText>
+              <w:instrText xml:space="preserve"> PAGEREF _Toc240922992 \h </w:instrText>
             </w:r>
             <w:r>
               <w:rPr>
@@ -1840,7 +1840,7 @@
               <w14:ligatures w14:val="standardContextual"/>
             </w:rPr>
           </w:pPr>
-          <w:hyperlink w:anchor="_Toc240919846" w:history="1">
+          <w:hyperlink w:anchor="_Toc240922993" w:history="1">
             <w:r>
               <w:rPr>
                 <w:rStyle w:val="Hyperlink"/>
@@ -1864,7 +1864,7 @@
               <w:rPr>
                 <w:noProof/>
               </w:rPr>
-              <w:instrText xml:space="preserve"> PAGEREF _Toc240919846 \h </w:instrText>
+              <w:instrText xml:space="preserve"> PAGEREF _Toc240922993 \h </w:instrText>
             </w:r>
             <w:r>
               <w:rPr>
@@ -1907,7 +1907,7 @@
               <w14:ligatures w14:val="standardContextual"/>
             </w:rPr>
           </w:pPr>
-          <w:hyperlink w:anchor="_Toc240919847" w:history="1">
+          <w:hyperlink w:anchor="_Toc240922994" w:history="1">
             <w:r>
               <w:rPr>
                 <w:rStyle w:val="Hyperlink"/>
@@ -1931,7 +1931,7 @@
               <w:rPr>
                 <w:noProof/>
               </w:rPr>
-              <w:instrText xml:space="preserve"> PAGEREF _Toc240919847 \h </w:instrText>
+              <w:instrText xml:space="preserve"> PAGEREF _Toc240922994 \h </w:instrText>
             </w:r>
             <w:r>
               <w:rPr>
@@ -1974,7 +1974,7 @@
               <w14:ligatures w14:val="standardContextual"/>
             </w:rPr>
           </w:pPr>
-          <w:hyperlink w:anchor="_Toc240919848" w:history="1">
+          <w:hyperlink w:anchor="_Toc240922995" w:history="1">
             <w:r>
               <w:rPr>
                 <w:rStyle w:val="Hyperlink"/>
@@ -1998,7 +1998,7 @@
               <w:rPr>
                 <w:noProof/>
               </w:rPr>
-              <w:instrText xml:space="preserve"> PAGEREF _Toc240919848 \h </w:instrText>
+              <w:instrText xml:space="preserve"> PAGEREF _Toc240922995 \h </w:instrText>
             </w:r>
             <w:r>
               <w:rPr>
@@ -2041,7 +2041,7 @@
               <w14:ligatures w14:val="standardContextual"/>
             </w:rPr>
           </w:pPr>
-          <w:hyperlink w:anchor="_Toc240919849" w:history="1">
+          <w:hyperlink w:anchor="_Toc240922996" w:history="1">
             <w:r>
               <w:rPr>
                 <w:rStyle w:val="Hyperlink"/>
@@ -2065,7 +2065,7 @@
               <w:rPr>
                 <w:noProof/>
               </w:rPr>
-              <w:instrText xml:space="preserve"> PAGEREF _Toc240919849 \h </w:instrText>
+              <w:instrText xml:space="preserve"> PAGEREF _Toc240922996 \h </w:instrText>
             </w:r>
             <w:r>
               <w:rPr>
@@ -2108,7 +2108,7 @@
               <w14:ligatures w14:val="standardContextual"/>
             </w:rPr>
           </w:pPr>
-          <w:hyperlink w:anchor="_Toc240919850" w:history="1">
+          <w:hyperlink w:anchor="_Toc240922997" w:history="1">
             <w:r>
               <w:rPr>
                 <w:rStyle w:val="Hyperlink"/>
@@ -2132,7 +2132,7 @@
               <w:rPr>
                 <w:noProof/>
               </w:rPr>
-              <w:instrText xml:space="preserve"> PAGEREF _Toc240919850 \h </w:instrText>
+              <w:instrText xml:space="preserve"> PAGEREF _Toc240922997 \h </w:instrText>
             </w:r>
             <w:r>
               <w:rPr>
@@ -2175,7 +2175,7 @@
               <w14:ligatures w14:val="standardContextual"/>
             </w:rPr>
           </w:pPr>
-          <w:hyperlink w:anchor="_Toc240919851" w:history="1">
+          <w:hyperlink w:anchor="_Toc240922998" w:history="1">
             <w:r>
               <w:rPr>
                 <w:rStyle w:val="Hyperlink"/>
@@ -2199,7 +2199,7 @@
               <w:rPr>
                 <w:noProof/>
               </w:rPr>
-              <w:instrText xml:space="preserve"> PAGEREF _Toc240919851 \h </w:instrText>
+              <w:instrText xml:space="preserve"> PAGEREF _Toc240922998 \h </w:instrText>
             </w:r>
             <w:r>
               <w:rPr>
@@ -2242,7 +2242,7 @@
               <w14:ligatures w14:val="standardContextual"/>
             </w:rPr>
           </w:pPr>
-          <w:hyperlink w:anchor="_Toc240919852" w:history="1">
+          <w:hyperlink w:anchor="_Toc240922999" w:history="1">
             <w:r>
               <w:rPr>
                 <w:rStyle w:val="Hyperlink"/>
@@ -2266,7 +2266,7 @@
               <w:rPr>
                 <w:noProof/>
               </w:rPr>
-              <w:instrText xml:space="preserve"> PAGEREF _Toc240919852 \h </w:instrText>
+              <w:instrText xml:space="preserve"> PAGEREF _Toc240922999 \h </w:instrText>
             </w:r>
             <w:r>
               <w:rPr>
@@ -2309,7 +2309,7 @@
               <w14:ligatures w14:val="standardContextual"/>
             </w:rPr>
           </w:pPr>
-          <w:hyperlink w:anchor="_Toc240919853" w:history="1">
+          <w:hyperlink w:anchor="_Toc240923000" w:history="1">
             <w:r>
               <w:rPr>
                 <w:rStyle w:val="Hyperlink"/>
@@ -2333,7 +2333,7 @@
               <w:rPr>
                 <w:noProof/>
               </w:rPr>
-              <w:instrText xml:space="preserve"> PAGEREF _Toc240919853 \h </w:instrText>
+              <w:instrText xml:space="preserve"> PAGEREF _Toc240923000 \h </w:instrText>
             </w:r>
             <w:r>
               <w:rPr>
@@ -2376,7 +2376,7 @@
               <w14:ligatures w14:val="standardContextual"/>
             </w:rPr>
           </w:pPr>
-          <w:hyperlink w:anchor="_Toc240919854" w:history="1">
+          <w:hyperlink w:anchor="_Toc240923001" w:history="1">
             <w:r>
               <w:rPr>
                 <w:rStyle w:val="Hyperlink"/>
@@ -2400,7 +2400,7 @@
               <w:rPr>
                 <w:noProof/>
               </w:rPr>
-              <w:instrText xml:space="preserve"> PAGEREF _Toc240919854 \h </w:instrText>
+              <w:instrText xml:space="preserve"> PAGEREF _Toc240923001 \h </w:instrText>
             </w:r>
             <w:r>
               <w:rPr>
@@ -2443,7 +2443,7 @@
               <w14:ligatures w14:val="standardContextual"/>
             </w:rPr>
           </w:pPr>
-          <w:hyperlink w:anchor="_Toc240919855" w:history="1">
+          <w:hyperlink w:anchor="_Toc240923002" w:history="1">
             <w:r>
               <w:rPr>
                 <w:rStyle w:val="Hyperlink"/>
@@ -2467,7 +2467,7 @@
               <w:rPr>
                 <w:noProof/>
               </w:rPr>
-              <w:instrText xml:space="preserve"> PAGEREF _Toc240919855 \h </w:instrText>
+              <w:instrText xml:space="preserve"> PAGEREF _Toc240923002 \h </w:instrText>
             </w:r>
             <w:r>
               <w:rPr>
@@ -2510,7 +2510,7 @@
               <w14:ligatures w14:val="standardContextual"/>
             </w:rPr>
           </w:pPr>
-          <w:hyperlink w:anchor="_Toc240919856" w:history="1">
+          <w:hyperlink w:anchor="_Toc240923003" w:history="1">
             <w:r>
               <w:rPr>
                 <w:rStyle w:val="Hyperlink"/>
@@ -2534,7 +2534,7 @@
               <w:rPr>
                 <w:noProof/>
               </w:rPr>
-              <w:instrText xml:space="preserve"> PAGEREF _Toc240919856 \h </w:instrText>
+              <w:instrText xml:space="preserve"> PAGEREF _Toc240923003 \h </w:instrText>
             </w:r>
             <w:r>
               <w:rPr>
@@ -2577,7 +2577,7 @@
               <w14:ligatures w14:val="standardContextual"/>
             </w:rPr>
           </w:pPr>
-          <w:hyperlink w:anchor="_Toc240919857" w:history="1">
+          <w:hyperlink w:anchor="_Toc240923004" w:history="1">
             <w:r>
               <w:rPr>
                 <w:rStyle w:val="Hyperlink"/>
@@ -2601,7 +2601,7 @@
               <w:rPr>
                 <w:noProof/>
               </w:rPr>
-              <w:instrText xml:space="preserve"> PAGEREF _Toc240919857 \h </w:instrText>
+              <w:instrText xml:space="preserve"> PAGEREF _Toc240923004 \h </w:instrText>
             </w:r>
             <w:r>
               <w:rPr>
@@ -2644,7 +2644,7 @@
               <w14:ligatures w14:val="standardContextual"/>
             </w:rPr>
           </w:pPr>
-          <w:hyperlink w:anchor="_Toc240919858" w:history="1">
+          <w:hyperlink w:anchor="_Toc240923005" w:history="1">
             <w:r>
               <w:rPr>
                 <w:rStyle w:val="Hyperlink"/>
@@ -2668,7 +2668,7 @@
               <w:rPr>
                 <w:noProof/>
               </w:rPr>
-              <w:instrText xml:space="preserve"> PAGEREF _Toc240919858 \h </w:instrText>
+              <w:instrText xml:space="preserve"> PAGEREF _Toc240923005 \h </w:instrText>
             </w:r>
             <w:r>
               <w:rPr>
@@ -2711,7 +2711,7 @@
               <w14:ligatures w14:val="standardContextual"/>
             </w:rPr>
           </w:pPr>
-          <w:hyperlink w:anchor="_Toc240919859" w:history="1">
+          <w:hyperlink w:anchor="_Toc240923006" w:history="1">
             <w:r>
               <w:rPr>
                 <w:rStyle w:val="Hyperlink"/>
@@ -2735,7 +2735,7 @@
               <w:rPr>
                 <w:noProof/>
               </w:rPr>
-              <w:instrText xml:space="preserve"> PAGEREF _Toc240919859 \h </w:instrText>
+              <w:instrText xml:space="preserve"> PAGEREF _Toc240923006 \h </w:instrText>
             </w:r>
             <w:r>
               <w:rPr>
@@ -2778,7 +2778,7 @@
               <w14:ligatures w14:val="standardContextual"/>
             </w:rPr>
           </w:pPr>
-          <w:hyperlink w:anchor="_Toc240919860" w:history="1">
+          <w:hyperlink w:anchor="_Toc240923007" w:history="1">
             <w:r>
               <w:rPr>
                 <w:rStyle w:val="Hyperlink"/>
@@ -2802,7 +2802,7 @@
               <w:rPr>
                 <w:noProof/>
               </w:rPr>
-              <w:instrText xml:space="preserve"> PAGEREF _Toc240919860 \h </w:instrText>
+              <w:instrText xml:space="preserve"> PAGEREF _Toc240923007 \h </w:instrText>
             </w:r>
             <w:r>
               <w:rPr>
@@ -2845,7 +2845,7 @@
               <w14:ligatures w14:val="standardContextual"/>
             </w:rPr>
           </w:pPr>
-          <w:hyperlink w:anchor="_Toc240919861" w:history="1">
+          <w:hyperlink w:anchor="_Toc240923008" w:history="1">
             <w:r>
               <w:rPr>
                 <w:rStyle w:val="Hyperlink"/>
@@ -2869,7 +2869,7 @@
               <w:rPr>
                 <w:noProof/>
               </w:rPr>
-              <w:instrText xml:space="preserve"> PAGEREF _Toc240919861 \h </w:instrText>
+              <w:instrText xml:space="preserve"> PAGEREF _Toc240923008 \h </w:instrText>
             </w:r>
             <w:r>
               <w:rPr>
@@ -2912,7 +2912,7 @@
               <w14:ligatures w14:val="standardContextual"/>
             </w:rPr>
           </w:pPr>
-          <w:hyperlink w:anchor="_Toc240919862" w:history="1">
+          <w:hyperlink w:anchor="_Toc240923009" w:history="1">
             <w:r>
               <w:rPr>
                 <w:rStyle w:val="Hyperlink"/>
@@ -2936,7 +2936,7 @@
               <w:rPr>
                 <w:noProof/>
               </w:rPr>
-              <w:instrText xml:space="preserve"> PAGEREF _Toc240919862 \h </w:instrText>
+              <w:instrText xml:space="preserve"> PAGEREF _Toc240923009 \h </w:instrText>
             </w:r>
             <w:r>
               <w:rPr>
@@ -2979,7 +2979,7 @@
               <w14:ligatures w14:val="standardContextual"/>
             </w:rPr>
           </w:pPr>
-          <w:hyperlink w:anchor="_Toc240919863" w:history="1">
+          <w:hyperlink w:anchor="_Toc240923010" w:history="1">
             <w:r>
               <w:rPr>
                 <w:rStyle w:val="Hyperlink"/>
@@ -3003,7 +3003,7 @@
               <w:rPr>
                 <w:noProof/>
               </w:rPr>
-              <w:instrText xml:space="preserve"> PAGEREF _Toc240919863 \h </w:instrText>
+              <w:instrText xml:space="preserve"> PAGEREF _Toc240923010 \h </w:instrText>
             </w:r>
             <w:r>
               <w:rPr>
@@ -3046,7 +3046,7 @@
               <w14:ligatures w14:val="standardContextual"/>
             </w:rPr>
           </w:pPr>
-          <w:hyperlink w:anchor="_Toc240919864" w:history="1">
+          <w:hyperlink w:anchor="_Toc240923011" w:history="1">
             <w:r>
               <w:rPr>
                 <w:rStyle w:val="Hyperlink"/>
@@ -3070,7 +3070,7 @@
               <w:rPr>
                 <w:noProof/>
               </w:rPr>
-              <w:instrText xml:space="preserve"> PAGEREF _Toc240919864 \h </w:instrText>
+              <w:instrText xml:space="preserve"> PAGEREF _Toc240923011 \h </w:instrText>
             </w:r>
             <w:r>
               <w:rPr>
@@ -3113,7 +3113,7 @@
               <w14:ligatures w14:val="standardContextual"/>
             </w:rPr>
           </w:pPr>
-          <w:hyperlink w:anchor="_Toc240919865" w:history="1">
+          <w:hyperlink w:anchor="_Toc240923012" w:history="1">
             <w:r>
               <w:rPr>
                 <w:rStyle w:val="Hyperlink"/>
@@ -3137,7 +3137,7 @@
               <w:rPr>
                 <w:noProof/>
               </w:rPr>
-              <w:instrText xml:space="preserve"> PAGEREF _Toc240919865 \h </w:instrText>
+              <w:instrText xml:space="preserve"> PAGEREF _Toc240923012 \h </w:instrText>
             </w:r>
             <w:r>
               <w:rPr>
@@ -3180,7 +3180,7 @@
               <w14:ligatures w14:val="standardContextual"/>
             </w:rPr>
           </w:pPr>
-          <w:hyperlink w:anchor="_Toc240919866" w:history="1">
+          <w:hyperlink w:anchor="_Toc240923013" w:history="1">
             <w:r>
               <w:rPr>
                 <w:rStyle w:val="Hyperlink"/>
@@ -3204,7 +3204,7 @@
               <w:rPr>
                 <w:noProof/>
               </w:rPr>
-              <w:instrText xml:space="preserve"> PAGEREF _Toc240919866 \h </w:instrText>
+              <w:instrText xml:space="preserve"> PAGEREF _Toc240923013 \h </w:instrText>
             </w:r>
             <w:r>
               <w:rPr>
@@ -3247,7 +3247,7 @@
               <w14:ligatures w14:val="standardContextual"/>
             </w:rPr>
           </w:pPr>
-          <w:hyperlink w:anchor="_Toc240919867" w:history="1">
+          <w:hyperlink w:anchor="_Toc240923014" w:history="1">
             <w:r>
               <w:rPr>
                 <w:rStyle w:val="Hyperlink"/>
@@ -3271,7 +3271,7 @@
               <w:rPr>
                 <w:noProof/>
               </w:rPr>
-              <w:instrText xml:space="preserve"> PAGEREF _Toc240919867 \h </w:instrText>
+              <w:instrText xml:space="preserve"> PAGEREF _Toc240923014 \h </w:instrText>
             </w:r>
             <w:r>
               <w:rPr>
@@ -3310,7 +3310,7 @@
         <w:pStyle w:val="Heading1"/>
         <w:pageBreakBefore/>
       </w:pPr>
-      <w:bookmarkStart w:id="0" w:name="_Toc240919827"/>
+      <w:bookmarkStart w:id="0" w:name="_Toc240922974"/>
       <w:r>
         <w:lastRenderedPageBreak/>
         <w:t>1. About this reference</w:t>
@@ -3763,7 +3763,7 @@
         <w:pStyle w:val="Heading1"/>
         <w:pageBreakBefore/>
       </w:pPr>
-      <w:bookmarkStart w:id="1" w:name="_Toc240919828"/>
+      <w:bookmarkStart w:id="1" w:name="_Toc240922975"/>
       <w:r>
         <w:lastRenderedPageBreak/>
         <w:t>2. Rules that apply on every screen</w:t>
@@ -3980,7 +3980,7 @@
         <w:pStyle w:val="Heading1"/>
         <w:pageBreakBefore/>
       </w:pPr>
-      <w:bookmarkStart w:id="2" w:name="_Toc240919829"/>
+      <w:bookmarkStart w:id="2" w:name="_Toc240922976"/>
       <w:r>
         <w:lastRenderedPageBreak/>
         <w:t>3. Who can open which screen</w:t>
@@ -9508,7 +9508,7 @@
         <w:pStyle w:val="Heading1"/>
         <w:pageBreakBefore/>
       </w:pPr>
-      <w:bookmarkStart w:id="3" w:name="_Toc240919830"/>
+      <w:bookmarkStart w:id="3" w:name="_Toc240922977"/>
       <w:r>
         <w:lastRenderedPageBreak/>
         <w:t>4. Signing in and your account</w:t>
@@ -9519,7 +9519,7 @@
       <w:pPr>
         <w:pStyle w:val="Heading2"/>
       </w:pPr>
-      <w:bookmarkStart w:id="4" w:name="_Toc240919831"/>
+      <w:bookmarkStart w:id="4" w:name="_Toc240922978"/>
       <w:r>
         <w:t>4.1 Sign in</w:t>
       </w:r>
@@ -10032,7 +10032,7 @@
       <w:pPr>
         <w:pStyle w:val="Heading2"/>
       </w:pPr>
-      <w:bookmarkStart w:id="5" w:name="_Toc240919832"/>
+      <w:bookmarkStart w:id="5" w:name="_Toc240922979"/>
       <w:r>
         <w:t>4.2 The header and menu bar (every screen)</w:t>
       </w:r>
@@ -10755,7 +10755,7 @@
       <w:pPr>
         <w:pStyle w:val="Heading2"/>
       </w:pPr>
-      <w:bookmarkStart w:id="6" w:name="_Toc240919833"/>
+      <w:bookmarkStart w:id="6" w:name="_Toc240922980"/>
       <w:r>
         <w:lastRenderedPageBreak/>
         <w:t>4.3 Change Password</w:t>
@@ -11377,7 +11377,7 @@
         <w:pStyle w:val="Heading1"/>
         <w:pageBreakBefore/>
       </w:pPr>
-      <w:bookmarkStart w:id="7" w:name="_Toc240919834"/>
+      <w:bookmarkStart w:id="7" w:name="_Toc240922981"/>
       <w:r>
         <w:lastRenderedPageBreak/>
         <w:t>5. Dashboards and Reports (read-only)</w:t>
@@ -11388,7 +11388,7 @@
       <w:pPr>
         <w:pStyle w:val="Heading2"/>
       </w:pPr>
-      <w:bookmarkStart w:id="8" w:name="_Toc240919835"/>
+      <w:bookmarkStart w:id="8" w:name="_Toc240922982"/>
       <w:r>
         <w:t>5.1 Executive Dashboard</w:t>
       </w:r>
@@ -11901,7 +11901,7 @@
       <w:pPr>
         <w:pStyle w:val="Heading2"/>
       </w:pPr>
-      <w:bookmarkStart w:id="9" w:name="_Toc240919836"/>
+      <w:bookmarkStart w:id="9" w:name="_Toc240922983"/>
       <w:r>
         <w:t>5.2 Sampling Dashboard</w:t>
       </w:r>
@@ -12414,7 +12414,7 @@
       <w:pPr>
         <w:pStyle w:val="Heading2"/>
       </w:pPr>
-      <w:bookmarkStart w:id="10" w:name="_Toc240919837"/>
+      <w:bookmarkStart w:id="10" w:name="_Toc240922984"/>
       <w:r>
         <w:t>5.3 Contact Dashboard</w:t>
       </w:r>
@@ -12718,7 +12718,7 @@
       <w:pPr>
         <w:pStyle w:val="Heading2"/>
       </w:pPr>
-      <w:bookmarkStart w:id="11" w:name="_Toc240919838"/>
+      <w:bookmarkStart w:id="11" w:name="_Toc240922985"/>
       <w:r>
         <w:t>5.4 QA Dashboard</w:t>
       </w:r>
@@ -13338,7 +13338,7 @@
       <w:pPr>
         <w:pStyle w:val="Heading2"/>
       </w:pPr>
-      <w:bookmarkStart w:id="12" w:name="_Toc240919839"/>
+      <w:bookmarkStart w:id="12" w:name="_Toc240922986"/>
       <w:r>
         <w:t>5.5 KII / Document Dashboard</w:t>
       </w:r>
@@ -13748,7 +13748,7 @@
       <w:pPr>
         <w:pStyle w:val="Heading2"/>
       </w:pPr>
-      <w:bookmarkStart w:id="13" w:name="_Toc240919840"/>
+      <w:bookmarkStart w:id="13" w:name="_Toc240922987"/>
       <w:r>
         <w:lastRenderedPageBreak/>
         <w:t>5.6 Reports</w:t>
@@ -14263,7 +14263,7 @@
         <w:pStyle w:val="Heading1"/>
         <w:pageBreakBefore/>
       </w:pPr>
-      <w:bookmarkStart w:id="14" w:name="_Toc240919841"/>
+      <w:bookmarkStart w:id="14" w:name="_Toc240922988"/>
       <w:r>
         <w:lastRenderedPageBreak/>
         <w:t>6. The sample and contact</w:t>
@@ -14274,7 +14274,7 @@
       <w:pPr>
         <w:pStyle w:val="Heading2"/>
       </w:pPr>
-      <w:bookmarkStart w:id="15" w:name="_Toc240919842"/>
+      <w:bookmarkStart w:id="15" w:name="_Toc240922989"/>
       <w:r>
         <w:t>6.1 Main-400 Register (and Reserve)</w:t>
       </w:r>
@@ -15207,7 +15207,7 @@
       <w:pPr>
         <w:pStyle w:val="Heading2"/>
       </w:pPr>
-      <w:bookmarkStart w:id="16" w:name="_Toc240919843"/>
+      <w:bookmarkStart w:id="16" w:name="_Toc240922990"/>
       <w:r>
         <w:t>6.2 Case page</w:t>
       </w:r>
@@ -16886,7 +16886,7 @@
       <w:pPr>
         <w:pStyle w:val="Heading2"/>
       </w:pPr>
-      <w:bookmarkStart w:id="17" w:name="_Toc240919844"/>
+      <w:bookmarkStart w:id="17" w:name="_Toc240922991"/>
       <w:r>
         <w:t>6.3 Pre-Interview Profile (PROIT) and its review screen</w:t>
       </w:r>
@@ -18451,7 +18451,7 @@
       <w:pPr>
         <w:pStyle w:val="Heading2"/>
       </w:pPr>
-      <w:bookmarkStart w:id="18" w:name="_Toc240919845"/>
+      <w:bookmarkStart w:id="18" w:name="_Toc240922992"/>
       <w:r>
         <w:t>6.4 Interview sheet (verifying a locked profile)</w:t>
       </w:r>
@@ -19709,7 +19709,7 @@
       <w:pPr>
         <w:pStyle w:val="Heading2"/>
       </w:pPr>
-      <w:bookmarkStart w:id="19" w:name="_Toc240919846"/>
+      <w:bookmarkStart w:id="19" w:name="_Toc240922993"/>
       <w:r>
         <w:t>6.5 Register Organisation</w:t>
       </w:r>
@@ -20432,7 +20432,7 @@
       <w:pPr>
         <w:pStyle w:val="Heading2"/>
       </w:pPr>
-      <w:bookmarkStart w:id="20" w:name="_Toc240919847"/>
+      <w:bookmarkStart w:id="20" w:name="_Toc240922994"/>
       <w:r>
         <w:t>6.6 Appointment Queue</w:t>
       </w:r>
@@ -21053,7 +21053,7 @@
       <w:pPr>
         <w:pStyle w:val="Heading2"/>
       </w:pPr>
-      <w:bookmarkStart w:id="21" w:name="_Toc240919848"/>
+      <w:bookmarkStart w:id="21" w:name="_Toc240922995"/>
       <w:r>
         <w:t>6.7 Follow-ups due</w:t>
       </w:r>
@@ -21566,7 +21566,7 @@
       <w:pPr>
         <w:pStyle w:val="Heading2"/>
       </w:pPr>
-      <w:bookmarkStart w:id="22" w:name="_Toc240919849"/>
+      <w:bookmarkStart w:id="22" w:name="_Toc240922996"/>
       <w:r>
         <w:t>6.8 Reserve Activation</w:t>
       </w:r>
@@ -22188,7 +22188,7 @@
         <w:pStyle w:val="Heading1"/>
         <w:pageBreakBefore/>
       </w:pPr>
-      <w:bookmarkStart w:id="23" w:name="_Toc240919850"/>
+      <w:bookmarkStart w:id="23" w:name="_Toc240922997"/>
       <w:r>
         <w:lastRenderedPageBreak/>
         <w:t>7. Quality checking</w:t>
@@ -22199,7 +22199,7 @@
       <w:pPr>
         <w:pStyle w:val="Heading2"/>
       </w:pPr>
-      <w:bookmarkStart w:id="24" w:name="_Toc240919851"/>
+      <w:bookmarkStart w:id="24" w:name="_Toc240922998"/>
       <w:r>
         <w:t>7.1 QA Queue (with the KoboToolbox sync panel)</w:t>
       </w:r>
@@ -22922,7 +22922,7 @@
       <w:pPr>
         <w:pStyle w:val="Heading2"/>
       </w:pPr>
-      <w:bookmarkStart w:id="25" w:name="_Toc240919852"/>
+      <w:bookmarkStart w:id="25" w:name="_Toc240922999"/>
       <w:r>
         <w:t>7.2 QA Exceptions</w:t>
       </w:r>
@@ -23754,7 +23754,7 @@
         <w:pStyle w:val="Heading1"/>
         <w:pageBreakBefore/>
       </w:pPr>
-      <w:bookmarkStart w:id="26" w:name="_Toc240919853"/>
+      <w:bookmarkStart w:id="26" w:name="_Toc240923000"/>
       <w:r>
         <w:lastRenderedPageBreak/>
         <w:t>8. Key Informant Interviews</w:t>
@@ -23765,7 +23765,7 @@
       <w:pPr>
         <w:pStyle w:val="Heading2"/>
       </w:pPr>
-      <w:bookmarkStart w:id="27" w:name="_Toc240919854"/>
+      <w:bookmarkStart w:id="27" w:name="_Toc240923001"/>
       <w:r>
         <w:t>8.1 KII Register</w:t>
       </w:r>
@@ -24385,7 +24385,7 @@
       <w:pPr>
         <w:pStyle w:val="Heading2"/>
       </w:pPr>
-      <w:bookmarkStart w:id="28" w:name="_Toc240919855"/>
+      <w:bookmarkStart w:id="28" w:name="_Toc240923002"/>
       <w:r>
         <w:t>8.2 New KII Record</w:t>
       </w:r>
@@ -24795,7 +24795,7 @@
       <w:pPr>
         <w:pStyle w:val="Heading2"/>
       </w:pPr>
-      <w:bookmarkStart w:id="29" w:name="_Toc240919856"/>
+      <w:bookmarkStart w:id="29" w:name="_Toc240923003"/>
       <w:r>
         <w:t>8.3 KII record</w:t>
       </w:r>
@@ -25837,7 +25837,7 @@
         <w:pStyle w:val="Heading1"/>
         <w:pageBreakBefore/>
       </w:pPr>
-      <w:bookmarkStart w:id="30" w:name="_Toc240919857"/>
+      <w:bookmarkStart w:id="30" w:name="_Toc240923004"/>
       <w:r>
         <w:lastRenderedPageBreak/>
         <w:t>9. Documentary evidence</w:t>
@@ -25848,7 +25848,7 @@
       <w:pPr>
         <w:pStyle w:val="Heading2"/>
       </w:pPr>
-      <w:bookmarkStart w:id="31" w:name="_Toc240919858"/>
+      <w:bookmarkStart w:id="31" w:name="_Toc240923005"/>
       <w:r>
         <w:t>9.1 Documents (the corpus)</w:t>
       </w:r>
@@ -26468,7 +26468,7 @@
       <w:pPr>
         <w:pStyle w:val="Heading2"/>
       </w:pPr>
-      <w:bookmarkStart w:id="32" w:name="_Toc240919859"/>
+      <w:bookmarkStart w:id="32" w:name="_Toc240923006"/>
       <w:r>
         <w:t>9.2 New Documentary Evidence Record</w:t>
       </w:r>
@@ -27299,7 +27299,7 @@
       <w:pPr>
         <w:pStyle w:val="Heading2"/>
       </w:pPr>
-      <w:bookmarkStart w:id="33" w:name="_Toc240919860"/>
+      <w:bookmarkStart w:id="33" w:name="_Toc240923007"/>
       <w:r>
         <w:t>9.3 Document record</w:t>
       </w:r>
@@ -28653,7 +28653,7 @@
       <w:pPr>
         <w:pStyle w:val="Heading2"/>
       </w:pPr>
-      <w:bookmarkStart w:id="34" w:name="_Toc240919861"/>
+      <w:bookmarkStart w:id="34" w:name="_Toc240923008"/>
       <w:r>
         <w:t>9.4 Auto-fill review screen</w:t>
       </w:r>
@@ -29695,7 +29695,7 @@
         <w:pStyle w:val="Heading1"/>
         <w:pageBreakBefore/>
       </w:pPr>
-      <w:bookmarkStart w:id="35" w:name="_Toc240919862"/>
+      <w:bookmarkStart w:id="35" w:name="_Toc240923009"/>
       <w:r>
         <w:lastRenderedPageBreak/>
         <w:t>10. Completed forms and exports</w:t>
@@ -29706,7 +29706,7 @@
       <w:pPr>
         <w:pStyle w:val="Heading2"/>
       </w:pPr>
-      <w:bookmarkStart w:id="36" w:name="_Toc240919863"/>
+      <w:bookmarkStart w:id="36" w:name="_Toc240923010"/>
       <w:r>
         <w:t>10.1 Completed forms (Form PDFs)</w:t>
       </w:r>
@@ -30972,7 +30972,7 @@
         <w:pStyle w:val="Heading1"/>
         <w:pageBreakBefore/>
       </w:pPr>
-      <w:bookmarkStart w:id="37" w:name="_Toc240919864"/>
+      <w:bookmarkStart w:id="37" w:name="_Toc240923011"/>
       <w:r>
         <w:lastRenderedPageBreak/>
         <w:t>11. Study administration</w:t>
@@ -30983,7 +30983,7 @@
       <w:pPr>
         <w:pStyle w:val="Heading2"/>
       </w:pPr>
-      <w:bookmarkStart w:id="38" w:name="_Toc240919865"/>
+      <w:bookmarkStart w:id="38" w:name="_Toc240923012"/>
       <w:r>
         <w:t>11.1 Cost Dashboard</w:t>
       </w:r>
@@ -31393,7 +31393,7 @@
       <w:pPr>
         <w:pStyle w:val="Heading2"/>
       </w:pPr>
-      <w:bookmarkStart w:id="39" w:name="_Toc240919866"/>
+      <w:bookmarkStart w:id="39" w:name="_Toc240923013"/>
       <w:r>
         <w:t>11.2 Audit Log</w:t>
       </w:r>
@@ -31803,7 +31803,7 @@
       <w:pPr>
         <w:pStyle w:val="Heading2"/>
       </w:pPr>
-      <w:bookmarkStart w:id="40" w:name="_Toc240919867"/>
+      <w:bookmarkStart w:id="40" w:name="_Toc240923014"/>
       <w:r>
         <w:t>11.3 Export</w:t>
       </w:r>
@@ -32534,10 +32534,68 @@
 <file path=word/numbering.xml><?xml version="1.0" encoding="utf-8"?>
 <w:numbering xmlns:wpc="http://schemas.microsoft.com/office/word/2010/wordprocessingCanvas" xmlns:cx="http://schemas.microsoft.com/office/drawing/2014/chartex" xmlns:cx1="http://schemas.microsoft.com/office/drawing/2015/9/8/chartex" xmlns:cx2="http://schemas.microsoft.com/office/drawing/2015/10/21/chartex" xmlns:cx3="http://schemas.microsoft.com/office/drawing/2016/5/9/chartex" xmlns:cx4="http://schemas.microsoft.com/office/drawing/2016/5/10/chartex" xmlns:cx5="http://schemas.microsoft.com/office/drawing/2016/5/11/chartex" xmlns:cx6="http://schemas.microsoft.com/office/drawing/2016/5/12/chartex" xmlns:cx7="http://schemas.microsoft.com/office/drawing/2016/5/13/chartex" xmlns:cx8="http://schemas.microsoft.com/office/drawing/2016/5/14/chartex" xmlns:mc="http://schemas.openxmlformats.org/markup-compatibility/2006" xmlns:aink="http://schemas.microsoft.com/office/drawing/2016/ink" xmlns:am3d="http://schemas.microsoft.com/office/drawing/2017/model3d" xmlns:o="urn:schemas-microsoft-com:office:office" xmlns:oel="http://schemas.microsoft.com/office/2019/extlst" xmlns:r="http://schemas.openxmlformats.org/officeDocument/2006/relationships" xmlns:m="http://schemas.openxmlformats.org/officeDocument/2006/math" xmlns:v="urn:schemas-microsoft-com:vml" xmlns:wp14="http://schemas.microsoft.com/office/word/2010/wordprocessingDrawing" xmlns:wp="http://schemas.openxmlformats.org/drawingml/2006/wordprocessingDrawing" xmlns:w10="urn:schemas-microsoft-com:office:word" xmlns:w="http://schemas.openxmlformats.org/wordprocessingml/2006/main" xmlns:w14="http://schemas.microsoft.com/office/word/2010/wordml" xmlns:w15="http://schemas.microsoft.com/office/word/2012/wordml" xmlns:w16cex="http://schemas.microsoft.com/office/word/2018/wordml/cex" xmlns:w16cid="http://schemas.microsoft.com/office/word/2016/wordml/cid" xmlns:w16="http://schemas.microsoft.com/office/word/2018/wordml" xmlns:w16sdtdh="http://schemas.microsoft.com/office/word/2020/wordml/sdtdatahash" xmlns:w16se="http://schemas.microsoft.com/office/word/2015/wordml/symex" xmlns:wpg="http://schemas.microsoft.com/office/word/2010/wordprocessingGroup" xmlns:wpi="http://schemas.microsoft.com/office/word/2010/wordprocessingInk" xmlns:wne="http://schemas.microsoft.com/office/word/2006/wordml" xmlns:wps="http://schemas.microsoft.com/office/word/2010/wordprocessingShape" mc:Ignorable="w14 w15 w16se w16cid w16 w16cex w16sdtdh wp14">
   <w:abstractNum w:abstractNumId="0" w15:restartNumberingAfterBreak="0">
-    <w:nsid w:val="140C3E32"/>
+    <w:nsid w:val="37F874D3"/>
     <w:multiLevelType w:val="hybridMultilevel"/>
-    <w:tmpl w:val="8CFE54EE"/>
-    <w:lvl w:ilvl="0" w:tplc="BA38AAA8">
+    <w:tmpl w:val="4AB0942E"/>
+    <w:lvl w:ilvl="0" w:tplc="0CE40CCC">
+      <w:start w:val="1"/>
+      <w:numFmt w:val="bullet"/>
+      <w:lvlText w:val="•"/>
+      <w:lvlJc w:val="left"/>
+      <w:pPr>
+        <w:ind w:left="460" w:hanging="280"/>
+      </w:pPr>
+    </w:lvl>
+    <w:lvl w:ilvl="1" w:tplc="7284C808">
+      <w:start w:val="1"/>
+      <w:numFmt w:val="bullet"/>
+      <w:lvlText w:val="–"/>
+      <w:lvlJc w:val="left"/>
+      <w:pPr>
+        <w:ind w:left="900" w:hanging="280"/>
+      </w:pPr>
+    </w:lvl>
+    <w:lvl w:ilvl="2" w:tplc="91B66B96">
+      <w:numFmt w:val="decimal"/>
+      <w:lvlText w:val=""/>
+      <w:lvlJc w:val="left"/>
+    </w:lvl>
+    <w:lvl w:ilvl="3" w:tplc="C5246BB4">
+      <w:numFmt w:val="decimal"/>
+      <w:lvlText w:val=""/>
+      <w:lvlJc w:val="left"/>
+    </w:lvl>
+    <w:lvl w:ilvl="4" w:tplc="3B84BC3A">
+      <w:numFmt w:val="decimal"/>
+      <w:lvlText w:val=""/>
+      <w:lvlJc w:val="left"/>
+    </w:lvl>
+    <w:lvl w:ilvl="5" w:tplc="8366552E">
+      <w:numFmt w:val="decimal"/>
+      <w:lvlText w:val=""/>
+      <w:lvlJc w:val="left"/>
+    </w:lvl>
+    <w:lvl w:ilvl="6" w:tplc="3B0A51B6">
+      <w:numFmt w:val="decimal"/>
+      <w:lvlText w:val=""/>
+      <w:lvlJc w:val="left"/>
+    </w:lvl>
+    <w:lvl w:ilvl="7" w:tplc="2272CD70">
+      <w:numFmt w:val="decimal"/>
+      <w:lvlText w:val=""/>
+      <w:lvlJc w:val="left"/>
+    </w:lvl>
+    <w:lvl w:ilvl="8" w:tplc="D1DA2E40">
+      <w:numFmt w:val="decimal"/>
+      <w:lvlText w:val=""/>
+      <w:lvlJc w:val="left"/>
+    </w:lvl>
+  </w:abstractNum>
+  <w:abstractNum w:abstractNumId="1" w15:restartNumberingAfterBreak="0">
+    <w:nsid w:val="536B05E1"/>
+    <w:multiLevelType w:val="hybridMultilevel"/>
+    <w:tmpl w:val="85687EAA"/>
+    <w:lvl w:ilvl="0" w:tplc="C36E00C6">
       <w:start w:val="1"/>
       <w:numFmt w:val="bullet"/>
       <w:lvlText w:val="●"/>
@@ -32546,7 +32604,7 @@
         <w:ind w:left="720" w:hanging="360"/>
       </w:pPr>
     </w:lvl>
-    <w:lvl w:ilvl="1" w:tplc="6EDA2D9C">
+    <w:lvl w:ilvl="1" w:tplc="FFBEC696">
       <w:start w:val="1"/>
       <w:numFmt w:val="bullet"/>
       <w:lvlText w:val="○"/>
@@ -32555,7 +32613,7 @@
         <w:ind w:left="1440" w:hanging="360"/>
       </w:pPr>
     </w:lvl>
-    <w:lvl w:ilvl="2" w:tplc="371210BA">
+    <w:lvl w:ilvl="2" w:tplc="1DC6763E">
       <w:start w:val="1"/>
       <w:numFmt w:val="bullet"/>
       <w:lvlText w:val="■"/>
@@ -32564,7 +32622,7 @@
         <w:ind w:left="2160" w:hanging="360"/>
       </w:pPr>
     </w:lvl>
-    <w:lvl w:ilvl="3" w:tplc="18B67702">
+    <w:lvl w:ilvl="3" w:tplc="B5889078">
       <w:start w:val="1"/>
       <w:numFmt w:val="bullet"/>
       <w:lvlText w:val="●"/>
@@ -32573,7 +32631,7 @@
         <w:ind w:left="2880" w:hanging="360"/>
       </w:pPr>
     </w:lvl>
-    <w:lvl w:ilvl="4" w:tplc="2BC20C7A">
+    <w:lvl w:ilvl="4" w:tplc="EBB65202">
       <w:start w:val="1"/>
       <w:numFmt w:val="bullet"/>
       <w:lvlText w:val="○"/>
@@ -32582,7 +32640,7 @@
         <w:ind w:left="3600" w:hanging="360"/>
       </w:pPr>
     </w:lvl>
-    <w:lvl w:ilvl="5" w:tplc="F1A29716">
+    <w:lvl w:ilvl="5" w:tplc="947E0B34">
       <w:start w:val="1"/>
       <w:numFmt w:val="bullet"/>
       <w:lvlText w:val="■"/>
@@ -32591,7 +32649,7 @@
         <w:ind w:left="4320" w:hanging="360"/>
       </w:pPr>
     </w:lvl>
-    <w:lvl w:ilvl="6" w:tplc="BD6EDEA6">
+    <w:lvl w:ilvl="6" w:tplc="25D25D50">
       <w:start w:val="1"/>
       <w:numFmt w:val="bullet"/>
       <w:lvlText w:val="●"/>
@@ -32600,7 +32658,7 @@
         <w:ind w:left="5040" w:hanging="360"/>
       </w:pPr>
     </w:lvl>
-    <w:lvl w:ilvl="7" w:tplc="01CC3772">
+    <w:lvl w:ilvl="7" w:tplc="58426C64">
       <w:start w:val="1"/>
       <w:numFmt w:val="bullet"/>
       <w:lvlText w:val="●"/>
@@ -32609,7 +32667,7 @@
         <w:ind w:left="5760" w:hanging="360"/>
       </w:pPr>
     </w:lvl>
-    <w:lvl w:ilvl="8" w:tplc="9FB2E98C">
+    <w:lvl w:ilvl="8" w:tplc="9880D8DC">
       <w:start w:val="1"/>
       <w:numFmt w:val="bullet"/>
       <w:lvlText w:val="●"/>
@@ -32619,72 +32677,14 @@
       </w:pPr>
     </w:lvl>
   </w:abstractNum>
-  <w:abstractNum w:abstractNumId="1" w15:restartNumberingAfterBreak="0">
-    <w:nsid w:val="40664855"/>
-    <w:multiLevelType w:val="hybridMultilevel"/>
-    <w:tmpl w:val="2FAA086E"/>
-    <w:lvl w:ilvl="0" w:tplc="C4D261F0">
-      <w:start w:val="1"/>
-      <w:numFmt w:val="bullet"/>
-      <w:lvlText w:val="•"/>
-      <w:lvlJc w:val="left"/>
-      <w:pPr>
-        <w:ind w:left="460" w:hanging="280"/>
-      </w:pPr>
-    </w:lvl>
-    <w:lvl w:ilvl="1" w:tplc="B6B6EA50">
-      <w:start w:val="1"/>
-      <w:numFmt w:val="bullet"/>
-      <w:lvlText w:val="–"/>
-      <w:lvlJc w:val="left"/>
-      <w:pPr>
-        <w:ind w:left="900" w:hanging="280"/>
-      </w:pPr>
-    </w:lvl>
-    <w:lvl w:ilvl="2" w:tplc="A8381EC6">
-      <w:numFmt w:val="decimal"/>
-      <w:lvlText w:val=""/>
-      <w:lvlJc w:val="left"/>
-    </w:lvl>
-    <w:lvl w:ilvl="3" w:tplc="D8061B92">
-      <w:numFmt w:val="decimal"/>
-      <w:lvlText w:val=""/>
-      <w:lvlJc w:val="left"/>
-    </w:lvl>
-    <w:lvl w:ilvl="4" w:tplc="3926BE44">
-      <w:numFmt w:val="decimal"/>
-      <w:lvlText w:val=""/>
-      <w:lvlJc w:val="left"/>
-    </w:lvl>
-    <w:lvl w:ilvl="5" w:tplc="D9227412">
-      <w:numFmt w:val="decimal"/>
-      <w:lvlText w:val=""/>
-      <w:lvlJc w:val="left"/>
-    </w:lvl>
-    <w:lvl w:ilvl="6" w:tplc="64BAA03A">
-      <w:numFmt w:val="decimal"/>
-      <w:lvlText w:val=""/>
-      <w:lvlJc w:val="left"/>
-    </w:lvl>
-    <w:lvl w:ilvl="7" w:tplc="6A02490A">
-      <w:numFmt w:val="decimal"/>
-      <w:lvlText w:val=""/>
-      <w:lvlJc w:val="left"/>
-    </w:lvl>
-    <w:lvl w:ilvl="8" w:tplc="752A295A">
-      <w:numFmt w:val="decimal"/>
-      <w:lvlText w:val=""/>
-      <w:lvlJc w:val="left"/>
-    </w:lvl>
-  </w:abstractNum>
-  <w:num w:numId="1" w16cid:durableId="714735629">
-    <w:abstractNumId w:val="0"/>
+  <w:num w:numId="1" w16cid:durableId="657270226">
+    <w:abstractNumId w:val="1"/>
     <w:lvlOverride w:ilvl="0">
       <w:startOverride w:val="1"/>
     </w:lvlOverride>
   </w:num>
-  <w:num w:numId="2" w16cid:durableId="2030370856">
-    <w:abstractNumId w:val="1"/>
+  <w:num w:numId="2" w16cid:durableId="328096861">
+    <w:abstractNumId w:val="0"/>
     <w:lvlOverride w:ilvl="0">
       <w:startOverride w:val="1"/>
     </w:lvlOverride>
@@ -33309,7 +33309,7 @@
     <w:autoRedefine/>
     <w:uiPriority w:val="39"/>
     <w:unhideWhenUsed/>
-    <w:rsid w:val="001819E2"/>
+    <w:rsid w:val="00D756EE"/>
     <w:pPr>
       <w:spacing w:after="100"/>
     </w:pPr>
@@ -33321,7 +33321,7 @@
     <w:autoRedefine/>
     <w:uiPriority w:val="39"/>
     <w:unhideWhenUsed/>
-    <w:rsid w:val="001819E2"/>
+    <w:rsid w:val="00D756EE"/>
     <w:pPr>
       <w:spacing w:after="100"/>
       <w:ind w:left="210"/>

</xml_diff>

<commit_message>
docs: manuals v1.9 -- AI account billing note, configure-ai-coding.sh, PROIT cost tip and plain-language AI-credit troubleshooting row
Co-Authored-By: Claude Sonnet 5 <noreply@anthropic.com>
</commit_message>
<xml_diff>
--- a/docs/manuals/ABF-FST_Screen_and_Button_Reference.docx
+++ b/docs/manuals/ABF-FST_Screen_and_Button_Reference.docx
@@ -469,7 +469,7 @@
                 <w:sz w:val="19"/>
                 <w:szCs w:val="19"/>
               </w:rPr>
-              <w:t>Version 1.8 · 21 September 2026</w:t>
+              <w:t>Version 1.9 · 22 September 2026</w:t>
             </w:r>
           </w:p>
         </w:tc>
@@ -538,7 +538,7 @@
     <w:sdt>
       <w:sdtPr>
         <w:alias w:val="Contents"/>
-        <w:id w:val="-523236998"/>
+        <w:id w:val="570392760"/>
       </w:sdtPr>
       <w:sdtEndPr/>
       <w:sdtContent>
@@ -567,7 +567,7 @@
           <w:r>
             <w:fldChar w:fldCharType="separate"/>
           </w:r>
-          <w:hyperlink w:anchor="_Toc240922974" w:history="1">
+          <w:hyperlink w:anchor="_Toc240960494" w:history="1">
             <w:r>
               <w:rPr>
                 <w:rStyle w:val="Hyperlink"/>
@@ -591,7 +591,7 @@
               <w:rPr>
                 <w:noProof/>
               </w:rPr>
-              <w:instrText xml:space="preserve"> PAGEREF _Toc240922974 \h </w:instrText>
+              <w:instrText xml:space="preserve"> PAGEREF _Toc240960494 \h </w:instrText>
             </w:r>
             <w:r>
               <w:rPr>
@@ -634,7 +634,7 @@
               <w14:ligatures w14:val="standardContextual"/>
             </w:rPr>
           </w:pPr>
-          <w:hyperlink w:anchor="_Toc240922975" w:history="1">
+          <w:hyperlink w:anchor="_Toc240960495" w:history="1">
             <w:r>
               <w:rPr>
                 <w:rStyle w:val="Hyperlink"/>
@@ -658,7 +658,7 @@
               <w:rPr>
                 <w:noProof/>
               </w:rPr>
-              <w:instrText xml:space="preserve"> PAGEREF _Toc240922975 \h </w:instrText>
+              <w:instrText xml:space="preserve"> PAGEREF _Toc240960495 \h </w:instrText>
             </w:r>
             <w:r>
               <w:rPr>
@@ -701,7 +701,7 @@
               <w14:ligatures w14:val="standardContextual"/>
             </w:rPr>
           </w:pPr>
-          <w:hyperlink w:anchor="_Toc240922976" w:history="1">
+          <w:hyperlink w:anchor="_Toc240960496" w:history="1">
             <w:r>
               <w:rPr>
                 <w:rStyle w:val="Hyperlink"/>
@@ -725,7 +725,7 @@
               <w:rPr>
                 <w:noProof/>
               </w:rPr>
-              <w:instrText xml:space="preserve"> PAGEREF _Toc240922976 \h </w:instrText>
+              <w:instrText xml:space="preserve"> PAGEREF _Toc240960496 \h </w:instrText>
             </w:r>
             <w:r>
               <w:rPr>
@@ -768,7 +768,7 @@
               <w14:ligatures w14:val="standardContextual"/>
             </w:rPr>
           </w:pPr>
-          <w:hyperlink w:anchor="_Toc240922977" w:history="1">
+          <w:hyperlink w:anchor="_Toc240960497" w:history="1">
             <w:r>
               <w:rPr>
                 <w:rStyle w:val="Hyperlink"/>
@@ -792,7 +792,7 @@
               <w:rPr>
                 <w:noProof/>
               </w:rPr>
-              <w:instrText xml:space="preserve"> PAGEREF _Toc240922977 \h </w:instrText>
+              <w:instrText xml:space="preserve"> PAGEREF _Toc240960497 \h </w:instrText>
             </w:r>
             <w:r>
               <w:rPr>
@@ -835,7 +835,7 @@
               <w14:ligatures w14:val="standardContextual"/>
             </w:rPr>
           </w:pPr>
-          <w:hyperlink w:anchor="_Toc240922978" w:history="1">
+          <w:hyperlink w:anchor="_Toc240960498" w:history="1">
             <w:r>
               <w:rPr>
                 <w:rStyle w:val="Hyperlink"/>
@@ -859,7 +859,7 @@
               <w:rPr>
                 <w:noProof/>
               </w:rPr>
-              <w:instrText xml:space="preserve"> PAGEREF _Toc240922978 \h </w:instrText>
+              <w:instrText xml:space="preserve"> PAGEREF _Toc240960498 \h </w:instrText>
             </w:r>
             <w:r>
               <w:rPr>
@@ -902,7 +902,7 @@
               <w14:ligatures w14:val="standardContextual"/>
             </w:rPr>
           </w:pPr>
-          <w:hyperlink w:anchor="_Toc240922979" w:history="1">
+          <w:hyperlink w:anchor="_Toc240960499" w:history="1">
             <w:r>
               <w:rPr>
                 <w:rStyle w:val="Hyperlink"/>
@@ -926,7 +926,7 @@
               <w:rPr>
                 <w:noProof/>
               </w:rPr>
-              <w:instrText xml:space="preserve"> PAGEREF _Toc240922979 \h </w:instrText>
+              <w:instrText xml:space="preserve"> PAGEREF _Toc240960499 \h </w:instrText>
             </w:r>
             <w:r>
               <w:rPr>
@@ -969,7 +969,7 @@
               <w14:ligatures w14:val="standardContextual"/>
             </w:rPr>
           </w:pPr>
-          <w:hyperlink w:anchor="_Toc240922980" w:history="1">
+          <w:hyperlink w:anchor="_Toc240960500" w:history="1">
             <w:r>
               <w:rPr>
                 <w:rStyle w:val="Hyperlink"/>
@@ -993,7 +993,7 @@
               <w:rPr>
                 <w:noProof/>
               </w:rPr>
-              <w:instrText xml:space="preserve"> PAGEREF _Toc240922980 \h </w:instrText>
+              <w:instrText xml:space="preserve"> PAGEREF _Toc240960500 \h </w:instrText>
             </w:r>
             <w:r>
               <w:rPr>
@@ -1036,7 +1036,7 @@
               <w14:ligatures w14:val="standardContextual"/>
             </w:rPr>
           </w:pPr>
-          <w:hyperlink w:anchor="_Toc240922981" w:history="1">
+          <w:hyperlink w:anchor="_Toc240960501" w:history="1">
             <w:r>
               <w:rPr>
                 <w:rStyle w:val="Hyperlink"/>
@@ -1060,7 +1060,7 @@
               <w:rPr>
                 <w:noProof/>
               </w:rPr>
-              <w:instrText xml:space="preserve"> PAGEREF _Toc240922981 \h </w:instrText>
+              <w:instrText xml:space="preserve"> PAGEREF _Toc240960501 \h </w:instrText>
             </w:r>
             <w:r>
               <w:rPr>
@@ -1103,7 +1103,7 @@
               <w14:ligatures w14:val="standardContextual"/>
             </w:rPr>
           </w:pPr>
-          <w:hyperlink w:anchor="_Toc240922982" w:history="1">
+          <w:hyperlink w:anchor="_Toc240960502" w:history="1">
             <w:r>
               <w:rPr>
                 <w:rStyle w:val="Hyperlink"/>
@@ -1127,7 +1127,7 @@
               <w:rPr>
                 <w:noProof/>
               </w:rPr>
-              <w:instrText xml:space="preserve"> PAGEREF _Toc240922982 \h </w:instrText>
+              <w:instrText xml:space="preserve"> PAGEREF _Toc240960502 \h </w:instrText>
             </w:r>
             <w:r>
               <w:rPr>
@@ -1170,7 +1170,7 @@
               <w14:ligatures w14:val="standardContextual"/>
             </w:rPr>
           </w:pPr>
-          <w:hyperlink w:anchor="_Toc240922983" w:history="1">
+          <w:hyperlink w:anchor="_Toc240960503" w:history="1">
             <w:r>
               <w:rPr>
                 <w:rStyle w:val="Hyperlink"/>
@@ -1194,7 +1194,7 @@
               <w:rPr>
                 <w:noProof/>
               </w:rPr>
-              <w:instrText xml:space="preserve"> PAGEREF _Toc240922983 \h </w:instrText>
+              <w:instrText xml:space="preserve"> PAGEREF _Toc240960503 \h </w:instrText>
             </w:r>
             <w:r>
               <w:rPr>
@@ -1237,7 +1237,7 @@
               <w14:ligatures w14:val="standardContextual"/>
             </w:rPr>
           </w:pPr>
-          <w:hyperlink w:anchor="_Toc240922984" w:history="1">
+          <w:hyperlink w:anchor="_Toc240960504" w:history="1">
             <w:r>
               <w:rPr>
                 <w:rStyle w:val="Hyperlink"/>
@@ -1261,7 +1261,7 @@
               <w:rPr>
                 <w:noProof/>
               </w:rPr>
-              <w:instrText xml:space="preserve"> PAGEREF _Toc240922984 \h </w:instrText>
+              <w:instrText xml:space="preserve"> PAGEREF _Toc240960504 \h </w:instrText>
             </w:r>
             <w:r>
               <w:rPr>
@@ -1304,7 +1304,7 @@
               <w14:ligatures w14:val="standardContextual"/>
             </w:rPr>
           </w:pPr>
-          <w:hyperlink w:anchor="_Toc240922985" w:history="1">
+          <w:hyperlink w:anchor="_Toc240960505" w:history="1">
             <w:r>
               <w:rPr>
                 <w:rStyle w:val="Hyperlink"/>
@@ -1328,7 +1328,7 @@
               <w:rPr>
                 <w:noProof/>
               </w:rPr>
-              <w:instrText xml:space="preserve"> PAGEREF _Toc240922985 \h </w:instrText>
+              <w:instrText xml:space="preserve"> PAGEREF _Toc240960505 \h </w:instrText>
             </w:r>
             <w:r>
               <w:rPr>
@@ -1371,7 +1371,7 @@
               <w14:ligatures w14:val="standardContextual"/>
             </w:rPr>
           </w:pPr>
-          <w:hyperlink w:anchor="_Toc240922986" w:history="1">
+          <w:hyperlink w:anchor="_Toc240960506" w:history="1">
             <w:r>
               <w:rPr>
                 <w:rStyle w:val="Hyperlink"/>
@@ -1395,7 +1395,7 @@
               <w:rPr>
                 <w:noProof/>
               </w:rPr>
-              <w:instrText xml:space="preserve"> PAGEREF _Toc240922986 \h </w:instrText>
+              <w:instrText xml:space="preserve"> PAGEREF _Toc240960506 \h </w:instrText>
             </w:r>
             <w:r>
               <w:rPr>
@@ -1438,7 +1438,7 @@
               <w14:ligatures w14:val="standardContextual"/>
             </w:rPr>
           </w:pPr>
-          <w:hyperlink w:anchor="_Toc240922987" w:history="1">
+          <w:hyperlink w:anchor="_Toc240960507" w:history="1">
             <w:r>
               <w:rPr>
                 <w:rStyle w:val="Hyperlink"/>
@@ -1462,7 +1462,7 @@
               <w:rPr>
                 <w:noProof/>
               </w:rPr>
-              <w:instrText xml:space="preserve"> PAGEREF _Toc240922987 \h </w:instrText>
+              <w:instrText xml:space="preserve"> PAGEREF _Toc240960507 \h </w:instrText>
             </w:r>
             <w:r>
               <w:rPr>
@@ -1505,7 +1505,7 @@
               <w14:ligatures w14:val="standardContextual"/>
             </w:rPr>
           </w:pPr>
-          <w:hyperlink w:anchor="_Toc240922988" w:history="1">
+          <w:hyperlink w:anchor="_Toc240960508" w:history="1">
             <w:r>
               <w:rPr>
                 <w:rStyle w:val="Hyperlink"/>
@@ -1529,7 +1529,7 @@
               <w:rPr>
                 <w:noProof/>
               </w:rPr>
-              <w:instrText xml:space="preserve"> PAGEREF _Toc240922988 \h </w:instrText>
+              <w:instrText xml:space="preserve"> PAGEREF _Toc240960508 \h </w:instrText>
             </w:r>
             <w:r>
               <w:rPr>
@@ -1572,7 +1572,7 @@
               <w14:ligatures w14:val="standardContextual"/>
             </w:rPr>
           </w:pPr>
-          <w:hyperlink w:anchor="_Toc240922989" w:history="1">
+          <w:hyperlink w:anchor="_Toc240960509" w:history="1">
             <w:r>
               <w:rPr>
                 <w:rStyle w:val="Hyperlink"/>
@@ -1596,7 +1596,7 @@
               <w:rPr>
                 <w:noProof/>
               </w:rPr>
-              <w:instrText xml:space="preserve"> PAGEREF _Toc240922989 \h </w:instrText>
+              <w:instrText xml:space="preserve"> PAGEREF _Toc240960509 \h </w:instrText>
             </w:r>
             <w:r>
               <w:rPr>
@@ -1639,7 +1639,7 @@
               <w14:ligatures w14:val="standardContextual"/>
             </w:rPr>
           </w:pPr>
-          <w:hyperlink w:anchor="_Toc240922990" w:history="1">
+          <w:hyperlink w:anchor="_Toc240960510" w:history="1">
             <w:r>
               <w:rPr>
                 <w:rStyle w:val="Hyperlink"/>
@@ -1663,7 +1663,7 @@
               <w:rPr>
                 <w:noProof/>
               </w:rPr>
-              <w:instrText xml:space="preserve"> PAGEREF _Toc240922990 \h </w:instrText>
+              <w:instrText xml:space="preserve"> PAGEREF _Toc240960510 \h </w:instrText>
             </w:r>
             <w:r>
               <w:rPr>
@@ -1706,7 +1706,7 @@
               <w14:ligatures w14:val="standardContextual"/>
             </w:rPr>
           </w:pPr>
-          <w:hyperlink w:anchor="_Toc240922991" w:history="1">
+          <w:hyperlink w:anchor="_Toc240960511" w:history="1">
             <w:r>
               <w:rPr>
                 <w:rStyle w:val="Hyperlink"/>
@@ -1730,7 +1730,7 @@
               <w:rPr>
                 <w:noProof/>
               </w:rPr>
-              <w:instrText xml:space="preserve"> PAGEREF _Toc240922991 \h </w:instrText>
+              <w:instrText xml:space="preserve"> PAGEREF _Toc240960511 \h </w:instrText>
             </w:r>
             <w:r>
               <w:rPr>
@@ -1773,7 +1773,7 @@
               <w14:ligatures w14:val="standardContextual"/>
             </w:rPr>
           </w:pPr>
-          <w:hyperlink w:anchor="_Toc240922992" w:history="1">
+          <w:hyperlink w:anchor="_Toc240960512" w:history="1">
             <w:r>
               <w:rPr>
                 <w:rStyle w:val="Hyperlink"/>
@@ -1797,7 +1797,7 @@
               <w:rPr>
                 <w:noProof/>
               </w:rPr>
-              <w:instrText xml:space="preserve"> PAGEREF _Toc240922992 \h </w:instrText>
+              <w:instrText xml:space="preserve"> PAGEREF _Toc240960512 \h </w:instrText>
             </w:r>
             <w:r>
               <w:rPr>
@@ -1840,7 +1840,7 @@
               <w14:ligatures w14:val="standardContextual"/>
             </w:rPr>
           </w:pPr>
-          <w:hyperlink w:anchor="_Toc240922993" w:history="1">
+          <w:hyperlink w:anchor="_Toc240960513" w:history="1">
             <w:r>
               <w:rPr>
                 <w:rStyle w:val="Hyperlink"/>
@@ -1864,7 +1864,7 @@
               <w:rPr>
                 <w:noProof/>
               </w:rPr>
-              <w:instrText xml:space="preserve"> PAGEREF _Toc240922993 \h </w:instrText>
+              <w:instrText xml:space="preserve"> PAGEREF _Toc240960513 \h </w:instrText>
             </w:r>
             <w:r>
               <w:rPr>
@@ -1907,7 +1907,7 @@
               <w14:ligatures w14:val="standardContextual"/>
             </w:rPr>
           </w:pPr>
-          <w:hyperlink w:anchor="_Toc240922994" w:history="1">
+          <w:hyperlink w:anchor="_Toc240960514" w:history="1">
             <w:r>
               <w:rPr>
                 <w:rStyle w:val="Hyperlink"/>
@@ -1931,7 +1931,7 @@
               <w:rPr>
                 <w:noProof/>
               </w:rPr>
-              <w:instrText xml:space="preserve"> PAGEREF _Toc240922994 \h </w:instrText>
+              <w:instrText xml:space="preserve"> PAGEREF _Toc240960514 \h </w:instrText>
             </w:r>
             <w:r>
               <w:rPr>
@@ -1974,7 +1974,7 @@
               <w14:ligatures w14:val="standardContextual"/>
             </w:rPr>
           </w:pPr>
-          <w:hyperlink w:anchor="_Toc240922995" w:history="1">
+          <w:hyperlink w:anchor="_Toc240960515" w:history="1">
             <w:r>
               <w:rPr>
                 <w:rStyle w:val="Hyperlink"/>
@@ -1998,7 +1998,7 @@
               <w:rPr>
                 <w:noProof/>
               </w:rPr>
-              <w:instrText xml:space="preserve"> PAGEREF _Toc240922995 \h </w:instrText>
+              <w:instrText xml:space="preserve"> PAGEREF _Toc240960515 \h </w:instrText>
             </w:r>
             <w:r>
               <w:rPr>
@@ -2041,7 +2041,7 @@
               <w14:ligatures w14:val="standardContextual"/>
             </w:rPr>
           </w:pPr>
-          <w:hyperlink w:anchor="_Toc240922996" w:history="1">
+          <w:hyperlink w:anchor="_Toc240960516" w:history="1">
             <w:r>
               <w:rPr>
                 <w:rStyle w:val="Hyperlink"/>
@@ -2065,7 +2065,7 @@
               <w:rPr>
                 <w:noProof/>
               </w:rPr>
-              <w:instrText xml:space="preserve"> PAGEREF _Toc240922996 \h </w:instrText>
+              <w:instrText xml:space="preserve"> PAGEREF _Toc240960516 \h </w:instrText>
             </w:r>
             <w:r>
               <w:rPr>
@@ -2108,7 +2108,7 @@
               <w14:ligatures w14:val="standardContextual"/>
             </w:rPr>
           </w:pPr>
-          <w:hyperlink w:anchor="_Toc240922997" w:history="1">
+          <w:hyperlink w:anchor="_Toc240960517" w:history="1">
             <w:r>
               <w:rPr>
                 <w:rStyle w:val="Hyperlink"/>
@@ -2132,7 +2132,7 @@
               <w:rPr>
                 <w:noProof/>
               </w:rPr>
-              <w:instrText xml:space="preserve"> PAGEREF _Toc240922997 \h </w:instrText>
+              <w:instrText xml:space="preserve"> PAGEREF _Toc240960517 \h </w:instrText>
             </w:r>
             <w:r>
               <w:rPr>
@@ -2175,7 +2175,7 @@
               <w14:ligatures w14:val="standardContextual"/>
             </w:rPr>
           </w:pPr>
-          <w:hyperlink w:anchor="_Toc240922998" w:history="1">
+          <w:hyperlink w:anchor="_Toc240960518" w:history="1">
             <w:r>
               <w:rPr>
                 <w:rStyle w:val="Hyperlink"/>
@@ -2199,7 +2199,7 @@
               <w:rPr>
                 <w:noProof/>
               </w:rPr>
-              <w:instrText xml:space="preserve"> PAGEREF _Toc240922998 \h </w:instrText>
+              <w:instrText xml:space="preserve"> PAGEREF _Toc240960518 \h </w:instrText>
             </w:r>
             <w:r>
               <w:rPr>
@@ -2242,7 +2242,7 @@
               <w14:ligatures w14:val="standardContextual"/>
             </w:rPr>
           </w:pPr>
-          <w:hyperlink w:anchor="_Toc240922999" w:history="1">
+          <w:hyperlink w:anchor="_Toc240960519" w:history="1">
             <w:r>
               <w:rPr>
                 <w:rStyle w:val="Hyperlink"/>
@@ -2266,7 +2266,7 @@
               <w:rPr>
                 <w:noProof/>
               </w:rPr>
-              <w:instrText xml:space="preserve"> PAGEREF _Toc240922999 \h </w:instrText>
+              <w:instrText xml:space="preserve"> PAGEREF _Toc240960519 \h </w:instrText>
             </w:r>
             <w:r>
               <w:rPr>
@@ -2309,7 +2309,7 @@
               <w14:ligatures w14:val="standardContextual"/>
             </w:rPr>
           </w:pPr>
-          <w:hyperlink w:anchor="_Toc240923000" w:history="1">
+          <w:hyperlink w:anchor="_Toc240960520" w:history="1">
             <w:r>
               <w:rPr>
                 <w:rStyle w:val="Hyperlink"/>
@@ -2333,7 +2333,7 @@
               <w:rPr>
                 <w:noProof/>
               </w:rPr>
-              <w:instrText xml:space="preserve"> PAGEREF _Toc240923000 \h </w:instrText>
+              <w:instrText xml:space="preserve"> PAGEREF _Toc240960520 \h </w:instrText>
             </w:r>
             <w:r>
               <w:rPr>
@@ -2376,7 +2376,7 @@
               <w14:ligatures w14:val="standardContextual"/>
             </w:rPr>
           </w:pPr>
-          <w:hyperlink w:anchor="_Toc240923001" w:history="1">
+          <w:hyperlink w:anchor="_Toc240960521" w:history="1">
             <w:r>
               <w:rPr>
                 <w:rStyle w:val="Hyperlink"/>
@@ -2400,7 +2400,7 @@
               <w:rPr>
                 <w:noProof/>
               </w:rPr>
-              <w:instrText xml:space="preserve"> PAGEREF _Toc240923001 \h </w:instrText>
+              <w:instrText xml:space="preserve"> PAGEREF _Toc240960521 \h </w:instrText>
             </w:r>
             <w:r>
               <w:rPr>
@@ -2443,7 +2443,7 @@
               <w14:ligatures w14:val="standardContextual"/>
             </w:rPr>
           </w:pPr>
-          <w:hyperlink w:anchor="_Toc240923002" w:history="1">
+          <w:hyperlink w:anchor="_Toc240960522" w:history="1">
             <w:r>
               <w:rPr>
                 <w:rStyle w:val="Hyperlink"/>
@@ -2467,7 +2467,7 @@
               <w:rPr>
                 <w:noProof/>
               </w:rPr>
-              <w:instrText xml:space="preserve"> PAGEREF _Toc240923002 \h </w:instrText>
+              <w:instrText xml:space="preserve"> PAGEREF _Toc240960522 \h </w:instrText>
             </w:r>
             <w:r>
               <w:rPr>
@@ -2510,7 +2510,7 @@
               <w14:ligatures w14:val="standardContextual"/>
             </w:rPr>
           </w:pPr>
-          <w:hyperlink w:anchor="_Toc240923003" w:history="1">
+          <w:hyperlink w:anchor="_Toc240960523" w:history="1">
             <w:r>
               <w:rPr>
                 <w:rStyle w:val="Hyperlink"/>
@@ -2534,7 +2534,7 @@
               <w:rPr>
                 <w:noProof/>
               </w:rPr>
-              <w:instrText xml:space="preserve"> PAGEREF _Toc240923003 \h </w:instrText>
+              <w:instrText xml:space="preserve"> PAGEREF _Toc240960523 \h </w:instrText>
             </w:r>
             <w:r>
               <w:rPr>
@@ -2577,7 +2577,7 @@
               <w14:ligatures w14:val="standardContextual"/>
             </w:rPr>
           </w:pPr>
-          <w:hyperlink w:anchor="_Toc240923004" w:history="1">
+          <w:hyperlink w:anchor="_Toc240960524" w:history="1">
             <w:r>
               <w:rPr>
                 <w:rStyle w:val="Hyperlink"/>
@@ -2601,7 +2601,7 @@
               <w:rPr>
                 <w:noProof/>
               </w:rPr>
-              <w:instrText xml:space="preserve"> PAGEREF _Toc240923004 \h </w:instrText>
+              <w:instrText xml:space="preserve"> PAGEREF _Toc240960524 \h </w:instrText>
             </w:r>
             <w:r>
               <w:rPr>
@@ -2644,7 +2644,7 @@
               <w14:ligatures w14:val="standardContextual"/>
             </w:rPr>
           </w:pPr>
-          <w:hyperlink w:anchor="_Toc240923005" w:history="1">
+          <w:hyperlink w:anchor="_Toc240960525" w:history="1">
             <w:r>
               <w:rPr>
                 <w:rStyle w:val="Hyperlink"/>
@@ -2668,7 +2668,7 @@
               <w:rPr>
                 <w:noProof/>
               </w:rPr>
-              <w:instrText xml:space="preserve"> PAGEREF _Toc240923005 \h </w:instrText>
+              <w:instrText xml:space="preserve"> PAGEREF _Toc240960525 \h </w:instrText>
             </w:r>
             <w:r>
               <w:rPr>
@@ -2711,7 +2711,7 @@
               <w14:ligatures w14:val="standardContextual"/>
             </w:rPr>
           </w:pPr>
-          <w:hyperlink w:anchor="_Toc240923006" w:history="1">
+          <w:hyperlink w:anchor="_Toc240960526" w:history="1">
             <w:r>
               <w:rPr>
                 <w:rStyle w:val="Hyperlink"/>
@@ -2735,7 +2735,7 @@
               <w:rPr>
                 <w:noProof/>
               </w:rPr>
-              <w:instrText xml:space="preserve"> PAGEREF _Toc240923006 \h </w:instrText>
+              <w:instrText xml:space="preserve"> PAGEREF _Toc240960526 \h </w:instrText>
             </w:r>
             <w:r>
               <w:rPr>
@@ -2778,7 +2778,7 @@
               <w14:ligatures w14:val="standardContextual"/>
             </w:rPr>
           </w:pPr>
-          <w:hyperlink w:anchor="_Toc240923007" w:history="1">
+          <w:hyperlink w:anchor="_Toc240960527" w:history="1">
             <w:r>
               <w:rPr>
                 <w:rStyle w:val="Hyperlink"/>
@@ -2802,7 +2802,7 @@
               <w:rPr>
                 <w:noProof/>
               </w:rPr>
-              <w:instrText xml:space="preserve"> PAGEREF _Toc240923007 \h </w:instrText>
+              <w:instrText xml:space="preserve"> PAGEREF _Toc240960527 \h </w:instrText>
             </w:r>
             <w:r>
               <w:rPr>
@@ -2845,7 +2845,7 @@
               <w14:ligatures w14:val="standardContextual"/>
             </w:rPr>
           </w:pPr>
-          <w:hyperlink w:anchor="_Toc240923008" w:history="1">
+          <w:hyperlink w:anchor="_Toc240960528" w:history="1">
             <w:r>
               <w:rPr>
                 <w:rStyle w:val="Hyperlink"/>
@@ -2869,7 +2869,7 @@
               <w:rPr>
                 <w:noProof/>
               </w:rPr>
-              <w:instrText xml:space="preserve"> PAGEREF _Toc240923008 \h </w:instrText>
+              <w:instrText xml:space="preserve"> PAGEREF _Toc240960528 \h </w:instrText>
             </w:r>
             <w:r>
               <w:rPr>
@@ -2912,7 +2912,7 @@
               <w14:ligatures w14:val="standardContextual"/>
             </w:rPr>
           </w:pPr>
-          <w:hyperlink w:anchor="_Toc240923009" w:history="1">
+          <w:hyperlink w:anchor="_Toc240960529" w:history="1">
             <w:r>
               <w:rPr>
                 <w:rStyle w:val="Hyperlink"/>
@@ -2936,7 +2936,7 @@
               <w:rPr>
                 <w:noProof/>
               </w:rPr>
-              <w:instrText xml:space="preserve"> PAGEREF _Toc240923009 \h </w:instrText>
+              <w:instrText xml:space="preserve"> PAGEREF _Toc240960529 \h </w:instrText>
             </w:r>
             <w:r>
               <w:rPr>
@@ -2979,7 +2979,7 @@
               <w14:ligatures w14:val="standardContextual"/>
             </w:rPr>
           </w:pPr>
-          <w:hyperlink w:anchor="_Toc240923010" w:history="1">
+          <w:hyperlink w:anchor="_Toc240960530" w:history="1">
             <w:r>
               <w:rPr>
                 <w:rStyle w:val="Hyperlink"/>
@@ -3003,7 +3003,7 @@
               <w:rPr>
                 <w:noProof/>
               </w:rPr>
-              <w:instrText xml:space="preserve"> PAGEREF _Toc240923010 \h </w:instrText>
+              <w:instrText xml:space="preserve"> PAGEREF _Toc240960530 \h </w:instrText>
             </w:r>
             <w:r>
               <w:rPr>
@@ -3046,7 +3046,7 @@
               <w14:ligatures w14:val="standardContextual"/>
             </w:rPr>
           </w:pPr>
-          <w:hyperlink w:anchor="_Toc240923011" w:history="1">
+          <w:hyperlink w:anchor="_Toc240960531" w:history="1">
             <w:r>
               <w:rPr>
                 <w:rStyle w:val="Hyperlink"/>
@@ -3070,7 +3070,7 @@
               <w:rPr>
                 <w:noProof/>
               </w:rPr>
-              <w:instrText xml:space="preserve"> PAGEREF _Toc240923011 \h </w:instrText>
+              <w:instrText xml:space="preserve"> PAGEREF _Toc240960531 \h </w:instrText>
             </w:r>
             <w:r>
               <w:rPr>
@@ -3113,7 +3113,7 @@
               <w14:ligatures w14:val="standardContextual"/>
             </w:rPr>
           </w:pPr>
-          <w:hyperlink w:anchor="_Toc240923012" w:history="1">
+          <w:hyperlink w:anchor="_Toc240960532" w:history="1">
             <w:r>
               <w:rPr>
                 <w:rStyle w:val="Hyperlink"/>
@@ -3137,7 +3137,7 @@
               <w:rPr>
                 <w:noProof/>
               </w:rPr>
-              <w:instrText xml:space="preserve"> PAGEREF _Toc240923012 \h </w:instrText>
+              <w:instrText xml:space="preserve"> PAGEREF _Toc240960532 \h </w:instrText>
             </w:r>
             <w:r>
               <w:rPr>
@@ -3180,7 +3180,7 @@
               <w14:ligatures w14:val="standardContextual"/>
             </w:rPr>
           </w:pPr>
-          <w:hyperlink w:anchor="_Toc240923013" w:history="1">
+          <w:hyperlink w:anchor="_Toc240960533" w:history="1">
             <w:r>
               <w:rPr>
                 <w:rStyle w:val="Hyperlink"/>
@@ -3204,7 +3204,7 @@
               <w:rPr>
                 <w:noProof/>
               </w:rPr>
-              <w:instrText xml:space="preserve"> PAGEREF _Toc240923013 \h </w:instrText>
+              <w:instrText xml:space="preserve"> PAGEREF _Toc240960533 \h </w:instrText>
             </w:r>
             <w:r>
               <w:rPr>
@@ -3247,7 +3247,7 @@
               <w14:ligatures w14:val="standardContextual"/>
             </w:rPr>
           </w:pPr>
-          <w:hyperlink w:anchor="_Toc240923014" w:history="1">
+          <w:hyperlink w:anchor="_Toc240960534" w:history="1">
             <w:r>
               <w:rPr>
                 <w:rStyle w:val="Hyperlink"/>
@@ -3271,7 +3271,7 @@
               <w:rPr>
                 <w:noProof/>
               </w:rPr>
-              <w:instrText xml:space="preserve"> PAGEREF _Toc240923014 \h </w:instrText>
+              <w:instrText xml:space="preserve"> PAGEREF _Toc240960534 \h </w:instrText>
             </w:r>
             <w:r>
               <w:rPr>
@@ -3310,7 +3310,7 @@
         <w:pStyle w:val="Heading1"/>
         <w:pageBreakBefore/>
       </w:pPr>
-      <w:bookmarkStart w:id="0" w:name="_Toc240922974"/>
+      <w:bookmarkStart w:id="0" w:name="_Toc240960494"/>
       <w:r>
         <w:lastRenderedPageBreak/>
         <w:t>1. About this reference</w:t>
@@ -3763,7 +3763,7 @@
         <w:pStyle w:val="Heading1"/>
         <w:pageBreakBefore/>
       </w:pPr>
-      <w:bookmarkStart w:id="1" w:name="_Toc240922975"/>
+      <w:bookmarkStart w:id="1" w:name="_Toc240960495"/>
       <w:r>
         <w:lastRenderedPageBreak/>
         <w:t>2. Rules that apply on every screen</w:t>
@@ -3980,7 +3980,7 @@
         <w:pStyle w:val="Heading1"/>
         <w:pageBreakBefore/>
       </w:pPr>
-      <w:bookmarkStart w:id="2" w:name="_Toc240922976"/>
+      <w:bookmarkStart w:id="2" w:name="_Toc240960496"/>
       <w:r>
         <w:lastRenderedPageBreak/>
         <w:t>3. Who can open which screen</w:t>
@@ -9508,7 +9508,7 @@
         <w:pStyle w:val="Heading1"/>
         <w:pageBreakBefore/>
       </w:pPr>
-      <w:bookmarkStart w:id="3" w:name="_Toc240922977"/>
+      <w:bookmarkStart w:id="3" w:name="_Toc240960497"/>
       <w:r>
         <w:lastRenderedPageBreak/>
         <w:t>4. Signing in and your account</w:t>
@@ -9519,7 +9519,7 @@
       <w:pPr>
         <w:pStyle w:val="Heading2"/>
       </w:pPr>
-      <w:bookmarkStart w:id="4" w:name="_Toc240922978"/>
+      <w:bookmarkStart w:id="4" w:name="_Toc240960498"/>
       <w:r>
         <w:t>4.1 Sign in</w:t>
       </w:r>
@@ -10032,7 +10032,7 @@
       <w:pPr>
         <w:pStyle w:val="Heading2"/>
       </w:pPr>
-      <w:bookmarkStart w:id="5" w:name="_Toc240922979"/>
+      <w:bookmarkStart w:id="5" w:name="_Toc240960499"/>
       <w:r>
         <w:t>4.2 The header and menu bar (every screen)</w:t>
       </w:r>
@@ -10755,7 +10755,7 @@
       <w:pPr>
         <w:pStyle w:val="Heading2"/>
       </w:pPr>
-      <w:bookmarkStart w:id="6" w:name="_Toc240922980"/>
+      <w:bookmarkStart w:id="6" w:name="_Toc240960500"/>
       <w:r>
         <w:lastRenderedPageBreak/>
         <w:t>4.3 Change Password</w:t>
@@ -11377,7 +11377,7 @@
         <w:pStyle w:val="Heading1"/>
         <w:pageBreakBefore/>
       </w:pPr>
-      <w:bookmarkStart w:id="7" w:name="_Toc240922981"/>
+      <w:bookmarkStart w:id="7" w:name="_Toc240960501"/>
       <w:r>
         <w:lastRenderedPageBreak/>
         <w:t>5. Dashboards and Reports (read-only)</w:t>
@@ -11388,7 +11388,7 @@
       <w:pPr>
         <w:pStyle w:val="Heading2"/>
       </w:pPr>
-      <w:bookmarkStart w:id="8" w:name="_Toc240922982"/>
+      <w:bookmarkStart w:id="8" w:name="_Toc240960502"/>
       <w:r>
         <w:t>5.1 Executive Dashboard</w:t>
       </w:r>
@@ -11901,7 +11901,7 @@
       <w:pPr>
         <w:pStyle w:val="Heading2"/>
       </w:pPr>
-      <w:bookmarkStart w:id="9" w:name="_Toc240922983"/>
+      <w:bookmarkStart w:id="9" w:name="_Toc240960503"/>
       <w:r>
         <w:t>5.2 Sampling Dashboard</w:t>
       </w:r>
@@ -12414,7 +12414,7 @@
       <w:pPr>
         <w:pStyle w:val="Heading2"/>
       </w:pPr>
-      <w:bookmarkStart w:id="10" w:name="_Toc240922984"/>
+      <w:bookmarkStart w:id="10" w:name="_Toc240960504"/>
       <w:r>
         <w:t>5.3 Contact Dashboard</w:t>
       </w:r>
@@ -12718,7 +12718,7 @@
       <w:pPr>
         <w:pStyle w:val="Heading2"/>
       </w:pPr>
-      <w:bookmarkStart w:id="11" w:name="_Toc240922985"/>
+      <w:bookmarkStart w:id="11" w:name="_Toc240960505"/>
       <w:r>
         <w:t>5.4 QA Dashboard</w:t>
       </w:r>
@@ -13338,7 +13338,7 @@
       <w:pPr>
         <w:pStyle w:val="Heading2"/>
       </w:pPr>
-      <w:bookmarkStart w:id="12" w:name="_Toc240922986"/>
+      <w:bookmarkStart w:id="12" w:name="_Toc240960506"/>
       <w:r>
         <w:t>5.5 KII / Document Dashboard</w:t>
       </w:r>
@@ -13748,7 +13748,7 @@
       <w:pPr>
         <w:pStyle w:val="Heading2"/>
       </w:pPr>
-      <w:bookmarkStart w:id="13" w:name="_Toc240922987"/>
+      <w:bookmarkStart w:id="13" w:name="_Toc240960507"/>
       <w:r>
         <w:lastRenderedPageBreak/>
         <w:t>5.6 Reports</w:t>
@@ -14263,7 +14263,7 @@
         <w:pStyle w:val="Heading1"/>
         <w:pageBreakBefore/>
       </w:pPr>
-      <w:bookmarkStart w:id="14" w:name="_Toc240922988"/>
+      <w:bookmarkStart w:id="14" w:name="_Toc240960508"/>
       <w:r>
         <w:lastRenderedPageBreak/>
         <w:t>6. The sample and contact</w:t>
@@ -14274,7 +14274,7 @@
       <w:pPr>
         <w:pStyle w:val="Heading2"/>
       </w:pPr>
-      <w:bookmarkStart w:id="15" w:name="_Toc240922989"/>
+      <w:bookmarkStart w:id="15" w:name="_Toc240960509"/>
       <w:r>
         <w:t>6.1 Main-400 Register (and Reserve)</w:t>
       </w:r>
@@ -15207,7 +15207,7 @@
       <w:pPr>
         <w:pStyle w:val="Heading2"/>
       </w:pPr>
-      <w:bookmarkStart w:id="16" w:name="_Toc240922990"/>
+      <w:bookmarkStart w:id="16" w:name="_Toc240960510"/>
       <w:r>
         <w:t>6.2 Case page</w:t>
       </w:r>
@@ -16886,7 +16886,7 @@
       <w:pPr>
         <w:pStyle w:val="Heading2"/>
       </w:pPr>
-      <w:bookmarkStart w:id="17" w:name="_Toc240922991"/>
+      <w:bookmarkStart w:id="17" w:name="_Toc240960511"/>
       <w:r>
         <w:t>6.3 Pre-Interview Profile (PROIT) and its review screen</w:t>
       </w:r>
@@ -18451,7 +18451,7 @@
       <w:pPr>
         <w:pStyle w:val="Heading2"/>
       </w:pPr>
-      <w:bookmarkStart w:id="18" w:name="_Toc240922992"/>
+      <w:bookmarkStart w:id="18" w:name="_Toc240960512"/>
       <w:r>
         <w:t>6.4 Interview sheet (verifying a locked profile)</w:t>
       </w:r>
@@ -19709,7 +19709,7 @@
       <w:pPr>
         <w:pStyle w:val="Heading2"/>
       </w:pPr>
-      <w:bookmarkStart w:id="19" w:name="_Toc240922993"/>
+      <w:bookmarkStart w:id="19" w:name="_Toc240960513"/>
       <w:r>
         <w:t>6.5 Register Organisation</w:t>
       </w:r>
@@ -20432,7 +20432,7 @@
       <w:pPr>
         <w:pStyle w:val="Heading2"/>
       </w:pPr>
-      <w:bookmarkStart w:id="20" w:name="_Toc240922994"/>
+      <w:bookmarkStart w:id="20" w:name="_Toc240960514"/>
       <w:r>
         <w:t>6.6 Appointment Queue</w:t>
       </w:r>
@@ -21053,7 +21053,7 @@
       <w:pPr>
         <w:pStyle w:val="Heading2"/>
       </w:pPr>
-      <w:bookmarkStart w:id="21" w:name="_Toc240922995"/>
+      <w:bookmarkStart w:id="21" w:name="_Toc240960515"/>
       <w:r>
         <w:t>6.7 Follow-ups due</w:t>
       </w:r>
@@ -21566,7 +21566,7 @@
       <w:pPr>
         <w:pStyle w:val="Heading2"/>
       </w:pPr>
-      <w:bookmarkStart w:id="22" w:name="_Toc240922996"/>
+      <w:bookmarkStart w:id="22" w:name="_Toc240960516"/>
       <w:r>
         <w:t>6.8 Reserve Activation</w:t>
       </w:r>
@@ -22188,7 +22188,7 @@
         <w:pStyle w:val="Heading1"/>
         <w:pageBreakBefore/>
       </w:pPr>
-      <w:bookmarkStart w:id="23" w:name="_Toc240922997"/>
+      <w:bookmarkStart w:id="23" w:name="_Toc240960517"/>
       <w:r>
         <w:lastRenderedPageBreak/>
         <w:t>7. Quality checking</w:t>
@@ -22199,7 +22199,7 @@
       <w:pPr>
         <w:pStyle w:val="Heading2"/>
       </w:pPr>
-      <w:bookmarkStart w:id="24" w:name="_Toc240922998"/>
+      <w:bookmarkStart w:id="24" w:name="_Toc240960518"/>
       <w:r>
         <w:t>7.1 QA Queue (with the KoboToolbox sync panel)</w:t>
       </w:r>
@@ -22922,7 +22922,7 @@
       <w:pPr>
         <w:pStyle w:val="Heading2"/>
       </w:pPr>
-      <w:bookmarkStart w:id="25" w:name="_Toc240922999"/>
+      <w:bookmarkStart w:id="25" w:name="_Toc240960519"/>
       <w:r>
         <w:t>7.2 QA Exceptions</w:t>
       </w:r>
@@ -23754,7 +23754,7 @@
         <w:pStyle w:val="Heading1"/>
         <w:pageBreakBefore/>
       </w:pPr>
-      <w:bookmarkStart w:id="26" w:name="_Toc240923000"/>
+      <w:bookmarkStart w:id="26" w:name="_Toc240960520"/>
       <w:r>
         <w:lastRenderedPageBreak/>
         <w:t>8. Key Informant Interviews</w:t>
@@ -23765,7 +23765,7 @@
       <w:pPr>
         <w:pStyle w:val="Heading2"/>
       </w:pPr>
-      <w:bookmarkStart w:id="27" w:name="_Toc240923001"/>
+      <w:bookmarkStart w:id="27" w:name="_Toc240960521"/>
       <w:r>
         <w:t>8.1 KII Register</w:t>
       </w:r>
@@ -24385,7 +24385,7 @@
       <w:pPr>
         <w:pStyle w:val="Heading2"/>
       </w:pPr>
-      <w:bookmarkStart w:id="28" w:name="_Toc240923002"/>
+      <w:bookmarkStart w:id="28" w:name="_Toc240960522"/>
       <w:r>
         <w:t>8.2 New KII Record</w:t>
       </w:r>
@@ -24795,7 +24795,7 @@
       <w:pPr>
         <w:pStyle w:val="Heading2"/>
       </w:pPr>
-      <w:bookmarkStart w:id="29" w:name="_Toc240923003"/>
+      <w:bookmarkStart w:id="29" w:name="_Toc240960523"/>
       <w:r>
         <w:t>8.3 KII record</w:t>
       </w:r>
@@ -25837,7 +25837,7 @@
         <w:pStyle w:val="Heading1"/>
         <w:pageBreakBefore/>
       </w:pPr>
-      <w:bookmarkStart w:id="30" w:name="_Toc240923004"/>
+      <w:bookmarkStart w:id="30" w:name="_Toc240960524"/>
       <w:r>
         <w:lastRenderedPageBreak/>
         <w:t>9. Documentary evidence</w:t>
@@ -25848,7 +25848,7 @@
       <w:pPr>
         <w:pStyle w:val="Heading2"/>
       </w:pPr>
-      <w:bookmarkStart w:id="31" w:name="_Toc240923005"/>
+      <w:bookmarkStart w:id="31" w:name="_Toc240960525"/>
       <w:r>
         <w:t>9.1 Documents (the corpus)</w:t>
       </w:r>
@@ -26468,7 +26468,7 @@
       <w:pPr>
         <w:pStyle w:val="Heading2"/>
       </w:pPr>
-      <w:bookmarkStart w:id="32" w:name="_Toc240923006"/>
+      <w:bookmarkStart w:id="32" w:name="_Toc240960526"/>
       <w:r>
         <w:t>9.2 New Documentary Evidence Record</w:t>
       </w:r>
@@ -27299,7 +27299,7 @@
       <w:pPr>
         <w:pStyle w:val="Heading2"/>
       </w:pPr>
-      <w:bookmarkStart w:id="33" w:name="_Toc240923007"/>
+      <w:bookmarkStart w:id="33" w:name="_Toc240960527"/>
       <w:r>
         <w:t>9.3 Document record</w:t>
       </w:r>
@@ -28653,7 +28653,7 @@
       <w:pPr>
         <w:pStyle w:val="Heading2"/>
       </w:pPr>
-      <w:bookmarkStart w:id="34" w:name="_Toc240923008"/>
+      <w:bookmarkStart w:id="34" w:name="_Toc240960528"/>
       <w:r>
         <w:t>9.4 Auto-fill review screen</w:t>
       </w:r>
@@ -29695,7 +29695,7 @@
         <w:pStyle w:val="Heading1"/>
         <w:pageBreakBefore/>
       </w:pPr>
-      <w:bookmarkStart w:id="35" w:name="_Toc240923009"/>
+      <w:bookmarkStart w:id="35" w:name="_Toc240960529"/>
       <w:r>
         <w:lastRenderedPageBreak/>
         <w:t>10. Completed forms and exports</w:t>
@@ -29706,7 +29706,7 @@
       <w:pPr>
         <w:pStyle w:val="Heading2"/>
       </w:pPr>
-      <w:bookmarkStart w:id="36" w:name="_Toc240923010"/>
+      <w:bookmarkStart w:id="36" w:name="_Toc240960530"/>
       <w:r>
         <w:t>10.1 Completed forms (Form PDFs)</w:t>
       </w:r>
@@ -30972,7 +30972,7 @@
         <w:pStyle w:val="Heading1"/>
         <w:pageBreakBefore/>
       </w:pPr>
-      <w:bookmarkStart w:id="37" w:name="_Toc240923011"/>
+      <w:bookmarkStart w:id="37" w:name="_Toc240960531"/>
       <w:r>
         <w:lastRenderedPageBreak/>
         <w:t>11. Study administration</w:t>
@@ -30983,7 +30983,7 @@
       <w:pPr>
         <w:pStyle w:val="Heading2"/>
       </w:pPr>
-      <w:bookmarkStart w:id="38" w:name="_Toc240923012"/>
+      <w:bookmarkStart w:id="38" w:name="_Toc240960532"/>
       <w:r>
         <w:t>11.1 Cost Dashboard</w:t>
       </w:r>
@@ -31393,7 +31393,7 @@
       <w:pPr>
         <w:pStyle w:val="Heading2"/>
       </w:pPr>
-      <w:bookmarkStart w:id="39" w:name="_Toc240923013"/>
+      <w:bookmarkStart w:id="39" w:name="_Toc240960533"/>
       <w:r>
         <w:t>11.2 Audit Log</w:t>
       </w:r>
@@ -31803,7 +31803,7 @@
       <w:pPr>
         <w:pStyle w:val="Heading2"/>
       </w:pPr>
-      <w:bookmarkStart w:id="40" w:name="_Toc240923014"/>
+      <w:bookmarkStart w:id="40" w:name="_Toc240960534"/>
       <w:r>
         <w:t>11.3 Export</w:t>
       </w:r>
@@ -32361,7 +32361,7 @@
         <w:sz w:val="16"/>
         <w:szCs w:val="16"/>
       </w:rPr>
-      <w:t>Version 1.8 · 21 September 2026</w:t>
+      <w:t>Version 1.9 · 22 September 2026</w:t>
     </w:r>
     <w:r>
       <w:rPr>
@@ -32534,10 +32534,10 @@
 <file path=word/numbering.xml><?xml version="1.0" encoding="utf-8"?>
 <w:numbering xmlns:wpc="http://schemas.microsoft.com/office/word/2010/wordprocessingCanvas" xmlns:cx="http://schemas.microsoft.com/office/drawing/2014/chartex" xmlns:cx1="http://schemas.microsoft.com/office/drawing/2015/9/8/chartex" xmlns:cx2="http://schemas.microsoft.com/office/drawing/2015/10/21/chartex" xmlns:cx3="http://schemas.microsoft.com/office/drawing/2016/5/9/chartex" xmlns:cx4="http://schemas.microsoft.com/office/drawing/2016/5/10/chartex" xmlns:cx5="http://schemas.microsoft.com/office/drawing/2016/5/11/chartex" xmlns:cx6="http://schemas.microsoft.com/office/drawing/2016/5/12/chartex" xmlns:cx7="http://schemas.microsoft.com/office/drawing/2016/5/13/chartex" xmlns:cx8="http://schemas.microsoft.com/office/drawing/2016/5/14/chartex" xmlns:mc="http://schemas.openxmlformats.org/markup-compatibility/2006" xmlns:aink="http://schemas.microsoft.com/office/drawing/2016/ink" xmlns:am3d="http://schemas.microsoft.com/office/drawing/2017/model3d" xmlns:o="urn:schemas-microsoft-com:office:office" xmlns:oel="http://schemas.microsoft.com/office/2019/extlst" xmlns:r="http://schemas.openxmlformats.org/officeDocument/2006/relationships" xmlns:m="http://schemas.openxmlformats.org/officeDocument/2006/math" xmlns:v="urn:schemas-microsoft-com:vml" xmlns:wp14="http://schemas.microsoft.com/office/word/2010/wordprocessingDrawing" xmlns:wp="http://schemas.openxmlformats.org/drawingml/2006/wordprocessingDrawing" xmlns:w10="urn:schemas-microsoft-com:office:word" xmlns:w="http://schemas.openxmlformats.org/wordprocessingml/2006/main" xmlns:w14="http://schemas.microsoft.com/office/word/2010/wordml" xmlns:w15="http://schemas.microsoft.com/office/word/2012/wordml" xmlns:w16cex="http://schemas.microsoft.com/office/word/2018/wordml/cex" xmlns:w16cid="http://schemas.microsoft.com/office/word/2016/wordml/cid" xmlns:w16="http://schemas.microsoft.com/office/word/2018/wordml" xmlns:w16sdtdh="http://schemas.microsoft.com/office/word/2020/wordml/sdtdatahash" xmlns:w16se="http://schemas.microsoft.com/office/word/2015/wordml/symex" xmlns:wpg="http://schemas.microsoft.com/office/word/2010/wordprocessingGroup" xmlns:wpi="http://schemas.microsoft.com/office/word/2010/wordprocessingInk" xmlns:wne="http://schemas.microsoft.com/office/word/2006/wordml" xmlns:wps="http://schemas.microsoft.com/office/word/2010/wordprocessingShape" mc:Ignorable="w14 w15 w16se w16cid w16 w16cex w16sdtdh wp14">
   <w:abstractNum w:abstractNumId="0" w15:restartNumberingAfterBreak="0">
-    <w:nsid w:val="37F874D3"/>
+    <w:nsid w:val="0AEE028C"/>
     <w:multiLevelType w:val="hybridMultilevel"/>
-    <w:tmpl w:val="4AB0942E"/>
-    <w:lvl w:ilvl="0" w:tplc="0CE40CCC">
+    <w:tmpl w:val="D8E422FE"/>
+    <w:lvl w:ilvl="0" w:tplc="C10C94FE">
       <w:start w:val="1"/>
       <w:numFmt w:val="bullet"/>
       <w:lvlText w:val="•"/>
@@ -32546,7 +32546,7 @@
         <w:ind w:left="460" w:hanging="280"/>
       </w:pPr>
     </w:lvl>
-    <w:lvl w:ilvl="1" w:tplc="7284C808">
+    <w:lvl w:ilvl="1" w:tplc="5F42D324">
       <w:start w:val="1"/>
       <w:numFmt w:val="bullet"/>
       <w:lvlText w:val="–"/>
@@ -32555,47 +32555,47 @@
         <w:ind w:left="900" w:hanging="280"/>
       </w:pPr>
     </w:lvl>
-    <w:lvl w:ilvl="2" w:tplc="91B66B96">
+    <w:lvl w:ilvl="2" w:tplc="B1FED36C">
       <w:numFmt w:val="decimal"/>
       <w:lvlText w:val=""/>
       <w:lvlJc w:val="left"/>
     </w:lvl>
-    <w:lvl w:ilvl="3" w:tplc="C5246BB4">
+    <w:lvl w:ilvl="3" w:tplc="7DA6B758">
       <w:numFmt w:val="decimal"/>
       <w:lvlText w:val=""/>
       <w:lvlJc w:val="left"/>
     </w:lvl>
-    <w:lvl w:ilvl="4" w:tplc="3B84BC3A">
+    <w:lvl w:ilvl="4" w:tplc="2F3208C6">
       <w:numFmt w:val="decimal"/>
       <w:lvlText w:val=""/>
       <w:lvlJc w:val="left"/>
     </w:lvl>
-    <w:lvl w:ilvl="5" w:tplc="8366552E">
+    <w:lvl w:ilvl="5" w:tplc="EB7A3E72">
       <w:numFmt w:val="decimal"/>
       <w:lvlText w:val=""/>
       <w:lvlJc w:val="left"/>
     </w:lvl>
-    <w:lvl w:ilvl="6" w:tplc="3B0A51B6">
+    <w:lvl w:ilvl="6" w:tplc="F398AACE">
       <w:numFmt w:val="decimal"/>
       <w:lvlText w:val=""/>
       <w:lvlJc w:val="left"/>
     </w:lvl>
-    <w:lvl w:ilvl="7" w:tplc="2272CD70">
+    <w:lvl w:ilvl="7" w:tplc="24DEABCE">
       <w:numFmt w:val="decimal"/>
       <w:lvlText w:val=""/>
       <w:lvlJc w:val="left"/>
     </w:lvl>
-    <w:lvl w:ilvl="8" w:tplc="D1DA2E40">
+    <w:lvl w:ilvl="8" w:tplc="8C9CD3EE">
       <w:numFmt w:val="decimal"/>
       <w:lvlText w:val=""/>
       <w:lvlJc w:val="left"/>
     </w:lvl>
   </w:abstractNum>
   <w:abstractNum w:abstractNumId="1" w15:restartNumberingAfterBreak="0">
-    <w:nsid w:val="536B05E1"/>
+    <w:nsid w:val="53E25176"/>
     <w:multiLevelType w:val="hybridMultilevel"/>
-    <w:tmpl w:val="85687EAA"/>
-    <w:lvl w:ilvl="0" w:tplc="C36E00C6">
+    <w:tmpl w:val="CB54D056"/>
+    <w:lvl w:ilvl="0" w:tplc="E916A970">
       <w:start w:val="1"/>
       <w:numFmt w:val="bullet"/>
       <w:lvlText w:val="●"/>
@@ -32604,7 +32604,7 @@
         <w:ind w:left="720" w:hanging="360"/>
       </w:pPr>
     </w:lvl>
-    <w:lvl w:ilvl="1" w:tplc="FFBEC696">
+    <w:lvl w:ilvl="1" w:tplc="A0009976">
       <w:start w:val="1"/>
       <w:numFmt w:val="bullet"/>
       <w:lvlText w:val="○"/>
@@ -32613,7 +32613,7 @@
         <w:ind w:left="1440" w:hanging="360"/>
       </w:pPr>
     </w:lvl>
-    <w:lvl w:ilvl="2" w:tplc="1DC6763E">
+    <w:lvl w:ilvl="2" w:tplc="BB4CE792">
       <w:start w:val="1"/>
       <w:numFmt w:val="bullet"/>
       <w:lvlText w:val="■"/>
@@ -32622,7 +32622,7 @@
         <w:ind w:left="2160" w:hanging="360"/>
       </w:pPr>
     </w:lvl>
-    <w:lvl w:ilvl="3" w:tplc="B5889078">
+    <w:lvl w:ilvl="3" w:tplc="71D6C350">
       <w:start w:val="1"/>
       <w:numFmt w:val="bullet"/>
       <w:lvlText w:val="●"/>
@@ -32631,7 +32631,7 @@
         <w:ind w:left="2880" w:hanging="360"/>
       </w:pPr>
     </w:lvl>
-    <w:lvl w:ilvl="4" w:tplc="EBB65202">
+    <w:lvl w:ilvl="4" w:tplc="5C7A4582">
       <w:start w:val="1"/>
       <w:numFmt w:val="bullet"/>
       <w:lvlText w:val="○"/>
@@ -32640,7 +32640,7 @@
         <w:ind w:left="3600" w:hanging="360"/>
       </w:pPr>
     </w:lvl>
-    <w:lvl w:ilvl="5" w:tplc="947E0B34">
+    <w:lvl w:ilvl="5" w:tplc="16E01872">
       <w:start w:val="1"/>
       <w:numFmt w:val="bullet"/>
       <w:lvlText w:val="■"/>
@@ -32649,7 +32649,7 @@
         <w:ind w:left="4320" w:hanging="360"/>
       </w:pPr>
     </w:lvl>
-    <w:lvl w:ilvl="6" w:tplc="25D25D50">
+    <w:lvl w:ilvl="6" w:tplc="2236C2B8">
       <w:start w:val="1"/>
       <w:numFmt w:val="bullet"/>
       <w:lvlText w:val="●"/>
@@ -32658,7 +32658,7 @@
         <w:ind w:left="5040" w:hanging="360"/>
       </w:pPr>
     </w:lvl>
-    <w:lvl w:ilvl="7" w:tplc="58426C64">
+    <w:lvl w:ilvl="7" w:tplc="C4F68C60">
       <w:start w:val="1"/>
       <w:numFmt w:val="bullet"/>
       <w:lvlText w:val="●"/>
@@ -32667,7 +32667,7 @@
         <w:ind w:left="5760" w:hanging="360"/>
       </w:pPr>
     </w:lvl>
-    <w:lvl w:ilvl="8" w:tplc="9880D8DC">
+    <w:lvl w:ilvl="8" w:tplc="BBD66F9E">
       <w:start w:val="1"/>
       <w:numFmt w:val="bullet"/>
       <w:lvlText w:val="●"/>
@@ -32677,13 +32677,13 @@
       </w:pPr>
     </w:lvl>
   </w:abstractNum>
-  <w:num w:numId="1" w16cid:durableId="657270226">
+  <w:num w:numId="1" w16cid:durableId="1311599199">
     <w:abstractNumId w:val="1"/>
     <w:lvlOverride w:ilvl="0">
       <w:startOverride w:val="1"/>
     </w:lvlOverride>
   </w:num>
-  <w:num w:numId="2" w16cid:durableId="328096861">
+  <w:num w:numId="2" w16cid:durableId="1580292283">
     <w:abstractNumId w:val="0"/>
     <w:lvlOverride w:ilvl="0">
       <w:startOverride w:val="1"/>
@@ -33309,7 +33309,7 @@
     <w:autoRedefine/>
     <w:uiPriority w:val="39"/>
     <w:unhideWhenUsed/>
-    <w:rsid w:val="00D756EE"/>
+    <w:rsid w:val="005632B0"/>
     <w:pPr>
       <w:spacing w:after="100"/>
     </w:pPr>
@@ -33321,7 +33321,7 @@
     <w:autoRedefine/>
     <w:uiPriority w:val="39"/>
     <w:unhideWhenUsed/>
-    <w:rsid w:val="00D756EE"/>
+    <w:rsid w:val="005632B0"/>
     <w:pPr>
       <w:spacing w:after="100"/>
       <w:ind w:left="210"/>

</xml_diff>

<commit_message>
fix: replace the study email everywhere -- abffst.research.cut@gmail.com -> abffst.research@gmail.com
PIS bumped to v1.4 (contact email only, no other wording changed; docs/31 sign-off row added, v1.3 history kept). Invitation CONTACT_LINE, .env.example, configure-email.sh, README and manuals updated. The PI's own account email updated on production. The System Manual PDF is excluded here (locked by Foxit again) -- its .docx was rebuilt but not re-finalised.

Co-Authored-By: Claude Sonnet 5 <noreply@anthropic.com>
</commit_message>
<xml_diff>
--- a/docs/manuals/ABF-FST_Screen_and_Button_Reference.docx
+++ b/docs/manuals/ABF-FST_Screen_and_Button_Reference.docx
@@ -69,7 +69,7 @@
           <w:left w:w="10" w:type="dxa"/>
           <w:right w:w="10" w:type="dxa"/>
         </w:tblCellMar>
-        <w:tblLook w:val="04A0" w:firstRow="1" w:lastRow="0" w:firstColumn="1" w:lastColumn="0" w:noHBand="0" w:noVBand="1"/>
+        <w:tblLook w:val="0000" w:firstRow="0" w:lastRow="0" w:firstColumn="0" w:lastColumn="0" w:noHBand="0" w:noVBand="0"/>
       </w:tblPr>
       <w:tblGrid>
         <w:gridCol w:w="2300"/>
@@ -412,7 +412,7 @@
                 <w:sz w:val="19"/>
                 <w:szCs w:val="19"/>
               </w:rPr>
-              <w:t>0773943709 · abffst.research.cut@gmail.com</w:t>
+              <w:t>0773943709 · abffst.research@gmail.com</w:t>
             </w:r>
           </w:p>
         </w:tc>
@@ -469,7 +469,7 @@
                 <w:sz w:val="19"/>
                 <w:szCs w:val="19"/>
               </w:rPr>
-              <w:t>Version 1.9 · 22 September 2026</w:t>
+              <w:t>Version 1.10 · 22 September 2026</w:t>
             </w:r>
           </w:p>
         </w:tc>
@@ -538,7 +538,7 @@
     <w:sdt>
       <w:sdtPr>
         <w:alias w:val="Contents"/>
-        <w:id w:val="570392760"/>
+        <w:id w:val="238224965"/>
       </w:sdtPr>
       <w:sdtEndPr/>
       <w:sdtContent>
@@ -567,7 +567,7 @@
           <w:r>
             <w:fldChar w:fldCharType="separate"/>
           </w:r>
-          <w:hyperlink w:anchor="_Toc240960494" w:history="1">
+          <w:hyperlink w:anchor="_Toc240975524" w:history="1">
             <w:r>
               <w:rPr>
                 <w:rStyle w:val="Hyperlink"/>
@@ -591,7 +591,7 @@
               <w:rPr>
                 <w:noProof/>
               </w:rPr>
-              <w:instrText xml:space="preserve"> PAGEREF _Toc240960494 \h </w:instrText>
+              <w:instrText xml:space="preserve"> PAGEREF _Toc240975524 \h </w:instrText>
             </w:r>
             <w:r>
               <w:rPr>
@@ -634,7 +634,7 @@
               <w14:ligatures w14:val="standardContextual"/>
             </w:rPr>
           </w:pPr>
-          <w:hyperlink w:anchor="_Toc240960495" w:history="1">
+          <w:hyperlink w:anchor="_Toc240975525" w:history="1">
             <w:r>
               <w:rPr>
                 <w:rStyle w:val="Hyperlink"/>
@@ -658,7 +658,7 @@
               <w:rPr>
                 <w:noProof/>
               </w:rPr>
-              <w:instrText xml:space="preserve"> PAGEREF _Toc240960495 \h </w:instrText>
+              <w:instrText xml:space="preserve"> PAGEREF _Toc240975525 \h </w:instrText>
             </w:r>
             <w:r>
               <w:rPr>
@@ -701,7 +701,7 @@
               <w14:ligatures w14:val="standardContextual"/>
             </w:rPr>
           </w:pPr>
-          <w:hyperlink w:anchor="_Toc240960496" w:history="1">
+          <w:hyperlink w:anchor="_Toc240975526" w:history="1">
             <w:r>
               <w:rPr>
                 <w:rStyle w:val="Hyperlink"/>
@@ -725,7 +725,7 @@
               <w:rPr>
                 <w:noProof/>
               </w:rPr>
-              <w:instrText xml:space="preserve"> PAGEREF _Toc240960496 \h </w:instrText>
+              <w:instrText xml:space="preserve"> PAGEREF _Toc240975526 \h </w:instrText>
             </w:r>
             <w:r>
               <w:rPr>
@@ -768,7 +768,7 @@
               <w14:ligatures w14:val="standardContextual"/>
             </w:rPr>
           </w:pPr>
-          <w:hyperlink w:anchor="_Toc240960497" w:history="1">
+          <w:hyperlink w:anchor="_Toc240975527" w:history="1">
             <w:r>
               <w:rPr>
                 <w:rStyle w:val="Hyperlink"/>
@@ -792,7 +792,7 @@
               <w:rPr>
                 <w:noProof/>
               </w:rPr>
-              <w:instrText xml:space="preserve"> PAGEREF _Toc240960497 \h </w:instrText>
+              <w:instrText xml:space="preserve"> PAGEREF _Toc240975527 \h </w:instrText>
             </w:r>
             <w:r>
               <w:rPr>
@@ -835,7 +835,7 @@
               <w14:ligatures w14:val="standardContextual"/>
             </w:rPr>
           </w:pPr>
-          <w:hyperlink w:anchor="_Toc240960498" w:history="1">
+          <w:hyperlink w:anchor="_Toc240975528" w:history="1">
             <w:r>
               <w:rPr>
                 <w:rStyle w:val="Hyperlink"/>
@@ -859,7 +859,7 @@
               <w:rPr>
                 <w:noProof/>
               </w:rPr>
-              <w:instrText xml:space="preserve"> PAGEREF _Toc240960498 \h </w:instrText>
+              <w:instrText xml:space="preserve"> PAGEREF _Toc240975528 \h </w:instrText>
             </w:r>
             <w:r>
               <w:rPr>
@@ -902,7 +902,7 @@
               <w14:ligatures w14:val="standardContextual"/>
             </w:rPr>
           </w:pPr>
-          <w:hyperlink w:anchor="_Toc240960499" w:history="1">
+          <w:hyperlink w:anchor="_Toc240975529" w:history="1">
             <w:r>
               <w:rPr>
                 <w:rStyle w:val="Hyperlink"/>
@@ -926,7 +926,7 @@
               <w:rPr>
                 <w:noProof/>
               </w:rPr>
-              <w:instrText xml:space="preserve"> PAGEREF _Toc240960499 \h </w:instrText>
+              <w:instrText xml:space="preserve"> PAGEREF _Toc240975529 \h </w:instrText>
             </w:r>
             <w:r>
               <w:rPr>
@@ -969,7 +969,7 @@
               <w14:ligatures w14:val="standardContextual"/>
             </w:rPr>
           </w:pPr>
-          <w:hyperlink w:anchor="_Toc240960500" w:history="1">
+          <w:hyperlink w:anchor="_Toc240975530" w:history="1">
             <w:r>
               <w:rPr>
                 <w:rStyle w:val="Hyperlink"/>
@@ -993,7 +993,7 @@
               <w:rPr>
                 <w:noProof/>
               </w:rPr>
-              <w:instrText xml:space="preserve"> PAGEREF _Toc240960500 \h </w:instrText>
+              <w:instrText xml:space="preserve"> PAGEREF _Toc240975530 \h </w:instrText>
             </w:r>
             <w:r>
               <w:rPr>
@@ -1036,7 +1036,7 @@
               <w14:ligatures w14:val="standardContextual"/>
             </w:rPr>
           </w:pPr>
-          <w:hyperlink w:anchor="_Toc240960501" w:history="1">
+          <w:hyperlink w:anchor="_Toc240975531" w:history="1">
             <w:r>
               <w:rPr>
                 <w:rStyle w:val="Hyperlink"/>
@@ -1060,7 +1060,7 @@
               <w:rPr>
                 <w:noProof/>
               </w:rPr>
-              <w:instrText xml:space="preserve"> PAGEREF _Toc240960501 \h </w:instrText>
+              <w:instrText xml:space="preserve"> PAGEREF _Toc240975531 \h </w:instrText>
             </w:r>
             <w:r>
               <w:rPr>
@@ -1103,7 +1103,7 @@
               <w14:ligatures w14:val="standardContextual"/>
             </w:rPr>
           </w:pPr>
-          <w:hyperlink w:anchor="_Toc240960502" w:history="1">
+          <w:hyperlink w:anchor="_Toc240975532" w:history="1">
             <w:r>
               <w:rPr>
                 <w:rStyle w:val="Hyperlink"/>
@@ -1127,7 +1127,7 @@
               <w:rPr>
                 <w:noProof/>
               </w:rPr>
-              <w:instrText xml:space="preserve"> PAGEREF _Toc240960502 \h </w:instrText>
+              <w:instrText xml:space="preserve"> PAGEREF _Toc240975532 \h </w:instrText>
             </w:r>
             <w:r>
               <w:rPr>
@@ -1170,7 +1170,7 @@
               <w14:ligatures w14:val="standardContextual"/>
             </w:rPr>
           </w:pPr>
-          <w:hyperlink w:anchor="_Toc240960503" w:history="1">
+          <w:hyperlink w:anchor="_Toc240975533" w:history="1">
             <w:r>
               <w:rPr>
                 <w:rStyle w:val="Hyperlink"/>
@@ -1194,7 +1194,7 @@
               <w:rPr>
                 <w:noProof/>
               </w:rPr>
-              <w:instrText xml:space="preserve"> PAGEREF _Toc240960503 \h </w:instrText>
+              <w:instrText xml:space="preserve"> PAGEREF _Toc240975533 \h </w:instrText>
             </w:r>
             <w:r>
               <w:rPr>
@@ -1237,7 +1237,7 @@
               <w14:ligatures w14:val="standardContextual"/>
             </w:rPr>
           </w:pPr>
-          <w:hyperlink w:anchor="_Toc240960504" w:history="1">
+          <w:hyperlink w:anchor="_Toc240975534" w:history="1">
             <w:r>
               <w:rPr>
                 <w:rStyle w:val="Hyperlink"/>
@@ -1261,7 +1261,7 @@
               <w:rPr>
                 <w:noProof/>
               </w:rPr>
-              <w:instrText xml:space="preserve"> PAGEREF _Toc240960504 \h </w:instrText>
+              <w:instrText xml:space="preserve"> PAGEREF _Toc240975534 \h </w:instrText>
             </w:r>
             <w:r>
               <w:rPr>
@@ -1304,7 +1304,7 @@
               <w14:ligatures w14:val="standardContextual"/>
             </w:rPr>
           </w:pPr>
-          <w:hyperlink w:anchor="_Toc240960505" w:history="1">
+          <w:hyperlink w:anchor="_Toc240975535" w:history="1">
             <w:r>
               <w:rPr>
                 <w:rStyle w:val="Hyperlink"/>
@@ -1328,7 +1328,7 @@
               <w:rPr>
                 <w:noProof/>
               </w:rPr>
-              <w:instrText xml:space="preserve"> PAGEREF _Toc240960505 \h </w:instrText>
+              <w:instrText xml:space="preserve"> PAGEREF _Toc240975535 \h </w:instrText>
             </w:r>
             <w:r>
               <w:rPr>
@@ -1371,7 +1371,7 @@
               <w14:ligatures w14:val="standardContextual"/>
             </w:rPr>
           </w:pPr>
-          <w:hyperlink w:anchor="_Toc240960506" w:history="1">
+          <w:hyperlink w:anchor="_Toc240975536" w:history="1">
             <w:r>
               <w:rPr>
                 <w:rStyle w:val="Hyperlink"/>
@@ -1395,7 +1395,7 @@
               <w:rPr>
                 <w:noProof/>
               </w:rPr>
-              <w:instrText xml:space="preserve"> PAGEREF _Toc240960506 \h </w:instrText>
+              <w:instrText xml:space="preserve"> PAGEREF _Toc240975536 \h </w:instrText>
             </w:r>
             <w:r>
               <w:rPr>
@@ -1438,7 +1438,7 @@
               <w14:ligatures w14:val="standardContextual"/>
             </w:rPr>
           </w:pPr>
-          <w:hyperlink w:anchor="_Toc240960507" w:history="1">
+          <w:hyperlink w:anchor="_Toc240975537" w:history="1">
             <w:r>
               <w:rPr>
                 <w:rStyle w:val="Hyperlink"/>
@@ -1462,7 +1462,7 @@
               <w:rPr>
                 <w:noProof/>
               </w:rPr>
-              <w:instrText xml:space="preserve"> PAGEREF _Toc240960507 \h </w:instrText>
+              <w:instrText xml:space="preserve"> PAGEREF _Toc240975537 \h </w:instrText>
             </w:r>
             <w:r>
               <w:rPr>
@@ -1505,7 +1505,7 @@
               <w14:ligatures w14:val="standardContextual"/>
             </w:rPr>
           </w:pPr>
-          <w:hyperlink w:anchor="_Toc240960508" w:history="1">
+          <w:hyperlink w:anchor="_Toc240975538" w:history="1">
             <w:r>
               <w:rPr>
                 <w:rStyle w:val="Hyperlink"/>
@@ -1529,7 +1529,7 @@
               <w:rPr>
                 <w:noProof/>
               </w:rPr>
-              <w:instrText xml:space="preserve"> PAGEREF _Toc240960508 \h </w:instrText>
+              <w:instrText xml:space="preserve"> PAGEREF _Toc240975538 \h </w:instrText>
             </w:r>
             <w:r>
               <w:rPr>
@@ -1572,7 +1572,7 @@
               <w14:ligatures w14:val="standardContextual"/>
             </w:rPr>
           </w:pPr>
-          <w:hyperlink w:anchor="_Toc240960509" w:history="1">
+          <w:hyperlink w:anchor="_Toc240975539" w:history="1">
             <w:r>
               <w:rPr>
                 <w:rStyle w:val="Hyperlink"/>
@@ -1596,7 +1596,7 @@
               <w:rPr>
                 <w:noProof/>
               </w:rPr>
-              <w:instrText xml:space="preserve"> PAGEREF _Toc240960509 \h </w:instrText>
+              <w:instrText xml:space="preserve"> PAGEREF _Toc240975539 \h </w:instrText>
             </w:r>
             <w:r>
               <w:rPr>
@@ -1639,7 +1639,7 @@
               <w14:ligatures w14:val="standardContextual"/>
             </w:rPr>
           </w:pPr>
-          <w:hyperlink w:anchor="_Toc240960510" w:history="1">
+          <w:hyperlink w:anchor="_Toc240975540" w:history="1">
             <w:r>
               <w:rPr>
                 <w:rStyle w:val="Hyperlink"/>
@@ -1663,7 +1663,7 @@
               <w:rPr>
                 <w:noProof/>
               </w:rPr>
-              <w:instrText xml:space="preserve"> PAGEREF _Toc240960510 \h </w:instrText>
+              <w:instrText xml:space="preserve"> PAGEREF _Toc240975540 \h </w:instrText>
             </w:r>
             <w:r>
               <w:rPr>
@@ -1706,7 +1706,7 @@
               <w14:ligatures w14:val="standardContextual"/>
             </w:rPr>
           </w:pPr>
-          <w:hyperlink w:anchor="_Toc240960511" w:history="1">
+          <w:hyperlink w:anchor="_Toc240975541" w:history="1">
             <w:r>
               <w:rPr>
                 <w:rStyle w:val="Hyperlink"/>
@@ -1730,7 +1730,7 @@
               <w:rPr>
                 <w:noProof/>
               </w:rPr>
-              <w:instrText xml:space="preserve"> PAGEREF _Toc240960511 \h </w:instrText>
+              <w:instrText xml:space="preserve"> PAGEREF _Toc240975541 \h </w:instrText>
             </w:r>
             <w:r>
               <w:rPr>
@@ -1773,7 +1773,7 @@
               <w14:ligatures w14:val="standardContextual"/>
             </w:rPr>
           </w:pPr>
-          <w:hyperlink w:anchor="_Toc240960512" w:history="1">
+          <w:hyperlink w:anchor="_Toc240975542" w:history="1">
             <w:r>
               <w:rPr>
                 <w:rStyle w:val="Hyperlink"/>
@@ -1797,7 +1797,7 @@
               <w:rPr>
                 <w:noProof/>
               </w:rPr>
-              <w:instrText xml:space="preserve"> PAGEREF _Toc240960512 \h </w:instrText>
+              <w:instrText xml:space="preserve"> PAGEREF _Toc240975542 \h </w:instrText>
             </w:r>
             <w:r>
               <w:rPr>
@@ -1840,7 +1840,7 @@
               <w14:ligatures w14:val="standardContextual"/>
             </w:rPr>
           </w:pPr>
-          <w:hyperlink w:anchor="_Toc240960513" w:history="1">
+          <w:hyperlink w:anchor="_Toc240975543" w:history="1">
             <w:r>
               <w:rPr>
                 <w:rStyle w:val="Hyperlink"/>
@@ -1864,7 +1864,7 @@
               <w:rPr>
                 <w:noProof/>
               </w:rPr>
-              <w:instrText xml:space="preserve"> PAGEREF _Toc240960513 \h </w:instrText>
+              <w:instrText xml:space="preserve"> PAGEREF _Toc240975543 \h </w:instrText>
             </w:r>
             <w:r>
               <w:rPr>
@@ -1907,7 +1907,7 @@
               <w14:ligatures w14:val="standardContextual"/>
             </w:rPr>
           </w:pPr>
-          <w:hyperlink w:anchor="_Toc240960514" w:history="1">
+          <w:hyperlink w:anchor="_Toc240975544" w:history="1">
             <w:r>
               <w:rPr>
                 <w:rStyle w:val="Hyperlink"/>
@@ -1931,7 +1931,7 @@
               <w:rPr>
                 <w:noProof/>
               </w:rPr>
-              <w:instrText xml:space="preserve"> PAGEREF _Toc240960514 \h </w:instrText>
+              <w:instrText xml:space="preserve"> PAGEREF _Toc240975544 \h </w:instrText>
             </w:r>
             <w:r>
               <w:rPr>
@@ -1974,7 +1974,7 @@
               <w14:ligatures w14:val="standardContextual"/>
             </w:rPr>
           </w:pPr>
-          <w:hyperlink w:anchor="_Toc240960515" w:history="1">
+          <w:hyperlink w:anchor="_Toc240975545" w:history="1">
             <w:r>
               <w:rPr>
                 <w:rStyle w:val="Hyperlink"/>
@@ -1998,7 +1998,7 @@
               <w:rPr>
                 <w:noProof/>
               </w:rPr>
-              <w:instrText xml:space="preserve"> PAGEREF _Toc240960515 \h </w:instrText>
+              <w:instrText xml:space="preserve"> PAGEREF _Toc240975545 \h </w:instrText>
             </w:r>
             <w:r>
               <w:rPr>
@@ -2041,7 +2041,7 @@
               <w14:ligatures w14:val="standardContextual"/>
             </w:rPr>
           </w:pPr>
-          <w:hyperlink w:anchor="_Toc240960516" w:history="1">
+          <w:hyperlink w:anchor="_Toc240975546" w:history="1">
             <w:r>
               <w:rPr>
                 <w:rStyle w:val="Hyperlink"/>
@@ -2065,7 +2065,7 @@
               <w:rPr>
                 <w:noProof/>
               </w:rPr>
-              <w:instrText xml:space="preserve"> PAGEREF _Toc240960516 \h </w:instrText>
+              <w:instrText xml:space="preserve"> PAGEREF _Toc240975546 \h </w:instrText>
             </w:r>
             <w:r>
               <w:rPr>
@@ -2108,7 +2108,7 @@
               <w14:ligatures w14:val="standardContextual"/>
             </w:rPr>
           </w:pPr>
-          <w:hyperlink w:anchor="_Toc240960517" w:history="1">
+          <w:hyperlink w:anchor="_Toc240975547" w:history="1">
             <w:r>
               <w:rPr>
                 <w:rStyle w:val="Hyperlink"/>
@@ -2132,7 +2132,7 @@
               <w:rPr>
                 <w:noProof/>
               </w:rPr>
-              <w:instrText xml:space="preserve"> PAGEREF _Toc240960517 \h </w:instrText>
+              <w:instrText xml:space="preserve"> PAGEREF _Toc240975547 \h </w:instrText>
             </w:r>
             <w:r>
               <w:rPr>
@@ -2175,7 +2175,7 @@
               <w14:ligatures w14:val="standardContextual"/>
             </w:rPr>
           </w:pPr>
-          <w:hyperlink w:anchor="_Toc240960518" w:history="1">
+          <w:hyperlink w:anchor="_Toc240975548" w:history="1">
             <w:r>
               <w:rPr>
                 <w:rStyle w:val="Hyperlink"/>
@@ -2199,7 +2199,7 @@
               <w:rPr>
                 <w:noProof/>
               </w:rPr>
-              <w:instrText xml:space="preserve"> PAGEREF _Toc240960518 \h </w:instrText>
+              <w:instrText xml:space="preserve"> PAGEREF _Toc240975548 \h </w:instrText>
             </w:r>
             <w:r>
               <w:rPr>
@@ -2242,7 +2242,7 @@
               <w14:ligatures w14:val="standardContextual"/>
             </w:rPr>
           </w:pPr>
-          <w:hyperlink w:anchor="_Toc240960519" w:history="1">
+          <w:hyperlink w:anchor="_Toc240975549" w:history="1">
             <w:r>
               <w:rPr>
                 <w:rStyle w:val="Hyperlink"/>
@@ -2266,7 +2266,7 @@
               <w:rPr>
                 <w:noProof/>
               </w:rPr>
-              <w:instrText xml:space="preserve"> PAGEREF _Toc240960519 \h </w:instrText>
+              <w:instrText xml:space="preserve"> PAGEREF _Toc240975549 \h </w:instrText>
             </w:r>
             <w:r>
               <w:rPr>
@@ -2309,7 +2309,7 @@
               <w14:ligatures w14:val="standardContextual"/>
             </w:rPr>
           </w:pPr>
-          <w:hyperlink w:anchor="_Toc240960520" w:history="1">
+          <w:hyperlink w:anchor="_Toc240975550" w:history="1">
             <w:r>
               <w:rPr>
                 <w:rStyle w:val="Hyperlink"/>
@@ -2333,7 +2333,7 @@
               <w:rPr>
                 <w:noProof/>
               </w:rPr>
-              <w:instrText xml:space="preserve"> PAGEREF _Toc240960520 \h </w:instrText>
+              <w:instrText xml:space="preserve"> PAGEREF _Toc240975550 \h </w:instrText>
             </w:r>
             <w:r>
               <w:rPr>
@@ -2376,7 +2376,7 @@
               <w14:ligatures w14:val="standardContextual"/>
             </w:rPr>
           </w:pPr>
-          <w:hyperlink w:anchor="_Toc240960521" w:history="1">
+          <w:hyperlink w:anchor="_Toc240975551" w:history="1">
             <w:r>
               <w:rPr>
                 <w:rStyle w:val="Hyperlink"/>
@@ -2400,7 +2400,7 @@
               <w:rPr>
                 <w:noProof/>
               </w:rPr>
-              <w:instrText xml:space="preserve"> PAGEREF _Toc240960521 \h </w:instrText>
+              <w:instrText xml:space="preserve"> PAGEREF _Toc240975551 \h </w:instrText>
             </w:r>
             <w:r>
               <w:rPr>
@@ -2443,7 +2443,7 @@
               <w14:ligatures w14:val="standardContextual"/>
             </w:rPr>
           </w:pPr>
-          <w:hyperlink w:anchor="_Toc240960522" w:history="1">
+          <w:hyperlink w:anchor="_Toc240975552" w:history="1">
             <w:r>
               <w:rPr>
                 <w:rStyle w:val="Hyperlink"/>
@@ -2467,7 +2467,7 @@
               <w:rPr>
                 <w:noProof/>
               </w:rPr>
-              <w:instrText xml:space="preserve"> PAGEREF _Toc240960522 \h </w:instrText>
+              <w:instrText xml:space="preserve"> PAGEREF _Toc240975552 \h </w:instrText>
             </w:r>
             <w:r>
               <w:rPr>
@@ -2510,7 +2510,7 @@
               <w14:ligatures w14:val="standardContextual"/>
             </w:rPr>
           </w:pPr>
-          <w:hyperlink w:anchor="_Toc240960523" w:history="1">
+          <w:hyperlink w:anchor="_Toc240975553" w:history="1">
             <w:r>
               <w:rPr>
                 <w:rStyle w:val="Hyperlink"/>
@@ -2534,7 +2534,7 @@
               <w:rPr>
                 <w:noProof/>
               </w:rPr>
-              <w:instrText xml:space="preserve"> PAGEREF _Toc240960523 \h </w:instrText>
+              <w:instrText xml:space="preserve"> PAGEREF _Toc240975553 \h </w:instrText>
             </w:r>
             <w:r>
               <w:rPr>
@@ -2577,7 +2577,7 @@
               <w14:ligatures w14:val="standardContextual"/>
             </w:rPr>
           </w:pPr>
-          <w:hyperlink w:anchor="_Toc240960524" w:history="1">
+          <w:hyperlink w:anchor="_Toc240975554" w:history="1">
             <w:r>
               <w:rPr>
                 <w:rStyle w:val="Hyperlink"/>
@@ -2601,7 +2601,7 @@
               <w:rPr>
                 <w:noProof/>
               </w:rPr>
-              <w:instrText xml:space="preserve"> PAGEREF _Toc240960524 \h </w:instrText>
+              <w:instrText xml:space="preserve"> PAGEREF _Toc240975554 \h </w:instrText>
             </w:r>
             <w:r>
               <w:rPr>
@@ -2644,7 +2644,7 @@
               <w14:ligatures w14:val="standardContextual"/>
             </w:rPr>
           </w:pPr>
-          <w:hyperlink w:anchor="_Toc240960525" w:history="1">
+          <w:hyperlink w:anchor="_Toc240975555" w:history="1">
             <w:r>
               <w:rPr>
                 <w:rStyle w:val="Hyperlink"/>
@@ -2668,7 +2668,7 @@
               <w:rPr>
                 <w:noProof/>
               </w:rPr>
-              <w:instrText xml:space="preserve"> PAGEREF _Toc240960525 \h </w:instrText>
+              <w:instrText xml:space="preserve"> PAGEREF _Toc240975555 \h </w:instrText>
             </w:r>
             <w:r>
               <w:rPr>
@@ -2711,7 +2711,7 @@
               <w14:ligatures w14:val="standardContextual"/>
             </w:rPr>
           </w:pPr>
-          <w:hyperlink w:anchor="_Toc240960526" w:history="1">
+          <w:hyperlink w:anchor="_Toc240975556" w:history="1">
             <w:r>
               <w:rPr>
                 <w:rStyle w:val="Hyperlink"/>
@@ -2735,7 +2735,7 @@
               <w:rPr>
                 <w:noProof/>
               </w:rPr>
-              <w:instrText xml:space="preserve"> PAGEREF _Toc240960526 \h </w:instrText>
+              <w:instrText xml:space="preserve"> PAGEREF _Toc240975556 \h </w:instrText>
             </w:r>
             <w:r>
               <w:rPr>
@@ -2778,7 +2778,7 @@
               <w14:ligatures w14:val="standardContextual"/>
             </w:rPr>
           </w:pPr>
-          <w:hyperlink w:anchor="_Toc240960527" w:history="1">
+          <w:hyperlink w:anchor="_Toc240975557" w:history="1">
             <w:r>
               <w:rPr>
                 <w:rStyle w:val="Hyperlink"/>
@@ -2802,7 +2802,7 @@
               <w:rPr>
                 <w:noProof/>
               </w:rPr>
-              <w:instrText xml:space="preserve"> PAGEREF _Toc240960527 \h </w:instrText>
+              <w:instrText xml:space="preserve"> PAGEREF _Toc240975557 \h </w:instrText>
             </w:r>
             <w:r>
               <w:rPr>
@@ -2845,7 +2845,7 @@
               <w14:ligatures w14:val="standardContextual"/>
             </w:rPr>
           </w:pPr>
-          <w:hyperlink w:anchor="_Toc240960528" w:history="1">
+          <w:hyperlink w:anchor="_Toc240975558" w:history="1">
             <w:r>
               <w:rPr>
                 <w:rStyle w:val="Hyperlink"/>
@@ -2869,7 +2869,7 @@
               <w:rPr>
                 <w:noProof/>
               </w:rPr>
-              <w:instrText xml:space="preserve"> PAGEREF _Toc240960528 \h </w:instrText>
+              <w:instrText xml:space="preserve"> PAGEREF _Toc240975558 \h </w:instrText>
             </w:r>
             <w:r>
               <w:rPr>
@@ -2912,7 +2912,7 @@
               <w14:ligatures w14:val="standardContextual"/>
             </w:rPr>
           </w:pPr>
-          <w:hyperlink w:anchor="_Toc240960529" w:history="1">
+          <w:hyperlink w:anchor="_Toc240975559" w:history="1">
             <w:r>
               <w:rPr>
                 <w:rStyle w:val="Hyperlink"/>
@@ -2936,7 +2936,7 @@
               <w:rPr>
                 <w:noProof/>
               </w:rPr>
-              <w:instrText xml:space="preserve"> PAGEREF _Toc240960529 \h </w:instrText>
+              <w:instrText xml:space="preserve"> PAGEREF _Toc240975559 \h </w:instrText>
             </w:r>
             <w:r>
               <w:rPr>
@@ -2979,7 +2979,7 @@
               <w14:ligatures w14:val="standardContextual"/>
             </w:rPr>
           </w:pPr>
-          <w:hyperlink w:anchor="_Toc240960530" w:history="1">
+          <w:hyperlink w:anchor="_Toc240975560" w:history="1">
             <w:r>
               <w:rPr>
                 <w:rStyle w:val="Hyperlink"/>
@@ -3003,7 +3003,7 @@
               <w:rPr>
                 <w:noProof/>
               </w:rPr>
-              <w:instrText xml:space="preserve"> PAGEREF _Toc240960530 \h </w:instrText>
+              <w:instrText xml:space="preserve"> PAGEREF _Toc240975560 \h </w:instrText>
             </w:r>
             <w:r>
               <w:rPr>
@@ -3046,7 +3046,7 @@
               <w14:ligatures w14:val="standardContextual"/>
             </w:rPr>
           </w:pPr>
-          <w:hyperlink w:anchor="_Toc240960531" w:history="1">
+          <w:hyperlink w:anchor="_Toc240975561" w:history="1">
             <w:r>
               <w:rPr>
                 <w:rStyle w:val="Hyperlink"/>
@@ -3070,7 +3070,7 @@
               <w:rPr>
                 <w:noProof/>
               </w:rPr>
-              <w:instrText xml:space="preserve"> PAGEREF _Toc240960531 \h </w:instrText>
+              <w:instrText xml:space="preserve"> PAGEREF _Toc240975561 \h </w:instrText>
             </w:r>
             <w:r>
               <w:rPr>
@@ -3113,7 +3113,7 @@
               <w14:ligatures w14:val="standardContextual"/>
             </w:rPr>
           </w:pPr>
-          <w:hyperlink w:anchor="_Toc240960532" w:history="1">
+          <w:hyperlink w:anchor="_Toc240975562" w:history="1">
             <w:r>
               <w:rPr>
                 <w:rStyle w:val="Hyperlink"/>
@@ -3137,7 +3137,7 @@
               <w:rPr>
                 <w:noProof/>
               </w:rPr>
-              <w:instrText xml:space="preserve"> PAGEREF _Toc240960532 \h </w:instrText>
+              <w:instrText xml:space="preserve"> PAGEREF _Toc240975562 \h </w:instrText>
             </w:r>
             <w:r>
               <w:rPr>
@@ -3180,7 +3180,7 @@
               <w14:ligatures w14:val="standardContextual"/>
             </w:rPr>
           </w:pPr>
-          <w:hyperlink w:anchor="_Toc240960533" w:history="1">
+          <w:hyperlink w:anchor="_Toc240975563" w:history="1">
             <w:r>
               <w:rPr>
                 <w:rStyle w:val="Hyperlink"/>
@@ -3204,7 +3204,7 @@
               <w:rPr>
                 <w:noProof/>
               </w:rPr>
-              <w:instrText xml:space="preserve"> PAGEREF _Toc240960533 \h </w:instrText>
+              <w:instrText xml:space="preserve"> PAGEREF _Toc240975563 \h </w:instrText>
             </w:r>
             <w:r>
               <w:rPr>
@@ -3247,7 +3247,7 @@
               <w14:ligatures w14:val="standardContextual"/>
             </w:rPr>
           </w:pPr>
-          <w:hyperlink w:anchor="_Toc240960534" w:history="1">
+          <w:hyperlink w:anchor="_Toc240975564" w:history="1">
             <w:r>
               <w:rPr>
                 <w:rStyle w:val="Hyperlink"/>
@@ -3271,7 +3271,7 @@
               <w:rPr>
                 <w:noProof/>
               </w:rPr>
-              <w:instrText xml:space="preserve"> PAGEREF _Toc240960534 \h </w:instrText>
+              <w:instrText xml:space="preserve"> PAGEREF _Toc240975564 \h </w:instrText>
             </w:r>
             <w:r>
               <w:rPr>
@@ -3310,7 +3310,7 @@
         <w:pStyle w:val="Heading1"/>
         <w:pageBreakBefore/>
       </w:pPr>
-      <w:bookmarkStart w:id="0" w:name="_Toc240960494"/>
+      <w:bookmarkStart w:id="0" w:name="_Toc240975524"/>
       <w:r>
         <w:lastRenderedPageBreak/>
         <w:t>1. About this reference</w:t>
@@ -3376,7 +3376,7 @@
           <w:left w:w="10" w:type="dxa"/>
           <w:right w:w="10" w:type="dxa"/>
         </w:tblCellMar>
-        <w:tblLook w:val="04A0" w:firstRow="1" w:lastRow="0" w:firstColumn="1" w:lastColumn="0" w:noHBand="0" w:noVBand="1"/>
+        <w:tblLook w:val="0000" w:firstRow="0" w:lastRow="0" w:firstColumn="0" w:lastColumn="0" w:noHBand="0" w:noVBand="0"/>
       </w:tblPr>
       <w:tblGrid>
         <w:gridCol w:w="2635"/>
@@ -3763,7 +3763,7 @@
         <w:pStyle w:val="Heading1"/>
         <w:pageBreakBefore/>
       </w:pPr>
-      <w:bookmarkStart w:id="1" w:name="_Toc240960495"/>
+      <w:bookmarkStart w:id="1" w:name="_Toc240975525"/>
       <w:r>
         <w:lastRenderedPageBreak/>
         <w:t>2. Rules that apply on every screen</w:t>
@@ -3980,7 +3980,7 @@
         <w:pStyle w:val="Heading1"/>
         <w:pageBreakBefore/>
       </w:pPr>
-      <w:bookmarkStart w:id="2" w:name="_Toc240960496"/>
+      <w:bookmarkStart w:id="2" w:name="_Toc240975526"/>
       <w:r>
         <w:lastRenderedPageBreak/>
         <w:t>3. Who can open which screen</w:t>
@@ -4010,7 +4010,7 @@
           <w:left w:w="10" w:type="dxa"/>
           <w:right w:w="10" w:type="dxa"/>
         </w:tblCellMar>
-        <w:tblLook w:val="04A0" w:firstRow="1" w:lastRow="0" w:firstColumn="1" w:lastColumn="0" w:noHBand="0" w:noVBand="1"/>
+        <w:tblLook w:val="0000" w:firstRow="0" w:lastRow="0" w:firstColumn="0" w:lastColumn="0" w:noHBand="0" w:noVBand="0"/>
       </w:tblPr>
       <w:tblGrid>
         <w:gridCol w:w="3388"/>
@@ -9508,7 +9508,7 @@
         <w:pStyle w:val="Heading1"/>
         <w:pageBreakBefore/>
       </w:pPr>
-      <w:bookmarkStart w:id="3" w:name="_Toc240960497"/>
+      <w:bookmarkStart w:id="3" w:name="_Toc240975527"/>
       <w:r>
         <w:lastRenderedPageBreak/>
         <w:t>4. Signing in and your account</w:t>
@@ -9519,7 +9519,7 @@
       <w:pPr>
         <w:pStyle w:val="Heading2"/>
       </w:pPr>
-      <w:bookmarkStart w:id="4" w:name="_Toc240960498"/>
+      <w:bookmarkStart w:id="4" w:name="_Toc240975528"/>
       <w:r>
         <w:t>4.1 Sign in</w:t>
       </w:r>
@@ -9582,7 +9582,7 @@
           <w:left w:w="10" w:type="dxa"/>
           <w:right w:w="10" w:type="dxa"/>
         </w:tblCellMar>
-        <w:tblLook w:val="04A0" w:firstRow="1" w:lastRow="0" w:firstColumn="1" w:lastColumn="0" w:noHBand="0" w:noVBand="1"/>
+        <w:tblLook w:val="0000" w:firstRow="0" w:lastRow="0" w:firstColumn="0" w:lastColumn="0" w:noHBand="0" w:noVBand="0"/>
       </w:tblPr>
       <w:tblGrid>
         <w:gridCol w:w="1882"/>
@@ -10032,7 +10032,7 @@
       <w:pPr>
         <w:pStyle w:val="Heading2"/>
       </w:pPr>
-      <w:bookmarkStart w:id="5" w:name="_Toc240960499"/>
+      <w:bookmarkStart w:id="5" w:name="_Toc240975529"/>
       <w:r>
         <w:t>4.2 The header and menu bar (every screen)</w:t>
       </w:r>
@@ -10095,7 +10095,7 @@
           <w:left w:w="10" w:type="dxa"/>
           <w:right w:w="10" w:type="dxa"/>
         </w:tblCellMar>
-        <w:tblLook w:val="04A0" w:firstRow="1" w:lastRow="0" w:firstColumn="1" w:lastColumn="0" w:noHBand="0" w:noVBand="1"/>
+        <w:tblLook w:val="0000" w:firstRow="0" w:lastRow="0" w:firstColumn="0" w:lastColumn="0" w:noHBand="0" w:noVBand="0"/>
       </w:tblPr>
       <w:tblGrid>
         <w:gridCol w:w="1882"/>
@@ -10755,7 +10755,7 @@
       <w:pPr>
         <w:pStyle w:val="Heading2"/>
       </w:pPr>
-      <w:bookmarkStart w:id="6" w:name="_Toc240960500"/>
+      <w:bookmarkStart w:id="6" w:name="_Toc240975530"/>
       <w:r>
         <w:lastRenderedPageBreak/>
         <w:t>4.3 Change Password</w:t>
@@ -10819,7 +10819,7 @@
           <w:left w:w="10" w:type="dxa"/>
           <w:right w:w="10" w:type="dxa"/>
         </w:tblCellMar>
-        <w:tblLook w:val="04A0" w:firstRow="1" w:lastRow="0" w:firstColumn="1" w:lastColumn="0" w:noHBand="0" w:noVBand="1"/>
+        <w:tblLook w:val="0000" w:firstRow="0" w:lastRow="0" w:firstColumn="0" w:lastColumn="0" w:noHBand="0" w:noVBand="0"/>
       </w:tblPr>
       <w:tblGrid>
         <w:gridCol w:w="1882"/>
@@ -11377,7 +11377,7 @@
         <w:pStyle w:val="Heading1"/>
         <w:pageBreakBefore/>
       </w:pPr>
-      <w:bookmarkStart w:id="7" w:name="_Toc240960501"/>
+      <w:bookmarkStart w:id="7" w:name="_Toc240975531"/>
       <w:r>
         <w:lastRenderedPageBreak/>
         <w:t>5. Dashboards and Reports (read-only)</w:t>
@@ -11388,7 +11388,7 @@
       <w:pPr>
         <w:pStyle w:val="Heading2"/>
       </w:pPr>
-      <w:bookmarkStart w:id="8" w:name="_Toc240960502"/>
+      <w:bookmarkStart w:id="8" w:name="_Toc240975532"/>
       <w:r>
         <w:t>5.1 Executive Dashboard</w:t>
       </w:r>
@@ -11451,7 +11451,7 @@
           <w:left w:w="10" w:type="dxa"/>
           <w:right w:w="10" w:type="dxa"/>
         </w:tblCellMar>
-        <w:tblLook w:val="04A0" w:firstRow="1" w:lastRow="0" w:firstColumn="1" w:lastColumn="0" w:noHBand="0" w:noVBand="1"/>
+        <w:tblLook w:val="0000" w:firstRow="0" w:lastRow="0" w:firstColumn="0" w:lastColumn="0" w:noHBand="0" w:noVBand="0"/>
       </w:tblPr>
       <w:tblGrid>
         <w:gridCol w:w="1882"/>
@@ -11901,7 +11901,7 @@
       <w:pPr>
         <w:pStyle w:val="Heading2"/>
       </w:pPr>
-      <w:bookmarkStart w:id="9" w:name="_Toc240960503"/>
+      <w:bookmarkStart w:id="9" w:name="_Toc240975533"/>
       <w:r>
         <w:t>5.2 Sampling Dashboard</w:t>
       </w:r>
@@ -11964,7 +11964,7 @@
           <w:left w:w="10" w:type="dxa"/>
           <w:right w:w="10" w:type="dxa"/>
         </w:tblCellMar>
-        <w:tblLook w:val="04A0" w:firstRow="1" w:lastRow="0" w:firstColumn="1" w:lastColumn="0" w:noHBand="0" w:noVBand="1"/>
+        <w:tblLook w:val="0000" w:firstRow="0" w:lastRow="0" w:firstColumn="0" w:lastColumn="0" w:noHBand="0" w:noVBand="0"/>
       </w:tblPr>
       <w:tblGrid>
         <w:gridCol w:w="1882"/>
@@ -12414,7 +12414,7 @@
       <w:pPr>
         <w:pStyle w:val="Heading2"/>
       </w:pPr>
-      <w:bookmarkStart w:id="10" w:name="_Toc240960504"/>
+      <w:bookmarkStart w:id="10" w:name="_Toc240975534"/>
       <w:r>
         <w:t>5.3 Contact Dashboard</w:t>
       </w:r>
@@ -12478,7 +12478,7 @@
           <w:left w:w="10" w:type="dxa"/>
           <w:right w:w="10" w:type="dxa"/>
         </w:tblCellMar>
-        <w:tblLook w:val="04A0" w:firstRow="1" w:lastRow="0" w:firstColumn="1" w:lastColumn="0" w:noHBand="0" w:noVBand="1"/>
+        <w:tblLook w:val="0000" w:firstRow="0" w:lastRow="0" w:firstColumn="0" w:lastColumn="0" w:noHBand="0" w:noVBand="0"/>
       </w:tblPr>
       <w:tblGrid>
         <w:gridCol w:w="1882"/>
@@ -12718,7 +12718,7 @@
       <w:pPr>
         <w:pStyle w:val="Heading2"/>
       </w:pPr>
-      <w:bookmarkStart w:id="11" w:name="_Toc240960505"/>
+      <w:bookmarkStart w:id="11" w:name="_Toc240975535"/>
       <w:r>
         <w:t>5.4 QA Dashboard</w:t>
       </w:r>
@@ -12781,7 +12781,7 @@
           <w:left w:w="10" w:type="dxa"/>
           <w:right w:w="10" w:type="dxa"/>
         </w:tblCellMar>
-        <w:tblLook w:val="04A0" w:firstRow="1" w:lastRow="0" w:firstColumn="1" w:lastColumn="0" w:noHBand="0" w:noVBand="1"/>
+        <w:tblLook w:val="0000" w:firstRow="0" w:lastRow="0" w:firstColumn="0" w:lastColumn="0" w:noHBand="0" w:noVBand="0"/>
       </w:tblPr>
       <w:tblGrid>
         <w:gridCol w:w="1882"/>
@@ -13338,7 +13338,7 @@
       <w:pPr>
         <w:pStyle w:val="Heading2"/>
       </w:pPr>
-      <w:bookmarkStart w:id="12" w:name="_Toc240960506"/>
+      <w:bookmarkStart w:id="12" w:name="_Toc240975536"/>
       <w:r>
         <w:t>5.5 KII / Document Dashboard</w:t>
       </w:r>
@@ -13401,7 +13401,7 @@
           <w:left w:w="10" w:type="dxa"/>
           <w:right w:w="10" w:type="dxa"/>
         </w:tblCellMar>
-        <w:tblLook w:val="04A0" w:firstRow="1" w:lastRow="0" w:firstColumn="1" w:lastColumn="0" w:noHBand="0" w:noVBand="1"/>
+        <w:tblLook w:val="0000" w:firstRow="0" w:lastRow="0" w:firstColumn="0" w:lastColumn="0" w:noHBand="0" w:noVBand="0"/>
       </w:tblPr>
       <w:tblGrid>
         <w:gridCol w:w="1882"/>
@@ -13748,7 +13748,7 @@
       <w:pPr>
         <w:pStyle w:val="Heading2"/>
       </w:pPr>
-      <w:bookmarkStart w:id="13" w:name="_Toc240960507"/>
+      <w:bookmarkStart w:id="13" w:name="_Toc240975537"/>
       <w:r>
         <w:lastRenderedPageBreak/>
         <w:t>5.6 Reports</w:t>
@@ -13812,7 +13812,7 @@
           <w:left w:w="10" w:type="dxa"/>
           <w:right w:w="10" w:type="dxa"/>
         </w:tblCellMar>
-        <w:tblLook w:val="04A0" w:firstRow="1" w:lastRow="0" w:firstColumn="1" w:lastColumn="0" w:noHBand="0" w:noVBand="1"/>
+        <w:tblLook w:val="0000" w:firstRow="0" w:lastRow="0" w:firstColumn="0" w:lastColumn="0" w:noHBand="0" w:noVBand="0"/>
       </w:tblPr>
       <w:tblGrid>
         <w:gridCol w:w="1882"/>
@@ -14263,7 +14263,7 @@
         <w:pStyle w:val="Heading1"/>
         <w:pageBreakBefore/>
       </w:pPr>
-      <w:bookmarkStart w:id="14" w:name="_Toc240960508"/>
+      <w:bookmarkStart w:id="14" w:name="_Toc240975538"/>
       <w:r>
         <w:lastRenderedPageBreak/>
         <w:t>6. The sample and contact</w:t>
@@ -14274,7 +14274,7 @@
       <w:pPr>
         <w:pStyle w:val="Heading2"/>
       </w:pPr>
-      <w:bookmarkStart w:id="15" w:name="_Toc240960509"/>
+      <w:bookmarkStart w:id="15" w:name="_Toc240975539"/>
       <w:r>
         <w:t>6.1 Main-400 Register (and Reserve)</w:t>
       </w:r>
@@ -14337,7 +14337,7 @@
           <w:left w:w="10" w:type="dxa"/>
           <w:right w:w="10" w:type="dxa"/>
         </w:tblCellMar>
-        <w:tblLook w:val="04A0" w:firstRow="1" w:lastRow="0" w:firstColumn="1" w:lastColumn="0" w:noHBand="0" w:noVBand="1"/>
+        <w:tblLook w:val="0000" w:firstRow="0" w:lastRow="0" w:firstColumn="0" w:lastColumn="0" w:noHBand="0" w:noVBand="0"/>
       </w:tblPr>
       <w:tblGrid>
         <w:gridCol w:w="1882"/>
@@ -15207,7 +15207,7 @@
       <w:pPr>
         <w:pStyle w:val="Heading2"/>
       </w:pPr>
-      <w:bookmarkStart w:id="16" w:name="_Toc240960510"/>
+      <w:bookmarkStart w:id="16" w:name="_Toc240975540"/>
       <w:r>
         <w:t>6.2 Case page</w:t>
       </w:r>
@@ -15270,7 +15270,7 @@
           <w:left w:w="10" w:type="dxa"/>
           <w:right w:w="10" w:type="dxa"/>
         </w:tblCellMar>
-        <w:tblLook w:val="04A0" w:firstRow="1" w:lastRow="0" w:firstColumn="1" w:lastColumn="0" w:noHBand="0" w:noVBand="1"/>
+        <w:tblLook w:val="0000" w:firstRow="0" w:lastRow="0" w:firstColumn="0" w:lastColumn="0" w:noHBand="0" w:noVBand="0"/>
       </w:tblPr>
       <w:tblGrid>
         <w:gridCol w:w="1882"/>
@@ -16886,7 +16886,7 @@
       <w:pPr>
         <w:pStyle w:val="Heading2"/>
       </w:pPr>
-      <w:bookmarkStart w:id="17" w:name="_Toc240960511"/>
+      <w:bookmarkStart w:id="17" w:name="_Toc240975541"/>
       <w:r>
         <w:t>6.3 Pre-Interview Profile (PROIT) and its review screen</w:t>
       </w:r>
@@ -16949,7 +16949,7 @@
           <w:left w:w="10" w:type="dxa"/>
           <w:right w:w="10" w:type="dxa"/>
         </w:tblCellMar>
-        <w:tblLook w:val="04A0" w:firstRow="1" w:lastRow="0" w:firstColumn="1" w:lastColumn="0" w:noHBand="0" w:noVBand="1"/>
+        <w:tblLook w:val="0000" w:firstRow="0" w:lastRow="0" w:firstColumn="0" w:lastColumn="0" w:noHBand="0" w:noVBand="0"/>
       </w:tblPr>
       <w:tblGrid>
         <w:gridCol w:w="1882"/>
@@ -18451,7 +18451,7 @@
       <w:pPr>
         <w:pStyle w:val="Heading2"/>
       </w:pPr>
-      <w:bookmarkStart w:id="18" w:name="_Toc240960512"/>
+      <w:bookmarkStart w:id="18" w:name="_Toc240975542"/>
       <w:r>
         <w:t>6.4 Interview sheet (verifying a locked profile)</w:t>
       </w:r>
@@ -18514,7 +18514,7 @@
           <w:left w:w="10" w:type="dxa"/>
           <w:right w:w="10" w:type="dxa"/>
         </w:tblCellMar>
-        <w:tblLook w:val="04A0" w:firstRow="1" w:lastRow="0" w:firstColumn="1" w:lastColumn="0" w:noHBand="0" w:noVBand="1"/>
+        <w:tblLook w:val="0000" w:firstRow="0" w:lastRow="0" w:firstColumn="0" w:lastColumn="0" w:noHBand="0" w:noVBand="0"/>
       </w:tblPr>
       <w:tblGrid>
         <w:gridCol w:w="1882"/>
@@ -19709,7 +19709,7 @@
       <w:pPr>
         <w:pStyle w:val="Heading2"/>
       </w:pPr>
-      <w:bookmarkStart w:id="19" w:name="_Toc240960513"/>
+      <w:bookmarkStart w:id="19" w:name="_Toc240975543"/>
       <w:r>
         <w:t>6.5 Register Organisation</w:t>
       </w:r>
@@ -19772,7 +19772,7 @@
           <w:left w:w="10" w:type="dxa"/>
           <w:right w:w="10" w:type="dxa"/>
         </w:tblCellMar>
-        <w:tblLook w:val="04A0" w:firstRow="1" w:lastRow="0" w:firstColumn="1" w:lastColumn="0" w:noHBand="0" w:noVBand="1"/>
+        <w:tblLook w:val="0000" w:firstRow="0" w:lastRow="0" w:firstColumn="0" w:lastColumn="0" w:noHBand="0" w:noVBand="0"/>
       </w:tblPr>
       <w:tblGrid>
         <w:gridCol w:w="1882"/>
@@ -20432,7 +20432,7 @@
       <w:pPr>
         <w:pStyle w:val="Heading2"/>
       </w:pPr>
-      <w:bookmarkStart w:id="20" w:name="_Toc240960514"/>
+      <w:bookmarkStart w:id="20" w:name="_Toc240975544"/>
       <w:r>
         <w:t>6.6 Appointment Queue</w:t>
       </w:r>
@@ -20495,7 +20495,7 @@
           <w:left w:w="10" w:type="dxa"/>
           <w:right w:w="10" w:type="dxa"/>
         </w:tblCellMar>
-        <w:tblLook w:val="04A0" w:firstRow="1" w:lastRow="0" w:firstColumn="1" w:lastColumn="0" w:noHBand="0" w:noVBand="1"/>
+        <w:tblLook w:val="0000" w:firstRow="0" w:lastRow="0" w:firstColumn="0" w:lastColumn="0" w:noHBand="0" w:noVBand="0"/>
       </w:tblPr>
       <w:tblGrid>
         <w:gridCol w:w="1882"/>
@@ -21053,7 +21053,7 @@
       <w:pPr>
         <w:pStyle w:val="Heading2"/>
       </w:pPr>
-      <w:bookmarkStart w:id="21" w:name="_Toc240960515"/>
+      <w:bookmarkStart w:id="21" w:name="_Toc240975545"/>
       <w:r>
         <w:t>6.7 Follow-ups due</w:t>
       </w:r>
@@ -21116,7 +21116,7 @@
           <w:left w:w="10" w:type="dxa"/>
           <w:right w:w="10" w:type="dxa"/>
         </w:tblCellMar>
-        <w:tblLook w:val="04A0" w:firstRow="1" w:lastRow="0" w:firstColumn="1" w:lastColumn="0" w:noHBand="0" w:noVBand="1"/>
+        <w:tblLook w:val="0000" w:firstRow="0" w:lastRow="0" w:firstColumn="0" w:lastColumn="0" w:noHBand="0" w:noVBand="0"/>
       </w:tblPr>
       <w:tblGrid>
         <w:gridCol w:w="1882"/>
@@ -21566,7 +21566,7 @@
       <w:pPr>
         <w:pStyle w:val="Heading2"/>
       </w:pPr>
-      <w:bookmarkStart w:id="22" w:name="_Toc240960516"/>
+      <w:bookmarkStart w:id="22" w:name="_Toc240975546"/>
       <w:r>
         <w:t>6.8 Reserve Activation</w:t>
       </w:r>
@@ -21629,7 +21629,7 @@
           <w:left w:w="10" w:type="dxa"/>
           <w:right w:w="10" w:type="dxa"/>
         </w:tblCellMar>
-        <w:tblLook w:val="04A0" w:firstRow="1" w:lastRow="0" w:firstColumn="1" w:lastColumn="0" w:noHBand="0" w:noVBand="1"/>
+        <w:tblLook w:val="0000" w:firstRow="0" w:lastRow="0" w:firstColumn="0" w:lastColumn="0" w:noHBand="0" w:noVBand="0"/>
       </w:tblPr>
       <w:tblGrid>
         <w:gridCol w:w="1882"/>
@@ -22188,7 +22188,7 @@
         <w:pStyle w:val="Heading1"/>
         <w:pageBreakBefore/>
       </w:pPr>
-      <w:bookmarkStart w:id="23" w:name="_Toc240960517"/>
+      <w:bookmarkStart w:id="23" w:name="_Toc240975547"/>
       <w:r>
         <w:lastRenderedPageBreak/>
         <w:t>7. Quality checking</w:t>
@@ -22199,7 +22199,7 @@
       <w:pPr>
         <w:pStyle w:val="Heading2"/>
       </w:pPr>
-      <w:bookmarkStart w:id="24" w:name="_Toc240960518"/>
+      <w:bookmarkStart w:id="24" w:name="_Toc240975548"/>
       <w:r>
         <w:t>7.1 QA Queue (with the KoboToolbox sync panel)</w:t>
       </w:r>
@@ -22262,7 +22262,7 @@
           <w:left w:w="10" w:type="dxa"/>
           <w:right w:w="10" w:type="dxa"/>
         </w:tblCellMar>
-        <w:tblLook w:val="04A0" w:firstRow="1" w:lastRow="0" w:firstColumn="1" w:lastColumn="0" w:noHBand="0" w:noVBand="1"/>
+        <w:tblLook w:val="0000" w:firstRow="0" w:lastRow="0" w:firstColumn="0" w:lastColumn="0" w:noHBand="0" w:noVBand="0"/>
       </w:tblPr>
       <w:tblGrid>
         <w:gridCol w:w="1882"/>
@@ -22922,7 +22922,7 @@
       <w:pPr>
         <w:pStyle w:val="Heading2"/>
       </w:pPr>
-      <w:bookmarkStart w:id="25" w:name="_Toc240960519"/>
+      <w:bookmarkStart w:id="25" w:name="_Toc240975549"/>
       <w:r>
         <w:t>7.2 QA Exceptions</w:t>
       </w:r>
@@ -22985,7 +22985,7 @@
           <w:left w:w="10" w:type="dxa"/>
           <w:right w:w="10" w:type="dxa"/>
         </w:tblCellMar>
-        <w:tblLook w:val="04A0" w:firstRow="1" w:lastRow="0" w:firstColumn="1" w:lastColumn="0" w:noHBand="0" w:noVBand="1"/>
+        <w:tblLook w:val="0000" w:firstRow="0" w:lastRow="0" w:firstColumn="0" w:lastColumn="0" w:noHBand="0" w:noVBand="0"/>
       </w:tblPr>
       <w:tblGrid>
         <w:gridCol w:w="1882"/>
@@ -23754,7 +23754,7 @@
         <w:pStyle w:val="Heading1"/>
         <w:pageBreakBefore/>
       </w:pPr>
-      <w:bookmarkStart w:id="26" w:name="_Toc240960520"/>
+      <w:bookmarkStart w:id="26" w:name="_Toc240975550"/>
       <w:r>
         <w:lastRenderedPageBreak/>
         <w:t>8. Key Informant Interviews</w:t>
@@ -23765,7 +23765,7 @@
       <w:pPr>
         <w:pStyle w:val="Heading2"/>
       </w:pPr>
-      <w:bookmarkStart w:id="27" w:name="_Toc240960521"/>
+      <w:bookmarkStart w:id="27" w:name="_Toc240975551"/>
       <w:r>
         <w:t>8.1 KII Register</w:t>
       </w:r>
@@ -23828,7 +23828,7 @@
           <w:left w:w="10" w:type="dxa"/>
           <w:right w:w="10" w:type="dxa"/>
         </w:tblCellMar>
-        <w:tblLook w:val="04A0" w:firstRow="1" w:lastRow="0" w:firstColumn="1" w:lastColumn="0" w:noHBand="0" w:noVBand="1"/>
+        <w:tblLook w:val="0000" w:firstRow="0" w:lastRow="0" w:firstColumn="0" w:lastColumn="0" w:noHBand="0" w:noVBand="0"/>
       </w:tblPr>
       <w:tblGrid>
         <w:gridCol w:w="1882"/>
@@ -24385,7 +24385,7 @@
       <w:pPr>
         <w:pStyle w:val="Heading2"/>
       </w:pPr>
-      <w:bookmarkStart w:id="28" w:name="_Toc240960522"/>
+      <w:bookmarkStart w:id="28" w:name="_Toc240975552"/>
       <w:r>
         <w:t>8.2 New KII Record</w:t>
       </w:r>
@@ -24448,7 +24448,7 @@
           <w:left w:w="10" w:type="dxa"/>
           <w:right w:w="10" w:type="dxa"/>
         </w:tblCellMar>
-        <w:tblLook w:val="04A0" w:firstRow="1" w:lastRow="0" w:firstColumn="1" w:lastColumn="0" w:noHBand="0" w:noVBand="1"/>
+        <w:tblLook w:val="0000" w:firstRow="0" w:lastRow="0" w:firstColumn="0" w:lastColumn="0" w:noHBand="0" w:noVBand="0"/>
       </w:tblPr>
       <w:tblGrid>
         <w:gridCol w:w="1882"/>
@@ -24795,7 +24795,7 @@
       <w:pPr>
         <w:pStyle w:val="Heading2"/>
       </w:pPr>
-      <w:bookmarkStart w:id="29" w:name="_Toc240960523"/>
+      <w:bookmarkStart w:id="29" w:name="_Toc240975553"/>
       <w:r>
         <w:t>8.3 KII record</w:t>
       </w:r>
@@ -24858,7 +24858,7 @@
           <w:left w:w="10" w:type="dxa"/>
           <w:right w:w="10" w:type="dxa"/>
         </w:tblCellMar>
-        <w:tblLook w:val="04A0" w:firstRow="1" w:lastRow="0" w:firstColumn="1" w:lastColumn="0" w:noHBand="0" w:noVBand="1"/>
+        <w:tblLook w:val="0000" w:firstRow="0" w:lastRow="0" w:firstColumn="0" w:lastColumn="0" w:noHBand="0" w:noVBand="0"/>
       </w:tblPr>
       <w:tblGrid>
         <w:gridCol w:w="1882"/>
@@ -25837,7 +25837,7 @@
         <w:pStyle w:val="Heading1"/>
         <w:pageBreakBefore/>
       </w:pPr>
-      <w:bookmarkStart w:id="30" w:name="_Toc240960524"/>
+      <w:bookmarkStart w:id="30" w:name="_Toc240975554"/>
       <w:r>
         <w:lastRenderedPageBreak/>
         <w:t>9. Documentary evidence</w:t>
@@ -25848,7 +25848,7 @@
       <w:pPr>
         <w:pStyle w:val="Heading2"/>
       </w:pPr>
-      <w:bookmarkStart w:id="31" w:name="_Toc240960525"/>
+      <w:bookmarkStart w:id="31" w:name="_Toc240975555"/>
       <w:r>
         <w:t>9.1 Documents (the corpus)</w:t>
       </w:r>
@@ -25911,7 +25911,7 @@
           <w:left w:w="10" w:type="dxa"/>
           <w:right w:w="10" w:type="dxa"/>
         </w:tblCellMar>
-        <w:tblLook w:val="04A0" w:firstRow="1" w:lastRow="0" w:firstColumn="1" w:lastColumn="0" w:noHBand="0" w:noVBand="1"/>
+        <w:tblLook w:val="0000" w:firstRow="0" w:lastRow="0" w:firstColumn="0" w:lastColumn="0" w:noHBand="0" w:noVBand="0"/>
       </w:tblPr>
       <w:tblGrid>
         <w:gridCol w:w="1882"/>
@@ -26468,7 +26468,7 @@
       <w:pPr>
         <w:pStyle w:val="Heading2"/>
       </w:pPr>
-      <w:bookmarkStart w:id="32" w:name="_Toc240960526"/>
+      <w:bookmarkStart w:id="32" w:name="_Toc240975556"/>
       <w:r>
         <w:t>9.2 New Documentary Evidence Record</w:t>
       </w:r>
@@ -26531,7 +26531,7 @@
           <w:left w:w="10" w:type="dxa"/>
           <w:right w:w="10" w:type="dxa"/>
         </w:tblCellMar>
-        <w:tblLook w:val="04A0" w:firstRow="1" w:lastRow="0" w:firstColumn="1" w:lastColumn="0" w:noHBand="0" w:noVBand="1"/>
+        <w:tblLook w:val="0000" w:firstRow="0" w:lastRow="0" w:firstColumn="0" w:lastColumn="0" w:noHBand="0" w:noVBand="0"/>
       </w:tblPr>
       <w:tblGrid>
         <w:gridCol w:w="1882"/>
@@ -27299,7 +27299,7 @@
       <w:pPr>
         <w:pStyle w:val="Heading2"/>
       </w:pPr>
-      <w:bookmarkStart w:id="33" w:name="_Toc240960527"/>
+      <w:bookmarkStart w:id="33" w:name="_Toc240975557"/>
       <w:r>
         <w:t>9.3 Document record</w:t>
       </w:r>
@@ -27362,7 +27362,7 @@
           <w:left w:w="10" w:type="dxa"/>
           <w:right w:w="10" w:type="dxa"/>
         </w:tblCellMar>
-        <w:tblLook w:val="04A0" w:firstRow="1" w:lastRow="0" w:firstColumn="1" w:lastColumn="0" w:noHBand="0" w:noVBand="1"/>
+        <w:tblLook w:val="0000" w:firstRow="0" w:lastRow="0" w:firstColumn="0" w:lastColumn="0" w:noHBand="0" w:noVBand="0"/>
       </w:tblPr>
       <w:tblGrid>
         <w:gridCol w:w="1882"/>
@@ -28653,7 +28653,7 @@
       <w:pPr>
         <w:pStyle w:val="Heading2"/>
       </w:pPr>
-      <w:bookmarkStart w:id="34" w:name="_Toc240960528"/>
+      <w:bookmarkStart w:id="34" w:name="_Toc240975558"/>
       <w:r>
         <w:t>9.4 Auto-fill review screen</w:t>
       </w:r>
@@ -28716,7 +28716,7 @@
           <w:left w:w="10" w:type="dxa"/>
           <w:right w:w="10" w:type="dxa"/>
         </w:tblCellMar>
-        <w:tblLook w:val="04A0" w:firstRow="1" w:lastRow="0" w:firstColumn="1" w:lastColumn="0" w:noHBand="0" w:noVBand="1"/>
+        <w:tblLook w:val="0000" w:firstRow="0" w:lastRow="0" w:firstColumn="0" w:lastColumn="0" w:noHBand="0" w:noVBand="0"/>
       </w:tblPr>
       <w:tblGrid>
         <w:gridCol w:w="1882"/>
@@ -29695,7 +29695,7 @@
         <w:pStyle w:val="Heading1"/>
         <w:pageBreakBefore/>
       </w:pPr>
-      <w:bookmarkStart w:id="35" w:name="_Toc240960529"/>
+      <w:bookmarkStart w:id="35" w:name="_Toc240975559"/>
       <w:r>
         <w:lastRenderedPageBreak/>
         <w:t>10. Completed forms and exports</w:t>
@@ -29706,7 +29706,7 @@
       <w:pPr>
         <w:pStyle w:val="Heading2"/>
       </w:pPr>
-      <w:bookmarkStart w:id="36" w:name="_Toc240960530"/>
+      <w:bookmarkStart w:id="36" w:name="_Toc240975560"/>
       <w:r>
         <w:t>10.1 Completed forms (Form PDFs)</w:t>
       </w:r>
@@ -29769,7 +29769,7 @@
           <w:left w:w="10" w:type="dxa"/>
           <w:right w:w="10" w:type="dxa"/>
         </w:tblCellMar>
-        <w:tblLook w:val="04A0" w:firstRow="1" w:lastRow="0" w:firstColumn="1" w:lastColumn="0" w:noHBand="0" w:noVBand="1"/>
+        <w:tblLook w:val="0000" w:firstRow="0" w:lastRow="0" w:firstColumn="0" w:lastColumn="0" w:noHBand="0" w:noVBand="0"/>
       </w:tblPr>
       <w:tblGrid>
         <w:gridCol w:w="1882"/>
@@ -30972,7 +30972,7 @@
         <w:pStyle w:val="Heading1"/>
         <w:pageBreakBefore/>
       </w:pPr>
-      <w:bookmarkStart w:id="37" w:name="_Toc240960531"/>
+      <w:bookmarkStart w:id="37" w:name="_Toc240975561"/>
       <w:r>
         <w:lastRenderedPageBreak/>
         <w:t>11. Study administration</w:t>
@@ -30983,7 +30983,7 @@
       <w:pPr>
         <w:pStyle w:val="Heading2"/>
       </w:pPr>
-      <w:bookmarkStart w:id="38" w:name="_Toc240960532"/>
+      <w:bookmarkStart w:id="38" w:name="_Toc240975562"/>
       <w:r>
         <w:t>11.1 Cost Dashboard</w:t>
       </w:r>
@@ -31046,7 +31046,7 @@
           <w:left w:w="10" w:type="dxa"/>
           <w:right w:w="10" w:type="dxa"/>
         </w:tblCellMar>
-        <w:tblLook w:val="04A0" w:firstRow="1" w:lastRow="0" w:firstColumn="1" w:lastColumn="0" w:noHBand="0" w:noVBand="1"/>
+        <w:tblLook w:val="0000" w:firstRow="0" w:lastRow="0" w:firstColumn="0" w:lastColumn="0" w:noHBand="0" w:noVBand="0"/>
       </w:tblPr>
       <w:tblGrid>
         <w:gridCol w:w="1882"/>
@@ -31393,7 +31393,7 @@
       <w:pPr>
         <w:pStyle w:val="Heading2"/>
       </w:pPr>
-      <w:bookmarkStart w:id="39" w:name="_Toc240960533"/>
+      <w:bookmarkStart w:id="39" w:name="_Toc240975563"/>
       <w:r>
         <w:t>11.2 Audit Log</w:t>
       </w:r>
@@ -31456,7 +31456,7 @@
           <w:left w:w="10" w:type="dxa"/>
           <w:right w:w="10" w:type="dxa"/>
         </w:tblCellMar>
-        <w:tblLook w:val="04A0" w:firstRow="1" w:lastRow="0" w:firstColumn="1" w:lastColumn="0" w:noHBand="0" w:noVBand="1"/>
+        <w:tblLook w:val="0000" w:firstRow="0" w:lastRow="0" w:firstColumn="0" w:lastColumn="0" w:noHBand="0" w:noVBand="0"/>
       </w:tblPr>
       <w:tblGrid>
         <w:gridCol w:w="1882"/>
@@ -31803,7 +31803,7 @@
       <w:pPr>
         <w:pStyle w:val="Heading2"/>
       </w:pPr>
-      <w:bookmarkStart w:id="40" w:name="_Toc240960534"/>
+      <w:bookmarkStart w:id="40" w:name="_Toc240975564"/>
       <w:r>
         <w:t>11.3 Export</w:t>
       </w:r>
@@ -31866,7 +31866,7 @@
           <w:left w:w="10" w:type="dxa"/>
           <w:right w:w="10" w:type="dxa"/>
         </w:tblCellMar>
-        <w:tblLook w:val="04A0" w:firstRow="1" w:lastRow="0" w:firstColumn="1" w:lastColumn="0" w:noHBand="0" w:noVBand="1"/>
+        <w:tblLook w:val="0000" w:firstRow="0" w:lastRow="0" w:firstColumn="0" w:lastColumn="0" w:noHBand="0" w:noVBand="0"/>
       </w:tblPr>
       <w:tblGrid>
         <w:gridCol w:w="1882"/>
@@ -32361,7 +32361,7 @@
         <w:sz w:val="16"/>
         <w:szCs w:val="16"/>
       </w:rPr>
-      <w:t>Version 1.9 · 22 September 2026</w:t>
+      <w:t>Version 1.10 · 22 September 2026</w:t>
     </w:r>
     <w:r>
       <w:rPr>
@@ -32534,10 +32534,10 @@
 <file path=word/numbering.xml><?xml version="1.0" encoding="utf-8"?>
 <w:numbering xmlns:wpc="http://schemas.microsoft.com/office/word/2010/wordprocessingCanvas" xmlns:cx="http://schemas.microsoft.com/office/drawing/2014/chartex" xmlns:cx1="http://schemas.microsoft.com/office/drawing/2015/9/8/chartex" xmlns:cx2="http://schemas.microsoft.com/office/drawing/2015/10/21/chartex" xmlns:cx3="http://schemas.microsoft.com/office/drawing/2016/5/9/chartex" xmlns:cx4="http://schemas.microsoft.com/office/drawing/2016/5/10/chartex" xmlns:cx5="http://schemas.microsoft.com/office/drawing/2016/5/11/chartex" xmlns:cx6="http://schemas.microsoft.com/office/drawing/2016/5/12/chartex" xmlns:cx7="http://schemas.microsoft.com/office/drawing/2016/5/13/chartex" xmlns:cx8="http://schemas.microsoft.com/office/drawing/2016/5/14/chartex" xmlns:mc="http://schemas.openxmlformats.org/markup-compatibility/2006" xmlns:aink="http://schemas.microsoft.com/office/drawing/2016/ink" xmlns:am3d="http://schemas.microsoft.com/office/drawing/2017/model3d" xmlns:o="urn:schemas-microsoft-com:office:office" xmlns:oel="http://schemas.microsoft.com/office/2019/extlst" xmlns:r="http://schemas.openxmlformats.org/officeDocument/2006/relationships" xmlns:m="http://schemas.openxmlformats.org/officeDocument/2006/math" xmlns:v="urn:schemas-microsoft-com:vml" xmlns:wp14="http://schemas.microsoft.com/office/word/2010/wordprocessingDrawing" xmlns:wp="http://schemas.openxmlformats.org/drawingml/2006/wordprocessingDrawing" xmlns:w10="urn:schemas-microsoft-com:office:word" xmlns:w="http://schemas.openxmlformats.org/wordprocessingml/2006/main" xmlns:w14="http://schemas.microsoft.com/office/word/2010/wordml" xmlns:w15="http://schemas.microsoft.com/office/word/2012/wordml" xmlns:w16cex="http://schemas.microsoft.com/office/word/2018/wordml/cex" xmlns:w16cid="http://schemas.microsoft.com/office/word/2016/wordml/cid" xmlns:w16="http://schemas.microsoft.com/office/word/2018/wordml" xmlns:w16sdtdh="http://schemas.microsoft.com/office/word/2020/wordml/sdtdatahash" xmlns:w16se="http://schemas.microsoft.com/office/word/2015/wordml/symex" xmlns:wpg="http://schemas.microsoft.com/office/word/2010/wordprocessingGroup" xmlns:wpi="http://schemas.microsoft.com/office/word/2010/wordprocessingInk" xmlns:wne="http://schemas.microsoft.com/office/word/2006/wordml" xmlns:wps="http://schemas.microsoft.com/office/word/2010/wordprocessingShape" mc:Ignorable="w14 w15 w16se w16cid w16 w16cex w16sdtdh wp14">
   <w:abstractNum w:abstractNumId="0" w15:restartNumberingAfterBreak="0">
-    <w:nsid w:val="0AEE028C"/>
+    <w:nsid w:val="49E647EE"/>
     <w:multiLevelType w:val="hybridMultilevel"/>
-    <w:tmpl w:val="D8E422FE"/>
-    <w:lvl w:ilvl="0" w:tplc="C10C94FE">
+    <w:tmpl w:val="59B83E80"/>
+    <w:lvl w:ilvl="0" w:tplc="2A7679BA">
       <w:start w:val="1"/>
       <w:numFmt w:val="bullet"/>
       <w:lvlText w:val="•"/>
@@ -32546,7 +32546,7 @@
         <w:ind w:left="460" w:hanging="280"/>
       </w:pPr>
     </w:lvl>
-    <w:lvl w:ilvl="1" w:tplc="5F42D324">
+    <w:lvl w:ilvl="1" w:tplc="418E56E4">
       <w:start w:val="1"/>
       <w:numFmt w:val="bullet"/>
       <w:lvlText w:val="–"/>
@@ -32555,47 +32555,47 @@
         <w:ind w:left="900" w:hanging="280"/>
       </w:pPr>
     </w:lvl>
-    <w:lvl w:ilvl="2" w:tplc="B1FED36C">
+    <w:lvl w:ilvl="2" w:tplc="F67CAF44">
       <w:numFmt w:val="decimal"/>
       <w:lvlText w:val=""/>
       <w:lvlJc w:val="left"/>
     </w:lvl>
-    <w:lvl w:ilvl="3" w:tplc="7DA6B758">
+    <w:lvl w:ilvl="3" w:tplc="4F70F6D0">
       <w:numFmt w:val="decimal"/>
       <w:lvlText w:val=""/>
       <w:lvlJc w:val="left"/>
     </w:lvl>
-    <w:lvl w:ilvl="4" w:tplc="2F3208C6">
+    <w:lvl w:ilvl="4" w:tplc="535ED2E0">
       <w:numFmt w:val="decimal"/>
       <w:lvlText w:val=""/>
       <w:lvlJc w:val="left"/>
     </w:lvl>
-    <w:lvl w:ilvl="5" w:tplc="EB7A3E72">
+    <w:lvl w:ilvl="5" w:tplc="619AF0BA">
       <w:numFmt w:val="decimal"/>
       <w:lvlText w:val=""/>
       <w:lvlJc w:val="left"/>
     </w:lvl>
-    <w:lvl w:ilvl="6" w:tplc="F398AACE">
+    <w:lvl w:ilvl="6" w:tplc="CFF21D4C">
       <w:numFmt w:val="decimal"/>
       <w:lvlText w:val=""/>
       <w:lvlJc w:val="left"/>
     </w:lvl>
-    <w:lvl w:ilvl="7" w:tplc="24DEABCE">
+    <w:lvl w:ilvl="7" w:tplc="61BAAE00">
       <w:numFmt w:val="decimal"/>
       <w:lvlText w:val=""/>
       <w:lvlJc w:val="left"/>
     </w:lvl>
-    <w:lvl w:ilvl="8" w:tplc="8C9CD3EE">
+    <w:lvl w:ilvl="8" w:tplc="D0388872">
       <w:numFmt w:val="decimal"/>
       <w:lvlText w:val=""/>
       <w:lvlJc w:val="left"/>
     </w:lvl>
   </w:abstractNum>
   <w:abstractNum w:abstractNumId="1" w15:restartNumberingAfterBreak="0">
-    <w:nsid w:val="53E25176"/>
+    <w:nsid w:val="4C1C046C"/>
     <w:multiLevelType w:val="hybridMultilevel"/>
-    <w:tmpl w:val="CB54D056"/>
-    <w:lvl w:ilvl="0" w:tplc="E916A970">
+    <w:tmpl w:val="7FAC6784"/>
+    <w:lvl w:ilvl="0" w:tplc="AE10241E">
       <w:start w:val="1"/>
       <w:numFmt w:val="bullet"/>
       <w:lvlText w:val="●"/>
@@ -32604,7 +32604,7 @@
         <w:ind w:left="720" w:hanging="360"/>
       </w:pPr>
     </w:lvl>
-    <w:lvl w:ilvl="1" w:tplc="A0009976">
+    <w:lvl w:ilvl="1" w:tplc="0FBCDCFC">
       <w:start w:val="1"/>
       <w:numFmt w:val="bullet"/>
       <w:lvlText w:val="○"/>
@@ -32613,7 +32613,7 @@
         <w:ind w:left="1440" w:hanging="360"/>
       </w:pPr>
     </w:lvl>
-    <w:lvl w:ilvl="2" w:tplc="BB4CE792">
+    <w:lvl w:ilvl="2" w:tplc="2B1E95DE">
       <w:start w:val="1"/>
       <w:numFmt w:val="bullet"/>
       <w:lvlText w:val="■"/>
@@ -32622,7 +32622,7 @@
         <w:ind w:left="2160" w:hanging="360"/>
       </w:pPr>
     </w:lvl>
-    <w:lvl w:ilvl="3" w:tplc="71D6C350">
+    <w:lvl w:ilvl="3" w:tplc="E510476E">
       <w:start w:val="1"/>
       <w:numFmt w:val="bullet"/>
       <w:lvlText w:val="●"/>
@@ -32631,7 +32631,7 @@
         <w:ind w:left="2880" w:hanging="360"/>
       </w:pPr>
     </w:lvl>
-    <w:lvl w:ilvl="4" w:tplc="5C7A4582">
+    <w:lvl w:ilvl="4" w:tplc="DC509EA6">
       <w:start w:val="1"/>
       <w:numFmt w:val="bullet"/>
       <w:lvlText w:val="○"/>
@@ -32640,7 +32640,7 @@
         <w:ind w:left="3600" w:hanging="360"/>
       </w:pPr>
     </w:lvl>
-    <w:lvl w:ilvl="5" w:tplc="16E01872">
+    <w:lvl w:ilvl="5" w:tplc="D5663BC8">
       <w:start w:val="1"/>
       <w:numFmt w:val="bullet"/>
       <w:lvlText w:val="■"/>
@@ -32649,7 +32649,7 @@
         <w:ind w:left="4320" w:hanging="360"/>
       </w:pPr>
     </w:lvl>
-    <w:lvl w:ilvl="6" w:tplc="2236C2B8">
+    <w:lvl w:ilvl="6" w:tplc="B0180034">
       <w:start w:val="1"/>
       <w:numFmt w:val="bullet"/>
       <w:lvlText w:val="●"/>
@@ -32658,7 +32658,7 @@
         <w:ind w:left="5040" w:hanging="360"/>
       </w:pPr>
     </w:lvl>
-    <w:lvl w:ilvl="7" w:tplc="C4F68C60">
+    <w:lvl w:ilvl="7" w:tplc="25E40F88">
       <w:start w:val="1"/>
       <w:numFmt w:val="bullet"/>
       <w:lvlText w:val="●"/>
@@ -32667,7 +32667,7 @@
         <w:ind w:left="5760" w:hanging="360"/>
       </w:pPr>
     </w:lvl>
-    <w:lvl w:ilvl="8" w:tplc="BBD66F9E">
+    <w:lvl w:ilvl="8" w:tplc="257419B8">
       <w:start w:val="1"/>
       <w:numFmt w:val="bullet"/>
       <w:lvlText w:val="●"/>
@@ -32677,13 +32677,13 @@
       </w:pPr>
     </w:lvl>
   </w:abstractNum>
-  <w:num w:numId="1" w16cid:durableId="1311599199">
+  <w:num w:numId="1" w16cid:durableId="2106683044">
     <w:abstractNumId w:val="1"/>
     <w:lvlOverride w:ilvl="0">
       <w:startOverride w:val="1"/>
     </w:lvlOverride>
   </w:num>
-  <w:num w:numId="2" w16cid:durableId="1580292283">
+  <w:num w:numId="2" w16cid:durableId="117073760">
     <w:abstractNumId w:val="0"/>
     <w:lvlOverride w:ilvl="0">
       <w:startOverride w:val="1"/>
@@ -33309,7 +33309,7 @@
     <w:autoRedefine/>
     <w:uiPriority w:val="39"/>
     <w:unhideWhenUsed/>
-    <w:rsid w:val="005632B0"/>
+    <w:rsid w:val="003B26D9"/>
     <w:pPr>
       <w:spacing w:after="100"/>
     </w:pPr>
@@ -33321,7 +33321,7 @@
     <w:autoRedefine/>
     <w:uiPriority w:val="39"/>
     <w:unhideWhenUsed/>
-    <w:rsid w:val="005632B0"/>
+    <w:rsid w:val="003B26D9"/>
     <w:pPr>
       <w:spacing w:after="100"/>
       <w:ind w:left="210"/>

</xml_diff>

<commit_message>
docs: analysis packs (SmartPLS 4, ATLAS.ti) in the README, the compliance doc and the manuals v1.11
Co-Authored-By: Claude Sonnet 5 <noreply@anthropic.com>
</commit_message>
<xml_diff>
--- a/docs/manuals/ABF-FST_Screen_and_Button_Reference.docx
+++ b/docs/manuals/ABF-FST_Screen_and_Button_Reference.docx
@@ -69,7 +69,7 @@
           <w:left w:w="10" w:type="dxa"/>
           <w:right w:w="10" w:type="dxa"/>
         </w:tblCellMar>
-        <w:tblLook w:val="0000" w:firstRow="0" w:lastRow="0" w:firstColumn="0" w:lastColumn="0" w:noHBand="0" w:noVBand="0"/>
+        <w:tblLook w:val="04A0" w:firstRow="1" w:lastRow="0" w:firstColumn="1" w:lastColumn="0" w:noHBand="0" w:noVBand="1"/>
       </w:tblPr>
       <w:tblGrid>
         <w:gridCol w:w="2300"/>
@@ -469,7 +469,7 @@
                 <w:sz w:val="19"/>
                 <w:szCs w:val="19"/>
               </w:rPr>
-              <w:t>Version 1.10 · 22 September 2026</w:t>
+              <w:t>Version 1.11 · 28 September 2026</w:t>
             </w:r>
           </w:p>
         </w:tc>
@@ -538,7 +538,7 @@
     <w:sdt>
       <w:sdtPr>
         <w:alias w:val="Contents"/>
-        <w:id w:val="238224965"/>
+        <w:id w:val="621653771"/>
       </w:sdtPr>
       <w:sdtEndPr/>
       <w:sdtContent>
@@ -567,7 +567,7 @@
           <w:r>
             <w:fldChar w:fldCharType="separate"/>
           </w:r>
-          <w:hyperlink w:anchor="_Toc240975524" w:history="1">
+          <w:hyperlink w:anchor="_Toc241490464" w:history="1">
             <w:r>
               <w:rPr>
                 <w:rStyle w:val="Hyperlink"/>
@@ -591,7 +591,7 @@
               <w:rPr>
                 <w:noProof/>
               </w:rPr>
-              <w:instrText xml:space="preserve"> PAGEREF _Toc240975524 \h </w:instrText>
+              <w:instrText xml:space="preserve"> PAGEREF _Toc241490464 \h </w:instrText>
             </w:r>
             <w:r>
               <w:rPr>
@@ -634,7 +634,7 @@
               <w14:ligatures w14:val="standardContextual"/>
             </w:rPr>
           </w:pPr>
-          <w:hyperlink w:anchor="_Toc240975525" w:history="1">
+          <w:hyperlink w:anchor="_Toc241490465" w:history="1">
             <w:r>
               <w:rPr>
                 <w:rStyle w:val="Hyperlink"/>
@@ -658,7 +658,7 @@
               <w:rPr>
                 <w:noProof/>
               </w:rPr>
-              <w:instrText xml:space="preserve"> PAGEREF _Toc240975525 \h </w:instrText>
+              <w:instrText xml:space="preserve"> PAGEREF _Toc241490465 \h </w:instrText>
             </w:r>
             <w:r>
               <w:rPr>
@@ -701,7 +701,7 @@
               <w14:ligatures w14:val="standardContextual"/>
             </w:rPr>
           </w:pPr>
-          <w:hyperlink w:anchor="_Toc240975526" w:history="1">
+          <w:hyperlink w:anchor="_Toc241490466" w:history="1">
             <w:r>
               <w:rPr>
                 <w:rStyle w:val="Hyperlink"/>
@@ -725,7 +725,7 @@
               <w:rPr>
                 <w:noProof/>
               </w:rPr>
-              <w:instrText xml:space="preserve"> PAGEREF _Toc240975526 \h </w:instrText>
+              <w:instrText xml:space="preserve"> PAGEREF _Toc241490466 \h </w:instrText>
             </w:r>
             <w:r>
               <w:rPr>
@@ -768,7 +768,7 @@
               <w14:ligatures w14:val="standardContextual"/>
             </w:rPr>
           </w:pPr>
-          <w:hyperlink w:anchor="_Toc240975527" w:history="1">
+          <w:hyperlink w:anchor="_Toc241490467" w:history="1">
             <w:r>
               <w:rPr>
                 <w:rStyle w:val="Hyperlink"/>
@@ -792,7 +792,7 @@
               <w:rPr>
                 <w:noProof/>
               </w:rPr>
-              <w:instrText xml:space="preserve"> PAGEREF _Toc240975527 \h </w:instrText>
+              <w:instrText xml:space="preserve"> PAGEREF _Toc241490467 \h </w:instrText>
             </w:r>
             <w:r>
               <w:rPr>
@@ -835,7 +835,7 @@
               <w14:ligatures w14:val="standardContextual"/>
             </w:rPr>
           </w:pPr>
-          <w:hyperlink w:anchor="_Toc240975528" w:history="1">
+          <w:hyperlink w:anchor="_Toc241490468" w:history="1">
             <w:r>
               <w:rPr>
                 <w:rStyle w:val="Hyperlink"/>
@@ -859,7 +859,7 @@
               <w:rPr>
                 <w:noProof/>
               </w:rPr>
-              <w:instrText xml:space="preserve"> PAGEREF _Toc240975528 \h </w:instrText>
+              <w:instrText xml:space="preserve"> PAGEREF _Toc241490468 \h </w:instrText>
             </w:r>
             <w:r>
               <w:rPr>
@@ -902,7 +902,7 @@
               <w14:ligatures w14:val="standardContextual"/>
             </w:rPr>
           </w:pPr>
-          <w:hyperlink w:anchor="_Toc240975529" w:history="1">
+          <w:hyperlink w:anchor="_Toc241490469" w:history="1">
             <w:r>
               <w:rPr>
                 <w:rStyle w:val="Hyperlink"/>
@@ -926,7 +926,7 @@
               <w:rPr>
                 <w:noProof/>
               </w:rPr>
-              <w:instrText xml:space="preserve"> PAGEREF _Toc240975529 \h </w:instrText>
+              <w:instrText xml:space="preserve"> PAGEREF _Toc241490469 \h </w:instrText>
             </w:r>
             <w:r>
               <w:rPr>
@@ -969,7 +969,7 @@
               <w14:ligatures w14:val="standardContextual"/>
             </w:rPr>
           </w:pPr>
-          <w:hyperlink w:anchor="_Toc240975530" w:history="1">
+          <w:hyperlink w:anchor="_Toc241490470" w:history="1">
             <w:r>
               <w:rPr>
                 <w:rStyle w:val="Hyperlink"/>
@@ -993,7 +993,7 @@
               <w:rPr>
                 <w:noProof/>
               </w:rPr>
-              <w:instrText xml:space="preserve"> PAGEREF _Toc240975530 \h </w:instrText>
+              <w:instrText xml:space="preserve"> PAGEREF _Toc241490470 \h </w:instrText>
             </w:r>
             <w:r>
               <w:rPr>
@@ -1036,7 +1036,7 @@
               <w14:ligatures w14:val="standardContextual"/>
             </w:rPr>
           </w:pPr>
-          <w:hyperlink w:anchor="_Toc240975531" w:history="1">
+          <w:hyperlink w:anchor="_Toc241490471" w:history="1">
             <w:r>
               <w:rPr>
                 <w:rStyle w:val="Hyperlink"/>
@@ -1060,7 +1060,7 @@
               <w:rPr>
                 <w:noProof/>
               </w:rPr>
-              <w:instrText xml:space="preserve"> PAGEREF _Toc240975531 \h </w:instrText>
+              <w:instrText xml:space="preserve"> PAGEREF _Toc241490471 \h </w:instrText>
             </w:r>
             <w:r>
               <w:rPr>
@@ -1103,7 +1103,7 @@
               <w14:ligatures w14:val="standardContextual"/>
             </w:rPr>
           </w:pPr>
-          <w:hyperlink w:anchor="_Toc240975532" w:history="1">
+          <w:hyperlink w:anchor="_Toc241490472" w:history="1">
             <w:r>
               <w:rPr>
                 <w:rStyle w:val="Hyperlink"/>
@@ -1127,7 +1127,7 @@
               <w:rPr>
                 <w:noProof/>
               </w:rPr>
-              <w:instrText xml:space="preserve"> PAGEREF _Toc240975532 \h </w:instrText>
+              <w:instrText xml:space="preserve"> PAGEREF _Toc241490472 \h </w:instrText>
             </w:r>
             <w:r>
               <w:rPr>
@@ -1170,7 +1170,7 @@
               <w14:ligatures w14:val="standardContextual"/>
             </w:rPr>
           </w:pPr>
-          <w:hyperlink w:anchor="_Toc240975533" w:history="1">
+          <w:hyperlink w:anchor="_Toc241490473" w:history="1">
             <w:r>
               <w:rPr>
                 <w:rStyle w:val="Hyperlink"/>
@@ -1194,7 +1194,7 @@
               <w:rPr>
                 <w:noProof/>
               </w:rPr>
-              <w:instrText xml:space="preserve"> PAGEREF _Toc240975533 \h </w:instrText>
+              <w:instrText xml:space="preserve"> PAGEREF _Toc241490473 \h </w:instrText>
             </w:r>
             <w:r>
               <w:rPr>
@@ -1237,7 +1237,7 @@
               <w14:ligatures w14:val="standardContextual"/>
             </w:rPr>
           </w:pPr>
-          <w:hyperlink w:anchor="_Toc240975534" w:history="1">
+          <w:hyperlink w:anchor="_Toc241490474" w:history="1">
             <w:r>
               <w:rPr>
                 <w:rStyle w:val="Hyperlink"/>
@@ -1261,7 +1261,7 @@
               <w:rPr>
                 <w:noProof/>
               </w:rPr>
-              <w:instrText xml:space="preserve"> PAGEREF _Toc240975534 \h </w:instrText>
+              <w:instrText xml:space="preserve"> PAGEREF _Toc241490474 \h </w:instrText>
             </w:r>
             <w:r>
               <w:rPr>
@@ -1304,7 +1304,7 @@
               <w14:ligatures w14:val="standardContextual"/>
             </w:rPr>
           </w:pPr>
-          <w:hyperlink w:anchor="_Toc240975535" w:history="1">
+          <w:hyperlink w:anchor="_Toc241490475" w:history="1">
             <w:r>
               <w:rPr>
                 <w:rStyle w:val="Hyperlink"/>
@@ -1328,7 +1328,7 @@
               <w:rPr>
                 <w:noProof/>
               </w:rPr>
-              <w:instrText xml:space="preserve"> PAGEREF _Toc240975535 \h </w:instrText>
+              <w:instrText xml:space="preserve"> PAGEREF _Toc241490475 \h </w:instrText>
             </w:r>
             <w:r>
               <w:rPr>
@@ -1371,7 +1371,7 @@
               <w14:ligatures w14:val="standardContextual"/>
             </w:rPr>
           </w:pPr>
-          <w:hyperlink w:anchor="_Toc240975536" w:history="1">
+          <w:hyperlink w:anchor="_Toc241490476" w:history="1">
             <w:r>
               <w:rPr>
                 <w:rStyle w:val="Hyperlink"/>
@@ -1395,7 +1395,7 @@
               <w:rPr>
                 <w:noProof/>
               </w:rPr>
-              <w:instrText xml:space="preserve"> PAGEREF _Toc240975536 \h </w:instrText>
+              <w:instrText xml:space="preserve"> PAGEREF _Toc241490476 \h </w:instrText>
             </w:r>
             <w:r>
               <w:rPr>
@@ -1438,7 +1438,7 @@
               <w14:ligatures w14:val="standardContextual"/>
             </w:rPr>
           </w:pPr>
-          <w:hyperlink w:anchor="_Toc240975537" w:history="1">
+          <w:hyperlink w:anchor="_Toc241490477" w:history="1">
             <w:r>
               <w:rPr>
                 <w:rStyle w:val="Hyperlink"/>
@@ -1462,7 +1462,7 @@
               <w:rPr>
                 <w:noProof/>
               </w:rPr>
-              <w:instrText xml:space="preserve"> PAGEREF _Toc240975537 \h </w:instrText>
+              <w:instrText xml:space="preserve"> PAGEREF _Toc241490477 \h </w:instrText>
             </w:r>
             <w:r>
               <w:rPr>
@@ -1505,7 +1505,7 @@
               <w14:ligatures w14:val="standardContextual"/>
             </w:rPr>
           </w:pPr>
-          <w:hyperlink w:anchor="_Toc240975538" w:history="1">
+          <w:hyperlink w:anchor="_Toc241490478" w:history="1">
             <w:r>
               <w:rPr>
                 <w:rStyle w:val="Hyperlink"/>
@@ -1529,7 +1529,7 @@
               <w:rPr>
                 <w:noProof/>
               </w:rPr>
-              <w:instrText xml:space="preserve"> PAGEREF _Toc240975538 \h </w:instrText>
+              <w:instrText xml:space="preserve"> PAGEREF _Toc241490478 \h </w:instrText>
             </w:r>
             <w:r>
               <w:rPr>
@@ -1572,7 +1572,7 @@
               <w14:ligatures w14:val="standardContextual"/>
             </w:rPr>
           </w:pPr>
-          <w:hyperlink w:anchor="_Toc240975539" w:history="1">
+          <w:hyperlink w:anchor="_Toc241490479" w:history="1">
             <w:r>
               <w:rPr>
                 <w:rStyle w:val="Hyperlink"/>
@@ -1596,7 +1596,7 @@
               <w:rPr>
                 <w:noProof/>
               </w:rPr>
-              <w:instrText xml:space="preserve"> PAGEREF _Toc240975539 \h </w:instrText>
+              <w:instrText xml:space="preserve"> PAGEREF _Toc241490479 \h </w:instrText>
             </w:r>
             <w:r>
               <w:rPr>
@@ -1639,7 +1639,7 @@
               <w14:ligatures w14:val="standardContextual"/>
             </w:rPr>
           </w:pPr>
-          <w:hyperlink w:anchor="_Toc240975540" w:history="1">
+          <w:hyperlink w:anchor="_Toc241490480" w:history="1">
             <w:r>
               <w:rPr>
                 <w:rStyle w:val="Hyperlink"/>
@@ -1663,7 +1663,7 @@
               <w:rPr>
                 <w:noProof/>
               </w:rPr>
-              <w:instrText xml:space="preserve"> PAGEREF _Toc240975540 \h </w:instrText>
+              <w:instrText xml:space="preserve"> PAGEREF _Toc241490480 \h </w:instrText>
             </w:r>
             <w:r>
               <w:rPr>
@@ -1706,7 +1706,7 @@
               <w14:ligatures w14:val="standardContextual"/>
             </w:rPr>
           </w:pPr>
-          <w:hyperlink w:anchor="_Toc240975541" w:history="1">
+          <w:hyperlink w:anchor="_Toc241490481" w:history="1">
             <w:r>
               <w:rPr>
                 <w:rStyle w:val="Hyperlink"/>
@@ -1730,7 +1730,7 @@
               <w:rPr>
                 <w:noProof/>
               </w:rPr>
-              <w:instrText xml:space="preserve"> PAGEREF _Toc240975541 \h </w:instrText>
+              <w:instrText xml:space="preserve"> PAGEREF _Toc241490481 \h </w:instrText>
             </w:r>
             <w:r>
               <w:rPr>
@@ -1773,7 +1773,7 @@
               <w14:ligatures w14:val="standardContextual"/>
             </w:rPr>
           </w:pPr>
-          <w:hyperlink w:anchor="_Toc240975542" w:history="1">
+          <w:hyperlink w:anchor="_Toc241490482" w:history="1">
             <w:r>
               <w:rPr>
                 <w:rStyle w:val="Hyperlink"/>
@@ -1797,7 +1797,7 @@
               <w:rPr>
                 <w:noProof/>
               </w:rPr>
-              <w:instrText xml:space="preserve"> PAGEREF _Toc240975542 \h </w:instrText>
+              <w:instrText xml:space="preserve"> PAGEREF _Toc241490482 \h </w:instrText>
             </w:r>
             <w:r>
               <w:rPr>
@@ -1840,7 +1840,7 @@
               <w14:ligatures w14:val="standardContextual"/>
             </w:rPr>
           </w:pPr>
-          <w:hyperlink w:anchor="_Toc240975543" w:history="1">
+          <w:hyperlink w:anchor="_Toc241490483" w:history="1">
             <w:r>
               <w:rPr>
                 <w:rStyle w:val="Hyperlink"/>
@@ -1864,7 +1864,7 @@
               <w:rPr>
                 <w:noProof/>
               </w:rPr>
-              <w:instrText xml:space="preserve"> PAGEREF _Toc240975543 \h </w:instrText>
+              <w:instrText xml:space="preserve"> PAGEREF _Toc241490483 \h </w:instrText>
             </w:r>
             <w:r>
               <w:rPr>
@@ -1907,7 +1907,7 @@
               <w14:ligatures w14:val="standardContextual"/>
             </w:rPr>
           </w:pPr>
-          <w:hyperlink w:anchor="_Toc240975544" w:history="1">
+          <w:hyperlink w:anchor="_Toc241490484" w:history="1">
             <w:r>
               <w:rPr>
                 <w:rStyle w:val="Hyperlink"/>
@@ -1931,7 +1931,7 @@
               <w:rPr>
                 <w:noProof/>
               </w:rPr>
-              <w:instrText xml:space="preserve"> PAGEREF _Toc240975544 \h </w:instrText>
+              <w:instrText xml:space="preserve"> PAGEREF _Toc241490484 \h </w:instrText>
             </w:r>
             <w:r>
               <w:rPr>
@@ -1974,7 +1974,7 @@
               <w14:ligatures w14:val="standardContextual"/>
             </w:rPr>
           </w:pPr>
-          <w:hyperlink w:anchor="_Toc240975545" w:history="1">
+          <w:hyperlink w:anchor="_Toc241490485" w:history="1">
             <w:r>
               <w:rPr>
                 <w:rStyle w:val="Hyperlink"/>
@@ -1998,7 +1998,7 @@
               <w:rPr>
                 <w:noProof/>
               </w:rPr>
-              <w:instrText xml:space="preserve"> PAGEREF _Toc240975545 \h </w:instrText>
+              <w:instrText xml:space="preserve"> PAGEREF _Toc241490485 \h </w:instrText>
             </w:r>
             <w:r>
               <w:rPr>
@@ -2041,7 +2041,7 @@
               <w14:ligatures w14:val="standardContextual"/>
             </w:rPr>
           </w:pPr>
-          <w:hyperlink w:anchor="_Toc240975546" w:history="1">
+          <w:hyperlink w:anchor="_Toc241490486" w:history="1">
             <w:r>
               <w:rPr>
                 <w:rStyle w:val="Hyperlink"/>
@@ -2065,7 +2065,7 @@
               <w:rPr>
                 <w:noProof/>
               </w:rPr>
-              <w:instrText xml:space="preserve"> PAGEREF _Toc240975546 \h </w:instrText>
+              <w:instrText xml:space="preserve"> PAGEREF _Toc241490486 \h </w:instrText>
             </w:r>
             <w:r>
               <w:rPr>
@@ -2108,7 +2108,7 @@
               <w14:ligatures w14:val="standardContextual"/>
             </w:rPr>
           </w:pPr>
-          <w:hyperlink w:anchor="_Toc240975547" w:history="1">
+          <w:hyperlink w:anchor="_Toc241490487" w:history="1">
             <w:r>
               <w:rPr>
                 <w:rStyle w:val="Hyperlink"/>
@@ -2132,7 +2132,7 @@
               <w:rPr>
                 <w:noProof/>
               </w:rPr>
-              <w:instrText xml:space="preserve"> PAGEREF _Toc240975547 \h </w:instrText>
+              <w:instrText xml:space="preserve"> PAGEREF _Toc241490487 \h </w:instrText>
             </w:r>
             <w:r>
               <w:rPr>
@@ -2175,7 +2175,7 @@
               <w14:ligatures w14:val="standardContextual"/>
             </w:rPr>
           </w:pPr>
-          <w:hyperlink w:anchor="_Toc240975548" w:history="1">
+          <w:hyperlink w:anchor="_Toc241490488" w:history="1">
             <w:r>
               <w:rPr>
                 <w:rStyle w:val="Hyperlink"/>
@@ -2199,7 +2199,7 @@
               <w:rPr>
                 <w:noProof/>
               </w:rPr>
-              <w:instrText xml:space="preserve"> PAGEREF _Toc240975548 \h </w:instrText>
+              <w:instrText xml:space="preserve"> PAGEREF _Toc241490488 \h </w:instrText>
             </w:r>
             <w:r>
               <w:rPr>
@@ -2242,7 +2242,7 @@
               <w14:ligatures w14:val="standardContextual"/>
             </w:rPr>
           </w:pPr>
-          <w:hyperlink w:anchor="_Toc240975549" w:history="1">
+          <w:hyperlink w:anchor="_Toc241490489" w:history="1">
             <w:r>
               <w:rPr>
                 <w:rStyle w:val="Hyperlink"/>
@@ -2266,7 +2266,7 @@
               <w:rPr>
                 <w:noProof/>
               </w:rPr>
-              <w:instrText xml:space="preserve"> PAGEREF _Toc240975549 \h </w:instrText>
+              <w:instrText xml:space="preserve"> PAGEREF _Toc241490489 \h </w:instrText>
             </w:r>
             <w:r>
               <w:rPr>
@@ -2309,7 +2309,7 @@
               <w14:ligatures w14:val="standardContextual"/>
             </w:rPr>
           </w:pPr>
-          <w:hyperlink w:anchor="_Toc240975550" w:history="1">
+          <w:hyperlink w:anchor="_Toc241490490" w:history="1">
             <w:r>
               <w:rPr>
                 <w:rStyle w:val="Hyperlink"/>
@@ -2333,7 +2333,7 @@
               <w:rPr>
                 <w:noProof/>
               </w:rPr>
-              <w:instrText xml:space="preserve"> PAGEREF _Toc240975550 \h </w:instrText>
+              <w:instrText xml:space="preserve"> PAGEREF _Toc241490490 \h </w:instrText>
             </w:r>
             <w:r>
               <w:rPr>
@@ -2376,7 +2376,7 @@
               <w14:ligatures w14:val="standardContextual"/>
             </w:rPr>
           </w:pPr>
-          <w:hyperlink w:anchor="_Toc240975551" w:history="1">
+          <w:hyperlink w:anchor="_Toc241490491" w:history="1">
             <w:r>
               <w:rPr>
                 <w:rStyle w:val="Hyperlink"/>
@@ -2400,7 +2400,7 @@
               <w:rPr>
                 <w:noProof/>
               </w:rPr>
-              <w:instrText xml:space="preserve"> PAGEREF _Toc240975551 \h </w:instrText>
+              <w:instrText xml:space="preserve"> PAGEREF _Toc241490491 \h </w:instrText>
             </w:r>
             <w:r>
               <w:rPr>
@@ -2443,7 +2443,7 @@
               <w14:ligatures w14:val="standardContextual"/>
             </w:rPr>
           </w:pPr>
-          <w:hyperlink w:anchor="_Toc240975552" w:history="1">
+          <w:hyperlink w:anchor="_Toc241490492" w:history="1">
             <w:r>
               <w:rPr>
                 <w:rStyle w:val="Hyperlink"/>
@@ -2467,7 +2467,7 @@
               <w:rPr>
                 <w:noProof/>
               </w:rPr>
-              <w:instrText xml:space="preserve"> PAGEREF _Toc240975552 \h </w:instrText>
+              <w:instrText xml:space="preserve"> PAGEREF _Toc241490492 \h </w:instrText>
             </w:r>
             <w:r>
               <w:rPr>
@@ -2510,7 +2510,7 @@
               <w14:ligatures w14:val="standardContextual"/>
             </w:rPr>
           </w:pPr>
-          <w:hyperlink w:anchor="_Toc240975553" w:history="1">
+          <w:hyperlink w:anchor="_Toc241490493" w:history="1">
             <w:r>
               <w:rPr>
                 <w:rStyle w:val="Hyperlink"/>
@@ -2534,7 +2534,7 @@
               <w:rPr>
                 <w:noProof/>
               </w:rPr>
-              <w:instrText xml:space="preserve"> PAGEREF _Toc240975553 \h </w:instrText>
+              <w:instrText xml:space="preserve"> PAGEREF _Toc241490493 \h </w:instrText>
             </w:r>
             <w:r>
               <w:rPr>
@@ -2577,7 +2577,7 @@
               <w14:ligatures w14:val="standardContextual"/>
             </w:rPr>
           </w:pPr>
-          <w:hyperlink w:anchor="_Toc240975554" w:history="1">
+          <w:hyperlink w:anchor="_Toc241490494" w:history="1">
             <w:r>
               <w:rPr>
                 <w:rStyle w:val="Hyperlink"/>
@@ -2601,7 +2601,7 @@
               <w:rPr>
                 <w:noProof/>
               </w:rPr>
-              <w:instrText xml:space="preserve"> PAGEREF _Toc240975554 \h </w:instrText>
+              <w:instrText xml:space="preserve"> PAGEREF _Toc241490494 \h </w:instrText>
             </w:r>
             <w:r>
               <w:rPr>
@@ -2644,7 +2644,7 @@
               <w14:ligatures w14:val="standardContextual"/>
             </w:rPr>
           </w:pPr>
-          <w:hyperlink w:anchor="_Toc240975555" w:history="1">
+          <w:hyperlink w:anchor="_Toc241490495" w:history="1">
             <w:r>
               <w:rPr>
                 <w:rStyle w:val="Hyperlink"/>
@@ -2668,7 +2668,7 @@
               <w:rPr>
                 <w:noProof/>
               </w:rPr>
-              <w:instrText xml:space="preserve"> PAGEREF _Toc240975555 \h </w:instrText>
+              <w:instrText xml:space="preserve"> PAGEREF _Toc241490495 \h </w:instrText>
             </w:r>
             <w:r>
               <w:rPr>
@@ -2711,7 +2711,7 @@
               <w14:ligatures w14:val="standardContextual"/>
             </w:rPr>
           </w:pPr>
-          <w:hyperlink w:anchor="_Toc240975556" w:history="1">
+          <w:hyperlink w:anchor="_Toc241490496" w:history="1">
             <w:r>
               <w:rPr>
                 <w:rStyle w:val="Hyperlink"/>
@@ -2735,7 +2735,7 @@
               <w:rPr>
                 <w:noProof/>
               </w:rPr>
-              <w:instrText xml:space="preserve"> PAGEREF _Toc240975556 \h </w:instrText>
+              <w:instrText xml:space="preserve"> PAGEREF _Toc241490496 \h </w:instrText>
             </w:r>
             <w:r>
               <w:rPr>
@@ -2778,7 +2778,7 @@
               <w14:ligatures w14:val="standardContextual"/>
             </w:rPr>
           </w:pPr>
-          <w:hyperlink w:anchor="_Toc240975557" w:history="1">
+          <w:hyperlink w:anchor="_Toc241490497" w:history="1">
             <w:r>
               <w:rPr>
                 <w:rStyle w:val="Hyperlink"/>
@@ -2802,7 +2802,7 @@
               <w:rPr>
                 <w:noProof/>
               </w:rPr>
-              <w:instrText xml:space="preserve"> PAGEREF _Toc240975557 \h </w:instrText>
+              <w:instrText xml:space="preserve"> PAGEREF _Toc241490497 \h </w:instrText>
             </w:r>
             <w:r>
               <w:rPr>
@@ -2845,7 +2845,7 @@
               <w14:ligatures w14:val="standardContextual"/>
             </w:rPr>
           </w:pPr>
-          <w:hyperlink w:anchor="_Toc240975558" w:history="1">
+          <w:hyperlink w:anchor="_Toc241490498" w:history="1">
             <w:r>
               <w:rPr>
                 <w:rStyle w:val="Hyperlink"/>
@@ -2869,7 +2869,7 @@
               <w:rPr>
                 <w:noProof/>
               </w:rPr>
-              <w:instrText xml:space="preserve"> PAGEREF _Toc240975558 \h </w:instrText>
+              <w:instrText xml:space="preserve"> PAGEREF _Toc241490498 \h </w:instrText>
             </w:r>
             <w:r>
               <w:rPr>
@@ -2912,7 +2912,7 @@
               <w14:ligatures w14:val="standardContextual"/>
             </w:rPr>
           </w:pPr>
-          <w:hyperlink w:anchor="_Toc240975559" w:history="1">
+          <w:hyperlink w:anchor="_Toc241490499" w:history="1">
             <w:r>
               <w:rPr>
                 <w:rStyle w:val="Hyperlink"/>
@@ -2936,7 +2936,7 @@
               <w:rPr>
                 <w:noProof/>
               </w:rPr>
-              <w:instrText xml:space="preserve"> PAGEREF _Toc240975559 \h </w:instrText>
+              <w:instrText xml:space="preserve"> PAGEREF _Toc241490499 \h </w:instrText>
             </w:r>
             <w:r>
               <w:rPr>
@@ -2979,7 +2979,7 @@
               <w14:ligatures w14:val="standardContextual"/>
             </w:rPr>
           </w:pPr>
-          <w:hyperlink w:anchor="_Toc240975560" w:history="1">
+          <w:hyperlink w:anchor="_Toc241490500" w:history="1">
             <w:r>
               <w:rPr>
                 <w:rStyle w:val="Hyperlink"/>
@@ -3003,7 +3003,7 @@
               <w:rPr>
                 <w:noProof/>
               </w:rPr>
-              <w:instrText xml:space="preserve"> PAGEREF _Toc240975560 \h </w:instrText>
+              <w:instrText xml:space="preserve"> PAGEREF _Toc241490500 \h </w:instrText>
             </w:r>
             <w:r>
               <w:rPr>
@@ -3046,7 +3046,7 @@
               <w14:ligatures w14:val="standardContextual"/>
             </w:rPr>
           </w:pPr>
-          <w:hyperlink w:anchor="_Toc240975561" w:history="1">
+          <w:hyperlink w:anchor="_Toc241490501" w:history="1">
             <w:r>
               <w:rPr>
                 <w:rStyle w:val="Hyperlink"/>
@@ -3070,7 +3070,7 @@
               <w:rPr>
                 <w:noProof/>
               </w:rPr>
-              <w:instrText xml:space="preserve"> PAGEREF _Toc240975561 \h </w:instrText>
+              <w:instrText xml:space="preserve"> PAGEREF _Toc241490501 \h </w:instrText>
             </w:r>
             <w:r>
               <w:rPr>
@@ -3113,7 +3113,7 @@
               <w14:ligatures w14:val="standardContextual"/>
             </w:rPr>
           </w:pPr>
-          <w:hyperlink w:anchor="_Toc240975562" w:history="1">
+          <w:hyperlink w:anchor="_Toc241490502" w:history="1">
             <w:r>
               <w:rPr>
                 <w:rStyle w:val="Hyperlink"/>
@@ -3137,7 +3137,7 @@
               <w:rPr>
                 <w:noProof/>
               </w:rPr>
-              <w:instrText xml:space="preserve"> PAGEREF _Toc240975562 \h </w:instrText>
+              <w:instrText xml:space="preserve"> PAGEREF _Toc241490502 \h </w:instrText>
             </w:r>
             <w:r>
               <w:rPr>
@@ -3180,7 +3180,7 @@
               <w14:ligatures w14:val="standardContextual"/>
             </w:rPr>
           </w:pPr>
-          <w:hyperlink w:anchor="_Toc240975563" w:history="1">
+          <w:hyperlink w:anchor="_Toc241490503" w:history="1">
             <w:r>
               <w:rPr>
                 <w:rStyle w:val="Hyperlink"/>
@@ -3204,7 +3204,7 @@
               <w:rPr>
                 <w:noProof/>
               </w:rPr>
-              <w:instrText xml:space="preserve"> PAGEREF _Toc240975563 \h </w:instrText>
+              <w:instrText xml:space="preserve"> PAGEREF _Toc241490503 \h </w:instrText>
             </w:r>
             <w:r>
               <w:rPr>
@@ -3247,7 +3247,7 @@
               <w14:ligatures w14:val="standardContextual"/>
             </w:rPr>
           </w:pPr>
-          <w:hyperlink w:anchor="_Toc240975564" w:history="1">
+          <w:hyperlink w:anchor="_Toc241490504" w:history="1">
             <w:r>
               <w:rPr>
                 <w:rStyle w:val="Hyperlink"/>
@@ -3271,7 +3271,7 @@
               <w:rPr>
                 <w:noProof/>
               </w:rPr>
-              <w:instrText xml:space="preserve"> PAGEREF _Toc240975564 \h </w:instrText>
+              <w:instrText xml:space="preserve"> PAGEREF _Toc241490504 \h </w:instrText>
             </w:r>
             <w:r>
               <w:rPr>
@@ -3310,7 +3310,7 @@
         <w:pStyle w:val="Heading1"/>
         <w:pageBreakBefore/>
       </w:pPr>
-      <w:bookmarkStart w:id="0" w:name="_Toc240975524"/>
+      <w:bookmarkStart w:id="0" w:name="_Toc241490464"/>
       <w:r>
         <w:lastRenderedPageBreak/>
         <w:t>1. About this reference</w:t>
@@ -3376,7 +3376,7 @@
           <w:left w:w="10" w:type="dxa"/>
           <w:right w:w="10" w:type="dxa"/>
         </w:tblCellMar>
-        <w:tblLook w:val="0000" w:firstRow="0" w:lastRow="0" w:firstColumn="0" w:lastColumn="0" w:noHBand="0" w:noVBand="0"/>
+        <w:tblLook w:val="04A0" w:firstRow="1" w:lastRow="0" w:firstColumn="1" w:lastColumn="0" w:noHBand="0" w:noVBand="1"/>
       </w:tblPr>
       <w:tblGrid>
         <w:gridCol w:w="2635"/>
@@ -3763,7 +3763,7 @@
         <w:pStyle w:val="Heading1"/>
         <w:pageBreakBefore/>
       </w:pPr>
-      <w:bookmarkStart w:id="1" w:name="_Toc240975525"/>
+      <w:bookmarkStart w:id="1" w:name="_Toc241490465"/>
       <w:r>
         <w:lastRenderedPageBreak/>
         <w:t>2. Rules that apply on every screen</w:t>
@@ -3980,7 +3980,7 @@
         <w:pStyle w:val="Heading1"/>
         <w:pageBreakBefore/>
       </w:pPr>
-      <w:bookmarkStart w:id="2" w:name="_Toc240975526"/>
+      <w:bookmarkStart w:id="2" w:name="_Toc241490466"/>
       <w:r>
         <w:lastRenderedPageBreak/>
         <w:t>3. Who can open which screen</w:t>
@@ -4010,7 +4010,7 @@
           <w:left w:w="10" w:type="dxa"/>
           <w:right w:w="10" w:type="dxa"/>
         </w:tblCellMar>
-        <w:tblLook w:val="0000" w:firstRow="0" w:lastRow="0" w:firstColumn="0" w:lastColumn="0" w:noHBand="0" w:noVBand="0"/>
+        <w:tblLook w:val="04A0" w:firstRow="1" w:lastRow="0" w:firstColumn="1" w:lastColumn="0" w:noHBand="0" w:noVBand="1"/>
       </w:tblPr>
       <w:tblGrid>
         <w:gridCol w:w="3388"/>
@@ -9508,7 +9508,7 @@
         <w:pStyle w:val="Heading1"/>
         <w:pageBreakBefore/>
       </w:pPr>
-      <w:bookmarkStart w:id="3" w:name="_Toc240975527"/>
+      <w:bookmarkStart w:id="3" w:name="_Toc241490467"/>
       <w:r>
         <w:lastRenderedPageBreak/>
         <w:t>4. Signing in and your account</w:t>
@@ -9519,7 +9519,7 @@
       <w:pPr>
         <w:pStyle w:val="Heading2"/>
       </w:pPr>
-      <w:bookmarkStart w:id="4" w:name="_Toc240975528"/>
+      <w:bookmarkStart w:id="4" w:name="_Toc241490468"/>
       <w:r>
         <w:t>4.1 Sign in</w:t>
       </w:r>
@@ -9582,7 +9582,7 @@
           <w:left w:w="10" w:type="dxa"/>
           <w:right w:w="10" w:type="dxa"/>
         </w:tblCellMar>
-        <w:tblLook w:val="0000" w:firstRow="0" w:lastRow="0" w:firstColumn="0" w:lastColumn="0" w:noHBand="0" w:noVBand="0"/>
+        <w:tblLook w:val="04A0" w:firstRow="1" w:lastRow="0" w:firstColumn="1" w:lastColumn="0" w:noHBand="0" w:noVBand="1"/>
       </w:tblPr>
       <w:tblGrid>
         <w:gridCol w:w="1882"/>
@@ -10032,7 +10032,7 @@
       <w:pPr>
         <w:pStyle w:val="Heading2"/>
       </w:pPr>
-      <w:bookmarkStart w:id="5" w:name="_Toc240975529"/>
+      <w:bookmarkStart w:id="5" w:name="_Toc241490469"/>
       <w:r>
         <w:t>4.2 The header and menu bar (every screen)</w:t>
       </w:r>
@@ -10095,7 +10095,7 @@
           <w:left w:w="10" w:type="dxa"/>
           <w:right w:w="10" w:type="dxa"/>
         </w:tblCellMar>
-        <w:tblLook w:val="0000" w:firstRow="0" w:lastRow="0" w:firstColumn="0" w:lastColumn="0" w:noHBand="0" w:noVBand="0"/>
+        <w:tblLook w:val="04A0" w:firstRow="1" w:lastRow="0" w:firstColumn="1" w:lastColumn="0" w:noHBand="0" w:noVBand="1"/>
       </w:tblPr>
       <w:tblGrid>
         <w:gridCol w:w="1882"/>
@@ -10755,7 +10755,7 @@
       <w:pPr>
         <w:pStyle w:val="Heading2"/>
       </w:pPr>
-      <w:bookmarkStart w:id="6" w:name="_Toc240975530"/>
+      <w:bookmarkStart w:id="6" w:name="_Toc241490470"/>
       <w:r>
         <w:lastRenderedPageBreak/>
         <w:t>4.3 Change Password</w:t>
@@ -10819,7 +10819,7 @@
           <w:left w:w="10" w:type="dxa"/>
           <w:right w:w="10" w:type="dxa"/>
         </w:tblCellMar>
-        <w:tblLook w:val="0000" w:firstRow="0" w:lastRow="0" w:firstColumn="0" w:lastColumn="0" w:noHBand="0" w:noVBand="0"/>
+        <w:tblLook w:val="04A0" w:firstRow="1" w:lastRow="0" w:firstColumn="1" w:lastColumn="0" w:noHBand="0" w:noVBand="1"/>
       </w:tblPr>
       <w:tblGrid>
         <w:gridCol w:w="1882"/>
@@ -11377,7 +11377,7 @@
         <w:pStyle w:val="Heading1"/>
         <w:pageBreakBefore/>
       </w:pPr>
-      <w:bookmarkStart w:id="7" w:name="_Toc240975531"/>
+      <w:bookmarkStart w:id="7" w:name="_Toc241490471"/>
       <w:r>
         <w:lastRenderedPageBreak/>
         <w:t>5. Dashboards and Reports (read-only)</w:t>
@@ -11388,7 +11388,7 @@
       <w:pPr>
         <w:pStyle w:val="Heading2"/>
       </w:pPr>
-      <w:bookmarkStart w:id="8" w:name="_Toc240975532"/>
+      <w:bookmarkStart w:id="8" w:name="_Toc241490472"/>
       <w:r>
         <w:t>5.1 Executive Dashboard</w:t>
       </w:r>
@@ -11451,7 +11451,7 @@
           <w:left w:w="10" w:type="dxa"/>
           <w:right w:w="10" w:type="dxa"/>
         </w:tblCellMar>
-        <w:tblLook w:val="0000" w:firstRow="0" w:lastRow="0" w:firstColumn="0" w:lastColumn="0" w:noHBand="0" w:noVBand="0"/>
+        <w:tblLook w:val="04A0" w:firstRow="1" w:lastRow="0" w:firstColumn="1" w:lastColumn="0" w:noHBand="0" w:noVBand="1"/>
       </w:tblPr>
       <w:tblGrid>
         <w:gridCol w:w="1882"/>
@@ -11901,7 +11901,7 @@
       <w:pPr>
         <w:pStyle w:val="Heading2"/>
       </w:pPr>
-      <w:bookmarkStart w:id="9" w:name="_Toc240975533"/>
+      <w:bookmarkStart w:id="9" w:name="_Toc241490473"/>
       <w:r>
         <w:t>5.2 Sampling Dashboard</w:t>
       </w:r>
@@ -11964,7 +11964,7 @@
           <w:left w:w="10" w:type="dxa"/>
           <w:right w:w="10" w:type="dxa"/>
         </w:tblCellMar>
-        <w:tblLook w:val="0000" w:firstRow="0" w:lastRow="0" w:firstColumn="0" w:lastColumn="0" w:noHBand="0" w:noVBand="0"/>
+        <w:tblLook w:val="04A0" w:firstRow="1" w:lastRow="0" w:firstColumn="1" w:lastColumn="0" w:noHBand="0" w:noVBand="1"/>
       </w:tblPr>
       <w:tblGrid>
         <w:gridCol w:w="1882"/>
@@ -12414,7 +12414,7 @@
       <w:pPr>
         <w:pStyle w:val="Heading2"/>
       </w:pPr>
-      <w:bookmarkStart w:id="10" w:name="_Toc240975534"/>
+      <w:bookmarkStart w:id="10" w:name="_Toc241490474"/>
       <w:r>
         <w:t>5.3 Contact Dashboard</w:t>
       </w:r>
@@ -12478,7 +12478,7 @@
           <w:left w:w="10" w:type="dxa"/>
           <w:right w:w="10" w:type="dxa"/>
         </w:tblCellMar>
-        <w:tblLook w:val="0000" w:firstRow="0" w:lastRow="0" w:firstColumn="0" w:lastColumn="0" w:noHBand="0" w:noVBand="0"/>
+        <w:tblLook w:val="04A0" w:firstRow="1" w:lastRow="0" w:firstColumn="1" w:lastColumn="0" w:noHBand="0" w:noVBand="1"/>
       </w:tblPr>
       <w:tblGrid>
         <w:gridCol w:w="1882"/>
@@ -12718,7 +12718,7 @@
       <w:pPr>
         <w:pStyle w:val="Heading2"/>
       </w:pPr>
-      <w:bookmarkStart w:id="11" w:name="_Toc240975535"/>
+      <w:bookmarkStart w:id="11" w:name="_Toc241490475"/>
       <w:r>
         <w:t>5.4 QA Dashboard</w:t>
       </w:r>
@@ -12781,7 +12781,7 @@
           <w:left w:w="10" w:type="dxa"/>
           <w:right w:w="10" w:type="dxa"/>
         </w:tblCellMar>
-        <w:tblLook w:val="0000" w:firstRow="0" w:lastRow="0" w:firstColumn="0" w:lastColumn="0" w:noHBand="0" w:noVBand="0"/>
+        <w:tblLook w:val="04A0" w:firstRow="1" w:lastRow="0" w:firstColumn="1" w:lastColumn="0" w:noHBand="0" w:noVBand="1"/>
       </w:tblPr>
       <w:tblGrid>
         <w:gridCol w:w="1882"/>
@@ -13338,7 +13338,7 @@
       <w:pPr>
         <w:pStyle w:val="Heading2"/>
       </w:pPr>
-      <w:bookmarkStart w:id="12" w:name="_Toc240975536"/>
+      <w:bookmarkStart w:id="12" w:name="_Toc241490476"/>
       <w:r>
         <w:t>5.5 KII / Document Dashboard</w:t>
       </w:r>
@@ -13401,7 +13401,7 @@
           <w:left w:w="10" w:type="dxa"/>
           <w:right w:w="10" w:type="dxa"/>
         </w:tblCellMar>
-        <w:tblLook w:val="0000" w:firstRow="0" w:lastRow="0" w:firstColumn="0" w:lastColumn="0" w:noHBand="0" w:noVBand="0"/>
+        <w:tblLook w:val="04A0" w:firstRow="1" w:lastRow="0" w:firstColumn="1" w:lastColumn="0" w:noHBand="0" w:noVBand="1"/>
       </w:tblPr>
       <w:tblGrid>
         <w:gridCol w:w="1882"/>
@@ -13748,7 +13748,7 @@
       <w:pPr>
         <w:pStyle w:val="Heading2"/>
       </w:pPr>
-      <w:bookmarkStart w:id="13" w:name="_Toc240975537"/>
+      <w:bookmarkStart w:id="13" w:name="_Toc241490477"/>
       <w:r>
         <w:lastRenderedPageBreak/>
         <w:t>5.6 Reports</w:t>
@@ -13812,7 +13812,7 @@
           <w:left w:w="10" w:type="dxa"/>
           <w:right w:w="10" w:type="dxa"/>
         </w:tblCellMar>
-        <w:tblLook w:val="0000" w:firstRow="0" w:lastRow="0" w:firstColumn="0" w:lastColumn="0" w:noHBand="0" w:noVBand="0"/>
+        <w:tblLook w:val="04A0" w:firstRow="1" w:lastRow="0" w:firstColumn="1" w:lastColumn="0" w:noHBand="0" w:noVBand="1"/>
       </w:tblPr>
       <w:tblGrid>
         <w:gridCol w:w="1882"/>
@@ -14263,7 +14263,7 @@
         <w:pStyle w:val="Heading1"/>
         <w:pageBreakBefore/>
       </w:pPr>
-      <w:bookmarkStart w:id="14" w:name="_Toc240975538"/>
+      <w:bookmarkStart w:id="14" w:name="_Toc241490478"/>
       <w:r>
         <w:lastRenderedPageBreak/>
         <w:t>6. The sample and contact</w:t>
@@ -14274,7 +14274,7 @@
       <w:pPr>
         <w:pStyle w:val="Heading2"/>
       </w:pPr>
-      <w:bookmarkStart w:id="15" w:name="_Toc240975539"/>
+      <w:bookmarkStart w:id="15" w:name="_Toc241490479"/>
       <w:r>
         <w:t>6.1 Main-400 Register (and Reserve)</w:t>
       </w:r>
@@ -14337,7 +14337,7 @@
           <w:left w:w="10" w:type="dxa"/>
           <w:right w:w="10" w:type="dxa"/>
         </w:tblCellMar>
-        <w:tblLook w:val="0000" w:firstRow="0" w:lastRow="0" w:firstColumn="0" w:lastColumn="0" w:noHBand="0" w:noVBand="0"/>
+        <w:tblLook w:val="04A0" w:firstRow="1" w:lastRow="0" w:firstColumn="1" w:lastColumn="0" w:noHBand="0" w:noVBand="1"/>
       </w:tblPr>
       <w:tblGrid>
         <w:gridCol w:w="1882"/>
@@ -15207,7 +15207,7 @@
       <w:pPr>
         <w:pStyle w:val="Heading2"/>
       </w:pPr>
-      <w:bookmarkStart w:id="16" w:name="_Toc240975540"/>
+      <w:bookmarkStart w:id="16" w:name="_Toc241490480"/>
       <w:r>
         <w:t>6.2 Case page</w:t>
       </w:r>
@@ -15270,7 +15270,7 @@
           <w:left w:w="10" w:type="dxa"/>
           <w:right w:w="10" w:type="dxa"/>
         </w:tblCellMar>
-        <w:tblLook w:val="0000" w:firstRow="0" w:lastRow="0" w:firstColumn="0" w:lastColumn="0" w:noHBand="0" w:noVBand="0"/>
+        <w:tblLook w:val="04A0" w:firstRow="1" w:lastRow="0" w:firstColumn="1" w:lastColumn="0" w:noHBand="0" w:noVBand="1"/>
       </w:tblPr>
       <w:tblGrid>
         <w:gridCol w:w="1882"/>
@@ -16886,7 +16886,7 @@
       <w:pPr>
         <w:pStyle w:val="Heading2"/>
       </w:pPr>
-      <w:bookmarkStart w:id="17" w:name="_Toc240975541"/>
+      <w:bookmarkStart w:id="17" w:name="_Toc241490481"/>
       <w:r>
         <w:t>6.3 Pre-Interview Profile (PROIT) and its review screen</w:t>
       </w:r>
@@ -16949,7 +16949,7 @@
           <w:left w:w="10" w:type="dxa"/>
           <w:right w:w="10" w:type="dxa"/>
         </w:tblCellMar>
-        <w:tblLook w:val="0000" w:firstRow="0" w:lastRow="0" w:firstColumn="0" w:lastColumn="0" w:noHBand="0" w:noVBand="0"/>
+        <w:tblLook w:val="04A0" w:firstRow="1" w:lastRow="0" w:firstColumn="1" w:lastColumn="0" w:noHBand="0" w:noVBand="1"/>
       </w:tblPr>
       <w:tblGrid>
         <w:gridCol w:w="1882"/>
@@ -18451,7 +18451,7 @@
       <w:pPr>
         <w:pStyle w:val="Heading2"/>
       </w:pPr>
-      <w:bookmarkStart w:id="18" w:name="_Toc240975542"/>
+      <w:bookmarkStart w:id="18" w:name="_Toc241490482"/>
       <w:r>
         <w:t>6.4 Interview sheet (verifying a locked profile)</w:t>
       </w:r>
@@ -18514,7 +18514,7 @@
           <w:left w:w="10" w:type="dxa"/>
           <w:right w:w="10" w:type="dxa"/>
         </w:tblCellMar>
-        <w:tblLook w:val="0000" w:firstRow="0" w:lastRow="0" w:firstColumn="0" w:lastColumn="0" w:noHBand="0" w:noVBand="0"/>
+        <w:tblLook w:val="04A0" w:firstRow="1" w:lastRow="0" w:firstColumn="1" w:lastColumn="0" w:noHBand="0" w:noVBand="1"/>
       </w:tblPr>
       <w:tblGrid>
         <w:gridCol w:w="1882"/>
@@ -19709,7 +19709,7 @@
       <w:pPr>
         <w:pStyle w:val="Heading2"/>
       </w:pPr>
-      <w:bookmarkStart w:id="19" w:name="_Toc240975543"/>
+      <w:bookmarkStart w:id="19" w:name="_Toc241490483"/>
       <w:r>
         <w:t>6.5 Register Organisation</w:t>
       </w:r>
@@ -19772,7 +19772,7 @@
           <w:left w:w="10" w:type="dxa"/>
           <w:right w:w="10" w:type="dxa"/>
         </w:tblCellMar>
-        <w:tblLook w:val="0000" w:firstRow="0" w:lastRow="0" w:firstColumn="0" w:lastColumn="0" w:noHBand="0" w:noVBand="0"/>
+        <w:tblLook w:val="04A0" w:firstRow="1" w:lastRow="0" w:firstColumn="1" w:lastColumn="0" w:noHBand="0" w:noVBand="1"/>
       </w:tblPr>
       <w:tblGrid>
         <w:gridCol w:w="1882"/>
@@ -20432,7 +20432,7 @@
       <w:pPr>
         <w:pStyle w:val="Heading2"/>
       </w:pPr>
-      <w:bookmarkStart w:id="20" w:name="_Toc240975544"/>
+      <w:bookmarkStart w:id="20" w:name="_Toc241490484"/>
       <w:r>
         <w:t>6.6 Appointment Queue</w:t>
       </w:r>
@@ -20495,7 +20495,7 @@
           <w:left w:w="10" w:type="dxa"/>
           <w:right w:w="10" w:type="dxa"/>
         </w:tblCellMar>
-        <w:tblLook w:val="0000" w:firstRow="0" w:lastRow="0" w:firstColumn="0" w:lastColumn="0" w:noHBand="0" w:noVBand="0"/>
+        <w:tblLook w:val="04A0" w:firstRow="1" w:lastRow="0" w:firstColumn="1" w:lastColumn="0" w:noHBand="0" w:noVBand="1"/>
       </w:tblPr>
       <w:tblGrid>
         <w:gridCol w:w="1882"/>
@@ -21053,7 +21053,7 @@
       <w:pPr>
         <w:pStyle w:val="Heading2"/>
       </w:pPr>
-      <w:bookmarkStart w:id="21" w:name="_Toc240975545"/>
+      <w:bookmarkStart w:id="21" w:name="_Toc241490485"/>
       <w:r>
         <w:t>6.7 Follow-ups due</w:t>
       </w:r>
@@ -21116,7 +21116,7 @@
           <w:left w:w="10" w:type="dxa"/>
           <w:right w:w="10" w:type="dxa"/>
         </w:tblCellMar>
-        <w:tblLook w:val="0000" w:firstRow="0" w:lastRow="0" w:firstColumn="0" w:lastColumn="0" w:noHBand="0" w:noVBand="0"/>
+        <w:tblLook w:val="04A0" w:firstRow="1" w:lastRow="0" w:firstColumn="1" w:lastColumn="0" w:noHBand="0" w:noVBand="1"/>
       </w:tblPr>
       <w:tblGrid>
         <w:gridCol w:w="1882"/>
@@ -21566,7 +21566,7 @@
       <w:pPr>
         <w:pStyle w:val="Heading2"/>
       </w:pPr>
-      <w:bookmarkStart w:id="22" w:name="_Toc240975546"/>
+      <w:bookmarkStart w:id="22" w:name="_Toc241490486"/>
       <w:r>
         <w:t>6.8 Reserve Activation</w:t>
       </w:r>
@@ -21629,7 +21629,7 @@
           <w:left w:w="10" w:type="dxa"/>
           <w:right w:w="10" w:type="dxa"/>
         </w:tblCellMar>
-        <w:tblLook w:val="0000" w:firstRow="0" w:lastRow="0" w:firstColumn="0" w:lastColumn="0" w:noHBand="0" w:noVBand="0"/>
+        <w:tblLook w:val="04A0" w:firstRow="1" w:lastRow="0" w:firstColumn="1" w:lastColumn="0" w:noHBand="0" w:noVBand="1"/>
       </w:tblPr>
       <w:tblGrid>
         <w:gridCol w:w="1882"/>
@@ -22188,7 +22188,7 @@
         <w:pStyle w:val="Heading1"/>
         <w:pageBreakBefore/>
       </w:pPr>
-      <w:bookmarkStart w:id="23" w:name="_Toc240975547"/>
+      <w:bookmarkStart w:id="23" w:name="_Toc241490487"/>
       <w:r>
         <w:lastRenderedPageBreak/>
         <w:t>7. Quality checking</w:t>
@@ -22199,7 +22199,7 @@
       <w:pPr>
         <w:pStyle w:val="Heading2"/>
       </w:pPr>
-      <w:bookmarkStart w:id="24" w:name="_Toc240975548"/>
+      <w:bookmarkStart w:id="24" w:name="_Toc241490488"/>
       <w:r>
         <w:t>7.1 QA Queue (with the KoboToolbox sync panel)</w:t>
       </w:r>
@@ -22262,7 +22262,7 @@
           <w:left w:w="10" w:type="dxa"/>
           <w:right w:w="10" w:type="dxa"/>
         </w:tblCellMar>
-        <w:tblLook w:val="0000" w:firstRow="0" w:lastRow="0" w:firstColumn="0" w:lastColumn="0" w:noHBand="0" w:noVBand="0"/>
+        <w:tblLook w:val="04A0" w:firstRow="1" w:lastRow="0" w:firstColumn="1" w:lastColumn="0" w:noHBand="0" w:noVBand="1"/>
       </w:tblPr>
       <w:tblGrid>
         <w:gridCol w:w="1882"/>
@@ -22922,7 +22922,7 @@
       <w:pPr>
         <w:pStyle w:val="Heading2"/>
       </w:pPr>
-      <w:bookmarkStart w:id="25" w:name="_Toc240975549"/>
+      <w:bookmarkStart w:id="25" w:name="_Toc241490489"/>
       <w:r>
         <w:t>7.2 QA Exceptions</w:t>
       </w:r>
@@ -22985,7 +22985,7 @@
           <w:left w:w="10" w:type="dxa"/>
           <w:right w:w="10" w:type="dxa"/>
         </w:tblCellMar>
-        <w:tblLook w:val="0000" w:firstRow="0" w:lastRow="0" w:firstColumn="0" w:lastColumn="0" w:noHBand="0" w:noVBand="0"/>
+        <w:tblLook w:val="04A0" w:firstRow="1" w:lastRow="0" w:firstColumn="1" w:lastColumn="0" w:noHBand="0" w:noVBand="1"/>
       </w:tblPr>
       <w:tblGrid>
         <w:gridCol w:w="1882"/>
@@ -23754,7 +23754,7 @@
         <w:pStyle w:val="Heading1"/>
         <w:pageBreakBefore/>
       </w:pPr>
-      <w:bookmarkStart w:id="26" w:name="_Toc240975550"/>
+      <w:bookmarkStart w:id="26" w:name="_Toc241490490"/>
       <w:r>
         <w:lastRenderedPageBreak/>
         <w:t>8. Key Informant Interviews</w:t>
@@ -23765,7 +23765,7 @@
       <w:pPr>
         <w:pStyle w:val="Heading2"/>
       </w:pPr>
-      <w:bookmarkStart w:id="27" w:name="_Toc240975551"/>
+      <w:bookmarkStart w:id="27" w:name="_Toc241490491"/>
       <w:r>
         <w:t>8.1 KII Register</w:t>
       </w:r>
@@ -23828,7 +23828,7 @@
           <w:left w:w="10" w:type="dxa"/>
           <w:right w:w="10" w:type="dxa"/>
         </w:tblCellMar>
-        <w:tblLook w:val="0000" w:firstRow="0" w:lastRow="0" w:firstColumn="0" w:lastColumn="0" w:noHBand="0" w:noVBand="0"/>
+        <w:tblLook w:val="04A0" w:firstRow="1" w:lastRow="0" w:firstColumn="1" w:lastColumn="0" w:noHBand="0" w:noVBand="1"/>
       </w:tblPr>
       <w:tblGrid>
         <w:gridCol w:w="1882"/>
@@ -24385,7 +24385,7 @@
       <w:pPr>
         <w:pStyle w:val="Heading2"/>
       </w:pPr>
-      <w:bookmarkStart w:id="28" w:name="_Toc240975552"/>
+      <w:bookmarkStart w:id="28" w:name="_Toc241490492"/>
       <w:r>
         <w:t>8.2 New KII Record</w:t>
       </w:r>
@@ -24448,7 +24448,7 @@
           <w:left w:w="10" w:type="dxa"/>
           <w:right w:w="10" w:type="dxa"/>
         </w:tblCellMar>
-        <w:tblLook w:val="0000" w:firstRow="0" w:lastRow="0" w:firstColumn="0" w:lastColumn="0" w:noHBand="0" w:noVBand="0"/>
+        <w:tblLook w:val="04A0" w:firstRow="1" w:lastRow="0" w:firstColumn="1" w:lastColumn="0" w:noHBand="0" w:noVBand="1"/>
       </w:tblPr>
       <w:tblGrid>
         <w:gridCol w:w="1882"/>
@@ -24795,7 +24795,7 @@
       <w:pPr>
         <w:pStyle w:val="Heading2"/>
       </w:pPr>
-      <w:bookmarkStart w:id="29" w:name="_Toc240975553"/>
+      <w:bookmarkStart w:id="29" w:name="_Toc241490493"/>
       <w:r>
         <w:t>8.3 KII record</w:t>
       </w:r>
@@ -24858,7 +24858,7 @@
           <w:left w:w="10" w:type="dxa"/>
           <w:right w:w="10" w:type="dxa"/>
         </w:tblCellMar>
-        <w:tblLook w:val="0000" w:firstRow="0" w:lastRow="0" w:firstColumn="0" w:lastColumn="0" w:noHBand="0" w:noVBand="0"/>
+        <w:tblLook w:val="04A0" w:firstRow="1" w:lastRow="0" w:firstColumn="1" w:lastColumn="0" w:noHBand="0" w:noVBand="1"/>
       </w:tblPr>
       <w:tblGrid>
         <w:gridCol w:w="1882"/>
@@ -25837,7 +25837,7 @@
         <w:pStyle w:val="Heading1"/>
         <w:pageBreakBefore/>
       </w:pPr>
-      <w:bookmarkStart w:id="30" w:name="_Toc240975554"/>
+      <w:bookmarkStart w:id="30" w:name="_Toc241490494"/>
       <w:r>
         <w:lastRenderedPageBreak/>
         <w:t>9. Documentary evidence</w:t>
@@ -25848,7 +25848,7 @@
       <w:pPr>
         <w:pStyle w:val="Heading2"/>
       </w:pPr>
-      <w:bookmarkStart w:id="31" w:name="_Toc240975555"/>
+      <w:bookmarkStart w:id="31" w:name="_Toc241490495"/>
       <w:r>
         <w:t>9.1 Documents (the corpus)</w:t>
       </w:r>
@@ -25911,7 +25911,7 @@
           <w:left w:w="10" w:type="dxa"/>
           <w:right w:w="10" w:type="dxa"/>
         </w:tblCellMar>
-        <w:tblLook w:val="0000" w:firstRow="0" w:lastRow="0" w:firstColumn="0" w:lastColumn="0" w:noHBand="0" w:noVBand="0"/>
+        <w:tblLook w:val="04A0" w:firstRow="1" w:lastRow="0" w:firstColumn="1" w:lastColumn="0" w:noHBand="0" w:noVBand="1"/>
       </w:tblPr>
       <w:tblGrid>
         <w:gridCol w:w="1882"/>
@@ -26468,7 +26468,7 @@
       <w:pPr>
         <w:pStyle w:val="Heading2"/>
       </w:pPr>
-      <w:bookmarkStart w:id="32" w:name="_Toc240975556"/>
+      <w:bookmarkStart w:id="32" w:name="_Toc241490496"/>
       <w:r>
         <w:t>9.2 New Documentary Evidence Record</w:t>
       </w:r>
@@ -26531,7 +26531,7 @@
           <w:left w:w="10" w:type="dxa"/>
           <w:right w:w="10" w:type="dxa"/>
         </w:tblCellMar>
-        <w:tblLook w:val="0000" w:firstRow="0" w:lastRow="0" w:firstColumn="0" w:lastColumn="0" w:noHBand="0" w:noVBand="0"/>
+        <w:tblLook w:val="04A0" w:firstRow="1" w:lastRow="0" w:firstColumn="1" w:lastColumn="0" w:noHBand="0" w:noVBand="1"/>
       </w:tblPr>
       <w:tblGrid>
         <w:gridCol w:w="1882"/>
@@ -27299,7 +27299,7 @@
       <w:pPr>
         <w:pStyle w:val="Heading2"/>
       </w:pPr>
-      <w:bookmarkStart w:id="33" w:name="_Toc240975557"/>
+      <w:bookmarkStart w:id="33" w:name="_Toc241490497"/>
       <w:r>
         <w:t>9.3 Document record</w:t>
       </w:r>
@@ -27362,7 +27362,7 @@
           <w:left w:w="10" w:type="dxa"/>
           <w:right w:w="10" w:type="dxa"/>
         </w:tblCellMar>
-        <w:tblLook w:val="0000" w:firstRow="0" w:lastRow="0" w:firstColumn="0" w:lastColumn="0" w:noHBand="0" w:noVBand="0"/>
+        <w:tblLook w:val="04A0" w:firstRow="1" w:lastRow="0" w:firstColumn="1" w:lastColumn="0" w:noHBand="0" w:noVBand="1"/>
       </w:tblPr>
       <w:tblGrid>
         <w:gridCol w:w="1882"/>
@@ -28653,7 +28653,7 @@
       <w:pPr>
         <w:pStyle w:val="Heading2"/>
       </w:pPr>
-      <w:bookmarkStart w:id="34" w:name="_Toc240975558"/>
+      <w:bookmarkStart w:id="34" w:name="_Toc241490498"/>
       <w:r>
         <w:t>9.4 Auto-fill review screen</w:t>
       </w:r>
@@ -28716,7 +28716,7 @@
           <w:left w:w="10" w:type="dxa"/>
           <w:right w:w="10" w:type="dxa"/>
         </w:tblCellMar>
-        <w:tblLook w:val="0000" w:firstRow="0" w:lastRow="0" w:firstColumn="0" w:lastColumn="0" w:noHBand="0" w:noVBand="0"/>
+        <w:tblLook w:val="04A0" w:firstRow="1" w:lastRow="0" w:firstColumn="1" w:lastColumn="0" w:noHBand="0" w:noVBand="1"/>
       </w:tblPr>
       <w:tblGrid>
         <w:gridCol w:w="1882"/>
@@ -29695,7 +29695,7 @@
         <w:pStyle w:val="Heading1"/>
         <w:pageBreakBefore/>
       </w:pPr>
-      <w:bookmarkStart w:id="35" w:name="_Toc240975559"/>
+      <w:bookmarkStart w:id="35" w:name="_Toc241490499"/>
       <w:r>
         <w:lastRenderedPageBreak/>
         <w:t>10. Completed forms and exports</w:t>
@@ -29706,7 +29706,7 @@
       <w:pPr>
         <w:pStyle w:val="Heading2"/>
       </w:pPr>
-      <w:bookmarkStart w:id="36" w:name="_Toc240975560"/>
+      <w:bookmarkStart w:id="36" w:name="_Toc241490500"/>
       <w:r>
         <w:t>10.1 Completed forms (Form PDFs)</w:t>
       </w:r>
@@ -29769,7 +29769,7 @@
           <w:left w:w="10" w:type="dxa"/>
           <w:right w:w="10" w:type="dxa"/>
         </w:tblCellMar>
-        <w:tblLook w:val="0000" w:firstRow="0" w:lastRow="0" w:firstColumn="0" w:lastColumn="0" w:noHBand="0" w:noVBand="0"/>
+        <w:tblLook w:val="04A0" w:firstRow="1" w:lastRow="0" w:firstColumn="1" w:lastColumn="0" w:noHBand="0" w:noVBand="1"/>
       </w:tblPr>
       <w:tblGrid>
         <w:gridCol w:w="1882"/>
@@ -30972,7 +30972,7 @@
         <w:pStyle w:val="Heading1"/>
         <w:pageBreakBefore/>
       </w:pPr>
-      <w:bookmarkStart w:id="37" w:name="_Toc240975561"/>
+      <w:bookmarkStart w:id="37" w:name="_Toc241490501"/>
       <w:r>
         <w:lastRenderedPageBreak/>
         <w:t>11. Study administration</w:t>
@@ -30983,7 +30983,7 @@
       <w:pPr>
         <w:pStyle w:val="Heading2"/>
       </w:pPr>
-      <w:bookmarkStart w:id="38" w:name="_Toc240975562"/>
+      <w:bookmarkStart w:id="38" w:name="_Toc241490502"/>
       <w:r>
         <w:t>11.1 Cost Dashboard</w:t>
       </w:r>
@@ -31046,7 +31046,7 @@
           <w:left w:w="10" w:type="dxa"/>
           <w:right w:w="10" w:type="dxa"/>
         </w:tblCellMar>
-        <w:tblLook w:val="0000" w:firstRow="0" w:lastRow="0" w:firstColumn="0" w:lastColumn="0" w:noHBand="0" w:noVBand="0"/>
+        <w:tblLook w:val="04A0" w:firstRow="1" w:lastRow="0" w:firstColumn="1" w:lastColumn="0" w:noHBand="0" w:noVBand="1"/>
       </w:tblPr>
       <w:tblGrid>
         <w:gridCol w:w="1882"/>
@@ -31393,7 +31393,7 @@
       <w:pPr>
         <w:pStyle w:val="Heading2"/>
       </w:pPr>
-      <w:bookmarkStart w:id="39" w:name="_Toc240975563"/>
+      <w:bookmarkStart w:id="39" w:name="_Toc241490503"/>
       <w:r>
         <w:t>11.2 Audit Log</w:t>
       </w:r>
@@ -31456,7 +31456,7 @@
           <w:left w:w="10" w:type="dxa"/>
           <w:right w:w="10" w:type="dxa"/>
         </w:tblCellMar>
-        <w:tblLook w:val="0000" w:firstRow="0" w:lastRow="0" w:firstColumn="0" w:lastColumn="0" w:noHBand="0" w:noVBand="0"/>
+        <w:tblLook w:val="04A0" w:firstRow="1" w:lastRow="0" w:firstColumn="1" w:lastColumn="0" w:noHBand="0" w:noVBand="1"/>
       </w:tblPr>
       <w:tblGrid>
         <w:gridCol w:w="1882"/>
@@ -31803,7 +31803,7 @@
       <w:pPr>
         <w:pStyle w:val="Heading2"/>
       </w:pPr>
-      <w:bookmarkStart w:id="40" w:name="_Toc240975564"/>
+      <w:bookmarkStart w:id="40" w:name="_Toc241490504"/>
       <w:r>
         <w:t>11.3 Export</w:t>
       </w:r>
@@ -31866,7 +31866,7 @@
           <w:left w:w="10" w:type="dxa"/>
           <w:right w:w="10" w:type="dxa"/>
         </w:tblCellMar>
-        <w:tblLook w:val="0000" w:firstRow="0" w:lastRow="0" w:firstColumn="0" w:lastColumn="0" w:noHBand="0" w:noVBand="0"/>
+        <w:tblLook w:val="04A0" w:firstRow="1" w:lastRow="0" w:firstColumn="1" w:lastColumn="0" w:noHBand="0" w:noVBand="1"/>
       </w:tblPr>
       <w:tblGrid>
         <w:gridCol w:w="1882"/>
@@ -32233,6 +32233,110 @@
                 <w:sz w:val="19"/>
                 <w:szCs w:val="19"/>
               </w:rPr>
+              <w:t>Analysis packs → Download SmartPLS pack / interviews pack / documents pack (the PI only)</w:t>
+            </w:r>
+          </w:p>
+        </w:tc>
+        <w:tc>
+          <w:tcPr>
+            <w:tcW w:w="3012" w:type="dxa"/>
+            <w:tcMar>
+              <w:top w:w="70" w:type="dxa"/>
+              <w:left w:w="110" w:type="dxa"/>
+              <w:bottom w:w="70" w:type="dxa"/>
+              <w:right w:w="110" w:type="dxa"/>
+            </w:tcMar>
+          </w:tcPr>
+          <w:p>
+            <w:pPr>
+              <w:spacing w:after="40"/>
+            </w:pPr>
+            <w:r>
+              <w:rPr>
+                <w:sz w:val="19"/>
+                <w:szCs w:val="19"/>
+              </w:rPr>
+              <w:t>Downloads a ZIP that opens directly in SmartPLS 4 (questionnaire, numeric, -99 for missing) or ATLAS.ti (interviews as Word documents, documents named by ID), each with a README and an attribute or dictionary file. PI only.</w:t>
+            </w:r>
+          </w:p>
+        </w:tc>
+        <w:tc>
+          <w:tcPr>
+            <w:tcW w:w="2447" w:type="dxa"/>
+            <w:tcMar>
+              <w:top w:w="70" w:type="dxa"/>
+              <w:left w:w="110" w:type="dxa"/>
+              <w:bottom w:w="70" w:type="dxa"/>
+              <w:right w:w="110" w:type="dxa"/>
+            </w:tcMar>
+          </w:tcPr>
+          <w:p>
+            <w:pPr>
+              <w:spacing w:after="40"/>
+            </w:pPr>
+            <w:r>
+              <w:rPr>
+                <w:sz w:val="19"/>
+                <w:szCs w:val="19"/>
+              </w:rPr>
+              <w:t>Removes the copying and recoding between the portal and the analysis software. No names, organisation, job title or contact details; withdrawn participants left out.</w:t>
+            </w:r>
+          </w:p>
+        </w:tc>
+        <w:tc>
+          <w:tcPr>
+            <w:tcW w:w="2071" w:type="dxa"/>
+            <w:tcMar>
+              <w:top w:w="70" w:type="dxa"/>
+              <w:left w:w="110" w:type="dxa"/>
+              <w:bottom w:w="70" w:type="dxa"/>
+              <w:right w:w="110" w:type="dxa"/>
+            </w:tcMar>
+          </w:tcPr>
+          <w:p>
+            <w:pPr>
+              <w:spacing w:after="40"/>
+            </w:pPr>
+            <w:r>
+              <w:rPr>
+                <w:sz w:val="19"/>
+                <w:szCs w:val="19"/>
+              </w:rPr>
+              <w:t>A ZIP downloads; the download is audited.</w:t>
+            </w:r>
+          </w:p>
+        </w:tc>
+      </w:tr>
+      <w:tr>
+        <w:tblPrEx>
+          <w:tblCellMar>
+            <w:top w:w="0" w:type="dxa"/>
+            <w:bottom w:w="0" w:type="dxa"/>
+          </w:tblCellMar>
+        </w:tblPrEx>
+        <w:trPr>
+          <w:cantSplit/>
+        </w:trPr>
+        <w:tc>
+          <w:tcPr>
+            <w:tcW w:w="1882" w:type="dxa"/>
+            <w:shd w:val="clear" w:color="auto" w:fill="F8FAFB"/>
+            <w:tcMar>
+              <w:top w:w="70" w:type="dxa"/>
+              <w:left w:w="110" w:type="dxa"/>
+              <w:bottom w:w="70" w:type="dxa"/>
+              <w:right w:w="110" w:type="dxa"/>
+            </w:tcMar>
+          </w:tcPr>
+          <w:p>
+            <w:pPr>
+              <w:spacing w:after="40"/>
+            </w:pPr>
+            <w:r>
+              <w:rPr>
+                <w:sz w:val="19"/>
+                <w:szCs w:val="19"/>
+              </w:rPr>
               <w:t>KoboToolbox data → Excel workbook / All completed forms (PDF ZIP), for each form (the PI only)</w:t>
             </w:r>
           </w:p>
@@ -32240,6 +32344,7 @@
         <w:tc>
           <w:tcPr>
             <w:tcW w:w="3012" w:type="dxa"/>
+            <w:shd w:val="clear" w:color="auto" w:fill="F8FAFB"/>
             <w:tcMar>
               <w:top w:w="70" w:type="dxa"/>
               <w:left w:w="110" w:type="dxa"/>
@@ -32263,6 +32368,7 @@
         <w:tc>
           <w:tcPr>
             <w:tcW w:w="2447" w:type="dxa"/>
+            <w:shd w:val="clear" w:color="auto" w:fill="F8FAFB"/>
             <w:tcMar>
               <w:top w:w="70" w:type="dxa"/>
               <w:left w:w="110" w:type="dxa"/>
@@ -32286,6 +32392,7 @@
         <w:tc>
           <w:tcPr>
             <w:tcW w:w="2071" w:type="dxa"/>
+            <w:shd w:val="clear" w:color="auto" w:fill="F8FAFB"/>
             <w:tcMar>
               <w:top w:w="70" w:type="dxa"/>
               <w:left w:w="110" w:type="dxa"/>
@@ -32361,7 +32468,7 @@
         <w:sz w:val="16"/>
         <w:szCs w:val="16"/>
       </w:rPr>
-      <w:t>Version 1.10 · 22 September 2026</w:t>
+      <w:t>Version 1.11 · 28 September 2026</w:t>
     </w:r>
     <w:r>
       <w:rPr>
@@ -32534,68 +32641,10 @@
 <file path=word/numbering.xml><?xml version="1.0" encoding="utf-8"?>
 <w:numbering xmlns:wpc="http://schemas.microsoft.com/office/word/2010/wordprocessingCanvas" xmlns:cx="http://schemas.microsoft.com/office/drawing/2014/chartex" xmlns:cx1="http://schemas.microsoft.com/office/drawing/2015/9/8/chartex" xmlns:cx2="http://schemas.microsoft.com/office/drawing/2015/10/21/chartex" xmlns:cx3="http://schemas.microsoft.com/office/drawing/2016/5/9/chartex" xmlns:cx4="http://schemas.microsoft.com/office/drawing/2016/5/10/chartex" xmlns:cx5="http://schemas.microsoft.com/office/drawing/2016/5/11/chartex" xmlns:cx6="http://schemas.microsoft.com/office/drawing/2016/5/12/chartex" xmlns:cx7="http://schemas.microsoft.com/office/drawing/2016/5/13/chartex" xmlns:cx8="http://schemas.microsoft.com/office/drawing/2016/5/14/chartex" xmlns:mc="http://schemas.openxmlformats.org/markup-compatibility/2006" xmlns:aink="http://schemas.microsoft.com/office/drawing/2016/ink" xmlns:am3d="http://schemas.microsoft.com/office/drawing/2017/model3d" xmlns:o="urn:schemas-microsoft-com:office:office" xmlns:oel="http://schemas.microsoft.com/office/2019/extlst" xmlns:r="http://schemas.openxmlformats.org/officeDocument/2006/relationships" xmlns:m="http://schemas.openxmlformats.org/officeDocument/2006/math" xmlns:v="urn:schemas-microsoft-com:vml" xmlns:wp14="http://schemas.microsoft.com/office/word/2010/wordprocessingDrawing" xmlns:wp="http://schemas.openxmlformats.org/drawingml/2006/wordprocessingDrawing" xmlns:w10="urn:schemas-microsoft-com:office:word" xmlns:w="http://schemas.openxmlformats.org/wordprocessingml/2006/main" xmlns:w14="http://schemas.microsoft.com/office/word/2010/wordml" xmlns:w15="http://schemas.microsoft.com/office/word/2012/wordml" xmlns:w16cex="http://schemas.microsoft.com/office/word/2018/wordml/cex" xmlns:w16cid="http://schemas.microsoft.com/office/word/2016/wordml/cid" xmlns:w16="http://schemas.microsoft.com/office/word/2018/wordml" xmlns:w16sdtdh="http://schemas.microsoft.com/office/word/2020/wordml/sdtdatahash" xmlns:w16se="http://schemas.microsoft.com/office/word/2015/wordml/symex" xmlns:wpg="http://schemas.microsoft.com/office/word/2010/wordprocessingGroup" xmlns:wpi="http://schemas.microsoft.com/office/word/2010/wordprocessingInk" xmlns:wne="http://schemas.microsoft.com/office/word/2006/wordml" xmlns:wps="http://schemas.microsoft.com/office/word/2010/wordprocessingShape" mc:Ignorable="w14 w15 w16se w16cid w16 w16cex w16sdtdh wp14">
   <w:abstractNum w:abstractNumId="0" w15:restartNumberingAfterBreak="0">
-    <w:nsid w:val="49E647EE"/>
+    <w:nsid w:val="2746587D"/>
     <w:multiLevelType w:val="hybridMultilevel"/>
-    <w:tmpl w:val="59B83E80"/>
-    <w:lvl w:ilvl="0" w:tplc="2A7679BA">
-      <w:start w:val="1"/>
-      <w:numFmt w:val="bullet"/>
-      <w:lvlText w:val="•"/>
-      <w:lvlJc w:val="left"/>
-      <w:pPr>
-        <w:ind w:left="460" w:hanging="280"/>
-      </w:pPr>
-    </w:lvl>
-    <w:lvl w:ilvl="1" w:tplc="418E56E4">
-      <w:start w:val="1"/>
-      <w:numFmt w:val="bullet"/>
-      <w:lvlText w:val="–"/>
-      <w:lvlJc w:val="left"/>
-      <w:pPr>
-        <w:ind w:left="900" w:hanging="280"/>
-      </w:pPr>
-    </w:lvl>
-    <w:lvl w:ilvl="2" w:tplc="F67CAF44">
-      <w:numFmt w:val="decimal"/>
-      <w:lvlText w:val=""/>
-      <w:lvlJc w:val="left"/>
-    </w:lvl>
-    <w:lvl w:ilvl="3" w:tplc="4F70F6D0">
-      <w:numFmt w:val="decimal"/>
-      <w:lvlText w:val=""/>
-      <w:lvlJc w:val="left"/>
-    </w:lvl>
-    <w:lvl w:ilvl="4" w:tplc="535ED2E0">
-      <w:numFmt w:val="decimal"/>
-      <w:lvlText w:val=""/>
-      <w:lvlJc w:val="left"/>
-    </w:lvl>
-    <w:lvl w:ilvl="5" w:tplc="619AF0BA">
-      <w:numFmt w:val="decimal"/>
-      <w:lvlText w:val=""/>
-      <w:lvlJc w:val="left"/>
-    </w:lvl>
-    <w:lvl w:ilvl="6" w:tplc="CFF21D4C">
-      <w:numFmt w:val="decimal"/>
-      <w:lvlText w:val=""/>
-      <w:lvlJc w:val="left"/>
-    </w:lvl>
-    <w:lvl w:ilvl="7" w:tplc="61BAAE00">
-      <w:numFmt w:val="decimal"/>
-      <w:lvlText w:val=""/>
-      <w:lvlJc w:val="left"/>
-    </w:lvl>
-    <w:lvl w:ilvl="8" w:tplc="D0388872">
-      <w:numFmt w:val="decimal"/>
-      <w:lvlText w:val=""/>
-      <w:lvlJc w:val="left"/>
-    </w:lvl>
-  </w:abstractNum>
-  <w:abstractNum w:abstractNumId="1" w15:restartNumberingAfterBreak="0">
-    <w:nsid w:val="4C1C046C"/>
-    <w:multiLevelType w:val="hybridMultilevel"/>
-    <w:tmpl w:val="7FAC6784"/>
-    <w:lvl w:ilvl="0" w:tplc="AE10241E">
+    <w:tmpl w:val="0F105CF6"/>
+    <w:lvl w:ilvl="0" w:tplc="AADAF546">
       <w:start w:val="1"/>
       <w:numFmt w:val="bullet"/>
       <w:lvlText w:val="●"/>
@@ -32604,7 +32653,7 @@
         <w:ind w:left="720" w:hanging="360"/>
       </w:pPr>
     </w:lvl>
-    <w:lvl w:ilvl="1" w:tplc="0FBCDCFC">
+    <w:lvl w:ilvl="1" w:tplc="2CB80B2A">
       <w:start w:val="1"/>
       <w:numFmt w:val="bullet"/>
       <w:lvlText w:val="○"/>
@@ -32613,7 +32662,7 @@
         <w:ind w:left="1440" w:hanging="360"/>
       </w:pPr>
     </w:lvl>
-    <w:lvl w:ilvl="2" w:tplc="2B1E95DE">
+    <w:lvl w:ilvl="2" w:tplc="990615F0">
       <w:start w:val="1"/>
       <w:numFmt w:val="bullet"/>
       <w:lvlText w:val="■"/>
@@ -32622,7 +32671,7 @@
         <w:ind w:left="2160" w:hanging="360"/>
       </w:pPr>
     </w:lvl>
-    <w:lvl w:ilvl="3" w:tplc="E510476E">
+    <w:lvl w:ilvl="3" w:tplc="F52063CE">
       <w:start w:val="1"/>
       <w:numFmt w:val="bullet"/>
       <w:lvlText w:val="●"/>
@@ -32631,7 +32680,7 @@
         <w:ind w:left="2880" w:hanging="360"/>
       </w:pPr>
     </w:lvl>
-    <w:lvl w:ilvl="4" w:tplc="DC509EA6">
+    <w:lvl w:ilvl="4" w:tplc="75E67C44">
       <w:start w:val="1"/>
       <w:numFmt w:val="bullet"/>
       <w:lvlText w:val="○"/>
@@ -32640,7 +32689,7 @@
         <w:ind w:left="3600" w:hanging="360"/>
       </w:pPr>
     </w:lvl>
-    <w:lvl w:ilvl="5" w:tplc="D5663BC8">
+    <w:lvl w:ilvl="5" w:tplc="A7ECB252">
       <w:start w:val="1"/>
       <w:numFmt w:val="bullet"/>
       <w:lvlText w:val="■"/>
@@ -32649,7 +32698,7 @@
         <w:ind w:left="4320" w:hanging="360"/>
       </w:pPr>
     </w:lvl>
-    <w:lvl w:ilvl="6" w:tplc="B0180034">
+    <w:lvl w:ilvl="6" w:tplc="87B2249C">
       <w:start w:val="1"/>
       <w:numFmt w:val="bullet"/>
       <w:lvlText w:val="●"/>
@@ -32658,7 +32707,7 @@
         <w:ind w:left="5040" w:hanging="360"/>
       </w:pPr>
     </w:lvl>
-    <w:lvl w:ilvl="7" w:tplc="25E40F88">
+    <w:lvl w:ilvl="7" w:tplc="C5E0B002">
       <w:start w:val="1"/>
       <w:numFmt w:val="bullet"/>
       <w:lvlText w:val="●"/>
@@ -32667,7 +32716,7 @@
         <w:ind w:left="5760" w:hanging="360"/>
       </w:pPr>
     </w:lvl>
-    <w:lvl w:ilvl="8" w:tplc="257419B8">
+    <w:lvl w:ilvl="8" w:tplc="B9186BD0">
       <w:start w:val="1"/>
       <w:numFmt w:val="bullet"/>
       <w:lvlText w:val="●"/>
@@ -32677,14 +32726,72 @@
       </w:pPr>
     </w:lvl>
   </w:abstractNum>
-  <w:num w:numId="1" w16cid:durableId="2106683044">
-    <w:abstractNumId w:val="1"/>
+  <w:abstractNum w:abstractNumId="1" w15:restartNumberingAfterBreak="0">
+    <w:nsid w:val="5EA233D9"/>
+    <w:multiLevelType w:val="hybridMultilevel"/>
+    <w:tmpl w:val="8F3C8BFC"/>
+    <w:lvl w:ilvl="0" w:tplc="D8640500">
+      <w:start w:val="1"/>
+      <w:numFmt w:val="bullet"/>
+      <w:lvlText w:val="•"/>
+      <w:lvlJc w:val="left"/>
+      <w:pPr>
+        <w:ind w:left="460" w:hanging="280"/>
+      </w:pPr>
+    </w:lvl>
+    <w:lvl w:ilvl="1" w:tplc="540816C0">
+      <w:start w:val="1"/>
+      <w:numFmt w:val="bullet"/>
+      <w:lvlText w:val="–"/>
+      <w:lvlJc w:val="left"/>
+      <w:pPr>
+        <w:ind w:left="900" w:hanging="280"/>
+      </w:pPr>
+    </w:lvl>
+    <w:lvl w:ilvl="2" w:tplc="3710E062">
+      <w:numFmt w:val="decimal"/>
+      <w:lvlText w:val=""/>
+      <w:lvlJc w:val="left"/>
+    </w:lvl>
+    <w:lvl w:ilvl="3" w:tplc="9ED4A22A">
+      <w:numFmt w:val="decimal"/>
+      <w:lvlText w:val=""/>
+      <w:lvlJc w:val="left"/>
+    </w:lvl>
+    <w:lvl w:ilvl="4" w:tplc="B1521CD6">
+      <w:numFmt w:val="decimal"/>
+      <w:lvlText w:val=""/>
+      <w:lvlJc w:val="left"/>
+    </w:lvl>
+    <w:lvl w:ilvl="5" w:tplc="8BDA96F8">
+      <w:numFmt w:val="decimal"/>
+      <w:lvlText w:val=""/>
+      <w:lvlJc w:val="left"/>
+    </w:lvl>
+    <w:lvl w:ilvl="6" w:tplc="199A7316">
+      <w:numFmt w:val="decimal"/>
+      <w:lvlText w:val=""/>
+      <w:lvlJc w:val="left"/>
+    </w:lvl>
+    <w:lvl w:ilvl="7" w:tplc="87E4CD84">
+      <w:numFmt w:val="decimal"/>
+      <w:lvlText w:val=""/>
+      <w:lvlJc w:val="left"/>
+    </w:lvl>
+    <w:lvl w:ilvl="8" w:tplc="FCB41776">
+      <w:numFmt w:val="decimal"/>
+      <w:lvlText w:val=""/>
+      <w:lvlJc w:val="left"/>
+    </w:lvl>
+  </w:abstractNum>
+  <w:num w:numId="1" w16cid:durableId="1777022272">
+    <w:abstractNumId w:val="0"/>
     <w:lvlOverride w:ilvl="0">
       <w:startOverride w:val="1"/>
     </w:lvlOverride>
   </w:num>
-  <w:num w:numId="2" w16cid:durableId="117073760">
-    <w:abstractNumId w:val="0"/>
+  <w:num w:numId="2" w16cid:durableId="1134904703">
+    <w:abstractNumId w:val="1"/>
     <w:lvlOverride w:ilvl="0">
       <w:startOverride w:val="1"/>
     </w:lvlOverride>
@@ -33309,7 +33416,7 @@
     <w:autoRedefine/>
     <w:uiPriority w:val="39"/>
     <w:unhideWhenUsed/>
-    <w:rsid w:val="003B26D9"/>
+    <w:rsid w:val="004E2359"/>
     <w:pPr>
       <w:spacing w:after="100"/>
     </w:pPr>
@@ -33321,7 +33428,7 @@
     <w:autoRedefine/>
     <w:uiPriority w:val="39"/>
     <w:unhideWhenUsed/>
-    <w:rsid w:val="003B26D9"/>
+    <w:rsid w:val="004E2359"/>
     <w:pPr>
       <w:spacing w:after="100"/>
       <w:ind w:left="210"/>

</xml_diff>

<commit_message>
feat: Participant Information Sheet v1.5 -- tells respondents an AI tool from a company outside Zimbabwe helps with the public-information search
PI-directed after the supervisors, ethics office, data-protection position and provider terms were confirmed (recorded on the PI's statement). docs/31 sign-off row, docs/27 record, README and manuals v1.12 updated in step. Every consent recorded from now carries v1.5.

Co-Authored-By: Claude Sonnet 5 <noreply@anthropic.com>
</commit_message>
<xml_diff>
--- a/docs/manuals/ABF-FST_Screen_and_Button_Reference.docx
+++ b/docs/manuals/ABF-FST_Screen_and_Button_Reference.docx
@@ -469,7 +469,7 @@
                 <w:sz w:val="19"/>
                 <w:szCs w:val="19"/>
               </w:rPr>
-              <w:t>Version 1.11 · 28 September 2026</w:t>
+              <w:t>Version 1.12 · 28 September 2026</w:t>
             </w:r>
           </w:p>
         </w:tc>
@@ -538,7 +538,7 @@
     <w:sdt>
       <w:sdtPr>
         <w:alias w:val="Contents"/>
-        <w:id w:val="621653771"/>
+        <w:id w:val="1940943072"/>
       </w:sdtPr>
       <w:sdtEndPr/>
       <w:sdtContent>
@@ -567,7 +567,7 @@
           <w:r>
             <w:fldChar w:fldCharType="separate"/>
           </w:r>
-          <w:hyperlink w:anchor="_Toc241490464" w:history="1">
+          <w:hyperlink w:anchor="_Toc241491885" w:history="1">
             <w:r>
               <w:rPr>
                 <w:rStyle w:val="Hyperlink"/>
@@ -591,7 +591,7 @@
               <w:rPr>
                 <w:noProof/>
               </w:rPr>
-              <w:instrText xml:space="preserve"> PAGEREF _Toc241490464 \h </w:instrText>
+              <w:instrText xml:space="preserve"> PAGEREF _Toc241491885 \h </w:instrText>
             </w:r>
             <w:r>
               <w:rPr>
@@ -634,7 +634,7 @@
               <w14:ligatures w14:val="standardContextual"/>
             </w:rPr>
           </w:pPr>
-          <w:hyperlink w:anchor="_Toc241490465" w:history="1">
+          <w:hyperlink w:anchor="_Toc241491886" w:history="1">
             <w:r>
               <w:rPr>
                 <w:rStyle w:val="Hyperlink"/>
@@ -658,7 +658,7 @@
               <w:rPr>
                 <w:noProof/>
               </w:rPr>
-              <w:instrText xml:space="preserve"> PAGEREF _Toc241490465 \h </w:instrText>
+              <w:instrText xml:space="preserve"> PAGEREF _Toc241491886 \h </w:instrText>
             </w:r>
             <w:r>
               <w:rPr>
@@ -701,7 +701,7 @@
               <w14:ligatures w14:val="standardContextual"/>
             </w:rPr>
           </w:pPr>
-          <w:hyperlink w:anchor="_Toc241490466" w:history="1">
+          <w:hyperlink w:anchor="_Toc241491887" w:history="1">
             <w:r>
               <w:rPr>
                 <w:rStyle w:val="Hyperlink"/>
@@ -725,7 +725,7 @@
               <w:rPr>
                 <w:noProof/>
               </w:rPr>
-              <w:instrText xml:space="preserve"> PAGEREF _Toc241490466 \h </w:instrText>
+              <w:instrText xml:space="preserve"> PAGEREF _Toc241491887 \h </w:instrText>
             </w:r>
             <w:r>
               <w:rPr>
@@ -768,7 +768,7 @@
               <w14:ligatures w14:val="standardContextual"/>
             </w:rPr>
           </w:pPr>
-          <w:hyperlink w:anchor="_Toc241490467" w:history="1">
+          <w:hyperlink w:anchor="_Toc241491888" w:history="1">
             <w:r>
               <w:rPr>
                 <w:rStyle w:val="Hyperlink"/>
@@ -792,7 +792,7 @@
               <w:rPr>
                 <w:noProof/>
               </w:rPr>
-              <w:instrText xml:space="preserve"> PAGEREF _Toc241490467 \h </w:instrText>
+              <w:instrText xml:space="preserve"> PAGEREF _Toc241491888 \h </w:instrText>
             </w:r>
             <w:r>
               <w:rPr>
@@ -835,7 +835,7 @@
               <w14:ligatures w14:val="standardContextual"/>
             </w:rPr>
           </w:pPr>
-          <w:hyperlink w:anchor="_Toc241490468" w:history="1">
+          <w:hyperlink w:anchor="_Toc241491889" w:history="1">
             <w:r>
               <w:rPr>
                 <w:rStyle w:val="Hyperlink"/>
@@ -859,7 +859,7 @@
               <w:rPr>
                 <w:noProof/>
               </w:rPr>
-              <w:instrText xml:space="preserve"> PAGEREF _Toc241490468 \h </w:instrText>
+              <w:instrText xml:space="preserve"> PAGEREF _Toc241491889 \h </w:instrText>
             </w:r>
             <w:r>
               <w:rPr>
@@ -902,7 +902,7 @@
               <w14:ligatures w14:val="standardContextual"/>
             </w:rPr>
           </w:pPr>
-          <w:hyperlink w:anchor="_Toc241490469" w:history="1">
+          <w:hyperlink w:anchor="_Toc241491890" w:history="1">
             <w:r>
               <w:rPr>
                 <w:rStyle w:val="Hyperlink"/>
@@ -926,7 +926,7 @@
               <w:rPr>
                 <w:noProof/>
               </w:rPr>
-              <w:instrText xml:space="preserve"> PAGEREF _Toc241490469 \h </w:instrText>
+              <w:instrText xml:space="preserve"> PAGEREF _Toc241491890 \h </w:instrText>
             </w:r>
             <w:r>
               <w:rPr>
@@ -969,7 +969,7 @@
               <w14:ligatures w14:val="standardContextual"/>
             </w:rPr>
           </w:pPr>
-          <w:hyperlink w:anchor="_Toc241490470" w:history="1">
+          <w:hyperlink w:anchor="_Toc241491891" w:history="1">
             <w:r>
               <w:rPr>
                 <w:rStyle w:val="Hyperlink"/>
@@ -993,7 +993,7 @@
               <w:rPr>
                 <w:noProof/>
               </w:rPr>
-              <w:instrText xml:space="preserve"> PAGEREF _Toc241490470 \h </w:instrText>
+              <w:instrText xml:space="preserve"> PAGEREF _Toc241491891 \h </w:instrText>
             </w:r>
             <w:r>
               <w:rPr>
@@ -1036,7 +1036,7 @@
               <w14:ligatures w14:val="standardContextual"/>
             </w:rPr>
           </w:pPr>
-          <w:hyperlink w:anchor="_Toc241490471" w:history="1">
+          <w:hyperlink w:anchor="_Toc241491892" w:history="1">
             <w:r>
               <w:rPr>
                 <w:rStyle w:val="Hyperlink"/>
@@ -1060,7 +1060,7 @@
               <w:rPr>
                 <w:noProof/>
               </w:rPr>
-              <w:instrText xml:space="preserve"> PAGEREF _Toc241490471 \h </w:instrText>
+              <w:instrText xml:space="preserve"> PAGEREF _Toc241491892 \h </w:instrText>
             </w:r>
             <w:r>
               <w:rPr>
@@ -1103,7 +1103,7 @@
               <w14:ligatures w14:val="standardContextual"/>
             </w:rPr>
           </w:pPr>
-          <w:hyperlink w:anchor="_Toc241490472" w:history="1">
+          <w:hyperlink w:anchor="_Toc241491893" w:history="1">
             <w:r>
               <w:rPr>
                 <w:rStyle w:val="Hyperlink"/>
@@ -1127,7 +1127,7 @@
               <w:rPr>
                 <w:noProof/>
               </w:rPr>
-              <w:instrText xml:space="preserve"> PAGEREF _Toc241490472 \h </w:instrText>
+              <w:instrText xml:space="preserve"> PAGEREF _Toc241491893 \h </w:instrText>
             </w:r>
             <w:r>
               <w:rPr>
@@ -1170,7 +1170,7 @@
               <w14:ligatures w14:val="standardContextual"/>
             </w:rPr>
           </w:pPr>
-          <w:hyperlink w:anchor="_Toc241490473" w:history="1">
+          <w:hyperlink w:anchor="_Toc241491894" w:history="1">
             <w:r>
               <w:rPr>
                 <w:rStyle w:val="Hyperlink"/>
@@ -1194,7 +1194,7 @@
               <w:rPr>
                 <w:noProof/>
               </w:rPr>
-              <w:instrText xml:space="preserve"> PAGEREF _Toc241490473 \h </w:instrText>
+              <w:instrText xml:space="preserve"> PAGEREF _Toc241491894 \h </w:instrText>
             </w:r>
             <w:r>
               <w:rPr>
@@ -1237,7 +1237,7 @@
               <w14:ligatures w14:val="standardContextual"/>
             </w:rPr>
           </w:pPr>
-          <w:hyperlink w:anchor="_Toc241490474" w:history="1">
+          <w:hyperlink w:anchor="_Toc241491895" w:history="1">
             <w:r>
               <w:rPr>
                 <w:rStyle w:val="Hyperlink"/>
@@ -1261,7 +1261,7 @@
               <w:rPr>
                 <w:noProof/>
               </w:rPr>
-              <w:instrText xml:space="preserve"> PAGEREF _Toc241490474 \h </w:instrText>
+              <w:instrText xml:space="preserve"> PAGEREF _Toc241491895 \h </w:instrText>
             </w:r>
             <w:r>
               <w:rPr>
@@ -1304,7 +1304,7 @@
               <w14:ligatures w14:val="standardContextual"/>
             </w:rPr>
           </w:pPr>
-          <w:hyperlink w:anchor="_Toc241490475" w:history="1">
+          <w:hyperlink w:anchor="_Toc241491896" w:history="1">
             <w:r>
               <w:rPr>
                 <w:rStyle w:val="Hyperlink"/>
@@ -1328,7 +1328,7 @@
               <w:rPr>
                 <w:noProof/>
               </w:rPr>
-              <w:instrText xml:space="preserve"> PAGEREF _Toc241490475 \h </w:instrText>
+              <w:instrText xml:space="preserve"> PAGEREF _Toc241491896 \h </w:instrText>
             </w:r>
             <w:r>
               <w:rPr>
@@ -1371,7 +1371,7 @@
               <w14:ligatures w14:val="standardContextual"/>
             </w:rPr>
           </w:pPr>
-          <w:hyperlink w:anchor="_Toc241490476" w:history="1">
+          <w:hyperlink w:anchor="_Toc241491897" w:history="1">
             <w:r>
               <w:rPr>
                 <w:rStyle w:val="Hyperlink"/>
@@ -1395,7 +1395,7 @@
               <w:rPr>
                 <w:noProof/>
               </w:rPr>
-              <w:instrText xml:space="preserve"> PAGEREF _Toc241490476 \h </w:instrText>
+              <w:instrText xml:space="preserve"> PAGEREF _Toc241491897 \h </w:instrText>
             </w:r>
             <w:r>
               <w:rPr>
@@ -1438,7 +1438,7 @@
               <w14:ligatures w14:val="standardContextual"/>
             </w:rPr>
           </w:pPr>
-          <w:hyperlink w:anchor="_Toc241490477" w:history="1">
+          <w:hyperlink w:anchor="_Toc241491898" w:history="1">
             <w:r>
               <w:rPr>
                 <w:rStyle w:val="Hyperlink"/>
@@ -1462,7 +1462,7 @@
               <w:rPr>
                 <w:noProof/>
               </w:rPr>
-              <w:instrText xml:space="preserve"> PAGEREF _Toc241490477 \h </w:instrText>
+              <w:instrText xml:space="preserve"> PAGEREF _Toc241491898 \h </w:instrText>
             </w:r>
             <w:r>
               <w:rPr>
@@ -1505,7 +1505,7 @@
               <w14:ligatures w14:val="standardContextual"/>
             </w:rPr>
           </w:pPr>
-          <w:hyperlink w:anchor="_Toc241490478" w:history="1">
+          <w:hyperlink w:anchor="_Toc241491899" w:history="1">
             <w:r>
               <w:rPr>
                 <w:rStyle w:val="Hyperlink"/>
@@ -1529,7 +1529,7 @@
               <w:rPr>
                 <w:noProof/>
               </w:rPr>
-              <w:instrText xml:space="preserve"> PAGEREF _Toc241490478 \h </w:instrText>
+              <w:instrText xml:space="preserve"> PAGEREF _Toc241491899 \h </w:instrText>
             </w:r>
             <w:r>
               <w:rPr>
@@ -1572,7 +1572,7 @@
               <w14:ligatures w14:val="standardContextual"/>
             </w:rPr>
           </w:pPr>
-          <w:hyperlink w:anchor="_Toc241490479" w:history="1">
+          <w:hyperlink w:anchor="_Toc241491900" w:history="1">
             <w:r>
               <w:rPr>
                 <w:rStyle w:val="Hyperlink"/>
@@ -1596,7 +1596,7 @@
               <w:rPr>
                 <w:noProof/>
               </w:rPr>
-              <w:instrText xml:space="preserve"> PAGEREF _Toc241490479 \h </w:instrText>
+              <w:instrText xml:space="preserve"> PAGEREF _Toc241491900 \h </w:instrText>
             </w:r>
             <w:r>
               <w:rPr>
@@ -1639,7 +1639,7 @@
               <w14:ligatures w14:val="standardContextual"/>
             </w:rPr>
           </w:pPr>
-          <w:hyperlink w:anchor="_Toc241490480" w:history="1">
+          <w:hyperlink w:anchor="_Toc241491901" w:history="1">
             <w:r>
               <w:rPr>
                 <w:rStyle w:val="Hyperlink"/>
@@ -1663,7 +1663,7 @@
               <w:rPr>
                 <w:noProof/>
               </w:rPr>
-              <w:instrText xml:space="preserve"> PAGEREF _Toc241490480 \h </w:instrText>
+              <w:instrText xml:space="preserve"> PAGEREF _Toc241491901 \h </w:instrText>
             </w:r>
             <w:r>
               <w:rPr>
@@ -1706,7 +1706,7 @@
               <w14:ligatures w14:val="standardContextual"/>
             </w:rPr>
           </w:pPr>
-          <w:hyperlink w:anchor="_Toc241490481" w:history="1">
+          <w:hyperlink w:anchor="_Toc241491902" w:history="1">
             <w:r>
               <w:rPr>
                 <w:rStyle w:val="Hyperlink"/>
@@ -1730,7 +1730,7 @@
               <w:rPr>
                 <w:noProof/>
               </w:rPr>
-              <w:instrText xml:space="preserve"> PAGEREF _Toc241490481 \h </w:instrText>
+              <w:instrText xml:space="preserve"> PAGEREF _Toc241491902 \h </w:instrText>
             </w:r>
             <w:r>
               <w:rPr>
@@ -1773,7 +1773,7 @@
               <w14:ligatures w14:val="standardContextual"/>
             </w:rPr>
           </w:pPr>
-          <w:hyperlink w:anchor="_Toc241490482" w:history="1">
+          <w:hyperlink w:anchor="_Toc241491903" w:history="1">
             <w:r>
               <w:rPr>
                 <w:rStyle w:val="Hyperlink"/>
@@ -1797,7 +1797,7 @@
               <w:rPr>
                 <w:noProof/>
               </w:rPr>
-              <w:instrText xml:space="preserve"> PAGEREF _Toc241490482 \h </w:instrText>
+              <w:instrText xml:space="preserve"> PAGEREF _Toc241491903 \h </w:instrText>
             </w:r>
             <w:r>
               <w:rPr>
@@ -1840,7 +1840,7 @@
               <w14:ligatures w14:val="standardContextual"/>
             </w:rPr>
           </w:pPr>
-          <w:hyperlink w:anchor="_Toc241490483" w:history="1">
+          <w:hyperlink w:anchor="_Toc241491904" w:history="1">
             <w:r>
               <w:rPr>
                 <w:rStyle w:val="Hyperlink"/>
@@ -1864,7 +1864,7 @@
               <w:rPr>
                 <w:noProof/>
               </w:rPr>
-              <w:instrText xml:space="preserve"> PAGEREF _Toc241490483 \h </w:instrText>
+              <w:instrText xml:space="preserve"> PAGEREF _Toc241491904 \h </w:instrText>
             </w:r>
             <w:r>
               <w:rPr>
@@ -1907,7 +1907,7 @@
               <w14:ligatures w14:val="standardContextual"/>
             </w:rPr>
           </w:pPr>
-          <w:hyperlink w:anchor="_Toc241490484" w:history="1">
+          <w:hyperlink w:anchor="_Toc241491905" w:history="1">
             <w:r>
               <w:rPr>
                 <w:rStyle w:val="Hyperlink"/>
@@ -1931,7 +1931,7 @@
               <w:rPr>
                 <w:noProof/>
               </w:rPr>
-              <w:instrText xml:space="preserve"> PAGEREF _Toc241490484 \h </w:instrText>
+              <w:instrText xml:space="preserve"> PAGEREF _Toc241491905 \h </w:instrText>
             </w:r>
             <w:r>
               <w:rPr>
@@ -1974,7 +1974,7 @@
               <w14:ligatures w14:val="standardContextual"/>
             </w:rPr>
           </w:pPr>
-          <w:hyperlink w:anchor="_Toc241490485" w:history="1">
+          <w:hyperlink w:anchor="_Toc241491906" w:history="1">
             <w:r>
               <w:rPr>
                 <w:rStyle w:val="Hyperlink"/>
@@ -1998,7 +1998,7 @@
               <w:rPr>
                 <w:noProof/>
               </w:rPr>
-              <w:instrText xml:space="preserve"> PAGEREF _Toc241490485 \h </w:instrText>
+              <w:instrText xml:space="preserve"> PAGEREF _Toc241491906 \h </w:instrText>
             </w:r>
             <w:r>
               <w:rPr>
@@ -2041,7 +2041,7 @@
               <w14:ligatures w14:val="standardContextual"/>
             </w:rPr>
           </w:pPr>
-          <w:hyperlink w:anchor="_Toc241490486" w:history="1">
+          <w:hyperlink w:anchor="_Toc241491907" w:history="1">
             <w:r>
               <w:rPr>
                 <w:rStyle w:val="Hyperlink"/>
@@ -2065,7 +2065,7 @@
               <w:rPr>
                 <w:noProof/>
               </w:rPr>
-              <w:instrText xml:space="preserve"> PAGEREF _Toc241490486 \h </w:instrText>
+              <w:instrText xml:space="preserve"> PAGEREF _Toc241491907 \h </w:instrText>
             </w:r>
             <w:r>
               <w:rPr>
@@ -2108,7 +2108,7 @@
               <w14:ligatures w14:val="standardContextual"/>
             </w:rPr>
           </w:pPr>
-          <w:hyperlink w:anchor="_Toc241490487" w:history="1">
+          <w:hyperlink w:anchor="_Toc241491908" w:history="1">
             <w:r>
               <w:rPr>
                 <w:rStyle w:val="Hyperlink"/>
@@ -2132,7 +2132,7 @@
               <w:rPr>
                 <w:noProof/>
               </w:rPr>
-              <w:instrText xml:space="preserve"> PAGEREF _Toc241490487 \h </w:instrText>
+              <w:instrText xml:space="preserve"> PAGEREF _Toc241491908 \h </w:instrText>
             </w:r>
             <w:r>
               <w:rPr>
@@ -2175,7 +2175,7 @@
               <w14:ligatures w14:val="standardContextual"/>
             </w:rPr>
           </w:pPr>
-          <w:hyperlink w:anchor="_Toc241490488" w:history="1">
+          <w:hyperlink w:anchor="_Toc241491909" w:history="1">
             <w:r>
               <w:rPr>
                 <w:rStyle w:val="Hyperlink"/>
@@ -2199,7 +2199,7 @@
               <w:rPr>
                 <w:noProof/>
               </w:rPr>
-              <w:instrText xml:space="preserve"> PAGEREF _Toc241490488 \h </w:instrText>
+              <w:instrText xml:space="preserve"> PAGEREF _Toc241491909 \h </w:instrText>
             </w:r>
             <w:r>
               <w:rPr>
@@ -2242,7 +2242,7 @@
               <w14:ligatures w14:val="standardContextual"/>
             </w:rPr>
           </w:pPr>
-          <w:hyperlink w:anchor="_Toc241490489" w:history="1">
+          <w:hyperlink w:anchor="_Toc241491910" w:history="1">
             <w:r>
               <w:rPr>
                 <w:rStyle w:val="Hyperlink"/>
@@ -2266,7 +2266,7 @@
               <w:rPr>
                 <w:noProof/>
               </w:rPr>
-              <w:instrText xml:space="preserve"> PAGEREF _Toc241490489 \h </w:instrText>
+              <w:instrText xml:space="preserve"> PAGEREF _Toc241491910 \h </w:instrText>
             </w:r>
             <w:r>
               <w:rPr>
@@ -2309,7 +2309,7 @@
               <w14:ligatures w14:val="standardContextual"/>
             </w:rPr>
           </w:pPr>
-          <w:hyperlink w:anchor="_Toc241490490" w:history="1">
+          <w:hyperlink w:anchor="_Toc241491911" w:history="1">
             <w:r>
               <w:rPr>
                 <w:rStyle w:val="Hyperlink"/>
@@ -2333,7 +2333,7 @@
               <w:rPr>
                 <w:noProof/>
               </w:rPr>
-              <w:instrText xml:space="preserve"> PAGEREF _Toc241490490 \h </w:instrText>
+              <w:instrText xml:space="preserve"> PAGEREF _Toc241491911 \h </w:instrText>
             </w:r>
             <w:r>
               <w:rPr>
@@ -2376,7 +2376,7 @@
               <w14:ligatures w14:val="standardContextual"/>
             </w:rPr>
           </w:pPr>
-          <w:hyperlink w:anchor="_Toc241490491" w:history="1">
+          <w:hyperlink w:anchor="_Toc241491912" w:history="1">
             <w:r>
               <w:rPr>
                 <w:rStyle w:val="Hyperlink"/>
@@ -2400,7 +2400,7 @@
               <w:rPr>
                 <w:noProof/>
               </w:rPr>
-              <w:instrText xml:space="preserve"> PAGEREF _Toc241490491 \h </w:instrText>
+              <w:instrText xml:space="preserve"> PAGEREF _Toc241491912 \h </w:instrText>
             </w:r>
             <w:r>
               <w:rPr>
@@ -2443,7 +2443,7 @@
               <w14:ligatures w14:val="standardContextual"/>
             </w:rPr>
           </w:pPr>
-          <w:hyperlink w:anchor="_Toc241490492" w:history="1">
+          <w:hyperlink w:anchor="_Toc241491913" w:history="1">
             <w:r>
               <w:rPr>
                 <w:rStyle w:val="Hyperlink"/>
@@ -2467,7 +2467,7 @@
               <w:rPr>
                 <w:noProof/>
               </w:rPr>
-              <w:instrText xml:space="preserve"> PAGEREF _Toc241490492 \h </w:instrText>
+              <w:instrText xml:space="preserve"> PAGEREF _Toc241491913 \h </w:instrText>
             </w:r>
             <w:r>
               <w:rPr>
@@ -2510,7 +2510,7 @@
               <w14:ligatures w14:val="standardContextual"/>
             </w:rPr>
           </w:pPr>
-          <w:hyperlink w:anchor="_Toc241490493" w:history="1">
+          <w:hyperlink w:anchor="_Toc241491914" w:history="1">
             <w:r>
               <w:rPr>
                 <w:rStyle w:val="Hyperlink"/>
@@ -2534,7 +2534,7 @@
               <w:rPr>
                 <w:noProof/>
               </w:rPr>
-              <w:instrText xml:space="preserve"> PAGEREF _Toc241490493 \h </w:instrText>
+              <w:instrText xml:space="preserve"> PAGEREF _Toc241491914 \h </w:instrText>
             </w:r>
             <w:r>
               <w:rPr>
@@ -2577,7 +2577,7 @@
               <w14:ligatures w14:val="standardContextual"/>
             </w:rPr>
           </w:pPr>
-          <w:hyperlink w:anchor="_Toc241490494" w:history="1">
+          <w:hyperlink w:anchor="_Toc241491915" w:history="1">
             <w:r>
               <w:rPr>
                 <w:rStyle w:val="Hyperlink"/>
@@ -2601,7 +2601,7 @@
               <w:rPr>
                 <w:noProof/>
               </w:rPr>
-              <w:instrText xml:space="preserve"> PAGEREF _Toc241490494 \h </w:instrText>
+              <w:instrText xml:space="preserve"> PAGEREF _Toc241491915 \h </w:instrText>
             </w:r>
             <w:r>
               <w:rPr>
@@ -2644,7 +2644,7 @@
               <w14:ligatures w14:val="standardContextual"/>
             </w:rPr>
           </w:pPr>
-          <w:hyperlink w:anchor="_Toc241490495" w:history="1">
+          <w:hyperlink w:anchor="_Toc241491916" w:history="1">
             <w:r>
               <w:rPr>
                 <w:rStyle w:val="Hyperlink"/>
@@ -2668,7 +2668,7 @@
               <w:rPr>
                 <w:noProof/>
               </w:rPr>
-              <w:instrText xml:space="preserve"> PAGEREF _Toc241490495 \h </w:instrText>
+              <w:instrText xml:space="preserve"> PAGEREF _Toc241491916 \h </w:instrText>
             </w:r>
             <w:r>
               <w:rPr>
@@ -2711,7 +2711,7 @@
               <w14:ligatures w14:val="standardContextual"/>
             </w:rPr>
           </w:pPr>
-          <w:hyperlink w:anchor="_Toc241490496" w:history="1">
+          <w:hyperlink w:anchor="_Toc241491917" w:history="1">
             <w:r>
               <w:rPr>
                 <w:rStyle w:val="Hyperlink"/>
@@ -2735,7 +2735,7 @@
               <w:rPr>
                 <w:noProof/>
               </w:rPr>
-              <w:instrText xml:space="preserve"> PAGEREF _Toc241490496 \h </w:instrText>
+              <w:instrText xml:space="preserve"> PAGEREF _Toc241491917 \h </w:instrText>
             </w:r>
             <w:r>
               <w:rPr>
@@ -2778,7 +2778,7 @@
               <w14:ligatures w14:val="standardContextual"/>
             </w:rPr>
           </w:pPr>
-          <w:hyperlink w:anchor="_Toc241490497" w:history="1">
+          <w:hyperlink w:anchor="_Toc241491918" w:history="1">
             <w:r>
               <w:rPr>
                 <w:rStyle w:val="Hyperlink"/>
@@ -2802,7 +2802,7 @@
               <w:rPr>
                 <w:noProof/>
               </w:rPr>
-              <w:instrText xml:space="preserve"> PAGEREF _Toc241490497 \h </w:instrText>
+              <w:instrText xml:space="preserve"> PAGEREF _Toc241491918 \h </w:instrText>
             </w:r>
             <w:r>
               <w:rPr>
@@ -2845,7 +2845,7 @@
               <w14:ligatures w14:val="standardContextual"/>
             </w:rPr>
           </w:pPr>
-          <w:hyperlink w:anchor="_Toc241490498" w:history="1">
+          <w:hyperlink w:anchor="_Toc241491919" w:history="1">
             <w:r>
               <w:rPr>
                 <w:rStyle w:val="Hyperlink"/>
@@ -2869,7 +2869,7 @@
               <w:rPr>
                 <w:noProof/>
               </w:rPr>
-              <w:instrText xml:space="preserve"> PAGEREF _Toc241490498 \h </w:instrText>
+              <w:instrText xml:space="preserve"> PAGEREF _Toc241491919 \h </w:instrText>
             </w:r>
             <w:r>
               <w:rPr>
@@ -2912,7 +2912,7 @@
               <w14:ligatures w14:val="standardContextual"/>
             </w:rPr>
           </w:pPr>
-          <w:hyperlink w:anchor="_Toc241490499" w:history="1">
+          <w:hyperlink w:anchor="_Toc241491920" w:history="1">
             <w:r>
               <w:rPr>
                 <w:rStyle w:val="Hyperlink"/>
@@ -2936,7 +2936,7 @@
               <w:rPr>
                 <w:noProof/>
               </w:rPr>
-              <w:instrText xml:space="preserve"> PAGEREF _Toc241490499 \h </w:instrText>
+              <w:instrText xml:space="preserve"> PAGEREF _Toc241491920 \h </w:instrText>
             </w:r>
             <w:r>
               <w:rPr>
@@ -2979,7 +2979,7 @@
               <w14:ligatures w14:val="standardContextual"/>
             </w:rPr>
           </w:pPr>
-          <w:hyperlink w:anchor="_Toc241490500" w:history="1">
+          <w:hyperlink w:anchor="_Toc241491921" w:history="1">
             <w:r>
               <w:rPr>
                 <w:rStyle w:val="Hyperlink"/>
@@ -3003,7 +3003,7 @@
               <w:rPr>
                 <w:noProof/>
               </w:rPr>
-              <w:instrText xml:space="preserve"> PAGEREF _Toc241490500 \h </w:instrText>
+              <w:instrText xml:space="preserve"> PAGEREF _Toc241491921 \h </w:instrText>
             </w:r>
             <w:r>
               <w:rPr>
@@ -3046,7 +3046,7 @@
               <w14:ligatures w14:val="standardContextual"/>
             </w:rPr>
           </w:pPr>
-          <w:hyperlink w:anchor="_Toc241490501" w:history="1">
+          <w:hyperlink w:anchor="_Toc241491922" w:history="1">
             <w:r>
               <w:rPr>
                 <w:rStyle w:val="Hyperlink"/>
@@ -3070,7 +3070,7 @@
               <w:rPr>
                 <w:noProof/>
               </w:rPr>
-              <w:instrText xml:space="preserve"> PAGEREF _Toc241490501 \h </w:instrText>
+              <w:instrText xml:space="preserve"> PAGEREF _Toc241491922 \h </w:instrText>
             </w:r>
             <w:r>
               <w:rPr>
@@ -3113,7 +3113,7 @@
               <w14:ligatures w14:val="standardContextual"/>
             </w:rPr>
           </w:pPr>
-          <w:hyperlink w:anchor="_Toc241490502" w:history="1">
+          <w:hyperlink w:anchor="_Toc241491923" w:history="1">
             <w:r>
               <w:rPr>
                 <w:rStyle w:val="Hyperlink"/>
@@ -3137,7 +3137,7 @@
               <w:rPr>
                 <w:noProof/>
               </w:rPr>
-              <w:instrText xml:space="preserve"> PAGEREF _Toc241490502 \h </w:instrText>
+              <w:instrText xml:space="preserve"> PAGEREF _Toc241491923 \h </w:instrText>
             </w:r>
             <w:r>
               <w:rPr>
@@ -3180,7 +3180,7 @@
               <w14:ligatures w14:val="standardContextual"/>
             </w:rPr>
           </w:pPr>
-          <w:hyperlink w:anchor="_Toc241490503" w:history="1">
+          <w:hyperlink w:anchor="_Toc241491924" w:history="1">
             <w:r>
               <w:rPr>
                 <w:rStyle w:val="Hyperlink"/>
@@ -3204,7 +3204,7 @@
               <w:rPr>
                 <w:noProof/>
               </w:rPr>
-              <w:instrText xml:space="preserve"> PAGEREF _Toc241490503 \h </w:instrText>
+              <w:instrText xml:space="preserve"> PAGEREF _Toc241491924 \h </w:instrText>
             </w:r>
             <w:r>
               <w:rPr>
@@ -3247,7 +3247,7 @@
               <w14:ligatures w14:val="standardContextual"/>
             </w:rPr>
           </w:pPr>
-          <w:hyperlink w:anchor="_Toc241490504" w:history="1">
+          <w:hyperlink w:anchor="_Toc241491925" w:history="1">
             <w:r>
               <w:rPr>
                 <w:rStyle w:val="Hyperlink"/>
@@ -3271,7 +3271,7 @@
               <w:rPr>
                 <w:noProof/>
               </w:rPr>
-              <w:instrText xml:space="preserve"> PAGEREF _Toc241490504 \h </w:instrText>
+              <w:instrText xml:space="preserve"> PAGEREF _Toc241491925 \h </w:instrText>
             </w:r>
             <w:r>
               <w:rPr>
@@ -3310,7 +3310,7 @@
         <w:pStyle w:val="Heading1"/>
         <w:pageBreakBefore/>
       </w:pPr>
-      <w:bookmarkStart w:id="0" w:name="_Toc241490464"/>
+      <w:bookmarkStart w:id="0" w:name="_Toc241491885"/>
       <w:r>
         <w:lastRenderedPageBreak/>
         <w:t>1. About this reference</w:t>
@@ -3763,7 +3763,7 @@
         <w:pStyle w:val="Heading1"/>
         <w:pageBreakBefore/>
       </w:pPr>
-      <w:bookmarkStart w:id="1" w:name="_Toc241490465"/>
+      <w:bookmarkStart w:id="1" w:name="_Toc241491886"/>
       <w:r>
         <w:lastRenderedPageBreak/>
         <w:t>2. Rules that apply on every screen</w:t>
@@ -3980,7 +3980,7 @@
         <w:pStyle w:val="Heading1"/>
         <w:pageBreakBefore/>
       </w:pPr>
-      <w:bookmarkStart w:id="2" w:name="_Toc241490466"/>
+      <w:bookmarkStart w:id="2" w:name="_Toc241491887"/>
       <w:r>
         <w:lastRenderedPageBreak/>
         <w:t>3. Who can open which screen</w:t>
@@ -9508,7 +9508,7 @@
         <w:pStyle w:val="Heading1"/>
         <w:pageBreakBefore/>
       </w:pPr>
-      <w:bookmarkStart w:id="3" w:name="_Toc241490467"/>
+      <w:bookmarkStart w:id="3" w:name="_Toc241491888"/>
       <w:r>
         <w:lastRenderedPageBreak/>
         <w:t>4. Signing in and your account</w:t>
@@ -9519,7 +9519,7 @@
       <w:pPr>
         <w:pStyle w:val="Heading2"/>
       </w:pPr>
-      <w:bookmarkStart w:id="4" w:name="_Toc241490468"/>
+      <w:bookmarkStart w:id="4" w:name="_Toc241491889"/>
       <w:r>
         <w:t>4.1 Sign in</w:t>
       </w:r>
@@ -10032,7 +10032,7 @@
       <w:pPr>
         <w:pStyle w:val="Heading2"/>
       </w:pPr>
-      <w:bookmarkStart w:id="5" w:name="_Toc241490469"/>
+      <w:bookmarkStart w:id="5" w:name="_Toc241491890"/>
       <w:r>
         <w:t>4.2 The header and menu bar (every screen)</w:t>
       </w:r>
@@ -10755,7 +10755,7 @@
       <w:pPr>
         <w:pStyle w:val="Heading2"/>
       </w:pPr>
-      <w:bookmarkStart w:id="6" w:name="_Toc241490470"/>
+      <w:bookmarkStart w:id="6" w:name="_Toc241491891"/>
       <w:r>
         <w:lastRenderedPageBreak/>
         <w:t>4.3 Change Password</w:t>
@@ -11377,7 +11377,7 @@
         <w:pStyle w:val="Heading1"/>
         <w:pageBreakBefore/>
       </w:pPr>
-      <w:bookmarkStart w:id="7" w:name="_Toc241490471"/>
+      <w:bookmarkStart w:id="7" w:name="_Toc241491892"/>
       <w:r>
         <w:lastRenderedPageBreak/>
         <w:t>5. Dashboards and Reports (read-only)</w:t>
@@ -11388,7 +11388,7 @@
       <w:pPr>
         <w:pStyle w:val="Heading2"/>
       </w:pPr>
-      <w:bookmarkStart w:id="8" w:name="_Toc241490472"/>
+      <w:bookmarkStart w:id="8" w:name="_Toc241491893"/>
       <w:r>
         <w:t>5.1 Executive Dashboard</w:t>
       </w:r>
@@ -11901,7 +11901,7 @@
       <w:pPr>
         <w:pStyle w:val="Heading2"/>
       </w:pPr>
-      <w:bookmarkStart w:id="9" w:name="_Toc241490473"/>
+      <w:bookmarkStart w:id="9" w:name="_Toc241491894"/>
       <w:r>
         <w:t>5.2 Sampling Dashboard</w:t>
       </w:r>
@@ -12414,7 +12414,7 @@
       <w:pPr>
         <w:pStyle w:val="Heading2"/>
       </w:pPr>
-      <w:bookmarkStart w:id="10" w:name="_Toc241490474"/>
+      <w:bookmarkStart w:id="10" w:name="_Toc241491895"/>
       <w:r>
         <w:t>5.3 Contact Dashboard</w:t>
       </w:r>
@@ -12718,7 +12718,7 @@
       <w:pPr>
         <w:pStyle w:val="Heading2"/>
       </w:pPr>
-      <w:bookmarkStart w:id="11" w:name="_Toc241490475"/>
+      <w:bookmarkStart w:id="11" w:name="_Toc241491896"/>
       <w:r>
         <w:t>5.4 QA Dashboard</w:t>
       </w:r>
@@ -13338,7 +13338,7 @@
       <w:pPr>
         <w:pStyle w:val="Heading2"/>
       </w:pPr>
-      <w:bookmarkStart w:id="12" w:name="_Toc241490476"/>
+      <w:bookmarkStart w:id="12" w:name="_Toc241491897"/>
       <w:r>
         <w:t>5.5 KII / Document Dashboard</w:t>
       </w:r>
@@ -13748,7 +13748,7 @@
       <w:pPr>
         <w:pStyle w:val="Heading2"/>
       </w:pPr>
-      <w:bookmarkStart w:id="13" w:name="_Toc241490477"/>
+      <w:bookmarkStart w:id="13" w:name="_Toc241491898"/>
       <w:r>
         <w:lastRenderedPageBreak/>
         <w:t>5.6 Reports</w:t>
@@ -14263,7 +14263,7 @@
         <w:pStyle w:val="Heading1"/>
         <w:pageBreakBefore/>
       </w:pPr>
-      <w:bookmarkStart w:id="14" w:name="_Toc241490478"/>
+      <w:bookmarkStart w:id="14" w:name="_Toc241491899"/>
       <w:r>
         <w:lastRenderedPageBreak/>
         <w:t>6. The sample and contact</w:t>
@@ -14274,7 +14274,7 @@
       <w:pPr>
         <w:pStyle w:val="Heading2"/>
       </w:pPr>
-      <w:bookmarkStart w:id="15" w:name="_Toc241490479"/>
+      <w:bookmarkStart w:id="15" w:name="_Toc241491900"/>
       <w:r>
         <w:t>6.1 Main-400 Register (and Reserve)</w:t>
       </w:r>
@@ -15207,7 +15207,7 @@
       <w:pPr>
         <w:pStyle w:val="Heading2"/>
       </w:pPr>
-      <w:bookmarkStart w:id="16" w:name="_Toc241490480"/>
+      <w:bookmarkStart w:id="16" w:name="_Toc241491901"/>
       <w:r>
         <w:t>6.2 Case page</w:t>
       </w:r>
@@ -16886,7 +16886,7 @@
       <w:pPr>
         <w:pStyle w:val="Heading2"/>
       </w:pPr>
-      <w:bookmarkStart w:id="17" w:name="_Toc241490481"/>
+      <w:bookmarkStart w:id="17" w:name="_Toc241491902"/>
       <w:r>
         <w:t>6.3 Pre-Interview Profile (PROIT) and its review screen</w:t>
       </w:r>
@@ -18451,7 +18451,7 @@
       <w:pPr>
         <w:pStyle w:val="Heading2"/>
       </w:pPr>
-      <w:bookmarkStart w:id="18" w:name="_Toc241490482"/>
+      <w:bookmarkStart w:id="18" w:name="_Toc241491903"/>
       <w:r>
         <w:t>6.4 Interview sheet (verifying a locked profile)</w:t>
       </w:r>
@@ -19709,7 +19709,7 @@
       <w:pPr>
         <w:pStyle w:val="Heading2"/>
       </w:pPr>
-      <w:bookmarkStart w:id="19" w:name="_Toc241490483"/>
+      <w:bookmarkStart w:id="19" w:name="_Toc241491904"/>
       <w:r>
         <w:t>6.5 Register Organisation</w:t>
       </w:r>
@@ -20432,7 +20432,7 @@
       <w:pPr>
         <w:pStyle w:val="Heading2"/>
       </w:pPr>
-      <w:bookmarkStart w:id="20" w:name="_Toc241490484"/>
+      <w:bookmarkStart w:id="20" w:name="_Toc241491905"/>
       <w:r>
         <w:t>6.6 Appointment Queue</w:t>
       </w:r>
@@ -21053,7 +21053,7 @@
       <w:pPr>
         <w:pStyle w:val="Heading2"/>
       </w:pPr>
-      <w:bookmarkStart w:id="21" w:name="_Toc241490485"/>
+      <w:bookmarkStart w:id="21" w:name="_Toc241491906"/>
       <w:r>
         <w:t>6.7 Follow-ups due</w:t>
       </w:r>
@@ -21566,7 +21566,7 @@
       <w:pPr>
         <w:pStyle w:val="Heading2"/>
       </w:pPr>
-      <w:bookmarkStart w:id="22" w:name="_Toc241490486"/>
+      <w:bookmarkStart w:id="22" w:name="_Toc241491907"/>
       <w:r>
         <w:t>6.8 Reserve Activation</w:t>
       </w:r>
@@ -22188,7 +22188,7 @@
         <w:pStyle w:val="Heading1"/>
         <w:pageBreakBefore/>
       </w:pPr>
-      <w:bookmarkStart w:id="23" w:name="_Toc241490487"/>
+      <w:bookmarkStart w:id="23" w:name="_Toc241491908"/>
       <w:r>
         <w:lastRenderedPageBreak/>
         <w:t>7. Quality checking</w:t>
@@ -22199,7 +22199,7 @@
       <w:pPr>
         <w:pStyle w:val="Heading2"/>
       </w:pPr>
-      <w:bookmarkStart w:id="24" w:name="_Toc241490488"/>
+      <w:bookmarkStart w:id="24" w:name="_Toc241491909"/>
       <w:r>
         <w:t>7.1 QA Queue (with the KoboToolbox sync panel)</w:t>
       </w:r>
@@ -22922,7 +22922,7 @@
       <w:pPr>
         <w:pStyle w:val="Heading2"/>
       </w:pPr>
-      <w:bookmarkStart w:id="25" w:name="_Toc241490489"/>
+      <w:bookmarkStart w:id="25" w:name="_Toc241491910"/>
       <w:r>
         <w:t>7.2 QA Exceptions</w:t>
       </w:r>
@@ -23754,7 +23754,7 @@
         <w:pStyle w:val="Heading1"/>
         <w:pageBreakBefore/>
       </w:pPr>
-      <w:bookmarkStart w:id="26" w:name="_Toc241490490"/>
+      <w:bookmarkStart w:id="26" w:name="_Toc241491911"/>
       <w:r>
         <w:lastRenderedPageBreak/>
         <w:t>8. Key Informant Interviews</w:t>
@@ -23765,7 +23765,7 @@
       <w:pPr>
         <w:pStyle w:val="Heading2"/>
       </w:pPr>
-      <w:bookmarkStart w:id="27" w:name="_Toc241490491"/>
+      <w:bookmarkStart w:id="27" w:name="_Toc241491912"/>
       <w:r>
         <w:t>8.1 KII Register</w:t>
       </w:r>
@@ -24385,7 +24385,7 @@
       <w:pPr>
         <w:pStyle w:val="Heading2"/>
       </w:pPr>
-      <w:bookmarkStart w:id="28" w:name="_Toc241490492"/>
+      <w:bookmarkStart w:id="28" w:name="_Toc241491913"/>
       <w:r>
         <w:t>8.2 New KII Record</w:t>
       </w:r>
@@ -24795,7 +24795,7 @@
       <w:pPr>
         <w:pStyle w:val="Heading2"/>
       </w:pPr>
-      <w:bookmarkStart w:id="29" w:name="_Toc241490493"/>
+      <w:bookmarkStart w:id="29" w:name="_Toc241491914"/>
       <w:r>
         <w:t>8.3 KII record</w:t>
       </w:r>
@@ -25837,7 +25837,7 @@
         <w:pStyle w:val="Heading1"/>
         <w:pageBreakBefore/>
       </w:pPr>
-      <w:bookmarkStart w:id="30" w:name="_Toc241490494"/>
+      <w:bookmarkStart w:id="30" w:name="_Toc241491915"/>
       <w:r>
         <w:lastRenderedPageBreak/>
         <w:t>9. Documentary evidence</w:t>
@@ -25848,7 +25848,7 @@
       <w:pPr>
         <w:pStyle w:val="Heading2"/>
       </w:pPr>
-      <w:bookmarkStart w:id="31" w:name="_Toc241490495"/>
+      <w:bookmarkStart w:id="31" w:name="_Toc241491916"/>
       <w:r>
         <w:t>9.1 Documents (the corpus)</w:t>
       </w:r>
@@ -26468,7 +26468,7 @@
       <w:pPr>
         <w:pStyle w:val="Heading2"/>
       </w:pPr>
-      <w:bookmarkStart w:id="32" w:name="_Toc241490496"/>
+      <w:bookmarkStart w:id="32" w:name="_Toc241491917"/>
       <w:r>
         <w:t>9.2 New Documentary Evidence Record</w:t>
       </w:r>
@@ -27299,7 +27299,7 @@
       <w:pPr>
         <w:pStyle w:val="Heading2"/>
       </w:pPr>
-      <w:bookmarkStart w:id="33" w:name="_Toc241490497"/>
+      <w:bookmarkStart w:id="33" w:name="_Toc241491918"/>
       <w:r>
         <w:t>9.3 Document record</w:t>
       </w:r>
@@ -28653,7 +28653,7 @@
       <w:pPr>
         <w:pStyle w:val="Heading2"/>
       </w:pPr>
-      <w:bookmarkStart w:id="34" w:name="_Toc241490498"/>
+      <w:bookmarkStart w:id="34" w:name="_Toc241491919"/>
       <w:r>
         <w:t>9.4 Auto-fill review screen</w:t>
       </w:r>
@@ -29695,7 +29695,7 @@
         <w:pStyle w:val="Heading1"/>
         <w:pageBreakBefore/>
       </w:pPr>
-      <w:bookmarkStart w:id="35" w:name="_Toc241490499"/>
+      <w:bookmarkStart w:id="35" w:name="_Toc241491920"/>
       <w:r>
         <w:lastRenderedPageBreak/>
         <w:t>10. Completed forms and exports</w:t>
@@ -29706,7 +29706,7 @@
       <w:pPr>
         <w:pStyle w:val="Heading2"/>
       </w:pPr>
-      <w:bookmarkStart w:id="36" w:name="_Toc241490500"/>
+      <w:bookmarkStart w:id="36" w:name="_Toc241491921"/>
       <w:r>
         <w:t>10.1 Completed forms (Form PDFs)</w:t>
       </w:r>
@@ -30972,7 +30972,7 @@
         <w:pStyle w:val="Heading1"/>
         <w:pageBreakBefore/>
       </w:pPr>
-      <w:bookmarkStart w:id="37" w:name="_Toc241490501"/>
+      <w:bookmarkStart w:id="37" w:name="_Toc241491922"/>
       <w:r>
         <w:lastRenderedPageBreak/>
         <w:t>11. Study administration</w:t>
@@ -30983,7 +30983,7 @@
       <w:pPr>
         <w:pStyle w:val="Heading2"/>
       </w:pPr>
-      <w:bookmarkStart w:id="38" w:name="_Toc241490502"/>
+      <w:bookmarkStart w:id="38" w:name="_Toc241491923"/>
       <w:r>
         <w:t>11.1 Cost Dashboard</w:t>
       </w:r>
@@ -31393,7 +31393,7 @@
       <w:pPr>
         <w:pStyle w:val="Heading2"/>
       </w:pPr>
-      <w:bookmarkStart w:id="39" w:name="_Toc241490503"/>
+      <w:bookmarkStart w:id="39" w:name="_Toc241491924"/>
       <w:r>
         <w:t>11.2 Audit Log</w:t>
       </w:r>
@@ -31803,7 +31803,7 @@
       <w:pPr>
         <w:pStyle w:val="Heading2"/>
       </w:pPr>
-      <w:bookmarkStart w:id="40" w:name="_Toc241490504"/>
+      <w:bookmarkStart w:id="40" w:name="_Toc241491925"/>
       <w:r>
         <w:t>11.3 Export</w:t>
       </w:r>
@@ -32468,7 +32468,7 @@
         <w:sz w:val="16"/>
         <w:szCs w:val="16"/>
       </w:rPr>
-      <w:t>Version 1.11 · 28 September 2026</w:t>
+      <w:t>Version 1.12 · 28 September 2026</w:t>
     </w:r>
     <w:r>
       <w:rPr>
@@ -32641,10 +32641,68 @@
 <file path=word/numbering.xml><?xml version="1.0" encoding="utf-8"?>
 <w:numbering xmlns:wpc="http://schemas.microsoft.com/office/word/2010/wordprocessingCanvas" xmlns:cx="http://schemas.microsoft.com/office/drawing/2014/chartex" xmlns:cx1="http://schemas.microsoft.com/office/drawing/2015/9/8/chartex" xmlns:cx2="http://schemas.microsoft.com/office/drawing/2015/10/21/chartex" xmlns:cx3="http://schemas.microsoft.com/office/drawing/2016/5/9/chartex" xmlns:cx4="http://schemas.microsoft.com/office/drawing/2016/5/10/chartex" xmlns:cx5="http://schemas.microsoft.com/office/drawing/2016/5/11/chartex" xmlns:cx6="http://schemas.microsoft.com/office/drawing/2016/5/12/chartex" xmlns:cx7="http://schemas.microsoft.com/office/drawing/2016/5/13/chartex" xmlns:cx8="http://schemas.microsoft.com/office/drawing/2016/5/14/chartex" xmlns:mc="http://schemas.openxmlformats.org/markup-compatibility/2006" xmlns:aink="http://schemas.microsoft.com/office/drawing/2016/ink" xmlns:am3d="http://schemas.microsoft.com/office/drawing/2017/model3d" xmlns:o="urn:schemas-microsoft-com:office:office" xmlns:oel="http://schemas.microsoft.com/office/2019/extlst" xmlns:r="http://schemas.openxmlformats.org/officeDocument/2006/relationships" xmlns:m="http://schemas.openxmlformats.org/officeDocument/2006/math" xmlns:v="urn:schemas-microsoft-com:vml" xmlns:wp14="http://schemas.microsoft.com/office/word/2010/wordprocessingDrawing" xmlns:wp="http://schemas.openxmlformats.org/drawingml/2006/wordprocessingDrawing" xmlns:w10="urn:schemas-microsoft-com:office:word" xmlns:w="http://schemas.openxmlformats.org/wordprocessingml/2006/main" xmlns:w14="http://schemas.microsoft.com/office/word/2010/wordml" xmlns:w15="http://schemas.microsoft.com/office/word/2012/wordml" xmlns:w16cex="http://schemas.microsoft.com/office/word/2018/wordml/cex" xmlns:w16cid="http://schemas.microsoft.com/office/word/2016/wordml/cid" xmlns:w16="http://schemas.microsoft.com/office/word/2018/wordml" xmlns:w16sdtdh="http://schemas.microsoft.com/office/word/2020/wordml/sdtdatahash" xmlns:w16se="http://schemas.microsoft.com/office/word/2015/wordml/symex" xmlns:wpg="http://schemas.microsoft.com/office/word/2010/wordprocessingGroup" xmlns:wpi="http://schemas.microsoft.com/office/word/2010/wordprocessingInk" xmlns:wne="http://schemas.microsoft.com/office/word/2006/wordml" xmlns:wps="http://schemas.microsoft.com/office/word/2010/wordprocessingShape" mc:Ignorable="w14 w15 w16se w16cid w16 w16cex w16sdtdh wp14">
   <w:abstractNum w:abstractNumId="0" w15:restartNumberingAfterBreak="0">
-    <w:nsid w:val="2746587D"/>
+    <w:nsid w:val="55834ADC"/>
     <w:multiLevelType w:val="hybridMultilevel"/>
-    <w:tmpl w:val="0F105CF6"/>
-    <w:lvl w:ilvl="0" w:tplc="AADAF546">
+    <w:tmpl w:val="373C8562"/>
+    <w:lvl w:ilvl="0" w:tplc="7B68E822">
+      <w:start w:val="1"/>
+      <w:numFmt w:val="bullet"/>
+      <w:lvlText w:val="•"/>
+      <w:lvlJc w:val="left"/>
+      <w:pPr>
+        <w:ind w:left="460" w:hanging="280"/>
+      </w:pPr>
+    </w:lvl>
+    <w:lvl w:ilvl="1" w:tplc="E3584B82">
+      <w:start w:val="1"/>
+      <w:numFmt w:val="bullet"/>
+      <w:lvlText w:val="–"/>
+      <w:lvlJc w:val="left"/>
+      <w:pPr>
+        <w:ind w:left="900" w:hanging="280"/>
+      </w:pPr>
+    </w:lvl>
+    <w:lvl w:ilvl="2" w:tplc="340E79BE">
+      <w:numFmt w:val="decimal"/>
+      <w:lvlText w:val=""/>
+      <w:lvlJc w:val="left"/>
+    </w:lvl>
+    <w:lvl w:ilvl="3" w:tplc="0D66574C">
+      <w:numFmt w:val="decimal"/>
+      <w:lvlText w:val=""/>
+      <w:lvlJc w:val="left"/>
+    </w:lvl>
+    <w:lvl w:ilvl="4" w:tplc="77DEE85C">
+      <w:numFmt w:val="decimal"/>
+      <w:lvlText w:val=""/>
+      <w:lvlJc w:val="left"/>
+    </w:lvl>
+    <w:lvl w:ilvl="5" w:tplc="ACACE8F2">
+      <w:numFmt w:val="decimal"/>
+      <w:lvlText w:val=""/>
+      <w:lvlJc w:val="left"/>
+    </w:lvl>
+    <w:lvl w:ilvl="6" w:tplc="51CA2AC2">
+      <w:numFmt w:val="decimal"/>
+      <w:lvlText w:val=""/>
+      <w:lvlJc w:val="left"/>
+    </w:lvl>
+    <w:lvl w:ilvl="7" w:tplc="D7AEEB54">
+      <w:numFmt w:val="decimal"/>
+      <w:lvlText w:val=""/>
+      <w:lvlJc w:val="left"/>
+    </w:lvl>
+    <w:lvl w:ilvl="8" w:tplc="B9C07EB2">
+      <w:numFmt w:val="decimal"/>
+      <w:lvlText w:val=""/>
+      <w:lvlJc w:val="left"/>
+    </w:lvl>
+  </w:abstractNum>
+  <w:abstractNum w:abstractNumId="1" w15:restartNumberingAfterBreak="0">
+    <w:nsid w:val="7C1047C2"/>
+    <w:multiLevelType w:val="hybridMultilevel"/>
+    <w:tmpl w:val="6506F74A"/>
+    <w:lvl w:ilvl="0" w:tplc="7A8CA814">
       <w:start w:val="1"/>
       <w:numFmt w:val="bullet"/>
       <w:lvlText w:val="●"/>
@@ -32653,7 +32711,7 @@
         <w:ind w:left="720" w:hanging="360"/>
       </w:pPr>
     </w:lvl>
-    <w:lvl w:ilvl="1" w:tplc="2CB80B2A">
+    <w:lvl w:ilvl="1" w:tplc="8C9842F2">
       <w:start w:val="1"/>
       <w:numFmt w:val="bullet"/>
       <w:lvlText w:val="○"/>
@@ -32662,7 +32720,7 @@
         <w:ind w:left="1440" w:hanging="360"/>
       </w:pPr>
     </w:lvl>
-    <w:lvl w:ilvl="2" w:tplc="990615F0">
+    <w:lvl w:ilvl="2" w:tplc="8A822B90">
       <w:start w:val="1"/>
       <w:numFmt w:val="bullet"/>
       <w:lvlText w:val="■"/>
@@ -32671,7 +32729,7 @@
         <w:ind w:left="2160" w:hanging="360"/>
       </w:pPr>
     </w:lvl>
-    <w:lvl w:ilvl="3" w:tplc="F52063CE">
+    <w:lvl w:ilvl="3" w:tplc="9864D6F8">
       <w:start w:val="1"/>
       <w:numFmt w:val="bullet"/>
       <w:lvlText w:val="●"/>
@@ -32680,7 +32738,7 @@
         <w:ind w:left="2880" w:hanging="360"/>
       </w:pPr>
     </w:lvl>
-    <w:lvl w:ilvl="4" w:tplc="75E67C44">
+    <w:lvl w:ilvl="4" w:tplc="9BB88DCA">
       <w:start w:val="1"/>
       <w:numFmt w:val="bullet"/>
       <w:lvlText w:val="○"/>
@@ -32689,7 +32747,7 @@
         <w:ind w:left="3600" w:hanging="360"/>
       </w:pPr>
     </w:lvl>
-    <w:lvl w:ilvl="5" w:tplc="A7ECB252">
+    <w:lvl w:ilvl="5" w:tplc="02CA5714">
       <w:start w:val="1"/>
       <w:numFmt w:val="bullet"/>
       <w:lvlText w:val="■"/>
@@ -32698,7 +32756,7 @@
         <w:ind w:left="4320" w:hanging="360"/>
       </w:pPr>
     </w:lvl>
-    <w:lvl w:ilvl="6" w:tplc="87B2249C">
+    <w:lvl w:ilvl="6" w:tplc="367A58B8">
       <w:start w:val="1"/>
       <w:numFmt w:val="bullet"/>
       <w:lvlText w:val="●"/>
@@ -32707,7 +32765,7 @@
         <w:ind w:left="5040" w:hanging="360"/>
       </w:pPr>
     </w:lvl>
-    <w:lvl w:ilvl="7" w:tplc="C5E0B002">
+    <w:lvl w:ilvl="7" w:tplc="E0FA578E">
       <w:start w:val="1"/>
       <w:numFmt w:val="bullet"/>
       <w:lvlText w:val="●"/>
@@ -32716,7 +32774,7 @@
         <w:ind w:left="5760" w:hanging="360"/>
       </w:pPr>
     </w:lvl>
-    <w:lvl w:ilvl="8" w:tplc="B9186BD0">
+    <w:lvl w:ilvl="8" w:tplc="68840EAE">
       <w:start w:val="1"/>
       <w:numFmt w:val="bullet"/>
       <w:lvlText w:val="●"/>
@@ -32726,72 +32784,14 @@
       </w:pPr>
     </w:lvl>
   </w:abstractNum>
-  <w:abstractNum w:abstractNumId="1" w15:restartNumberingAfterBreak="0">
-    <w:nsid w:val="5EA233D9"/>
-    <w:multiLevelType w:val="hybridMultilevel"/>
-    <w:tmpl w:val="8F3C8BFC"/>
-    <w:lvl w:ilvl="0" w:tplc="D8640500">
-      <w:start w:val="1"/>
-      <w:numFmt w:val="bullet"/>
-      <w:lvlText w:val="•"/>
-      <w:lvlJc w:val="left"/>
-      <w:pPr>
-        <w:ind w:left="460" w:hanging="280"/>
-      </w:pPr>
-    </w:lvl>
-    <w:lvl w:ilvl="1" w:tplc="540816C0">
-      <w:start w:val="1"/>
-      <w:numFmt w:val="bullet"/>
-      <w:lvlText w:val="–"/>
-      <w:lvlJc w:val="left"/>
-      <w:pPr>
-        <w:ind w:left="900" w:hanging="280"/>
-      </w:pPr>
-    </w:lvl>
-    <w:lvl w:ilvl="2" w:tplc="3710E062">
-      <w:numFmt w:val="decimal"/>
-      <w:lvlText w:val=""/>
-      <w:lvlJc w:val="left"/>
-    </w:lvl>
-    <w:lvl w:ilvl="3" w:tplc="9ED4A22A">
-      <w:numFmt w:val="decimal"/>
-      <w:lvlText w:val=""/>
-      <w:lvlJc w:val="left"/>
-    </w:lvl>
-    <w:lvl w:ilvl="4" w:tplc="B1521CD6">
-      <w:numFmt w:val="decimal"/>
-      <w:lvlText w:val=""/>
-      <w:lvlJc w:val="left"/>
-    </w:lvl>
-    <w:lvl w:ilvl="5" w:tplc="8BDA96F8">
-      <w:numFmt w:val="decimal"/>
-      <w:lvlText w:val=""/>
-      <w:lvlJc w:val="left"/>
-    </w:lvl>
-    <w:lvl w:ilvl="6" w:tplc="199A7316">
-      <w:numFmt w:val="decimal"/>
-      <w:lvlText w:val=""/>
-      <w:lvlJc w:val="left"/>
-    </w:lvl>
-    <w:lvl w:ilvl="7" w:tplc="87E4CD84">
-      <w:numFmt w:val="decimal"/>
-      <w:lvlText w:val=""/>
-      <w:lvlJc w:val="left"/>
-    </w:lvl>
-    <w:lvl w:ilvl="8" w:tplc="FCB41776">
-      <w:numFmt w:val="decimal"/>
-      <w:lvlText w:val=""/>
-      <w:lvlJc w:val="left"/>
-    </w:lvl>
-  </w:abstractNum>
-  <w:num w:numId="1" w16cid:durableId="1777022272">
-    <w:abstractNumId w:val="0"/>
+  <w:num w:numId="1" w16cid:durableId="1434475431">
+    <w:abstractNumId w:val="1"/>
     <w:lvlOverride w:ilvl="0">
       <w:startOverride w:val="1"/>
     </w:lvlOverride>
   </w:num>
-  <w:num w:numId="2" w16cid:durableId="1134904703">
-    <w:abstractNumId w:val="1"/>
+  <w:num w:numId="2" w16cid:durableId="1813521617">
+    <w:abstractNumId w:val="0"/>
     <w:lvlOverride w:ilvl="0">
       <w:startOverride w:val="1"/>
     </w:lvlOverride>
@@ -33416,7 +33416,7 @@
     <w:autoRedefine/>
     <w:uiPriority w:val="39"/>
     <w:unhideWhenUsed/>
-    <w:rsid w:val="004E2359"/>
+    <w:rsid w:val="00103ADA"/>
     <w:pPr>
       <w:spacing w:after="100"/>
     </w:pPr>
@@ -33428,7 +33428,7 @@
     <w:autoRedefine/>
     <w:uiPriority w:val="39"/>
     <w:unhideWhenUsed/>
-    <w:rsid w:val="004E2359"/>
+    <w:rsid w:val="00103ADA"/>
     <w:pPr>
       <w:spacing w:after="100"/>
       <w:ind w:left="210"/>

</xml_diff>

<commit_message>
docs: Research Clearance in the manuals (v1.13)
Covers the new PI-only screen across all of it: the role table and screen
counts in common.js (PI now 20 screens, FC/Supervisor explicitly exclude it
alongside the Audit Log), a glossary entry, a System Manual section (3.15)
and screen-reference entry (6.14, old 6.14 renumbered to 6.15), a step-by-
step procedure (7.27 / tasks.js T.clearance), a full Screen and Button
Reference entry (reference_b.js, auto-flows into Role Guide 1's closing
appendix and the "who can open which screen" matrix), Role Guide updates
for PI/FC/Supervisor, and a line in the Respondent Guide's Step 4.

Rebuilt via build_manuals.js and finalise_manuals.ps1; verified by
extracting text from the built PDFs rather than assuming the build worked.

Co-Authored-By: Claude Sonnet 5 <noreply@anthropic.com>
</commit_message>
<xml_diff>
--- a/docs/manuals/ABF-FST_Screen_and_Button_Reference.docx
+++ b/docs/manuals/ABF-FST_Screen_and_Button_Reference.docx
@@ -469,7 +469,7 @@
                 <w:sz w:val="19"/>
                 <w:szCs w:val="19"/>
               </w:rPr>
-              <w:t>Version 1.12 · 28 September 2026</w:t>
+              <w:t>Version 1.13 · 1 October 2026</w:t>
             </w:r>
           </w:p>
         </w:tc>
@@ -538,7 +538,7 @@
     <w:sdt>
       <w:sdtPr>
         <w:alias w:val="Contents"/>
-        <w:id w:val="1940943072"/>
+        <w:id w:val="930169756"/>
       </w:sdtPr>
       <w:sdtEndPr/>
       <w:sdtContent>
@@ -567,7 +567,7 @@
           <w:r>
             <w:fldChar w:fldCharType="separate"/>
           </w:r>
-          <w:hyperlink w:anchor="_Toc241491885" w:history="1">
+          <w:hyperlink w:anchor="_Toc241726267" w:history="1">
             <w:r>
               <w:rPr>
                 <w:rStyle w:val="Hyperlink"/>
@@ -591,7 +591,7 @@
               <w:rPr>
                 <w:noProof/>
               </w:rPr>
-              <w:instrText xml:space="preserve"> PAGEREF _Toc241491885 \h </w:instrText>
+              <w:instrText xml:space="preserve"> PAGEREF _Toc241726267 \h </w:instrText>
             </w:r>
             <w:r>
               <w:rPr>
@@ -634,7 +634,7 @@
               <w14:ligatures w14:val="standardContextual"/>
             </w:rPr>
           </w:pPr>
-          <w:hyperlink w:anchor="_Toc241491886" w:history="1">
+          <w:hyperlink w:anchor="_Toc241726268" w:history="1">
             <w:r>
               <w:rPr>
                 <w:rStyle w:val="Hyperlink"/>
@@ -658,7 +658,7 @@
               <w:rPr>
                 <w:noProof/>
               </w:rPr>
-              <w:instrText xml:space="preserve"> PAGEREF _Toc241491886 \h </w:instrText>
+              <w:instrText xml:space="preserve"> PAGEREF _Toc241726268 \h </w:instrText>
             </w:r>
             <w:r>
               <w:rPr>
@@ -701,7 +701,7 @@
               <w14:ligatures w14:val="standardContextual"/>
             </w:rPr>
           </w:pPr>
-          <w:hyperlink w:anchor="_Toc241491887" w:history="1">
+          <w:hyperlink w:anchor="_Toc241726269" w:history="1">
             <w:r>
               <w:rPr>
                 <w:rStyle w:val="Hyperlink"/>
@@ -725,7 +725,7 @@
               <w:rPr>
                 <w:noProof/>
               </w:rPr>
-              <w:instrText xml:space="preserve"> PAGEREF _Toc241491887 \h </w:instrText>
+              <w:instrText xml:space="preserve"> PAGEREF _Toc241726269 \h </w:instrText>
             </w:r>
             <w:r>
               <w:rPr>
@@ -768,7 +768,7 @@
               <w14:ligatures w14:val="standardContextual"/>
             </w:rPr>
           </w:pPr>
-          <w:hyperlink w:anchor="_Toc241491888" w:history="1">
+          <w:hyperlink w:anchor="_Toc241726270" w:history="1">
             <w:r>
               <w:rPr>
                 <w:rStyle w:val="Hyperlink"/>
@@ -792,7 +792,7 @@
               <w:rPr>
                 <w:noProof/>
               </w:rPr>
-              <w:instrText xml:space="preserve"> PAGEREF _Toc241491888 \h </w:instrText>
+              <w:instrText xml:space="preserve"> PAGEREF _Toc241726270 \h </w:instrText>
             </w:r>
             <w:r>
               <w:rPr>
@@ -835,7 +835,7 @@
               <w14:ligatures w14:val="standardContextual"/>
             </w:rPr>
           </w:pPr>
-          <w:hyperlink w:anchor="_Toc241491889" w:history="1">
+          <w:hyperlink w:anchor="_Toc241726271" w:history="1">
             <w:r>
               <w:rPr>
                 <w:rStyle w:val="Hyperlink"/>
@@ -859,7 +859,7 @@
               <w:rPr>
                 <w:noProof/>
               </w:rPr>
-              <w:instrText xml:space="preserve"> PAGEREF _Toc241491889 \h </w:instrText>
+              <w:instrText xml:space="preserve"> PAGEREF _Toc241726271 \h </w:instrText>
             </w:r>
             <w:r>
               <w:rPr>
@@ -902,7 +902,7 @@
               <w14:ligatures w14:val="standardContextual"/>
             </w:rPr>
           </w:pPr>
-          <w:hyperlink w:anchor="_Toc241491890" w:history="1">
+          <w:hyperlink w:anchor="_Toc241726272" w:history="1">
             <w:r>
               <w:rPr>
                 <w:rStyle w:val="Hyperlink"/>
@@ -926,7 +926,7 @@
               <w:rPr>
                 <w:noProof/>
               </w:rPr>
-              <w:instrText xml:space="preserve"> PAGEREF _Toc241491890 \h </w:instrText>
+              <w:instrText xml:space="preserve"> PAGEREF _Toc241726272 \h </w:instrText>
             </w:r>
             <w:r>
               <w:rPr>
@@ -969,7 +969,7 @@
               <w14:ligatures w14:val="standardContextual"/>
             </w:rPr>
           </w:pPr>
-          <w:hyperlink w:anchor="_Toc241491891" w:history="1">
+          <w:hyperlink w:anchor="_Toc241726273" w:history="1">
             <w:r>
               <w:rPr>
                 <w:rStyle w:val="Hyperlink"/>
@@ -993,7 +993,7 @@
               <w:rPr>
                 <w:noProof/>
               </w:rPr>
-              <w:instrText xml:space="preserve"> PAGEREF _Toc241491891 \h </w:instrText>
+              <w:instrText xml:space="preserve"> PAGEREF _Toc241726273 \h </w:instrText>
             </w:r>
             <w:r>
               <w:rPr>
@@ -1036,7 +1036,7 @@
               <w14:ligatures w14:val="standardContextual"/>
             </w:rPr>
           </w:pPr>
-          <w:hyperlink w:anchor="_Toc241491892" w:history="1">
+          <w:hyperlink w:anchor="_Toc241726274" w:history="1">
             <w:r>
               <w:rPr>
                 <w:rStyle w:val="Hyperlink"/>
@@ -1060,7 +1060,7 @@
               <w:rPr>
                 <w:noProof/>
               </w:rPr>
-              <w:instrText xml:space="preserve"> PAGEREF _Toc241491892 \h </w:instrText>
+              <w:instrText xml:space="preserve"> PAGEREF _Toc241726274 \h </w:instrText>
             </w:r>
             <w:r>
               <w:rPr>
@@ -1103,7 +1103,7 @@
               <w14:ligatures w14:val="standardContextual"/>
             </w:rPr>
           </w:pPr>
-          <w:hyperlink w:anchor="_Toc241491893" w:history="1">
+          <w:hyperlink w:anchor="_Toc241726275" w:history="1">
             <w:r>
               <w:rPr>
                 <w:rStyle w:val="Hyperlink"/>
@@ -1127,7 +1127,7 @@
               <w:rPr>
                 <w:noProof/>
               </w:rPr>
-              <w:instrText xml:space="preserve"> PAGEREF _Toc241491893 \h </w:instrText>
+              <w:instrText xml:space="preserve"> PAGEREF _Toc241726275 \h </w:instrText>
             </w:r>
             <w:r>
               <w:rPr>
@@ -1170,7 +1170,7 @@
               <w14:ligatures w14:val="standardContextual"/>
             </w:rPr>
           </w:pPr>
-          <w:hyperlink w:anchor="_Toc241491894" w:history="1">
+          <w:hyperlink w:anchor="_Toc241726276" w:history="1">
             <w:r>
               <w:rPr>
                 <w:rStyle w:val="Hyperlink"/>
@@ -1194,7 +1194,7 @@
               <w:rPr>
                 <w:noProof/>
               </w:rPr>
-              <w:instrText xml:space="preserve"> PAGEREF _Toc241491894 \h </w:instrText>
+              <w:instrText xml:space="preserve"> PAGEREF _Toc241726276 \h </w:instrText>
             </w:r>
             <w:r>
               <w:rPr>
@@ -1237,7 +1237,7 @@
               <w14:ligatures w14:val="standardContextual"/>
             </w:rPr>
           </w:pPr>
-          <w:hyperlink w:anchor="_Toc241491895" w:history="1">
+          <w:hyperlink w:anchor="_Toc241726277" w:history="1">
             <w:r>
               <w:rPr>
                 <w:rStyle w:val="Hyperlink"/>
@@ -1261,7 +1261,7 @@
               <w:rPr>
                 <w:noProof/>
               </w:rPr>
-              <w:instrText xml:space="preserve"> PAGEREF _Toc241491895 \h </w:instrText>
+              <w:instrText xml:space="preserve"> PAGEREF _Toc241726277 \h </w:instrText>
             </w:r>
             <w:r>
               <w:rPr>
@@ -1304,7 +1304,7 @@
               <w14:ligatures w14:val="standardContextual"/>
             </w:rPr>
           </w:pPr>
-          <w:hyperlink w:anchor="_Toc241491896" w:history="1">
+          <w:hyperlink w:anchor="_Toc241726278" w:history="1">
             <w:r>
               <w:rPr>
                 <w:rStyle w:val="Hyperlink"/>
@@ -1328,7 +1328,7 @@
               <w:rPr>
                 <w:noProof/>
               </w:rPr>
-              <w:instrText xml:space="preserve"> PAGEREF _Toc241491896 \h </w:instrText>
+              <w:instrText xml:space="preserve"> PAGEREF _Toc241726278 \h </w:instrText>
             </w:r>
             <w:r>
               <w:rPr>
@@ -1371,7 +1371,7 @@
               <w14:ligatures w14:val="standardContextual"/>
             </w:rPr>
           </w:pPr>
-          <w:hyperlink w:anchor="_Toc241491897" w:history="1">
+          <w:hyperlink w:anchor="_Toc241726279" w:history="1">
             <w:r>
               <w:rPr>
                 <w:rStyle w:val="Hyperlink"/>
@@ -1395,7 +1395,7 @@
               <w:rPr>
                 <w:noProof/>
               </w:rPr>
-              <w:instrText xml:space="preserve"> PAGEREF _Toc241491897 \h </w:instrText>
+              <w:instrText xml:space="preserve"> PAGEREF _Toc241726279 \h </w:instrText>
             </w:r>
             <w:r>
               <w:rPr>
@@ -1438,7 +1438,7 @@
               <w14:ligatures w14:val="standardContextual"/>
             </w:rPr>
           </w:pPr>
-          <w:hyperlink w:anchor="_Toc241491898" w:history="1">
+          <w:hyperlink w:anchor="_Toc241726280" w:history="1">
             <w:r>
               <w:rPr>
                 <w:rStyle w:val="Hyperlink"/>
@@ -1462,7 +1462,7 @@
               <w:rPr>
                 <w:noProof/>
               </w:rPr>
-              <w:instrText xml:space="preserve"> PAGEREF _Toc241491898 \h </w:instrText>
+              <w:instrText xml:space="preserve"> PAGEREF _Toc241726280 \h </w:instrText>
             </w:r>
             <w:r>
               <w:rPr>
@@ -1505,7 +1505,7 @@
               <w14:ligatures w14:val="standardContextual"/>
             </w:rPr>
           </w:pPr>
-          <w:hyperlink w:anchor="_Toc241491899" w:history="1">
+          <w:hyperlink w:anchor="_Toc241726281" w:history="1">
             <w:r>
               <w:rPr>
                 <w:rStyle w:val="Hyperlink"/>
@@ -1529,7 +1529,7 @@
               <w:rPr>
                 <w:noProof/>
               </w:rPr>
-              <w:instrText xml:space="preserve"> PAGEREF _Toc241491899 \h </w:instrText>
+              <w:instrText xml:space="preserve"> PAGEREF _Toc241726281 \h </w:instrText>
             </w:r>
             <w:r>
               <w:rPr>
@@ -1572,7 +1572,7 @@
               <w14:ligatures w14:val="standardContextual"/>
             </w:rPr>
           </w:pPr>
-          <w:hyperlink w:anchor="_Toc241491900" w:history="1">
+          <w:hyperlink w:anchor="_Toc241726282" w:history="1">
             <w:r>
               <w:rPr>
                 <w:rStyle w:val="Hyperlink"/>
@@ -1596,7 +1596,7 @@
               <w:rPr>
                 <w:noProof/>
               </w:rPr>
-              <w:instrText xml:space="preserve"> PAGEREF _Toc241491900 \h </w:instrText>
+              <w:instrText xml:space="preserve"> PAGEREF _Toc241726282 \h </w:instrText>
             </w:r>
             <w:r>
               <w:rPr>
@@ -1639,7 +1639,7 @@
               <w14:ligatures w14:val="standardContextual"/>
             </w:rPr>
           </w:pPr>
-          <w:hyperlink w:anchor="_Toc241491901" w:history="1">
+          <w:hyperlink w:anchor="_Toc241726283" w:history="1">
             <w:r>
               <w:rPr>
                 <w:rStyle w:val="Hyperlink"/>
@@ -1663,7 +1663,7 @@
               <w:rPr>
                 <w:noProof/>
               </w:rPr>
-              <w:instrText xml:space="preserve"> PAGEREF _Toc241491901 \h </w:instrText>
+              <w:instrText xml:space="preserve"> PAGEREF _Toc241726283 \h </w:instrText>
             </w:r>
             <w:r>
               <w:rPr>
@@ -1706,7 +1706,7 @@
               <w14:ligatures w14:val="standardContextual"/>
             </w:rPr>
           </w:pPr>
-          <w:hyperlink w:anchor="_Toc241491902" w:history="1">
+          <w:hyperlink w:anchor="_Toc241726284" w:history="1">
             <w:r>
               <w:rPr>
                 <w:rStyle w:val="Hyperlink"/>
@@ -1730,7 +1730,7 @@
               <w:rPr>
                 <w:noProof/>
               </w:rPr>
-              <w:instrText xml:space="preserve"> PAGEREF _Toc241491902 \h </w:instrText>
+              <w:instrText xml:space="preserve"> PAGEREF _Toc241726284 \h </w:instrText>
             </w:r>
             <w:r>
               <w:rPr>
@@ -1773,7 +1773,7 @@
               <w14:ligatures w14:val="standardContextual"/>
             </w:rPr>
           </w:pPr>
-          <w:hyperlink w:anchor="_Toc241491903" w:history="1">
+          <w:hyperlink w:anchor="_Toc241726285" w:history="1">
             <w:r>
               <w:rPr>
                 <w:rStyle w:val="Hyperlink"/>
@@ -1797,7 +1797,7 @@
               <w:rPr>
                 <w:noProof/>
               </w:rPr>
-              <w:instrText xml:space="preserve"> PAGEREF _Toc241491903 \h </w:instrText>
+              <w:instrText xml:space="preserve"> PAGEREF _Toc241726285 \h </w:instrText>
             </w:r>
             <w:r>
               <w:rPr>
@@ -1840,7 +1840,7 @@
               <w14:ligatures w14:val="standardContextual"/>
             </w:rPr>
           </w:pPr>
-          <w:hyperlink w:anchor="_Toc241491904" w:history="1">
+          <w:hyperlink w:anchor="_Toc241726286" w:history="1">
             <w:r>
               <w:rPr>
                 <w:rStyle w:val="Hyperlink"/>
@@ -1864,7 +1864,7 @@
               <w:rPr>
                 <w:noProof/>
               </w:rPr>
-              <w:instrText xml:space="preserve"> PAGEREF _Toc241491904 \h </w:instrText>
+              <w:instrText xml:space="preserve"> PAGEREF _Toc241726286 \h </w:instrText>
             </w:r>
             <w:r>
               <w:rPr>
@@ -1907,7 +1907,7 @@
               <w14:ligatures w14:val="standardContextual"/>
             </w:rPr>
           </w:pPr>
-          <w:hyperlink w:anchor="_Toc241491905" w:history="1">
+          <w:hyperlink w:anchor="_Toc241726287" w:history="1">
             <w:r>
               <w:rPr>
                 <w:rStyle w:val="Hyperlink"/>
@@ -1931,7 +1931,7 @@
               <w:rPr>
                 <w:noProof/>
               </w:rPr>
-              <w:instrText xml:space="preserve"> PAGEREF _Toc241491905 \h </w:instrText>
+              <w:instrText xml:space="preserve"> PAGEREF _Toc241726287 \h </w:instrText>
             </w:r>
             <w:r>
               <w:rPr>
@@ -1974,7 +1974,7 @@
               <w14:ligatures w14:val="standardContextual"/>
             </w:rPr>
           </w:pPr>
-          <w:hyperlink w:anchor="_Toc241491906" w:history="1">
+          <w:hyperlink w:anchor="_Toc241726288" w:history="1">
             <w:r>
               <w:rPr>
                 <w:rStyle w:val="Hyperlink"/>
@@ -1998,7 +1998,7 @@
               <w:rPr>
                 <w:noProof/>
               </w:rPr>
-              <w:instrText xml:space="preserve"> PAGEREF _Toc241491906 \h </w:instrText>
+              <w:instrText xml:space="preserve"> PAGEREF _Toc241726288 \h </w:instrText>
             </w:r>
             <w:r>
               <w:rPr>
@@ -2041,7 +2041,7 @@
               <w14:ligatures w14:val="standardContextual"/>
             </w:rPr>
           </w:pPr>
-          <w:hyperlink w:anchor="_Toc241491907" w:history="1">
+          <w:hyperlink w:anchor="_Toc241726289" w:history="1">
             <w:r>
               <w:rPr>
                 <w:rStyle w:val="Hyperlink"/>
@@ -2065,7 +2065,7 @@
               <w:rPr>
                 <w:noProof/>
               </w:rPr>
-              <w:instrText xml:space="preserve"> PAGEREF _Toc241491907 \h </w:instrText>
+              <w:instrText xml:space="preserve"> PAGEREF _Toc241726289 \h </w:instrText>
             </w:r>
             <w:r>
               <w:rPr>
@@ -2108,7 +2108,7 @@
               <w14:ligatures w14:val="standardContextual"/>
             </w:rPr>
           </w:pPr>
-          <w:hyperlink w:anchor="_Toc241491908" w:history="1">
+          <w:hyperlink w:anchor="_Toc241726290" w:history="1">
             <w:r>
               <w:rPr>
                 <w:rStyle w:val="Hyperlink"/>
@@ -2132,7 +2132,7 @@
               <w:rPr>
                 <w:noProof/>
               </w:rPr>
-              <w:instrText xml:space="preserve"> PAGEREF _Toc241491908 \h </w:instrText>
+              <w:instrText xml:space="preserve"> PAGEREF _Toc241726290 \h </w:instrText>
             </w:r>
             <w:r>
               <w:rPr>
@@ -2175,7 +2175,7 @@
               <w14:ligatures w14:val="standardContextual"/>
             </w:rPr>
           </w:pPr>
-          <w:hyperlink w:anchor="_Toc241491909" w:history="1">
+          <w:hyperlink w:anchor="_Toc241726291" w:history="1">
             <w:r>
               <w:rPr>
                 <w:rStyle w:val="Hyperlink"/>
@@ -2199,7 +2199,7 @@
               <w:rPr>
                 <w:noProof/>
               </w:rPr>
-              <w:instrText xml:space="preserve"> PAGEREF _Toc241491909 \h </w:instrText>
+              <w:instrText xml:space="preserve"> PAGEREF _Toc241726291 \h </w:instrText>
             </w:r>
             <w:r>
               <w:rPr>
@@ -2242,7 +2242,7 @@
               <w14:ligatures w14:val="standardContextual"/>
             </w:rPr>
           </w:pPr>
-          <w:hyperlink w:anchor="_Toc241491910" w:history="1">
+          <w:hyperlink w:anchor="_Toc241726292" w:history="1">
             <w:r>
               <w:rPr>
                 <w:rStyle w:val="Hyperlink"/>
@@ -2266,7 +2266,7 @@
               <w:rPr>
                 <w:noProof/>
               </w:rPr>
-              <w:instrText xml:space="preserve"> PAGEREF _Toc241491910 \h </w:instrText>
+              <w:instrText xml:space="preserve"> PAGEREF _Toc241726292 \h </w:instrText>
             </w:r>
             <w:r>
               <w:rPr>
@@ -2309,7 +2309,7 @@
               <w14:ligatures w14:val="standardContextual"/>
             </w:rPr>
           </w:pPr>
-          <w:hyperlink w:anchor="_Toc241491911" w:history="1">
+          <w:hyperlink w:anchor="_Toc241726293" w:history="1">
             <w:r>
               <w:rPr>
                 <w:rStyle w:val="Hyperlink"/>
@@ -2333,7 +2333,7 @@
               <w:rPr>
                 <w:noProof/>
               </w:rPr>
-              <w:instrText xml:space="preserve"> PAGEREF _Toc241491911 \h </w:instrText>
+              <w:instrText xml:space="preserve"> PAGEREF _Toc241726293 \h </w:instrText>
             </w:r>
             <w:r>
               <w:rPr>
@@ -2376,7 +2376,7 @@
               <w14:ligatures w14:val="standardContextual"/>
             </w:rPr>
           </w:pPr>
-          <w:hyperlink w:anchor="_Toc241491912" w:history="1">
+          <w:hyperlink w:anchor="_Toc241726294" w:history="1">
             <w:r>
               <w:rPr>
                 <w:rStyle w:val="Hyperlink"/>
@@ -2400,7 +2400,7 @@
               <w:rPr>
                 <w:noProof/>
               </w:rPr>
-              <w:instrText xml:space="preserve"> PAGEREF _Toc241491912 \h </w:instrText>
+              <w:instrText xml:space="preserve"> PAGEREF _Toc241726294 \h </w:instrText>
             </w:r>
             <w:r>
               <w:rPr>
@@ -2443,7 +2443,7 @@
               <w14:ligatures w14:val="standardContextual"/>
             </w:rPr>
           </w:pPr>
-          <w:hyperlink w:anchor="_Toc241491913" w:history="1">
+          <w:hyperlink w:anchor="_Toc241726295" w:history="1">
             <w:r>
               <w:rPr>
                 <w:rStyle w:val="Hyperlink"/>
@@ -2467,7 +2467,7 @@
               <w:rPr>
                 <w:noProof/>
               </w:rPr>
-              <w:instrText xml:space="preserve"> PAGEREF _Toc241491913 \h </w:instrText>
+              <w:instrText xml:space="preserve"> PAGEREF _Toc241726295 \h </w:instrText>
             </w:r>
             <w:r>
               <w:rPr>
@@ -2510,7 +2510,7 @@
               <w14:ligatures w14:val="standardContextual"/>
             </w:rPr>
           </w:pPr>
-          <w:hyperlink w:anchor="_Toc241491914" w:history="1">
+          <w:hyperlink w:anchor="_Toc241726296" w:history="1">
             <w:r>
               <w:rPr>
                 <w:rStyle w:val="Hyperlink"/>
@@ -2534,7 +2534,7 @@
               <w:rPr>
                 <w:noProof/>
               </w:rPr>
-              <w:instrText xml:space="preserve"> PAGEREF _Toc241491914 \h </w:instrText>
+              <w:instrText xml:space="preserve"> PAGEREF _Toc241726296 \h </w:instrText>
             </w:r>
             <w:r>
               <w:rPr>
@@ -2577,7 +2577,7 @@
               <w14:ligatures w14:val="standardContextual"/>
             </w:rPr>
           </w:pPr>
-          <w:hyperlink w:anchor="_Toc241491915" w:history="1">
+          <w:hyperlink w:anchor="_Toc241726297" w:history="1">
             <w:r>
               <w:rPr>
                 <w:rStyle w:val="Hyperlink"/>
@@ -2601,7 +2601,7 @@
               <w:rPr>
                 <w:noProof/>
               </w:rPr>
-              <w:instrText xml:space="preserve"> PAGEREF _Toc241491915 \h </w:instrText>
+              <w:instrText xml:space="preserve"> PAGEREF _Toc241726297 \h </w:instrText>
             </w:r>
             <w:r>
               <w:rPr>
@@ -2644,7 +2644,7 @@
               <w14:ligatures w14:val="standardContextual"/>
             </w:rPr>
           </w:pPr>
-          <w:hyperlink w:anchor="_Toc241491916" w:history="1">
+          <w:hyperlink w:anchor="_Toc241726298" w:history="1">
             <w:r>
               <w:rPr>
                 <w:rStyle w:val="Hyperlink"/>
@@ -2668,7 +2668,7 @@
               <w:rPr>
                 <w:noProof/>
               </w:rPr>
-              <w:instrText xml:space="preserve"> PAGEREF _Toc241491916 \h </w:instrText>
+              <w:instrText xml:space="preserve"> PAGEREF _Toc241726298 \h </w:instrText>
             </w:r>
             <w:r>
               <w:rPr>
@@ -2711,7 +2711,7 @@
               <w14:ligatures w14:val="standardContextual"/>
             </w:rPr>
           </w:pPr>
-          <w:hyperlink w:anchor="_Toc241491917" w:history="1">
+          <w:hyperlink w:anchor="_Toc241726299" w:history="1">
             <w:r>
               <w:rPr>
                 <w:rStyle w:val="Hyperlink"/>
@@ -2735,7 +2735,7 @@
               <w:rPr>
                 <w:noProof/>
               </w:rPr>
-              <w:instrText xml:space="preserve"> PAGEREF _Toc241491917 \h </w:instrText>
+              <w:instrText xml:space="preserve"> PAGEREF _Toc241726299 \h </w:instrText>
             </w:r>
             <w:r>
               <w:rPr>
@@ -2778,7 +2778,7 @@
               <w14:ligatures w14:val="standardContextual"/>
             </w:rPr>
           </w:pPr>
-          <w:hyperlink w:anchor="_Toc241491918" w:history="1">
+          <w:hyperlink w:anchor="_Toc241726300" w:history="1">
             <w:r>
               <w:rPr>
                 <w:rStyle w:val="Hyperlink"/>
@@ -2802,7 +2802,7 @@
               <w:rPr>
                 <w:noProof/>
               </w:rPr>
-              <w:instrText xml:space="preserve"> PAGEREF _Toc241491918 \h </w:instrText>
+              <w:instrText xml:space="preserve"> PAGEREF _Toc241726300 \h </w:instrText>
             </w:r>
             <w:r>
               <w:rPr>
@@ -2845,7 +2845,7 @@
               <w14:ligatures w14:val="standardContextual"/>
             </w:rPr>
           </w:pPr>
-          <w:hyperlink w:anchor="_Toc241491919" w:history="1">
+          <w:hyperlink w:anchor="_Toc241726301" w:history="1">
             <w:r>
               <w:rPr>
                 <w:rStyle w:val="Hyperlink"/>
@@ -2869,7 +2869,7 @@
               <w:rPr>
                 <w:noProof/>
               </w:rPr>
-              <w:instrText xml:space="preserve"> PAGEREF _Toc241491919 \h </w:instrText>
+              <w:instrText xml:space="preserve"> PAGEREF _Toc241726301 \h </w:instrText>
             </w:r>
             <w:r>
               <w:rPr>
@@ -2912,7 +2912,7 @@
               <w14:ligatures w14:val="standardContextual"/>
             </w:rPr>
           </w:pPr>
-          <w:hyperlink w:anchor="_Toc241491920" w:history="1">
+          <w:hyperlink w:anchor="_Toc241726302" w:history="1">
             <w:r>
               <w:rPr>
                 <w:rStyle w:val="Hyperlink"/>
@@ -2936,7 +2936,7 @@
               <w:rPr>
                 <w:noProof/>
               </w:rPr>
-              <w:instrText xml:space="preserve"> PAGEREF _Toc241491920 \h </w:instrText>
+              <w:instrText xml:space="preserve"> PAGEREF _Toc241726302 \h </w:instrText>
             </w:r>
             <w:r>
               <w:rPr>
@@ -2979,7 +2979,7 @@
               <w14:ligatures w14:val="standardContextual"/>
             </w:rPr>
           </w:pPr>
-          <w:hyperlink w:anchor="_Toc241491921" w:history="1">
+          <w:hyperlink w:anchor="_Toc241726303" w:history="1">
             <w:r>
               <w:rPr>
                 <w:rStyle w:val="Hyperlink"/>
@@ -3003,7 +3003,7 @@
               <w:rPr>
                 <w:noProof/>
               </w:rPr>
-              <w:instrText xml:space="preserve"> PAGEREF _Toc241491921 \h </w:instrText>
+              <w:instrText xml:space="preserve"> PAGEREF _Toc241726303 \h </w:instrText>
             </w:r>
             <w:r>
               <w:rPr>
@@ -3046,7 +3046,7 @@
               <w14:ligatures w14:val="standardContextual"/>
             </w:rPr>
           </w:pPr>
-          <w:hyperlink w:anchor="_Toc241491922" w:history="1">
+          <w:hyperlink w:anchor="_Toc241726304" w:history="1">
             <w:r>
               <w:rPr>
                 <w:rStyle w:val="Hyperlink"/>
@@ -3070,7 +3070,7 @@
               <w:rPr>
                 <w:noProof/>
               </w:rPr>
-              <w:instrText xml:space="preserve"> PAGEREF _Toc241491922 \h </w:instrText>
+              <w:instrText xml:space="preserve"> PAGEREF _Toc241726304 \h </w:instrText>
             </w:r>
             <w:r>
               <w:rPr>
@@ -3113,7 +3113,7 @@
               <w14:ligatures w14:val="standardContextual"/>
             </w:rPr>
           </w:pPr>
-          <w:hyperlink w:anchor="_Toc241491923" w:history="1">
+          <w:hyperlink w:anchor="_Toc241726305" w:history="1">
             <w:r>
               <w:rPr>
                 <w:rStyle w:val="Hyperlink"/>
@@ -3137,7 +3137,7 @@
               <w:rPr>
                 <w:noProof/>
               </w:rPr>
-              <w:instrText xml:space="preserve"> PAGEREF _Toc241491923 \h </w:instrText>
+              <w:instrText xml:space="preserve"> PAGEREF _Toc241726305 \h </w:instrText>
             </w:r>
             <w:r>
               <w:rPr>
@@ -3180,7 +3180,7 @@
               <w14:ligatures w14:val="standardContextual"/>
             </w:rPr>
           </w:pPr>
-          <w:hyperlink w:anchor="_Toc241491924" w:history="1">
+          <w:hyperlink w:anchor="_Toc241726306" w:history="1">
             <w:r>
               <w:rPr>
                 <w:rStyle w:val="Hyperlink"/>
@@ -3204,7 +3204,7 @@
               <w:rPr>
                 <w:noProof/>
               </w:rPr>
-              <w:instrText xml:space="preserve"> PAGEREF _Toc241491924 \h </w:instrText>
+              <w:instrText xml:space="preserve"> PAGEREF _Toc241726306 \h </w:instrText>
             </w:r>
             <w:r>
               <w:rPr>
@@ -3247,13 +3247,13 @@
               <w14:ligatures w14:val="standardContextual"/>
             </w:rPr>
           </w:pPr>
-          <w:hyperlink w:anchor="_Toc241491925" w:history="1">
+          <w:hyperlink w:anchor="_Toc241726307" w:history="1">
             <w:r>
               <w:rPr>
                 <w:rStyle w:val="Hyperlink"/>
                 <w:noProof/>
               </w:rPr>
-              <w:t>11.3 Export</w:t>
+              <w:t>11.3 Research Clearance</w:t>
             </w:r>
             <w:r>
               <w:rPr>
@@ -3271,7 +3271,7 @@
               <w:rPr>
                 <w:noProof/>
               </w:rPr>
-              <w:instrText xml:space="preserve"> PAGEREF _Toc241491925 \h </w:instrText>
+              <w:instrText xml:space="preserve"> PAGEREF _Toc241726307 \h </w:instrText>
             </w:r>
             <w:r>
               <w:rPr>
@@ -3289,6 +3289,73 @@
                 <w:noProof/>
               </w:rPr>
               <w:t>31</w:t>
+            </w:r>
+            <w:r>
+              <w:rPr>
+                <w:noProof/>
+              </w:rPr>
+              <w:fldChar w:fldCharType="end"/>
+            </w:r>
+          </w:hyperlink>
+        </w:p>
+        <w:p>
+          <w:pPr>
+            <w:pStyle w:val="TOC2"/>
+            <w:tabs>
+              <w:tab w:val="right" w:leader="dot" w:pos="9402"/>
+            </w:tabs>
+            <w:rPr>
+              <w:rFonts w:asciiTheme="minorHAnsi" w:eastAsiaTheme="minorEastAsia" w:hAnsiTheme="minorHAnsi" w:cstheme="minorBidi"/>
+              <w:noProof/>
+              <w:color w:val="auto"/>
+              <w:kern w:val="2"/>
+              <w:sz w:val="24"/>
+              <w:szCs w:val="24"/>
+              <w14:ligatures w14:val="standardContextual"/>
+            </w:rPr>
+          </w:pPr>
+          <w:hyperlink w:anchor="_Toc241726308" w:history="1">
+            <w:r>
+              <w:rPr>
+                <w:rStyle w:val="Hyperlink"/>
+                <w:noProof/>
+              </w:rPr>
+              <w:t>11.4 Export</w:t>
+            </w:r>
+            <w:r>
+              <w:rPr>
+                <w:noProof/>
+              </w:rPr>
+              <w:tab/>
+            </w:r>
+            <w:r>
+              <w:rPr>
+                <w:noProof/>
+              </w:rPr>
+              <w:fldChar w:fldCharType="begin"/>
+            </w:r>
+            <w:r>
+              <w:rPr>
+                <w:noProof/>
+              </w:rPr>
+              <w:instrText xml:space="preserve"> PAGEREF _Toc241726308 \h </w:instrText>
+            </w:r>
+            <w:r>
+              <w:rPr>
+                <w:noProof/>
+              </w:rPr>
+            </w:r>
+            <w:r>
+              <w:rPr>
+                <w:noProof/>
+              </w:rPr>
+              <w:fldChar w:fldCharType="separate"/>
+            </w:r>
+            <w:r>
+              <w:rPr>
+                <w:noProof/>
+              </w:rPr>
+              <w:t>32</w:t>
             </w:r>
             <w:r>
               <w:rPr>
@@ -3310,7 +3377,7 @@
         <w:pStyle w:val="Heading1"/>
         <w:pageBreakBefore/>
       </w:pPr>
-      <w:bookmarkStart w:id="0" w:name="_Toc241491885"/>
+      <w:bookmarkStart w:id="0" w:name="_Toc241726267"/>
       <w:r>
         <w:lastRenderedPageBreak/>
         <w:t>1. About this reference</w:t>
@@ -3763,7 +3830,7 @@
         <w:pStyle w:val="Heading1"/>
         <w:pageBreakBefore/>
       </w:pPr>
-      <w:bookmarkStart w:id="1" w:name="_Toc241491886"/>
+      <w:bookmarkStart w:id="1" w:name="_Toc241726268"/>
       <w:r>
         <w:lastRenderedPageBreak/>
         <w:t>2. Rules that apply on every screen</w:t>
@@ -3980,7 +4047,7 @@
         <w:pStyle w:val="Heading1"/>
         <w:pageBreakBefore/>
       </w:pPr>
-      <w:bookmarkStart w:id="2" w:name="_Toc241491887"/>
+      <w:bookmarkStart w:id="2" w:name="_Toc241726269"/>
       <w:r>
         <w:lastRenderedPageBreak/>
         <w:t>3. Who can open which screen</w:t>
@@ -9343,6 +9410,176 @@
                 <w:sz w:val="19"/>
                 <w:szCs w:val="19"/>
               </w:rPr>
+              <w:t>Research Clearance</w:t>
+            </w:r>
+          </w:p>
+        </w:tc>
+        <w:tc>
+          <w:tcPr>
+            <w:tcW w:w="753" w:type="dxa"/>
+            <w:tcMar>
+              <w:top w:w="70" w:type="dxa"/>
+              <w:left w:w="110" w:type="dxa"/>
+              <w:bottom w:w="70" w:type="dxa"/>
+              <w:right w:w="110" w:type="dxa"/>
+            </w:tcMar>
+          </w:tcPr>
+          <w:p>
+            <w:pPr>
+              <w:spacing w:after="40"/>
+            </w:pPr>
+            <w:r>
+              <w:rPr>
+                <w:sz w:val="19"/>
+                <w:szCs w:val="19"/>
+              </w:rPr>
+              <w:t>✓</w:t>
+            </w:r>
+          </w:p>
+        </w:tc>
+        <w:tc>
+          <w:tcPr>
+            <w:tcW w:w="753" w:type="dxa"/>
+            <w:tcMar>
+              <w:top w:w="70" w:type="dxa"/>
+              <w:left w:w="110" w:type="dxa"/>
+              <w:bottom w:w="70" w:type="dxa"/>
+              <w:right w:w="110" w:type="dxa"/>
+            </w:tcMar>
+          </w:tcPr>
+          <w:p>
+            <w:pPr>
+              <w:spacing w:after="40"/>
+            </w:pPr>
+          </w:p>
+        </w:tc>
+        <w:tc>
+          <w:tcPr>
+            <w:tcW w:w="753" w:type="dxa"/>
+            <w:tcMar>
+              <w:top w:w="70" w:type="dxa"/>
+              <w:left w:w="110" w:type="dxa"/>
+              <w:bottom w:w="70" w:type="dxa"/>
+              <w:right w:w="110" w:type="dxa"/>
+            </w:tcMar>
+          </w:tcPr>
+          <w:p>
+            <w:pPr>
+              <w:spacing w:after="40"/>
+            </w:pPr>
+          </w:p>
+        </w:tc>
+        <w:tc>
+          <w:tcPr>
+            <w:tcW w:w="753" w:type="dxa"/>
+            <w:tcMar>
+              <w:top w:w="70" w:type="dxa"/>
+              <w:left w:w="110" w:type="dxa"/>
+              <w:bottom w:w="70" w:type="dxa"/>
+              <w:right w:w="110" w:type="dxa"/>
+            </w:tcMar>
+          </w:tcPr>
+          <w:p>
+            <w:pPr>
+              <w:spacing w:after="40"/>
+            </w:pPr>
+          </w:p>
+        </w:tc>
+        <w:tc>
+          <w:tcPr>
+            <w:tcW w:w="753" w:type="dxa"/>
+            <w:tcMar>
+              <w:top w:w="70" w:type="dxa"/>
+              <w:left w:w="110" w:type="dxa"/>
+              <w:bottom w:w="70" w:type="dxa"/>
+              <w:right w:w="110" w:type="dxa"/>
+            </w:tcMar>
+          </w:tcPr>
+          <w:p>
+            <w:pPr>
+              <w:spacing w:after="40"/>
+            </w:pPr>
+          </w:p>
+        </w:tc>
+        <w:tc>
+          <w:tcPr>
+            <w:tcW w:w="753" w:type="dxa"/>
+            <w:tcMar>
+              <w:top w:w="70" w:type="dxa"/>
+              <w:left w:w="110" w:type="dxa"/>
+              <w:bottom w:w="70" w:type="dxa"/>
+              <w:right w:w="110" w:type="dxa"/>
+            </w:tcMar>
+          </w:tcPr>
+          <w:p>
+            <w:pPr>
+              <w:spacing w:after="40"/>
+            </w:pPr>
+          </w:p>
+        </w:tc>
+        <w:tc>
+          <w:tcPr>
+            <w:tcW w:w="753" w:type="dxa"/>
+            <w:tcMar>
+              <w:top w:w="70" w:type="dxa"/>
+              <w:left w:w="110" w:type="dxa"/>
+              <w:bottom w:w="70" w:type="dxa"/>
+              <w:right w:w="110" w:type="dxa"/>
+            </w:tcMar>
+          </w:tcPr>
+          <w:p>
+            <w:pPr>
+              <w:spacing w:after="40"/>
+            </w:pPr>
+          </w:p>
+        </w:tc>
+        <w:tc>
+          <w:tcPr>
+            <w:tcW w:w="753" w:type="dxa"/>
+            <w:tcMar>
+              <w:top w:w="70" w:type="dxa"/>
+              <w:left w:w="110" w:type="dxa"/>
+              <w:bottom w:w="70" w:type="dxa"/>
+              <w:right w:w="110" w:type="dxa"/>
+            </w:tcMar>
+          </w:tcPr>
+          <w:p>
+            <w:pPr>
+              <w:spacing w:after="40"/>
+            </w:pPr>
+          </w:p>
+        </w:tc>
+      </w:tr>
+      <w:tr>
+        <w:tblPrEx>
+          <w:tblCellMar>
+            <w:top w:w="0" w:type="dxa"/>
+            <w:bottom w:w="0" w:type="dxa"/>
+          </w:tblCellMar>
+        </w:tblPrEx>
+        <w:trPr>
+          <w:cantSplit/>
+        </w:trPr>
+        <w:tc>
+          <w:tcPr>
+            <w:tcW w:w="3388" w:type="dxa"/>
+            <w:shd w:val="clear" w:color="auto" w:fill="F8FAFB"/>
+            <w:tcMar>
+              <w:top w:w="70" w:type="dxa"/>
+              <w:left w:w="110" w:type="dxa"/>
+              <w:bottom w:w="70" w:type="dxa"/>
+              <w:right w:w="110" w:type="dxa"/>
+            </w:tcMar>
+          </w:tcPr>
+          <w:p>
+            <w:pPr>
+              <w:spacing w:after="40"/>
+            </w:pPr>
+            <w:r>
+              <w:rPr>
+                <w:sz w:val="19"/>
+                <w:szCs w:val="19"/>
+              </w:rPr>
               <w:t>Export</w:t>
             </w:r>
           </w:p>
@@ -9350,6 +9587,7 @@
         <w:tc>
           <w:tcPr>
             <w:tcW w:w="753" w:type="dxa"/>
+            <w:shd w:val="clear" w:color="auto" w:fill="F8FAFB"/>
             <w:tcMar>
               <w:top w:w="70" w:type="dxa"/>
               <w:left w:w="110" w:type="dxa"/>
@@ -9373,6 +9611,7 @@
         <w:tc>
           <w:tcPr>
             <w:tcW w:w="753" w:type="dxa"/>
+            <w:shd w:val="clear" w:color="auto" w:fill="F8FAFB"/>
             <w:tcMar>
               <w:top w:w="70" w:type="dxa"/>
               <w:left w:w="110" w:type="dxa"/>
@@ -9396,6 +9635,7 @@
         <w:tc>
           <w:tcPr>
             <w:tcW w:w="753" w:type="dxa"/>
+            <w:shd w:val="clear" w:color="auto" w:fill="F8FAFB"/>
             <w:tcMar>
               <w:top w:w="70" w:type="dxa"/>
               <w:left w:w="110" w:type="dxa"/>
@@ -9412,6 +9652,7 @@
         <w:tc>
           <w:tcPr>
             <w:tcW w:w="753" w:type="dxa"/>
+            <w:shd w:val="clear" w:color="auto" w:fill="F8FAFB"/>
             <w:tcMar>
               <w:top w:w="70" w:type="dxa"/>
               <w:left w:w="110" w:type="dxa"/>
@@ -9428,6 +9669,7 @@
         <w:tc>
           <w:tcPr>
             <w:tcW w:w="753" w:type="dxa"/>
+            <w:shd w:val="clear" w:color="auto" w:fill="F8FAFB"/>
             <w:tcMar>
               <w:top w:w="70" w:type="dxa"/>
               <w:left w:w="110" w:type="dxa"/>
@@ -9444,6 +9686,7 @@
         <w:tc>
           <w:tcPr>
             <w:tcW w:w="753" w:type="dxa"/>
+            <w:shd w:val="clear" w:color="auto" w:fill="F8FAFB"/>
             <w:tcMar>
               <w:top w:w="70" w:type="dxa"/>
               <w:left w:w="110" w:type="dxa"/>
@@ -9460,6 +9703,7 @@
         <w:tc>
           <w:tcPr>
             <w:tcW w:w="753" w:type="dxa"/>
+            <w:shd w:val="clear" w:color="auto" w:fill="F8FAFB"/>
             <w:tcMar>
               <w:top w:w="70" w:type="dxa"/>
               <w:left w:w="110" w:type="dxa"/>
@@ -9483,6 +9727,7 @@
         <w:tc>
           <w:tcPr>
             <w:tcW w:w="753" w:type="dxa"/>
+            <w:shd w:val="clear" w:color="auto" w:fill="F8FAFB"/>
             <w:tcMar>
               <w:top w:w="70" w:type="dxa"/>
               <w:left w:w="110" w:type="dxa"/>
@@ -9508,7 +9753,7 @@
         <w:pStyle w:val="Heading1"/>
         <w:pageBreakBefore/>
       </w:pPr>
-      <w:bookmarkStart w:id="3" w:name="_Toc241491888"/>
+      <w:bookmarkStart w:id="3" w:name="_Toc241726270"/>
       <w:r>
         <w:lastRenderedPageBreak/>
         <w:t>4. Signing in and your account</w:t>
@@ -9519,7 +9764,7 @@
       <w:pPr>
         <w:pStyle w:val="Heading2"/>
       </w:pPr>
-      <w:bookmarkStart w:id="4" w:name="_Toc241491889"/>
+      <w:bookmarkStart w:id="4" w:name="_Toc241726271"/>
       <w:r>
         <w:t>4.1 Sign in</w:t>
       </w:r>
@@ -10032,7 +10277,7 @@
       <w:pPr>
         <w:pStyle w:val="Heading2"/>
       </w:pPr>
-      <w:bookmarkStart w:id="5" w:name="_Toc241491890"/>
+      <w:bookmarkStart w:id="5" w:name="_Toc241726272"/>
       <w:r>
         <w:t>4.2 The header and menu bar (every screen)</w:t>
       </w:r>
@@ -10755,7 +11000,7 @@
       <w:pPr>
         <w:pStyle w:val="Heading2"/>
       </w:pPr>
-      <w:bookmarkStart w:id="6" w:name="_Toc241491891"/>
+      <w:bookmarkStart w:id="6" w:name="_Toc241726273"/>
       <w:r>
         <w:lastRenderedPageBreak/>
         <w:t>4.3 Change Password</w:t>
@@ -11377,7 +11622,7 @@
         <w:pStyle w:val="Heading1"/>
         <w:pageBreakBefore/>
       </w:pPr>
-      <w:bookmarkStart w:id="7" w:name="_Toc241491892"/>
+      <w:bookmarkStart w:id="7" w:name="_Toc241726274"/>
       <w:r>
         <w:lastRenderedPageBreak/>
         <w:t>5. Dashboards and Reports (read-only)</w:t>
@@ -11388,7 +11633,7 @@
       <w:pPr>
         <w:pStyle w:val="Heading2"/>
       </w:pPr>
-      <w:bookmarkStart w:id="8" w:name="_Toc241491893"/>
+      <w:bookmarkStart w:id="8" w:name="_Toc241726275"/>
       <w:r>
         <w:t>5.1 Executive Dashboard</w:t>
       </w:r>
@@ -11901,7 +12146,7 @@
       <w:pPr>
         <w:pStyle w:val="Heading2"/>
       </w:pPr>
-      <w:bookmarkStart w:id="9" w:name="_Toc241491894"/>
+      <w:bookmarkStart w:id="9" w:name="_Toc241726276"/>
       <w:r>
         <w:t>5.2 Sampling Dashboard</w:t>
       </w:r>
@@ -12414,7 +12659,7 @@
       <w:pPr>
         <w:pStyle w:val="Heading2"/>
       </w:pPr>
-      <w:bookmarkStart w:id="10" w:name="_Toc241491895"/>
+      <w:bookmarkStart w:id="10" w:name="_Toc241726277"/>
       <w:r>
         <w:t>5.3 Contact Dashboard</w:t>
       </w:r>
@@ -12718,7 +12963,7 @@
       <w:pPr>
         <w:pStyle w:val="Heading2"/>
       </w:pPr>
-      <w:bookmarkStart w:id="11" w:name="_Toc241491896"/>
+      <w:bookmarkStart w:id="11" w:name="_Toc241726278"/>
       <w:r>
         <w:t>5.4 QA Dashboard</w:t>
       </w:r>
@@ -13338,7 +13583,7 @@
       <w:pPr>
         <w:pStyle w:val="Heading2"/>
       </w:pPr>
-      <w:bookmarkStart w:id="12" w:name="_Toc241491897"/>
+      <w:bookmarkStart w:id="12" w:name="_Toc241726279"/>
       <w:r>
         <w:t>5.5 KII / Document Dashboard</w:t>
       </w:r>
@@ -13748,7 +13993,7 @@
       <w:pPr>
         <w:pStyle w:val="Heading2"/>
       </w:pPr>
-      <w:bookmarkStart w:id="13" w:name="_Toc241491898"/>
+      <w:bookmarkStart w:id="13" w:name="_Toc241726280"/>
       <w:r>
         <w:lastRenderedPageBreak/>
         <w:t>5.6 Reports</w:t>
@@ -14263,7 +14508,7 @@
         <w:pStyle w:val="Heading1"/>
         <w:pageBreakBefore/>
       </w:pPr>
-      <w:bookmarkStart w:id="14" w:name="_Toc241491899"/>
+      <w:bookmarkStart w:id="14" w:name="_Toc241726281"/>
       <w:r>
         <w:lastRenderedPageBreak/>
         <w:t>6. The sample and contact</w:t>
@@ -14274,7 +14519,7 @@
       <w:pPr>
         <w:pStyle w:val="Heading2"/>
       </w:pPr>
-      <w:bookmarkStart w:id="15" w:name="_Toc241491900"/>
+      <w:bookmarkStart w:id="15" w:name="_Toc241726282"/>
       <w:r>
         <w:t>6.1 Main-400 Register (and Reserve)</w:t>
       </w:r>
@@ -15207,7 +15452,7 @@
       <w:pPr>
         <w:pStyle w:val="Heading2"/>
       </w:pPr>
-      <w:bookmarkStart w:id="16" w:name="_Toc241491901"/>
+      <w:bookmarkStart w:id="16" w:name="_Toc241726283"/>
       <w:r>
         <w:t>6.2 Case page</w:t>
       </w:r>
@@ -16886,7 +17131,7 @@
       <w:pPr>
         <w:pStyle w:val="Heading2"/>
       </w:pPr>
-      <w:bookmarkStart w:id="17" w:name="_Toc241491902"/>
+      <w:bookmarkStart w:id="17" w:name="_Toc241726284"/>
       <w:r>
         <w:t>6.3 Pre-Interview Profile (PROIT) and its review screen</w:t>
       </w:r>
@@ -18451,7 +18696,7 @@
       <w:pPr>
         <w:pStyle w:val="Heading2"/>
       </w:pPr>
-      <w:bookmarkStart w:id="18" w:name="_Toc241491903"/>
+      <w:bookmarkStart w:id="18" w:name="_Toc241726285"/>
       <w:r>
         <w:t>6.4 Interview sheet (verifying a locked profile)</w:t>
       </w:r>
@@ -19709,7 +19954,7 @@
       <w:pPr>
         <w:pStyle w:val="Heading2"/>
       </w:pPr>
-      <w:bookmarkStart w:id="19" w:name="_Toc241491904"/>
+      <w:bookmarkStart w:id="19" w:name="_Toc241726286"/>
       <w:r>
         <w:t>6.5 Register Organisation</w:t>
       </w:r>
@@ -20432,7 +20677,7 @@
       <w:pPr>
         <w:pStyle w:val="Heading2"/>
       </w:pPr>
-      <w:bookmarkStart w:id="20" w:name="_Toc241491905"/>
+      <w:bookmarkStart w:id="20" w:name="_Toc241726287"/>
       <w:r>
         <w:t>6.6 Appointment Queue</w:t>
       </w:r>
@@ -21053,7 +21298,7 @@
       <w:pPr>
         <w:pStyle w:val="Heading2"/>
       </w:pPr>
-      <w:bookmarkStart w:id="21" w:name="_Toc241491906"/>
+      <w:bookmarkStart w:id="21" w:name="_Toc241726288"/>
       <w:r>
         <w:t>6.7 Follow-ups due</w:t>
       </w:r>
@@ -21566,7 +21811,7 @@
       <w:pPr>
         <w:pStyle w:val="Heading2"/>
       </w:pPr>
-      <w:bookmarkStart w:id="22" w:name="_Toc241491907"/>
+      <w:bookmarkStart w:id="22" w:name="_Toc241726289"/>
       <w:r>
         <w:t>6.8 Reserve Activation</w:t>
       </w:r>
@@ -22188,7 +22433,7 @@
         <w:pStyle w:val="Heading1"/>
         <w:pageBreakBefore/>
       </w:pPr>
-      <w:bookmarkStart w:id="23" w:name="_Toc241491908"/>
+      <w:bookmarkStart w:id="23" w:name="_Toc241726290"/>
       <w:r>
         <w:lastRenderedPageBreak/>
         <w:t>7. Quality checking</w:t>
@@ -22199,7 +22444,7 @@
       <w:pPr>
         <w:pStyle w:val="Heading2"/>
       </w:pPr>
-      <w:bookmarkStart w:id="24" w:name="_Toc241491909"/>
+      <w:bookmarkStart w:id="24" w:name="_Toc241726291"/>
       <w:r>
         <w:t>7.1 QA Queue (with the KoboToolbox sync panel)</w:t>
       </w:r>
@@ -22922,7 +23167,7 @@
       <w:pPr>
         <w:pStyle w:val="Heading2"/>
       </w:pPr>
-      <w:bookmarkStart w:id="25" w:name="_Toc241491910"/>
+      <w:bookmarkStart w:id="25" w:name="_Toc241726292"/>
       <w:r>
         <w:t>7.2 QA Exceptions</w:t>
       </w:r>
@@ -23754,7 +23999,7 @@
         <w:pStyle w:val="Heading1"/>
         <w:pageBreakBefore/>
       </w:pPr>
-      <w:bookmarkStart w:id="26" w:name="_Toc241491911"/>
+      <w:bookmarkStart w:id="26" w:name="_Toc241726293"/>
       <w:r>
         <w:lastRenderedPageBreak/>
         <w:t>8. Key Informant Interviews</w:t>
@@ -23765,7 +24010,7 @@
       <w:pPr>
         <w:pStyle w:val="Heading2"/>
       </w:pPr>
-      <w:bookmarkStart w:id="27" w:name="_Toc241491912"/>
+      <w:bookmarkStart w:id="27" w:name="_Toc241726294"/>
       <w:r>
         <w:t>8.1 KII Register</w:t>
       </w:r>
@@ -24385,7 +24630,7 @@
       <w:pPr>
         <w:pStyle w:val="Heading2"/>
       </w:pPr>
-      <w:bookmarkStart w:id="28" w:name="_Toc241491913"/>
+      <w:bookmarkStart w:id="28" w:name="_Toc241726295"/>
       <w:r>
         <w:t>8.2 New KII Record</w:t>
       </w:r>
@@ -24795,7 +25040,7 @@
       <w:pPr>
         <w:pStyle w:val="Heading2"/>
       </w:pPr>
-      <w:bookmarkStart w:id="29" w:name="_Toc241491914"/>
+      <w:bookmarkStart w:id="29" w:name="_Toc241726296"/>
       <w:r>
         <w:t>8.3 KII record</w:t>
       </w:r>
@@ -25837,7 +26082,7 @@
         <w:pStyle w:val="Heading1"/>
         <w:pageBreakBefore/>
       </w:pPr>
-      <w:bookmarkStart w:id="30" w:name="_Toc241491915"/>
+      <w:bookmarkStart w:id="30" w:name="_Toc241726297"/>
       <w:r>
         <w:lastRenderedPageBreak/>
         <w:t>9. Documentary evidence</w:t>
@@ -25848,7 +26093,7 @@
       <w:pPr>
         <w:pStyle w:val="Heading2"/>
       </w:pPr>
-      <w:bookmarkStart w:id="31" w:name="_Toc241491916"/>
+      <w:bookmarkStart w:id="31" w:name="_Toc241726298"/>
       <w:r>
         <w:t>9.1 Documents (the corpus)</w:t>
       </w:r>
@@ -26468,7 +26713,7 @@
       <w:pPr>
         <w:pStyle w:val="Heading2"/>
       </w:pPr>
-      <w:bookmarkStart w:id="32" w:name="_Toc241491917"/>
+      <w:bookmarkStart w:id="32" w:name="_Toc241726299"/>
       <w:r>
         <w:t>9.2 New Documentary Evidence Record</w:t>
       </w:r>
@@ -27299,7 +27544,7 @@
       <w:pPr>
         <w:pStyle w:val="Heading2"/>
       </w:pPr>
-      <w:bookmarkStart w:id="33" w:name="_Toc241491918"/>
+      <w:bookmarkStart w:id="33" w:name="_Toc241726300"/>
       <w:r>
         <w:t>9.3 Document record</w:t>
       </w:r>
@@ -28653,7 +28898,7 @@
       <w:pPr>
         <w:pStyle w:val="Heading2"/>
       </w:pPr>
-      <w:bookmarkStart w:id="34" w:name="_Toc241491919"/>
+      <w:bookmarkStart w:id="34" w:name="_Toc241726301"/>
       <w:r>
         <w:t>9.4 Auto-fill review screen</w:t>
       </w:r>
@@ -29695,7 +29940,7 @@
         <w:pStyle w:val="Heading1"/>
         <w:pageBreakBefore/>
       </w:pPr>
-      <w:bookmarkStart w:id="35" w:name="_Toc241491920"/>
+      <w:bookmarkStart w:id="35" w:name="_Toc241726302"/>
       <w:r>
         <w:lastRenderedPageBreak/>
         <w:t>10. Completed forms and exports</w:t>
@@ -29706,7 +29951,7 @@
       <w:pPr>
         <w:pStyle w:val="Heading2"/>
       </w:pPr>
-      <w:bookmarkStart w:id="36" w:name="_Toc241491921"/>
+      <w:bookmarkStart w:id="36" w:name="_Toc241726303"/>
       <w:r>
         <w:t>10.1 Completed forms (Form PDFs)</w:t>
       </w:r>
@@ -30972,7 +31217,7 @@
         <w:pStyle w:val="Heading1"/>
         <w:pageBreakBefore/>
       </w:pPr>
-      <w:bookmarkStart w:id="37" w:name="_Toc241491922"/>
+      <w:bookmarkStart w:id="37" w:name="_Toc241726304"/>
       <w:r>
         <w:lastRenderedPageBreak/>
         <w:t>11. Study administration</w:t>
@@ -30983,7 +31228,7 @@
       <w:pPr>
         <w:pStyle w:val="Heading2"/>
       </w:pPr>
-      <w:bookmarkStart w:id="38" w:name="_Toc241491923"/>
+      <w:bookmarkStart w:id="38" w:name="_Toc241726305"/>
       <w:r>
         <w:t>11.1 Cost Dashboard</w:t>
       </w:r>
@@ -31393,7 +31638,7 @@
       <w:pPr>
         <w:pStyle w:val="Heading2"/>
       </w:pPr>
-      <w:bookmarkStart w:id="39" w:name="_Toc241491924"/>
+      <w:bookmarkStart w:id="39" w:name="_Toc241726306"/>
       <w:r>
         <w:t>11.2 Audit Log</w:t>
       </w:r>
@@ -31803,11 +32048,842 @@
       <w:pPr>
         <w:pStyle w:val="Heading2"/>
       </w:pPr>
-      <w:bookmarkStart w:id="40" w:name="_Toc241491925"/>
+      <w:bookmarkStart w:id="40" w:name="_Toc241726307"/>
       <w:r>
-        <w:t>11.3 Export</w:t>
+        <w:t>11.3 Research Clearance</w:t>
       </w:r>
       <w:bookmarkEnd w:id="40"/>
+    </w:p>
+    <w:p>
+      <w:pPr>
+        <w:spacing w:after="120" w:line="288" w:lineRule="auto"/>
+      </w:pPr>
+      <w:r>
+        <w:rPr>
+          <w:b/>
+          <w:bCs/>
+        </w:rPr>
+        <w:t>Who can open it:</w:t>
+      </w:r>
+      <w:r>
+        <w:t xml:space="preserve"> PI / System Admin.  </w:t>
+      </w:r>
+      <w:r>
+        <w:rPr>
+          <w:b/>
+          <w:bCs/>
+        </w:rPr>
+        <w:t>Where:</w:t>
+      </w:r>
+      <w:r>
+        <w:t xml:space="preserve"> </w:t>
+      </w:r>
+      <w:r>
+        <w:rPr>
+          <w:rFonts w:ascii="Consolas" w:eastAsia="Consolas" w:hAnsi="Consolas" w:cs="Consolas"/>
+          <w:color w:val="122238"/>
+          <w:sz w:val="19"/>
+          <w:szCs w:val="19"/>
+        </w:rPr>
+        <w:t>/admin/clearance</w:t>
+      </w:r>
+    </w:p>
+    <w:p>
+      <w:pPr>
+        <w:spacing w:after="120" w:line="288" w:lineRule="auto"/>
+      </w:pPr>
+      <w:r>
+        <w:t>The study's official approval letters (ethics clearance, institutional approval, supervision confirmation), published for a respondent to check the study is genuine before taking part.</w:t>
+      </w:r>
+    </w:p>
+    <w:tbl>
+      <w:tblPr>
+        <w:tblW w:w="9412" w:type="dxa"/>
+        <w:tblBorders>
+          <w:top w:val="single" w:sz="4" w:space="0" w:color="D5DAE0"/>
+          <w:left w:val="single" w:sz="4" w:space="0" w:color="D5DAE0"/>
+          <w:bottom w:val="single" w:sz="4" w:space="0" w:color="D5DAE0"/>
+          <w:right w:val="single" w:sz="4" w:space="0" w:color="D5DAE0"/>
+          <w:insideH w:val="single" w:sz="4" w:space="0" w:color="D5DAE0"/>
+          <w:insideV w:val="single" w:sz="4" w:space="0" w:color="D5DAE0"/>
+        </w:tblBorders>
+        <w:tblCellMar>
+          <w:left w:w="10" w:type="dxa"/>
+          <w:right w:w="10" w:type="dxa"/>
+        </w:tblCellMar>
+        <w:tblLook w:val="04A0" w:firstRow="1" w:lastRow="0" w:firstColumn="1" w:lastColumn="0" w:noHBand="0" w:noVBand="1"/>
+      </w:tblPr>
+      <w:tblGrid>
+        <w:gridCol w:w="1882"/>
+        <w:gridCol w:w="3012"/>
+        <w:gridCol w:w="2447"/>
+        <w:gridCol w:w="2071"/>
+      </w:tblGrid>
+      <w:tr>
+        <w:tblPrEx>
+          <w:tblCellMar>
+            <w:top w:w="0" w:type="dxa"/>
+            <w:bottom w:w="0" w:type="dxa"/>
+          </w:tblCellMar>
+        </w:tblPrEx>
+        <w:trPr>
+          <w:tblHeader/>
+        </w:trPr>
+        <w:tc>
+          <w:tcPr>
+            <w:tcW w:w="1882" w:type="dxa"/>
+            <w:shd w:val="clear" w:color="auto" w:fill="1B3350"/>
+            <w:tcMar>
+              <w:top w:w="70" w:type="dxa"/>
+              <w:left w:w="110" w:type="dxa"/>
+              <w:bottom w:w="70" w:type="dxa"/>
+              <w:right w:w="110" w:type="dxa"/>
+            </w:tcMar>
+          </w:tcPr>
+          <w:p>
+            <w:pPr>
+              <w:spacing w:after="40"/>
+            </w:pPr>
+            <w:r>
+              <w:rPr>
+                <w:b/>
+                <w:bCs/>
+                <w:color w:val="FFFFFF"/>
+                <w:sz w:val="19"/>
+                <w:szCs w:val="19"/>
+              </w:rPr>
+              <w:lastRenderedPageBreak/>
+              <w:t>Control</w:t>
+            </w:r>
+          </w:p>
+        </w:tc>
+        <w:tc>
+          <w:tcPr>
+            <w:tcW w:w="3012" w:type="dxa"/>
+            <w:shd w:val="clear" w:color="auto" w:fill="1B3350"/>
+            <w:tcMar>
+              <w:top w:w="70" w:type="dxa"/>
+              <w:left w:w="110" w:type="dxa"/>
+              <w:bottom w:w="70" w:type="dxa"/>
+              <w:right w:w="110" w:type="dxa"/>
+            </w:tcMar>
+          </w:tcPr>
+          <w:p>
+            <w:pPr>
+              <w:spacing w:after="40"/>
+            </w:pPr>
+            <w:r>
+              <w:rPr>
+                <w:b/>
+                <w:bCs/>
+                <w:color w:val="FFFFFF"/>
+                <w:sz w:val="19"/>
+                <w:szCs w:val="19"/>
+              </w:rPr>
+              <w:t>What it does and when to use it</w:t>
+            </w:r>
+          </w:p>
+        </w:tc>
+        <w:tc>
+          <w:tcPr>
+            <w:tcW w:w="2447" w:type="dxa"/>
+            <w:shd w:val="clear" w:color="auto" w:fill="1B3350"/>
+            <w:tcMar>
+              <w:top w:w="70" w:type="dxa"/>
+              <w:left w:w="110" w:type="dxa"/>
+              <w:bottom w:w="70" w:type="dxa"/>
+              <w:right w:w="110" w:type="dxa"/>
+            </w:tcMar>
+          </w:tcPr>
+          <w:p>
+            <w:pPr>
+              <w:spacing w:after="40"/>
+            </w:pPr>
+            <w:r>
+              <w:rPr>
+                <w:b/>
+                <w:bCs/>
+                <w:color w:val="FFFFFF"/>
+                <w:sz w:val="19"/>
+                <w:szCs w:val="19"/>
+              </w:rPr>
+              <w:t>Why it exists</w:t>
+            </w:r>
+          </w:p>
+        </w:tc>
+        <w:tc>
+          <w:tcPr>
+            <w:tcW w:w="2071" w:type="dxa"/>
+            <w:shd w:val="clear" w:color="auto" w:fill="1B3350"/>
+            <w:tcMar>
+              <w:top w:w="70" w:type="dxa"/>
+              <w:left w:w="110" w:type="dxa"/>
+              <w:bottom w:w="70" w:type="dxa"/>
+              <w:right w:w="110" w:type="dxa"/>
+            </w:tcMar>
+          </w:tcPr>
+          <w:p>
+            <w:pPr>
+              <w:spacing w:after="40"/>
+            </w:pPr>
+            <w:r>
+              <w:rPr>
+                <w:b/>
+                <w:bCs/>
+                <w:color w:val="FFFFFF"/>
+                <w:sz w:val="19"/>
+                <w:szCs w:val="19"/>
+              </w:rPr>
+              <w:t>What happens next</w:t>
+            </w:r>
+          </w:p>
+        </w:tc>
+      </w:tr>
+      <w:tr>
+        <w:tblPrEx>
+          <w:tblCellMar>
+            <w:top w:w="0" w:type="dxa"/>
+            <w:bottom w:w="0" w:type="dxa"/>
+          </w:tblCellMar>
+        </w:tblPrEx>
+        <w:trPr>
+          <w:cantSplit/>
+        </w:trPr>
+        <w:tc>
+          <w:tcPr>
+            <w:tcW w:w="1882" w:type="dxa"/>
+            <w:tcMar>
+              <w:top w:w="70" w:type="dxa"/>
+              <w:left w:w="110" w:type="dxa"/>
+              <w:bottom w:w="70" w:type="dxa"/>
+              <w:right w:w="110" w:type="dxa"/>
+            </w:tcMar>
+          </w:tcPr>
+          <w:p>
+            <w:pPr>
+              <w:spacing w:after="40"/>
+            </w:pPr>
+            <w:r>
+              <w:rPr>
+                <w:sz w:val="19"/>
+                <w:szCs w:val="19"/>
+              </w:rPr>
+              <w:t>Add a document: Title, Issuing body, Type, Reference number, Date, Description → Add document</w:t>
+            </w:r>
+          </w:p>
+        </w:tc>
+        <w:tc>
+          <w:tcPr>
+            <w:tcW w:w="3012" w:type="dxa"/>
+            <w:tcMar>
+              <w:top w:w="70" w:type="dxa"/>
+              <w:left w:w="110" w:type="dxa"/>
+              <w:bottom w:w="70" w:type="dxa"/>
+              <w:right w:w="110" w:type="dxa"/>
+            </w:tcMar>
+          </w:tcPr>
+          <w:p>
+            <w:pPr>
+              <w:spacing w:after="40"/>
+            </w:pPr>
+            <w:r>
+              <w:rPr>
+                <w:sz w:val="19"/>
+                <w:szCs w:val="19"/>
+              </w:rPr>
+              <w:t>Creates a document record. It has no file yet and is not shown to anyone.</w:t>
+            </w:r>
+          </w:p>
+        </w:tc>
+        <w:tc>
+          <w:tcPr>
+            <w:tcW w:w="2447" w:type="dxa"/>
+            <w:tcMar>
+              <w:top w:w="70" w:type="dxa"/>
+              <w:left w:w="110" w:type="dxa"/>
+              <w:bottom w:w="70" w:type="dxa"/>
+              <w:right w:w="110" w:type="dxa"/>
+            </w:tcMar>
+          </w:tcPr>
+          <w:p>
+            <w:pPr>
+              <w:spacing w:after="40"/>
+            </w:pPr>
+            <w:r>
+              <w:rPr>
+                <w:sz w:val="19"/>
+                <w:szCs w:val="19"/>
+              </w:rPr>
+              <w:t>The record (who issued it, when, what kind) is entered before the file, so the title is right before anything is uploaded.</w:t>
+            </w:r>
+          </w:p>
+        </w:tc>
+        <w:tc>
+          <w:tcPr>
+            <w:tcW w:w="2071" w:type="dxa"/>
+            <w:tcMar>
+              <w:top w:w="70" w:type="dxa"/>
+              <w:left w:w="110" w:type="dxa"/>
+              <w:bottom w:w="70" w:type="dxa"/>
+              <w:right w:w="110" w:type="dxa"/>
+            </w:tcMar>
+          </w:tcPr>
+          <w:p>
+            <w:pPr>
+              <w:spacing w:after="40"/>
+            </w:pPr>
+            <w:r>
+              <w:rPr>
+                <w:sz w:val="19"/>
+                <w:szCs w:val="19"/>
+              </w:rPr>
+              <w:t>The document appears in the list with “No file uploaded yet”.</w:t>
+            </w:r>
+          </w:p>
+        </w:tc>
+      </w:tr>
+      <w:tr>
+        <w:tblPrEx>
+          <w:tblCellMar>
+            <w:top w:w="0" w:type="dxa"/>
+            <w:bottom w:w="0" w:type="dxa"/>
+          </w:tblCellMar>
+        </w:tblPrEx>
+        <w:trPr>
+          <w:cantSplit/>
+        </w:trPr>
+        <w:tc>
+          <w:tcPr>
+            <w:tcW w:w="1882" w:type="dxa"/>
+            <w:shd w:val="clear" w:color="auto" w:fill="F8FAFB"/>
+            <w:tcMar>
+              <w:top w:w="70" w:type="dxa"/>
+              <w:left w:w="110" w:type="dxa"/>
+              <w:bottom w:w="70" w:type="dxa"/>
+              <w:right w:w="110" w:type="dxa"/>
+            </w:tcMar>
+          </w:tcPr>
+          <w:p>
+            <w:pPr>
+              <w:spacing w:after="40"/>
+            </w:pPr>
+            <w:r>
+              <w:rPr>
+                <w:sz w:val="19"/>
+                <w:szCs w:val="19"/>
+              </w:rPr>
+              <w:t>Upload file / Replace file</w:t>
+            </w:r>
+          </w:p>
+        </w:tc>
+        <w:tc>
+          <w:tcPr>
+            <w:tcW w:w="3012" w:type="dxa"/>
+            <w:shd w:val="clear" w:color="auto" w:fill="F8FAFB"/>
+            <w:tcMar>
+              <w:top w:w="70" w:type="dxa"/>
+              <w:left w:w="110" w:type="dxa"/>
+              <w:bottom w:w="70" w:type="dxa"/>
+              <w:right w:w="110" w:type="dxa"/>
+            </w:tcMar>
+          </w:tcPr>
+          <w:p>
+            <w:pPr>
+              <w:spacing w:after="40"/>
+            </w:pPr>
+            <w:r>
+              <w:rPr>
+                <w:sz w:val="19"/>
+                <w:szCs w:val="19"/>
+              </w:rPr>
+              <w:t>Attaches or replaces the letter itself (PDF, JPG or PNG, up to 20MB).</w:t>
+            </w:r>
+          </w:p>
+        </w:tc>
+        <w:tc>
+          <w:tcPr>
+            <w:tcW w:w="2447" w:type="dxa"/>
+            <w:shd w:val="clear" w:color="auto" w:fill="F8FAFB"/>
+            <w:tcMar>
+              <w:top w:w="70" w:type="dxa"/>
+              <w:left w:w="110" w:type="dxa"/>
+              <w:bottom w:w="70" w:type="dxa"/>
+              <w:right w:w="110" w:type="dxa"/>
+            </w:tcMar>
+          </w:tcPr>
+          <w:p>
+            <w:pPr>
+              <w:spacing w:after="40"/>
+            </w:pPr>
+            <w:r>
+              <w:rPr>
+                <w:sz w:val="19"/>
+                <w:szCs w:val="19"/>
+              </w:rPr>
+              <w:t>A respondent needs the actual letter to open, not just its description.</w:t>
+            </w:r>
+          </w:p>
+        </w:tc>
+        <w:tc>
+          <w:tcPr>
+            <w:tcW w:w="2071" w:type="dxa"/>
+            <w:shd w:val="clear" w:color="auto" w:fill="F8FAFB"/>
+            <w:tcMar>
+              <w:top w:w="70" w:type="dxa"/>
+              <w:left w:w="110" w:type="dxa"/>
+              <w:bottom w:w="70" w:type="dxa"/>
+              <w:right w:w="110" w:type="dxa"/>
+            </w:tcMar>
+          </w:tcPr>
+          <w:p>
+            <w:pPr>
+              <w:spacing w:after="40"/>
+            </w:pPr>
+            <w:r>
+              <w:rPr>
+                <w:sz w:val="19"/>
+                <w:szCs w:val="19"/>
+              </w:rPr>
+              <w:t>The file name appears; an already-public document's new file is live immediately.</w:t>
+            </w:r>
+          </w:p>
+        </w:tc>
+      </w:tr>
+      <w:tr>
+        <w:tblPrEx>
+          <w:tblCellMar>
+            <w:top w:w="0" w:type="dxa"/>
+            <w:bottom w:w="0" w:type="dxa"/>
+          </w:tblCellMar>
+        </w:tblPrEx>
+        <w:trPr>
+          <w:cantSplit/>
+        </w:trPr>
+        <w:tc>
+          <w:tcPr>
+            <w:tcW w:w="1882" w:type="dxa"/>
+            <w:tcMar>
+              <w:top w:w="70" w:type="dxa"/>
+              <w:left w:w="110" w:type="dxa"/>
+              <w:bottom w:w="70" w:type="dxa"/>
+              <w:right w:w="110" w:type="dxa"/>
+            </w:tcMar>
+          </w:tcPr>
+          <w:p>
+            <w:pPr>
+              <w:spacing w:after="40"/>
+            </w:pPr>
+            <w:r>
+              <w:rPr>
+                <w:sz w:val="19"/>
+                <w:szCs w:val="19"/>
+              </w:rPr>
+              <w:t>Shown to respondents</w:t>
+            </w:r>
+          </w:p>
+        </w:tc>
+        <w:tc>
+          <w:tcPr>
+            <w:tcW w:w="3012" w:type="dxa"/>
+            <w:tcMar>
+              <w:top w:w="70" w:type="dxa"/>
+              <w:left w:w="110" w:type="dxa"/>
+              <w:bottom w:w="70" w:type="dxa"/>
+              <w:right w:w="110" w:type="dxa"/>
+            </w:tcMar>
+          </w:tcPr>
+          <w:p>
+            <w:pPr>
+              <w:spacing w:after="40"/>
+            </w:pPr>
+            <w:r>
+              <w:rPr>
+                <w:sz w:val="19"/>
+                <w:szCs w:val="19"/>
+              </w:rPr>
+              <w:t>Switches whether this document appears on the Participant Information step of every invitation link.</w:t>
+            </w:r>
+          </w:p>
+        </w:tc>
+        <w:tc>
+          <w:tcPr>
+            <w:tcW w:w="2447" w:type="dxa"/>
+            <w:tcMar>
+              <w:top w:w="70" w:type="dxa"/>
+              <w:left w:w="110" w:type="dxa"/>
+              <w:bottom w:w="70" w:type="dxa"/>
+              <w:right w:w="110" w:type="dxa"/>
+            </w:tcMar>
+          </w:tcPr>
+          <w:p>
+            <w:pPr>
+              <w:spacing w:after="40"/>
+            </w:pPr>
+            <w:r>
+              <w:rPr>
+                <w:sz w:val="19"/>
+                <w:szCs w:val="19"/>
+              </w:rPr>
+              <w:t>A document is private by default; nothing reaches a respondent until this is explicitly turned on, and it needs a file first.</w:t>
+            </w:r>
+          </w:p>
+        </w:tc>
+        <w:tc>
+          <w:tcPr>
+            <w:tcW w:w="2071" w:type="dxa"/>
+            <w:tcMar>
+              <w:top w:w="70" w:type="dxa"/>
+              <w:left w:w="110" w:type="dxa"/>
+              <w:bottom w:w="70" w:type="dxa"/>
+              <w:right w:w="110" w:type="dxa"/>
+            </w:tcMar>
+          </w:tcPr>
+          <w:p>
+            <w:pPr>
+              <w:spacing w:after="40"/>
+            </w:pPr>
+            <w:r>
+              <w:rPr>
+                <w:sz w:val="19"/>
+                <w:szCs w:val="19"/>
+              </w:rPr>
+              <w:t>On: the document appears to every respondent from then on. Off: it stops appearing immediately.</w:t>
+            </w:r>
+          </w:p>
+        </w:tc>
+      </w:tr>
+      <w:tr>
+        <w:tblPrEx>
+          <w:tblCellMar>
+            <w:top w:w="0" w:type="dxa"/>
+            <w:bottom w:w="0" w:type="dxa"/>
+          </w:tblCellMar>
+        </w:tblPrEx>
+        <w:trPr>
+          <w:cantSplit/>
+        </w:trPr>
+        <w:tc>
+          <w:tcPr>
+            <w:tcW w:w="1882" w:type="dxa"/>
+            <w:shd w:val="clear" w:color="auto" w:fill="F8FAFB"/>
+            <w:tcMar>
+              <w:top w:w="70" w:type="dxa"/>
+              <w:left w:w="110" w:type="dxa"/>
+              <w:bottom w:w="70" w:type="dxa"/>
+              <w:right w:w="110" w:type="dxa"/>
+            </w:tcMar>
+          </w:tcPr>
+          <w:p>
+            <w:pPr>
+              <w:spacing w:after="40"/>
+            </w:pPr>
+            <w:r>
+              <w:rPr>
+                <w:sz w:val="19"/>
+                <w:szCs w:val="19"/>
+              </w:rPr>
+              <w:t>Active</w:t>
+            </w:r>
+          </w:p>
+        </w:tc>
+        <w:tc>
+          <w:tcPr>
+            <w:tcW w:w="3012" w:type="dxa"/>
+            <w:shd w:val="clear" w:color="auto" w:fill="F8FAFB"/>
+            <w:tcMar>
+              <w:top w:w="70" w:type="dxa"/>
+              <w:left w:w="110" w:type="dxa"/>
+              <w:bottom w:w="70" w:type="dxa"/>
+              <w:right w:w="110" w:type="dxa"/>
+            </w:tcMar>
+          </w:tcPr>
+          <w:p>
+            <w:pPr>
+              <w:spacing w:after="40"/>
+            </w:pPr>
+            <w:r>
+              <w:rPr>
+                <w:sz w:val="19"/>
+                <w:szCs w:val="19"/>
+              </w:rPr>
+              <w:t>Switches whether the document is current, independently of whether it is shown.</w:t>
+            </w:r>
+          </w:p>
+        </w:tc>
+        <w:tc>
+          <w:tcPr>
+            <w:tcW w:w="2447" w:type="dxa"/>
+            <w:shd w:val="clear" w:color="auto" w:fill="F8FAFB"/>
+            <w:tcMar>
+              <w:top w:w="70" w:type="dxa"/>
+              <w:left w:w="110" w:type="dxa"/>
+              <w:bottom w:w="70" w:type="dxa"/>
+              <w:right w:w="110" w:type="dxa"/>
+            </w:tcMar>
+          </w:tcPr>
+          <w:p>
+            <w:pPr>
+              <w:spacing w:after="40"/>
+            </w:pPr>
+            <w:r>
+              <w:rPr>
+                <w:sz w:val="19"/>
+                <w:szCs w:val="19"/>
+              </w:rPr>
+              <w:t>Lets a superseded letter stay on record without being deleted.</w:t>
+            </w:r>
+          </w:p>
+        </w:tc>
+        <w:tc>
+          <w:tcPr>
+            <w:tcW w:w="2071" w:type="dxa"/>
+            <w:shd w:val="clear" w:color="auto" w:fill="F8FAFB"/>
+            <w:tcMar>
+              <w:top w:w="70" w:type="dxa"/>
+              <w:left w:w="110" w:type="dxa"/>
+              <w:bottom w:w="70" w:type="dxa"/>
+              <w:right w:w="110" w:type="dxa"/>
+            </w:tcMar>
+          </w:tcPr>
+          <w:p>
+            <w:pPr>
+              <w:spacing w:after="40"/>
+            </w:pPr>
+            <w:r>
+              <w:rPr>
+                <w:sz w:val="19"/>
+                <w:szCs w:val="19"/>
+              </w:rPr>
+              <w:t>No visible change to respondents beyond Shown to respondents.</w:t>
+            </w:r>
+          </w:p>
+        </w:tc>
+      </w:tr>
+      <w:tr>
+        <w:tblPrEx>
+          <w:tblCellMar>
+            <w:top w:w="0" w:type="dxa"/>
+            <w:bottom w:w="0" w:type="dxa"/>
+          </w:tblCellMar>
+        </w:tblPrEx>
+        <w:trPr>
+          <w:cantSplit/>
+        </w:trPr>
+        <w:tc>
+          <w:tcPr>
+            <w:tcW w:w="1882" w:type="dxa"/>
+            <w:tcMar>
+              <w:top w:w="70" w:type="dxa"/>
+              <w:left w:w="110" w:type="dxa"/>
+              <w:bottom w:w="70" w:type="dxa"/>
+              <w:right w:w="110" w:type="dxa"/>
+            </w:tcMar>
+          </w:tcPr>
+          <w:p>
+            <w:pPr>
+              <w:spacing w:after="40"/>
+            </w:pPr>
+            <w:r>
+              <w:rPr>
+                <w:sz w:val="19"/>
+                <w:szCs w:val="19"/>
+              </w:rPr>
+              <w:t>View</w:t>
+            </w:r>
+          </w:p>
+        </w:tc>
+        <w:tc>
+          <w:tcPr>
+            <w:tcW w:w="3012" w:type="dxa"/>
+            <w:tcMar>
+              <w:top w:w="70" w:type="dxa"/>
+              <w:left w:w="110" w:type="dxa"/>
+              <w:bottom w:w="70" w:type="dxa"/>
+              <w:right w:w="110" w:type="dxa"/>
+            </w:tcMar>
+          </w:tcPr>
+          <w:p>
+            <w:pPr>
+              <w:spacing w:after="40"/>
+            </w:pPr>
+            <w:r>
+              <w:rPr>
+                <w:sz w:val="19"/>
+                <w:szCs w:val="19"/>
+              </w:rPr>
+              <w:t>Opens the uploaded file.</w:t>
+            </w:r>
+          </w:p>
+        </w:tc>
+        <w:tc>
+          <w:tcPr>
+            <w:tcW w:w="2447" w:type="dxa"/>
+            <w:tcMar>
+              <w:top w:w="70" w:type="dxa"/>
+              <w:left w:w="110" w:type="dxa"/>
+              <w:bottom w:w="70" w:type="dxa"/>
+              <w:right w:w="110" w:type="dxa"/>
+            </w:tcMar>
+          </w:tcPr>
+          <w:p>
+            <w:pPr>
+              <w:spacing w:after="40"/>
+            </w:pPr>
+            <w:r>
+              <w:rPr>
+                <w:sz w:val="19"/>
+                <w:szCs w:val="19"/>
+              </w:rPr>
+              <w:t>Checking what was actually uploaded.</w:t>
+            </w:r>
+          </w:p>
+        </w:tc>
+        <w:tc>
+          <w:tcPr>
+            <w:tcW w:w="2071" w:type="dxa"/>
+            <w:tcMar>
+              <w:top w:w="70" w:type="dxa"/>
+              <w:left w:w="110" w:type="dxa"/>
+              <w:bottom w:w="70" w:type="dxa"/>
+              <w:right w:w="110" w:type="dxa"/>
+            </w:tcMar>
+          </w:tcPr>
+          <w:p>
+            <w:pPr>
+              <w:spacing w:after="40"/>
+            </w:pPr>
+            <w:r>
+              <w:rPr>
+                <w:sz w:val="19"/>
+                <w:szCs w:val="19"/>
+              </w:rPr>
+              <w:t>The file opens in a new tab.</w:t>
+            </w:r>
+          </w:p>
+        </w:tc>
+      </w:tr>
+      <w:tr>
+        <w:tblPrEx>
+          <w:tblCellMar>
+            <w:top w:w="0" w:type="dxa"/>
+            <w:bottom w:w="0" w:type="dxa"/>
+          </w:tblCellMar>
+        </w:tblPrEx>
+        <w:trPr>
+          <w:cantSplit/>
+        </w:trPr>
+        <w:tc>
+          <w:tcPr>
+            <w:tcW w:w="1882" w:type="dxa"/>
+            <w:shd w:val="clear" w:color="auto" w:fill="F8FAFB"/>
+            <w:tcMar>
+              <w:top w:w="70" w:type="dxa"/>
+              <w:left w:w="110" w:type="dxa"/>
+              <w:bottom w:w="70" w:type="dxa"/>
+              <w:right w:w="110" w:type="dxa"/>
+            </w:tcMar>
+          </w:tcPr>
+          <w:p>
+            <w:pPr>
+              <w:spacing w:after="40"/>
+            </w:pPr>
+            <w:r>
+              <w:rPr>
+                <w:sz w:val="19"/>
+                <w:szCs w:val="19"/>
+              </w:rPr>
+              <w:t>Delete</w:t>
+            </w:r>
+          </w:p>
+        </w:tc>
+        <w:tc>
+          <w:tcPr>
+            <w:tcW w:w="3012" w:type="dxa"/>
+            <w:shd w:val="clear" w:color="auto" w:fill="F8FAFB"/>
+            <w:tcMar>
+              <w:top w:w="70" w:type="dxa"/>
+              <w:left w:w="110" w:type="dxa"/>
+              <w:bottom w:w="70" w:type="dxa"/>
+              <w:right w:w="110" w:type="dxa"/>
+            </w:tcMar>
+          </w:tcPr>
+          <w:p>
+            <w:pPr>
+              <w:spacing w:after="40"/>
+            </w:pPr>
+            <w:r>
+              <w:rPr>
+                <w:sz w:val="19"/>
+                <w:szCs w:val="19"/>
+              </w:rPr>
+              <w:t>Removes a document that has never been shown to a respondent.</w:t>
+            </w:r>
+          </w:p>
+        </w:tc>
+        <w:tc>
+          <w:tcPr>
+            <w:tcW w:w="2447" w:type="dxa"/>
+            <w:shd w:val="clear" w:color="auto" w:fill="F8FAFB"/>
+            <w:tcMar>
+              <w:top w:w="70" w:type="dxa"/>
+              <w:left w:w="110" w:type="dxa"/>
+              <w:bottom w:w="70" w:type="dxa"/>
+              <w:right w:w="110" w:type="dxa"/>
+            </w:tcMar>
+          </w:tcPr>
+          <w:p>
+            <w:pPr>
+              <w:spacing w:after="40"/>
+            </w:pPr>
+            <w:r>
+              <w:rPr>
+                <w:sz w:val="19"/>
+                <w:szCs w:val="19"/>
+              </w:rPr>
+              <w:t>Once a document could have been seen by a respondent, there must always be a record of what was shown; disabled, and refused by the server, once it has been public even briefly.</w:t>
+            </w:r>
+          </w:p>
+        </w:tc>
+        <w:tc>
+          <w:tcPr>
+            <w:tcW w:w="2071" w:type="dxa"/>
+            <w:shd w:val="clear" w:color="auto" w:fill="F8FAFB"/>
+            <w:tcMar>
+              <w:top w:w="70" w:type="dxa"/>
+              <w:left w:w="110" w:type="dxa"/>
+              <w:bottom w:w="70" w:type="dxa"/>
+              <w:right w:w="110" w:type="dxa"/>
+            </w:tcMar>
+          </w:tcPr>
+          <w:p>
+            <w:pPr>
+              <w:spacing w:after="40"/>
+            </w:pPr>
+            <w:r>
+              <w:rPr>
+                <w:sz w:val="19"/>
+                <w:szCs w:val="19"/>
+              </w:rPr>
+              <w:t>The record is removed. If it was ever public, the server refuses with a message instead.</w:t>
+            </w:r>
+          </w:p>
+        </w:tc>
+      </w:tr>
+    </w:tbl>
+    <w:p>
+      <w:pPr>
+        <w:spacing w:after="120"/>
+      </w:pPr>
+    </w:p>
+    <w:p>
+      <w:pPr>
+        <w:pStyle w:val="Heading2"/>
+      </w:pPr>
+      <w:bookmarkStart w:id="41" w:name="_Toc241726308"/>
+      <w:r>
+        <w:t>11.4 Export</w:t>
+      </w:r>
+      <w:bookmarkEnd w:id="41"/>
     </w:p>
     <w:p>
       <w:pPr>
@@ -31907,7 +32983,6 @@
                 <w:sz w:val="19"/>
                 <w:szCs w:val="19"/>
               </w:rPr>
-              <w:lastRenderedPageBreak/>
               <w:t>Control</w:t>
             </w:r>
           </w:p>
@@ -32233,6 +33308,7 @@
                 <w:sz w:val="19"/>
                 <w:szCs w:val="19"/>
               </w:rPr>
+              <w:lastRenderedPageBreak/>
               <w:t>Analysis packs → Download SmartPLS pack / interviews pack / documents pack (the PI only)</w:t>
             </w:r>
           </w:p>
@@ -32468,7 +33544,7 @@
         <w:sz w:val="16"/>
         <w:szCs w:val="16"/>
       </w:rPr>
-      <w:t>Version 1.12 · 28 September 2026</w:t>
+      <w:t>Version 1.13 · 1 October 2026</w:t>
     </w:r>
     <w:r>
       <w:rPr>
@@ -32641,10 +33717,10 @@
 <file path=word/numbering.xml><?xml version="1.0" encoding="utf-8"?>
 <w:numbering xmlns:wpc="http://schemas.microsoft.com/office/word/2010/wordprocessingCanvas" xmlns:cx="http://schemas.microsoft.com/office/drawing/2014/chartex" xmlns:cx1="http://schemas.microsoft.com/office/drawing/2015/9/8/chartex" xmlns:cx2="http://schemas.microsoft.com/office/drawing/2015/10/21/chartex" xmlns:cx3="http://schemas.microsoft.com/office/drawing/2016/5/9/chartex" xmlns:cx4="http://schemas.microsoft.com/office/drawing/2016/5/10/chartex" xmlns:cx5="http://schemas.microsoft.com/office/drawing/2016/5/11/chartex" xmlns:cx6="http://schemas.microsoft.com/office/drawing/2016/5/12/chartex" xmlns:cx7="http://schemas.microsoft.com/office/drawing/2016/5/13/chartex" xmlns:cx8="http://schemas.microsoft.com/office/drawing/2016/5/14/chartex" xmlns:mc="http://schemas.openxmlformats.org/markup-compatibility/2006" xmlns:aink="http://schemas.microsoft.com/office/drawing/2016/ink" xmlns:am3d="http://schemas.microsoft.com/office/drawing/2017/model3d" xmlns:o="urn:schemas-microsoft-com:office:office" xmlns:oel="http://schemas.microsoft.com/office/2019/extlst" xmlns:r="http://schemas.openxmlformats.org/officeDocument/2006/relationships" xmlns:m="http://schemas.openxmlformats.org/officeDocument/2006/math" xmlns:v="urn:schemas-microsoft-com:vml" xmlns:wp14="http://schemas.microsoft.com/office/word/2010/wordprocessingDrawing" xmlns:wp="http://schemas.openxmlformats.org/drawingml/2006/wordprocessingDrawing" xmlns:w10="urn:schemas-microsoft-com:office:word" xmlns:w="http://schemas.openxmlformats.org/wordprocessingml/2006/main" xmlns:w14="http://schemas.microsoft.com/office/word/2010/wordml" xmlns:w15="http://schemas.microsoft.com/office/word/2012/wordml" xmlns:w16cex="http://schemas.microsoft.com/office/word/2018/wordml/cex" xmlns:w16cid="http://schemas.microsoft.com/office/word/2016/wordml/cid" xmlns:w16="http://schemas.microsoft.com/office/word/2018/wordml" xmlns:w16sdtdh="http://schemas.microsoft.com/office/word/2020/wordml/sdtdatahash" xmlns:w16se="http://schemas.microsoft.com/office/word/2015/wordml/symex" xmlns:wpg="http://schemas.microsoft.com/office/word/2010/wordprocessingGroup" xmlns:wpi="http://schemas.microsoft.com/office/word/2010/wordprocessingInk" xmlns:wne="http://schemas.microsoft.com/office/word/2006/wordml" xmlns:wps="http://schemas.microsoft.com/office/word/2010/wordprocessingShape" mc:Ignorable="w14 w15 w16se w16cid w16 w16cex w16sdtdh wp14">
   <w:abstractNum w:abstractNumId="0" w15:restartNumberingAfterBreak="0">
-    <w:nsid w:val="55834ADC"/>
+    <w:nsid w:val="1D1B5CF4"/>
     <w:multiLevelType w:val="hybridMultilevel"/>
-    <w:tmpl w:val="373C8562"/>
-    <w:lvl w:ilvl="0" w:tplc="7B68E822">
+    <w:tmpl w:val="6AEA167E"/>
+    <w:lvl w:ilvl="0" w:tplc="3F20374A">
       <w:start w:val="1"/>
       <w:numFmt w:val="bullet"/>
       <w:lvlText w:val="•"/>
@@ -32653,7 +33729,7 @@
         <w:ind w:left="460" w:hanging="280"/>
       </w:pPr>
     </w:lvl>
-    <w:lvl w:ilvl="1" w:tplc="E3584B82">
+    <w:lvl w:ilvl="1" w:tplc="94B8C21E">
       <w:start w:val="1"/>
       <w:numFmt w:val="bullet"/>
       <w:lvlText w:val="–"/>
@@ -32662,47 +33738,47 @@
         <w:ind w:left="900" w:hanging="280"/>
       </w:pPr>
     </w:lvl>
-    <w:lvl w:ilvl="2" w:tplc="340E79BE">
+    <w:lvl w:ilvl="2" w:tplc="772AF526">
       <w:numFmt w:val="decimal"/>
       <w:lvlText w:val=""/>
       <w:lvlJc w:val="left"/>
     </w:lvl>
-    <w:lvl w:ilvl="3" w:tplc="0D66574C">
+    <w:lvl w:ilvl="3" w:tplc="4DE82988">
       <w:numFmt w:val="decimal"/>
       <w:lvlText w:val=""/>
       <w:lvlJc w:val="left"/>
     </w:lvl>
-    <w:lvl w:ilvl="4" w:tplc="77DEE85C">
+    <w:lvl w:ilvl="4" w:tplc="A1247190">
       <w:numFmt w:val="decimal"/>
       <w:lvlText w:val=""/>
       <w:lvlJc w:val="left"/>
     </w:lvl>
-    <w:lvl w:ilvl="5" w:tplc="ACACE8F2">
+    <w:lvl w:ilvl="5" w:tplc="3A005DCA">
       <w:numFmt w:val="decimal"/>
       <w:lvlText w:val=""/>
       <w:lvlJc w:val="left"/>
     </w:lvl>
-    <w:lvl w:ilvl="6" w:tplc="51CA2AC2">
+    <w:lvl w:ilvl="6" w:tplc="6452365E">
       <w:numFmt w:val="decimal"/>
       <w:lvlText w:val=""/>
       <w:lvlJc w:val="left"/>
     </w:lvl>
-    <w:lvl w:ilvl="7" w:tplc="D7AEEB54">
+    <w:lvl w:ilvl="7" w:tplc="047673FC">
       <w:numFmt w:val="decimal"/>
       <w:lvlText w:val=""/>
       <w:lvlJc w:val="left"/>
     </w:lvl>
-    <w:lvl w:ilvl="8" w:tplc="B9C07EB2">
+    <w:lvl w:ilvl="8" w:tplc="2D42BA40">
       <w:numFmt w:val="decimal"/>
       <w:lvlText w:val=""/>
       <w:lvlJc w:val="left"/>
     </w:lvl>
   </w:abstractNum>
   <w:abstractNum w:abstractNumId="1" w15:restartNumberingAfterBreak="0">
-    <w:nsid w:val="7C1047C2"/>
+    <w:nsid w:val="57FE0242"/>
     <w:multiLevelType w:val="hybridMultilevel"/>
-    <w:tmpl w:val="6506F74A"/>
-    <w:lvl w:ilvl="0" w:tplc="7A8CA814">
+    <w:tmpl w:val="7EC6CED0"/>
+    <w:lvl w:ilvl="0" w:tplc="89C00528">
       <w:start w:val="1"/>
       <w:numFmt w:val="bullet"/>
       <w:lvlText w:val="●"/>
@@ -32711,7 +33787,7 @@
         <w:ind w:left="720" w:hanging="360"/>
       </w:pPr>
     </w:lvl>
-    <w:lvl w:ilvl="1" w:tplc="8C9842F2">
+    <w:lvl w:ilvl="1" w:tplc="38EADEF2">
       <w:start w:val="1"/>
       <w:numFmt w:val="bullet"/>
       <w:lvlText w:val="○"/>
@@ -32720,7 +33796,7 @@
         <w:ind w:left="1440" w:hanging="360"/>
       </w:pPr>
     </w:lvl>
-    <w:lvl w:ilvl="2" w:tplc="8A822B90">
+    <w:lvl w:ilvl="2" w:tplc="75D288BE">
       <w:start w:val="1"/>
       <w:numFmt w:val="bullet"/>
       <w:lvlText w:val="■"/>
@@ -32729,7 +33805,7 @@
         <w:ind w:left="2160" w:hanging="360"/>
       </w:pPr>
     </w:lvl>
-    <w:lvl w:ilvl="3" w:tplc="9864D6F8">
+    <w:lvl w:ilvl="3" w:tplc="5066AB3A">
       <w:start w:val="1"/>
       <w:numFmt w:val="bullet"/>
       <w:lvlText w:val="●"/>
@@ -32738,7 +33814,7 @@
         <w:ind w:left="2880" w:hanging="360"/>
       </w:pPr>
     </w:lvl>
-    <w:lvl w:ilvl="4" w:tplc="9BB88DCA">
+    <w:lvl w:ilvl="4" w:tplc="7FBCEF08">
       <w:start w:val="1"/>
       <w:numFmt w:val="bullet"/>
       <w:lvlText w:val="○"/>
@@ -32747,7 +33823,7 @@
         <w:ind w:left="3600" w:hanging="360"/>
       </w:pPr>
     </w:lvl>
-    <w:lvl w:ilvl="5" w:tplc="02CA5714">
+    <w:lvl w:ilvl="5" w:tplc="A5727A86">
       <w:start w:val="1"/>
       <w:numFmt w:val="bullet"/>
       <w:lvlText w:val="■"/>
@@ -32756,7 +33832,7 @@
         <w:ind w:left="4320" w:hanging="360"/>
       </w:pPr>
     </w:lvl>
-    <w:lvl w:ilvl="6" w:tplc="367A58B8">
+    <w:lvl w:ilvl="6" w:tplc="C7C08D88">
       <w:start w:val="1"/>
       <w:numFmt w:val="bullet"/>
       <w:lvlText w:val="●"/>
@@ -32765,7 +33841,7 @@
         <w:ind w:left="5040" w:hanging="360"/>
       </w:pPr>
     </w:lvl>
-    <w:lvl w:ilvl="7" w:tplc="E0FA578E">
+    <w:lvl w:ilvl="7" w:tplc="2A8A6060">
       <w:start w:val="1"/>
       <w:numFmt w:val="bullet"/>
       <w:lvlText w:val="●"/>
@@ -32774,7 +33850,7 @@
         <w:ind w:left="5760" w:hanging="360"/>
       </w:pPr>
     </w:lvl>
-    <w:lvl w:ilvl="8" w:tplc="68840EAE">
+    <w:lvl w:ilvl="8" w:tplc="B71AFEBA">
       <w:start w:val="1"/>
       <w:numFmt w:val="bullet"/>
       <w:lvlText w:val="●"/>
@@ -32784,13 +33860,13 @@
       </w:pPr>
     </w:lvl>
   </w:abstractNum>
-  <w:num w:numId="1" w16cid:durableId="1434475431">
+  <w:num w:numId="1" w16cid:durableId="907492532">
     <w:abstractNumId w:val="1"/>
     <w:lvlOverride w:ilvl="0">
       <w:startOverride w:val="1"/>
     </w:lvlOverride>
   </w:num>
-  <w:num w:numId="2" w16cid:durableId="1813521617">
+  <w:num w:numId="2" w16cid:durableId="1512795275">
     <w:abstractNumId w:val="0"/>
     <w:lvlOverride w:ilvl="0">
       <w:startOverride w:val="1"/>
@@ -33416,7 +34492,7 @@
     <w:autoRedefine/>
     <w:uiPriority w:val="39"/>
     <w:unhideWhenUsed/>
-    <w:rsid w:val="00103ADA"/>
+    <w:rsid w:val="00736FA6"/>
     <w:pPr>
       <w:spacing w:after="100"/>
     </w:pPr>
@@ -33428,7 +34504,7 @@
     <w:autoRedefine/>
     <w:uiPriority w:val="39"/>
     <w:unhideWhenUsed/>
-    <w:rsid w:val="00103ADA"/>
+    <w:rsid w:val="00736FA6"/>
     <w:pPr>
       <w:spacing w:after="100"/>
       <w:ind w:left="210"/>

</xml_diff>

<commit_message>
docs: cover the KII self-service invitation flow in the manuals (v1.14)
Built and deployed earlier today without a manuals pass -- the Respondent
Guide's own audience line implicitly excluded KII informants entirely, and
no KII RA instructions existed for the new "Invite" panel.

Respondent Guide: new chapter 7, "If you were invited to a Key Informant
Interview" (old chapter 7 renumbered to 8) -- the /ki/ link pattern, the
shorter 4-step flow, and the interviewer-assisted alternative.

Role Guide 5 (KII RA) / System Manual: a new T.kii procedure section
("Sending the informant their own link (self-service)") flows into both via
their shared source, plus a System Manual sentence on the INVITED ->
COMPLETED direct transition.

Rebuilt via build_manuals.js and finalise_manuals.ps1; verified by
extracting text from the built PDFs rather than assuming the build worked.

Co-Authored-By: Claude Sonnet 5 <noreply@anthropic.com>
</commit_message>
<xml_diff>
--- a/docs/manuals/ABF-FST_Screen_and_Button_Reference.docx
+++ b/docs/manuals/ABF-FST_Screen_and_Button_Reference.docx
@@ -469,7 +469,7 @@
                 <w:sz w:val="19"/>
                 <w:szCs w:val="19"/>
               </w:rPr>
-              <w:t>Version 1.13 · 1 October 2026</w:t>
+              <w:t>Version 1.14 · 1 October 2026</w:t>
             </w:r>
           </w:p>
         </w:tc>
@@ -538,7 +538,7 @@
     <w:sdt>
       <w:sdtPr>
         <w:alias w:val="Contents"/>
-        <w:id w:val="930169756"/>
+        <w:id w:val="-2108651737"/>
       </w:sdtPr>
       <w:sdtEndPr/>
       <w:sdtContent>
@@ -567,7 +567,7 @@
           <w:r>
             <w:fldChar w:fldCharType="separate"/>
           </w:r>
-          <w:hyperlink w:anchor="_Toc241726267" w:history="1">
+          <w:hyperlink w:anchor="_Toc241780173" w:history="1">
             <w:r>
               <w:rPr>
                 <w:rStyle w:val="Hyperlink"/>
@@ -591,7 +591,7 @@
               <w:rPr>
                 <w:noProof/>
               </w:rPr>
-              <w:instrText xml:space="preserve"> PAGEREF _Toc241726267 \h </w:instrText>
+              <w:instrText xml:space="preserve"> PAGEREF _Toc241780173 \h </w:instrText>
             </w:r>
             <w:r>
               <w:rPr>
@@ -634,7 +634,7 @@
               <w14:ligatures w14:val="standardContextual"/>
             </w:rPr>
           </w:pPr>
-          <w:hyperlink w:anchor="_Toc241726268" w:history="1">
+          <w:hyperlink w:anchor="_Toc241780174" w:history="1">
             <w:r>
               <w:rPr>
                 <w:rStyle w:val="Hyperlink"/>
@@ -658,7 +658,7 @@
               <w:rPr>
                 <w:noProof/>
               </w:rPr>
-              <w:instrText xml:space="preserve"> PAGEREF _Toc241726268 \h </w:instrText>
+              <w:instrText xml:space="preserve"> PAGEREF _Toc241780174 \h </w:instrText>
             </w:r>
             <w:r>
               <w:rPr>
@@ -701,7 +701,7 @@
               <w14:ligatures w14:val="standardContextual"/>
             </w:rPr>
           </w:pPr>
-          <w:hyperlink w:anchor="_Toc241726269" w:history="1">
+          <w:hyperlink w:anchor="_Toc241780175" w:history="1">
             <w:r>
               <w:rPr>
                 <w:rStyle w:val="Hyperlink"/>
@@ -725,7 +725,7 @@
               <w:rPr>
                 <w:noProof/>
               </w:rPr>
-              <w:instrText xml:space="preserve"> PAGEREF _Toc241726269 \h </w:instrText>
+              <w:instrText xml:space="preserve"> PAGEREF _Toc241780175 \h </w:instrText>
             </w:r>
             <w:r>
               <w:rPr>
@@ -768,7 +768,7 @@
               <w14:ligatures w14:val="standardContextual"/>
             </w:rPr>
           </w:pPr>
-          <w:hyperlink w:anchor="_Toc241726270" w:history="1">
+          <w:hyperlink w:anchor="_Toc241780176" w:history="1">
             <w:r>
               <w:rPr>
                 <w:rStyle w:val="Hyperlink"/>
@@ -792,7 +792,7 @@
               <w:rPr>
                 <w:noProof/>
               </w:rPr>
-              <w:instrText xml:space="preserve"> PAGEREF _Toc241726270 \h </w:instrText>
+              <w:instrText xml:space="preserve"> PAGEREF _Toc241780176 \h </w:instrText>
             </w:r>
             <w:r>
               <w:rPr>
@@ -835,7 +835,7 @@
               <w14:ligatures w14:val="standardContextual"/>
             </w:rPr>
           </w:pPr>
-          <w:hyperlink w:anchor="_Toc241726271" w:history="1">
+          <w:hyperlink w:anchor="_Toc241780177" w:history="1">
             <w:r>
               <w:rPr>
                 <w:rStyle w:val="Hyperlink"/>
@@ -859,7 +859,7 @@
               <w:rPr>
                 <w:noProof/>
               </w:rPr>
-              <w:instrText xml:space="preserve"> PAGEREF _Toc241726271 \h </w:instrText>
+              <w:instrText xml:space="preserve"> PAGEREF _Toc241780177 \h </w:instrText>
             </w:r>
             <w:r>
               <w:rPr>
@@ -902,7 +902,7 @@
               <w14:ligatures w14:val="standardContextual"/>
             </w:rPr>
           </w:pPr>
-          <w:hyperlink w:anchor="_Toc241726272" w:history="1">
+          <w:hyperlink w:anchor="_Toc241780178" w:history="1">
             <w:r>
               <w:rPr>
                 <w:rStyle w:val="Hyperlink"/>
@@ -926,7 +926,7 @@
               <w:rPr>
                 <w:noProof/>
               </w:rPr>
-              <w:instrText xml:space="preserve"> PAGEREF _Toc241726272 \h </w:instrText>
+              <w:instrText xml:space="preserve"> PAGEREF _Toc241780178 \h </w:instrText>
             </w:r>
             <w:r>
               <w:rPr>
@@ -969,7 +969,7 @@
               <w14:ligatures w14:val="standardContextual"/>
             </w:rPr>
           </w:pPr>
-          <w:hyperlink w:anchor="_Toc241726273" w:history="1">
+          <w:hyperlink w:anchor="_Toc241780179" w:history="1">
             <w:r>
               <w:rPr>
                 <w:rStyle w:val="Hyperlink"/>
@@ -993,7 +993,7 @@
               <w:rPr>
                 <w:noProof/>
               </w:rPr>
-              <w:instrText xml:space="preserve"> PAGEREF _Toc241726273 \h </w:instrText>
+              <w:instrText xml:space="preserve"> PAGEREF _Toc241780179 \h </w:instrText>
             </w:r>
             <w:r>
               <w:rPr>
@@ -1036,7 +1036,7 @@
               <w14:ligatures w14:val="standardContextual"/>
             </w:rPr>
           </w:pPr>
-          <w:hyperlink w:anchor="_Toc241726274" w:history="1">
+          <w:hyperlink w:anchor="_Toc241780180" w:history="1">
             <w:r>
               <w:rPr>
                 <w:rStyle w:val="Hyperlink"/>
@@ -1060,7 +1060,7 @@
               <w:rPr>
                 <w:noProof/>
               </w:rPr>
-              <w:instrText xml:space="preserve"> PAGEREF _Toc241726274 \h </w:instrText>
+              <w:instrText xml:space="preserve"> PAGEREF _Toc241780180 \h </w:instrText>
             </w:r>
             <w:r>
               <w:rPr>
@@ -1103,7 +1103,7 @@
               <w14:ligatures w14:val="standardContextual"/>
             </w:rPr>
           </w:pPr>
-          <w:hyperlink w:anchor="_Toc241726275" w:history="1">
+          <w:hyperlink w:anchor="_Toc241780181" w:history="1">
             <w:r>
               <w:rPr>
                 <w:rStyle w:val="Hyperlink"/>
@@ -1127,7 +1127,7 @@
               <w:rPr>
                 <w:noProof/>
               </w:rPr>
-              <w:instrText xml:space="preserve"> PAGEREF _Toc241726275 \h </w:instrText>
+              <w:instrText xml:space="preserve"> PAGEREF _Toc241780181 \h </w:instrText>
             </w:r>
             <w:r>
               <w:rPr>
@@ -1170,7 +1170,7 @@
               <w14:ligatures w14:val="standardContextual"/>
             </w:rPr>
           </w:pPr>
-          <w:hyperlink w:anchor="_Toc241726276" w:history="1">
+          <w:hyperlink w:anchor="_Toc241780182" w:history="1">
             <w:r>
               <w:rPr>
                 <w:rStyle w:val="Hyperlink"/>
@@ -1194,7 +1194,7 @@
               <w:rPr>
                 <w:noProof/>
               </w:rPr>
-              <w:instrText xml:space="preserve"> PAGEREF _Toc241726276 \h </w:instrText>
+              <w:instrText xml:space="preserve"> PAGEREF _Toc241780182 \h </w:instrText>
             </w:r>
             <w:r>
               <w:rPr>
@@ -1237,7 +1237,7 @@
               <w14:ligatures w14:val="standardContextual"/>
             </w:rPr>
           </w:pPr>
-          <w:hyperlink w:anchor="_Toc241726277" w:history="1">
+          <w:hyperlink w:anchor="_Toc241780183" w:history="1">
             <w:r>
               <w:rPr>
                 <w:rStyle w:val="Hyperlink"/>
@@ -1261,7 +1261,7 @@
               <w:rPr>
                 <w:noProof/>
               </w:rPr>
-              <w:instrText xml:space="preserve"> PAGEREF _Toc241726277 \h </w:instrText>
+              <w:instrText xml:space="preserve"> PAGEREF _Toc241780183 \h </w:instrText>
             </w:r>
             <w:r>
               <w:rPr>
@@ -1304,7 +1304,7 @@
               <w14:ligatures w14:val="standardContextual"/>
             </w:rPr>
           </w:pPr>
-          <w:hyperlink w:anchor="_Toc241726278" w:history="1">
+          <w:hyperlink w:anchor="_Toc241780184" w:history="1">
             <w:r>
               <w:rPr>
                 <w:rStyle w:val="Hyperlink"/>
@@ -1328,7 +1328,7 @@
               <w:rPr>
                 <w:noProof/>
               </w:rPr>
-              <w:instrText xml:space="preserve"> PAGEREF _Toc241726278 \h </w:instrText>
+              <w:instrText xml:space="preserve"> PAGEREF _Toc241780184 \h </w:instrText>
             </w:r>
             <w:r>
               <w:rPr>
@@ -1371,7 +1371,7 @@
               <w14:ligatures w14:val="standardContextual"/>
             </w:rPr>
           </w:pPr>
-          <w:hyperlink w:anchor="_Toc241726279" w:history="1">
+          <w:hyperlink w:anchor="_Toc241780185" w:history="1">
             <w:r>
               <w:rPr>
                 <w:rStyle w:val="Hyperlink"/>
@@ -1395,7 +1395,7 @@
               <w:rPr>
                 <w:noProof/>
               </w:rPr>
-              <w:instrText xml:space="preserve"> PAGEREF _Toc241726279 \h </w:instrText>
+              <w:instrText xml:space="preserve"> PAGEREF _Toc241780185 \h </w:instrText>
             </w:r>
             <w:r>
               <w:rPr>
@@ -1438,7 +1438,7 @@
               <w14:ligatures w14:val="standardContextual"/>
             </w:rPr>
           </w:pPr>
-          <w:hyperlink w:anchor="_Toc241726280" w:history="1">
+          <w:hyperlink w:anchor="_Toc241780186" w:history="1">
             <w:r>
               <w:rPr>
                 <w:rStyle w:val="Hyperlink"/>
@@ -1462,7 +1462,7 @@
               <w:rPr>
                 <w:noProof/>
               </w:rPr>
-              <w:instrText xml:space="preserve"> PAGEREF _Toc241726280 \h </w:instrText>
+              <w:instrText xml:space="preserve"> PAGEREF _Toc241780186 \h </w:instrText>
             </w:r>
             <w:r>
               <w:rPr>
@@ -1505,7 +1505,7 @@
               <w14:ligatures w14:val="standardContextual"/>
             </w:rPr>
           </w:pPr>
-          <w:hyperlink w:anchor="_Toc241726281" w:history="1">
+          <w:hyperlink w:anchor="_Toc241780187" w:history="1">
             <w:r>
               <w:rPr>
                 <w:rStyle w:val="Hyperlink"/>
@@ -1529,7 +1529,7 @@
               <w:rPr>
                 <w:noProof/>
               </w:rPr>
-              <w:instrText xml:space="preserve"> PAGEREF _Toc241726281 \h </w:instrText>
+              <w:instrText xml:space="preserve"> PAGEREF _Toc241780187 \h </w:instrText>
             </w:r>
             <w:r>
               <w:rPr>
@@ -1572,7 +1572,7 @@
               <w14:ligatures w14:val="standardContextual"/>
             </w:rPr>
           </w:pPr>
-          <w:hyperlink w:anchor="_Toc241726282" w:history="1">
+          <w:hyperlink w:anchor="_Toc241780188" w:history="1">
             <w:r>
               <w:rPr>
                 <w:rStyle w:val="Hyperlink"/>
@@ -1596,7 +1596,7 @@
               <w:rPr>
                 <w:noProof/>
               </w:rPr>
-              <w:instrText xml:space="preserve"> PAGEREF _Toc241726282 \h </w:instrText>
+              <w:instrText xml:space="preserve"> PAGEREF _Toc241780188 \h </w:instrText>
             </w:r>
             <w:r>
               <w:rPr>
@@ -1639,7 +1639,7 @@
               <w14:ligatures w14:val="standardContextual"/>
             </w:rPr>
           </w:pPr>
-          <w:hyperlink w:anchor="_Toc241726283" w:history="1">
+          <w:hyperlink w:anchor="_Toc241780189" w:history="1">
             <w:r>
               <w:rPr>
                 <w:rStyle w:val="Hyperlink"/>
@@ -1663,7 +1663,7 @@
               <w:rPr>
                 <w:noProof/>
               </w:rPr>
-              <w:instrText xml:space="preserve"> PAGEREF _Toc241726283 \h </w:instrText>
+              <w:instrText xml:space="preserve"> PAGEREF _Toc241780189 \h </w:instrText>
             </w:r>
             <w:r>
               <w:rPr>
@@ -1706,7 +1706,7 @@
               <w14:ligatures w14:val="standardContextual"/>
             </w:rPr>
           </w:pPr>
-          <w:hyperlink w:anchor="_Toc241726284" w:history="1">
+          <w:hyperlink w:anchor="_Toc241780190" w:history="1">
             <w:r>
               <w:rPr>
                 <w:rStyle w:val="Hyperlink"/>
@@ -1730,7 +1730,7 @@
               <w:rPr>
                 <w:noProof/>
               </w:rPr>
-              <w:instrText xml:space="preserve"> PAGEREF _Toc241726284 \h </w:instrText>
+              <w:instrText xml:space="preserve"> PAGEREF _Toc241780190 \h </w:instrText>
             </w:r>
             <w:r>
               <w:rPr>
@@ -1773,7 +1773,7 @@
               <w14:ligatures w14:val="standardContextual"/>
             </w:rPr>
           </w:pPr>
-          <w:hyperlink w:anchor="_Toc241726285" w:history="1">
+          <w:hyperlink w:anchor="_Toc241780191" w:history="1">
             <w:r>
               <w:rPr>
                 <w:rStyle w:val="Hyperlink"/>
@@ -1797,7 +1797,7 @@
               <w:rPr>
                 <w:noProof/>
               </w:rPr>
-              <w:instrText xml:space="preserve"> PAGEREF _Toc241726285 \h </w:instrText>
+              <w:instrText xml:space="preserve"> PAGEREF _Toc241780191 \h </w:instrText>
             </w:r>
             <w:r>
               <w:rPr>
@@ -1840,7 +1840,7 @@
               <w14:ligatures w14:val="standardContextual"/>
             </w:rPr>
           </w:pPr>
-          <w:hyperlink w:anchor="_Toc241726286" w:history="1">
+          <w:hyperlink w:anchor="_Toc241780192" w:history="1">
             <w:r>
               <w:rPr>
                 <w:rStyle w:val="Hyperlink"/>
@@ -1864,7 +1864,7 @@
               <w:rPr>
                 <w:noProof/>
               </w:rPr>
-              <w:instrText xml:space="preserve"> PAGEREF _Toc241726286 \h </w:instrText>
+              <w:instrText xml:space="preserve"> PAGEREF _Toc241780192 \h </w:instrText>
             </w:r>
             <w:r>
               <w:rPr>
@@ -1907,7 +1907,7 @@
               <w14:ligatures w14:val="standardContextual"/>
             </w:rPr>
           </w:pPr>
-          <w:hyperlink w:anchor="_Toc241726287" w:history="1">
+          <w:hyperlink w:anchor="_Toc241780193" w:history="1">
             <w:r>
               <w:rPr>
                 <w:rStyle w:val="Hyperlink"/>
@@ -1931,7 +1931,7 @@
               <w:rPr>
                 <w:noProof/>
               </w:rPr>
-              <w:instrText xml:space="preserve"> PAGEREF _Toc241726287 \h </w:instrText>
+              <w:instrText xml:space="preserve"> PAGEREF _Toc241780193 \h </w:instrText>
             </w:r>
             <w:r>
               <w:rPr>
@@ -1974,7 +1974,7 @@
               <w14:ligatures w14:val="standardContextual"/>
             </w:rPr>
           </w:pPr>
-          <w:hyperlink w:anchor="_Toc241726288" w:history="1">
+          <w:hyperlink w:anchor="_Toc241780194" w:history="1">
             <w:r>
               <w:rPr>
                 <w:rStyle w:val="Hyperlink"/>
@@ -1998,7 +1998,7 @@
               <w:rPr>
                 <w:noProof/>
               </w:rPr>
-              <w:instrText xml:space="preserve"> PAGEREF _Toc241726288 \h </w:instrText>
+              <w:instrText xml:space="preserve"> PAGEREF _Toc241780194 \h </w:instrText>
             </w:r>
             <w:r>
               <w:rPr>
@@ -2041,7 +2041,7 @@
               <w14:ligatures w14:val="standardContextual"/>
             </w:rPr>
           </w:pPr>
-          <w:hyperlink w:anchor="_Toc241726289" w:history="1">
+          <w:hyperlink w:anchor="_Toc241780195" w:history="1">
             <w:r>
               <w:rPr>
                 <w:rStyle w:val="Hyperlink"/>
@@ -2065,7 +2065,7 @@
               <w:rPr>
                 <w:noProof/>
               </w:rPr>
-              <w:instrText xml:space="preserve"> PAGEREF _Toc241726289 \h </w:instrText>
+              <w:instrText xml:space="preserve"> PAGEREF _Toc241780195 \h </w:instrText>
             </w:r>
             <w:r>
               <w:rPr>
@@ -2108,7 +2108,7 @@
               <w14:ligatures w14:val="standardContextual"/>
             </w:rPr>
           </w:pPr>
-          <w:hyperlink w:anchor="_Toc241726290" w:history="1">
+          <w:hyperlink w:anchor="_Toc241780196" w:history="1">
             <w:r>
               <w:rPr>
                 <w:rStyle w:val="Hyperlink"/>
@@ -2132,7 +2132,7 @@
               <w:rPr>
                 <w:noProof/>
               </w:rPr>
-              <w:instrText xml:space="preserve"> PAGEREF _Toc241726290 \h </w:instrText>
+              <w:instrText xml:space="preserve"> PAGEREF _Toc241780196 \h </w:instrText>
             </w:r>
             <w:r>
               <w:rPr>
@@ -2175,7 +2175,7 @@
               <w14:ligatures w14:val="standardContextual"/>
             </w:rPr>
           </w:pPr>
-          <w:hyperlink w:anchor="_Toc241726291" w:history="1">
+          <w:hyperlink w:anchor="_Toc241780197" w:history="1">
             <w:r>
               <w:rPr>
                 <w:rStyle w:val="Hyperlink"/>
@@ -2199,7 +2199,7 @@
               <w:rPr>
                 <w:noProof/>
               </w:rPr>
-              <w:instrText xml:space="preserve"> PAGEREF _Toc241726291 \h </w:instrText>
+              <w:instrText xml:space="preserve"> PAGEREF _Toc241780197 \h </w:instrText>
             </w:r>
             <w:r>
               <w:rPr>
@@ -2242,7 +2242,7 @@
               <w14:ligatures w14:val="standardContextual"/>
             </w:rPr>
           </w:pPr>
-          <w:hyperlink w:anchor="_Toc241726292" w:history="1">
+          <w:hyperlink w:anchor="_Toc241780198" w:history="1">
             <w:r>
               <w:rPr>
                 <w:rStyle w:val="Hyperlink"/>
@@ -2266,7 +2266,7 @@
               <w:rPr>
                 <w:noProof/>
               </w:rPr>
-              <w:instrText xml:space="preserve"> PAGEREF _Toc241726292 \h </w:instrText>
+              <w:instrText xml:space="preserve"> PAGEREF _Toc241780198 \h </w:instrText>
             </w:r>
             <w:r>
               <w:rPr>
@@ -2309,7 +2309,7 @@
               <w14:ligatures w14:val="standardContextual"/>
             </w:rPr>
           </w:pPr>
-          <w:hyperlink w:anchor="_Toc241726293" w:history="1">
+          <w:hyperlink w:anchor="_Toc241780199" w:history="1">
             <w:r>
               <w:rPr>
                 <w:rStyle w:val="Hyperlink"/>
@@ -2333,7 +2333,7 @@
               <w:rPr>
                 <w:noProof/>
               </w:rPr>
-              <w:instrText xml:space="preserve"> PAGEREF _Toc241726293 \h </w:instrText>
+              <w:instrText xml:space="preserve"> PAGEREF _Toc241780199 \h </w:instrText>
             </w:r>
             <w:r>
               <w:rPr>
@@ -2376,7 +2376,7 @@
               <w14:ligatures w14:val="standardContextual"/>
             </w:rPr>
           </w:pPr>
-          <w:hyperlink w:anchor="_Toc241726294" w:history="1">
+          <w:hyperlink w:anchor="_Toc241780200" w:history="1">
             <w:r>
               <w:rPr>
                 <w:rStyle w:val="Hyperlink"/>
@@ -2400,7 +2400,7 @@
               <w:rPr>
                 <w:noProof/>
               </w:rPr>
-              <w:instrText xml:space="preserve"> PAGEREF _Toc241726294 \h </w:instrText>
+              <w:instrText xml:space="preserve"> PAGEREF _Toc241780200 \h </w:instrText>
             </w:r>
             <w:r>
               <w:rPr>
@@ -2443,7 +2443,7 @@
               <w14:ligatures w14:val="standardContextual"/>
             </w:rPr>
           </w:pPr>
-          <w:hyperlink w:anchor="_Toc241726295" w:history="1">
+          <w:hyperlink w:anchor="_Toc241780201" w:history="1">
             <w:r>
               <w:rPr>
                 <w:rStyle w:val="Hyperlink"/>
@@ -2467,7 +2467,7 @@
               <w:rPr>
                 <w:noProof/>
               </w:rPr>
-              <w:instrText xml:space="preserve"> PAGEREF _Toc241726295 \h </w:instrText>
+              <w:instrText xml:space="preserve"> PAGEREF _Toc241780201 \h </w:instrText>
             </w:r>
             <w:r>
               <w:rPr>
@@ -2510,7 +2510,7 @@
               <w14:ligatures w14:val="standardContextual"/>
             </w:rPr>
           </w:pPr>
-          <w:hyperlink w:anchor="_Toc241726296" w:history="1">
+          <w:hyperlink w:anchor="_Toc241780202" w:history="1">
             <w:r>
               <w:rPr>
                 <w:rStyle w:val="Hyperlink"/>
@@ -2534,7 +2534,7 @@
               <w:rPr>
                 <w:noProof/>
               </w:rPr>
-              <w:instrText xml:space="preserve"> PAGEREF _Toc241726296 \h </w:instrText>
+              <w:instrText xml:space="preserve"> PAGEREF _Toc241780202 \h </w:instrText>
             </w:r>
             <w:r>
               <w:rPr>
@@ -2577,7 +2577,7 @@
               <w14:ligatures w14:val="standardContextual"/>
             </w:rPr>
           </w:pPr>
-          <w:hyperlink w:anchor="_Toc241726297" w:history="1">
+          <w:hyperlink w:anchor="_Toc241780203" w:history="1">
             <w:r>
               <w:rPr>
                 <w:rStyle w:val="Hyperlink"/>
@@ -2601,7 +2601,7 @@
               <w:rPr>
                 <w:noProof/>
               </w:rPr>
-              <w:instrText xml:space="preserve"> PAGEREF _Toc241726297 \h </w:instrText>
+              <w:instrText xml:space="preserve"> PAGEREF _Toc241780203 \h </w:instrText>
             </w:r>
             <w:r>
               <w:rPr>
@@ -2644,7 +2644,7 @@
               <w14:ligatures w14:val="standardContextual"/>
             </w:rPr>
           </w:pPr>
-          <w:hyperlink w:anchor="_Toc241726298" w:history="1">
+          <w:hyperlink w:anchor="_Toc241780204" w:history="1">
             <w:r>
               <w:rPr>
                 <w:rStyle w:val="Hyperlink"/>
@@ -2668,7 +2668,7 @@
               <w:rPr>
                 <w:noProof/>
               </w:rPr>
-              <w:instrText xml:space="preserve"> PAGEREF _Toc241726298 \h </w:instrText>
+              <w:instrText xml:space="preserve"> PAGEREF _Toc241780204 \h </w:instrText>
             </w:r>
             <w:r>
               <w:rPr>
@@ -2711,7 +2711,7 @@
               <w14:ligatures w14:val="standardContextual"/>
             </w:rPr>
           </w:pPr>
-          <w:hyperlink w:anchor="_Toc241726299" w:history="1">
+          <w:hyperlink w:anchor="_Toc241780205" w:history="1">
             <w:r>
               <w:rPr>
                 <w:rStyle w:val="Hyperlink"/>
@@ -2735,7 +2735,7 @@
               <w:rPr>
                 <w:noProof/>
               </w:rPr>
-              <w:instrText xml:space="preserve"> PAGEREF _Toc241726299 \h </w:instrText>
+              <w:instrText xml:space="preserve"> PAGEREF _Toc241780205 \h </w:instrText>
             </w:r>
             <w:r>
               <w:rPr>
@@ -2778,7 +2778,7 @@
               <w14:ligatures w14:val="standardContextual"/>
             </w:rPr>
           </w:pPr>
-          <w:hyperlink w:anchor="_Toc241726300" w:history="1">
+          <w:hyperlink w:anchor="_Toc241780206" w:history="1">
             <w:r>
               <w:rPr>
                 <w:rStyle w:val="Hyperlink"/>
@@ -2802,7 +2802,7 @@
               <w:rPr>
                 <w:noProof/>
               </w:rPr>
-              <w:instrText xml:space="preserve"> PAGEREF _Toc241726300 \h </w:instrText>
+              <w:instrText xml:space="preserve"> PAGEREF _Toc241780206 \h </w:instrText>
             </w:r>
             <w:r>
               <w:rPr>
@@ -2845,7 +2845,7 @@
               <w14:ligatures w14:val="standardContextual"/>
             </w:rPr>
           </w:pPr>
-          <w:hyperlink w:anchor="_Toc241726301" w:history="1">
+          <w:hyperlink w:anchor="_Toc241780207" w:history="1">
             <w:r>
               <w:rPr>
                 <w:rStyle w:val="Hyperlink"/>
@@ -2869,7 +2869,7 @@
               <w:rPr>
                 <w:noProof/>
               </w:rPr>
-              <w:instrText xml:space="preserve"> PAGEREF _Toc241726301 \h </w:instrText>
+              <w:instrText xml:space="preserve"> PAGEREF _Toc241780207 \h </w:instrText>
             </w:r>
             <w:r>
               <w:rPr>
@@ -2912,7 +2912,7 @@
               <w14:ligatures w14:val="standardContextual"/>
             </w:rPr>
           </w:pPr>
-          <w:hyperlink w:anchor="_Toc241726302" w:history="1">
+          <w:hyperlink w:anchor="_Toc241780208" w:history="1">
             <w:r>
               <w:rPr>
                 <w:rStyle w:val="Hyperlink"/>
@@ -2936,7 +2936,7 @@
               <w:rPr>
                 <w:noProof/>
               </w:rPr>
-              <w:instrText xml:space="preserve"> PAGEREF _Toc241726302 \h </w:instrText>
+              <w:instrText xml:space="preserve"> PAGEREF _Toc241780208 \h </w:instrText>
             </w:r>
             <w:r>
               <w:rPr>
@@ -2979,7 +2979,7 @@
               <w14:ligatures w14:val="standardContextual"/>
             </w:rPr>
           </w:pPr>
-          <w:hyperlink w:anchor="_Toc241726303" w:history="1">
+          <w:hyperlink w:anchor="_Toc241780209" w:history="1">
             <w:r>
               <w:rPr>
                 <w:rStyle w:val="Hyperlink"/>
@@ -3003,7 +3003,7 @@
               <w:rPr>
                 <w:noProof/>
               </w:rPr>
-              <w:instrText xml:space="preserve"> PAGEREF _Toc241726303 \h </w:instrText>
+              <w:instrText xml:space="preserve"> PAGEREF _Toc241780209 \h </w:instrText>
             </w:r>
             <w:r>
               <w:rPr>
@@ -3046,7 +3046,7 @@
               <w14:ligatures w14:val="standardContextual"/>
             </w:rPr>
           </w:pPr>
-          <w:hyperlink w:anchor="_Toc241726304" w:history="1">
+          <w:hyperlink w:anchor="_Toc241780210" w:history="1">
             <w:r>
               <w:rPr>
                 <w:rStyle w:val="Hyperlink"/>
@@ -3070,7 +3070,7 @@
               <w:rPr>
                 <w:noProof/>
               </w:rPr>
-              <w:instrText xml:space="preserve"> PAGEREF _Toc241726304 \h </w:instrText>
+              <w:instrText xml:space="preserve"> PAGEREF _Toc241780210 \h </w:instrText>
             </w:r>
             <w:r>
               <w:rPr>
@@ -3113,7 +3113,7 @@
               <w14:ligatures w14:val="standardContextual"/>
             </w:rPr>
           </w:pPr>
-          <w:hyperlink w:anchor="_Toc241726305" w:history="1">
+          <w:hyperlink w:anchor="_Toc241780211" w:history="1">
             <w:r>
               <w:rPr>
                 <w:rStyle w:val="Hyperlink"/>
@@ -3137,7 +3137,7 @@
               <w:rPr>
                 <w:noProof/>
               </w:rPr>
-              <w:instrText xml:space="preserve"> PAGEREF _Toc241726305 \h </w:instrText>
+              <w:instrText xml:space="preserve"> PAGEREF _Toc241780211 \h </w:instrText>
             </w:r>
             <w:r>
               <w:rPr>
@@ -3180,7 +3180,7 @@
               <w14:ligatures w14:val="standardContextual"/>
             </w:rPr>
           </w:pPr>
-          <w:hyperlink w:anchor="_Toc241726306" w:history="1">
+          <w:hyperlink w:anchor="_Toc241780212" w:history="1">
             <w:r>
               <w:rPr>
                 <w:rStyle w:val="Hyperlink"/>
@@ -3204,7 +3204,7 @@
               <w:rPr>
                 <w:noProof/>
               </w:rPr>
-              <w:instrText xml:space="preserve"> PAGEREF _Toc241726306 \h </w:instrText>
+              <w:instrText xml:space="preserve"> PAGEREF _Toc241780212 \h </w:instrText>
             </w:r>
             <w:r>
               <w:rPr>
@@ -3247,7 +3247,7 @@
               <w14:ligatures w14:val="standardContextual"/>
             </w:rPr>
           </w:pPr>
-          <w:hyperlink w:anchor="_Toc241726307" w:history="1">
+          <w:hyperlink w:anchor="_Toc241780213" w:history="1">
             <w:r>
               <w:rPr>
                 <w:rStyle w:val="Hyperlink"/>
@@ -3271,7 +3271,7 @@
               <w:rPr>
                 <w:noProof/>
               </w:rPr>
-              <w:instrText xml:space="preserve"> PAGEREF _Toc241726307 \h </w:instrText>
+              <w:instrText xml:space="preserve"> PAGEREF _Toc241780213 \h </w:instrText>
             </w:r>
             <w:r>
               <w:rPr>
@@ -3314,7 +3314,7 @@
               <w14:ligatures w14:val="standardContextual"/>
             </w:rPr>
           </w:pPr>
-          <w:hyperlink w:anchor="_Toc241726308" w:history="1">
+          <w:hyperlink w:anchor="_Toc241780214" w:history="1">
             <w:r>
               <w:rPr>
                 <w:rStyle w:val="Hyperlink"/>
@@ -3338,7 +3338,7 @@
               <w:rPr>
                 <w:noProof/>
               </w:rPr>
-              <w:instrText xml:space="preserve"> PAGEREF _Toc241726308 \h </w:instrText>
+              <w:instrText xml:space="preserve"> PAGEREF _Toc241780214 \h </w:instrText>
             </w:r>
             <w:r>
               <w:rPr>
@@ -3377,7 +3377,7 @@
         <w:pStyle w:val="Heading1"/>
         <w:pageBreakBefore/>
       </w:pPr>
-      <w:bookmarkStart w:id="0" w:name="_Toc241726267"/>
+      <w:bookmarkStart w:id="0" w:name="_Toc241780173"/>
       <w:r>
         <w:lastRenderedPageBreak/>
         <w:t>1. About this reference</w:t>
@@ -3830,7 +3830,7 @@
         <w:pStyle w:val="Heading1"/>
         <w:pageBreakBefore/>
       </w:pPr>
-      <w:bookmarkStart w:id="1" w:name="_Toc241726268"/>
+      <w:bookmarkStart w:id="1" w:name="_Toc241780174"/>
       <w:r>
         <w:lastRenderedPageBreak/>
         <w:t>2. Rules that apply on every screen</w:t>
@@ -4047,7 +4047,7 @@
         <w:pStyle w:val="Heading1"/>
         <w:pageBreakBefore/>
       </w:pPr>
-      <w:bookmarkStart w:id="2" w:name="_Toc241726269"/>
+      <w:bookmarkStart w:id="2" w:name="_Toc241780175"/>
       <w:r>
         <w:lastRenderedPageBreak/>
         <w:t>3. Who can open which screen</w:t>
@@ -9753,7 +9753,7 @@
         <w:pStyle w:val="Heading1"/>
         <w:pageBreakBefore/>
       </w:pPr>
-      <w:bookmarkStart w:id="3" w:name="_Toc241726270"/>
+      <w:bookmarkStart w:id="3" w:name="_Toc241780176"/>
       <w:r>
         <w:lastRenderedPageBreak/>
         <w:t>4. Signing in and your account</w:t>
@@ -9764,7 +9764,7 @@
       <w:pPr>
         <w:pStyle w:val="Heading2"/>
       </w:pPr>
-      <w:bookmarkStart w:id="4" w:name="_Toc241726271"/>
+      <w:bookmarkStart w:id="4" w:name="_Toc241780177"/>
       <w:r>
         <w:t>4.1 Sign in</w:t>
       </w:r>
@@ -10277,7 +10277,7 @@
       <w:pPr>
         <w:pStyle w:val="Heading2"/>
       </w:pPr>
-      <w:bookmarkStart w:id="5" w:name="_Toc241726272"/>
+      <w:bookmarkStart w:id="5" w:name="_Toc241780178"/>
       <w:r>
         <w:t>4.2 The header and menu bar (every screen)</w:t>
       </w:r>
@@ -11000,7 +11000,7 @@
       <w:pPr>
         <w:pStyle w:val="Heading2"/>
       </w:pPr>
-      <w:bookmarkStart w:id="6" w:name="_Toc241726273"/>
+      <w:bookmarkStart w:id="6" w:name="_Toc241780179"/>
       <w:r>
         <w:lastRenderedPageBreak/>
         <w:t>4.3 Change Password</w:t>
@@ -11622,7 +11622,7 @@
         <w:pStyle w:val="Heading1"/>
         <w:pageBreakBefore/>
       </w:pPr>
-      <w:bookmarkStart w:id="7" w:name="_Toc241726274"/>
+      <w:bookmarkStart w:id="7" w:name="_Toc241780180"/>
       <w:r>
         <w:lastRenderedPageBreak/>
         <w:t>5. Dashboards and Reports (read-only)</w:t>
@@ -11633,7 +11633,7 @@
       <w:pPr>
         <w:pStyle w:val="Heading2"/>
       </w:pPr>
-      <w:bookmarkStart w:id="8" w:name="_Toc241726275"/>
+      <w:bookmarkStart w:id="8" w:name="_Toc241780181"/>
       <w:r>
         <w:t>5.1 Executive Dashboard</w:t>
       </w:r>
@@ -12146,7 +12146,7 @@
       <w:pPr>
         <w:pStyle w:val="Heading2"/>
       </w:pPr>
-      <w:bookmarkStart w:id="9" w:name="_Toc241726276"/>
+      <w:bookmarkStart w:id="9" w:name="_Toc241780182"/>
       <w:r>
         <w:t>5.2 Sampling Dashboard</w:t>
       </w:r>
@@ -12659,7 +12659,7 @@
       <w:pPr>
         <w:pStyle w:val="Heading2"/>
       </w:pPr>
-      <w:bookmarkStart w:id="10" w:name="_Toc241726277"/>
+      <w:bookmarkStart w:id="10" w:name="_Toc241780183"/>
       <w:r>
         <w:t>5.3 Contact Dashboard</w:t>
       </w:r>
@@ -12963,7 +12963,7 @@
       <w:pPr>
         <w:pStyle w:val="Heading2"/>
       </w:pPr>
-      <w:bookmarkStart w:id="11" w:name="_Toc241726278"/>
+      <w:bookmarkStart w:id="11" w:name="_Toc241780184"/>
       <w:r>
         <w:t>5.4 QA Dashboard</w:t>
       </w:r>
@@ -13583,7 +13583,7 @@
       <w:pPr>
         <w:pStyle w:val="Heading2"/>
       </w:pPr>
-      <w:bookmarkStart w:id="12" w:name="_Toc241726279"/>
+      <w:bookmarkStart w:id="12" w:name="_Toc241780185"/>
       <w:r>
         <w:t>5.5 KII / Document Dashboard</w:t>
       </w:r>
@@ -13993,7 +13993,7 @@
       <w:pPr>
         <w:pStyle w:val="Heading2"/>
       </w:pPr>
-      <w:bookmarkStart w:id="13" w:name="_Toc241726280"/>
+      <w:bookmarkStart w:id="13" w:name="_Toc241780186"/>
       <w:r>
         <w:lastRenderedPageBreak/>
         <w:t>5.6 Reports</w:t>
@@ -14508,7 +14508,7 @@
         <w:pStyle w:val="Heading1"/>
         <w:pageBreakBefore/>
       </w:pPr>
-      <w:bookmarkStart w:id="14" w:name="_Toc241726281"/>
+      <w:bookmarkStart w:id="14" w:name="_Toc241780187"/>
       <w:r>
         <w:lastRenderedPageBreak/>
         <w:t>6. The sample and contact</w:t>
@@ -14519,7 +14519,7 @@
       <w:pPr>
         <w:pStyle w:val="Heading2"/>
       </w:pPr>
-      <w:bookmarkStart w:id="15" w:name="_Toc241726282"/>
+      <w:bookmarkStart w:id="15" w:name="_Toc241780188"/>
       <w:r>
         <w:t>6.1 Main-400 Register (and Reserve)</w:t>
       </w:r>
@@ -15452,7 +15452,7 @@
       <w:pPr>
         <w:pStyle w:val="Heading2"/>
       </w:pPr>
-      <w:bookmarkStart w:id="16" w:name="_Toc241726283"/>
+      <w:bookmarkStart w:id="16" w:name="_Toc241780189"/>
       <w:r>
         <w:t>6.2 Case page</w:t>
       </w:r>
@@ -17131,7 +17131,7 @@
       <w:pPr>
         <w:pStyle w:val="Heading2"/>
       </w:pPr>
-      <w:bookmarkStart w:id="17" w:name="_Toc241726284"/>
+      <w:bookmarkStart w:id="17" w:name="_Toc241780190"/>
       <w:r>
         <w:t>6.3 Pre-Interview Profile (PROIT) and its review screen</w:t>
       </w:r>
@@ -18696,7 +18696,7 @@
       <w:pPr>
         <w:pStyle w:val="Heading2"/>
       </w:pPr>
-      <w:bookmarkStart w:id="18" w:name="_Toc241726285"/>
+      <w:bookmarkStart w:id="18" w:name="_Toc241780191"/>
       <w:r>
         <w:t>6.4 Interview sheet (verifying a locked profile)</w:t>
       </w:r>
@@ -19954,7 +19954,7 @@
       <w:pPr>
         <w:pStyle w:val="Heading2"/>
       </w:pPr>
-      <w:bookmarkStart w:id="19" w:name="_Toc241726286"/>
+      <w:bookmarkStart w:id="19" w:name="_Toc241780192"/>
       <w:r>
         <w:t>6.5 Register Organisation</w:t>
       </w:r>
@@ -20677,7 +20677,7 @@
       <w:pPr>
         <w:pStyle w:val="Heading2"/>
       </w:pPr>
-      <w:bookmarkStart w:id="20" w:name="_Toc241726287"/>
+      <w:bookmarkStart w:id="20" w:name="_Toc241780193"/>
       <w:r>
         <w:t>6.6 Appointment Queue</w:t>
       </w:r>
@@ -21298,7 +21298,7 @@
       <w:pPr>
         <w:pStyle w:val="Heading2"/>
       </w:pPr>
-      <w:bookmarkStart w:id="21" w:name="_Toc241726288"/>
+      <w:bookmarkStart w:id="21" w:name="_Toc241780194"/>
       <w:r>
         <w:t>6.7 Follow-ups due</w:t>
       </w:r>
@@ -21811,7 +21811,7 @@
       <w:pPr>
         <w:pStyle w:val="Heading2"/>
       </w:pPr>
-      <w:bookmarkStart w:id="22" w:name="_Toc241726289"/>
+      <w:bookmarkStart w:id="22" w:name="_Toc241780195"/>
       <w:r>
         <w:t>6.8 Reserve Activation</w:t>
       </w:r>
@@ -22433,7 +22433,7 @@
         <w:pStyle w:val="Heading1"/>
         <w:pageBreakBefore/>
       </w:pPr>
-      <w:bookmarkStart w:id="23" w:name="_Toc241726290"/>
+      <w:bookmarkStart w:id="23" w:name="_Toc241780196"/>
       <w:r>
         <w:lastRenderedPageBreak/>
         <w:t>7. Quality checking</w:t>
@@ -22444,7 +22444,7 @@
       <w:pPr>
         <w:pStyle w:val="Heading2"/>
       </w:pPr>
-      <w:bookmarkStart w:id="24" w:name="_Toc241726291"/>
+      <w:bookmarkStart w:id="24" w:name="_Toc241780197"/>
       <w:r>
         <w:t>7.1 QA Queue (with the KoboToolbox sync panel)</w:t>
       </w:r>
@@ -23167,7 +23167,7 @@
       <w:pPr>
         <w:pStyle w:val="Heading2"/>
       </w:pPr>
-      <w:bookmarkStart w:id="25" w:name="_Toc241726292"/>
+      <w:bookmarkStart w:id="25" w:name="_Toc241780198"/>
       <w:r>
         <w:t>7.2 QA Exceptions</w:t>
       </w:r>
@@ -23999,7 +23999,7 @@
         <w:pStyle w:val="Heading1"/>
         <w:pageBreakBefore/>
       </w:pPr>
-      <w:bookmarkStart w:id="26" w:name="_Toc241726293"/>
+      <w:bookmarkStart w:id="26" w:name="_Toc241780199"/>
       <w:r>
         <w:lastRenderedPageBreak/>
         <w:t>8. Key Informant Interviews</w:t>
@@ -24010,7 +24010,7 @@
       <w:pPr>
         <w:pStyle w:val="Heading2"/>
       </w:pPr>
-      <w:bookmarkStart w:id="27" w:name="_Toc241726294"/>
+      <w:bookmarkStart w:id="27" w:name="_Toc241780200"/>
       <w:r>
         <w:t>8.1 KII Register</w:t>
       </w:r>
@@ -24630,7 +24630,7 @@
       <w:pPr>
         <w:pStyle w:val="Heading2"/>
       </w:pPr>
-      <w:bookmarkStart w:id="28" w:name="_Toc241726295"/>
+      <w:bookmarkStart w:id="28" w:name="_Toc241780201"/>
       <w:r>
         <w:t>8.2 New KII Record</w:t>
       </w:r>
@@ -25040,7 +25040,7 @@
       <w:pPr>
         <w:pStyle w:val="Heading2"/>
       </w:pPr>
-      <w:bookmarkStart w:id="29" w:name="_Toc241726296"/>
+      <w:bookmarkStart w:id="29" w:name="_Toc241780202"/>
       <w:r>
         <w:t>8.3 KII record</w:t>
       </w:r>
@@ -26082,7 +26082,7 @@
         <w:pStyle w:val="Heading1"/>
         <w:pageBreakBefore/>
       </w:pPr>
-      <w:bookmarkStart w:id="30" w:name="_Toc241726297"/>
+      <w:bookmarkStart w:id="30" w:name="_Toc241780203"/>
       <w:r>
         <w:lastRenderedPageBreak/>
         <w:t>9. Documentary evidence</w:t>
@@ -26093,7 +26093,7 @@
       <w:pPr>
         <w:pStyle w:val="Heading2"/>
       </w:pPr>
-      <w:bookmarkStart w:id="31" w:name="_Toc241726298"/>
+      <w:bookmarkStart w:id="31" w:name="_Toc241780204"/>
       <w:r>
         <w:t>9.1 Documents (the corpus)</w:t>
       </w:r>
@@ -26713,7 +26713,7 @@
       <w:pPr>
         <w:pStyle w:val="Heading2"/>
       </w:pPr>
-      <w:bookmarkStart w:id="32" w:name="_Toc241726299"/>
+      <w:bookmarkStart w:id="32" w:name="_Toc241780205"/>
       <w:r>
         <w:t>9.2 New Documentary Evidence Record</w:t>
       </w:r>
@@ -27544,7 +27544,7 @@
       <w:pPr>
         <w:pStyle w:val="Heading2"/>
       </w:pPr>
-      <w:bookmarkStart w:id="33" w:name="_Toc241726300"/>
+      <w:bookmarkStart w:id="33" w:name="_Toc241780206"/>
       <w:r>
         <w:t>9.3 Document record</w:t>
       </w:r>
@@ -28898,7 +28898,7 @@
       <w:pPr>
         <w:pStyle w:val="Heading2"/>
       </w:pPr>
-      <w:bookmarkStart w:id="34" w:name="_Toc241726301"/>
+      <w:bookmarkStart w:id="34" w:name="_Toc241780207"/>
       <w:r>
         <w:t>9.4 Auto-fill review screen</w:t>
       </w:r>
@@ -29940,7 +29940,7 @@
         <w:pStyle w:val="Heading1"/>
         <w:pageBreakBefore/>
       </w:pPr>
-      <w:bookmarkStart w:id="35" w:name="_Toc241726302"/>
+      <w:bookmarkStart w:id="35" w:name="_Toc241780208"/>
       <w:r>
         <w:lastRenderedPageBreak/>
         <w:t>10. Completed forms and exports</w:t>
@@ -29951,7 +29951,7 @@
       <w:pPr>
         <w:pStyle w:val="Heading2"/>
       </w:pPr>
-      <w:bookmarkStart w:id="36" w:name="_Toc241726303"/>
+      <w:bookmarkStart w:id="36" w:name="_Toc241780209"/>
       <w:r>
         <w:t>10.1 Completed forms (Form PDFs)</w:t>
       </w:r>
@@ -31217,7 +31217,7 @@
         <w:pStyle w:val="Heading1"/>
         <w:pageBreakBefore/>
       </w:pPr>
-      <w:bookmarkStart w:id="37" w:name="_Toc241726304"/>
+      <w:bookmarkStart w:id="37" w:name="_Toc241780210"/>
       <w:r>
         <w:lastRenderedPageBreak/>
         <w:t>11. Study administration</w:t>
@@ -31228,7 +31228,7 @@
       <w:pPr>
         <w:pStyle w:val="Heading2"/>
       </w:pPr>
-      <w:bookmarkStart w:id="38" w:name="_Toc241726305"/>
+      <w:bookmarkStart w:id="38" w:name="_Toc241780211"/>
       <w:r>
         <w:t>11.1 Cost Dashboard</w:t>
       </w:r>
@@ -31638,7 +31638,7 @@
       <w:pPr>
         <w:pStyle w:val="Heading2"/>
       </w:pPr>
-      <w:bookmarkStart w:id="39" w:name="_Toc241726306"/>
+      <w:bookmarkStart w:id="39" w:name="_Toc241780212"/>
       <w:r>
         <w:t>11.2 Audit Log</w:t>
       </w:r>
@@ -32048,7 +32048,7 @@
       <w:pPr>
         <w:pStyle w:val="Heading2"/>
       </w:pPr>
-      <w:bookmarkStart w:id="40" w:name="_Toc241726307"/>
+      <w:bookmarkStart w:id="40" w:name="_Toc241780213"/>
       <w:r>
         <w:t>11.3 Research Clearance</w:t>
       </w:r>
@@ -32879,7 +32879,7 @@
       <w:pPr>
         <w:pStyle w:val="Heading2"/>
       </w:pPr>
-      <w:bookmarkStart w:id="41" w:name="_Toc241726308"/>
+      <w:bookmarkStart w:id="41" w:name="_Toc241780214"/>
       <w:r>
         <w:t>11.4 Export</w:t>
       </w:r>
@@ -33544,7 +33544,7 @@
         <w:sz w:val="16"/>
         <w:szCs w:val="16"/>
       </w:rPr>
-      <w:t>Version 1.13 · 1 October 2026</w:t>
+      <w:t>Version 1.14 · 1 October 2026</w:t>
     </w:r>
     <w:r>
       <w:rPr>
@@ -33717,10 +33717,10 @@
 <file path=word/numbering.xml><?xml version="1.0" encoding="utf-8"?>
 <w:numbering xmlns:wpc="http://schemas.microsoft.com/office/word/2010/wordprocessingCanvas" xmlns:cx="http://schemas.microsoft.com/office/drawing/2014/chartex" xmlns:cx1="http://schemas.microsoft.com/office/drawing/2015/9/8/chartex" xmlns:cx2="http://schemas.microsoft.com/office/drawing/2015/10/21/chartex" xmlns:cx3="http://schemas.microsoft.com/office/drawing/2016/5/9/chartex" xmlns:cx4="http://schemas.microsoft.com/office/drawing/2016/5/10/chartex" xmlns:cx5="http://schemas.microsoft.com/office/drawing/2016/5/11/chartex" xmlns:cx6="http://schemas.microsoft.com/office/drawing/2016/5/12/chartex" xmlns:cx7="http://schemas.microsoft.com/office/drawing/2016/5/13/chartex" xmlns:cx8="http://schemas.microsoft.com/office/drawing/2016/5/14/chartex" xmlns:mc="http://schemas.openxmlformats.org/markup-compatibility/2006" xmlns:aink="http://schemas.microsoft.com/office/drawing/2016/ink" xmlns:am3d="http://schemas.microsoft.com/office/drawing/2017/model3d" xmlns:o="urn:schemas-microsoft-com:office:office" xmlns:oel="http://schemas.microsoft.com/office/2019/extlst" xmlns:r="http://schemas.openxmlformats.org/officeDocument/2006/relationships" xmlns:m="http://schemas.openxmlformats.org/officeDocument/2006/math" xmlns:v="urn:schemas-microsoft-com:vml" xmlns:wp14="http://schemas.microsoft.com/office/word/2010/wordprocessingDrawing" xmlns:wp="http://schemas.openxmlformats.org/drawingml/2006/wordprocessingDrawing" xmlns:w10="urn:schemas-microsoft-com:office:word" xmlns:w="http://schemas.openxmlformats.org/wordprocessingml/2006/main" xmlns:w14="http://schemas.microsoft.com/office/word/2010/wordml" xmlns:w15="http://schemas.microsoft.com/office/word/2012/wordml" xmlns:w16cex="http://schemas.microsoft.com/office/word/2018/wordml/cex" xmlns:w16cid="http://schemas.microsoft.com/office/word/2016/wordml/cid" xmlns:w16="http://schemas.microsoft.com/office/word/2018/wordml" xmlns:w16sdtdh="http://schemas.microsoft.com/office/word/2020/wordml/sdtdatahash" xmlns:w16se="http://schemas.microsoft.com/office/word/2015/wordml/symex" xmlns:wpg="http://schemas.microsoft.com/office/word/2010/wordprocessingGroup" xmlns:wpi="http://schemas.microsoft.com/office/word/2010/wordprocessingInk" xmlns:wne="http://schemas.microsoft.com/office/word/2006/wordml" xmlns:wps="http://schemas.microsoft.com/office/word/2010/wordprocessingShape" mc:Ignorable="w14 w15 w16se w16cid w16 w16cex w16sdtdh wp14">
   <w:abstractNum w:abstractNumId="0" w15:restartNumberingAfterBreak="0">
-    <w:nsid w:val="1D1B5CF4"/>
+    <w:nsid w:val="04846D04"/>
     <w:multiLevelType w:val="hybridMultilevel"/>
-    <w:tmpl w:val="6AEA167E"/>
-    <w:lvl w:ilvl="0" w:tplc="3F20374A">
+    <w:tmpl w:val="1B90C862"/>
+    <w:lvl w:ilvl="0" w:tplc="F1B416F8">
       <w:start w:val="1"/>
       <w:numFmt w:val="bullet"/>
       <w:lvlText w:val="•"/>
@@ -33729,7 +33729,7 @@
         <w:ind w:left="460" w:hanging="280"/>
       </w:pPr>
     </w:lvl>
-    <w:lvl w:ilvl="1" w:tplc="94B8C21E">
+    <w:lvl w:ilvl="1" w:tplc="A806938E">
       <w:start w:val="1"/>
       <w:numFmt w:val="bullet"/>
       <w:lvlText w:val="–"/>
@@ -33738,47 +33738,47 @@
         <w:ind w:left="900" w:hanging="280"/>
       </w:pPr>
     </w:lvl>
-    <w:lvl w:ilvl="2" w:tplc="772AF526">
+    <w:lvl w:ilvl="2" w:tplc="410CCA54">
       <w:numFmt w:val="decimal"/>
       <w:lvlText w:val=""/>
       <w:lvlJc w:val="left"/>
     </w:lvl>
-    <w:lvl w:ilvl="3" w:tplc="4DE82988">
+    <w:lvl w:ilvl="3" w:tplc="9C76C902">
       <w:numFmt w:val="decimal"/>
       <w:lvlText w:val=""/>
       <w:lvlJc w:val="left"/>
     </w:lvl>
-    <w:lvl w:ilvl="4" w:tplc="A1247190">
+    <w:lvl w:ilvl="4" w:tplc="DCD434B2">
       <w:numFmt w:val="decimal"/>
       <w:lvlText w:val=""/>
       <w:lvlJc w:val="left"/>
     </w:lvl>
-    <w:lvl w:ilvl="5" w:tplc="3A005DCA">
+    <w:lvl w:ilvl="5" w:tplc="1672617C">
       <w:numFmt w:val="decimal"/>
       <w:lvlText w:val=""/>
       <w:lvlJc w:val="left"/>
     </w:lvl>
-    <w:lvl w:ilvl="6" w:tplc="6452365E">
+    <w:lvl w:ilvl="6" w:tplc="602CCD14">
       <w:numFmt w:val="decimal"/>
       <w:lvlText w:val=""/>
       <w:lvlJc w:val="left"/>
     </w:lvl>
-    <w:lvl w:ilvl="7" w:tplc="047673FC">
+    <w:lvl w:ilvl="7" w:tplc="17F4754C">
       <w:numFmt w:val="decimal"/>
       <w:lvlText w:val=""/>
       <w:lvlJc w:val="left"/>
     </w:lvl>
-    <w:lvl w:ilvl="8" w:tplc="2D42BA40">
+    <w:lvl w:ilvl="8" w:tplc="604005DA">
       <w:numFmt w:val="decimal"/>
       <w:lvlText w:val=""/>
       <w:lvlJc w:val="left"/>
     </w:lvl>
   </w:abstractNum>
   <w:abstractNum w:abstractNumId="1" w15:restartNumberingAfterBreak="0">
-    <w:nsid w:val="57FE0242"/>
+    <w:nsid w:val="0F097AB6"/>
     <w:multiLevelType w:val="hybridMultilevel"/>
-    <w:tmpl w:val="7EC6CED0"/>
-    <w:lvl w:ilvl="0" w:tplc="89C00528">
+    <w:tmpl w:val="F170E376"/>
+    <w:lvl w:ilvl="0" w:tplc="C8DE72D6">
       <w:start w:val="1"/>
       <w:numFmt w:val="bullet"/>
       <w:lvlText w:val="●"/>
@@ -33787,7 +33787,7 @@
         <w:ind w:left="720" w:hanging="360"/>
       </w:pPr>
     </w:lvl>
-    <w:lvl w:ilvl="1" w:tplc="38EADEF2">
+    <w:lvl w:ilvl="1" w:tplc="E4B0CD14">
       <w:start w:val="1"/>
       <w:numFmt w:val="bullet"/>
       <w:lvlText w:val="○"/>
@@ -33796,7 +33796,7 @@
         <w:ind w:left="1440" w:hanging="360"/>
       </w:pPr>
     </w:lvl>
-    <w:lvl w:ilvl="2" w:tplc="75D288BE">
+    <w:lvl w:ilvl="2" w:tplc="0CE89346">
       <w:start w:val="1"/>
       <w:numFmt w:val="bullet"/>
       <w:lvlText w:val="■"/>
@@ -33805,7 +33805,7 @@
         <w:ind w:left="2160" w:hanging="360"/>
       </w:pPr>
     </w:lvl>
-    <w:lvl w:ilvl="3" w:tplc="5066AB3A">
+    <w:lvl w:ilvl="3" w:tplc="7868AE2E">
       <w:start w:val="1"/>
       <w:numFmt w:val="bullet"/>
       <w:lvlText w:val="●"/>
@@ -33814,7 +33814,7 @@
         <w:ind w:left="2880" w:hanging="360"/>
       </w:pPr>
     </w:lvl>
-    <w:lvl w:ilvl="4" w:tplc="7FBCEF08">
+    <w:lvl w:ilvl="4" w:tplc="BACE2498">
       <w:start w:val="1"/>
       <w:numFmt w:val="bullet"/>
       <w:lvlText w:val="○"/>
@@ -33823,7 +33823,7 @@
         <w:ind w:left="3600" w:hanging="360"/>
       </w:pPr>
     </w:lvl>
-    <w:lvl w:ilvl="5" w:tplc="A5727A86">
+    <w:lvl w:ilvl="5" w:tplc="5ACA4E32">
       <w:start w:val="1"/>
       <w:numFmt w:val="bullet"/>
       <w:lvlText w:val="■"/>
@@ -33832,7 +33832,7 @@
         <w:ind w:left="4320" w:hanging="360"/>
       </w:pPr>
     </w:lvl>
-    <w:lvl w:ilvl="6" w:tplc="C7C08D88">
+    <w:lvl w:ilvl="6" w:tplc="5FF49BA8">
       <w:start w:val="1"/>
       <w:numFmt w:val="bullet"/>
       <w:lvlText w:val="●"/>
@@ -33841,7 +33841,7 @@
         <w:ind w:left="5040" w:hanging="360"/>
       </w:pPr>
     </w:lvl>
-    <w:lvl w:ilvl="7" w:tplc="2A8A6060">
+    <w:lvl w:ilvl="7" w:tplc="16225A10">
       <w:start w:val="1"/>
       <w:numFmt w:val="bullet"/>
       <w:lvlText w:val="●"/>
@@ -33850,7 +33850,7 @@
         <w:ind w:left="5760" w:hanging="360"/>
       </w:pPr>
     </w:lvl>
-    <w:lvl w:ilvl="8" w:tplc="B71AFEBA">
+    <w:lvl w:ilvl="8" w:tplc="796206E6">
       <w:start w:val="1"/>
       <w:numFmt w:val="bullet"/>
       <w:lvlText w:val="●"/>
@@ -33860,13 +33860,13 @@
       </w:pPr>
     </w:lvl>
   </w:abstractNum>
-  <w:num w:numId="1" w16cid:durableId="907492532">
+  <w:num w:numId="1" w16cid:durableId="229537860">
     <w:abstractNumId w:val="1"/>
     <w:lvlOverride w:ilvl="0">
       <w:startOverride w:val="1"/>
     </w:lvlOverride>
   </w:num>
-  <w:num w:numId="2" w16cid:durableId="1512795275">
+  <w:num w:numId="2" w16cid:durableId="1877042302">
     <w:abstractNumId w:val="0"/>
     <w:lvlOverride w:ilvl="0">
       <w:startOverride w:val="1"/>
@@ -34492,7 +34492,7 @@
     <w:autoRedefine/>
     <w:uiPriority w:val="39"/>
     <w:unhideWhenUsed/>
-    <w:rsid w:val="00736FA6"/>
+    <w:rsid w:val="00B6694E"/>
     <w:pPr>
       <w:spacing w:after="100"/>
     </w:pPr>
@@ -34504,7 +34504,7 @@
     <w:autoRedefine/>
     <w:uiPriority w:val="39"/>
     <w:unhideWhenUsed/>
-    <w:rsid w:val="00736FA6"/>
+    <w:rsid w:val="00B6694E"/>
     <w:pPr>
       <w:spacing w:after="100"/>
       <w:ind w:left="210"/>

</xml_diff>

<commit_message>
docs: give the PI/Admin role guide its own missing procedures (v1.16)
Checked all 8 role guides against their own "You can" lists. Role Guide
1's list claims the PI can do everything the Field Coordinator can --
register organisations, invite, manage KII and document records, log
costs -- but its task list never included T.registerOrg, T.respondents,
T.invite, T.kii, T.documents or T.cost, so none of those procedures
(including the organisation/KII correction sections added in the
previous commit) actually appeared in the guide. Added the same shared
tasks.js blocks Role Guide 2 already uses; no new content written.

Co-Authored-By: Claude Sonnet 5 <noreply@anthropic.com>
</commit_message>
<xml_diff>
--- a/docs/manuals/ABF-FST_Screen_and_Button_Reference.docx
+++ b/docs/manuals/ABF-FST_Screen_and_Button_Reference.docx
@@ -469,7 +469,7 @@
                 <w:sz w:val="19"/>
                 <w:szCs w:val="19"/>
               </w:rPr>
-              <w:t>Version 1.15 · 1 October 2026</w:t>
+              <w:t>Version 1.16 · 1 October 2026</w:t>
             </w:r>
           </w:p>
         </w:tc>
@@ -538,7 +538,7 @@
     <w:sdt>
       <w:sdtPr>
         <w:alias w:val="Contents"/>
-        <w:id w:val="698975658"/>
+        <w:id w:val="1018899935"/>
       </w:sdtPr>
       <w:sdtEndPr/>
       <w:sdtContent>
@@ -567,7 +567,7 @@
           <w:r>
             <w:fldChar w:fldCharType="separate"/>
           </w:r>
-          <w:hyperlink w:anchor="_Toc241781236" w:history="1">
+          <w:hyperlink w:anchor="_Toc241781728" w:history="1">
             <w:r>
               <w:rPr>
                 <w:rStyle w:val="Hyperlink"/>
@@ -591,7 +591,7 @@
               <w:rPr>
                 <w:noProof/>
               </w:rPr>
-              <w:instrText xml:space="preserve"> PAGEREF _Toc241781236 \h </w:instrText>
+              <w:instrText xml:space="preserve"> PAGEREF _Toc241781728 \h </w:instrText>
             </w:r>
             <w:r>
               <w:rPr>
@@ -634,7 +634,7 @@
               <w14:ligatures w14:val="standardContextual"/>
             </w:rPr>
           </w:pPr>
-          <w:hyperlink w:anchor="_Toc241781237" w:history="1">
+          <w:hyperlink w:anchor="_Toc241781729" w:history="1">
             <w:r>
               <w:rPr>
                 <w:rStyle w:val="Hyperlink"/>
@@ -658,7 +658,7 @@
               <w:rPr>
                 <w:noProof/>
               </w:rPr>
-              <w:instrText xml:space="preserve"> PAGEREF _Toc241781237 \h </w:instrText>
+              <w:instrText xml:space="preserve"> PAGEREF _Toc241781729 \h </w:instrText>
             </w:r>
             <w:r>
               <w:rPr>
@@ -701,7 +701,7 @@
               <w14:ligatures w14:val="standardContextual"/>
             </w:rPr>
           </w:pPr>
-          <w:hyperlink w:anchor="_Toc241781238" w:history="1">
+          <w:hyperlink w:anchor="_Toc241781730" w:history="1">
             <w:r>
               <w:rPr>
                 <w:rStyle w:val="Hyperlink"/>
@@ -725,7 +725,7 @@
               <w:rPr>
                 <w:noProof/>
               </w:rPr>
-              <w:instrText xml:space="preserve"> PAGEREF _Toc241781238 \h </w:instrText>
+              <w:instrText xml:space="preserve"> PAGEREF _Toc241781730 \h </w:instrText>
             </w:r>
             <w:r>
               <w:rPr>
@@ -768,7 +768,7 @@
               <w14:ligatures w14:val="standardContextual"/>
             </w:rPr>
           </w:pPr>
-          <w:hyperlink w:anchor="_Toc241781239" w:history="1">
+          <w:hyperlink w:anchor="_Toc241781731" w:history="1">
             <w:r>
               <w:rPr>
                 <w:rStyle w:val="Hyperlink"/>
@@ -792,7 +792,7 @@
               <w:rPr>
                 <w:noProof/>
               </w:rPr>
-              <w:instrText xml:space="preserve"> PAGEREF _Toc241781239 \h </w:instrText>
+              <w:instrText xml:space="preserve"> PAGEREF _Toc241781731 \h </w:instrText>
             </w:r>
             <w:r>
               <w:rPr>
@@ -835,7 +835,7 @@
               <w14:ligatures w14:val="standardContextual"/>
             </w:rPr>
           </w:pPr>
-          <w:hyperlink w:anchor="_Toc241781240" w:history="1">
+          <w:hyperlink w:anchor="_Toc241781732" w:history="1">
             <w:r>
               <w:rPr>
                 <w:rStyle w:val="Hyperlink"/>
@@ -859,7 +859,7 @@
               <w:rPr>
                 <w:noProof/>
               </w:rPr>
-              <w:instrText xml:space="preserve"> PAGEREF _Toc241781240 \h </w:instrText>
+              <w:instrText xml:space="preserve"> PAGEREF _Toc241781732 \h </w:instrText>
             </w:r>
             <w:r>
               <w:rPr>
@@ -902,7 +902,7 @@
               <w14:ligatures w14:val="standardContextual"/>
             </w:rPr>
           </w:pPr>
-          <w:hyperlink w:anchor="_Toc241781241" w:history="1">
+          <w:hyperlink w:anchor="_Toc241781733" w:history="1">
             <w:r>
               <w:rPr>
                 <w:rStyle w:val="Hyperlink"/>
@@ -926,7 +926,7 @@
               <w:rPr>
                 <w:noProof/>
               </w:rPr>
-              <w:instrText xml:space="preserve"> PAGEREF _Toc241781241 \h </w:instrText>
+              <w:instrText xml:space="preserve"> PAGEREF _Toc241781733 \h </w:instrText>
             </w:r>
             <w:r>
               <w:rPr>
@@ -969,7 +969,7 @@
               <w14:ligatures w14:val="standardContextual"/>
             </w:rPr>
           </w:pPr>
-          <w:hyperlink w:anchor="_Toc241781242" w:history="1">
+          <w:hyperlink w:anchor="_Toc241781734" w:history="1">
             <w:r>
               <w:rPr>
                 <w:rStyle w:val="Hyperlink"/>
@@ -993,7 +993,7 @@
               <w:rPr>
                 <w:noProof/>
               </w:rPr>
-              <w:instrText xml:space="preserve"> PAGEREF _Toc241781242 \h </w:instrText>
+              <w:instrText xml:space="preserve"> PAGEREF _Toc241781734 \h </w:instrText>
             </w:r>
             <w:r>
               <w:rPr>
@@ -1036,7 +1036,7 @@
               <w14:ligatures w14:val="standardContextual"/>
             </w:rPr>
           </w:pPr>
-          <w:hyperlink w:anchor="_Toc241781243" w:history="1">
+          <w:hyperlink w:anchor="_Toc241781735" w:history="1">
             <w:r>
               <w:rPr>
                 <w:rStyle w:val="Hyperlink"/>
@@ -1060,7 +1060,7 @@
               <w:rPr>
                 <w:noProof/>
               </w:rPr>
-              <w:instrText xml:space="preserve"> PAGEREF _Toc241781243 \h </w:instrText>
+              <w:instrText xml:space="preserve"> PAGEREF _Toc241781735 \h </w:instrText>
             </w:r>
             <w:r>
               <w:rPr>
@@ -1103,7 +1103,7 @@
               <w14:ligatures w14:val="standardContextual"/>
             </w:rPr>
           </w:pPr>
-          <w:hyperlink w:anchor="_Toc241781244" w:history="1">
+          <w:hyperlink w:anchor="_Toc241781736" w:history="1">
             <w:r>
               <w:rPr>
                 <w:rStyle w:val="Hyperlink"/>
@@ -1127,7 +1127,7 @@
               <w:rPr>
                 <w:noProof/>
               </w:rPr>
-              <w:instrText xml:space="preserve"> PAGEREF _Toc241781244 \h </w:instrText>
+              <w:instrText xml:space="preserve"> PAGEREF _Toc241781736 \h </w:instrText>
             </w:r>
             <w:r>
               <w:rPr>
@@ -1170,7 +1170,7 @@
               <w14:ligatures w14:val="standardContextual"/>
             </w:rPr>
           </w:pPr>
-          <w:hyperlink w:anchor="_Toc241781245" w:history="1">
+          <w:hyperlink w:anchor="_Toc241781737" w:history="1">
             <w:r>
               <w:rPr>
                 <w:rStyle w:val="Hyperlink"/>
@@ -1194,7 +1194,7 @@
               <w:rPr>
                 <w:noProof/>
               </w:rPr>
-              <w:instrText xml:space="preserve"> PAGEREF _Toc241781245 \h </w:instrText>
+              <w:instrText xml:space="preserve"> PAGEREF _Toc241781737 \h </w:instrText>
             </w:r>
             <w:r>
               <w:rPr>
@@ -1237,7 +1237,7 @@
               <w14:ligatures w14:val="standardContextual"/>
             </w:rPr>
           </w:pPr>
-          <w:hyperlink w:anchor="_Toc241781246" w:history="1">
+          <w:hyperlink w:anchor="_Toc241781738" w:history="1">
             <w:r>
               <w:rPr>
                 <w:rStyle w:val="Hyperlink"/>
@@ -1261,7 +1261,7 @@
               <w:rPr>
                 <w:noProof/>
               </w:rPr>
-              <w:instrText xml:space="preserve"> PAGEREF _Toc241781246 \h </w:instrText>
+              <w:instrText xml:space="preserve"> PAGEREF _Toc241781738 \h </w:instrText>
             </w:r>
             <w:r>
               <w:rPr>
@@ -1304,7 +1304,7 @@
               <w14:ligatures w14:val="standardContextual"/>
             </w:rPr>
           </w:pPr>
-          <w:hyperlink w:anchor="_Toc241781247" w:history="1">
+          <w:hyperlink w:anchor="_Toc241781739" w:history="1">
             <w:r>
               <w:rPr>
                 <w:rStyle w:val="Hyperlink"/>
@@ -1328,7 +1328,7 @@
               <w:rPr>
                 <w:noProof/>
               </w:rPr>
-              <w:instrText xml:space="preserve"> PAGEREF _Toc241781247 \h </w:instrText>
+              <w:instrText xml:space="preserve"> PAGEREF _Toc241781739 \h </w:instrText>
             </w:r>
             <w:r>
               <w:rPr>
@@ -1371,7 +1371,7 @@
               <w14:ligatures w14:val="standardContextual"/>
             </w:rPr>
           </w:pPr>
-          <w:hyperlink w:anchor="_Toc241781248" w:history="1">
+          <w:hyperlink w:anchor="_Toc241781740" w:history="1">
             <w:r>
               <w:rPr>
                 <w:rStyle w:val="Hyperlink"/>
@@ -1395,7 +1395,7 @@
               <w:rPr>
                 <w:noProof/>
               </w:rPr>
-              <w:instrText xml:space="preserve"> PAGEREF _Toc241781248 \h </w:instrText>
+              <w:instrText xml:space="preserve"> PAGEREF _Toc241781740 \h </w:instrText>
             </w:r>
             <w:r>
               <w:rPr>
@@ -1438,7 +1438,7 @@
               <w14:ligatures w14:val="standardContextual"/>
             </w:rPr>
           </w:pPr>
-          <w:hyperlink w:anchor="_Toc241781249" w:history="1">
+          <w:hyperlink w:anchor="_Toc241781741" w:history="1">
             <w:r>
               <w:rPr>
                 <w:rStyle w:val="Hyperlink"/>
@@ -1462,7 +1462,7 @@
               <w:rPr>
                 <w:noProof/>
               </w:rPr>
-              <w:instrText xml:space="preserve"> PAGEREF _Toc241781249 \h </w:instrText>
+              <w:instrText xml:space="preserve"> PAGEREF _Toc241781741 \h </w:instrText>
             </w:r>
             <w:r>
               <w:rPr>
@@ -1505,7 +1505,7 @@
               <w14:ligatures w14:val="standardContextual"/>
             </w:rPr>
           </w:pPr>
-          <w:hyperlink w:anchor="_Toc241781250" w:history="1">
+          <w:hyperlink w:anchor="_Toc241781742" w:history="1">
             <w:r>
               <w:rPr>
                 <w:rStyle w:val="Hyperlink"/>
@@ -1529,7 +1529,7 @@
               <w:rPr>
                 <w:noProof/>
               </w:rPr>
-              <w:instrText xml:space="preserve"> PAGEREF _Toc241781250 \h </w:instrText>
+              <w:instrText xml:space="preserve"> PAGEREF _Toc241781742 \h </w:instrText>
             </w:r>
             <w:r>
               <w:rPr>
@@ -1572,7 +1572,7 @@
               <w14:ligatures w14:val="standardContextual"/>
             </w:rPr>
           </w:pPr>
-          <w:hyperlink w:anchor="_Toc241781251" w:history="1">
+          <w:hyperlink w:anchor="_Toc241781743" w:history="1">
             <w:r>
               <w:rPr>
                 <w:rStyle w:val="Hyperlink"/>
@@ -1596,7 +1596,7 @@
               <w:rPr>
                 <w:noProof/>
               </w:rPr>
-              <w:instrText xml:space="preserve"> PAGEREF _Toc241781251 \h </w:instrText>
+              <w:instrText xml:space="preserve"> PAGEREF _Toc241781743 \h </w:instrText>
             </w:r>
             <w:r>
               <w:rPr>
@@ -1639,7 +1639,7 @@
               <w14:ligatures w14:val="standardContextual"/>
             </w:rPr>
           </w:pPr>
-          <w:hyperlink w:anchor="_Toc241781252" w:history="1">
+          <w:hyperlink w:anchor="_Toc241781744" w:history="1">
             <w:r>
               <w:rPr>
                 <w:rStyle w:val="Hyperlink"/>
@@ -1663,7 +1663,7 @@
               <w:rPr>
                 <w:noProof/>
               </w:rPr>
-              <w:instrText xml:space="preserve"> PAGEREF _Toc241781252 \h </w:instrText>
+              <w:instrText xml:space="preserve"> PAGEREF _Toc241781744 \h </w:instrText>
             </w:r>
             <w:r>
               <w:rPr>
@@ -1706,7 +1706,7 @@
               <w14:ligatures w14:val="standardContextual"/>
             </w:rPr>
           </w:pPr>
-          <w:hyperlink w:anchor="_Toc241781253" w:history="1">
+          <w:hyperlink w:anchor="_Toc241781745" w:history="1">
             <w:r>
               <w:rPr>
                 <w:rStyle w:val="Hyperlink"/>
@@ -1730,7 +1730,7 @@
               <w:rPr>
                 <w:noProof/>
               </w:rPr>
-              <w:instrText xml:space="preserve"> PAGEREF _Toc241781253 \h </w:instrText>
+              <w:instrText xml:space="preserve"> PAGEREF _Toc241781745 \h </w:instrText>
             </w:r>
             <w:r>
               <w:rPr>
@@ -1773,7 +1773,7 @@
               <w14:ligatures w14:val="standardContextual"/>
             </w:rPr>
           </w:pPr>
-          <w:hyperlink w:anchor="_Toc241781254" w:history="1">
+          <w:hyperlink w:anchor="_Toc241781746" w:history="1">
             <w:r>
               <w:rPr>
                 <w:rStyle w:val="Hyperlink"/>
@@ -1797,7 +1797,7 @@
               <w:rPr>
                 <w:noProof/>
               </w:rPr>
-              <w:instrText xml:space="preserve"> PAGEREF _Toc241781254 \h </w:instrText>
+              <w:instrText xml:space="preserve"> PAGEREF _Toc241781746 \h </w:instrText>
             </w:r>
             <w:r>
               <w:rPr>
@@ -1840,7 +1840,7 @@
               <w14:ligatures w14:val="standardContextual"/>
             </w:rPr>
           </w:pPr>
-          <w:hyperlink w:anchor="_Toc241781255" w:history="1">
+          <w:hyperlink w:anchor="_Toc241781747" w:history="1">
             <w:r>
               <w:rPr>
                 <w:rStyle w:val="Hyperlink"/>
@@ -1864,7 +1864,7 @@
               <w:rPr>
                 <w:noProof/>
               </w:rPr>
-              <w:instrText xml:space="preserve"> PAGEREF _Toc241781255 \h </w:instrText>
+              <w:instrText xml:space="preserve"> PAGEREF _Toc241781747 \h </w:instrText>
             </w:r>
             <w:r>
               <w:rPr>
@@ -1907,7 +1907,7 @@
               <w14:ligatures w14:val="standardContextual"/>
             </w:rPr>
           </w:pPr>
-          <w:hyperlink w:anchor="_Toc241781256" w:history="1">
+          <w:hyperlink w:anchor="_Toc241781748" w:history="1">
             <w:r>
               <w:rPr>
                 <w:rStyle w:val="Hyperlink"/>
@@ -1931,7 +1931,7 @@
               <w:rPr>
                 <w:noProof/>
               </w:rPr>
-              <w:instrText xml:space="preserve"> PAGEREF _Toc241781256 \h </w:instrText>
+              <w:instrText xml:space="preserve"> PAGEREF _Toc241781748 \h </w:instrText>
             </w:r>
             <w:r>
               <w:rPr>
@@ -1974,7 +1974,7 @@
               <w14:ligatures w14:val="standardContextual"/>
             </w:rPr>
           </w:pPr>
-          <w:hyperlink w:anchor="_Toc241781257" w:history="1">
+          <w:hyperlink w:anchor="_Toc241781749" w:history="1">
             <w:r>
               <w:rPr>
                 <w:rStyle w:val="Hyperlink"/>
@@ -1998,7 +1998,7 @@
               <w:rPr>
                 <w:noProof/>
               </w:rPr>
-              <w:instrText xml:space="preserve"> PAGEREF _Toc241781257 \h </w:instrText>
+              <w:instrText xml:space="preserve"> PAGEREF _Toc241781749 \h </w:instrText>
             </w:r>
             <w:r>
               <w:rPr>
@@ -2041,7 +2041,7 @@
               <w14:ligatures w14:val="standardContextual"/>
             </w:rPr>
           </w:pPr>
-          <w:hyperlink w:anchor="_Toc241781258" w:history="1">
+          <w:hyperlink w:anchor="_Toc241781750" w:history="1">
             <w:r>
               <w:rPr>
                 <w:rStyle w:val="Hyperlink"/>
@@ -2065,7 +2065,7 @@
               <w:rPr>
                 <w:noProof/>
               </w:rPr>
-              <w:instrText xml:space="preserve"> PAGEREF _Toc241781258 \h </w:instrText>
+              <w:instrText xml:space="preserve"> PAGEREF _Toc241781750 \h </w:instrText>
             </w:r>
             <w:r>
               <w:rPr>
@@ -2108,7 +2108,7 @@
               <w14:ligatures w14:val="standardContextual"/>
             </w:rPr>
           </w:pPr>
-          <w:hyperlink w:anchor="_Toc241781259" w:history="1">
+          <w:hyperlink w:anchor="_Toc241781751" w:history="1">
             <w:r>
               <w:rPr>
                 <w:rStyle w:val="Hyperlink"/>
@@ -2132,7 +2132,7 @@
               <w:rPr>
                 <w:noProof/>
               </w:rPr>
-              <w:instrText xml:space="preserve"> PAGEREF _Toc241781259 \h </w:instrText>
+              <w:instrText xml:space="preserve"> PAGEREF _Toc241781751 \h </w:instrText>
             </w:r>
             <w:r>
               <w:rPr>
@@ -2175,7 +2175,7 @@
               <w14:ligatures w14:val="standardContextual"/>
             </w:rPr>
           </w:pPr>
-          <w:hyperlink w:anchor="_Toc241781260" w:history="1">
+          <w:hyperlink w:anchor="_Toc241781752" w:history="1">
             <w:r>
               <w:rPr>
                 <w:rStyle w:val="Hyperlink"/>
@@ -2199,7 +2199,7 @@
               <w:rPr>
                 <w:noProof/>
               </w:rPr>
-              <w:instrText xml:space="preserve"> PAGEREF _Toc241781260 \h </w:instrText>
+              <w:instrText xml:space="preserve"> PAGEREF _Toc241781752 \h </w:instrText>
             </w:r>
             <w:r>
               <w:rPr>
@@ -2242,7 +2242,7 @@
               <w14:ligatures w14:val="standardContextual"/>
             </w:rPr>
           </w:pPr>
-          <w:hyperlink w:anchor="_Toc241781261" w:history="1">
+          <w:hyperlink w:anchor="_Toc241781753" w:history="1">
             <w:r>
               <w:rPr>
                 <w:rStyle w:val="Hyperlink"/>
@@ -2266,7 +2266,7 @@
               <w:rPr>
                 <w:noProof/>
               </w:rPr>
-              <w:instrText xml:space="preserve"> PAGEREF _Toc241781261 \h </w:instrText>
+              <w:instrText xml:space="preserve"> PAGEREF _Toc241781753 \h </w:instrText>
             </w:r>
             <w:r>
               <w:rPr>
@@ -2309,7 +2309,7 @@
               <w14:ligatures w14:val="standardContextual"/>
             </w:rPr>
           </w:pPr>
-          <w:hyperlink w:anchor="_Toc241781262" w:history="1">
+          <w:hyperlink w:anchor="_Toc241781754" w:history="1">
             <w:r>
               <w:rPr>
                 <w:rStyle w:val="Hyperlink"/>
@@ -2333,7 +2333,7 @@
               <w:rPr>
                 <w:noProof/>
               </w:rPr>
-              <w:instrText xml:space="preserve"> PAGEREF _Toc241781262 \h </w:instrText>
+              <w:instrText xml:space="preserve"> PAGEREF _Toc241781754 \h </w:instrText>
             </w:r>
             <w:r>
               <w:rPr>
@@ -2376,7 +2376,7 @@
               <w14:ligatures w14:val="standardContextual"/>
             </w:rPr>
           </w:pPr>
-          <w:hyperlink w:anchor="_Toc241781263" w:history="1">
+          <w:hyperlink w:anchor="_Toc241781755" w:history="1">
             <w:r>
               <w:rPr>
                 <w:rStyle w:val="Hyperlink"/>
@@ -2400,7 +2400,7 @@
               <w:rPr>
                 <w:noProof/>
               </w:rPr>
-              <w:instrText xml:space="preserve"> PAGEREF _Toc241781263 \h </w:instrText>
+              <w:instrText xml:space="preserve"> PAGEREF _Toc241781755 \h </w:instrText>
             </w:r>
             <w:r>
               <w:rPr>
@@ -2443,7 +2443,7 @@
               <w14:ligatures w14:val="standardContextual"/>
             </w:rPr>
           </w:pPr>
-          <w:hyperlink w:anchor="_Toc241781264" w:history="1">
+          <w:hyperlink w:anchor="_Toc241781756" w:history="1">
             <w:r>
               <w:rPr>
                 <w:rStyle w:val="Hyperlink"/>
@@ -2467,7 +2467,7 @@
               <w:rPr>
                 <w:noProof/>
               </w:rPr>
-              <w:instrText xml:space="preserve"> PAGEREF _Toc241781264 \h </w:instrText>
+              <w:instrText xml:space="preserve"> PAGEREF _Toc241781756 \h </w:instrText>
             </w:r>
             <w:r>
               <w:rPr>
@@ -2510,7 +2510,7 @@
               <w14:ligatures w14:val="standardContextual"/>
             </w:rPr>
           </w:pPr>
-          <w:hyperlink w:anchor="_Toc241781265" w:history="1">
+          <w:hyperlink w:anchor="_Toc241781757" w:history="1">
             <w:r>
               <w:rPr>
                 <w:rStyle w:val="Hyperlink"/>
@@ -2534,7 +2534,7 @@
               <w:rPr>
                 <w:noProof/>
               </w:rPr>
-              <w:instrText xml:space="preserve"> PAGEREF _Toc241781265 \h </w:instrText>
+              <w:instrText xml:space="preserve"> PAGEREF _Toc241781757 \h </w:instrText>
             </w:r>
             <w:r>
               <w:rPr>
@@ -2577,7 +2577,7 @@
               <w14:ligatures w14:val="standardContextual"/>
             </w:rPr>
           </w:pPr>
-          <w:hyperlink w:anchor="_Toc241781266" w:history="1">
+          <w:hyperlink w:anchor="_Toc241781758" w:history="1">
             <w:r>
               <w:rPr>
                 <w:rStyle w:val="Hyperlink"/>
@@ -2601,7 +2601,7 @@
               <w:rPr>
                 <w:noProof/>
               </w:rPr>
-              <w:instrText xml:space="preserve"> PAGEREF _Toc241781266 \h </w:instrText>
+              <w:instrText xml:space="preserve"> PAGEREF _Toc241781758 \h </w:instrText>
             </w:r>
             <w:r>
               <w:rPr>
@@ -2644,7 +2644,7 @@
               <w14:ligatures w14:val="standardContextual"/>
             </w:rPr>
           </w:pPr>
-          <w:hyperlink w:anchor="_Toc241781267" w:history="1">
+          <w:hyperlink w:anchor="_Toc241781759" w:history="1">
             <w:r>
               <w:rPr>
                 <w:rStyle w:val="Hyperlink"/>
@@ -2668,7 +2668,7 @@
               <w:rPr>
                 <w:noProof/>
               </w:rPr>
-              <w:instrText xml:space="preserve"> PAGEREF _Toc241781267 \h </w:instrText>
+              <w:instrText xml:space="preserve"> PAGEREF _Toc241781759 \h </w:instrText>
             </w:r>
             <w:r>
               <w:rPr>
@@ -2711,7 +2711,7 @@
               <w14:ligatures w14:val="standardContextual"/>
             </w:rPr>
           </w:pPr>
-          <w:hyperlink w:anchor="_Toc241781268" w:history="1">
+          <w:hyperlink w:anchor="_Toc241781760" w:history="1">
             <w:r>
               <w:rPr>
                 <w:rStyle w:val="Hyperlink"/>
@@ -2735,7 +2735,7 @@
               <w:rPr>
                 <w:noProof/>
               </w:rPr>
-              <w:instrText xml:space="preserve"> PAGEREF _Toc241781268 \h </w:instrText>
+              <w:instrText xml:space="preserve"> PAGEREF _Toc241781760 \h </w:instrText>
             </w:r>
             <w:r>
               <w:rPr>
@@ -2778,7 +2778,7 @@
               <w14:ligatures w14:val="standardContextual"/>
             </w:rPr>
           </w:pPr>
-          <w:hyperlink w:anchor="_Toc241781269" w:history="1">
+          <w:hyperlink w:anchor="_Toc241781761" w:history="1">
             <w:r>
               <w:rPr>
                 <w:rStyle w:val="Hyperlink"/>
@@ -2802,7 +2802,7 @@
               <w:rPr>
                 <w:noProof/>
               </w:rPr>
-              <w:instrText xml:space="preserve"> PAGEREF _Toc241781269 \h </w:instrText>
+              <w:instrText xml:space="preserve"> PAGEREF _Toc241781761 \h </w:instrText>
             </w:r>
             <w:r>
               <w:rPr>
@@ -2845,7 +2845,7 @@
               <w14:ligatures w14:val="standardContextual"/>
             </w:rPr>
           </w:pPr>
-          <w:hyperlink w:anchor="_Toc241781270" w:history="1">
+          <w:hyperlink w:anchor="_Toc241781762" w:history="1">
             <w:r>
               <w:rPr>
                 <w:rStyle w:val="Hyperlink"/>
@@ -2869,7 +2869,7 @@
               <w:rPr>
                 <w:noProof/>
               </w:rPr>
-              <w:instrText xml:space="preserve"> PAGEREF _Toc241781270 \h </w:instrText>
+              <w:instrText xml:space="preserve"> PAGEREF _Toc241781762 \h </w:instrText>
             </w:r>
             <w:r>
               <w:rPr>
@@ -2912,7 +2912,7 @@
               <w14:ligatures w14:val="standardContextual"/>
             </w:rPr>
           </w:pPr>
-          <w:hyperlink w:anchor="_Toc241781271" w:history="1">
+          <w:hyperlink w:anchor="_Toc241781763" w:history="1">
             <w:r>
               <w:rPr>
                 <w:rStyle w:val="Hyperlink"/>
@@ -2936,7 +2936,7 @@
               <w:rPr>
                 <w:noProof/>
               </w:rPr>
-              <w:instrText xml:space="preserve"> PAGEREF _Toc241781271 \h </w:instrText>
+              <w:instrText xml:space="preserve"> PAGEREF _Toc241781763 \h </w:instrText>
             </w:r>
             <w:r>
               <w:rPr>
@@ -2979,7 +2979,7 @@
               <w14:ligatures w14:val="standardContextual"/>
             </w:rPr>
           </w:pPr>
-          <w:hyperlink w:anchor="_Toc241781272" w:history="1">
+          <w:hyperlink w:anchor="_Toc241781764" w:history="1">
             <w:r>
               <w:rPr>
                 <w:rStyle w:val="Hyperlink"/>
@@ -3003,7 +3003,7 @@
               <w:rPr>
                 <w:noProof/>
               </w:rPr>
-              <w:instrText xml:space="preserve"> PAGEREF _Toc241781272 \h </w:instrText>
+              <w:instrText xml:space="preserve"> PAGEREF _Toc241781764 \h </w:instrText>
             </w:r>
             <w:r>
               <w:rPr>
@@ -3046,7 +3046,7 @@
               <w14:ligatures w14:val="standardContextual"/>
             </w:rPr>
           </w:pPr>
-          <w:hyperlink w:anchor="_Toc241781273" w:history="1">
+          <w:hyperlink w:anchor="_Toc241781765" w:history="1">
             <w:r>
               <w:rPr>
                 <w:rStyle w:val="Hyperlink"/>
@@ -3070,7 +3070,7 @@
               <w:rPr>
                 <w:noProof/>
               </w:rPr>
-              <w:instrText xml:space="preserve"> PAGEREF _Toc241781273 \h </w:instrText>
+              <w:instrText xml:space="preserve"> PAGEREF _Toc241781765 \h </w:instrText>
             </w:r>
             <w:r>
               <w:rPr>
@@ -3113,7 +3113,7 @@
               <w14:ligatures w14:val="standardContextual"/>
             </w:rPr>
           </w:pPr>
-          <w:hyperlink w:anchor="_Toc241781274" w:history="1">
+          <w:hyperlink w:anchor="_Toc241781766" w:history="1">
             <w:r>
               <w:rPr>
                 <w:rStyle w:val="Hyperlink"/>
@@ -3137,7 +3137,7 @@
               <w:rPr>
                 <w:noProof/>
               </w:rPr>
-              <w:instrText xml:space="preserve"> PAGEREF _Toc241781274 \h </w:instrText>
+              <w:instrText xml:space="preserve"> PAGEREF _Toc241781766 \h </w:instrText>
             </w:r>
             <w:r>
               <w:rPr>
@@ -3180,7 +3180,7 @@
               <w14:ligatures w14:val="standardContextual"/>
             </w:rPr>
           </w:pPr>
-          <w:hyperlink w:anchor="_Toc241781275" w:history="1">
+          <w:hyperlink w:anchor="_Toc241781767" w:history="1">
             <w:r>
               <w:rPr>
                 <w:rStyle w:val="Hyperlink"/>
@@ -3204,7 +3204,7 @@
               <w:rPr>
                 <w:noProof/>
               </w:rPr>
-              <w:instrText xml:space="preserve"> PAGEREF _Toc241781275 \h </w:instrText>
+              <w:instrText xml:space="preserve"> PAGEREF _Toc241781767 \h </w:instrText>
             </w:r>
             <w:r>
               <w:rPr>
@@ -3247,7 +3247,7 @@
               <w14:ligatures w14:val="standardContextual"/>
             </w:rPr>
           </w:pPr>
-          <w:hyperlink w:anchor="_Toc241781276" w:history="1">
+          <w:hyperlink w:anchor="_Toc241781768" w:history="1">
             <w:r>
               <w:rPr>
                 <w:rStyle w:val="Hyperlink"/>
@@ -3271,7 +3271,7 @@
               <w:rPr>
                 <w:noProof/>
               </w:rPr>
-              <w:instrText xml:space="preserve"> PAGEREF _Toc241781276 \h </w:instrText>
+              <w:instrText xml:space="preserve"> PAGEREF _Toc241781768 \h </w:instrText>
             </w:r>
             <w:r>
               <w:rPr>
@@ -3314,7 +3314,7 @@
               <w14:ligatures w14:val="standardContextual"/>
             </w:rPr>
           </w:pPr>
-          <w:hyperlink w:anchor="_Toc241781277" w:history="1">
+          <w:hyperlink w:anchor="_Toc241781769" w:history="1">
             <w:r>
               <w:rPr>
                 <w:rStyle w:val="Hyperlink"/>
@@ -3338,7 +3338,7 @@
               <w:rPr>
                 <w:noProof/>
               </w:rPr>
-              <w:instrText xml:space="preserve"> PAGEREF _Toc241781277 \h </w:instrText>
+              <w:instrText xml:space="preserve"> PAGEREF _Toc241781769 \h </w:instrText>
             </w:r>
             <w:r>
               <w:rPr>
@@ -3377,7 +3377,7 @@
         <w:pStyle w:val="Heading1"/>
         <w:pageBreakBefore/>
       </w:pPr>
-      <w:bookmarkStart w:id="0" w:name="_Toc241781236"/>
+      <w:bookmarkStart w:id="0" w:name="_Toc241781728"/>
       <w:r>
         <w:lastRenderedPageBreak/>
         <w:t>1. About this reference</w:t>
@@ -3830,7 +3830,7 @@
         <w:pStyle w:val="Heading1"/>
         <w:pageBreakBefore/>
       </w:pPr>
-      <w:bookmarkStart w:id="1" w:name="_Toc241781237"/>
+      <w:bookmarkStart w:id="1" w:name="_Toc241781729"/>
       <w:r>
         <w:lastRenderedPageBreak/>
         <w:t>2. Rules that apply on every screen</w:t>
@@ -4047,7 +4047,7 @@
         <w:pStyle w:val="Heading1"/>
         <w:pageBreakBefore/>
       </w:pPr>
-      <w:bookmarkStart w:id="2" w:name="_Toc241781238"/>
+      <w:bookmarkStart w:id="2" w:name="_Toc241781730"/>
       <w:r>
         <w:lastRenderedPageBreak/>
         <w:t>3. Who can open which screen</w:t>
@@ -9753,7 +9753,7 @@
         <w:pStyle w:val="Heading1"/>
         <w:pageBreakBefore/>
       </w:pPr>
-      <w:bookmarkStart w:id="3" w:name="_Toc241781239"/>
+      <w:bookmarkStart w:id="3" w:name="_Toc241781731"/>
       <w:r>
         <w:lastRenderedPageBreak/>
         <w:t>4. Signing in and your account</w:t>
@@ -9764,7 +9764,7 @@
       <w:pPr>
         <w:pStyle w:val="Heading2"/>
       </w:pPr>
-      <w:bookmarkStart w:id="4" w:name="_Toc241781240"/>
+      <w:bookmarkStart w:id="4" w:name="_Toc241781732"/>
       <w:r>
         <w:t>4.1 Sign in</w:t>
       </w:r>
@@ -10277,7 +10277,7 @@
       <w:pPr>
         <w:pStyle w:val="Heading2"/>
       </w:pPr>
-      <w:bookmarkStart w:id="5" w:name="_Toc241781241"/>
+      <w:bookmarkStart w:id="5" w:name="_Toc241781733"/>
       <w:r>
         <w:t>4.2 The header and menu bar (every screen)</w:t>
       </w:r>
@@ -11000,7 +11000,7 @@
       <w:pPr>
         <w:pStyle w:val="Heading2"/>
       </w:pPr>
-      <w:bookmarkStart w:id="6" w:name="_Toc241781242"/>
+      <w:bookmarkStart w:id="6" w:name="_Toc241781734"/>
       <w:r>
         <w:lastRenderedPageBreak/>
         <w:t>4.3 Change Password</w:t>
@@ -11622,7 +11622,7 @@
         <w:pStyle w:val="Heading1"/>
         <w:pageBreakBefore/>
       </w:pPr>
-      <w:bookmarkStart w:id="7" w:name="_Toc241781243"/>
+      <w:bookmarkStart w:id="7" w:name="_Toc241781735"/>
       <w:r>
         <w:lastRenderedPageBreak/>
         <w:t>5. Dashboards and Reports (read-only)</w:t>
@@ -11633,7 +11633,7 @@
       <w:pPr>
         <w:pStyle w:val="Heading2"/>
       </w:pPr>
-      <w:bookmarkStart w:id="8" w:name="_Toc241781244"/>
+      <w:bookmarkStart w:id="8" w:name="_Toc241781736"/>
       <w:r>
         <w:t>5.1 Executive Dashboard</w:t>
       </w:r>
@@ -12146,7 +12146,7 @@
       <w:pPr>
         <w:pStyle w:val="Heading2"/>
       </w:pPr>
-      <w:bookmarkStart w:id="9" w:name="_Toc241781245"/>
+      <w:bookmarkStart w:id="9" w:name="_Toc241781737"/>
       <w:r>
         <w:t>5.2 Sampling Dashboard</w:t>
       </w:r>
@@ -12659,7 +12659,7 @@
       <w:pPr>
         <w:pStyle w:val="Heading2"/>
       </w:pPr>
-      <w:bookmarkStart w:id="10" w:name="_Toc241781246"/>
+      <w:bookmarkStart w:id="10" w:name="_Toc241781738"/>
       <w:r>
         <w:t>5.3 Contact Dashboard</w:t>
       </w:r>
@@ -12963,7 +12963,7 @@
       <w:pPr>
         <w:pStyle w:val="Heading2"/>
       </w:pPr>
-      <w:bookmarkStart w:id="11" w:name="_Toc241781247"/>
+      <w:bookmarkStart w:id="11" w:name="_Toc241781739"/>
       <w:r>
         <w:t>5.4 QA Dashboard</w:t>
       </w:r>
@@ -13583,7 +13583,7 @@
       <w:pPr>
         <w:pStyle w:val="Heading2"/>
       </w:pPr>
-      <w:bookmarkStart w:id="12" w:name="_Toc241781248"/>
+      <w:bookmarkStart w:id="12" w:name="_Toc241781740"/>
       <w:r>
         <w:t>5.5 KII / Document Dashboard</w:t>
       </w:r>
@@ -13993,7 +13993,7 @@
       <w:pPr>
         <w:pStyle w:val="Heading2"/>
       </w:pPr>
-      <w:bookmarkStart w:id="13" w:name="_Toc241781249"/>
+      <w:bookmarkStart w:id="13" w:name="_Toc241781741"/>
       <w:r>
         <w:lastRenderedPageBreak/>
         <w:t>5.6 Reports</w:t>
@@ -14508,7 +14508,7 @@
         <w:pStyle w:val="Heading1"/>
         <w:pageBreakBefore/>
       </w:pPr>
-      <w:bookmarkStart w:id="14" w:name="_Toc241781250"/>
+      <w:bookmarkStart w:id="14" w:name="_Toc241781742"/>
       <w:r>
         <w:lastRenderedPageBreak/>
         <w:t>6. The sample and contact</w:t>
@@ -14519,7 +14519,7 @@
       <w:pPr>
         <w:pStyle w:val="Heading2"/>
       </w:pPr>
-      <w:bookmarkStart w:id="15" w:name="_Toc241781251"/>
+      <w:bookmarkStart w:id="15" w:name="_Toc241781743"/>
       <w:r>
         <w:t>6.1 Main-400 Register (and Reserve)</w:t>
       </w:r>
@@ -15452,7 +15452,7 @@
       <w:pPr>
         <w:pStyle w:val="Heading2"/>
       </w:pPr>
-      <w:bookmarkStart w:id="16" w:name="_Toc241781252"/>
+      <w:bookmarkStart w:id="16" w:name="_Toc241781744"/>
       <w:r>
         <w:t>6.2 Case page</w:t>
       </w:r>
@@ -17131,7 +17131,7 @@
       <w:pPr>
         <w:pStyle w:val="Heading2"/>
       </w:pPr>
-      <w:bookmarkStart w:id="17" w:name="_Toc241781253"/>
+      <w:bookmarkStart w:id="17" w:name="_Toc241781745"/>
       <w:r>
         <w:t>6.3 Pre-Interview Profile (PROIT) and its review screen</w:t>
       </w:r>
@@ -18696,7 +18696,7 @@
       <w:pPr>
         <w:pStyle w:val="Heading2"/>
       </w:pPr>
-      <w:bookmarkStart w:id="18" w:name="_Toc241781254"/>
+      <w:bookmarkStart w:id="18" w:name="_Toc241781746"/>
       <w:r>
         <w:t>6.4 Interview sheet (verifying a locked profile)</w:t>
       </w:r>
@@ -19954,7 +19954,7 @@
       <w:pPr>
         <w:pStyle w:val="Heading2"/>
       </w:pPr>
-      <w:bookmarkStart w:id="19" w:name="_Toc241781255"/>
+      <w:bookmarkStart w:id="19" w:name="_Toc241781747"/>
       <w:r>
         <w:t>6.5 Register Organisation</w:t>
       </w:r>
@@ -20677,7 +20677,7 @@
       <w:pPr>
         <w:pStyle w:val="Heading2"/>
       </w:pPr>
-      <w:bookmarkStart w:id="20" w:name="_Toc241781256"/>
+      <w:bookmarkStart w:id="20" w:name="_Toc241781748"/>
       <w:r>
         <w:t>6.6 Appointment Queue</w:t>
       </w:r>
@@ -21298,7 +21298,7 @@
       <w:pPr>
         <w:pStyle w:val="Heading2"/>
       </w:pPr>
-      <w:bookmarkStart w:id="21" w:name="_Toc241781257"/>
+      <w:bookmarkStart w:id="21" w:name="_Toc241781749"/>
       <w:r>
         <w:t>6.7 Follow-ups due</w:t>
       </w:r>
@@ -21811,7 +21811,7 @@
       <w:pPr>
         <w:pStyle w:val="Heading2"/>
       </w:pPr>
-      <w:bookmarkStart w:id="22" w:name="_Toc241781258"/>
+      <w:bookmarkStart w:id="22" w:name="_Toc241781750"/>
       <w:r>
         <w:t>6.8 Reserve Activation</w:t>
       </w:r>
@@ -22433,7 +22433,7 @@
         <w:pStyle w:val="Heading1"/>
         <w:pageBreakBefore/>
       </w:pPr>
-      <w:bookmarkStart w:id="23" w:name="_Toc241781259"/>
+      <w:bookmarkStart w:id="23" w:name="_Toc241781751"/>
       <w:r>
         <w:lastRenderedPageBreak/>
         <w:t>7. Quality checking</w:t>
@@ -22444,7 +22444,7 @@
       <w:pPr>
         <w:pStyle w:val="Heading2"/>
       </w:pPr>
-      <w:bookmarkStart w:id="24" w:name="_Toc241781260"/>
+      <w:bookmarkStart w:id="24" w:name="_Toc241781752"/>
       <w:r>
         <w:t>7.1 QA Queue (with the KoboToolbox sync panel)</w:t>
       </w:r>
@@ -23167,7 +23167,7 @@
       <w:pPr>
         <w:pStyle w:val="Heading2"/>
       </w:pPr>
-      <w:bookmarkStart w:id="25" w:name="_Toc241781261"/>
+      <w:bookmarkStart w:id="25" w:name="_Toc241781753"/>
       <w:r>
         <w:t>7.2 QA Exceptions</w:t>
       </w:r>
@@ -23999,7 +23999,7 @@
         <w:pStyle w:val="Heading1"/>
         <w:pageBreakBefore/>
       </w:pPr>
-      <w:bookmarkStart w:id="26" w:name="_Toc241781262"/>
+      <w:bookmarkStart w:id="26" w:name="_Toc241781754"/>
       <w:r>
         <w:lastRenderedPageBreak/>
         <w:t>8. Key Informant Interviews</w:t>
@@ -24010,7 +24010,7 @@
       <w:pPr>
         <w:pStyle w:val="Heading2"/>
       </w:pPr>
-      <w:bookmarkStart w:id="27" w:name="_Toc241781263"/>
+      <w:bookmarkStart w:id="27" w:name="_Toc241781755"/>
       <w:r>
         <w:t>8.1 KII Register</w:t>
       </w:r>
@@ -24630,7 +24630,7 @@
       <w:pPr>
         <w:pStyle w:val="Heading2"/>
       </w:pPr>
-      <w:bookmarkStart w:id="28" w:name="_Toc241781264"/>
+      <w:bookmarkStart w:id="28" w:name="_Toc241781756"/>
       <w:r>
         <w:t>8.2 New KII Record</w:t>
       </w:r>
@@ -25040,7 +25040,7 @@
       <w:pPr>
         <w:pStyle w:val="Heading2"/>
       </w:pPr>
-      <w:bookmarkStart w:id="29" w:name="_Toc241781265"/>
+      <w:bookmarkStart w:id="29" w:name="_Toc241781757"/>
       <w:r>
         <w:t>8.3 KII record</w:t>
       </w:r>
@@ -26082,7 +26082,7 @@
         <w:pStyle w:val="Heading1"/>
         <w:pageBreakBefore/>
       </w:pPr>
-      <w:bookmarkStart w:id="30" w:name="_Toc241781266"/>
+      <w:bookmarkStart w:id="30" w:name="_Toc241781758"/>
       <w:r>
         <w:lastRenderedPageBreak/>
         <w:t>9. Documentary evidence</w:t>
@@ -26093,7 +26093,7 @@
       <w:pPr>
         <w:pStyle w:val="Heading2"/>
       </w:pPr>
-      <w:bookmarkStart w:id="31" w:name="_Toc241781267"/>
+      <w:bookmarkStart w:id="31" w:name="_Toc241781759"/>
       <w:r>
         <w:t>9.1 Documents (the corpus)</w:t>
       </w:r>
@@ -26713,7 +26713,7 @@
       <w:pPr>
         <w:pStyle w:val="Heading2"/>
       </w:pPr>
-      <w:bookmarkStart w:id="32" w:name="_Toc241781268"/>
+      <w:bookmarkStart w:id="32" w:name="_Toc241781760"/>
       <w:r>
         <w:t>9.2 New Documentary Evidence Record</w:t>
       </w:r>
@@ -27544,7 +27544,7 @@
       <w:pPr>
         <w:pStyle w:val="Heading2"/>
       </w:pPr>
-      <w:bookmarkStart w:id="33" w:name="_Toc241781269"/>
+      <w:bookmarkStart w:id="33" w:name="_Toc241781761"/>
       <w:r>
         <w:t>9.3 Document record</w:t>
       </w:r>
@@ -28898,7 +28898,7 @@
       <w:pPr>
         <w:pStyle w:val="Heading2"/>
       </w:pPr>
-      <w:bookmarkStart w:id="34" w:name="_Toc241781270"/>
+      <w:bookmarkStart w:id="34" w:name="_Toc241781762"/>
       <w:r>
         <w:t>9.4 Auto-fill review screen</w:t>
       </w:r>
@@ -29940,7 +29940,7 @@
         <w:pStyle w:val="Heading1"/>
         <w:pageBreakBefore/>
       </w:pPr>
-      <w:bookmarkStart w:id="35" w:name="_Toc241781271"/>
+      <w:bookmarkStart w:id="35" w:name="_Toc241781763"/>
       <w:r>
         <w:lastRenderedPageBreak/>
         <w:t>10. Completed forms and exports</w:t>
@@ -29951,7 +29951,7 @@
       <w:pPr>
         <w:pStyle w:val="Heading2"/>
       </w:pPr>
-      <w:bookmarkStart w:id="36" w:name="_Toc241781272"/>
+      <w:bookmarkStart w:id="36" w:name="_Toc241781764"/>
       <w:r>
         <w:t>10.1 Completed forms (Form PDFs)</w:t>
       </w:r>
@@ -31217,7 +31217,7 @@
         <w:pStyle w:val="Heading1"/>
         <w:pageBreakBefore/>
       </w:pPr>
-      <w:bookmarkStart w:id="37" w:name="_Toc241781273"/>
+      <w:bookmarkStart w:id="37" w:name="_Toc241781765"/>
       <w:r>
         <w:lastRenderedPageBreak/>
         <w:t>11. Study administration</w:t>
@@ -31228,7 +31228,7 @@
       <w:pPr>
         <w:pStyle w:val="Heading2"/>
       </w:pPr>
-      <w:bookmarkStart w:id="38" w:name="_Toc241781274"/>
+      <w:bookmarkStart w:id="38" w:name="_Toc241781766"/>
       <w:r>
         <w:t>11.1 Cost Dashboard</w:t>
       </w:r>
@@ -31638,7 +31638,7 @@
       <w:pPr>
         <w:pStyle w:val="Heading2"/>
       </w:pPr>
-      <w:bookmarkStart w:id="39" w:name="_Toc241781275"/>
+      <w:bookmarkStart w:id="39" w:name="_Toc241781767"/>
       <w:r>
         <w:t>11.2 Audit Log</w:t>
       </w:r>
@@ -32048,7 +32048,7 @@
       <w:pPr>
         <w:pStyle w:val="Heading2"/>
       </w:pPr>
-      <w:bookmarkStart w:id="40" w:name="_Toc241781276"/>
+      <w:bookmarkStart w:id="40" w:name="_Toc241781768"/>
       <w:r>
         <w:t>11.3 Research Clearance</w:t>
       </w:r>
@@ -32879,7 +32879,7 @@
       <w:pPr>
         <w:pStyle w:val="Heading2"/>
       </w:pPr>
-      <w:bookmarkStart w:id="41" w:name="_Toc241781277"/>
+      <w:bookmarkStart w:id="41" w:name="_Toc241781769"/>
       <w:r>
         <w:t>11.4 Export</w:t>
       </w:r>
@@ -33544,7 +33544,7 @@
         <w:sz w:val="16"/>
         <w:szCs w:val="16"/>
       </w:rPr>
-      <w:t>Version 1.15 · 1 October 2026</w:t>
+      <w:t>Version 1.16 · 1 October 2026</w:t>
     </w:r>
     <w:r>
       <w:rPr>
@@ -33717,68 +33717,10 @@
 <file path=word/numbering.xml><?xml version="1.0" encoding="utf-8"?>
 <w:numbering xmlns:wpc="http://schemas.microsoft.com/office/word/2010/wordprocessingCanvas" xmlns:cx="http://schemas.microsoft.com/office/drawing/2014/chartex" xmlns:cx1="http://schemas.microsoft.com/office/drawing/2015/9/8/chartex" xmlns:cx2="http://schemas.microsoft.com/office/drawing/2015/10/21/chartex" xmlns:cx3="http://schemas.microsoft.com/office/drawing/2016/5/9/chartex" xmlns:cx4="http://schemas.microsoft.com/office/drawing/2016/5/10/chartex" xmlns:cx5="http://schemas.microsoft.com/office/drawing/2016/5/11/chartex" xmlns:cx6="http://schemas.microsoft.com/office/drawing/2016/5/12/chartex" xmlns:cx7="http://schemas.microsoft.com/office/drawing/2016/5/13/chartex" xmlns:cx8="http://schemas.microsoft.com/office/drawing/2016/5/14/chartex" xmlns:mc="http://schemas.openxmlformats.org/markup-compatibility/2006" xmlns:aink="http://schemas.microsoft.com/office/drawing/2016/ink" xmlns:am3d="http://schemas.microsoft.com/office/drawing/2017/model3d" xmlns:o="urn:schemas-microsoft-com:office:office" xmlns:oel="http://schemas.microsoft.com/office/2019/extlst" xmlns:r="http://schemas.openxmlformats.org/officeDocument/2006/relationships" xmlns:m="http://schemas.openxmlformats.org/officeDocument/2006/math" xmlns:v="urn:schemas-microsoft-com:vml" xmlns:wp14="http://schemas.microsoft.com/office/word/2010/wordprocessingDrawing" xmlns:wp="http://schemas.openxmlformats.org/drawingml/2006/wordprocessingDrawing" xmlns:w10="urn:schemas-microsoft-com:office:word" xmlns:w="http://schemas.openxmlformats.org/wordprocessingml/2006/main" xmlns:w14="http://schemas.microsoft.com/office/word/2010/wordml" xmlns:w15="http://schemas.microsoft.com/office/word/2012/wordml" xmlns:w16cex="http://schemas.microsoft.com/office/word/2018/wordml/cex" xmlns:w16cid="http://schemas.microsoft.com/office/word/2016/wordml/cid" xmlns:w16="http://schemas.microsoft.com/office/word/2018/wordml" xmlns:w16sdtdh="http://schemas.microsoft.com/office/word/2020/wordml/sdtdatahash" xmlns:w16se="http://schemas.microsoft.com/office/word/2015/wordml/symex" xmlns:wpg="http://schemas.microsoft.com/office/word/2010/wordprocessingGroup" xmlns:wpi="http://schemas.microsoft.com/office/word/2010/wordprocessingInk" xmlns:wne="http://schemas.microsoft.com/office/word/2006/wordml" xmlns:wps="http://schemas.microsoft.com/office/word/2010/wordprocessingShape" mc:Ignorable="w14 w15 w16se w16cid w16 w16cex w16sdtdh wp14">
   <w:abstractNum w:abstractNumId="0" w15:restartNumberingAfterBreak="0">
-    <w:nsid w:val="3EAE5B5B"/>
+    <w:nsid w:val="11285174"/>
     <w:multiLevelType w:val="hybridMultilevel"/>
-    <w:tmpl w:val="D8B2A35A"/>
-    <w:lvl w:ilvl="0" w:tplc="4F189D94">
-      <w:start w:val="1"/>
-      <w:numFmt w:val="bullet"/>
-      <w:lvlText w:val="•"/>
-      <w:lvlJc w:val="left"/>
-      <w:pPr>
-        <w:ind w:left="460" w:hanging="280"/>
-      </w:pPr>
-    </w:lvl>
-    <w:lvl w:ilvl="1" w:tplc="DEA4B9DE">
-      <w:start w:val="1"/>
-      <w:numFmt w:val="bullet"/>
-      <w:lvlText w:val="–"/>
-      <w:lvlJc w:val="left"/>
-      <w:pPr>
-        <w:ind w:left="900" w:hanging="280"/>
-      </w:pPr>
-    </w:lvl>
-    <w:lvl w:ilvl="2" w:tplc="EB221518">
-      <w:numFmt w:val="decimal"/>
-      <w:lvlText w:val=""/>
-      <w:lvlJc w:val="left"/>
-    </w:lvl>
-    <w:lvl w:ilvl="3" w:tplc="BBD6A7F4">
-      <w:numFmt w:val="decimal"/>
-      <w:lvlText w:val=""/>
-      <w:lvlJc w:val="left"/>
-    </w:lvl>
-    <w:lvl w:ilvl="4" w:tplc="EF169E94">
-      <w:numFmt w:val="decimal"/>
-      <w:lvlText w:val=""/>
-      <w:lvlJc w:val="left"/>
-    </w:lvl>
-    <w:lvl w:ilvl="5" w:tplc="30BCF5D2">
-      <w:numFmt w:val="decimal"/>
-      <w:lvlText w:val=""/>
-      <w:lvlJc w:val="left"/>
-    </w:lvl>
-    <w:lvl w:ilvl="6" w:tplc="2CDEB078">
-      <w:numFmt w:val="decimal"/>
-      <w:lvlText w:val=""/>
-      <w:lvlJc w:val="left"/>
-    </w:lvl>
-    <w:lvl w:ilvl="7" w:tplc="63343070">
-      <w:numFmt w:val="decimal"/>
-      <w:lvlText w:val=""/>
-      <w:lvlJc w:val="left"/>
-    </w:lvl>
-    <w:lvl w:ilvl="8" w:tplc="A81E0A42">
-      <w:numFmt w:val="decimal"/>
-      <w:lvlText w:val=""/>
-      <w:lvlJc w:val="left"/>
-    </w:lvl>
-  </w:abstractNum>
-  <w:abstractNum w:abstractNumId="1" w15:restartNumberingAfterBreak="0">
-    <w:nsid w:val="70786AED"/>
-    <w:multiLevelType w:val="hybridMultilevel"/>
-    <w:tmpl w:val="9564C29C"/>
-    <w:lvl w:ilvl="0" w:tplc="91560620">
+    <w:tmpl w:val="3222ACEA"/>
+    <w:lvl w:ilvl="0" w:tplc="22267E9C">
       <w:start w:val="1"/>
       <w:numFmt w:val="bullet"/>
       <w:lvlText w:val="●"/>
@@ -33787,7 +33729,7 @@
         <w:ind w:left="720" w:hanging="360"/>
       </w:pPr>
     </w:lvl>
-    <w:lvl w:ilvl="1" w:tplc="5BC4F868">
+    <w:lvl w:ilvl="1" w:tplc="AA9472E2">
       <w:start w:val="1"/>
       <w:numFmt w:val="bullet"/>
       <w:lvlText w:val="○"/>
@@ -33796,7 +33738,7 @@
         <w:ind w:left="1440" w:hanging="360"/>
       </w:pPr>
     </w:lvl>
-    <w:lvl w:ilvl="2" w:tplc="5012531E">
+    <w:lvl w:ilvl="2" w:tplc="C68A1EDA">
       <w:start w:val="1"/>
       <w:numFmt w:val="bullet"/>
       <w:lvlText w:val="■"/>
@@ -33805,7 +33747,7 @@
         <w:ind w:left="2160" w:hanging="360"/>
       </w:pPr>
     </w:lvl>
-    <w:lvl w:ilvl="3" w:tplc="01F2244E">
+    <w:lvl w:ilvl="3" w:tplc="0C3CD12C">
       <w:start w:val="1"/>
       <w:numFmt w:val="bullet"/>
       <w:lvlText w:val="●"/>
@@ -33814,7 +33756,7 @@
         <w:ind w:left="2880" w:hanging="360"/>
       </w:pPr>
     </w:lvl>
-    <w:lvl w:ilvl="4" w:tplc="148468C2">
+    <w:lvl w:ilvl="4" w:tplc="3E686C2E">
       <w:start w:val="1"/>
       <w:numFmt w:val="bullet"/>
       <w:lvlText w:val="○"/>
@@ -33823,7 +33765,7 @@
         <w:ind w:left="3600" w:hanging="360"/>
       </w:pPr>
     </w:lvl>
-    <w:lvl w:ilvl="5" w:tplc="4D2A9F4E">
+    <w:lvl w:ilvl="5" w:tplc="B7EE9CFC">
       <w:start w:val="1"/>
       <w:numFmt w:val="bullet"/>
       <w:lvlText w:val="■"/>
@@ -33832,7 +33774,7 @@
         <w:ind w:left="4320" w:hanging="360"/>
       </w:pPr>
     </w:lvl>
-    <w:lvl w:ilvl="6" w:tplc="EC9A4D96">
+    <w:lvl w:ilvl="6" w:tplc="1C0C4884">
       <w:start w:val="1"/>
       <w:numFmt w:val="bullet"/>
       <w:lvlText w:val="●"/>
@@ -33841,7 +33783,7 @@
         <w:ind w:left="5040" w:hanging="360"/>
       </w:pPr>
     </w:lvl>
-    <w:lvl w:ilvl="7" w:tplc="FAD69DE0">
+    <w:lvl w:ilvl="7" w:tplc="519A08A8">
       <w:start w:val="1"/>
       <w:numFmt w:val="bullet"/>
       <w:lvlText w:val="●"/>
@@ -33850,7 +33792,7 @@
         <w:ind w:left="5760" w:hanging="360"/>
       </w:pPr>
     </w:lvl>
-    <w:lvl w:ilvl="8" w:tplc="1E8889E8">
+    <w:lvl w:ilvl="8" w:tplc="8ABCC288">
       <w:start w:val="1"/>
       <w:numFmt w:val="bullet"/>
       <w:lvlText w:val="●"/>
@@ -33860,14 +33802,72 @@
       </w:pPr>
     </w:lvl>
   </w:abstractNum>
-  <w:num w:numId="1" w16cid:durableId="1017661878">
-    <w:abstractNumId w:val="1"/>
+  <w:abstractNum w:abstractNumId="1" w15:restartNumberingAfterBreak="0">
+    <w:nsid w:val="3BF909C0"/>
+    <w:multiLevelType w:val="hybridMultilevel"/>
+    <w:tmpl w:val="55DC4DE8"/>
+    <w:lvl w:ilvl="0" w:tplc="2A58B892">
+      <w:start w:val="1"/>
+      <w:numFmt w:val="bullet"/>
+      <w:lvlText w:val="•"/>
+      <w:lvlJc w:val="left"/>
+      <w:pPr>
+        <w:ind w:left="460" w:hanging="280"/>
+      </w:pPr>
+    </w:lvl>
+    <w:lvl w:ilvl="1" w:tplc="57D29C4E">
+      <w:start w:val="1"/>
+      <w:numFmt w:val="bullet"/>
+      <w:lvlText w:val="–"/>
+      <w:lvlJc w:val="left"/>
+      <w:pPr>
+        <w:ind w:left="900" w:hanging="280"/>
+      </w:pPr>
+    </w:lvl>
+    <w:lvl w:ilvl="2" w:tplc="FCCA5C6A">
+      <w:numFmt w:val="decimal"/>
+      <w:lvlText w:val=""/>
+      <w:lvlJc w:val="left"/>
+    </w:lvl>
+    <w:lvl w:ilvl="3" w:tplc="BC7465AA">
+      <w:numFmt w:val="decimal"/>
+      <w:lvlText w:val=""/>
+      <w:lvlJc w:val="left"/>
+    </w:lvl>
+    <w:lvl w:ilvl="4" w:tplc="9D3819B6">
+      <w:numFmt w:val="decimal"/>
+      <w:lvlText w:val=""/>
+      <w:lvlJc w:val="left"/>
+    </w:lvl>
+    <w:lvl w:ilvl="5" w:tplc="9DB0F2AC">
+      <w:numFmt w:val="decimal"/>
+      <w:lvlText w:val=""/>
+      <w:lvlJc w:val="left"/>
+    </w:lvl>
+    <w:lvl w:ilvl="6" w:tplc="3698CDCE">
+      <w:numFmt w:val="decimal"/>
+      <w:lvlText w:val=""/>
+      <w:lvlJc w:val="left"/>
+    </w:lvl>
+    <w:lvl w:ilvl="7" w:tplc="F2622D6A">
+      <w:numFmt w:val="decimal"/>
+      <w:lvlText w:val=""/>
+      <w:lvlJc w:val="left"/>
+    </w:lvl>
+    <w:lvl w:ilvl="8" w:tplc="856611AE">
+      <w:numFmt w:val="decimal"/>
+      <w:lvlText w:val=""/>
+      <w:lvlJc w:val="left"/>
+    </w:lvl>
+  </w:abstractNum>
+  <w:num w:numId="1" w16cid:durableId="1952281737">
+    <w:abstractNumId w:val="0"/>
     <w:lvlOverride w:ilvl="0">
       <w:startOverride w:val="1"/>
     </w:lvlOverride>
   </w:num>
-  <w:num w:numId="2" w16cid:durableId="1335643010">
-    <w:abstractNumId w:val="0"/>
+  <w:num w:numId="2" w16cid:durableId="2072577097">
+    <w:abstractNumId w:val="1"/>
     <w:lvlOverride w:ilvl="0">
       <w:startOverride w:val="1"/>
     </w:lvlOverride>
@@ -34492,7 +34492,7 @@
     <w:autoRedefine/>
     <w:uiPriority w:val="39"/>
     <w:unhideWhenUsed/>
-    <w:rsid w:val="00294E85"/>
+    <w:rsid w:val="00702B85"/>
     <w:pPr>
       <w:spacing w:after="100"/>
     </w:pPr>
@@ -34504,7 +34504,7 @@
     <w:autoRedefine/>
     <w:uiPriority w:val="39"/>
     <w:unhideWhenUsed/>
-    <w:rsid w:val="00294E85"/>
+    <w:rsid w:val="00702B85"/>
     <w:pPr>
       <w:spacing w:after="100"/>
       <w:ind w:left="210"/>

</xml_diff>